<commit_message>
Add public production-trace validation (BurstGPT, LLM provider incidents), thinning proposition, data-anchored burst scenario; update paper
Co-Authored-By: Claude Sonnet 5.5 <noreply@anthropic.com>
Claude-Session: https://claude.ai/code/session_01FJoEQKBVMu4pDX4YuJC5vW
</commit_message>
<xml_diff>
--- a/hallucination_poisson/paper/LLM_Hallucination_Poisson_Framework_Revised.docx
+++ b/hallucination_poisson/paper/LLM_Hallucination_Poisson_Framework_Revised.docx
@@ -60,7 +60,7 @@
           <w:sz w:val="22"/>
           <w:szCs w:val="22"/>
         </w:rPr>
-        <w:t xml:space="preserve">Organisations that deploy large language models (LLMs) must decide how much human triage capacity to hold in reserve and how many automated guardrail layers to place in front of the model. Practice relies on two rules of thumb: staff for the average incident load, and stack guardrails whose combined benefit is computed under independence. We model critical hallucinations as a (possibly over-dispersed, non-homogeneous) counting process, size capacity at a quantile of the daily count, and treat the multiplicative guardrail formula as the independence special case of Fréchet-type bounds. We show analytically that over-dispersion inflates required capacity by roughly the square root of the dispersion index, that positive association between layers makes the independence formula a lower bound on residual risk, and that, because capacity is integer-valued, total cost is not unimodal in the number of layers; an earlier claim that three layers are structurally optimal does not follow from the cost model. We then evaluate the integrated pipeline on measured outputs of three open LLMs answering 900 SQuAD 2.0 questions through three executed guardrail layers (rules, an extractive-QA classifier, an LLM judge) with measured latency and failures, with user traffic simulated as a non-homogeneous arrival process. A single validated classifier cut required capacity by 80-95%; a routed judge added a modest, model-dependent gain at about triple the latency. The independence formula understated the share of hallucinations passing a two-layer cascade by a factor of 1.6-2.6 (2.7-4.6 with routing), a classifier with chance-level discrimination appeared beneficial only because it blocked almost everything, and with mild burstiness (daily-rate CV 0.3) a Poisson-sized capacity plan was exceeded on about 25% of days instead of 5%. Arrival times are simulated, models are small, and the task is extractive QA, so the numbers do not transfer to production; the method and its diagnostics do.</w:t>
+        <w:t xml:space="preserve">Organisations that deploy large language models (LLMs) must decide how much human triage capacity to hold in reserve and how many automated guardrail layers to place in front of the model. Practice relies on two rules of thumb: staff for the average incident load, and stack guardrails whose combined benefit is computed under independence. We model critical hallucinations as a (possibly over-dispersed, non-homogeneous) counting process, size capacity at a quantile of the daily count, and treat the multiplicative guardrail formula as the independence special case of Fréchet-type bounds. We show analytically that over-dispersion inflates required capacity by roughly the square root of the dispersion index, that positive association between layers makes the independence formula a lower bound on residual risk, and that, because capacity is integer-valued, total cost is not unimodal in the number of layers; an earlier claim that three layers are structurally optimal does not follow from the cost model. We then evaluate the integrated pipeline on measured outputs of three open LLMs answering 900 SQuAD 2.0 questions through three executed guardrail layers (rules, an extractive-QA classifier, an LLM judge) with measured latency and failures, with user traffic simulated as a non-homogeneous arrival process. We then test the Poisson structure on public production data: a request trace of an LLM service shows clustered arrivals at every scale above one second and a median day-to-day volume change of a factor of 1.8, and provider incident streams are strongly seasonal and remain over-dispersed after accounting for it. A single validated classifier cut required capacity by 80-95%; a routed judge added a modest, model-dependent gain at about triple the latency. The independence formula understated the share of hallucinations passing a two-layer cascade by a factor of 1.6-2.6 (2.7-4.6 with routing), a classifier with chance-level discrimination appeared beneficial only because it blocked almost everything, and with mild burstiness (daily-rate CV 0.3) a Poisson-sized capacity plan was exceeded on about 25-30% of days instead of 5%, while over-dispersion mattered little for low-rate provider-level incidents, as the thinning argument of Proposition 5 predicts. Hallucination arrival times are simulated and no public time-stamped hallucination log exists; models are small and the task is extractive QA, so the numbers do not transfer to production; the method and its diagnostics do.</w:t>
       </w:r>
     </w:p>
     <w:p>
@@ -231,7 +231,7 @@
           <w:sz w:val="22"/>
           <w:szCs w:val="22"/>
         </w:rPr>
-        <w:t xml:space="preserve">, we evaluate the integrated pipeline on real model outputs: three open models answering SQuAD 2.0 questions, three guardrail layers executed with measured latency and error behaviour, and traffic replayed through a non-homogeneous arrival process. To our knowledge, this is the first study that tests counting-process assumptions on measured LLM hallucination outputs and connects the result to quantile-based triage capacity and guardrail-depth decisions in one framework; each ingredient has precedents (Section 2). Arrival times are simulated; outcomes, guardrail decisions and latencies are measured.</w:t>
+        <w:t xml:space="preserve">, we evaluate the integrated pipeline on real model outputs (three open models answering SQuAD 2.0 questions, three guardrail layers executed with measured latency and error behaviour) with traffic replayed through a non-homogeneous arrival process whose daily-rate variability is anchored in a public production trace of an LLM service (BurstGPT; Wang et al., 2025), and we test the Poisson assumptions directly on that trace and on the public incident history of three LLM providers (Chu et al., 2025). To our knowledge, this is the first study that tests counting-process assumptions on measured LLM hallucination outputs and connects the result to quantile-based triage capacity and guardrail-depth decisions in one framework; each ingredient has precedents (Section 2). Arrival times of the hallucination replay are simulated; outcomes, guardrail decisions and latencies are measured; the public traces concern request arrivals and service incidents, not hallucinations.</w:t>
       </w:r>
     </w:p>
     <w:p>
@@ -2914,7 +2914,91 @@
           <w:sz w:val="23"/>
           <w:szCs w:val="23"/>
         </w:rPr>
-        <w:t xml:space="preserve">3.3 Guardrail cascades and dependence</w:t>
+        <w:t xml:space="preserve">3.3 Thinning: guardrails make the incident stream closer to Poisson</w:t>
+      </w:r>
+    </w:p>
+    <w:p>
+      <w:pPr>
+        <w:spacing w:after="120" w:line="300"/>
+        <w:jc w:val="both"/>
+      </w:pPr>
+      <w:r>
+        <w:rPr>
+          <w:rFonts w:ascii="Times New Roman" w:cs="Times New Roman" w:eastAsia="Times New Roman" w:hAnsi="Times New Roman"/>
+          <w:sz w:val="22"/>
+          <w:szCs w:val="22"/>
+        </w:rPr>
+        <w:t xml:space="preserve">Requests may be clustered even when incidents are rare. Because critical hallucinations are an independent thinning of requests, the dispersion of the incident stream follows from that of the request stream:</w:t>
+      </w:r>
+    </w:p>
+    <w:p>
+      <w:pPr>
+        <w:pBdr>
+          <w:left w:val="single" w:color="888888" w:sz="12" w:space="8"/>
+        </w:pBdr>
+        <w:spacing w:after="120" w:line="300"/>
+        <w:ind w:left="360" w:right="360"/>
+        <w:jc w:val="both"/>
+      </w:pPr>
+      <w:r>
+        <w:rPr>
+          <w:rFonts w:ascii="Times New Roman" w:cs="Times New Roman" w:eastAsia="Times New Roman" w:hAnsi="Times New Roman"/>
+          <w:b/>
+          <w:bCs/>
+          <w:sz w:val="22"/>
+          <w:szCs w:val="22"/>
+        </w:rPr>
+        <w:t xml:space="preserve">Proposition 5 (thinning reduces dispersion). </w:t>
+      </w:r>
+      <w:r>
+        <w:rPr>
+          <w:rFonts w:ascii="Times New Roman" w:cs="Times New Roman" w:eastAsia="Times New Roman" w:hAnsi="Times New Roman"/>
+          <w:sz w:val="22"/>
+          <w:szCs w:val="22"/>
+        </w:rPr>
+        <w:t xml:space="preserve">Let N be the request count in a window with mean μ and Fano factor F = Var(N)/μ, and let each request independently become a critical event with probability p. Then the event count N_p has mean pμ and Fano factor 1 + p(F - 1). In particular, a guardrail cascade that reduces the residual probability p pulls the incident stream towards Poisson (Fano factor 1), while the unprotected stream (p large) retains most of the request stream's burstiness. Equivalently, for a mixed-Poisson day with rate multiplier of CV c, φ = 1 + λc² in Proposition 2 with λ = pμ.</w:t>
+      </w:r>
+    </w:p>
+    <w:p>
+      <w:pPr>
+        <w:spacing w:after="120" w:line="300"/>
+        <w:jc w:val="both"/>
+      </w:pPr>
+      <w:r>
+        <w:rPr>
+          <w:rFonts w:ascii="Times New Roman" w:cs="Times New Roman" w:eastAsia="Times New Roman" w:hAnsi="Times New Roman"/>
+          <w:i/>
+          <w:iCs/>
+          <w:sz w:val="22"/>
+          <w:szCs w:val="22"/>
+        </w:rPr>
+        <w:t xml:space="preserve">Proof.</w:t>
+      </w:r>
+      <w:r>
+        <w:rPr>
+          <w:rFonts w:ascii="Times New Roman" w:cs="Times New Roman" w:eastAsia="Times New Roman" w:hAnsi="Times New Roman"/>
+          <w:sz w:val="22"/>
+          <w:szCs w:val="22"/>
+        </w:rPr>
+        <w:t xml:space="preserve"> Var(N_p) = p²Var(N) + p(1 - p)μ by the law of total variance for the binomial thinning. Dividing by pμ gives pF + (1 - p) = 1 + p(F - 1). ∎ (We also verified this numerically by simulation.) The practical reading: over-dispersion matters most precisely where capacity is largest, i.e. without or with weak guardrails, and matters less after strong filtering, consistent with the shrinking gap between Poisson and negative-binomial capacity in Section 5.4.</w:t>
+      </w:r>
+    </w:p>
+    <w:p>
+      <w:pPr>
+        <w:pStyle w:val="Heading2"/>
+        <w:spacing w:after="100" w:before="200"/>
+      </w:pPr>
+      <w:r>
+        <w:rPr>
+          <w:rFonts w:ascii="Times New Roman" w:cs="Times New Roman" w:eastAsia="Times New Roman" w:hAnsi="Times New Roman"/>
+          <w:b/>
+          <w:bCs/>
+          <w:i/>
+          <w:iCs/>
+          <w:sz w:val="23"/>
+          <w:szCs w:val="23"/>
+        </w:rPr>
+        <w:t xml:space="preserve">3.4 Guardrail cascades and dependence</w:t>
       </w:r>
     </w:p>
     <w:p>
@@ -4213,7 +4297,7 @@
           <w:sz w:val="23"/>
           <w:szCs w:val="23"/>
         </w:rPr>
-        <w:t xml:space="preserve">3.4 Cost-minimising guardrail depth</w:t>
+        <w:t xml:space="preserve">3.5 Cost-minimising guardrail depth</w:t>
       </w:r>
     </w:p>
     <w:p>
@@ -6698,7 +6782,7 @@
           <w:sz w:val="22"/>
           <w:szCs w:val="22"/>
         </w:rPr>
-        <w:t xml:space="preserve"> are measured. Queries arrive according to an NHPP with a business-hours-shaped 24-slot intensity and a mean of 200 queries/day for 90 days (a Cox variant multiplies each day's intensity by a Gamma(1, c²) factor, c = 0.3, to represent bursty demand). Each arriving query replays a uniformly drawn example from the measured pool; it becomes a critical event if it is a hallucination that survives the cascade. For each resulting event stream we estimate λ̂ = events/days and test: (i) the index-of-dispersion test on daily counts; (ii) a chi-square test of constant hourly intensity; (iii) a Kolmogorov-Smirnov test of raw inter-arrival times against an exponential, and of time-rescaled gaps under the fitted hourly intensity (the Lilliefors-type p-value is optimistic); (iv) a negative-binomial fit of daily counts. Uncertainty from the finite evaluation pool is quantified by a 300-draw bootstrap over examples (95% percentile intervals).</w:t>
+        <w:t xml:space="preserve"> are measured. Queries arrive according to an NHPP with a 24-slot hour-of-day intensity and a mean of 200 queries/day for 90 days. The default profile is business-hours-shaped; a second profile is the hour-of-day profile measured in the BurstGPT production trace (Section 4.5). A Cox variant multiplies each day's intensity by a Gamma factor with mean 1 and coefficient of variation c to represent bursty demand; we use c = 0.3 (an arbitrary mild scenario) and c = 0.44 (the coefficient of variation of the calmest 14-day window of BurstGPT, Section 5.6, which makes the scenario data-anchored and still conservative). Each arriving query replays a uniformly drawn example from the measured pool; it becomes a critical event if it is a hallucination that survives the cascade. For each resulting event stream we estimate λ̂ = events/days and test: (i) the index-of-dispersion test on daily counts; (ii) a chi-square test of constant hourly intensity; (iii) a Kolmogorov-Smirnov test of raw inter-arrival times against an exponential, and of time-rescaled gaps under the fitted hourly intensity (the Lilliefors-type p-value is optimistic); (iv) a negative-binomial fit of daily counts. Uncertainty from the finite evaluation pool is quantified by a 300-draw bootstrap over examples (95% percentile intervals).</w:t>
       </w:r>
     </w:p>
     <w:p>
@@ -6763,6 +6847,74 @@
           <w:szCs w:val="22"/>
         </w:rPr>
         <w:t xml:space="preserve">Daily cost is C_h·max(k_min, k∗) + compute + false-block cost + residual-harm cost. We set C_h = $150 per capacity unit (as in the earlier draft), compute $0.0001 per classifier call and $0.002 per judge call, and treat the false-block cost c_fp and residual-harm cost c_res as scenario parameters in a sensitivity grid. These are assumptions, not estimates, and are labelled as such wherever used.</w:t>
+      </w:r>
+    </w:p>
+    <w:p>
+      <w:pPr>
+        <w:pStyle w:val="Heading2"/>
+        <w:spacing w:after="100" w:before="200"/>
+      </w:pPr>
+      <w:r>
+        <w:rPr>
+          <w:rFonts w:ascii="Times New Roman" w:cs="Times New Roman" w:eastAsia="Times New Roman" w:hAnsi="Times New Roman"/>
+          <w:b/>
+          <w:bCs/>
+          <w:i/>
+          <w:iCs/>
+          <w:sz w:val="23"/>
+          <w:szCs w:val="23"/>
+        </w:rPr>
+        <w:t xml:space="preserve">4.5 Public production data</w:t>
+      </w:r>
+    </w:p>
+    <w:p>
+      <w:pPr>
+        <w:spacing w:after="120" w:line="300"/>
+        <w:jc w:val="both"/>
+      </w:pPr>
+      <w:r>
+        <w:rPr>
+          <w:rFonts w:ascii="Times New Roman" w:cs="Times New Roman" w:eastAsia="Times New Roman" w:hAnsi="Times New Roman"/>
+          <w:sz w:val="22"/>
+          <w:szCs w:val="22"/>
+        </w:rPr>
+        <w:t xml:space="preserve">Two public datasets test the counting-process assumptions on real systems; neither concerns hallucinations. </w:t>
+      </w:r>
+      <w:r>
+        <w:rPr>
+          <w:rFonts w:ascii="Times New Roman" w:cs="Times New Roman" w:eastAsia="Times New Roman" w:hAnsi="Times New Roman"/>
+          <w:b/>
+          <w:bCs/>
+          <w:sz w:val="22"/>
+          <w:szCs w:val="22"/>
+        </w:rPr>
+        <w:t xml:space="preserve">BurstGPT</w:t>
+      </w:r>
+      <w:r>
+        <w:rPr>
+          <w:rFonts w:ascii="Times New Roman" w:cs="Times New Roman" w:eastAsia="Times New Roman" w:hAnsi="Times New Roman"/>
+          <w:sz w:val="22"/>
+          <w:szCs w:val="22"/>
+        </w:rPr>
+        <w:t xml:space="preserve"> (Wang et al., 2025; CC BY 4.0) contains 10.6 million request records of regional Azure OpenAI ChatGPT and GPT-4 services at one-second resolution over 231 days (two contiguous segments of 121 and 110 days separated by an unrecorded gap of 104 days; timestamps are seconds from an undisclosed day 0, so weekday labels are unknown); failed requests are the rows with zero response tokens. We estimate the hour-of-day profile, the day-to-day variability of request volume (robustly, because volume grows by two orders of magnitude and contains regime shifts), and the within-hour Fano factor of counts at 1 s, 10 s, 1 min and 10 min. </w:t>
+      </w:r>
+      <w:r>
+        <w:rPr>
+          <w:rFonts w:ascii="Times New Roman" w:cs="Times New Roman" w:eastAsia="Times New Roman" w:hAnsi="Times New Roman"/>
+          <w:b/>
+          <w:bCs/>
+          <w:sz w:val="22"/>
+          <w:szCs w:val="22"/>
+        </w:rPr>
+        <w:t xml:space="preserve">LLM Service Outages and Incident Reports</w:t>
+      </w:r>
+      <w:r>
+        <w:rPr>
+          <w:rFonts w:ascii="Times New Roman" w:cs="Times New Roman" w:eastAsia="Times New Roman" w:hAnsi="Times New Roman"/>
+          <w:sz w:val="22"/>
+          <w:szCs w:val="22"/>
+        </w:rPr>
+        <w:t xml:space="preserve"> (Chu et al., 2025; CC BY 4.0) contains provider-declared incidents scraped from the OpenAI, Anthropic and Character.AI status pages; we use the 457 incidents starting from March 2023, when all three pages are populated, and test Poisson counts per day and week (index of dispersion, also stratified by day of week), day-of-week and hour-of-day homogeneity, exponential inter-arrival times after time-rescaling with a fitted hour-of-week intensity, the distribution of incident durations as a proxy for human response time, and the number of concurrently open incidents against the M/G/∞ prediction.</w:t>
       </w:r>
     </w:p>
     <w:p>
@@ -8356,6 +8508,1463 @@
     </w:p>
     <w:p>
       <w:pPr>
+        <w:spacing w:after="120" w:line="300"/>
+        <w:jc w:val="both"/>
+      </w:pPr>
+      <w:r>
+        <w:rPr>
+          <w:rFonts w:ascii="Times New Roman" w:cs="Times New Roman" w:eastAsia="Times New Roman" w:hAnsi="Times New Roman"/>
+          <w:b/>
+          <w:bCs/>
+          <w:sz w:val="22"/>
+          <w:szCs w:val="22"/>
+        </w:rPr>
+        <w:t xml:space="preserve">Data-anchored scenario.</w:t>
+      </w:r>
+      <w:r>
+        <w:rPr>
+          <w:rFonts w:ascii="Times New Roman" w:cs="Times New Roman" w:eastAsia="Times New Roman" w:hAnsi="Times New Roman"/>
+          <w:sz w:val="22"/>
+          <w:szCs w:val="22"/>
+        </w:rPr>
+        <w:t xml:space="preserve"> Section 5.6 shows that real LLM request volume varies much more from day to day than c = 0.3; the calmest 14-day window of the BurstGPT trace still has c = 0.44. Replaying our measured outcomes with c = 0.44 and the BurstGPT hour-of-day profile gives the exceedance rates in Table 6.</w:t>
+      </w:r>
+    </w:p>
+    <w:p>
+      <w:pPr>
+        <w:keepNext/>
+        <w:spacing w:after="60" w:before="160"/>
+      </w:pPr>
+      <w:r>
+        <w:rPr>
+          <w:rFonts w:ascii="Times New Roman" w:cs="Times New Roman" w:eastAsia="Times New Roman" w:hAnsi="Times New Roman"/>
+          <w:b/>
+          <w:bCs/>
+          <w:sz w:val="20"/>
+          <w:szCs w:val="20"/>
+        </w:rPr>
+        <w:t xml:space="preserve">Table 6. Share of days on which the Poisson-sized capacity k* is exceeded (target 5%; 90 simulated days)</w:t>
+      </w:r>
+    </w:p>
+    <w:tbl>
+      <w:tblPr>
+        <w:tblW w:type="dxa" w:w="9360"/>
+        <w:tblBorders>
+          <w:top w:val="single" w:color="auto" w:sz="4"/>
+          <w:left w:val="single" w:color="auto" w:sz="4"/>
+          <w:bottom w:val="single" w:color="auto" w:sz="4"/>
+          <w:right w:val="single" w:color="auto" w:sz="4"/>
+          <w:insideH w:val="single" w:color="auto" w:sz="4"/>
+          <w:insideV w:val="single" w:color="auto" w:sz="4"/>
+        </w:tblBorders>
+      </w:tblPr>
+      <w:tblGrid>
+        <w:gridCol w:w="1500"/>
+        <w:gridCol w:w="1000"/>
+        <w:gridCol w:w="1500"/>
+        <w:gridCol w:w="1100"/>
+        <w:gridCol w:w="2000"/>
+        <w:gridCol w:w="2260"/>
+      </w:tblGrid>
+      <w:tr>
+        <w:trPr>
+          <w:tblHeader/>
+        </w:trPr>
+        <w:tc>
+          <w:tcPr>
+            <w:tcW w:type="dxa" w:w="1500"/>
+            <w:tcBorders>
+              <w:top w:val="single" w:color="AAAAAA" w:sz="4"/>
+              <w:left w:val="single" w:color="AAAAAA" w:sz="4"/>
+              <w:bottom w:val="single" w:color="AAAAAA" w:sz="4"/>
+              <w:right w:val="single" w:color="AAAAAA" w:sz="4"/>
+            </w:tcBorders>
+            <w:shd w:fill="E8E8E8" w:color="auto" w:val="clear"/>
+            <w:tcMar>
+              <w:top w:type="dxa" w:w="40"/>
+              <w:left w:type="dxa" w:w="80"/>
+              <w:bottom w:type="dxa" w:w="40"/>
+              <w:right w:type="dxa" w:w="80"/>
+            </w:tcMar>
+          </w:tcPr>
+          <w:p>
+            <w:pPr>
+              <w:jc w:val="center"/>
+            </w:pPr>
+            <w:r>
+              <w:rPr>
+                <w:rFonts w:ascii="Times New Roman" w:cs="Times New Roman" w:eastAsia="Times New Roman" w:hAnsi="Times New Roman"/>
+                <w:b/>
+                <w:bCs/>
+                <w:sz w:val="18"/>
+                <w:szCs w:val="18"/>
+              </w:rPr>
+              <w:t xml:space="preserve">Generator</w:t>
+            </w:r>
+          </w:p>
+        </w:tc>
+        <w:tc>
+          <w:tcPr>
+            <w:tcW w:type="dxa" w:w="1000"/>
+            <w:tcBorders>
+              <w:top w:val="single" w:color="AAAAAA" w:sz="4"/>
+              <w:left w:val="single" w:color="AAAAAA" w:sz="4"/>
+              <w:bottom w:val="single" w:color="AAAAAA" w:sz="4"/>
+              <w:right w:val="single" w:color="AAAAAA" w:sz="4"/>
+            </w:tcBorders>
+            <w:shd w:fill="E8E8E8" w:color="auto" w:val="clear"/>
+            <w:tcMar>
+              <w:top w:type="dxa" w:w="40"/>
+              <w:left w:type="dxa" w:w="80"/>
+              <w:bottom w:type="dxa" w:w="40"/>
+              <w:right w:type="dxa" w:w="80"/>
+            </w:tcMar>
+          </w:tcPr>
+          <w:p>
+            <w:pPr>
+              <w:jc w:val="center"/>
+            </w:pPr>
+            <w:r>
+              <w:rPr>
+                <w:rFonts w:ascii="Times New Roman" w:cs="Times New Roman" w:eastAsia="Times New Roman" w:hAnsi="Times New Roman"/>
+                <w:b/>
+                <w:bCs/>
+                <w:sz w:val="18"/>
+                <w:szCs w:val="18"/>
+              </w:rPr>
+              <w:t xml:space="preserve">Cascade</w:t>
+            </w:r>
+          </w:p>
+        </w:tc>
+        <w:tc>
+          <w:tcPr>
+            <w:tcW w:type="dxa" w:w="1500"/>
+            <w:tcBorders>
+              <w:top w:val="single" w:color="AAAAAA" w:sz="4"/>
+              <w:left w:val="single" w:color="AAAAAA" w:sz="4"/>
+              <w:bottom w:val="single" w:color="AAAAAA" w:sz="4"/>
+              <w:right w:val="single" w:color="AAAAAA" w:sz="4"/>
+            </w:tcBorders>
+            <w:shd w:fill="E8E8E8" w:color="auto" w:val="clear"/>
+            <w:tcMar>
+              <w:top w:type="dxa" w:w="40"/>
+              <w:left w:type="dxa" w:w="80"/>
+              <w:bottom w:type="dxa" w:w="40"/>
+              <w:right w:type="dxa" w:w="80"/>
+            </w:tcMar>
+          </w:tcPr>
+          <w:p>
+            <w:pPr>
+              <w:jc w:val="center"/>
+            </w:pPr>
+            <w:r>
+              <w:rPr>
+                <w:rFonts w:ascii="Times New Roman" w:cs="Times New Roman" w:eastAsia="Times New Roman" w:hAnsi="Times New Roman"/>
+                <w:b/>
+                <w:bCs/>
+                <w:sz w:val="18"/>
+                <w:szCs w:val="18"/>
+              </w:rPr>
+              <w:t xml:space="preserve">Steady NHPP (c = 0)</w:t>
+            </w:r>
+          </w:p>
+        </w:tc>
+        <w:tc>
+          <w:tcPr>
+            <w:tcW w:type="dxa" w:w="1100"/>
+            <w:tcBorders>
+              <w:top w:val="single" w:color="AAAAAA" w:sz="4"/>
+              <w:left w:val="single" w:color="AAAAAA" w:sz="4"/>
+              <w:bottom w:val="single" w:color="AAAAAA" w:sz="4"/>
+              <w:right w:val="single" w:color="AAAAAA" w:sz="4"/>
+            </w:tcBorders>
+            <w:shd w:fill="E8E8E8" w:color="auto" w:val="clear"/>
+            <w:tcMar>
+              <w:top w:type="dxa" w:w="40"/>
+              <w:left w:type="dxa" w:w="80"/>
+              <w:bottom w:type="dxa" w:w="40"/>
+              <w:right w:type="dxa" w:w="80"/>
+            </w:tcMar>
+          </w:tcPr>
+          <w:p>
+            <w:pPr>
+              <w:jc w:val="center"/>
+            </w:pPr>
+            <w:r>
+              <w:rPr>
+                <w:rFonts w:ascii="Times New Roman" w:cs="Times New Roman" w:eastAsia="Times New Roman" w:hAnsi="Times New Roman"/>
+                <w:b/>
+                <w:bCs/>
+                <w:sz w:val="18"/>
+                <w:szCs w:val="18"/>
+              </w:rPr>
+              <w:t xml:space="preserve">c = 0.3</w:t>
+            </w:r>
+          </w:p>
+        </w:tc>
+        <w:tc>
+          <w:tcPr>
+            <w:tcW w:type="dxa" w:w="2000"/>
+            <w:tcBorders>
+              <w:top w:val="single" w:color="AAAAAA" w:sz="4"/>
+              <w:left w:val="single" w:color="AAAAAA" w:sz="4"/>
+              <w:bottom w:val="single" w:color="AAAAAA" w:sz="4"/>
+              <w:right w:val="single" w:color="AAAAAA" w:sz="4"/>
+            </w:tcBorders>
+            <w:shd w:fill="E8E8E8" w:color="auto" w:val="clear"/>
+            <w:tcMar>
+              <w:top w:type="dxa" w:w="40"/>
+              <w:left w:type="dxa" w:w="80"/>
+              <w:bottom w:type="dxa" w:w="40"/>
+              <w:right w:type="dxa" w:w="80"/>
+            </w:tcMar>
+          </w:tcPr>
+          <w:p>
+            <w:pPr>
+              <w:jc w:val="center"/>
+            </w:pPr>
+            <w:r>
+              <w:rPr>
+                <w:rFonts w:ascii="Times New Roman" w:cs="Times New Roman" w:eastAsia="Times New Roman" w:hAnsi="Times New Roman"/>
+                <w:b/>
+                <w:bCs/>
+                <w:sz w:val="18"/>
+                <w:szCs w:val="18"/>
+              </w:rPr>
+              <w:t xml:space="preserve">c = 0.44 + BurstGPT profile</w:t>
+            </w:r>
+          </w:p>
+        </w:tc>
+        <w:tc>
+          <w:tcPr>
+            <w:tcW w:type="dxa" w:w="2260"/>
+            <w:tcBorders>
+              <w:top w:val="single" w:color="AAAAAA" w:sz="4"/>
+              <w:left w:val="single" w:color="AAAAAA" w:sz="4"/>
+              <w:bottom w:val="single" w:color="AAAAAA" w:sz="4"/>
+              <w:right w:val="single" w:color="AAAAAA" w:sz="4"/>
+            </w:tcBorders>
+            <w:shd w:fill="E8E8E8" w:color="auto" w:val="clear"/>
+            <w:tcMar>
+              <w:top w:type="dxa" w:w="40"/>
+              <w:left w:type="dxa" w:w="80"/>
+              <w:bottom w:type="dxa" w:w="40"/>
+              <w:right w:type="dxa" w:w="80"/>
+            </w:tcMar>
+          </w:tcPr>
+          <w:p>
+            <w:pPr>
+              <w:jc w:val="center"/>
+            </w:pPr>
+            <w:r>
+              <w:rPr>
+                <w:rFonts w:ascii="Times New Roman" w:cs="Times New Roman" w:eastAsia="Times New Roman" w:hAnsi="Times New Roman"/>
+                <w:b/>
+                <w:bCs/>
+                <w:sz w:val="18"/>
+                <w:szCs w:val="18"/>
+              </w:rPr>
+              <w:t xml:space="preserve">k∗ Poisson → k∗ negative-binomial (c = 0.44)</w:t>
+            </w:r>
+          </w:p>
+        </w:tc>
+      </w:tr>
+      <w:tr>
+        <w:tc>
+          <w:tcPr>
+            <w:tcW w:type="dxa" w:w="1500"/>
+            <w:tcBorders>
+              <w:top w:val="single" w:color="AAAAAA" w:sz="4"/>
+              <w:left w:val="single" w:color="AAAAAA" w:sz="4"/>
+              <w:bottom w:val="single" w:color="AAAAAA" w:sz="4"/>
+              <w:right w:val="single" w:color="AAAAAA" w:sz="4"/>
+            </w:tcBorders>
+            <w:tcMar>
+              <w:top w:type="dxa" w:w="40"/>
+              <w:left w:type="dxa" w:w="80"/>
+              <w:bottom w:type="dxa" w:w="40"/>
+              <w:right w:type="dxa" w:w="80"/>
+            </w:tcMar>
+          </w:tcPr>
+          <w:p>
+            <w:pPr>
+              <w:jc w:val="center"/>
+            </w:pPr>
+            <w:r>
+              <w:rPr>
+                <w:rFonts w:ascii="Times New Roman" w:cs="Times New Roman" w:eastAsia="Times New Roman" w:hAnsi="Times New Roman"/>
+                <w:b w:val="false"/>
+                <w:bCs w:val="false"/>
+                <w:sz w:val="18"/>
+                <w:szCs w:val="18"/>
+              </w:rPr>
+              <w:t xml:space="preserve">Qwen2.5-0.5B</w:t>
+            </w:r>
+          </w:p>
+        </w:tc>
+        <w:tc>
+          <w:tcPr>
+            <w:tcW w:type="dxa" w:w="1000"/>
+            <w:tcBorders>
+              <w:top w:val="single" w:color="AAAAAA" w:sz="4"/>
+              <w:left w:val="single" w:color="AAAAAA" w:sz="4"/>
+              <w:bottom w:val="single" w:color="AAAAAA" w:sz="4"/>
+              <w:right w:val="single" w:color="AAAAAA" w:sz="4"/>
+            </w:tcBorders>
+            <w:tcMar>
+              <w:top w:type="dxa" w:w="40"/>
+              <w:left w:type="dxa" w:w="80"/>
+              <w:bottom w:type="dxa" w:w="40"/>
+              <w:right w:type="dxa" w:w="80"/>
+            </w:tcMar>
+          </w:tcPr>
+          <w:p>
+            <w:pPr>
+              <w:jc w:val="center"/>
+            </w:pPr>
+            <w:r>
+              <w:rPr>
+                <w:rFonts w:ascii="Times New Roman" w:cs="Times New Roman" w:eastAsia="Times New Roman" w:hAnsi="Times New Roman"/>
+                <w:b w:val="false"/>
+                <w:bCs w:val="false"/>
+                <w:sz w:val="18"/>
+                <w:szCs w:val="18"/>
+              </w:rPr>
+              <w:t xml:space="preserve">none</w:t>
+            </w:r>
+          </w:p>
+        </w:tc>
+        <w:tc>
+          <w:tcPr>
+            <w:tcW w:type="dxa" w:w="1500"/>
+            <w:tcBorders>
+              <w:top w:val="single" w:color="AAAAAA" w:sz="4"/>
+              <w:left w:val="single" w:color="AAAAAA" w:sz="4"/>
+              <w:bottom w:val="single" w:color="AAAAAA" w:sz="4"/>
+              <w:right w:val="single" w:color="AAAAAA" w:sz="4"/>
+            </w:tcBorders>
+            <w:tcMar>
+              <w:top w:type="dxa" w:w="40"/>
+              <w:left w:type="dxa" w:w="80"/>
+              <w:bottom w:type="dxa" w:w="40"/>
+              <w:right w:type="dxa" w:w="80"/>
+            </w:tcMar>
+          </w:tcPr>
+          <w:p>
+            <w:pPr>
+              <w:jc w:val="center"/>
+            </w:pPr>
+            <w:r>
+              <w:rPr>
+                <w:rFonts w:ascii="Times New Roman" w:cs="Times New Roman" w:eastAsia="Times New Roman" w:hAnsi="Times New Roman"/>
+                <w:b w:val="false"/>
+                <w:bCs w:val="false"/>
+                <w:sz w:val="18"/>
+                <w:szCs w:val="18"/>
+              </w:rPr>
+              <w:t xml:space="preserve">6.7%</w:t>
+            </w:r>
+          </w:p>
+        </w:tc>
+        <w:tc>
+          <w:tcPr>
+            <w:tcW w:type="dxa" w:w="1100"/>
+            <w:tcBorders>
+              <w:top w:val="single" w:color="AAAAAA" w:sz="4"/>
+              <w:left w:val="single" w:color="AAAAAA" w:sz="4"/>
+              <w:bottom w:val="single" w:color="AAAAAA" w:sz="4"/>
+              <w:right w:val="single" w:color="AAAAAA" w:sz="4"/>
+            </w:tcBorders>
+            <w:tcMar>
+              <w:top w:type="dxa" w:w="40"/>
+              <w:left w:type="dxa" w:w="80"/>
+              <w:bottom w:type="dxa" w:w="40"/>
+              <w:right w:type="dxa" w:w="80"/>
+            </w:tcMar>
+          </w:tcPr>
+          <w:p>
+            <w:pPr>
+              <w:jc w:val="center"/>
+            </w:pPr>
+            <w:r>
+              <w:rPr>
+                <w:rFonts w:ascii="Times New Roman" w:cs="Times New Roman" w:eastAsia="Times New Roman" w:hAnsi="Times New Roman"/>
+                <w:b w:val="false"/>
+                <w:bCs w:val="false"/>
+                <w:sz w:val="18"/>
+                <w:szCs w:val="18"/>
+              </w:rPr>
+              <w:t xml:space="preserve">25.6%</w:t>
+            </w:r>
+          </w:p>
+        </w:tc>
+        <w:tc>
+          <w:tcPr>
+            <w:tcW w:type="dxa" w:w="2000"/>
+            <w:tcBorders>
+              <w:top w:val="single" w:color="AAAAAA" w:sz="4"/>
+              <w:left w:val="single" w:color="AAAAAA" w:sz="4"/>
+              <w:bottom w:val="single" w:color="AAAAAA" w:sz="4"/>
+              <w:right w:val="single" w:color="AAAAAA" w:sz="4"/>
+            </w:tcBorders>
+            <w:tcMar>
+              <w:top w:type="dxa" w:w="40"/>
+              <w:left w:type="dxa" w:w="80"/>
+              <w:bottom w:type="dxa" w:w="40"/>
+              <w:right w:type="dxa" w:w="80"/>
+            </w:tcMar>
+          </w:tcPr>
+          <w:p>
+            <w:pPr>
+              <w:jc w:val="center"/>
+            </w:pPr>
+            <w:r>
+              <w:rPr>
+                <w:rFonts w:ascii="Times New Roman" w:cs="Times New Roman" w:eastAsia="Times New Roman" w:hAnsi="Times New Roman"/>
+                <w:b w:val="false"/>
+                <w:bCs w:val="false"/>
+                <w:sz w:val="18"/>
+                <w:szCs w:val="18"/>
+              </w:rPr>
+              <w:t xml:space="preserve">32.2%</w:t>
+            </w:r>
+          </w:p>
+        </w:tc>
+        <w:tc>
+          <w:tcPr>
+            <w:tcW w:type="dxa" w:w="2260"/>
+            <w:tcBorders>
+              <w:top w:val="single" w:color="AAAAAA" w:sz="4"/>
+              <w:left w:val="single" w:color="AAAAAA" w:sz="4"/>
+              <w:bottom w:val="single" w:color="AAAAAA" w:sz="4"/>
+              <w:right w:val="single" w:color="AAAAAA" w:sz="4"/>
+            </w:tcBorders>
+            <w:tcMar>
+              <w:top w:type="dxa" w:w="40"/>
+              <w:left w:type="dxa" w:w="80"/>
+              <w:bottom w:type="dxa" w:w="40"/>
+              <w:right w:type="dxa" w:w="80"/>
+            </w:tcMar>
+          </w:tcPr>
+          <w:p>
+            <w:pPr>
+              <w:jc w:val="center"/>
+            </w:pPr>
+            <w:r>
+              <w:rPr>
+                <w:rFonts w:ascii="Times New Roman" w:cs="Times New Roman" w:eastAsia="Times New Roman" w:hAnsi="Times New Roman"/>
+                <w:b w:val="false"/>
+                <w:bCs w:val="false"/>
+                <w:sz w:val="18"/>
+                <w:szCs w:val="18"/>
+              </w:rPr>
+              <w:t xml:space="preserve">135 → 209</w:t>
+            </w:r>
+          </w:p>
+        </w:tc>
+      </w:tr>
+      <w:tr>
+        <w:tc>
+          <w:tcPr>
+            <w:tcW w:type="dxa" w:w="1500"/>
+            <w:tcBorders>
+              <w:top w:val="single" w:color="AAAAAA" w:sz="4"/>
+              <w:left w:val="single" w:color="AAAAAA" w:sz="4"/>
+              <w:bottom w:val="single" w:color="AAAAAA" w:sz="4"/>
+              <w:right w:val="single" w:color="AAAAAA" w:sz="4"/>
+            </w:tcBorders>
+            <w:tcMar>
+              <w:top w:type="dxa" w:w="40"/>
+              <w:left w:type="dxa" w:w="80"/>
+              <w:bottom w:type="dxa" w:w="40"/>
+              <w:right w:type="dxa" w:w="80"/>
+            </w:tcMar>
+          </w:tcPr>
+          <w:p>
+            <w:pPr>
+              <w:jc w:val="center"/>
+            </w:pPr>
+            <w:r>
+              <w:rPr>
+                <w:rFonts w:ascii="Times New Roman" w:cs="Times New Roman" w:eastAsia="Times New Roman" w:hAnsi="Times New Roman"/>
+                <w:b w:val="false"/>
+                <w:bCs w:val="false"/>
+                <w:sz w:val="18"/>
+                <w:szCs w:val="18"/>
+              </w:rPr>
+              <w:t xml:space="preserve">Qwen2.5-0.5B</w:t>
+            </w:r>
+          </w:p>
+        </w:tc>
+        <w:tc>
+          <w:tcPr>
+            <w:tcW w:type="dxa" w:w="1000"/>
+            <w:tcBorders>
+              <w:top w:val="single" w:color="AAAAAA" w:sz="4"/>
+              <w:left w:val="single" w:color="AAAAAA" w:sz="4"/>
+              <w:bottom w:val="single" w:color="AAAAAA" w:sz="4"/>
+              <w:right w:val="single" w:color="AAAAAA" w:sz="4"/>
+            </w:tcBorders>
+            <w:tcMar>
+              <w:top w:type="dxa" w:w="40"/>
+              <w:left w:type="dxa" w:w="80"/>
+              <w:bottom w:type="dxa" w:w="40"/>
+              <w:right w:type="dxa" w:w="80"/>
+            </w:tcMar>
+          </w:tcPr>
+          <w:p>
+            <w:pPr>
+              <w:jc w:val="center"/>
+            </w:pPr>
+            <w:r>
+              <w:rPr>
+                <w:rFonts w:ascii="Times New Roman" w:cs="Times New Roman" w:eastAsia="Times New Roman" w:hAnsi="Times New Roman"/>
+                <w:b w:val="false"/>
+                <w:bCs w:val="false"/>
+                <w:sz w:val="18"/>
+                <w:szCs w:val="18"/>
+              </w:rPr>
+              <w:t xml:space="preserve">L1+L2</w:t>
+            </w:r>
+          </w:p>
+        </w:tc>
+        <w:tc>
+          <w:tcPr>
+            <w:tcW w:type="dxa" w:w="1500"/>
+            <w:tcBorders>
+              <w:top w:val="single" w:color="AAAAAA" w:sz="4"/>
+              <w:left w:val="single" w:color="AAAAAA" w:sz="4"/>
+              <w:bottom w:val="single" w:color="AAAAAA" w:sz="4"/>
+              <w:right w:val="single" w:color="AAAAAA" w:sz="4"/>
+            </w:tcBorders>
+            <w:tcMar>
+              <w:top w:type="dxa" w:w="40"/>
+              <w:left w:type="dxa" w:w="80"/>
+              <w:bottom w:type="dxa" w:w="40"/>
+              <w:right w:type="dxa" w:w="80"/>
+            </w:tcMar>
+          </w:tcPr>
+          <w:p>
+            <w:pPr>
+              <w:jc w:val="center"/>
+            </w:pPr>
+            <w:r>
+              <w:rPr>
+                <w:rFonts w:ascii="Times New Roman" w:cs="Times New Roman" w:eastAsia="Times New Roman" w:hAnsi="Times New Roman"/>
+                <w:b w:val="false"/>
+                <w:bCs w:val="false"/>
+                <w:sz w:val="18"/>
+                <w:szCs w:val="18"/>
+              </w:rPr>
+              <w:t xml:space="preserve">3.3%</w:t>
+            </w:r>
+          </w:p>
+        </w:tc>
+        <w:tc>
+          <w:tcPr>
+            <w:tcW w:type="dxa" w:w="1100"/>
+            <w:tcBorders>
+              <w:top w:val="single" w:color="AAAAAA" w:sz="4"/>
+              <w:left w:val="single" w:color="AAAAAA" w:sz="4"/>
+              <w:bottom w:val="single" w:color="AAAAAA" w:sz="4"/>
+              <w:right w:val="single" w:color="AAAAAA" w:sz="4"/>
+            </w:tcBorders>
+            <w:tcMar>
+              <w:top w:type="dxa" w:w="40"/>
+              <w:left w:type="dxa" w:w="80"/>
+              <w:bottom w:type="dxa" w:w="40"/>
+              <w:right w:type="dxa" w:w="80"/>
+            </w:tcMar>
+          </w:tcPr>
+          <w:p>
+            <w:pPr>
+              <w:jc w:val="center"/>
+            </w:pPr>
+            <w:r>
+              <w:rPr>
+                <w:rFonts w:ascii="Times New Roman" w:cs="Times New Roman" w:eastAsia="Times New Roman" w:hAnsi="Times New Roman"/>
+                <w:b w:val="false"/>
+                <w:bCs w:val="false"/>
+                <w:sz w:val="18"/>
+                <w:szCs w:val="18"/>
+              </w:rPr>
+              <w:t xml:space="preserve">10.0%</w:t>
+            </w:r>
+          </w:p>
+        </w:tc>
+        <w:tc>
+          <w:tcPr>
+            <w:tcW w:type="dxa" w:w="2000"/>
+            <w:tcBorders>
+              <w:top w:val="single" w:color="AAAAAA" w:sz="4"/>
+              <w:left w:val="single" w:color="AAAAAA" w:sz="4"/>
+              <w:bottom w:val="single" w:color="AAAAAA" w:sz="4"/>
+              <w:right w:val="single" w:color="AAAAAA" w:sz="4"/>
+            </w:tcBorders>
+            <w:tcMar>
+              <w:top w:type="dxa" w:w="40"/>
+              <w:left w:type="dxa" w:w="80"/>
+              <w:bottom w:type="dxa" w:w="40"/>
+              <w:right w:type="dxa" w:w="80"/>
+            </w:tcMar>
+          </w:tcPr>
+          <w:p>
+            <w:pPr>
+              <w:jc w:val="center"/>
+            </w:pPr>
+            <w:r>
+              <w:rPr>
+                <w:rFonts w:ascii="Times New Roman" w:cs="Times New Roman" w:eastAsia="Times New Roman" w:hAnsi="Times New Roman"/>
+                <w:b w:val="false"/>
+                <w:bCs w:val="false"/>
+                <w:sz w:val="18"/>
+                <w:szCs w:val="18"/>
+              </w:rPr>
+              <w:t xml:space="preserve">14.4%</w:t>
+            </w:r>
+          </w:p>
+        </w:tc>
+        <w:tc>
+          <w:tcPr>
+            <w:tcW w:type="dxa" w:w="2260"/>
+            <w:tcBorders>
+              <w:top w:val="single" w:color="AAAAAA" w:sz="4"/>
+              <w:left w:val="single" w:color="AAAAAA" w:sz="4"/>
+              <w:bottom w:val="single" w:color="AAAAAA" w:sz="4"/>
+              <w:right w:val="single" w:color="AAAAAA" w:sz="4"/>
+            </w:tcBorders>
+            <w:tcMar>
+              <w:top w:type="dxa" w:w="40"/>
+              <w:left w:type="dxa" w:w="80"/>
+              <w:bottom w:type="dxa" w:w="40"/>
+              <w:right w:type="dxa" w:w="80"/>
+            </w:tcMar>
+          </w:tcPr>
+          <w:p>
+            <w:pPr>
+              <w:jc w:val="center"/>
+            </w:pPr>
+            <w:r>
+              <w:rPr>
+                <w:rFonts w:ascii="Times New Roman" w:cs="Times New Roman" w:eastAsia="Times New Roman" w:hAnsi="Times New Roman"/>
+                <w:b w:val="false"/>
+                <w:bCs w:val="false"/>
+                <w:sz w:val="18"/>
+                <w:szCs w:val="18"/>
+              </w:rPr>
+              <w:t xml:space="preserve">18 → 23</w:t>
+            </w:r>
+          </w:p>
+        </w:tc>
+      </w:tr>
+      <w:tr>
+        <w:tc>
+          <w:tcPr>
+            <w:tcW w:type="dxa" w:w="1500"/>
+            <w:tcBorders>
+              <w:top w:val="single" w:color="AAAAAA" w:sz="4"/>
+              <w:left w:val="single" w:color="AAAAAA" w:sz="4"/>
+              <w:bottom w:val="single" w:color="AAAAAA" w:sz="4"/>
+              <w:right w:val="single" w:color="AAAAAA" w:sz="4"/>
+            </w:tcBorders>
+            <w:tcMar>
+              <w:top w:type="dxa" w:w="40"/>
+              <w:left w:type="dxa" w:w="80"/>
+              <w:bottom w:type="dxa" w:w="40"/>
+              <w:right w:type="dxa" w:w="80"/>
+            </w:tcMar>
+          </w:tcPr>
+          <w:p>
+            <w:pPr>
+              <w:jc w:val="center"/>
+            </w:pPr>
+            <w:r>
+              <w:rPr>
+                <w:rFonts w:ascii="Times New Roman" w:cs="Times New Roman" w:eastAsia="Times New Roman" w:hAnsi="Times New Roman"/>
+                <w:b w:val="false"/>
+                <w:bCs w:val="false"/>
+                <w:sz w:val="18"/>
+                <w:szCs w:val="18"/>
+              </w:rPr>
+              <w:t xml:space="preserve">SmolLM2-360M</w:t>
+            </w:r>
+          </w:p>
+        </w:tc>
+        <w:tc>
+          <w:tcPr>
+            <w:tcW w:type="dxa" w:w="1000"/>
+            <w:tcBorders>
+              <w:top w:val="single" w:color="AAAAAA" w:sz="4"/>
+              <w:left w:val="single" w:color="AAAAAA" w:sz="4"/>
+              <w:bottom w:val="single" w:color="AAAAAA" w:sz="4"/>
+              <w:right w:val="single" w:color="AAAAAA" w:sz="4"/>
+            </w:tcBorders>
+            <w:tcMar>
+              <w:top w:type="dxa" w:w="40"/>
+              <w:left w:type="dxa" w:w="80"/>
+              <w:bottom w:type="dxa" w:w="40"/>
+              <w:right w:type="dxa" w:w="80"/>
+            </w:tcMar>
+          </w:tcPr>
+          <w:p>
+            <w:pPr>
+              <w:jc w:val="center"/>
+            </w:pPr>
+            <w:r>
+              <w:rPr>
+                <w:rFonts w:ascii="Times New Roman" w:cs="Times New Roman" w:eastAsia="Times New Roman" w:hAnsi="Times New Roman"/>
+                <w:b w:val="false"/>
+                <w:bCs w:val="false"/>
+                <w:sz w:val="18"/>
+                <w:szCs w:val="18"/>
+              </w:rPr>
+              <w:t xml:space="preserve">none</w:t>
+            </w:r>
+          </w:p>
+        </w:tc>
+        <w:tc>
+          <w:tcPr>
+            <w:tcW w:type="dxa" w:w="1500"/>
+            <w:tcBorders>
+              <w:top w:val="single" w:color="AAAAAA" w:sz="4"/>
+              <w:left w:val="single" w:color="AAAAAA" w:sz="4"/>
+              <w:bottom w:val="single" w:color="AAAAAA" w:sz="4"/>
+              <w:right w:val="single" w:color="AAAAAA" w:sz="4"/>
+            </w:tcBorders>
+            <w:tcMar>
+              <w:top w:type="dxa" w:w="40"/>
+              <w:left w:type="dxa" w:w="80"/>
+              <w:bottom w:type="dxa" w:w="40"/>
+              <w:right w:type="dxa" w:w="80"/>
+            </w:tcMar>
+          </w:tcPr>
+          <w:p>
+            <w:pPr>
+              <w:jc w:val="center"/>
+            </w:pPr>
+            <w:r>
+              <w:rPr>
+                <w:rFonts w:ascii="Times New Roman" w:cs="Times New Roman" w:eastAsia="Times New Roman" w:hAnsi="Times New Roman"/>
+                <w:b w:val="false"/>
+                <w:bCs w:val="false"/>
+                <w:sz w:val="18"/>
+                <w:szCs w:val="18"/>
+              </w:rPr>
+              <w:t xml:space="preserve">5.6%</w:t>
+            </w:r>
+          </w:p>
+        </w:tc>
+        <w:tc>
+          <w:tcPr>
+            <w:tcW w:type="dxa" w:w="1100"/>
+            <w:tcBorders>
+              <w:top w:val="single" w:color="AAAAAA" w:sz="4"/>
+              <w:left w:val="single" w:color="AAAAAA" w:sz="4"/>
+              <w:bottom w:val="single" w:color="AAAAAA" w:sz="4"/>
+              <w:right w:val="single" w:color="AAAAAA" w:sz="4"/>
+            </w:tcBorders>
+            <w:tcMar>
+              <w:top w:type="dxa" w:w="40"/>
+              <w:left w:type="dxa" w:w="80"/>
+              <w:bottom w:type="dxa" w:w="40"/>
+              <w:right w:type="dxa" w:w="80"/>
+            </w:tcMar>
+          </w:tcPr>
+          <w:p>
+            <w:pPr>
+              <w:jc w:val="center"/>
+            </w:pPr>
+            <w:r>
+              <w:rPr>
+                <w:rFonts w:ascii="Times New Roman" w:cs="Times New Roman" w:eastAsia="Times New Roman" w:hAnsi="Times New Roman"/>
+                <w:b w:val="false"/>
+                <w:bCs w:val="false"/>
+                <w:sz w:val="18"/>
+                <w:szCs w:val="18"/>
+              </w:rPr>
+              <w:t xml:space="preserve">27.8%</w:t>
+            </w:r>
+          </w:p>
+        </w:tc>
+        <w:tc>
+          <w:tcPr>
+            <w:tcW w:type="dxa" w:w="2000"/>
+            <w:tcBorders>
+              <w:top w:val="single" w:color="AAAAAA" w:sz="4"/>
+              <w:left w:val="single" w:color="AAAAAA" w:sz="4"/>
+              <w:bottom w:val="single" w:color="AAAAAA" w:sz="4"/>
+              <w:right w:val="single" w:color="AAAAAA" w:sz="4"/>
+            </w:tcBorders>
+            <w:tcMar>
+              <w:top w:type="dxa" w:w="40"/>
+              <w:left w:type="dxa" w:w="80"/>
+              <w:bottom w:type="dxa" w:w="40"/>
+              <w:right w:type="dxa" w:w="80"/>
+            </w:tcMar>
+          </w:tcPr>
+          <w:p>
+            <w:pPr>
+              <w:jc w:val="center"/>
+            </w:pPr>
+            <w:r>
+              <w:rPr>
+                <w:rFonts w:ascii="Times New Roman" w:cs="Times New Roman" w:eastAsia="Times New Roman" w:hAnsi="Times New Roman"/>
+                <w:b w:val="false"/>
+                <w:bCs w:val="false"/>
+                <w:sz w:val="18"/>
+                <w:szCs w:val="18"/>
+              </w:rPr>
+              <w:t xml:space="preserve">32.2%</w:t>
+            </w:r>
+          </w:p>
+        </w:tc>
+        <w:tc>
+          <w:tcPr>
+            <w:tcW w:type="dxa" w:w="2260"/>
+            <w:tcBorders>
+              <w:top w:val="single" w:color="AAAAAA" w:sz="4"/>
+              <w:left w:val="single" w:color="AAAAAA" w:sz="4"/>
+              <w:bottom w:val="single" w:color="AAAAAA" w:sz="4"/>
+              <w:right w:val="single" w:color="AAAAAA" w:sz="4"/>
+            </w:tcBorders>
+            <w:tcMar>
+              <w:top w:type="dxa" w:w="40"/>
+              <w:left w:type="dxa" w:w="80"/>
+              <w:bottom w:type="dxa" w:w="40"/>
+              <w:right w:type="dxa" w:w="80"/>
+            </w:tcMar>
+          </w:tcPr>
+          <w:p>
+            <w:pPr>
+              <w:jc w:val="center"/>
+            </w:pPr>
+            <w:r>
+              <w:rPr>
+                <w:rFonts w:ascii="Times New Roman" w:cs="Times New Roman" w:eastAsia="Times New Roman" w:hAnsi="Times New Roman"/>
+                <w:b w:val="false"/>
+                <w:bCs w:val="false"/>
+                <w:sz w:val="18"/>
+                <w:szCs w:val="18"/>
+              </w:rPr>
+              <w:t xml:space="preserve">144 → 225</w:t>
+            </w:r>
+          </w:p>
+        </w:tc>
+      </w:tr>
+      <w:tr>
+        <w:tc>
+          <w:tcPr>
+            <w:tcW w:type="dxa" w:w="1500"/>
+            <w:tcBorders>
+              <w:top w:val="single" w:color="AAAAAA" w:sz="4"/>
+              <w:left w:val="single" w:color="AAAAAA" w:sz="4"/>
+              <w:bottom w:val="single" w:color="AAAAAA" w:sz="4"/>
+              <w:right w:val="single" w:color="AAAAAA" w:sz="4"/>
+            </w:tcBorders>
+            <w:tcMar>
+              <w:top w:type="dxa" w:w="40"/>
+              <w:left w:type="dxa" w:w="80"/>
+              <w:bottom w:type="dxa" w:w="40"/>
+              <w:right w:type="dxa" w:w="80"/>
+            </w:tcMar>
+          </w:tcPr>
+          <w:p>
+            <w:pPr>
+              <w:jc w:val="center"/>
+            </w:pPr>
+            <w:r>
+              <w:rPr>
+                <w:rFonts w:ascii="Times New Roman" w:cs="Times New Roman" w:eastAsia="Times New Roman" w:hAnsi="Times New Roman"/>
+                <w:b w:val="false"/>
+                <w:bCs w:val="false"/>
+                <w:sz w:val="18"/>
+                <w:szCs w:val="18"/>
+              </w:rPr>
+              <w:t xml:space="preserve">SmolLM2-360M</w:t>
+            </w:r>
+          </w:p>
+        </w:tc>
+        <w:tc>
+          <w:tcPr>
+            <w:tcW w:type="dxa" w:w="1000"/>
+            <w:tcBorders>
+              <w:top w:val="single" w:color="AAAAAA" w:sz="4"/>
+              <w:left w:val="single" w:color="AAAAAA" w:sz="4"/>
+              <w:bottom w:val="single" w:color="AAAAAA" w:sz="4"/>
+              <w:right w:val="single" w:color="AAAAAA" w:sz="4"/>
+            </w:tcBorders>
+            <w:tcMar>
+              <w:top w:type="dxa" w:w="40"/>
+              <w:left w:type="dxa" w:w="80"/>
+              <w:bottom w:type="dxa" w:w="40"/>
+              <w:right w:type="dxa" w:w="80"/>
+            </w:tcMar>
+          </w:tcPr>
+          <w:p>
+            <w:pPr>
+              <w:jc w:val="center"/>
+            </w:pPr>
+            <w:r>
+              <w:rPr>
+                <w:rFonts w:ascii="Times New Roman" w:cs="Times New Roman" w:eastAsia="Times New Roman" w:hAnsi="Times New Roman"/>
+                <w:b w:val="false"/>
+                <w:bCs w:val="false"/>
+                <w:sz w:val="18"/>
+                <w:szCs w:val="18"/>
+              </w:rPr>
+              <w:t xml:space="preserve">L1+L2</w:t>
+            </w:r>
+          </w:p>
+        </w:tc>
+        <w:tc>
+          <w:tcPr>
+            <w:tcW w:type="dxa" w:w="1500"/>
+            <w:tcBorders>
+              <w:top w:val="single" w:color="AAAAAA" w:sz="4"/>
+              <w:left w:val="single" w:color="AAAAAA" w:sz="4"/>
+              <w:bottom w:val="single" w:color="AAAAAA" w:sz="4"/>
+              <w:right w:val="single" w:color="AAAAAA" w:sz="4"/>
+            </w:tcBorders>
+            <w:tcMar>
+              <w:top w:type="dxa" w:w="40"/>
+              <w:left w:type="dxa" w:w="80"/>
+              <w:bottom w:type="dxa" w:w="40"/>
+              <w:right w:type="dxa" w:w="80"/>
+            </w:tcMar>
+          </w:tcPr>
+          <w:p>
+            <w:pPr>
+              <w:jc w:val="center"/>
+            </w:pPr>
+            <w:r>
+              <w:rPr>
+                <w:rFonts w:ascii="Times New Roman" w:cs="Times New Roman" w:eastAsia="Times New Roman" w:hAnsi="Times New Roman"/>
+                <w:b w:val="false"/>
+                <w:bCs w:val="false"/>
+                <w:sz w:val="18"/>
+                <w:szCs w:val="18"/>
+              </w:rPr>
+              <w:t xml:space="preserve">5.6%</w:t>
+            </w:r>
+          </w:p>
+        </w:tc>
+        <w:tc>
+          <w:tcPr>
+            <w:tcW w:type="dxa" w:w="1100"/>
+            <w:tcBorders>
+              <w:top w:val="single" w:color="AAAAAA" w:sz="4"/>
+              <w:left w:val="single" w:color="AAAAAA" w:sz="4"/>
+              <w:bottom w:val="single" w:color="AAAAAA" w:sz="4"/>
+              <w:right w:val="single" w:color="AAAAAA" w:sz="4"/>
+            </w:tcBorders>
+            <w:tcMar>
+              <w:top w:type="dxa" w:w="40"/>
+              <w:left w:type="dxa" w:w="80"/>
+              <w:bottom w:type="dxa" w:w="40"/>
+              <w:right w:type="dxa" w:w="80"/>
+            </w:tcMar>
+          </w:tcPr>
+          <w:p>
+            <w:pPr>
+              <w:jc w:val="center"/>
+            </w:pPr>
+            <w:r>
+              <w:rPr>
+                <w:rFonts w:ascii="Times New Roman" w:cs="Times New Roman" w:eastAsia="Times New Roman" w:hAnsi="Times New Roman"/>
+                <w:b w:val="false"/>
+                <w:bCs w:val="false"/>
+                <w:sz w:val="18"/>
+                <w:szCs w:val="18"/>
+              </w:rPr>
+              <w:t xml:space="preserve">11.1%</w:t>
+            </w:r>
+          </w:p>
+        </w:tc>
+        <w:tc>
+          <w:tcPr>
+            <w:tcW w:type="dxa" w:w="2000"/>
+            <w:tcBorders>
+              <w:top w:val="single" w:color="AAAAAA" w:sz="4"/>
+              <w:left w:val="single" w:color="AAAAAA" w:sz="4"/>
+              <w:bottom w:val="single" w:color="AAAAAA" w:sz="4"/>
+              <w:right w:val="single" w:color="AAAAAA" w:sz="4"/>
+            </w:tcBorders>
+            <w:tcMar>
+              <w:top w:type="dxa" w:w="40"/>
+              <w:left w:type="dxa" w:w="80"/>
+              <w:bottom w:type="dxa" w:w="40"/>
+              <w:right w:type="dxa" w:w="80"/>
+            </w:tcMar>
+          </w:tcPr>
+          <w:p>
+            <w:pPr>
+              <w:jc w:val="center"/>
+            </w:pPr>
+            <w:r>
+              <w:rPr>
+                <w:rFonts w:ascii="Times New Roman" w:cs="Times New Roman" w:eastAsia="Times New Roman" w:hAnsi="Times New Roman"/>
+                <w:b w:val="false"/>
+                <w:bCs w:val="false"/>
+                <w:sz w:val="18"/>
+                <w:szCs w:val="18"/>
+              </w:rPr>
+              <w:t xml:space="preserve">6.7%</w:t>
+            </w:r>
+          </w:p>
+        </w:tc>
+        <w:tc>
+          <w:tcPr>
+            <w:tcW w:type="dxa" w:w="2260"/>
+            <w:tcBorders>
+              <w:top w:val="single" w:color="AAAAAA" w:sz="4"/>
+              <w:left w:val="single" w:color="AAAAAA" w:sz="4"/>
+              <w:bottom w:val="single" w:color="AAAAAA" w:sz="4"/>
+              <w:right w:val="single" w:color="AAAAAA" w:sz="4"/>
+            </w:tcBorders>
+            <w:tcMar>
+              <w:top w:type="dxa" w:w="40"/>
+              <w:left w:type="dxa" w:w="80"/>
+              <w:bottom w:type="dxa" w:w="40"/>
+              <w:right w:type="dxa" w:w="80"/>
+            </w:tcMar>
+          </w:tcPr>
+          <w:p>
+            <w:pPr>
+              <w:jc w:val="center"/>
+            </w:pPr>
+            <w:r>
+              <w:rPr>
+                <w:rFonts w:ascii="Times New Roman" w:cs="Times New Roman" w:eastAsia="Times New Roman" w:hAnsi="Times New Roman"/>
+                <w:b w:val="false"/>
+                <w:bCs w:val="false"/>
+                <w:sz w:val="18"/>
+                <w:szCs w:val="18"/>
+              </w:rPr>
+              <w:t xml:space="preserve">8 → 9</w:t>
+            </w:r>
+          </w:p>
+        </w:tc>
+      </w:tr>
+      <w:tr>
+        <w:tc>
+          <w:tcPr>
+            <w:tcW w:type="dxa" w:w="1500"/>
+            <w:tcBorders>
+              <w:top w:val="single" w:color="AAAAAA" w:sz="4"/>
+              <w:left w:val="single" w:color="AAAAAA" w:sz="4"/>
+              <w:bottom w:val="single" w:color="AAAAAA" w:sz="4"/>
+              <w:right w:val="single" w:color="AAAAAA" w:sz="4"/>
+            </w:tcBorders>
+            <w:tcMar>
+              <w:top w:type="dxa" w:w="40"/>
+              <w:left w:type="dxa" w:w="80"/>
+              <w:bottom w:type="dxa" w:w="40"/>
+              <w:right w:type="dxa" w:w="80"/>
+            </w:tcMar>
+          </w:tcPr>
+          <w:p>
+            <w:pPr>
+              <w:jc w:val="center"/>
+            </w:pPr>
+            <w:r>
+              <w:rPr>
+                <w:rFonts w:ascii="Times New Roman" w:cs="Times New Roman" w:eastAsia="Times New Roman" w:hAnsi="Times New Roman"/>
+                <w:b w:val="false"/>
+                <w:bCs w:val="false"/>
+                <w:sz w:val="18"/>
+                <w:szCs w:val="18"/>
+              </w:rPr>
+              <w:t xml:space="preserve">Qwen2.5-1.5B</w:t>
+            </w:r>
+          </w:p>
+        </w:tc>
+        <w:tc>
+          <w:tcPr>
+            <w:tcW w:type="dxa" w:w="1000"/>
+            <w:tcBorders>
+              <w:top w:val="single" w:color="AAAAAA" w:sz="4"/>
+              <w:left w:val="single" w:color="AAAAAA" w:sz="4"/>
+              <w:bottom w:val="single" w:color="AAAAAA" w:sz="4"/>
+              <w:right w:val="single" w:color="AAAAAA" w:sz="4"/>
+            </w:tcBorders>
+            <w:tcMar>
+              <w:top w:type="dxa" w:w="40"/>
+              <w:left w:type="dxa" w:w="80"/>
+              <w:bottom w:type="dxa" w:w="40"/>
+              <w:right w:type="dxa" w:w="80"/>
+            </w:tcMar>
+          </w:tcPr>
+          <w:p>
+            <w:pPr>
+              <w:jc w:val="center"/>
+            </w:pPr>
+            <w:r>
+              <w:rPr>
+                <w:rFonts w:ascii="Times New Roman" w:cs="Times New Roman" w:eastAsia="Times New Roman" w:hAnsi="Times New Roman"/>
+                <w:b w:val="false"/>
+                <w:bCs w:val="false"/>
+                <w:sz w:val="18"/>
+                <w:szCs w:val="18"/>
+              </w:rPr>
+              <w:t xml:space="preserve">none</w:t>
+            </w:r>
+          </w:p>
+        </w:tc>
+        <w:tc>
+          <w:tcPr>
+            <w:tcW w:type="dxa" w:w="1500"/>
+            <w:tcBorders>
+              <w:top w:val="single" w:color="AAAAAA" w:sz="4"/>
+              <w:left w:val="single" w:color="AAAAAA" w:sz="4"/>
+              <w:bottom w:val="single" w:color="AAAAAA" w:sz="4"/>
+              <w:right w:val="single" w:color="AAAAAA" w:sz="4"/>
+            </w:tcBorders>
+            <w:tcMar>
+              <w:top w:type="dxa" w:w="40"/>
+              <w:left w:type="dxa" w:w="80"/>
+              <w:bottom w:type="dxa" w:w="40"/>
+              <w:right w:type="dxa" w:w="80"/>
+            </w:tcMar>
+          </w:tcPr>
+          <w:p>
+            <w:pPr>
+              <w:jc w:val="center"/>
+            </w:pPr>
+            <w:r>
+              <w:rPr>
+                <w:rFonts w:ascii="Times New Roman" w:cs="Times New Roman" w:eastAsia="Times New Roman" w:hAnsi="Times New Roman"/>
+                <w:b w:val="false"/>
+                <w:bCs w:val="false"/>
+                <w:sz w:val="18"/>
+                <w:szCs w:val="18"/>
+              </w:rPr>
+              <w:t xml:space="preserve">8.9%</w:t>
+            </w:r>
+          </w:p>
+        </w:tc>
+        <w:tc>
+          <w:tcPr>
+            <w:tcW w:type="dxa" w:w="1100"/>
+            <w:tcBorders>
+              <w:top w:val="single" w:color="AAAAAA" w:sz="4"/>
+              <w:left w:val="single" w:color="AAAAAA" w:sz="4"/>
+              <w:bottom w:val="single" w:color="AAAAAA" w:sz="4"/>
+              <w:right w:val="single" w:color="AAAAAA" w:sz="4"/>
+            </w:tcBorders>
+            <w:tcMar>
+              <w:top w:type="dxa" w:w="40"/>
+              <w:left w:type="dxa" w:w="80"/>
+              <w:bottom w:type="dxa" w:w="40"/>
+              <w:right w:type="dxa" w:w="80"/>
+            </w:tcMar>
+          </w:tcPr>
+          <w:p>
+            <w:pPr>
+              <w:jc w:val="center"/>
+            </w:pPr>
+            <w:r>
+              <w:rPr>
+                <w:rFonts w:ascii="Times New Roman" w:cs="Times New Roman" w:eastAsia="Times New Roman" w:hAnsi="Times New Roman"/>
+                <w:b w:val="false"/>
+                <w:bCs w:val="false"/>
+                <w:sz w:val="18"/>
+                <w:szCs w:val="18"/>
+              </w:rPr>
+              <w:t xml:space="preserve">23.3%</w:t>
+            </w:r>
+          </w:p>
+        </w:tc>
+        <w:tc>
+          <w:tcPr>
+            <w:tcW w:type="dxa" w:w="2000"/>
+            <w:tcBorders>
+              <w:top w:val="single" w:color="AAAAAA" w:sz="4"/>
+              <w:left w:val="single" w:color="AAAAAA" w:sz="4"/>
+              <w:bottom w:val="single" w:color="AAAAAA" w:sz="4"/>
+              <w:right w:val="single" w:color="AAAAAA" w:sz="4"/>
+            </w:tcBorders>
+            <w:tcMar>
+              <w:top w:type="dxa" w:w="40"/>
+              <w:left w:type="dxa" w:w="80"/>
+              <w:bottom w:type="dxa" w:w="40"/>
+              <w:right w:type="dxa" w:w="80"/>
+            </w:tcMar>
+          </w:tcPr>
+          <w:p>
+            <w:pPr>
+              <w:jc w:val="center"/>
+            </w:pPr>
+            <w:r>
+              <w:rPr>
+                <w:rFonts w:ascii="Times New Roman" w:cs="Times New Roman" w:eastAsia="Times New Roman" w:hAnsi="Times New Roman"/>
+                <w:b w:val="false"/>
+                <w:bCs w:val="false"/>
+                <w:sz w:val="18"/>
+                <w:szCs w:val="18"/>
+              </w:rPr>
+              <w:t xml:space="preserve">30.0%</w:t>
+            </w:r>
+          </w:p>
+        </w:tc>
+        <w:tc>
+          <w:tcPr>
+            <w:tcW w:type="dxa" w:w="2260"/>
+            <w:tcBorders>
+              <w:top w:val="single" w:color="AAAAAA" w:sz="4"/>
+              <w:left w:val="single" w:color="AAAAAA" w:sz="4"/>
+              <w:bottom w:val="single" w:color="AAAAAA" w:sz="4"/>
+              <w:right w:val="single" w:color="AAAAAA" w:sz="4"/>
+            </w:tcBorders>
+            <w:tcMar>
+              <w:top w:type="dxa" w:w="40"/>
+              <w:left w:type="dxa" w:w="80"/>
+              <w:bottom w:type="dxa" w:w="40"/>
+              <w:right w:type="dxa" w:w="80"/>
+            </w:tcMar>
+          </w:tcPr>
+          <w:p>
+            <w:pPr>
+              <w:jc w:val="center"/>
+            </w:pPr>
+            <w:r>
+              <w:rPr>
+                <w:rFonts w:ascii="Times New Roman" w:cs="Times New Roman" w:eastAsia="Times New Roman" w:hAnsi="Times New Roman"/>
+                <w:b w:val="false"/>
+                <w:bCs w:val="false"/>
+                <w:sz w:val="18"/>
+                <w:szCs w:val="18"/>
+              </w:rPr>
+              <w:t xml:space="preserve">106 → 162</w:t>
+            </w:r>
+          </w:p>
+        </w:tc>
+      </w:tr>
+      <w:tr>
+        <w:tc>
+          <w:tcPr>
+            <w:tcW w:type="dxa" w:w="1500"/>
+            <w:tcBorders>
+              <w:top w:val="single" w:color="AAAAAA" w:sz="4"/>
+              <w:left w:val="single" w:color="AAAAAA" w:sz="4"/>
+              <w:bottom w:val="single" w:color="AAAAAA" w:sz="4"/>
+              <w:right w:val="single" w:color="AAAAAA" w:sz="4"/>
+            </w:tcBorders>
+            <w:tcMar>
+              <w:top w:type="dxa" w:w="40"/>
+              <w:left w:type="dxa" w:w="80"/>
+              <w:bottom w:type="dxa" w:w="40"/>
+              <w:right w:type="dxa" w:w="80"/>
+            </w:tcMar>
+          </w:tcPr>
+          <w:p>
+            <w:pPr>
+              <w:jc w:val="center"/>
+            </w:pPr>
+            <w:r>
+              <w:rPr>
+                <w:rFonts w:ascii="Times New Roman" w:cs="Times New Roman" w:eastAsia="Times New Roman" w:hAnsi="Times New Roman"/>
+                <w:b w:val="false"/>
+                <w:bCs w:val="false"/>
+                <w:sz w:val="18"/>
+                <w:szCs w:val="18"/>
+              </w:rPr>
+              <w:t xml:space="preserve">Qwen2.5-1.5B</w:t>
+            </w:r>
+          </w:p>
+        </w:tc>
+        <w:tc>
+          <w:tcPr>
+            <w:tcW w:type="dxa" w:w="1000"/>
+            <w:tcBorders>
+              <w:top w:val="single" w:color="AAAAAA" w:sz="4"/>
+              <w:left w:val="single" w:color="AAAAAA" w:sz="4"/>
+              <w:bottom w:val="single" w:color="AAAAAA" w:sz="4"/>
+              <w:right w:val="single" w:color="AAAAAA" w:sz="4"/>
+            </w:tcBorders>
+            <w:tcMar>
+              <w:top w:type="dxa" w:w="40"/>
+              <w:left w:type="dxa" w:w="80"/>
+              <w:bottom w:type="dxa" w:w="40"/>
+              <w:right w:type="dxa" w:w="80"/>
+            </w:tcMar>
+          </w:tcPr>
+          <w:p>
+            <w:pPr>
+              <w:jc w:val="center"/>
+            </w:pPr>
+            <w:r>
+              <w:rPr>
+                <w:rFonts w:ascii="Times New Roman" w:cs="Times New Roman" w:eastAsia="Times New Roman" w:hAnsi="Times New Roman"/>
+                <w:b w:val="false"/>
+                <w:bCs w:val="false"/>
+                <w:sz w:val="18"/>
+                <w:szCs w:val="18"/>
+              </w:rPr>
+              <w:t xml:space="preserve">L1+L2</w:t>
+            </w:r>
+          </w:p>
+        </w:tc>
+        <w:tc>
+          <w:tcPr>
+            <w:tcW w:type="dxa" w:w="1500"/>
+            <w:tcBorders>
+              <w:top w:val="single" w:color="AAAAAA" w:sz="4"/>
+              <w:left w:val="single" w:color="AAAAAA" w:sz="4"/>
+              <w:bottom w:val="single" w:color="AAAAAA" w:sz="4"/>
+              <w:right w:val="single" w:color="AAAAAA" w:sz="4"/>
+            </w:tcBorders>
+            <w:tcMar>
+              <w:top w:type="dxa" w:w="40"/>
+              <w:left w:type="dxa" w:w="80"/>
+              <w:bottom w:type="dxa" w:w="40"/>
+              <w:right w:type="dxa" w:w="80"/>
+            </w:tcMar>
+          </w:tcPr>
+          <w:p>
+            <w:pPr>
+              <w:jc w:val="center"/>
+            </w:pPr>
+            <w:r>
+              <w:rPr>
+                <w:rFonts w:ascii="Times New Roman" w:cs="Times New Roman" w:eastAsia="Times New Roman" w:hAnsi="Times New Roman"/>
+                <w:b w:val="false"/>
+                <w:bCs w:val="false"/>
+                <w:sz w:val="18"/>
+                <w:szCs w:val="18"/>
+              </w:rPr>
+              <w:t xml:space="preserve">3.3%</w:t>
+            </w:r>
+          </w:p>
+        </w:tc>
+        <w:tc>
+          <w:tcPr>
+            <w:tcW w:type="dxa" w:w="1100"/>
+            <w:tcBorders>
+              <w:top w:val="single" w:color="AAAAAA" w:sz="4"/>
+              <w:left w:val="single" w:color="AAAAAA" w:sz="4"/>
+              <w:bottom w:val="single" w:color="AAAAAA" w:sz="4"/>
+              <w:right w:val="single" w:color="AAAAAA" w:sz="4"/>
+            </w:tcBorders>
+            <w:tcMar>
+              <w:top w:type="dxa" w:w="40"/>
+              <w:left w:type="dxa" w:w="80"/>
+              <w:bottom w:type="dxa" w:w="40"/>
+              <w:right w:type="dxa" w:w="80"/>
+            </w:tcMar>
+          </w:tcPr>
+          <w:p>
+            <w:pPr>
+              <w:jc w:val="center"/>
+            </w:pPr>
+            <w:r>
+              <w:rPr>
+                <w:rFonts w:ascii="Times New Roman" w:cs="Times New Roman" w:eastAsia="Times New Roman" w:hAnsi="Times New Roman"/>
+                <w:b w:val="false"/>
+                <w:bCs w:val="false"/>
+                <w:sz w:val="18"/>
+                <w:szCs w:val="18"/>
+              </w:rPr>
+              <w:t xml:space="preserve">10.0%</w:t>
+            </w:r>
+          </w:p>
+        </w:tc>
+        <w:tc>
+          <w:tcPr>
+            <w:tcW w:type="dxa" w:w="2000"/>
+            <w:tcBorders>
+              <w:top w:val="single" w:color="AAAAAA" w:sz="4"/>
+              <w:left w:val="single" w:color="AAAAAA" w:sz="4"/>
+              <w:bottom w:val="single" w:color="AAAAAA" w:sz="4"/>
+              <w:right w:val="single" w:color="AAAAAA" w:sz="4"/>
+            </w:tcBorders>
+            <w:tcMar>
+              <w:top w:type="dxa" w:w="40"/>
+              <w:left w:type="dxa" w:w="80"/>
+              <w:bottom w:type="dxa" w:w="40"/>
+              <w:right w:type="dxa" w:w="80"/>
+            </w:tcMar>
+          </w:tcPr>
+          <w:p>
+            <w:pPr>
+              <w:jc w:val="center"/>
+            </w:pPr>
+            <w:r>
+              <w:rPr>
+                <w:rFonts w:ascii="Times New Roman" w:cs="Times New Roman" w:eastAsia="Times New Roman" w:hAnsi="Times New Roman"/>
+                <w:b w:val="false"/>
+                <w:bCs w:val="false"/>
+                <w:sz w:val="18"/>
+                <w:szCs w:val="18"/>
+              </w:rPr>
+              <w:t xml:space="preserve">15.6%</w:t>
+            </w:r>
+          </w:p>
+        </w:tc>
+        <w:tc>
+          <w:tcPr>
+            <w:tcW w:type="dxa" w:w="2260"/>
+            <w:tcBorders>
+              <w:top w:val="single" w:color="AAAAAA" w:sz="4"/>
+              <w:left w:val="single" w:color="AAAAAA" w:sz="4"/>
+              <w:bottom w:val="single" w:color="AAAAAA" w:sz="4"/>
+              <w:right w:val="single" w:color="AAAAAA" w:sz="4"/>
+            </w:tcBorders>
+            <w:tcMar>
+              <w:top w:type="dxa" w:w="40"/>
+              <w:left w:type="dxa" w:w="80"/>
+              <w:bottom w:type="dxa" w:w="40"/>
+              <w:right w:type="dxa" w:w="80"/>
+            </w:tcMar>
+          </w:tcPr>
+          <w:p>
+            <w:pPr>
+              <w:jc w:val="center"/>
+            </w:pPr>
+            <w:r>
+              <w:rPr>
+                <w:rFonts w:ascii="Times New Roman" w:cs="Times New Roman" w:eastAsia="Times New Roman" w:hAnsi="Times New Roman"/>
+                <w:b w:val="false"/>
+                <w:bCs w:val="false"/>
+                <w:sz w:val="18"/>
+                <w:szCs w:val="18"/>
+              </w:rPr>
+              <w:t xml:space="preserve">24 → 32</w:t>
+            </w:r>
+          </w:p>
+        </w:tc>
+      </w:tr>
+    </w:tbl>
+    <w:p>
+      <w:pPr>
+        <w:spacing w:after="160" w:before="40"/>
+      </w:pPr>
+      <w:r>
+        <w:rPr>
+          <w:rFonts w:ascii="Times New Roman" w:cs="Times New Roman" w:eastAsia="Times New Roman" w:hAnsi="Times New Roman"/>
+          <w:i/>
+          <w:iCs/>
+          <w:sz w:val="18"/>
+          <w:szCs w:val="18"/>
+        </w:rPr>
+        <w:t xml:space="preserve">Observed over 90 simulated days, so each share has a standard error of about 2-5 percentage points. L1+L2 is the cheapest cascade within the 500 ms budget (Section 5.5).</w:t>
+      </w:r>
+    </w:p>
+    <w:p>
+      <w:pPr>
+        <w:spacing w:after="120" w:line="300"/>
+        <w:jc w:val="both"/>
+      </w:pPr>
+      <w:r>
+        <w:rPr>
+          <w:rFonts w:ascii="Times New Roman" w:cs="Times New Roman" w:eastAsia="Times New Roman" w:hAnsi="Times New Roman"/>
+          <w:sz w:val="22"/>
+          <w:szCs w:val="22"/>
+        </w:rPr>
+        <w:t xml:space="preserve">The gap shrinks with guardrails but does not vanish: for the best cascade, the Poisson plan is exceeded on 7-16% of days at c = 0.44, against 30-32% without guardrails. This is the thinning effect of Proposition 5: at small λ the product λc² is small, so over-dispersion inflates the safety stock less in absolute terms (about 5, 1, 8 extra units) although the exceedance probability is still several times the target.</w:t>
+      </w:r>
+    </w:p>
+    <w:p>
+      <w:pPr>
         <w:pStyle w:val="Heading2"/>
         <w:spacing w:after="100" w:before="200"/>
       </w:pPr>
@@ -11461,22 +13070,6 @@
     </w:p>
     <w:p>
       <w:pPr>
-        <w:pStyle w:val="Heading1"/>
-        <w:spacing w:after="120" w:before="280"/>
-      </w:pPr>
-      <w:r>
-        <w:rPr>
-          <w:rFonts w:ascii="Times New Roman" w:cs="Times New Roman" w:eastAsia="Times New Roman" w:hAnsi="Times New Roman"/>
-          <w:b/>
-          <w:bCs/>
-          <w:sz w:val="26"/>
-          <w:szCs w:val="26"/>
-        </w:rPr>
-        <w:t xml:space="preserve">6. Discussion</w:t>
-      </w:r>
-    </w:p>
-    <w:p>
-      <w:pPr>
         <w:pStyle w:val="Heading2"/>
         <w:spacing w:after="100" w:before="200"/>
       </w:pPr>
@@ -11490,6 +13083,144 @@
           <w:sz w:val="23"/>
           <w:szCs w:val="23"/>
         </w:rPr>
+        <w:t xml:space="preserve">5.6 Evidence from public production traces</w:t>
+      </w:r>
+    </w:p>
+    <w:p>
+      <w:pPr>
+        <w:spacing w:after="120" w:line="300"/>
+        <w:jc w:val="both"/>
+      </w:pPr>
+      <w:r>
+        <w:rPr>
+          <w:rFonts w:ascii="Times New Roman" w:cs="Times New Roman" w:eastAsia="Times New Roman" w:hAnsi="Times New Roman"/>
+          <w:b/>
+          <w:bCs/>
+          <w:sz w:val="22"/>
+          <w:szCs w:val="22"/>
+        </w:rPr>
+        <w:t xml:space="preserve">Request arrivals (BurstGPT).</w:t>
+      </w:r>
+      <w:r>
+        <w:rPr>
+          <w:rFonts w:ascii="Times New Roman" w:cs="Times New Roman" w:eastAsia="Times New Roman" w:hAnsi="Times New Roman"/>
+          <w:sz w:val="22"/>
+          <w:szCs w:val="22"/>
+        </w:rPr>
+        <w:t xml:space="preserve"> The Azure OpenAI trace has 10.6 million requests over 231 recorded days; 4.6% of requests failed (zero response tokens). The hour-of-day profile has a peak-to-trough ratio of 2.2 (peak in the late afternoon and evening hours, trough in the morning hours of the local clock), so the arrival process is non-homogeneous, as the NHPP formulation assumes. Within an hour, however, counts are far more variable than Poisson: the variance-to-mean ratio of counts per bin (Poisson = 1) has a median of 1.4 at 1 s, 5.3 at 10 s, 3.9 at 1 min and 5.1 at 10 min, i.e. requests arrive in clusters at every scale above one second. By Proposition 5 an unprotected hallucination stream with p = 0.6 would inherit about 1 + 0.6(F - 1) ≈ 3.5 of that dispersion at the 10-minute scale, whereas a cascade with residual probability p = 0.05 would retain about 1.2.</w:t>
+      </w:r>
+    </w:p>
+    <w:p>
+      <w:pPr>
+        <w:spacing w:after="120" w:line="300"/>
+        <w:jc w:val="both"/>
+      </w:pPr>
+      <w:r>
+        <w:rPr>
+          <w:rFonts w:ascii="Times New Roman" w:cs="Times New Roman" w:eastAsia="Times New Roman" w:hAnsi="Times New Roman"/>
+          <w:sz w:val="22"/>
+          <w:szCs w:val="22"/>
+        </w:rPr>
+        <w:t xml:space="preserve">Day-to-day volume is extremely variable: the median day has 19,024 requests, with a range from 52 to 425,604. The median absolute day-to-day log change is 0.61 (a factor of 1.8), 73% of days differ from the previous day by more than 30%, the robust log-standard deviation around a 15-day rolling median is 0.80, and even the calmest 14-day window has a coefficient of variation of 0.44 (mean 140k requests/day). This variability reflects traffic growth, campaigns, regime shifts and possibly logging gaps and not only random fluctuation (the series also contains 7 near-duplicate day pairs, which we treat as a data artefact), so we use it as a </w:t>
+      </w:r>
+      <w:r>
+        <w:rPr>
+          <w:rFonts w:ascii="Times New Roman" w:cs="Times New Roman" w:eastAsia="Times New Roman" w:hAnsi="Times New Roman"/>
+          <w:b/>
+          <w:bCs/>
+          <w:sz w:val="22"/>
+          <w:szCs w:val="22"/>
+        </w:rPr>
+        <w:t xml:space="preserve">stress test and as an anchor showing that c = 0.3 is a conservative scenario</w:t>
+      </w:r>
+      <w:r>
+        <w:rPr>
+          <w:rFonts w:ascii="Times New Roman" w:cs="Times New Roman" w:eastAsia="Times New Roman" w:hAnsi="Times New Roman"/>
+          <w:sz w:val="22"/>
+          <w:szCs w:val="22"/>
+        </w:rPr>
+        <w:t xml:space="preserve">, not as an estimate of the dispersion of hallucination counts. As a stress test, replaying the measured daily multipliers on an incident stream of λ = 10 and 120 events/day makes the Poisson capacity plan fail on 21-30% of days (target 5%), with negative-binomial requirements of 33, 384, 75, 892 units against Poisson plans of 15, 138, 15, 138.</w:t>
+      </w:r>
+    </w:p>
+    <w:p>
+      <w:pPr>
+        <w:spacing w:after="120" w:line="300"/>
+        <w:jc w:val="both"/>
+      </w:pPr>
+      <w:r>
+        <w:rPr>
+          <w:rFonts w:ascii="Times New Roman" w:cs="Times New Roman" w:eastAsia="Times New Roman" w:hAnsi="Times New Roman"/>
+          <w:b/>
+          <w:bCs/>
+          <w:sz w:val="22"/>
+          <w:szCs w:val="22"/>
+        </w:rPr>
+        <w:t xml:space="preserve">Service incidents (LLM providers).</w:t>
+      </w:r>
+      <w:r>
+        <w:rPr>
+          <w:rFonts w:ascii="Times New Roman" w:cs="Times New Roman" w:eastAsia="Times New Roman" w:hAnsi="Times New Roman"/>
+          <w:sz w:val="22"/>
+          <w:szCs w:val="22"/>
+        </w:rPr>
+        <w:t xml:space="preserve"> Between March 2023 and August 2024 the three providers declared 457 incidents (0.83 per day; OpenAI 0.51, Anthropic 0.26). Incident starts are strongly non-homogeneous: weekday counts are 2.5-6.4 times weekend counts and hour-of-day homogeneity is rejected (p &lt; 10⁻⁴ for every provider and subset). A homogeneous Poisson model is rejected on every inter-arrival and dispersion test. Allowing for weekly and daily seasonality removes part of the lack of fit but not all of it: the daily index of dispersion is 1.53 (p = 3×10⁻14) and still 1.30 after stratifying by day of week (p = 6×10⁻6); for OpenAI alone the time-rescaled inter-arrival test is consistent with an NHPP (p = 0.23) but its stratified index is still 1.19 (p = 0.003), while for Anthropic and for the major and critical subset both are rejected. A negative-binomial fit to daily counts gives r ≈ 1.6. The practical consequence at this low rate is small: the Poisson and negative-binomial 95% capacities coincide (3 incidents per day) and the Poisson capacity is exceeded on 3.5% of days, below the 5% target. This agrees with Proposition 2: over-dispersion is statistically clear but φ = 1 + λc² stays near 1 when λ is below one per day, and it becomes consequential only at higher rates.</w:t>
+      </w:r>
+    </w:p>
+    <w:p>
+      <w:pPr>
+        <w:spacing w:after="120" w:line="300"/>
+        <w:jc w:val="both"/>
+      </w:pPr>
+      <w:r>
+        <w:rPr>
+          <w:rFonts w:ascii="Times New Roman" w:cs="Times New Roman" w:eastAsia="Times New Roman" w:hAnsi="Times New Roman"/>
+          <w:b/>
+          <w:bCs/>
+          <w:sz w:val="22"/>
+          <w:szCs w:val="22"/>
+        </w:rPr>
+        <w:t xml:space="preserve">Human response proxy.</w:t>
+      </w:r>
+      <w:r>
+        <w:rPr>
+          <w:rFonts w:ascii="Times New Roman" w:cs="Times New Roman" w:eastAsia="Times New Roman" w:hAnsi="Times New Roman"/>
+          <w:sz w:val="22"/>
+          <w:szCs w:val="22"/>
+        </w:rPr>
+        <w:t xml:space="preserve"> Incident duration (declared start to resolution) has a median of 1.0 h, a 90th percentile of 5.1 h and a 99th percentile of 34 h; the mean is 3.1 h and the coefficient of variation 3.5, i.e. response times are heavy-tailed, not exponential (12.3% are zero-duration notices). Treating incidents as arrivals to an infinite-server system, the time-averaged number of concurrently open incidents is 0.11, matching the M/G/∞ mean (Little's law), and the 95th percentile of the open count is 1, equal to the Poisson 95% quantile of the M/G/∞ occupancy (1); two or more incidents are open simultaneously 0.7% of the time. At provider level a single standing responder therefore covers 95% of the time, whereas the heavy tail of durations explains the rare long overruns. These are provider-declared outage incidents (elevated errors, latency, degraded service), not hallucinations, so they inform the arrival and service-time structure of an LLM incident stream but not its rate.</w:t>
+      </w:r>
+    </w:p>
+    <w:p>
+      <w:pPr>
+        <w:pStyle w:val="Heading1"/>
+        <w:spacing w:after="120" w:before="280"/>
+      </w:pPr>
+      <w:r>
+        <w:rPr>
+          <w:rFonts w:ascii="Times New Roman" w:cs="Times New Roman" w:eastAsia="Times New Roman" w:hAnsi="Times New Roman"/>
+          <w:b/>
+          <w:bCs/>
+          <w:sz w:val="26"/>
+          <w:szCs w:val="26"/>
+        </w:rPr>
+        <w:t xml:space="preserve">6. Discussion</w:t>
+      </w:r>
+    </w:p>
+    <w:p>
+      <w:pPr>
+        <w:pStyle w:val="Heading2"/>
+        <w:spacing w:after="100" w:before="200"/>
+      </w:pPr>
+      <w:r>
+        <w:rPr>
+          <w:rFonts w:ascii="Times New Roman" w:cs="Times New Roman" w:eastAsia="Times New Roman" w:hAnsi="Times New Roman"/>
+          <w:b/>
+          <w:bCs/>
+          <w:i/>
+          <w:iCs/>
+          <w:sz w:val="23"/>
+          <w:szCs w:val="23"/>
+        </w:rPr>
         <w:t xml:space="preserve">6.1 Implications for IS practice and research</w:t>
       </w:r>
     </w:p>
@@ -11518,7 +13249,7 @@
           <w:sz w:val="22"/>
           <w:szCs w:val="22"/>
         </w:rPr>
-        <w:t xml:space="preserve"> Provisioning at the mean load fails on roughly 40-50% of days in every configuration we measured. The Poisson quantile fixes this when daily counts are Poisson, but Proposition 2 and the burst experiment show that a modest day-to-day variation in demand (CV 0.3) multiplies the miss rate several-fold. Dispersion should be estimated from incident logs before the plan is fixed.</w:t>
+        <w:t xml:space="preserve"> Provisioning at the mean load fails on roughly 40-50% of days in every configuration we measured. The Poisson quantile fixes this when daily counts are Poisson, but Proposition 2 and the burst experiments show that a modest day-to-day variation in demand (CV 0.3-0.44) multiplies the miss rate several-fold; real LLM request streams vary far more than that. Dispersion should be estimated from incident logs before the plan is fixed, and over-dispersion matters most for large incident streams (weak guardrails) and least for small ones (Proposition 5): for provider-level outages of about 0.8 per day, over-dispersion was statistically clear but changed the 95% capacity by nothing.</w:t>
       </w:r>
     </w:p>
     <w:p>
@@ -11640,33 +13371,15 @@
           <w:sz w:val="22"/>
           <w:szCs w:val="22"/>
         </w:rPr>
-        <w:t xml:space="preserve">Simulated arrivals.</w:t>
-      </w:r>
-      <w:r>
-        <w:rPr>
-          <w:rFonts w:ascii="Times New Roman" w:cs="Times New Roman" w:eastAsia="Times New Roman" w:hAnsi="Times New Roman"/>
-          <w:sz w:val="22"/>
-          <w:szCs w:val="22"/>
-        </w:rPr>
-        <w:t xml:space="preserve"> Outcomes are measured on real model outputs, but arrival times are simulated and each arrival replays a bootstrapped example. Real users' queries are correlated (trending topics, incidents), so real streams are likely </w:t>
-      </w:r>
-      <w:r>
-        <w:rPr>
-          <w:rFonts w:ascii="Times New Roman" w:cs="Times New Roman" w:eastAsia="Times New Roman" w:hAnsi="Times New Roman"/>
-          <w:i/>
-          <w:iCs/>
-          <w:sz w:val="22"/>
-          <w:szCs w:val="22"/>
-        </w:rPr>
-        <w:t xml:space="preserve">more</w:t>
-      </w:r>
-      <w:r>
-        <w:rPr>
-          <w:rFonts w:ascii="Times New Roman" w:cs="Times New Roman" w:eastAsia="Times New Roman" w:hAnsi="Times New Roman"/>
-          <w:sz w:val="22"/>
-          <w:szCs w:val="22"/>
-        </w:rPr>
-        <w:t xml:space="preserve"> over-dispersed than the pure replay. The burst experiment bounds this effect but does not replace production data; validation on proprietary logs is the main follow-up.</w:t>
+        <w:t xml:space="preserve">Simulated arrivals and no hallucination log.</w:t>
+      </w:r>
+      <w:r>
+        <w:rPr>
+          <w:rFonts w:ascii="Times New Roman" w:cs="Times New Roman" w:eastAsia="Times New Roman" w:hAnsi="Times New Roman"/>
+          <w:sz w:val="22"/>
+          <w:szCs w:val="22"/>
+        </w:rPr>
+        <w:t xml:space="preserve"> Outcomes are measured on real model outputs, but arrival times are simulated and each arrival replays a bootstrapped example. The public traces we use (BurstGPT, the provider incident history) are real production data, but they record request arrivals and service incidents, not hallucinations; no public time-stamped production log of hallucination incidents exists to our knowledge. The burstiness of the replay is therefore a scenario anchored in, not estimated from, the dispersion of real request streams. Validation on proprietary incident logs is the main follow-up.</w:t>
       </w:r>
     </w:p>
     <w:p>
@@ -11686,51 +13399,15 @@
           <w:sz w:val="22"/>
           <w:szCs w:val="22"/>
         </w:rPr>
-        <w:t xml:space="preserve">Small open models and one task.</w:t>
-      </w:r>
-      <w:r>
-        <w:rPr>
-          <w:rFonts w:ascii="Times New Roman" w:cs="Times New Roman" w:eastAsia="Times New Roman" w:hAnsi="Times New Roman"/>
-          <w:sz w:val="22"/>
-          <w:szCs w:val="22"/>
-        </w:rPr>
-        <w:t xml:space="preserve"> We study 0.4-1.5B-parameter models on extractive QA with unanswerable questions. Absolute hallucination rates are much higher than for frontier models, and the layers are CPU-bound; latencies on GPU or hosted APIs differ. The </w:t>
-      </w:r>
-      <w:r>
-        <w:rPr>
-          <w:rFonts w:ascii="Times New Roman" w:cs="Times New Roman" w:eastAsia="Times New Roman" w:hAnsi="Times New Roman"/>
-          <w:i/>
-          <w:iCs/>
-          <w:sz w:val="22"/>
-          <w:szCs w:val="22"/>
-        </w:rPr>
-        <w:t xml:space="preserve">method</w:t>
-      </w:r>
-      <w:r>
-        <w:rPr>
-          <w:rFonts w:ascii="Times New Roman" w:cs="Times New Roman" w:eastAsia="Times New Roman" w:hAnsi="Times New Roman"/>
-          <w:sz w:val="22"/>
-          <w:szCs w:val="22"/>
-        </w:rPr>
-        <w:t xml:space="preserve"> transfers, the </w:t>
-      </w:r>
-      <w:r>
-        <w:rPr>
-          <w:rFonts w:ascii="Times New Roman" w:cs="Times New Roman" w:eastAsia="Times New Roman" w:hAnsi="Times New Roman"/>
-          <w:i/>
-          <w:iCs/>
-          <w:sz w:val="22"/>
-          <w:szCs w:val="22"/>
-        </w:rPr>
-        <w:t xml:space="preserve">numbers</w:t>
-      </w:r>
-      <w:r>
-        <w:rPr>
-          <w:rFonts w:ascii="Times New Roman" w:cs="Times New Roman" w:eastAsia="Times New Roman" w:hAnsi="Times New Roman"/>
-          <w:sz w:val="22"/>
-          <w:szCs w:val="22"/>
-        </w:rPr>
-        <w:t xml:space="preserve"> do not.</w:t>
+        <w:t xml:space="preserve">Public-trace artefacts.</w:t>
+      </w:r>
+      <w:r>
+        <w:rPr>
+          <w:rFonts w:ascii="Times New Roman" w:cs="Times New Roman" w:eastAsia="Times New Roman" w:hAnsi="Times New Roman"/>
+          <w:sz w:val="22"/>
+          <w:szCs w:val="22"/>
+        </w:rPr>
+        <w:t xml:space="preserve"> BurstGPT has no calendar dates, a 104-day gap, near-duplicate day pairs and order-of-magnitude regime changes in daily volume, so its day-level variability reflects growth and logging as well as randomness; we use it as a stress test and a lower bound for c, not as an estimate. The provider incident data are provider-declared, with minute resolution and detection and reporting bias; incident duration is the declared start-to-resolution time, not triage effort.</w:t>
       </w:r>
     </w:p>
     <w:p>
@@ -11750,15 +13427,51 @@
           <w:sz w:val="22"/>
           <w:szCs w:val="22"/>
         </w:rPr>
-        <w:t xml:space="preserve">Label noise.</w:t>
-      </w:r>
-      <w:r>
-        <w:rPr>
-          <w:rFonts w:ascii="Times New Roman" w:cs="Times New Roman" w:eastAsia="Times New Roman" w:hAnsi="Times New Roman"/>
-          <w:sz w:val="22"/>
-          <w:szCs w:val="22"/>
-        </w:rPr>
-        <w:t xml:space="preserve"> Ground truth uses string and token-F1 matching against SQuAD gold answers, which can mark valid paraphrases as hallucinations; this affects all configurations alike but inflates the base rate.</w:t>
+        <w:t xml:space="preserve">Small open models and one task.</w:t>
+      </w:r>
+      <w:r>
+        <w:rPr>
+          <w:rFonts w:ascii="Times New Roman" w:cs="Times New Roman" w:eastAsia="Times New Roman" w:hAnsi="Times New Roman"/>
+          <w:sz w:val="22"/>
+          <w:szCs w:val="22"/>
+        </w:rPr>
+        <w:t xml:space="preserve"> We study 0.4-1.5B-parameter models on extractive QA with unanswerable questions. Absolute hallucination rates are much higher than for frontier models, and the layers are CPU-bound; latencies on GPU or hosted APIs differ. The </w:t>
+      </w:r>
+      <w:r>
+        <w:rPr>
+          <w:rFonts w:ascii="Times New Roman" w:cs="Times New Roman" w:eastAsia="Times New Roman" w:hAnsi="Times New Roman"/>
+          <w:i/>
+          <w:iCs/>
+          <w:sz w:val="22"/>
+          <w:szCs w:val="22"/>
+        </w:rPr>
+        <w:t xml:space="preserve">method</w:t>
+      </w:r>
+      <w:r>
+        <w:rPr>
+          <w:rFonts w:ascii="Times New Roman" w:cs="Times New Roman" w:eastAsia="Times New Roman" w:hAnsi="Times New Roman"/>
+          <w:sz w:val="22"/>
+          <w:szCs w:val="22"/>
+        </w:rPr>
+        <w:t xml:space="preserve"> transfers, the </w:t>
+      </w:r>
+      <w:r>
+        <w:rPr>
+          <w:rFonts w:ascii="Times New Roman" w:cs="Times New Roman" w:eastAsia="Times New Roman" w:hAnsi="Times New Roman"/>
+          <w:i/>
+          <w:iCs/>
+          <w:sz w:val="22"/>
+          <w:szCs w:val="22"/>
+        </w:rPr>
+        <w:t xml:space="preserve">numbers</w:t>
+      </w:r>
+      <w:r>
+        <w:rPr>
+          <w:rFonts w:ascii="Times New Roman" w:cs="Times New Roman" w:eastAsia="Times New Roman" w:hAnsi="Times New Roman"/>
+          <w:sz w:val="22"/>
+          <w:szCs w:val="22"/>
+        </w:rPr>
+        <w:t xml:space="preserve"> do not.</w:t>
       </w:r>
     </w:p>
     <w:p>
@@ -11778,15 +13491,15 @@
           <w:sz w:val="22"/>
           <w:szCs w:val="22"/>
         </w:rPr>
-        <w:t xml:space="preserve">Cost parameters are assumptions.</w:t>
-      </w:r>
-      <w:r>
-        <w:rPr>
-          <w:rFonts w:ascii="Times New Roman" w:cs="Times New Roman" w:eastAsia="Times New Roman" w:hAnsi="Times New Roman"/>
-          <w:sz w:val="22"/>
-          <w:szCs w:val="22"/>
-        </w:rPr>
-        <w:t xml:space="preserve"> Only labour-to-compute ratios and the sensitivity grid are informative; dollar levels are illustrative.</w:t>
+        <w:t xml:space="preserve">Label noise.</w:t>
+      </w:r>
+      <w:r>
+        <w:rPr>
+          <w:rFonts w:ascii="Times New Roman" w:cs="Times New Roman" w:eastAsia="Times New Roman" w:hAnsi="Times New Roman"/>
+          <w:sz w:val="22"/>
+          <w:szCs w:val="22"/>
+        </w:rPr>
+        <w:t xml:space="preserve"> Ground truth uses string and token-F1 matching against SQuAD gold answers, which can mark valid paraphrases as hallucinations; this affects all configurations alike but inflates the base rate.</w:t>
       </w:r>
     </w:p>
     <w:p>
@@ -11806,15 +13519,15 @@
           <w:sz w:val="22"/>
           <w:szCs w:val="22"/>
         </w:rPr>
-        <w:t xml:space="preserve">Single judge and classifier, and a post-hoc layer change.</w:t>
-      </w:r>
-      <w:r>
-        <w:rPr>
-          <w:rFonts w:ascii="Times New Roman" w:cs="Times New Roman" w:eastAsia="Times New Roman" w:hAnsi="Times New Roman"/>
-          <w:sz w:val="22"/>
-          <w:szCs w:val="22"/>
-        </w:rPr>
-        <w:t xml:space="preserve"> Layer dependence and clearance were measured for one extractive-QA verifier and one judge model; other choices may be more or less correlated. The QA verifier was introduced after the NLI classifier proved uninformative, so the L2 choice was made after seeing results (on the same data); it is trained on SQuAD, which flatters it relative to a domain-agnostic classifier, and its threshold (token-F1 &lt; 0.5) was not tuned. The analyses should be repeated on a held-out sample with a pre-registered layer configuration.</w:t>
+        <w:t xml:space="preserve">Cost parameters are assumptions.</w:t>
+      </w:r>
+      <w:r>
+        <w:rPr>
+          <w:rFonts w:ascii="Times New Roman" w:cs="Times New Roman" w:eastAsia="Times New Roman" w:hAnsi="Times New Roman"/>
+          <w:sz w:val="22"/>
+          <w:szCs w:val="22"/>
+        </w:rPr>
+        <w:t xml:space="preserve"> Only labour-to-compute ratios and the sensitivity grid are informative; dollar levels are illustrative.</w:t>
       </w:r>
     </w:p>
     <w:p>
@@ -11834,15 +13547,15 @@
           <w:sz w:val="22"/>
           <w:szCs w:val="22"/>
         </w:rPr>
-        <w:t xml:space="preserve">Consistency checks are partly by construction.</w:t>
-      </w:r>
-      <w:r>
-        <w:rPr>
-          <w:rFonts w:ascii="Times New Roman" w:cs="Times New Roman" w:eastAsia="Times New Roman" w:hAnsi="Times New Roman"/>
-          <w:sz w:val="22"/>
-          <w:szCs w:val="22"/>
-        </w:rPr>
-        <w:t xml:space="preserve"> Because outcomes are bootstrapped from a fixed pool and arrivals are simulated, the Poisson and time-rescaling checks of Section 5.3 verify the machinery, not real traffic; only the dependence, clearance, latency and failure measurements are evidence about real systems.</w:t>
+        <w:t xml:space="preserve">Single judge and classifier, and a post-hoc layer change.</w:t>
+      </w:r>
+      <w:r>
+        <w:rPr>
+          <w:rFonts w:ascii="Times New Roman" w:cs="Times New Roman" w:eastAsia="Times New Roman" w:hAnsi="Times New Roman"/>
+          <w:sz w:val="22"/>
+          <w:szCs w:val="22"/>
+        </w:rPr>
+        <w:t xml:space="preserve"> Layer dependence and clearance were measured for one extractive-QA verifier and one judge model; other choices may be more or less correlated. The QA verifier was introduced after the NLI classifier proved uninformative, so the L2 choice was made after seeing results (on the same data); it is trained on SQuAD, which flatters it relative to a domain-agnostic classifier, and its threshold (token-F1 &lt; 0.5) was not tuned. The analyses should be repeated on a held-out sample with a pre-registered layer configuration.</w:t>
       </w:r>
     </w:p>
     <w:p>
@@ -11862,6 +13575,34 @@
           <w:sz w:val="22"/>
           <w:szCs w:val="22"/>
         </w:rPr>
+        <w:t xml:space="preserve">Consistency checks are partly by construction.</w:t>
+      </w:r>
+      <w:r>
+        <w:rPr>
+          <w:rFonts w:ascii="Times New Roman" w:cs="Times New Roman" w:eastAsia="Times New Roman" w:hAnsi="Times New Roman"/>
+          <w:sz w:val="22"/>
+          <w:szCs w:val="22"/>
+        </w:rPr>
+        <w:t xml:space="preserve"> Because outcomes are bootstrapped from a fixed pool and arrivals are simulated, the Poisson and time-rescaling checks of Section 5.3 verify the machinery, not real traffic; only the dependence, clearance, latency and failure measurements are evidence about real systems.</w:t>
+      </w:r>
+    </w:p>
+    <w:p>
+      <w:pPr>
+        <w:pStyle w:val="ListParagraph"/>
+        <w:numPr>
+          <w:ilvl w:val="0"/>
+          <w:numId w:val="2"/>
+        </w:numPr>
+        <w:spacing w:after="60" w:line="288"/>
+      </w:pPr>
+      <w:r>
+        <w:rPr>
+          <w:rFonts w:ascii="Times New Roman" w:cs="Times New Roman" w:eastAsia="Times New Roman" w:hAnsi="Times New Roman"/>
+          <w:b/>
+          <w:bCs/>
+          <w:sz w:val="22"/>
+          <w:szCs w:val="22"/>
+        </w:rPr>
         <w:t xml:space="preserve">Independent days.</w:t>
       </w:r>
       <w:r>
@@ -11900,7 +13641,7 @@
           <w:sz w:val="22"/>
           <w:szCs w:val="22"/>
         </w:rPr>
-        <w:t xml:space="preserve">Treating critical hallucinations as a counting process turns guardrail performance into a staffing and cost decision. The analysis yields three results that differ from the common practice the earlier draft followed: capacity must be sized from an over-dispersion-aware quantile; the multiplicative guardrail formula is an optimistic bound whose gap must be measured; and the cost-minimising number of layers is not fixed at three but depends on integer capacity effects, the floor on standing staff, latency, the labour-to-compute ratio and, empirically, on the generator. On measured outputs of three open models, a single task-validated classifier reduces the required capacity by roughly 80-95% relative to no guardrails; a routed judge adds a further modest, model-dependent reduction at about triple the latency, and every cascade incurs false blocks and system failures that the earlier framework ignored. The independence formula understated the share of hallucinations passing a two-layer cascade by a factor of 1.6-2.6 (2.7-4.6 with routing), and a mild burstiness (daily-rate CV of 0.3) raised the exceedance rate of a Poisson-sized plan from 5% to about 25%. Validating the counting-process assumptions on production incident logs is the key next step.</w:t>
+        <w:t xml:space="preserve">Treating critical hallucinations as a counting process turns guardrail performance into a staffing and cost decision. The analysis yields three results that differ from the common practice the earlier draft followed: capacity must be sized from an over-dispersion-aware quantile; the multiplicative guardrail formula is an optimistic bound whose gap must be measured; and the cost-minimising number of layers is not fixed at three but depends on integer capacity effects, the floor on standing staff, latency, the labour-to-compute ratio and, empirically, on the generator. On measured outputs of three open models, a single task-validated classifier reduces the required capacity by roughly 80-95% relative to no guardrails; a routed judge adds a further modest, model-dependent reduction at about triple the latency, and every cascade incurs false blocks and system failures that the earlier framework ignored. The independence formula understated the share of hallucinations passing a two-layer cascade by a factor of 1.6-2.6 (2.7-4.6 with routing), and a mild burstiness (daily-rate CV of 0.3) raised the exceedance rate of a Poisson-sized plan from 5% to about 25%, to about 30% with the CV of 0.44 anchored in a production trace. Public production data corroborate the structure: an LLM request trace shows clustered arrivals at every scale above one second and a median day-to-day volume change of a factor of 1.8, and provider incident streams are strongly seasonal and remain over-dispersed after accounting for seasonality, with heavy-tailed durations. Validating the counting-process assumptions on production incident logs is the key next step.</w:t>
       </w:r>
     </w:p>
     <w:p>
@@ -12042,7 +13783,7 @@
           <w:sz w:val="20"/>
           <w:szCs w:val="20"/>
         </w:rPr>
-        <w:t xml:space="preserve">Cox, D. R. (1955). Some statistical methods connected with series of events. Journal of the Royal Statistical Society, Series B, 17(2), 129-164.</w:t>
+        <w:t xml:space="preserve">Chu, X., Talluri, S., Lu, Q., &amp; Iosup, A. (2025). An empirical characterization of outages and incidents in public services for large language models. Proceedings of ICPE 2025 (arXiv:2501.12469).</w:t>
       </w:r>
     </w:p>
     <w:p>
@@ -12056,7 +13797,7 @@
           <w:sz w:val="20"/>
           <w:szCs w:val="20"/>
         </w:rPr>
-        <w:t xml:space="preserve">Esary, J. D., Proschan, F., &amp; Walkup, D. W. (1967). Association of random variables, with applications. Annals of Mathematical Statistics, 38(5), 1466-1474.</w:t>
+        <w:t xml:space="preserve">Cox, D. R. (1955). Some statistical methods connected with series of events. Journal of the Royal Statistical Society, Series B, 17(2), 129-164.</w:t>
       </w:r>
     </w:p>
     <w:p>
@@ -12070,7 +13811,7 @@
           <w:sz w:val="20"/>
           <w:szCs w:val="20"/>
         </w:rPr>
-        <w:t xml:space="preserve">Green, L. V., Kolesar, P. J., &amp; Whitt, W. (2007). Coping with time-varying demand when setting staffing requirements for a service system. Production and Operations Management, 16(1), 13-39.</w:t>
+        <w:t xml:space="preserve">Esary, J. D., Proschan, F., &amp; Walkup, D. W. (1967). Association of random variables, with applications. Annals of Mathematical Statistics, 38(5), 1466-1474.</w:t>
       </w:r>
     </w:p>
     <w:p>
@@ -12084,7 +13825,7 @@
           <w:sz w:val="20"/>
           <w:szCs w:val="20"/>
         </w:rPr>
-        <w:t xml:space="preserve">Gregor, S., &amp; Hevner, A. R. (2013). Positioning and presenting design science research for maximum impact. MIS Quarterly, 37(2), 337-355.</w:t>
+        <w:t xml:space="preserve">Green, L. V., Kolesar, P. J., &amp; Whitt, W. (2007). Coping with time-varying demand when setting staffing requirements for a service system. Production and Operations Management, 16(1), 13-39.</w:t>
       </w:r>
     </w:p>
     <w:p>
@@ -12098,7 +13839,7 @@
           <w:sz w:val="20"/>
           <w:szCs w:val="20"/>
         </w:rPr>
-        <w:t xml:space="preserve">He, P., Gao, J., &amp; Chen, W. (2021). DeBERTaV3: Improving DeBERTa using ELECTRA-style pre-training with gradient-disentangled embedding sharing. arXiv:2111.09543.</w:t>
+        <w:t xml:space="preserve">Gregor, S., &amp; Hevner, A. R. (2013). Positioning and presenting design science research for maximum impact. MIS Quarterly, 37(2), 337-355.</w:t>
       </w:r>
     </w:p>
     <w:p>
@@ -12112,7 +13853,7 @@
           <w:sz w:val="20"/>
           <w:szCs w:val="20"/>
         </w:rPr>
-        <w:t xml:space="preserve">Hevner, A. R., March, S. T., Park, J., &amp; Ram, S. (2004). Design science in information systems research. MIS Quarterly, 28(1), 75-105.</w:t>
+        <w:t xml:space="preserve">He, P., Gao, J., &amp; Chen, W. (2021). DeBERTaV3: Improving DeBERTa using ELECTRA-style pre-training with gradient-disentangled embedding sharing. arXiv:2111.09543.</w:t>
       </w:r>
     </w:p>
     <w:p>
@@ -12126,7 +13867,7 @@
           <w:sz w:val="20"/>
           <w:szCs w:val="20"/>
         </w:rPr>
-        <w:t xml:space="preserve">Inan, H., et al. (2023). Llama Guard: LLM-based input-output safeguard for human-AI conversations. arXiv:2312.06674.</w:t>
+        <w:t xml:space="preserve">Hevner, A. R., March, S. T., Park, J., &amp; Ram, S. (2004). Design science in information systems research. MIS Quarterly, 28(1), 75-105.</w:t>
       </w:r>
     </w:p>
     <w:p>
@@ -12140,7 +13881,7 @@
           <w:sz w:val="20"/>
           <w:szCs w:val="20"/>
         </w:rPr>
-        <w:t xml:space="preserve">Ji, Z., et al. (2023). Survey of hallucination in natural language generation. ACM Computing Surveys, 55(12), Article 248.</w:t>
+        <w:t xml:space="preserve">Inan, H., et al. (2023). Llama Guard: LLM-based input-output safeguard for human-AI conversations. arXiv:2312.06674.</w:t>
       </w:r>
     </w:p>
     <w:p>
@@ -12154,7 +13895,7 @@
           <w:sz w:val="20"/>
           <w:szCs w:val="20"/>
         </w:rPr>
-        <w:t xml:space="preserve">Kingman, J. F. C. (1993). Poisson Processes. Oxford University Press.</w:t>
+        <w:t xml:space="preserve">Ji, Z., et al. (2023). Survey of hallucination in natural language generation. ACM Computing Surveys, 55(12), Article 248.</w:t>
       </w:r>
     </w:p>
     <w:p>
@@ -12168,7 +13909,7 @@
           <w:sz w:val="20"/>
           <w:szCs w:val="20"/>
         </w:rPr>
-        <w:t xml:space="preserve">Lewis, P., et al. (2020). Retrieval-augmented generation for knowledge-intensive NLP tasks. Advances in Neural Information Processing Systems, 33.</w:t>
+        <w:t xml:space="preserve">Kingman, J. F. C. (1993). Poisson Processes. Oxford University Press.</w:t>
       </w:r>
     </w:p>
     <w:p>
@@ -12182,7 +13923,7 @@
           <w:sz w:val="20"/>
           <w:szCs w:val="20"/>
         </w:rPr>
-        <w:t xml:space="preserve">Lin, R., &amp; Zhang, J. (2026). When to screen, when to bypass: LLM-judges in resource-scarce AI-human workflow. arXiv:2603.13870.</w:t>
+        <w:t xml:space="preserve">Lewis, P., et al. (2020). Retrieval-augmented generation for knowledge-intensive NLP tasks. Advances in Neural Information Processing Systems, 33.</w:t>
       </w:r>
     </w:p>
     <w:p>
@@ -12196,7 +13937,7 @@
           <w:sz w:val="20"/>
           <w:szCs w:val="20"/>
         </w:rPr>
-        <w:t xml:space="preserve">Manakul, P., Liusie, A., &amp; Gales, M. J. F. (2023). SelfCheckGPT: Zero-resource black-box hallucination detection for generative large language models. Proceedings of EMNLP 2023.</w:t>
+        <w:t xml:space="preserve">Lin, R., &amp; Zhang, J. (2026). When to screen, when to bypass: LLM-judges in resource-scarce AI-human workflow. arXiv:2603.13870.</w:t>
       </w:r>
     </w:p>
     <w:p>
@@ -12210,7 +13951,7 @@
           <w:sz w:val="20"/>
           <w:szCs w:val="20"/>
         </w:rPr>
-        <w:t xml:space="preserve">Qwen Team. (2024). Qwen2.5 technical report. arXiv:2412.15115.</w:t>
+        <w:t xml:space="preserve">Manakul, P., Liusie, A., &amp; Gales, M. J. F. (2023). SelfCheckGPT: Zero-resource black-box hallucination detection for generative large language models. Proceedings of EMNLP 2023.</w:t>
       </w:r>
     </w:p>
     <w:p>
@@ -12224,7 +13965,7 @@
           <w:sz w:val="20"/>
           <w:szCs w:val="20"/>
         </w:rPr>
-        <w:t xml:space="preserve">Rajpurkar, P., Jia, R., &amp; Liang, P. (2018). Know what you don't know: Unanswerable questions for SQuAD. Proceedings of ACL 2018, 784-789.</w:t>
+        <w:t xml:space="preserve">Qwen Team. (2024). Qwen2.5 technical report. arXiv:2412.15115.</w:t>
       </w:r>
     </w:p>
     <w:p>
@@ -12238,7 +13979,7 @@
           <w:sz w:val="20"/>
           <w:szCs w:val="20"/>
         </w:rPr>
-        <w:t xml:space="preserve">Topkis, D. M. (1978). Minimizing a submodular function on a lattice. Operations Research, 26(2), 305-321.</w:t>
+        <w:t xml:space="preserve">Rajpurkar, P., Jia, R., &amp; Liang, P. (2018). Know what you don't know: Unanswerable questions for SQuAD. Proceedings of ACL 2018, 784-789.</w:t>
       </w:r>
     </w:p>
     <w:p>
@@ -12252,7 +13993,35 @@
           <w:sz w:val="20"/>
           <w:szCs w:val="20"/>
         </w:rPr>
+        <w:t xml:space="preserve">Topkis, D. M. (1978). Minimizing a submodular function on a lattice. Operations Research, 26(2), 305-321.</w:t>
+      </w:r>
+    </w:p>
+    <w:p>
+      <w:pPr>
+        <w:spacing w:after="70"/>
+        <w:ind w:left="360" w:hanging="360"/>
+      </w:pPr>
+      <w:r>
+        <w:rPr>
+          <w:rFonts w:ascii="Times New Roman" w:cs="Times New Roman" w:eastAsia="Times New Roman" w:hAnsi="Times New Roman"/>
+          <w:sz w:val="20"/>
+          <w:szCs w:val="20"/>
+        </w:rPr>
         <w:t xml:space="preserve">Tran-Truong, &amp; Le, (2026). Measuring the unmeasurable: Markov chain reliability for LLM agents. arXiv:2604.24579.</w:t>
+      </w:r>
+    </w:p>
+    <w:p>
+      <w:pPr>
+        <w:spacing w:after="70"/>
+        <w:ind w:left="360" w:hanging="360"/>
+      </w:pPr>
+      <w:r>
+        <w:rPr>
+          <w:rFonts w:ascii="Times New Roman" w:cs="Times New Roman" w:eastAsia="Times New Roman" w:hAnsi="Times New Roman"/>
+          <w:sz w:val="20"/>
+          <w:szCs w:val="20"/>
+        </w:rPr>
+        <w:t xml:space="preserve">Wang, Y., et al. (2025). BurstGPT: A real-world workload dataset to optimize LLM serving systems. Proceedings of KDD 2025 (arXiv:2401.17644).</w:t>
       </w:r>
     </w:p>
     <w:p>

</xml_diff>

<commit_message>
Add human-triage evidence from public company ticket data (arrival variability, service times, workload, concurrency); update paper
Co-Authored-By: Claude Sonnet 5.5 <noreply@anthropic.com>
Claude-Session: https://claude.ai/code/session_01FJoEQKBVMu4pDX4YuJC5vW
</commit_message>
<xml_diff>
--- a/hallucination_poisson/paper/LLM_Hallucination_Poisson_Framework_Revised.docx
+++ b/hallucination_poisson/paper/LLM_Hallucination_Poisson_Framework_Revised.docx
@@ -60,7 +60,7 @@
           <w:sz w:val="22"/>
           <w:szCs w:val="22"/>
         </w:rPr>
-        <w:t xml:space="preserve">Organisations that deploy large language models (LLMs) must decide how much human triage capacity to hold in reserve and how many automated guardrail layers to place in front of the model. Practice relies on two rules of thumb: staff for the average incident load, and stack guardrails whose combined benefit is computed under independence. We model critical hallucinations as a (possibly over-dispersed, non-homogeneous) counting process, size capacity at a quantile of the daily count, and treat the multiplicative guardrail formula as the independence special case of Fréchet-type bounds. We show analytically that over-dispersion inflates required capacity by roughly the square root of the dispersion index, that positive association between layers makes the independence formula a lower bound on residual risk, and that, because capacity is integer-valued, total cost is not unimodal in the number of layers; an earlier claim that three layers are structurally optimal does not follow from the cost model. We then evaluate the integrated pipeline on measured outputs of three open LLMs answering 900 SQuAD 2.0 questions through three executed guardrail layers (rules, an extractive-QA classifier, an LLM judge) with measured latency and failures, with user traffic simulated as a non-homogeneous arrival process. We then test the Poisson structure on public production data: a request trace of an LLM service shows clustered arrivals at every scale above one second and a median day-to-day volume change of a factor of 1.8, and provider incident streams are strongly seasonal and remain over-dispersed after accounting for it. A single validated classifier cut required capacity by 80-95%; a routed judge added a modest, model-dependent gain at about triple the latency. The independence formula understated the share of hallucinations passing a two-layer cascade by a factor of 1.6-2.6 (2.7-4.6 with routing), a classifier with chance-level discrimination appeared beneficial only because it blocked almost everything, and with mild burstiness (daily-rate CV 0.3) a Poisson-sized capacity plan was exceeded on about 25-30% of days instead of 5%, while over-dispersion mattered little for low-rate provider-level incidents, as the thinning argument of Proposition 5 predicts. Hallucination arrival times are simulated and no public time-stamped hallucination log exists; models are small and the task is extractive QA, so the numbers do not transfer to production; the method and its diagnostics do.</w:t>
+        <w:t xml:space="preserve">Organisations that deploy large language models (LLMs) must decide how much human triage capacity to hold in reserve and how many automated guardrail layers to place in front of the model. Practice relies on two rules of thumb: staff for the average incident load, and stack guardrails whose combined benefit is computed under independence. We model critical hallucinations as a (possibly over-dispersed, non-homogeneous) counting process, size capacity at a quantile of the daily count, and treat the multiplicative guardrail formula as the independence special case of Fréchet-type bounds. We show analytically that over-dispersion inflates required capacity by roughly the square root of the dispersion index, that positive association between layers makes the independence formula a lower bound on residual risk, and that, because capacity is integer-valued, total cost is not unimodal in the number of layers; an earlier claim that three layers are structurally optimal does not follow from the cost model. We then evaluate the integrated pipeline on measured outputs of three open LLMs answering 900 SQuAD 2.0 questions through three executed guardrail layers (rules, an extractive-QA classifier, an LLM judge) with measured latency and failures, with user traffic simulated as a non-homogeneous arrival process. We then test the Poisson structure on public production data: a request trace of an LLM service shows clustered arrivals at every scale above one second and a median day-to-day volume change of a factor of 1.8, provider incident streams are strongly seasonal and remain over-dispersed after accounting for it, and three company ticket streams show a daily arrival-rate variability of 0.33-0.41 (so Poisson-sized plans fail on 7.5-17% of days instead of 5%) and heavy-tailed resolution times (the daily handling workload needs 3.4 times its mean as 95% headroom against 2.0 for arrival counts). A single validated classifier cut required capacity by 80-95%; a routed judge added a modest, model-dependent gain at about triple the latency. The independence formula understated the share of hallucinations passing a two-layer cascade by a factor of 1.6-2.6 (2.7-4.6 with routing), a classifier with chance-level discrimination appeared beneficial only because it blocked almost everything, and with mild burstiness (daily-rate CV 0.3) a Poisson-sized capacity plan was exceeded on about 25-30% of days instead of 5%, while over-dispersion mattered little for low-rate provider-level incidents, as the thinning argument of Proposition 5 predicts. Hallucination arrival times are simulated and no public time-stamped hallucination log exists; models are small and the task is extractive QA, so the numbers do not transfer to production; the method and its diagnostics do.</w:t>
       </w:r>
     </w:p>
     <w:p>
@@ -2956,7 +2956,7 @@
           <w:sz w:val="22"/>
           <w:szCs w:val="22"/>
         </w:rPr>
-        <w:t xml:space="preserve">Let N be the request count in a window with mean μ and Fano factor F = Var(N)/μ, and let each request independently become a critical event with probability p. Then the event count N_p has mean pμ and Fano factor 1 + p(F - 1). In particular, a guardrail cascade that reduces the residual probability p pulls the incident stream towards Poisson (Fano factor 1), while the unprotected stream (p large) retains most of the request stream's burstiness. Equivalently, for a mixed-Poisson day with rate multiplier of CV c, φ = 1 + λc² in Proposition 2 with λ = pμ.</w:t>
+        <w:t xml:space="preserve">Let N be the request count in a window with mean μ and Fano factor F = Var(N)/μ, and let each request independently become a critical event with probability p. Then the event count N_p has mean pμ and Fano factor 1 + p(F - 1). In particular, a guardrail cascade that reduces the residual probability p pulls the incident stream towards Poisson (Fano factor 1), while the unprotected stream (p large) retains most of the request stream's burstiness. Equivalently, for a mixed-Poisson day with rate multiplier of CV c, φ = 1 + λc² in Proposition 2 with λ = pμ. The multiplier's CV c itself is unchanged by independent thinning, so c is the transferable measure of day-to-day variability, whereas φ depends on the event rate.</w:t>
       </w:r>
     </w:p>
     <w:p>
@@ -6782,7 +6782,7 @@
           <w:sz w:val="22"/>
           <w:szCs w:val="22"/>
         </w:rPr>
-        <w:t xml:space="preserve"> are measured. Queries arrive according to an NHPP with a 24-slot hour-of-day intensity and a mean of 200 queries/day for 90 days. The default profile is business-hours-shaped; a second profile is the hour-of-day profile measured in the BurstGPT production trace (Section 4.5). A Cox variant multiplies each day's intensity by a Gamma factor with mean 1 and coefficient of variation c to represent bursty demand; we use c = 0.3 (an arbitrary mild scenario) and c = 0.44 (the coefficient of variation of the calmest 14-day window of BurstGPT, Section 5.6, which makes the scenario data-anchored and still conservative). Each arriving query replays a uniformly drawn example from the measured pool; it becomes a critical event if it is a hallucination that survives the cascade. For each resulting event stream we estimate λ̂ = events/days and test: (i) the index-of-dispersion test on daily counts; (ii) a chi-square test of constant hourly intensity; (iii) a Kolmogorov-Smirnov test of raw inter-arrival times against an exponential, and of time-rescaled gaps under the fitted hourly intensity (the Lilliefors-type p-value is optimistic); (iv) a negative-binomial fit of daily counts. Uncertainty from the finite evaluation pool is quantified by a 300-draw bootstrap over examples (95% percentile intervals).</w:t>
+        <w:t xml:space="preserve"> are measured. Queries arrive according to an NHPP with a 24-slot hour-of-day intensity and a mean of 200 queries/day for 90 days. The default profile is business-hours-shaped; a second profile is the hour-of-day profile measured in the BurstGPT production trace (Section 4.5). A Cox variant multiplies each day's intensity by a Gamma factor with mean 1 and coefficient of variation c to represent bursty demand; we use c = 0.3 and c = 0.44, which bracket the values estimated net of trend from public human-handled ticket streams (0.33-0.41, Section 5.7) and equal the coefficient of variation of the calmest 14-day window of BurstGPT (0.44, Section 5.6). Each arriving query replays a uniformly drawn example from the measured pool; it becomes a critical event if it is a hallucination that survives the cascade. For each resulting event stream we estimate λ̂ = events/days and test: (i) the index-of-dispersion test on daily counts; (ii) a chi-square test of constant hourly intensity; (iii) a Kolmogorov-Smirnov test of raw inter-arrival times against an exponential, and of time-rescaled gaps under the fitted hourly intensity (the Lilliefors-type p-value is optimistic); (iv) a negative-binomial fit of daily counts. Uncertainty from the finite evaluation pool is quantified by a 300-draw bootstrap over examples (95% percentile intervals).</w:t>
       </w:r>
     </w:p>
     <w:p>
@@ -6914,7 +6914,25 @@
           <w:sz w:val="22"/>
           <w:szCs w:val="22"/>
         </w:rPr>
-        <w:t xml:space="preserve"> (Chu et al., 2025; CC BY 4.0) contains provider-declared incidents scraped from the OpenAI, Anthropic and Character.AI status pages; we use the 457 incidents starting from March 2023, when all three pages are populated, and test Poisson counts per day and week (index of dispersion, also stratified by day of week), day-of-week and hour-of-day homogeneity, exponential inter-arrival times after time-rescaling with a fitted hour-of-week intensity, the distribution of incident durations as a proxy for human response time, and the number of concurrently open incidents against the M/G/∞ prediction.</w:t>
+        <w:t xml:space="preserve"> (Chu et al., 2025; CC BY 4.0) contains provider-declared incidents scraped from the OpenAI, Anthropic and Character.AI status pages; we use the 457 incidents starting from March 2023, when all three pages are populated, and test Poisson counts per day and week (index of dispersion, also stratified by day of week), day-of-week and hour-of-day homogeneity, exponential inter-arrival times after time-rescaling with a fitted hour-of-week intensity, the distribution of incident durations as a proxy for human response time, and the number of concurrently open incidents against the M/G/∞ prediction. For </w:t>
+      </w:r>
+      <w:r>
+        <w:rPr>
+          <w:rFonts w:ascii="Times New Roman" w:cs="Times New Roman" w:eastAsia="Times New Roman" w:hAnsi="Times New Roman"/>
+          <w:b/>
+          <w:bCs/>
+          <w:sz w:val="22"/>
+          <w:szCs w:val="22"/>
+        </w:rPr>
+        <w:t xml:space="preserve">human triage workloads</w:t>
+      </w:r>
+      <w:r>
+        <w:rPr>
+          <w:rFonts w:ascii="Times New Roman" w:cs="Times New Roman" w:eastAsia="Times New Roman" w:hAnsi="Times New Roman"/>
+          <w:sz w:val="22"/>
+          <w:szCs w:val="22"/>
+        </w:rPr>
+        <w:t xml:space="preserve"> we use three public company ticket datasets: customer tickets of an international software company (Abdellatif, 2026; 22,016 customer tickets from 2017 to March 2023, with creation, resolution and in-progress times), the audit log of a ServiceNow instance of an IT company (Amaral et al., 2018; 24,918 incidents in 2016-2017) and the help-desk log of an Italian software company (Verenich, 2016; 3,804 cases, 2010-2012). For each stream we estimate weekday-stratified over-dispersion, the daily rate CV net of slow trends (Pearson dispersion of weekday counts against a leave-one-out local mean over about eight weeks, after removing the weekday effect), the exceedance rate of Poisson-sized capacity plans, the distribution of resolution and in-progress times (exponential, lognormal and Weibull fits compared by AIC), the daily workload safety factor (95th percentile over mean of handling hours versus arrivals), and the number of concurrently open tickets against the M/G/∞ Poisson prediction.</w:t>
       </w:r>
     </w:p>
     <w:p>
@@ -8527,7 +8545,7 @@
           <w:sz w:val="22"/>
           <w:szCs w:val="22"/>
         </w:rPr>
-        <w:t xml:space="preserve"> Section 5.6 shows that real LLM request volume varies much more from day to day than c = 0.3; the calmest 14-day window of the BurstGPT trace still has c = 0.44. Replaying our measured outcomes with c = 0.44 and the BurstGPT hour-of-day profile gives the exceedance rates in Table 6.</w:t>
+        <w:t xml:space="preserve"> The daily rate CV is c = 0.44 in the calmest 14-day window of the BurstGPT trace (Section 5.6), and 0.33-0.41 net of trend in three human-handled ticket streams (Section 5.7); c = 0.3 and c = 0.44 bracket this range. Replaying our measured outcomes with c = 0.44 and the BurstGPT hour-of-day profile gives the exceedance rates in Table 6.</w:t>
       </w:r>
     </w:p>
     <w:p>
@@ -13131,15 +13149,15 @@
           <w:sz w:val="22"/>
           <w:szCs w:val="22"/>
         </w:rPr>
-        <w:t xml:space="preserve">stress test and as an anchor showing that c = 0.3 is a conservative scenario</w:t>
-      </w:r>
-      <w:r>
-        <w:rPr>
-          <w:rFonts w:ascii="Times New Roman" w:cs="Times New Roman" w:eastAsia="Times New Roman" w:hAnsi="Times New Roman"/>
-          <w:sz w:val="22"/>
-          <w:szCs w:val="22"/>
-        </w:rPr>
-        <w:t xml:space="preserve">, not as an estimate of the dispersion of hallucination counts. As a stress test, replaying the measured daily multipliers on an incident stream of λ = 10 and 120 events/day makes the Poisson capacity plan fail on 21-30% of days (target 5%), with negative-binomial requirements of 33, 384, 75, 892 units against Poisson plans of 15, 138, 15, 138.</w:t>
+        <w:t xml:space="preserve">stress test and as an upper-range anchor</w:t>
+      </w:r>
+      <w:r>
+        <w:rPr>
+          <w:rFonts w:ascii="Times New Roman" w:cs="Times New Roman" w:eastAsia="Times New Roman" w:hAnsi="Times New Roman"/>
+          <w:sz w:val="22"/>
+          <w:szCs w:val="22"/>
+        </w:rPr>
+        <w:t xml:space="preserve"> (the ticket streams of Section 5.7, which are handled by humans, give c = 0.3-0.4 net of trend), not as an estimate of the dispersion of hallucination counts. As a stress test, replaying the measured daily multipliers on an incident stream of λ = 10 and 120 events/day makes the Poisson capacity plan fail on 21-30% of days (target 5%), with negative-binomial requirements of 33, 384, 75, 892 units against Poisson plans of 15, 138, 15, 138.</w:t>
       </w:r>
     </w:p>
     <w:p>
@@ -13188,6 +13206,2708 @@
           <w:szCs w:val="22"/>
         </w:rPr>
         <w:t xml:space="preserve"> Incident duration (declared start to resolution) has a median of 1.0 h, a 90th percentile of 5.1 h and a 99th percentile of 34 h; the mean is 3.1 h and the coefficient of variation 3.5, i.e. response times are heavy-tailed, not exponential (12.3% are zero-duration notices). Treating incidents as arrivals to an infinite-server system, the time-averaged number of concurrently open incidents is 0.11, matching the M/G/∞ mean (Little's law), and the 95th percentile of the open count is 1, equal to the Poisson 95% quantile of the M/G/∞ occupancy (1); two or more incidents are open simultaneously 0.7% of the time. At provider level a single standing responder therefore covers 95% of the time, whereas the heavy tail of durations explains the rare long overruns. These are provider-declared outage incidents (elevated errors, latency, degraded service), not hallucinations, so they inform the arrival and service-time structure of an LLM incident stream but not its rate.</w:t>
+      </w:r>
+    </w:p>
+    <w:p>
+      <w:pPr>
+        <w:pStyle w:val="Heading2"/>
+        <w:spacing w:after="100" w:before="200"/>
+      </w:pPr>
+      <w:r>
+        <w:rPr>
+          <w:rFonts w:ascii="Times New Roman" w:cs="Times New Roman" w:eastAsia="Times New Roman" w:hAnsi="Times New Roman"/>
+          <w:b/>
+          <w:bCs/>
+          <w:i/>
+          <w:iCs/>
+          <w:sz w:val="23"/>
+          <w:szCs w:val="23"/>
+        </w:rPr>
+        <w:t xml:space="preserve">5.7 Human triage workloads in public company ticket data</w:t>
+      </w:r>
+    </w:p>
+    <w:p>
+      <w:pPr>
+        <w:spacing w:after="120" w:line="300"/>
+        <w:jc w:val="both"/>
+      </w:pPr>
+      <w:r>
+        <w:rPr>
+          <w:rFonts w:ascii="Times New Roman" w:cs="Times New Roman" w:eastAsia="Times New Roman" w:hAnsi="Times New Roman"/>
+          <w:sz w:val="22"/>
+          <w:szCs w:val="22"/>
+        </w:rPr>
+        <w:t xml:space="preserve">The third public dataset family concerns what happens after an incident is detected: how tickets arrive at, and are worked by, human teams in real organisations. The three streams are customer-support and IT-incident tickets, not LLM incidents, but they are the best available public evidence on the arrival variability and the service-time distribution of human triage.</w:t>
+      </w:r>
+    </w:p>
+    <w:p>
+      <w:pPr>
+        <w:keepNext/>
+        <w:spacing w:after="60" w:before="160"/>
+      </w:pPr>
+      <w:r>
+        <w:rPr>
+          <w:rFonts w:ascii="Times New Roman" w:cs="Times New Roman" w:eastAsia="Times New Roman" w:hAnsi="Times New Roman"/>
+          <w:b/>
+          <w:bCs/>
+          <w:sz w:val="20"/>
+          <w:szCs w:val="20"/>
+        </w:rPr>
+        <w:t xml:space="preserve">Table 7. Arrival structure of human-handled ticket streams (weekdays; Poisson plan = 95% quantile of Poisson with the stratum or local mean)</w:t>
+      </w:r>
+    </w:p>
+    <w:tbl>
+      <w:tblPr>
+        <w:tblW w:type="dxa" w:w="9360"/>
+        <w:tblBorders>
+          <w:top w:val="single" w:color="auto" w:sz="4"/>
+          <w:left w:val="single" w:color="auto" w:sz="4"/>
+          <w:bottom w:val="single" w:color="auto" w:sz="4"/>
+          <w:right w:val="single" w:color="auto" w:sz="4"/>
+          <w:insideH w:val="single" w:color="auto" w:sz="4"/>
+          <w:insideV w:val="single" w:color="auto" w:sz="4"/>
+        </w:tblBorders>
+      </w:tblPr>
+      <w:tblGrid>
+        <w:gridCol w:w="2300"/>
+        <w:gridCol w:w="1500"/>
+        <w:gridCol w:w="1300"/>
+        <w:gridCol w:w="1250"/>
+        <w:gridCol w:w="1100"/>
+        <w:gridCol w:w="1000"/>
+        <w:gridCol w:w="910"/>
+      </w:tblGrid>
+      <w:tr>
+        <w:trPr>
+          <w:tblHeader/>
+        </w:trPr>
+        <w:tc>
+          <w:tcPr>
+            <w:tcW w:type="dxa" w:w="2300"/>
+            <w:tcBorders>
+              <w:top w:val="single" w:color="AAAAAA" w:sz="4"/>
+              <w:left w:val="single" w:color="AAAAAA" w:sz="4"/>
+              <w:bottom w:val="single" w:color="AAAAAA" w:sz="4"/>
+              <w:right w:val="single" w:color="AAAAAA" w:sz="4"/>
+            </w:tcBorders>
+            <w:shd w:fill="E8E8E8" w:color="auto" w:val="clear"/>
+            <w:tcMar>
+              <w:top w:type="dxa" w:w="40"/>
+              <w:left w:type="dxa" w:w="80"/>
+              <w:bottom w:type="dxa" w:w="40"/>
+              <w:right w:type="dxa" w:w="80"/>
+            </w:tcMar>
+          </w:tcPr>
+          <w:p>
+            <w:pPr>
+              <w:jc w:val="center"/>
+            </w:pPr>
+            <w:r>
+              <w:rPr>
+                <w:rFonts w:ascii="Times New Roman" w:cs="Times New Roman" w:eastAsia="Times New Roman" w:hAnsi="Times New Roman"/>
+                <w:b/>
+                <w:bCs/>
+                <w:sz w:val="18"/>
+                <w:szCs w:val="18"/>
+              </w:rPr>
+              <w:t xml:space="preserve">Stream</w:t>
+            </w:r>
+          </w:p>
+        </w:tc>
+        <w:tc>
+          <w:tcPr>
+            <w:tcW w:type="dxa" w:w="1500"/>
+            <w:tcBorders>
+              <w:top w:val="single" w:color="AAAAAA" w:sz="4"/>
+              <w:left w:val="single" w:color="AAAAAA" w:sz="4"/>
+              <w:bottom w:val="single" w:color="AAAAAA" w:sz="4"/>
+              <w:right w:val="single" w:color="AAAAAA" w:sz="4"/>
+            </w:tcBorders>
+            <w:shd w:fill="E8E8E8" w:color="auto" w:val="clear"/>
+            <w:tcMar>
+              <w:top w:type="dxa" w:w="40"/>
+              <w:left w:type="dxa" w:w="80"/>
+              <w:bottom w:type="dxa" w:w="40"/>
+              <w:right w:type="dxa" w:w="80"/>
+            </w:tcMar>
+          </w:tcPr>
+          <w:p>
+            <w:pPr>
+              <w:jc w:val="center"/>
+            </w:pPr>
+            <w:r>
+              <w:rPr>
+                <w:rFonts w:ascii="Times New Roman" w:cs="Times New Roman" w:eastAsia="Times New Roman" w:hAnsi="Times New Roman"/>
+                <w:b/>
+                <w:bCs/>
+                <w:sz w:val="18"/>
+                <w:szCs w:val="18"/>
+              </w:rPr>
+              <w:t xml:space="preserve">Tickets (weekday mean/day)</w:t>
+            </w:r>
+          </w:p>
+        </w:tc>
+        <w:tc>
+          <w:tcPr>
+            <w:tcW w:type="dxa" w:w="1300"/>
+            <w:tcBorders>
+              <w:top w:val="single" w:color="AAAAAA" w:sz="4"/>
+              <w:left w:val="single" w:color="AAAAAA" w:sz="4"/>
+              <w:bottom w:val="single" w:color="AAAAAA" w:sz="4"/>
+              <w:right w:val="single" w:color="AAAAAA" w:sz="4"/>
+            </w:tcBorders>
+            <w:shd w:fill="E8E8E8" w:color="auto" w:val="clear"/>
+            <w:tcMar>
+              <w:top w:type="dxa" w:w="40"/>
+              <w:left w:type="dxa" w:w="80"/>
+              <w:bottom w:type="dxa" w:w="40"/>
+              <w:right w:type="dxa" w:w="80"/>
+            </w:tcMar>
+          </w:tcPr>
+          <w:p>
+            <w:pPr>
+              <w:jc w:val="center"/>
+            </w:pPr>
+            <w:r>
+              <w:rPr>
+                <w:rFonts w:ascii="Times New Roman" w:cs="Times New Roman" w:eastAsia="Times New Roman" w:hAnsi="Times New Roman"/>
+                <w:b/>
+                <w:bCs/>
+                <w:sz w:val="18"/>
+                <w:szCs w:val="18"/>
+              </w:rPr>
+              <w:t xml:space="preserve">Weekday-stratified dispersion index</w:t>
+            </w:r>
+          </w:p>
+        </w:tc>
+        <w:tc>
+          <w:tcPr>
+            <w:tcW w:type="dxa" w:w="1250"/>
+            <w:tcBorders>
+              <w:top w:val="single" w:color="AAAAAA" w:sz="4"/>
+              <w:left w:val="single" w:color="AAAAAA" w:sz="4"/>
+              <w:bottom w:val="single" w:color="AAAAAA" w:sz="4"/>
+              <w:right w:val="single" w:color="AAAAAA" w:sz="4"/>
+            </w:tcBorders>
+            <w:shd w:fill="E8E8E8" w:color="auto" w:val="clear"/>
+            <w:tcMar>
+              <w:top w:type="dxa" w:w="40"/>
+              <w:left w:type="dxa" w:w="80"/>
+              <w:bottom w:type="dxa" w:w="40"/>
+              <w:right w:type="dxa" w:w="80"/>
+            </w:tcMar>
+          </w:tcPr>
+          <w:p>
+            <w:pPr>
+              <w:jc w:val="center"/>
+            </w:pPr>
+            <w:r>
+              <w:rPr>
+                <w:rFonts w:ascii="Times New Roman" w:cs="Times New Roman" w:eastAsia="Times New Roman" w:hAnsi="Times New Roman"/>
+                <w:b/>
+                <w:bCs/>
+                <w:sz w:val="18"/>
+                <w:szCs w:val="18"/>
+              </w:rPr>
+              <w:t xml:space="preserve">Daily rate CV net of trend and weekday</w:t>
+            </w:r>
+          </w:p>
+        </w:tc>
+        <w:tc>
+          <w:tcPr>
+            <w:tcW w:type="dxa" w:w="1100"/>
+            <w:tcBorders>
+              <w:top w:val="single" w:color="AAAAAA" w:sz="4"/>
+              <w:left w:val="single" w:color="AAAAAA" w:sz="4"/>
+              <w:bottom w:val="single" w:color="AAAAAA" w:sz="4"/>
+              <w:right w:val="single" w:color="AAAAAA" w:sz="4"/>
+            </w:tcBorders>
+            <w:shd w:fill="E8E8E8" w:color="auto" w:val="clear"/>
+            <w:tcMar>
+              <w:top w:type="dxa" w:w="40"/>
+              <w:left w:type="dxa" w:w="80"/>
+              <w:bottom w:type="dxa" w:w="40"/>
+              <w:right w:type="dxa" w:w="80"/>
+            </w:tcMar>
+          </w:tcPr>
+          <w:p>
+            <w:pPr>
+              <w:jc w:val="center"/>
+            </w:pPr>
+            <w:r>
+              <w:rPr>
+                <w:rFonts w:ascii="Times New Roman" w:cs="Times New Roman" w:eastAsia="Times New Roman" w:hAnsi="Times New Roman"/>
+                <w:b/>
+                <w:bCs/>
+                <w:sz w:val="18"/>
+                <w:szCs w:val="18"/>
+              </w:rPr>
+              <w:t xml:space="preserve">Poisson plan exceeded (stratified)</w:t>
+            </w:r>
+          </w:p>
+        </w:tc>
+        <w:tc>
+          <w:tcPr>
+            <w:tcW w:type="dxa" w:w="1000"/>
+            <w:tcBorders>
+              <w:top w:val="single" w:color="AAAAAA" w:sz="4"/>
+              <w:left w:val="single" w:color="AAAAAA" w:sz="4"/>
+              <w:bottom w:val="single" w:color="AAAAAA" w:sz="4"/>
+              <w:right w:val="single" w:color="AAAAAA" w:sz="4"/>
+            </w:tcBorders>
+            <w:shd w:fill="E8E8E8" w:color="auto" w:val="clear"/>
+            <w:tcMar>
+              <w:top w:type="dxa" w:w="40"/>
+              <w:left w:type="dxa" w:w="80"/>
+              <w:bottom w:type="dxa" w:w="40"/>
+              <w:right w:type="dxa" w:w="80"/>
+            </w:tcMar>
+          </w:tcPr>
+          <w:p>
+            <w:pPr>
+              <w:jc w:val="center"/>
+            </w:pPr>
+            <w:r>
+              <w:rPr>
+                <w:rFonts w:ascii="Times New Roman" w:cs="Times New Roman" w:eastAsia="Times New Roman" w:hAnsi="Times New Roman"/>
+                <w:b/>
+                <w:bCs/>
+                <w:sz w:val="18"/>
+                <w:szCs w:val="18"/>
+              </w:rPr>
+              <w:t xml:space="preserve">Poisson plan exceeded (local mean)</w:t>
+            </w:r>
+          </w:p>
+        </w:tc>
+        <w:tc>
+          <w:tcPr>
+            <w:tcW w:type="dxa" w:w="910"/>
+            <w:tcBorders>
+              <w:top w:val="single" w:color="AAAAAA" w:sz="4"/>
+              <w:left w:val="single" w:color="AAAAAA" w:sz="4"/>
+              <w:bottom w:val="single" w:color="AAAAAA" w:sz="4"/>
+              <w:right w:val="single" w:color="AAAAAA" w:sz="4"/>
+            </w:tcBorders>
+            <w:shd w:fill="E8E8E8" w:color="auto" w:val="clear"/>
+            <w:tcMar>
+              <w:top w:type="dxa" w:w="40"/>
+              <w:left w:type="dxa" w:w="80"/>
+              <w:bottom w:type="dxa" w:w="40"/>
+              <w:right w:type="dxa" w:w="80"/>
+            </w:tcMar>
+          </w:tcPr>
+          <w:p>
+            <w:pPr>
+              <w:jc w:val="center"/>
+            </w:pPr>
+            <w:r>
+              <w:rPr>
+                <w:rFonts w:ascii="Times New Roman" w:cs="Times New Roman" w:eastAsia="Times New Roman" w:hAnsi="Times New Roman"/>
+                <w:b/>
+                <w:bCs/>
+                <w:sz w:val="18"/>
+                <w:szCs w:val="18"/>
+              </w:rPr>
+              <w:t xml:space="preserve">NB plan exceeded (local mean, c from data)</w:t>
+            </w:r>
+          </w:p>
+        </w:tc>
+      </w:tr>
+      <w:tr>
+        <w:tc>
+          <w:tcPr>
+            <w:tcW w:type="dxa" w:w="2300"/>
+            <w:tcBorders>
+              <w:top w:val="single" w:color="AAAAAA" w:sz="4"/>
+              <w:left w:val="single" w:color="AAAAAA" w:sz="4"/>
+              <w:bottom w:val="single" w:color="AAAAAA" w:sz="4"/>
+              <w:right w:val="single" w:color="AAAAAA" w:sz="4"/>
+            </w:tcBorders>
+            <w:tcMar>
+              <w:top w:type="dxa" w:w="40"/>
+              <w:left w:type="dxa" w:w="80"/>
+              <w:bottom w:type="dxa" w:w="40"/>
+              <w:right w:type="dxa" w:w="80"/>
+            </w:tcMar>
+          </w:tcPr>
+          <w:p>
+            <w:pPr>
+              <w:jc w:val="center"/>
+            </w:pPr>
+            <w:r>
+              <w:rPr>
+                <w:rFonts w:ascii="Times New Roman" w:cs="Times New Roman" w:eastAsia="Times New Roman" w:hAnsi="Times New Roman"/>
+                <w:b w:val="false"/>
+                <w:bCs w:val="false"/>
+                <w:sz w:val="18"/>
+                <w:szCs w:val="18"/>
+              </w:rPr>
+              <w:t xml:space="preserve">Software company (customer tickets 2017-23)</w:t>
+            </w:r>
+          </w:p>
+        </w:tc>
+        <w:tc>
+          <w:tcPr>
+            <w:tcW w:type="dxa" w:w="1500"/>
+            <w:tcBorders>
+              <w:top w:val="single" w:color="AAAAAA" w:sz="4"/>
+              <w:left w:val="single" w:color="AAAAAA" w:sz="4"/>
+              <w:bottom w:val="single" w:color="AAAAAA" w:sz="4"/>
+              <w:right w:val="single" w:color="AAAAAA" w:sz="4"/>
+            </w:tcBorders>
+            <w:tcMar>
+              <w:top w:type="dxa" w:w="40"/>
+              <w:left w:type="dxa" w:w="80"/>
+              <w:bottom w:type="dxa" w:w="40"/>
+              <w:right w:type="dxa" w:w="80"/>
+            </w:tcMar>
+          </w:tcPr>
+          <w:p>
+            <w:pPr>
+              <w:jc w:val="center"/>
+            </w:pPr>
+            <w:r>
+              <w:rPr>
+                <w:rFonts w:ascii="Times New Roman" w:cs="Times New Roman" w:eastAsia="Times New Roman" w:hAnsi="Times New Roman"/>
+                <w:b w:val="false"/>
+                <w:bCs w:val="false"/>
+                <w:sz w:val="18"/>
+                <w:szCs w:val="18"/>
+              </w:rPr>
+              <w:t xml:space="preserve">22,016 (10.4)</w:t>
+            </w:r>
+          </w:p>
+        </w:tc>
+        <w:tc>
+          <w:tcPr>
+            <w:tcW w:type="dxa" w:w="1300"/>
+            <w:tcBorders>
+              <w:top w:val="single" w:color="AAAAAA" w:sz="4"/>
+              <w:left w:val="single" w:color="AAAAAA" w:sz="4"/>
+              <w:bottom w:val="single" w:color="AAAAAA" w:sz="4"/>
+              <w:right w:val="single" w:color="AAAAAA" w:sz="4"/>
+            </w:tcBorders>
+            <w:tcMar>
+              <w:top w:type="dxa" w:w="40"/>
+              <w:left w:type="dxa" w:w="80"/>
+              <w:bottom w:type="dxa" w:w="40"/>
+              <w:right w:type="dxa" w:w="80"/>
+            </w:tcMar>
+          </w:tcPr>
+          <w:p>
+            <w:pPr>
+              <w:jc w:val="center"/>
+            </w:pPr>
+            <w:r>
+              <w:rPr>
+                <w:rFonts w:ascii="Times New Roman" w:cs="Times New Roman" w:eastAsia="Times New Roman" w:hAnsi="Times New Roman"/>
+                <w:b w:val="false"/>
+                <w:bCs w:val="false"/>
+                <w:sz w:val="18"/>
+                <w:szCs w:val="18"/>
+              </w:rPr>
+              <w:t xml:space="preserve">3.1</w:t>
+            </w:r>
+          </w:p>
+        </w:tc>
+        <w:tc>
+          <w:tcPr>
+            <w:tcW w:type="dxa" w:w="1250"/>
+            <w:tcBorders>
+              <w:top w:val="single" w:color="AAAAAA" w:sz="4"/>
+              <w:left w:val="single" w:color="AAAAAA" w:sz="4"/>
+              <w:bottom w:val="single" w:color="AAAAAA" w:sz="4"/>
+              <w:right w:val="single" w:color="AAAAAA" w:sz="4"/>
+            </w:tcBorders>
+            <w:tcMar>
+              <w:top w:type="dxa" w:w="40"/>
+              <w:left w:type="dxa" w:w="80"/>
+              <w:bottom w:type="dxa" w:w="40"/>
+              <w:right w:type="dxa" w:w="80"/>
+            </w:tcMar>
+          </w:tcPr>
+          <w:p>
+            <w:pPr>
+              <w:jc w:val="center"/>
+            </w:pPr>
+            <w:r>
+              <w:rPr>
+                <w:rFonts w:ascii="Times New Roman" w:cs="Times New Roman" w:eastAsia="Times New Roman" w:hAnsi="Times New Roman"/>
+                <w:b w:val="false"/>
+                <w:bCs w:val="false"/>
+                <w:sz w:val="18"/>
+                <w:szCs w:val="18"/>
+              </w:rPr>
+              <w:t xml:space="preserve">0.33</w:t>
+            </w:r>
+          </w:p>
+        </w:tc>
+        <w:tc>
+          <w:tcPr>
+            <w:tcW w:type="dxa" w:w="1100"/>
+            <w:tcBorders>
+              <w:top w:val="single" w:color="AAAAAA" w:sz="4"/>
+              <w:left w:val="single" w:color="AAAAAA" w:sz="4"/>
+              <w:bottom w:val="single" w:color="AAAAAA" w:sz="4"/>
+              <w:right w:val="single" w:color="AAAAAA" w:sz="4"/>
+            </w:tcBorders>
+            <w:tcMar>
+              <w:top w:type="dxa" w:w="40"/>
+              <w:left w:type="dxa" w:w="80"/>
+              <w:bottom w:type="dxa" w:w="40"/>
+              <w:right w:type="dxa" w:w="80"/>
+            </w:tcMar>
+          </w:tcPr>
+          <w:p>
+            <w:pPr>
+              <w:jc w:val="center"/>
+            </w:pPr>
+            <w:r>
+              <w:rPr>
+                <w:rFonts w:ascii="Times New Roman" w:cs="Times New Roman" w:eastAsia="Times New Roman" w:hAnsi="Times New Roman"/>
+                <w:b w:val="false"/>
+                <w:bCs w:val="false"/>
+                <w:sz w:val="18"/>
+                <w:szCs w:val="18"/>
+              </w:rPr>
+              <w:t xml:space="preserve">13.4%</w:t>
+            </w:r>
+          </w:p>
+        </w:tc>
+        <w:tc>
+          <w:tcPr>
+            <w:tcW w:type="dxa" w:w="1000"/>
+            <w:tcBorders>
+              <w:top w:val="single" w:color="AAAAAA" w:sz="4"/>
+              <w:left w:val="single" w:color="AAAAAA" w:sz="4"/>
+              <w:bottom w:val="single" w:color="AAAAAA" w:sz="4"/>
+              <w:right w:val="single" w:color="AAAAAA" w:sz="4"/>
+            </w:tcBorders>
+            <w:tcMar>
+              <w:top w:type="dxa" w:w="40"/>
+              <w:left w:type="dxa" w:w="80"/>
+              <w:bottom w:type="dxa" w:w="40"/>
+              <w:right w:type="dxa" w:w="80"/>
+            </w:tcMar>
+          </w:tcPr>
+          <w:p>
+            <w:pPr>
+              <w:jc w:val="center"/>
+            </w:pPr>
+            <w:r>
+              <w:rPr>
+                <w:rFonts w:ascii="Times New Roman" w:cs="Times New Roman" w:eastAsia="Times New Roman" w:hAnsi="Times New Roman"/>
+                <w:b w:val="false"/>
+                <w:bCs w:val="false"/>
+                <w:sz w:val="18"/>
+                <w:szCs w:val="18"/>
+              </w:rPr>
+              <w:t xml:space="preserve">9.3%</w:t>
+            </w:r>
+          </w:p>
+        </w:tc>
+        <w:tc>
+          <w:tcPr>
+            <w:tcW w:type="dxa" w:w="910"/>
+            <w:tcBorders>
+              <w:top w:val="single" w:color="AAAAAA" w:sz="4"/>
+              <w:left w:val="single" w:color="AAAAAA" w:sz="4"/>
+              <w:bottom w:val="single" w:color="AAAAAA" w:sz="4"/>
+              <w:right w:val="single" w:color="AAAAAA" w:sz="4"/>
+            </w:tcBorders>
+            <w:tcMar>
+              <w:top w:type="dxa" w:w="40"/>
+              <w:left w:type="dxa" w:w="80"/>
+              <w:bottom w:type="dxa" w:w="40"/>
+              <w:right w:type="dxa" w:w="80"/>
+            </w:tcMar>
+          </w:tcPr>
+          <w:p>
+            <w:pPr>
+              <w:jc w:val="center"/>
+            </w:pPr>
+            <w:r>
+              <w:rPr>
+                <w:rFonts w:ascii="Times New Roman" w:cs="Times New Roman" w:eastAsia="Times New Roman" w:hAnsi="Times New Roman"/>
+                <w:b w:val="false"/>
+                <w:bCs w:val="false"/>
+                <w:sz w:val="18"/>
+                <w:szCs w:val="18"/>
+              </w:rPr>
+              <w:t xml:space="preserve">4.1%</w:t>
+            </w:r>
+          </w:p>
+        </w:tc>
+      </w:tr>
+      <w:tr>
+        <w:tc>
+          <w:tcPr>
+            <w:tcW w:type="dxa" w:w="2300"/>
+            <w:tcBorders>
+              <w:top w:val="single" w:color="AAAAAA" w:sz="4"/>
+              <w:left w:val="single" w:color="AAAAAA" w:sz="4"/>
+              <w:bottom w:val="single" w:color="AAAAAA" w:sz="4"/>
+              <w:right w:val="single" w:color="AAAAAA" w:sz="4"/>
+            </w:tcBorders>
+            <w:tcMar>
+              <w:top w:type="dxa" w:w="40"/>
+              <w:left w:type="dxa" w:w="80"/>
+              <w:bottom w:type="dxa" w:w="40"/>
+              <w:right w:type="dxa" w:w="80"/>
+            </w:tcMar>
+          </w:tcPr>
+          <w:p>
+            <w:pPr>
+              <w:jc w:val="center"/>
+            </w:pPr>
+            <w:r>
+              <w:rPr>
+                <w:rFonts w:ascii="Times New Roman" w:cs="Times New Roman" w:eastAsia="Times New Roman" w:hAnsi="Times New Roman"/>
+                <w:b w:val="false"/>
+                <w:bCs w:val="false"/>
+                <w:sz w:val="18"/>
+                <w:szCs w:val="18"/>
+              </w:rPr>
+              <w:t xml:space="preserve">ServiceNow incidents (2016-17)</w:t>
+            </w:r>
+          </w:p>
+        </w:tc>
+        <w:tc>
+          <w:tcPr>
+            <w:tcW w:type="dxa" w:w="1500"/>
+            <w:tcBorders>
+              <w:top w:val="single" w:color="AAAAAA" w:sz="4"/>
+              <w:left w:val="single" w:color="AAAAAA" w:sz="4"/>
+              <w:bottom w:val="single" w:color="AAAAAA" w:sz="4"/>
+              <w:right w:val="single" w:color="AAAAAA" w:sz="4"/>
+            </w:tcBorders>
+            <w:tcMar>
+              <w:top w:type="dxa" w:w="40"/>
+              <w:left w:type="dxa" w:w="80"/>
+              <w:bottom w:type="dxa" w:w="40"/>
+              <w:right w:type="dxa" w:w="80"/>
+            </w:tcMar>
+          </w:tcPr>
+          <w:p>
+            <w:pPr>
+              <w:jc w:val="center"/>
+            </w:pPr>
+            <w:r>
+              <w:rPr>
+                <w:rFonts w:ascii="Times New Roman" w:cs="Times New Roman" w:eastAsia="Times New Roman" w:hAnsi="Times New Roman"/>
+                <w:b w:val="false"/>
+                <w:bCs w:val="false"/>
+                <w:sz w:val="18"/>
+                <w:szCs w:val="18"/>
+              </w:rPr>
+              <w:t xml:space="preserve">24,918 (93.4)</w:t>
+            </w:r>
+          </w:p>
+        </w:tc>
+        <w:tc>
+          <w:tcPr>
+            <w:tcW w:type="dxa" w:w="1300"/>
+            <w:tcBorders>
+              <w:top w:val="single" w:color="AAAAAA" w:sz="4"/>
+              <w:left w:val="single" w:color="AAAAAA" w:sz="4"/>
+              <w:bottom w:val="single" w:color="AAAAAA" w:sz="4"/>
+              <w:right w:val="single" w:color="AAAAAA" w:sz="4"/>
+            </w:tcBorders>
+            <w:tcMar>
+              <w:top w:type="dxa" w:w="40"/>
+              <w:left w:type="dxa" w:w="80"/>
+              <w:bottom w:type="dxa" w:w="40"/>
+              <w:right w:type="dxa" w:w="80"/>
+            </w:tcMar>
+          </w:tcPr>
+          <w:p>
+            <w:pPr>
+              <w:jc w:val="center"/>
+            </w:pPr>
+            <w:r>
+              <w:rPr>
+                <w:rFonts w:ascii="Times New Roman" w:cs="Times New Roman" w:eastAsia="Times New Roman" w:hAnsi="Times New Roman"/>
+                <w:b w:val="false"/>
+                <w:bCs w:val="false"/>
+                <w:sz w:val="18"/>
+                <w:szCs w:val="18"/>
+              </w:rPr>
+              <w:t xml:space="preserve">281.2</w:t>
+            </w:r>
+          </w:p>
+        </w:tc>
+        <w:tc>
+          <w:tcPr>
+            <w:tcW w:type="dxa" w:w="1250"/>
+            <w:tcBorders>
+              <w:top w:val="single" w:color="AAAAAA" w:sz="4"/>
+              <w:left w:val="single" w:color="AAAAAA" w:sz="4"/>
+              <w:bottom w:val="single" w:color="AAAAAA" w:sz="4"/>
+              <w:right w:val="single" w:color="AAAAAA" w:sz="4"/>
+            </w:tcBorders>
+            <w:tcMar>
+              <w:top w:type="dxa" w:w="40"/>
+              <w:left w:type="dxa" w:w="80"/>
+              <w:bottom w:type="dxa" w:w="40"/>
+              <w:right w:type="dxa" w:w="80"/>
+            </w:tcMar>
+          </w:tcPr>
+          <w:p>
+            <w:pPr>
+              <w:jc w:val="center"/>
+            </w:pPr>
+            <w:r>
+              <w:rPr>
+                <w:rFonts w:ascii="Times New Roman" w:cs="Times New Roman" w:eastAsia="Times New Roman" w:hAnsi="Times New Roman"/>
+                <w:b w:val="false"/>
+                <w:bCs w:val="false"/>
+                <w:sz w:val="18"/>
+                <w:szCs w:val="18"/>
+              </w:rPr>
+              <w:t xml:space="preserve">0.38</w:t>
+            </w:r>
+          </w:p>
+        </w:tc>
+        <w:tc>
+          <w:tcPr>
+            <w:tcW w:type="dxa" w:w="1100"/>
+            <w:tcBorders>
+              <w:top w:val="single" w:color="AAAAAA" w:sz="4"/>
+              <w:left w:val="single" w:color="AAAAAA" w:sz="4"/>
+              <w:bottom w:val="single" w:color="AAAAAA" w:sz="4"/>
+              <w:right w:val="single" w:color="AAAAAA" w:sz="4"/>
+            </w:tcBorders>
+            <w:tcMar>
+              <w:top w:type="dxa" w:w="40"/>
+              <w:left w:type="dxa" w:w="80"/>
+              <w:bottom w:type="dxa" w:w="40"/>
+              <w:right w:type="dxa" w:w="80"/>
+            </w:tcMar>
+          </w:tcPr>
+          <w:p>
+            <w:pPr>
+              <w:jc w:val="center"/>
+            </w:pPr>
+            <w:r>
+              <w:rPr>
+                <w:rFonts w:ascii="Times New Roman" w:cs="Times New Roman" w:eastAsia="Times New Roman" w:hAnsi="Times New Roman"/>
+                <w:b w:val="false"/>
+                <w:bCs w:val="false"/>
+                <w:sz w:val="18"/>
+                <w:szCs w:val="18"/>
+              </w:rPr>
+              <w:t xml:space="preserve">24.8%</w:t>
+            </w:r>
+          </w:p>
+        </w:tc>
+        <w:tc>
+          <w:tcPr>
+            <w:tcW w:type="dxa" w:w="1000"/>
+            <w:tcBorders>
+              <w:top w:val="single" w:color="AAAAAA" w:sz="4"/>
+              <w:left w:val="single" w:color="AAAAAA" w:sz="4"/>
+              <w:bottom w:val="single" w:color="AAAAAA" w:sz="4"/>
+              <w:right w:val="single" w:color="AAAAAA" w:sz="4"/>
+            </w:tcBorders>
+            <w:tcMar>
+              <w:top w:type="dxa" w:w="40"/>
+              <w:left w:type="dxa" w:w="80"/>
+              <w:bottom w:type="dxa" w:w="40"/>
+              <w:right w:type="dxa" w:w="80"/>
+            </w:tcMar>
+          </w:tcPr>
+          <w:p>
+            <w:pPr>
+              <w:jc w:val="center"/>
+            </w:pPr>
+            <w:r>
+              <w:rPr>
+                <w:rFonts w:ascii="Times New Roman" w:cs="Times New Roman" w:eastAsia="Times New Roman" w:hAnsi="Times New Roman"/>
+                <w:b w:val="false"/>
+                <w:bCs w:val="false"/>
+                <w:sz w:val="18"/>
+                <w:szCs w:val="18"/>
+              </w:rPr>
+              <w:t xml:space="preserve">16.5%</w:t>
+            </w:r>
+          </w:p>
+        </w:tc>
+        <w:tc>
+          <w:tcPr>
+            <w:tcW w:type="dxa" w:w="910"/>
+            <w:tcBorders>
+              <w:top w:val="single" w:color="AAAAAA" w:sz="4"/>
+              <w:left w:val="single" w:color="AAAAAA" w:sz="4"/>
+              <w:bottom w:val="single" w:color="AAAAAA" w:sz="4"/>
+              <w:right w:val="single" w:color="AAAAAA" w:sz="4"/>
+            </w:tcBorders>
+            <w:tcMar>
+              <w:top w:type="dxa" w:w="40"/>
+              <w:left w:type="dxa" w:w="80"/>
+              <w:bottom w:type="dxa" w:w="40"/>
+              <w:right w:type="dxa" w:w="80"/>
+            </w:tcMar>
+          </w:tcPr>
+          <w:p>
+            <w:pPr>
+              <w:jc w:val="center"/>
+            </w:pPr>
+            <w:r>
+              <w:rPr>
+                <w:rFonts w:ascii="Times New Roman" w:cs="Times New Roman" w:eastAsia="Times New Roman" w:hAnsi="Times New Roman"/>
+                <w:b w:val="false"/>
+                <w:bCs w:val="false"/>
+                <w:sz w:val="18"/>
+                <w:szCs w:val="18"/>
+              </w:rPr>
+              <w:t xml:space="preserve">3.5%</w:t>
+            </w:r>
+          </w:p>
+        </w:tc>
+      </w:tr>
+      <w:tr>
+        <w:tc>
+          <w:tcPr>
+            <w:tcW w:type="dxa" w:w="2300"/>
+            <w:tcBorders>
+              <w:top w:val="single" w:color="AAAAAA" w:sz="4"/>
+              <w:left w:val="single" w:color="AAAAAA" w:sz="4"/>
+              <w:bottom w:val="single" w:color="AAAAAA" w:sz="4"/>
+              <w:right w:val="single" w:color="AAAAAA" w:sz="4"/>
+            </w:tcBorders>
+            <w:tcMar>
+              <w:top w:type="dxa" w:w="40"/>
+              <w:left w:type="dxa" w:w="80"/>
+              <w:bottom w:type="dxa" w:w="40"/>
+              <w:right w:type="dxa" w:w="80"/>
+            </w:tcMar>
+          </w:tcPr>
+          <w:p>
+            <w:pPr>
+              <w:jc w:val="center"/>
+            </w:pPr>
+            <w:r>
+              <w:rPr>
+                <w:rFonts w:ascii="Times New Roman" w:cs="Times New Roman" w:eastAsia="Times New Roman" w:hAnsi="Times New Roman"/>
+                <w:b w:val="false"/>
+                <w:bCs w:val="false"/>
+                <w:sz w:val="18"/>
+                <w:szCs w:val="18"/>
+              </w:rPr>
+              <w:t xml:space="preserve">Italian software help desk (2010-12)</w:t>
+            </w:r>
+          </w:p>
+        </w:tc>
+        <w:tc>
+          <w:tcPr>
+            <w:tcW w:type="dxa" w:w="1500"/>
+            <w:tcBorders>
+              <w:top w:val="single" w:color="AAAAAA" w:sz="4"/>
+              <w:left w:val="single" w:color="AAAAAA" w:sz="4"/>
+              <w:bottom w:val="single" w:color="AAAAAA" w:sz="4"/>
+              <w:right w:val="single" w:color="AAAAAA" w:sz="4"/>
+            </w:tcBorders>
+            <w:tcMar>
+              <w:top w:type="dxa" w:w="40"/>
+              <w:left w:type="dxa" w:w="80"/>
+              <w:bottom w:type="dxa" w:w="40"/>
+              <w:right w:type="dxa" w:w="80"/>
+            </w:tcMar>
+          </w:tcPr>
+          <w:p>
+            <w:pPr>
+              <w:jc w:val="center"/>
+            </w:pPr>
+            <w:r>
+              <w:rPr>
+                <w:rFonts w:ascii="Times New Roman" w:cs="Times New Roman" w:eastAsia="Times New Roman" w:hAnsi="Times New Roman"/>
+                <w:b w:val="false"/>
+                <w:bCs w:val="false"/>
+                <w:sz w:val="18"/>
+                <w:szCs w:val="18"/>
+              </w:rPr>
+              <w:t xml:space="preserve">3,804 (5.3)</w:t>
+            </w:r>
+          </w:p>
+        </w:tc>
+        <w:tc>
+          <w:tcPr>
+            <w:tcW w:type="dxa" w:w="1300"/>
+            <w:tcBorders>
+              <w:top w:val="single" w:color="AAAAAA" w:sz="4"/>
+              <w:left w:val="single" w:color="AAAAAA" w:sz="4"/>
+              <w:bottom w:val="single" w:color="AAAAAA" w:sz="4"/>
+              <w:right w:val="single" w:color="AAAAAA" w:sz="4"/>
+            </w:tcBorders>
+            <w:tcMar>
+              <w:top w:type="dxa" w:w="40"/>
+              <w:left w:type="dxa" w:w="80"/>
+              <w:bottom w:type="dxa" w:w="40"/>
+              <w:right w:type="dxa" w:w="80"/>
+            </w:tcMar>
+          </w:tcPr>
+          <w:p>
+            <w:pPr>
+              <w:jc w:val="center"/>
+            </w:pPr>
+            <w:r>
+              <w:rPr>
+                <w:rFonts w:ascii="Times New Roman" w:cs="Times New Roman" w:eastAsia="Times New Roman" w:hAnsi="Times New Roman"/>
+                <w:b w:val="false"/>
+                <w:bCs w:val="false"/>
+                <w:sz w:val="18"/>
+                <w:szCs w:val="18"/>
+              </w:rPr>
+              <w:t xml:space="preserve">2.5</w:t>
+            </w:r>
+          </w:p>
+        </w:tc>
+        <w:tc>
+          <w:tcPr>
+            <w:tcW w:type="dxa" w:w="1250"/>
+            <w:tcBorders>
+              <w:top w:val="single" w:color="AAAAAA" w:sz="4"/>
+              <w:left w:val="single" w:color="AAAAAA" w:sz="4"/>
+              <w:bottom w:val="single" w:color="AAAAAA" w:sz="4"/>
+              <w:right w:val="single" w:color="AAAAAA" w:sz="4"/>
+            </w:tcBorders>
+            <w:tcMar>
+              <w:top w:type="dxa" w:w="40"/>
+              <w:left w:type="dxa" w:w="80"/>
+              <w:bottom w:type="dxa" w:w="40"/>
+              <w:right w:type="dxa" w:w="80"/>
+            </w:tcMar>
+          </w:tcPr>
+          <w:p>
+            <w:pPr>
+              <w:jc w:val="center"/>
+            </w:pPr>
+            <w:r>
+              <w:rPr>
+                <w:rFonts w:ascii="Times New Roman" w:cs="Times New Roman" w:eastAsia="Times New Roman" w:hAnsi="Times New Roman"/>
+                <w:b w:val="false"/>
+                <w:bCs w:val="false"/>
+                <w:sz w:val="18"/>
+                <w:szCs w:val="18"/>
+              </w:rPr>
+              <w:t xml:space="preserve">0.41</w:t>
+            </w:r>
+          </w:p>
+        </w:tc>
+        <w:tc>
+          <w:tcPr>
+            <w:tcW w:type="dxa" w:w="1100"/>
+            <w:tcBorders>
+              <w:top w:val="single" w:color="AAAAAA" w:sz="4"/>
+              <w:left w:val="single" w:color="AAAAAA" w:sz="4"/>
+              <w:bottom w:val="single" w:color="AAAAAA" w:sz="4"/>
+              <w:right w:val="single" w:color="AAAAAA" w:sz="4"/>
+            </w:tcBorders>
+            <w:tcMar>
+              <w:top w:type="dxa" w:w="40"/>
+              <w:left w:type="dxa" w:w="80"/>
+              <w:bottom w:type="dxa" w:w="40"/>
+              <w:right w:type="dxa" w:w="80"/>
+            </w:tcMar>
+          </w:tcPr>
+          <w:p>
+            <w:pPr>
+              <w:jc w:val="center"/>
+            </w:pPr>
+            <w:r>
+              <w:rPr>
+                <w:rFonts w:ascii="Times New Roman" w:cs="Times New Roman" w:eastAsia="Times New Roman" w:hAnsi="Times New Roman"/>
+                <w:b w:val="false"/>
+                <w:bCs w:val="false"/>
+                <w:sz w:val="18"/>
+                <w:szCs w:val="18"/>
+              </w:rPr>
+              <w:t xml:space="preserve">12.7%</w:t>
+            </w:r>
+          </w:p>
+        </w:tc>
+        <w:tc>
+          <w:tcPr>
+            <w:tcW w:type="dxa" w:w="1000"/>
+            <w:tcBorders>
+              <w:top w:val="single" w:color="AAAAAA" w:sz="4"/>
+              <w:left w:val="single" w:color="AAAAAA" w:sz="4"/>
+              <w:bottom w:val="single" w:color="AAAAAA" w:sz="4"/>
+              <w:right w:val="single" w:color="AAAAAA" w:sz="4"/>
+            </w:tcBorders>
+            <w:tcMar>
+              <w:top w:type="dxa" w:w="40"/>
+              <w:left w:type="dxa" w:w="80"/>
+              <w:bottom w:type="dxa" w:w="40"/>
+              <w:right w:type="dxa" w:w="80"/>
+            </w:tcMar>
+          </w:tcPr>
+          <w:p>
+            <w:pPr>
+              <w:jc w:val="center"/>
+            </w:pPr>
+            <w:r>
+              <w:rPr>
+                <w:rFonts w:ascii="Times New Roman" w:cs="Times New Roman" w:eastAsia="Times New Roman" w:hAnsi="Times New Roman"/>
+                <w:b w:val="false"/>
+                <w:bCs w:val="false"/>
+                <w:sz w:val="18"/>
+                <w:szCs w:val="18"/>
+              </w:rPr>
+              <w:t xml:space="preserve">7.5%</w:t>
+            </w:r>
+          </w:p>
+        </w:tc>
+        <w:tc>
+          <w:tcPr>
+            <w:tcW w:type="dxa" w:w="910"/>
+            <w:tcBorders>
+              <w:top w:val="single" w:color="AAAAAA" w:sz="4"/>
+              <w:left w:val="single" w:color="AAAAAA" w:sz="4"/>
+              <w:bottom w:val="single" w:color="AAAAAA" w:sz="4"/>
+              <w:right w:val="single" w:color="AAAAAA" w:sz="4"/>
+            </w:tcBorders>
+            <w:tcMar>
+              <w:top w:type="dxa" w:w="40"/>
+              <w:left w:type="dxa" w:w="80"/>
+              <w:bottom w:type="dxa" w:w="40"/>
+              <w:right w:type="dxa" w:w="80"/>
+            </w:tcMar>
+          </w:tcPr>
+          <w:p>
+            <w:pPr>
+              <w:jc w:val="center"/>
+            </w:pPr>
+            <w:r>
+              <w:rPr>
+                <w:rFonts w:ascii="Times New Roman" w:cs="Times New Roman" w:eastAsia="Times New Roman" w:hAnsi="Times New Roman"/>
+                <w:b w:val="false"/>
+                <w:bCs w:val="false"/>
+                <w:sz w:val="18"/>
+                <w:szCs w:val="18"/>
+              </w:rPr>
+              <w:t xml:space="preserve">3.7%</w:t>
+            </w:r>
+          </w:p>
+        </w:tc>
+      </w:tr>
+    </w:tbl>
+    <w:p>
+      <w:pPr>
+        <w:spacing w:after="160" w:before="40"/>
+      </w:pPr>
+      <w:r>
+        <w:rPr>
+          <w:rFonts w:ascii="Times New Roman" w:cs="Times New Roman" w:eastAsia="Times New Roman" w:hAnsi="Times New Roman"/>
+          <w:i/>
+          <w:iCs/>
+          <w:sz w:val="18"/>
+          <w:szCs w:val="18"/>
+        </w:rPr>
+        <w:t xml:space="preserve">Target exceedance is 5%. Stratified: separate Poisson plan per weekday over the whole period (includes slow trends). Local: leave-one-out mean of surrounding weekdays (about 8 weeks) after removing the weekday effect.</w:t>
+      </w:r>
+    </w:p>
+    <w:p>
+      <w:pPr>
+        <w:spacing w:after="120" w:line="300"/>
+        <w:jc w:val="both"/>
+      </w:pPr>
+      <w:r>
+        <w:rPr>
+          <w:rFonts w:ascii="Times New Roman" w:cs="Times New Roman" w:eastAsia="Times New Roman" w:hAnsi="Times New Roman"/>
+          <w:b/>
+          <w:bCs/>
+          <w:sz w:val="22"/>
+          <w:szCs w:val="22"/>
+        </w:rPr>
+        <w:t xml:space="preserve">Arrivals.</w:t>
+      </w:r>
+      <w:r>
+        <w:rPr>
+          <w:rFonts w:ascii="Times New Roman" w:cs="Times New Roman" w:eastAsia="Times New Roman" w:hAnsi="Times New Roman"/>
+          <w:sz w:val="22"/>
+          <w:szCs w:val="22"/>
+        </w:rPr>
+        <w:t xml:space="preserve"> All three streams are strongly non-homogeneous over the week and the day (hour-of-week homogeneity rejected, p &lt; 10⁻¹⁰⁰; weekend ticket rates are 0.76, 0.13 and 0.04 of weekday rates), and arrivals are far from Poisson even after time-rescaling (p &lt; 10⁻⁹⁰), because daily volumes vary beyond the weekly cycle. Net of slow trends and the weekday effect, the coefficient of variation of the daily rate is 0.33 (software company), 0.38 (ServiceNow) and 0.41 (Italian help desk), and 0.41 for the high-priority subset of the software company (2.6 tickets per day). These values are close to each other and to the scenarios used in Section 5.4 (c = 0.3 and 0.44), which supports using c ≈ 0.3-0.45 as a realistic range for human-handled incident streams. At 5 to 90 tickets per weekday, the effect is practically important: a Poisson-sized plan against the local mean is exceeded on 7.5-16.5% of weekdays instead of 5%, and a negative-binomial plan using the estimated c restores 3.5-4.1%. This is a direct, out-of-sample check of Proposition 2 on real human-triage streams. (For the high-priority subset, at 2.6 tickets per day, the Poisson plan is exceeded on 4.8% of weekdays, consistent with the thinning argument that over-dispersion matters less at low rates.)</w:t>
+      </w:r>
+    </w:p>
+    <w:p>
+      <w:pPr>
+        <w:keepNext/>
+        <w:spacing w:after="60" w:before="160"/>
+      </w:pPr>
+      <w:r>
+        <w:rPr>
+          <w:rFonts w:ascii="Times New Roman" w:cs="Times New Roman" w:eastAsia="Times New Roman" w:hAnsi="Times New Roman"/>
+          <w:b/>
+          <w:bCs/>
+          <w:sz w:val="20"/>
+          <w:szCs w:val="20"/>
+        </w:rPr>
+        <w:t xml:space="preserve">Table 8. Resolution and handling times of tickets (hours)</w:t>
+      </w:r>
+    </w:p>
+    <w:tbl>
+      <w:tblPr>
+        <w:tblW w:type="dxa" w:w="9360"/>
+        <w:tblBorders>
+          <w:top w:val="single" w:color="auto" w:sz="4"/>
+          <w:left w:val="single" w:color="auto" w:sz="4"/>
+          <w:bottom w:val="single" w:color="auto" w:sz="4"/>
+          <w:right w:val="single" w:color="auto" w:sz="4"/>
+          <w:insideH w:val="single" w:color="auto" w:sz="4"/>
+          <w:insideV w:val="single" w:color="auto" w:sz="4"/>
+        </w:tblBorders>
+      </w:tblPr>
+      <w:tblGrid>
+        <w:gridCol w:w="3000"/>
+        <w:gridCol w:w="700"/>
+        <w:gridCol w:w="800"/>
+        <w:gridCol w:w="800"/>
+        <w:gridCol w:w="900"/>
+        <w:gridCol w:w="900"/>
+        <w:gridCol w:w="600"/>
+        <w:gridCol w:w="1660"/>
+      </w:tblGrid>
+      <w:tr>
+        <w:trPr>
+          <w:tblHeader/>
+        </w:trPr>
+        <w:tc>
+          <w:tcPr>
+            <w:tcW w:type="dxa" w:w="3000"/>
+            <w:tcBorders>
+              <w:top w:val="single" w:color="AAAAAA" w:sz="4"/>
+              <w:left w:val="single" w:color="AAAAAA" w:sz="4"/>
+              <w:bottom w:val="single" w:color="AAAAAA" w:sz="4"/>
+              <w:right w:val="single" w:color="AAAAAA" w:sz="4"/>
+            </w:tcBorders>
+            <w:shd w:fill="E8E8E8" w:color="auto" w:val="clear"/>
+            <w:tcMar>
+              <w:top w:type="dxa" w:w="40"/>
+              <w:left w:type="dxa" w:w="80"/>
+              <w:bottom w:type="dxa" w:w="40"/>
+              <w:right w:type="dxa" w:w="80"/>
+            </w:tcMar>
+          </w:tcPr>
+          <w:p>
+            <w:pPr>
+              <w:jc w:val="center"/>
+            </w:pPr>
+            <w:r>
+              <w:rPr>
+                <w:rFonts w:ascii="Times New Roman" w:cs="Times New Roman" w:eastAsia="Times New Roman" w:hAnsi="Times New Roman"/>
+                <w:b/>
+                <w:bCs/>
+                <w:sz w:val="18"/>
+                <w:szCs w:val="18"/>
+              </w:rPr>
+              <w:t xml:space="preserve">Stream / measure</w:t>
+            </w:r>
+          </w:p>
+        </w:tc>
+        <w:tc>
+          <w:tcPr>
+            <w:tcW w:type="dxa" w:w="700"/>
+            <w:tcBorders>
+              <w:top w:val="single" w:color="AAAAAA" w:sz="4"/>
+              <w:left w:val="single" w:color="AAAAAA" w:sz="4"/>
+              <w:bottom w:val="single" w:color="AAAAAA" w:sz="4"/>
+              <w:right w:val="single" w:color="AAAAAA" w:sz="4"/>
+            </w:tcBorders>
+            <w:shd w:fill="E8E8E8" w:color="auto" w:val="clear"/>
+            <w:tcMar>
+              <w:top w:type="dxa" w:w="40"/>
+              <w:left w:type="dxa" w:w="80"/>
+              <w:bottom w:type="dxa" w:w="40"/>
+              <w:right w:type="dxa" w:w="80"/>
+            </w:tcMar>
+          </w:tcPr>
+          <w:p>
+            <w:pPr>
+              <w:jc w:val="center"/>
+            </w:pPr>
+            <w:r>
+              <w:rPr>
+                <w:rFonts w:ascii="Times New Roman" w:cs="Times New Roman" w:eastAsia="Times New Roman" w:hAnsi="Times New Roman"/>
+                <w:b/>
+                <w:bCs/>
+                <w:sz w:val="18"/>
+                <w:szCs w:val="18"/>
+              </w:rPr>
+              <w:t xml:space="preserve">n</w:t>
+            </w:r>
+          </w:p>
+        </w:tc>
+        <w:tc>
+          <w:tcPr>
+            <w:tcW w:type="dxa" w:w="800"/>
+            <w:tcBorders>
+              <w:top w:val="single" w:color="AAAAAA" w:sz="4"/>
+              <w:left w:val="single" w:color="AAAAAA" w:sz="4"/>
+              <w:bottom w:val="single" w:color="AAAAAA" w:sz="4"/>
+              <w:right w:val="single" w:color="AAAAAA" w:sz="4"/>
+            </w:tcBorders>
+            <w:shd w:fill="E8E8E8" w:color="auto" w:val="clear"/>
+            <w:tcMar>
+              <w:top w:type="dxa" w:w="40"/>
+              <w:left w:type="dxa" w:w="80"/>
+              <w:bottom w:type="dxa" w:w="40"/>
+              <w:right w:type="dxa" w:w="80"/>
+            </w:tcMar>
+          </w:tcPr>
+          <w:p>
+            <w:pPr>
+              <w:jc w:val="center"/>
+            </w:pPr>
+            <w:r>
+              <w:rPr>
+                <w:rFonts w:ascii="Times New Roman" w:cs="Times New Roman" w:eastAsia="Times New Roman" w:hAnsi="Times New Roman"/>
+                <w:b/>
+                <w:bCs/>
+                <w:sz w:val="18"/>
+                <w:szCs w:val="18"/>
+              </w:rPr>
+              <w:t xml:space="preserve">Median</w:t>
+            </w:r>
+          </w:p>
+        </w:tc>
+        <w:tc>
+          <w:tcPr>
+            <w:tcW w:type="dxa" w:w="800"/>
+            <w:tcBorders>
+              <w:top w:val="single" w:color="AAAAAA" w:sz="4"/>
+              <w:left w:val="single" w:color="AAAAAA" w:sz="4"/>
+              <w:bottom w:val="single" w:color="AAAAAA" w:sz="4"/>
+              <w:right w:val="single" w:color="AAAAAA" w:sz="4"/>
+            </w:tcBorders>
+            <w:shd w:fill="E8E8E8" w:color="auto" w:val="clear"/>
+            <w:tcMar>
+              <w:top w:type="dxa" w:w="40"/>
+              <w:left w:type="dxa" w:w="80"/>
+              <w:bottom w:type="dxa" w:w="40"/>
+              <w:right w:type="dxa" w:w="80"/>
+            </w:tcMar>
+          </w:tcPr>
+          <w:p>
+            <w:pPr>
+              <w:jc w:val="center"/>
+            </w:pPr>
+            <w:r>
+              <w:rPr>
+                <w:rFonts w:ascii="Times New Roman" w:cs="Times New Roman" w:eastAsia="Times New Roman" w:hAnsi="Times New Roman"/>
+                <w:b/>
+                <w:bCs/>
+                <w:sz w:val="18"/>
+                <w:szCs w:val="18"/>
+              </w:rPr>
+              <w:t xml:space="preserve">Mean</w:t>
+            </w:r>
+          </w:p>
+        </w:tc>
+        <w:tc>
+          <w:tcPr>
+            <w:tcW w:type="dxa" w:w="900"/>
+            <w:tcBorders>
+              <w:top w:val="single" w:color="AAAAAA" w:sz="4"/>
+              <w:left w:val="single" w:color="AAAAAA" w:sz="4"/>
+              <w:bottom w:val="single" w:color="AAAAAA" w:sz="4"/>
+              <w:right w:val="single" w:color="AAAAAA" w:sz="4"/>
+            </w:tcBorders>
+            <w:shd w:fill="E8E8E8" w:color="auto" w:val="clear"/>
+            <w:tcMar>
+              <w:top w:type="dxa" w:w="40"/>
+              <w:left w:type="dxa" w:w="80"/>
+              <w:bottom w:type="dxa" w:w="40"/>
+              <w:right w:type="dxa" w:w="80"/>
+            </w:tcMar>
+          </w:tcPr>
+          <w:p>
+            <w:pPr>
+              <w:jc w:val="center"/>
+            </w:pPr>
+            <w:r>
+              <w:rPr>
+                <w:rFonts w:ascii="Times New Roman" w:cs="Times New Roman" w:eastAsia="Times New Roman" w:hAnsi="Times New Roman"/>
+                <w:b/>
+                <w:bCs/>
+                <w:sz w:val="18"/>
+                <w:szCs w:val="18"/>
+              </w:rPr>
+              <w:t xml:space="preserve">90th pct</w:t>
+            </w:r>
+          </w:p>
+        </w:tc>
+        <w:tc>
+          <w:tcPr>
+            <w:tcW w:type="dxa" w:w="900"/>
+            <w:tcBorders>
+              <w:top w:val="single" w:color="AAAAAA" w:sz="4"/>
+              <w:left w:val="single" w:color="AAAAAA" w:sz="4"/>
+              <w:bottom w:val="single" w:color="AAAAAA" w:sz="4"/>
+              <w:right w:val="single" w:color="AAAAAA" w:sz="4"/>
+            </w:tcBorders>
+            <w:shd w:fill="E8E8E8" w:color="auto" w:val="clear"/>
+            <w:tcMar>
+              <w:top w:type="dxa" w:w="40"/>
+              <w:left w:type="dxa" w:w="80"/>
+              <w:bottom w:type="dxa" w:w="40"/>
+              <w:right w:type="dxa" w:w="80"/>
+            </w:tcMar>
+          </w:tcPr>
+          <w:p>
+            <w:pPr>
+              <w:jc w:val="center"/>
+            </w:pPr>
+            <w:r>
+              <w:rPr>
+                <w:rFonts w:ascii="Times New Roman" w:cs="Times New Roman" w:eastAsia="Times New Roman" w:hAnsi="Times New Roman"/>
+                <w:b/>
+                <w:bCs/>
+                <w:sz w:val="18"/>
+                <w:szCs w:val="18"/>
+              </w:rPr>
+              <w:t xml:space="preserve">99th pct</w:t>
+            </w:r>
+          </w:p>
+        </w:tc>
+        <w:tc>
+          <w:tcPr>
+            <w:tcW w:type="dxa" w:w="600"/>
+            <w:tcBorders>
+              <w:top w:val="single" w:color="AAAAAA" w:sz="4"/>
+              <w:left w:val="single" w:color="AAAAAA" w:sz="4"/>
+              <w:bottom w:val="single" w:color="AAAAAA" w:sz="4"/>
+              <w:right w:val="single" w:color="AAAAAA" w:sz="4"/>
+            </w:tcBorders>
+            <w:shd w:fill="E8E8E8" w:color="auto" w:val="clear"/>
+            <w:tcMar>
+              <w:top w:type="dxa" w:w="40"/>
+              <w:left w:type="dxa" w:w="80"/>
+              <w:bottom w:type="dxa" w:w="40"/>
+              <w:right w:type="dxa" w:w="80"/>
+            </w:tcMar>
+          </w:tcPr>
+          <w:p>
+            <w:pPr>
+              <w:jc w:val="center"/>
+            </w:pPr>
+            <w:r>
+              <w:rPr>
+                <w:rFonts w:ascii="Times New Roman" w:cs="Times New Roman" w:eastAsia="Times New Roman" w:hAnsi="Times New Roman"/>
+                <w:b/>
+                <w:bCs/>
+                <w:sz w:val="18"/>
+                <w:szCs w:val="18"/>
+              </w:rPr>
+              <w:t xml:space="preserve">CV</w:t>
+            </w:r>
+          </w:p>
+        </w:tc>
+        <w:tc>
+          <w:tcPr>
+            <w:tcW w:type="dxa" w:w="1660"/>
+            <w:tcBorders>
+              <w:top w:val="single" w:color="AAAAAA" w:sz="4"/>
+              <w:left w:val="single" w:color="AAAAAA" w:sz="4"/>
+              <w:bottom w:val="single" w:color="AAAAAA" w:sz="4"/>
+              <w:right w:val="single" w:color="AAAAAA" w:sz="4"/>
+            </w:tcBorders>
+            <w:shd w:fill="E8E8E8" w:color="auto" w:val="clear"/>
+            <w:tcMar>
+              <w:top w:type="dxa" w:w="40"/>
+              <w:left w:type="dxa" w:w="80"/>
+              <w:bottom w:type="dxa" w:w="40"/>
+              <w:right w:type="dxa" w:w="80"/>
+            </w:tcMar>
+          </w:tcPr>
+          <w:p>
+            <w:pPr>
+              <w:jc w:val="center"/>
+            </w:pPr>
+            <w:r>
+              <w:rPr>
+                <w:rFonts w:ascii="Times New Roman" w:cs="Times New Roman" w:eastAsia="Times New Roman" w:hAnsi="Times New Roman"/>
+                <w:b/>
+                <w:bCs/>
+                <w:sz w:val="18"/>
+                <w:szCs w:val="18"/>
+              </w:rPr>
+              <w:t xml:space="preserve">Best fit (AIC) / Weibull shape</w:t>
+            </w:r>
+          </w:p>
+        </w:tc>
+      </w:tr>
+      <w:tr>
+        <w:tc>
+          <w:tcPr>
+            <w:tcW w:type="dxa" w:w="3000"/>
+            <w:tcBorders>
+              <w:top w:val="single" w:color="AAAAAA" w:sz="4"/>
+              <w:left w:val="single" w:color="AAAAAA" w:sz="4"/>
+              <w:bottom w:val="single" w:color="AAAAAA" w:sz="4"/>
+              <w:right w:val="single" w:color="AAAAAA" w:sz="4"/>
+            </w:tcBorders>
+            <w:tcMar>
+              <w:top w:type="dxa" w:w="40"/>
+              <w:left w:type="dxa" w:w="80"/>
+              <w:bottom w:type="dxa" w:w="40"/>
+              <w:right w:type="dxa" w:w="80"/>
+            </w:tcMar>
+          </w:tcPr>
+          <w:p>
+            <w:pPr>
+              <w:jc w:val="center"/>
+            </w:pPr>
+            <w:r>
+              <w:rPr>
+                <w:rFonts w:ascii="Times New Roman" w:cs="Times New Roman" w:eastAsia="Times New Roman" w:hAnsi="Times New Roman"/>
+                <w:b w:val="false"/>
+                <w:bCs w:val="false"/>
+                <w:sz w:val="18"/>
+                <w:szCs w:val="18"/>
+              </w:rPr>
+              <w:t xml:space="preserve">Software company: creation to resolution</w:t>
+            </w:r>
+          </w:p>
+        </w:tc>
+        <w:tc>
+          <w:tcPr>
+            <w:tcW w:type="dxa" w:w="700"/>
+            <w:tcBorders>
+              <w:top w:val="single" w:color="AAAAAA" w:sz="4"/>
+              <w:left w:val="single" w:color="AAAAAA" w:sz="4"/>
+              <w:bottom w:val="single" w:color="AAAAAA" w:sz="4"/>
+              <w:right w:val="single" w:color="AAAAAA" w:sz="4"/>
+            </w:tcBorders>
+            <w:tcMar>
+              <w:top w:type="dxa" w:w="40"/>
+              <w:left w:type="dxa" w:w="80"/>
+              <w:bottom w:type="dxa" w:w="40"/>
+              <w:right w:type="dxa" w:w="80"/>
+            </w:tcMar>
+          </w:tcPr>
+          <w:p>
+            <w:pPr>
+              <w:jc w:val="center"/>
+            </w:pPr>
+            <w:r>
+              <w:rPr>
+                <w:rFonts w:ascii="Times New Roman" w:cs="Times New Roman" w:eastAsia="Times New Roman" w:hAnsi="Times New Roman"/>
+                <w:b w:val="false"/>
+                <w:bCs w:val="false"/>
+                <w:sz w:val="18"/>
+                <w:szCs w:val="18"/>
+              </w:rPr>
+              <w:t xml:space="preserve">22,016</w:t>
+            </w:r>
+          </w:p>
+        </w:tc>
+        <w:tc>
+          <w:tcPr>
+            <w:tcW w:type="dxa" w:w="800"/>
+            <w:tcBorders>
+              <w:top w:val="single" w:color="AAAAAA" w:sz="4"/>
+              <w:left w:val="single" w:color="AAAAAA" w:sz="4"/>
+              <w:bottom w:val="single" w:color="AAAAAA" w:sz="4"/>
+              <w:right w:val="single" w:color="AAAAAA" w:sz="4"/>
+            </w:tcBorders>
+            <w:tcMar>
+              <w:top w:type="dxa" w:w="40"/>
+              <w:left w:type="dxa" w:w="80"/>
+              <w:bottom w:type="dxa" w:w="40"/>
+              <w:right w:type="dxa" w:w="80"/>
+            </w:tcMar>
+          </w:tcPr>
+          <w:p>
+            <w:pPr>
+              <w:jc w:val="center"/>
+            </w:pPr>
+            <w:r>
+              <w:rPr>
+                <w:rFonts w:ascii="Times New Roman" w:cs="Times New Roman" w:eastAsia="Times New Roman" w:hAnsi="Times New Roman"/>
+                <w:b w:val="false"/>
+                <w:bCs w:val="false"/>
+                <w:sz w:val="18"/>
+                <w:szCs w:val="18"/>
+              </w:rPr>
+              <w:t xml:space="preserve">167.8</w:t>
+            </w:r>
+          </w:p>
+        </w:tc>
+        <w:tc>
+          <w:tcPr>
+            <w:tcW w:type="dxa" w:w="800"/>
+            <w:tcBorders>
+              <w:top w:val="single" w:color="AAAAAA" w:sz="4"/>
+              <w:left w:val="single" w:color="AAAAAA" w:sz="4"/>
+              <w:bottom w:val="single" w:color="AAAAAA" w:sz="4"/>
+              <w:right w:val="single" w:color="AAAAAA" w:sz="4"/>
+            </w:tcBorders>
+            <w:tcMar>
+              <w:top w:type="dxa" w:w="40"/>
+              <w:left w:type="dxa" w:w="80"/>
+              <w:bottom w:type="dxa" w:w="40"/>
+              <w:right w:type="dxa" w:w="80"/>
+            </w:tcMar>
+          </w:tcPr>
+          <w:p>
+            <w:pPr>
+              <w:jc w:val="center"/>
+            </w:pPr>
+            <w:r>
+              <w:rPr>
+                <w:rFonts w:ascii="Times New Roman" w:cs="Times New Roman" w:eastAsia="Times New Roman" w:hAnsi="Times New Roman"/>
+                <w:b w:val="false"/>
+                <w:bCs w:val="false"/>
+                <w:sz w:val="18"/>
+                <w:szCs w:val="18"/>
+              </w:rPr>
+              <w:t xml:space="preserve">698.8</w:t>
+            </w:r>
+          </w:p>
+        </w:tc>
+        <w:tc>
+          <w:tcPr>
+            <w:tcW w:type="dxa" w:w="900"/>
+            <w:tcBorders>
+              <w:top w:val="single" w:color="AAAAAA" w:sz="4"/>
+              <w:left w:val="single" w:color="AAAAAA" w:sz="4"/>
+              <w:bottom w:val="single" w:color="AAAAAA" w:sz="4"/>
+              <w:right w:val="single" w:color="AAAAAA" w:sz="4"/>
+            </w:tcBorders>
+            <w:tcMar>
+              <w:top w:type="dxa" w:w="40"/>
+              <w:left w:type="dxa" w:w="80"/>
+              <w:bottom w:type="dxa" w:w="40"/>
+              <w:right w:type="dxa" w:w="80"/>
+            </w:tcMar>
+          </w:tcPr>
+          <w:p>
+            <w:pPr>
+              <w:jc w:val="center"/>
+            </w:pPr>
+            <w:r>
+              <w:rPr>
+                <w:rFonts w:ascii="Times New Roman" w:cs="Times New Roman" w:eastAsia="Times New Roman" w:hAnsi="Times New Roman"/>
+                <w:b w:val="false"/>
+                <w:bCs w:val="false"/>
+                <w:sz w:val="18"/>
+                <w:szCs w:val="18"/>
+              </w:rPr>
+              <w:t xml:space="preserve">1487</w:t>
+            </w:r>
+          </w:p>
+        </w:tc>
+        <w:tc>
+          <w:tcPr>
+            <w:tcW w:type="dxa" w:w="900"/>
+            <w:tcBorders>
+              <w:top w:val="single" w:color="AAAAAA" w:sz="4"/>
+              <w:left w:val="single" w:color="AAAAAA" w:sz="4"/>
+              <w:bottom w:val="single" w:color="AAAAAA" w:sz="4"/>
+              <w:right w:val="single" w:color="AAAAAA" w:sz="4"/>
+            </w:tcBorders>
+            <w:tcMar>
+              <w:top w:type="dxa" w:w="40"/>
+              <w:left w:type="dxa" w:w="80"/>
+              <w:bottom w:type="dxa" w:w="40"/>
+              <w:right w:type="dxa" w:w="80"/>
+            </w:tcMar>
+          </w:tcPr>
+          <w:p>
+            <w:pPr>
+              <w:jc w:val="center"/>
+            </w:pPr>
+            <w:r>
+              <w:rPr>
+                <w:rFonts w:ascii="Times New Roman" w:cs="Times New Roman" w:eastAsia="Times New Roman" w:hAnsi="Times New Roman"/>
+                <w:b w:val="false"/>
+                <w:bCs w:val="false"/>
+                <w:sz w:val="18"/>
+                <w:szCs w:val="18"/>
+              </w:rPr>
+              <w:t xml:space="preserve">8806</w:t>
+            </w:r>
+          </w:p>
+        </w:tc>
+        <w:tc>
+          <w:tcPr>
+            <w:tcW w:type="dxa" w:w="600"/>
+            <w:tcBorders>
+              <w:top w:val="single" w:color="AAAAAA" w:sz="4"/>
+              <w:left w:val="single" w:color="AAAAAA" w:sz="4"/>
+              <w:bottom w:val="single" w:color="AAAAAA" w:sz="4"/>
+              <w:right w:val="single" w:color="AAAAAA" w:sz="4"/>
+            </w:tcBorders>
+            <w:tcMar>
+              <w:top w:type="dxa" w:w="40"/>
+              <w:left w:type="dxa" w:w="80"/>
+              <w:bottom w:type="dxa" w:w="40"/>
+              <w:right w:type="dxa" w:w="80"/>
+            </w:tcMar>
+          </w:tcPr>
+          <w:p>
+            <w:pPr>
+              <w:jc w:val="center"/>
+            </w:pPr>
+            <w:r>
+              <w:rPr>
+                <w:rFonts w:ascii="Times New Roman" w:cs="Times New Roman" w:eastAsia="Times New Roman" w:hAnsi="Times New Roman"/>
+                <w:b w:val="false"/>
+                <w:bCs w:val="false"/>
+                <w:sz w:val="18"/>
+                <w:szCs w:val="18"/>
+              </w:rPr>
+              <w:t xml:space="preserve">3.0</w:t>
+            </w:r>
+          </w:p>
+        </w:tc>
+        <w:tc>
+          <w:tcPr>
+            <w:tcW w:type="dxa" w:w="1660"/>
+            <w:tcBorders>
+              <w:top w:val="single" w:color="AAAAAA" w:sz="4"/>
+              <w:left w:val="single" w:color="AAAAAA" w:sz="4"/>
+              <w:bottom w:val="single" w:color="AAAAAA" w:sz="4"/>
+              <w:right w:val="single" w:color="AAAAAA" w:sz="4"/>
+            </w:tcBorders>
+            <w:tcMar>
+              <w:top w:type="dxa" w:w="40"/>
+              <w:left w:type="dxa" w:w="80"/>
+              <w:bottom w:type="dxa" w:w="40"/>
+              <w:right w:type="dxa" w:w="80"/>
+            </w:tcMar>
+          </w:tcPr>
+          <w:p>
+            <w:pPr>
+              <w:jc w:val="center"/>
+            </w:pPr>
+            <w:r>
+              <w:rPr>
+                <w:rFonts w:ascii="Times New Roman" w:cs="Times New Roman" w:eastAsia="Times New Roman" w:hAnsi="Times New Roman"/>
+                <w:b w:val="false"/>
+                <w:bCs w:val="false"/>
+                <w:sz w:val="18"/>
+                <w:szCs w:val="18"/>
+              </w:rPr>
+              <w:t xml:space="preserve">weibull / 0.51</w:t>
+            </w:r>
+          </w:p>
+        </w:tc>
+      </w:tr>
+      <w:tr>
+        <w:tc>
+          <w:tcPr>
+            <w:tcW w:type="dxa" w:w="3000"/>
+            <w:tcBorders>
+              <w:top w:val="single" w:color="AAAAAA" w:sz="4"/>
+              <w:left w:val="single" w:color="AAAAAA" w:sz="4"/>
+              <w:bottom w:val="single" w:color="AAAAAA" w:sz="4"/>
+              <w:right w:val="single" w:color="AAAAAA" w:sz="4"/>
+            </w:tcBorders>
+            <w:tcMar>
+              <w:top w:type="dxa" w:w="40"/>
+              <w:left w:type="dxa" w:w="80"/>
+              <w:bottom w:type="dxa" w:w="40"/>
+              <w:right w:type="dxa" w:w="80"/>
+            </w:tcMar>
+          </w:tcPr>
+          <w:p>
+            <w:pPr>
+              <w:jc w:val="center"/>
+            </w:pPr>
+            <w:r>
+              <w:rPr>
+                <w:rFonts w:ascii="Times New Roman" w:cs="Times New Roman" w:eastAsia="Times New Roman" w:hAnsi="Times New Roman"/>
+                <w:b w:val="false"/>
+                <w:bCs w:val="false"/>
+                <w:sz w:val="18"/>
+                <w:szCs w:val="18"/>
+              </w:rPr>
+              <w:t xml:space="preserve">Software company: time in "in progress"</w:t>
+            </w:r>
+          </w:p>
+        </w:tc>
+        <w:tc>
+          <w:tcPr>
+            <w:tcW w:type="dxa" w:w="700"/>
+            <w:tcBorders>
+              <w:top w:val="single" w:color="AAAAAA" w:sz="4"/>
+              <w:left w:val="single" w:color="AAAAAA" w:sz="4"/>
+              <w:bottom w:val="single" w:color="AAAAAA" w:sz="4"/>
+              <w:right w:val="single" w:color="AAAAAA" w:sz="4"/>
+            </w:tcBorders>
+            <w:tcMar>
+              <w:top w:type="dxa" w:w="40"/>
+              <w:left w:type="dxa" w:w="80"/>
+              <w:bottom w:type="dxa" w:w="40"/>
+              <w:right w:type="dxa" w:w="80"/>
+            </w:tcMar>
+          </w:tcPr>
+          <w:p>
+            <w:pPr>
+              <w:jc w:val="center"/>
+            </w:pPr>
+            <w:r>
+              <w:rPr>
+                <w:rFonts w:ascii="Times New Roman" w:cs="Times New Roman" w:eastAsia="Times New Roman" w:hAnsi="Times New Roman"/>
+                <w:b w:val="false"/>
+                <w:bCs w:val="false"/>
+                <w:sz w:val="18"/>
+                <w:szCs w:val="18"/>
+              </w:rPr>
+              <w:t xml:space="preserve">19,662</w:t>
+            </w:r>
+          </w:p>
+        </w:tc>
+        <w:tc>
+          <w:tcPr>
+            <w:tcW w:type="dxa" w:w="800"/>
+            <w:tcBorders>
+              <w:top w:val="single" w:color="AAAAAA" w:sz="4"/>
+              <w:left w:val="single" w:color="AAAAAA" w:sz="4"/>
+              <w:bottom w:val="single" w:color="AAAAAA" w:sz="4"/>
+              <w:right w:val="single" w:color="AAAAAA" w:sz="4"/>
+            </w:tcBorders>
+            <w:tcMar>
+              <w:top w:type="dxa" w:w="40"/>
+              <w:left w:type="dxa" w:w="80"/>
+              <w:bottom w:type="dxa" w:w="40"/>
+              <w:right w:type="dxa" w:w="80"/>
+            </w:tcMar>
+          </w:tcPr>
+          <w:p>
+            <w:pPr>
+              <w:jc w:val="center"/>
+            </w:pPr>
+            <w:r>
+              <w:rPr>
+                <w:rFonts w:ascii="Times New Roman" w:cs="Times New Roman" w:eastAsia="Times New Roman" w:hAnsi="Times New Roman"/>
+                <w:b w:val="false"/>
+                <w:bCs w:val="false"/>
+                <w:sz w:val="18"/>
+                <w:szCs w:val="18"/>
+              </w:rPr>
+              <w:t xml:space="preserve">2.2</w:t>
+            </w:r>
+          </w:p>
+        </w:tc>
+        <w:tc>
+          <w:tcPr>
+            <w:tcW w:type="dxa" w:w="800"/>
+            <w:tcBorders>
+              <w:top w:val="single" w:color="AAAAAA" w:sz="4"/>
+              <w:left w:val="single" w:color="AAAAAA" w:sz="4"/>
+              <w:bottom w:val="single" w:color="AAAAAA" w:sz="4"/>
+              <w:right w:val="single" w:color="AAAAAA" w:sz="4"/>
+            </w:tcBorders>
+            <w:tcMar>
+              <w:top w:type="dxa" w:w="40"/>
+              <w:left w:type="dxa" w:w="80"/>
+              <w:bottom w:type="dxa" w:w="40"/>
+              <w:right w:type="dxa" w:w="80"/>
+            </w:tcMar>
+          </w:tcPr>
+          <w:p>
+            <w:pPr>
+              <w:jc w:val="center"/>
+            </w:pPr>
+            <w:r>
+              <w:rPr>
+                <w:rFonts w:ascii="Times New Roman" w:cs="Times New Roman" w:eastAsia="Times New Roman" w:hAnsi="Times New Roman"/>
+                <w:b w:val="false"/>
+                <w:bCs w:val="false"/>
+                <w:sz w:val="18"/>
+                <w:szCs w:val="18"/>
+              </w:rPr>
+              <w:t xml:space="preserve">97.3</w:t>
+            </w:r>
+          </w:p>
+        </w:tc>
+        <w:tc>
+          <w:tcPr>
+            <w:tcW w:type="dxa" w:w="900"/>
+            <w:tcBorders>
+              <w:top w:val="single" w:color="AAAAAA" w:sz="4"/>
+              <w:left w:val="single" w:color="AAAAAA" w:sz="4"/>
+              <w:bottom w:val="single" w:color="AAAAAA" w:sz="4"/>
+              <w:right w:val="single" w:color="AAAAAA" w:sz="4"/>
+            </w:tcBorders>
+            <w:tcMar>
+              <w:top w:type="dxa" w:w="40"/>
+              <w:left w:type="dxa" w:w="80"/>
+              <w:bottom w:type="dxa" w:w="40"/>
+              <w:right w:type="dxa" w:w="80"/>
+            </w:tcMar>
+          </w:tcPr>
+          <w:p>
+            <w:pPr>
+              <w:jc w:val="center"/>
+            </w:pPr>
+            <w:r>
+              <w:rPr>
+                <w:rFonts w:ascii="Times New Roman" w:cs="Times New Roman" w:eastAsia="Times New Roman" w:hAnsi="Times New Roman"/>
+                <w:b w:val="false"/>
+                <w:bCs w:val="false"/>
+                <w:sz w:val="18"/>
+                <w:szCs w:val="18"/>
+              </w:rPr>
+              <w:t xml:space="preserve">220</w:t>
+            </w:r>
+          </w:p>
+        </w:tc>
+        <w:tc>
+          <w:tcPr>
+            <w:tcW w:type="dxa" w:w="900"/>
+            <w:tcBorders>
+              <w:top w:val="single" w:color="AAAAAA" w:sz="4"/>
+              <w:left w:val="single" w:color="AAAAAA" w:sz="4"/>
+              <w:bottom w:val="single" w:color="AAAAAA" w:sz="4"/>
+              <w:right w:val="single" w:color="AAAAAA" w:sz="4"/>
+            </w:tcBorders>
+            <w:tcMar>
+              <w:top w:type="dxa" w:w="40"/>
+              <w:left w:type="dxa" w:w="80"/>
+              <w:bottom w:type="dxa" w:w="40"/>
+              <w:right w:type="dxa" w:w="80"/>
+            </w:tcMar>
+          </w:tcPr>
+          <w:p>
+            <w:pPr>
+              <w:jc w:val="center"/>
+            </w:pPr>
+            <w:r>
+              <w:rPr>
+                <w:rFonts w:ascii="Times New Roman" w:cs="Times New Roman" w:eastAsia="Times New Roman" w:hAnsi="Times New Roman"/>
+                <w:b w:val="false"/>
+                <w:bCs w:val="false"/>
+                <w:sz w:val="18"/>
+                <w:szCs w:val="18"/>
+              </w:rPr>
+              <w:t xml:space="preserve">1532</w:t>
+            </w:r>
+          </w:p>
+        </w:tc>
+        <w:tc>
+          <w:tcPr>
+            <w:tcW w:type="dxa" w:w="600"/>
+            <w:tcBorders>
+              <w:top w:val="single" w:color="AAAAAA" w:sz="4"/>
+              <w:left w:val="single" w:color="AAAAAA" w:sz="4"/>
+              <w:bottom w:val="single" w:color="AAAAAA" w:sz="4"/>
+              <w:right w:val="single" w:color="AAAAAA" w:sz="4"/>
+            </w:tcBorders>
+            <w:tcMar>
+              <w:top w:type="dxa" w:w="40"/>
+              <w:left w:type="dxa" w:w="80"/>
+              <w:bottom w:type="dxa" w:w="40"/>
+              <w:right w:type="dxa" w:w="80"/>
+            </w:tcMar>
+          </w:tcPr>
+          <w:p>
+            <w:pPr>
+              <w:jc w:val="center"/>
+            </w:pPr>
+            <w:r>
+              <w:rPr>
+                <w:rFonts w:ascii="Times New Roman" w:cs="Times New Roman" w:eastAsia="Times New Roman" w:hAnsi="Times New Roman"/>
+                <w:b w:val="false"/>
+                <w:bCs w:val="false"/>
+                <w:sz w:val="18"/>
+                <w:szCs w:val="18"/>
+              </w:rPr>
+              <w:t xml:space="preserve">3.6</w:t>
+            </w:r>
+          </w:p>
+        </w:tc>
+        <w:tc>
+          <w:tcPr>
+            <w:tcW w:type="dxa" w:w="1660"/>
+            <w:tcBorders>
+              <w:top w:val="single" w:color="AAAAAA" w:sz="4"/>
+              <w:left w:val="single" w:color="AAAAAA" w:sz="4"/>
+              <w:bottom w:val="single" w:color="AAAAAA" w:sz="4"/>
+              <w:right w:val="single" w:color="AAAAAA" w:sz="4"/>
+            </w:tcBorders>
+            <w:tcMar>
+              <w:top w:type="dxa" w:w="40"/>
+              <w:left w:type="dxa" w:w="80"/>
+              <w:bottom w:type="dxa" w:w="40"/>
+              <w:right w:type="dxa" w:w="80"/>
+            </w:tcMar>
+          </w:tcPr>
+          <w:p>
+            <w:pPr>
+              <w:jc w:val="center"/>
+            </w:pPr>
+            <w:r>
+              <w:rPr>
+                <w:rFonts w:ascii="Times New Roman" w:cs="Times New Roman" w:eastAsia="Times New Roman" w:hAnsi="Times New Roman"/>
+                <w:b w:val="false"/>
+                <w:bCs w:val="false"/>
+                <w:sz w:val="18"/>
+                <w:szCs w:val="18"/>
+              </w:rPr>
+              <w:t xml:space="preserve">weibull / 0.30</w:t>
+            </w:r>
+          </w:p>
+        </w:tc>
+      </w:tr>
+      <w:tr>
+        <w:tc>
+          <w:tcPr>
+            <w:tcW w:type="dxa" w:w="3000"/>
+            <w:tcBorders>
+              <w:top w:val="single" w:color="AAAAAA" w:sz="4"/>
+              <w:left w:val="single" w:color="AAAAAA" w:sz="4"/>
+              <w:bottom w:val="single" w:color="AAAAAA" w:sz="4"/>
+              <w:right w:val="single" w:color="AAAAAA" w:sz="4"/>
+            </w:tcBorders>
+            <w:tcMar>
+              <w:top w:type="dxa" w:w="40"/>
+              <w:left w:type="dxa" w:w="80"/>
+              <w:bottom w:type="dxa" w:w="40"/>
+              <w:right w:type="dxa" w:w="80"/>
+            </w:tcMar>
+          </w:tcPr>
+          <w:p>
+            <w:pPr>
+              <w:jc w:val="center"/>
+            </w:pPr>
+            <w:r>
+              <w:rPr>
+                <w:rFonts w:ascii="Times New Roman" w:cs="Times New Roman" w:eastAsia="Times New Roman" w:hAnsi="Times New Roman"/>
+                <w:b w:val="false"/>
+                <w:bCs w:val="false"/>
+                <w:sz w:val="18"/>
+                <w:szCs w:val="18"/>
+              </w:rPr>
+              <w:t xml:space="preserve">ServiceNow: opened to resolved</w:t>
+            </w:r>
+          </w:p>
+        </w:tc>
+        <w:tc>
+          <w:tcPr>
+            <w:tcW w:type="dxa" w:w="700"/>
+            <w:tcBorders>
+              <w:top w:val="single" w:color="AAAAAA" w:sz="4"/>
+              <w:left w:val="single" w:color="AAAAAA" w:sz="4"/>
+              <w:bottom w:val="single" w:color="AAAAAA" w:sz="4"/>
+              <w:right w:val="single" w:color="AAAAAA" w:sz="4"/>
+            </w:tcBorders>
+            <w:tcMar>
+              <w:top w:type="dxa" w:w="40"/>
+              <w:left w:type="dxa" w:w="80"/>
+              <w:bottom w:type="dxa" w:w="40"/>
+              <w:right w:type="dxa" w:w="80"/>
+            </w:tcMar>
+          </w:tcPr>
+          <w:p>
+            <w:pPr>
+              <w:jc w:val="center"/>
+            </w:pPr>
+            <w:r>
+              <w:rPr>
+                <w:rFonts w:ascii="Times New Roman" w:cs="Times New Roman" w:eastAsia="Times New Roman" w:hAnsi="Times New Roman"/>
+                <w:b w:val="false"/>
+                <w:bCs w:val="false"/>
+                <w:sz w:val="18"/>
+                <w:szCs w:val="18"/>
+              </w:rPr>
+              <w:t xml:space="preserve">23,323</w:t>
+            </w:r>
+          </w:p>
+        </w:tc>
+        <w:tc>
+          <w:tcPr>
+            <w:tcW w:type="dxa" w:w="800"/>
+            <w:tcBorders>
+              <w:top w:val="single" w:color="AAAAAA" w:sz="4"/>
+              <w:left w:val="single" w:color="AAAAAA" w:sz="4"/>
+              <w:bottom w:val="single" w:color="AAAAAA" w:sz="4"/>
+              <w:right w:val="single" w:color="AAAAAA" w:sz="4"/>
+            </w:tcBorders>
+            <w:tcMar>
+              <w:top w:type="dxa" w:w="40"/>
+              <w:left w:type="dxa" w:w="80"/>
+              <w:bottom w:type="dxa" w:w="40"/>
+              <w:right w:type="dxa" w:w="80"/>
+            </w:tcMar>
+          </w:tcPr>
+          <w:p>
+            <w:pPr>
+              <w:jc w:val="center"/>
+            </w:pPr>
+            <w:r>
+              <w:rPr>
+                <w:rFonts w:ascii="Times New Roman" w:cs="Times New Roman" w:eastAsia="Times New Roman" w:hAnsi="Times New Roman"/>
+                <w:b w:val="false"/>
+                <w:bCs w:val="false"/>
+                <w:sz w:val="18"/>
+                <w:szCs w:val="18"/>
+              </w:rPr>
+              <w:t xml:space="preserve">22.2</w:t>
+            </w:r>
+          </w:p>
+        </w:tc>
+        <w:tc>
+          <w:tcPr>
+            <w:tcW w:type="dxa" w:w="800"/>
+            <w:tcBorders>
+              <w:top w:val="single" w:color="AAAAAA" w:sz="4"/>
+              <w:left w:val="single" w:color="AAAAAA" w:sz="4"/>
+              <w:bottom w:val="single" w:color="AAAAAA" w:sz="4"/>
+              <w:right w:val="single" w:color="AAAAAA" w:sz="4"/>
+            </w:tcBorders>
+            <w:tcMar>
+              <w:top w:type="dxa" w:w="40"/>
+              <w:left w:type="dxa" w:w="80"/>
+              <w:bottom w:type="dxa" w:w="40"/>
+              <w:right w:type="dxa" w:w="80"/>
+            </w:tcMar>
+          </w:tcPr>
+          <w:p>
+            <w:pPr>
+              <w:jc w:val="center"/>
+            </w:pPr>
+            <w:r>
+              <w:rPr>
+                <w:rFonts w:ascii="Times New Roman" w:cs="Times New Roman" w:eastAsia="Times New Roman" w:hAnsi="Times New Roman"/>
+                <w:b w:val="false"/>
+                <w:bCs w:val="false"/>
+                <w:sz w:val="18"/>
+                <w:szCs w:val="18"/>
+              </w:rPr>
+              <w:t xml:space="preserve">178.5</w:t>
+            </w:r>
+          </w:p>
+        </w:tc>
+        <w:tc>
+          <w:tcPr>
+            <w:tcW w:type="dxa" w:w="900"/>
+            <w:tcBorders>
+              <w:top w:val="single" w:color="AAAAAA" w:sz="4"/>
+              <w:left w:val="single" w:color="AAAAAA" w:sz="4"/>
+              <w:bottom w:val="single" w:color="AAAAAA" w:sz="4"/>
+              <w:right w:val="single" w:color="AAAAAA" w:sz="4"/>
+            </w:tcBorders>
+            <w:tcMar>
+              <w:top w:type="dxa" w:w="40"/>
+              <w:left w:type="dxa" w:w="80"/>
+              <w:bottom w:type="dxa" w:w="40"/>
+              <w:right w:type="dxa" w:w="80"/>
+            </w:tcMar>
+          </w:tcPr>
+          <w:p>
+            <w:pPr>
+              <w:jc w:val="center"/>
+            </w:pPr>
+            <w:r>
+              <w:rPr>
+                <w:rFonts w:ascii="Times New Roman" w:cs="Times New Roman" w:eastAsia="Times New Roman" w:hAnsi="Times New Roman"/>
+                <w:b w:val="false"/>
+                <w:bCs w:val="false"/>
+                <w:sz w:val="18"/>
+                <w:szCs w:val="18"/>
+              </w:rPr>
+              <w:t xml:space="preserve">382</w:t>
+            </w:r>
+          </w:p>
+        </w:tc>
+        <w:tc>
+          <w:tcPr>
+            <w:tcW w:type="dxa" w:w="900"/>
+            <w:tcBorders>
+              <w:top w:val="single" w:color="AAAAAA" w:sz="4"/>
+              <w:left w:val="single" w:color="AAAAAA" w:sz="4"/>
+              <w:bottom w:val="single" w:color="AAAAAA" w:sz="4"/>
+              <w:right w:val="single" w:color="AAAAAA" w:sz="4"/>
+            </w:tcBorders>
+            <w:tcMar>
+              <w:top w:type="dxa" w:w="40"/>
+              <w:left w:type="dxa" w:w="80"/>
+              <w:bottom w:type="dxa" w:w="40"/>
+              <w:right w:type="dxa" w:w="80"/>
+            </w:tcMar>
+          </w:tcPr>
+          <w:p>
+            <w:pPr>
+              <w:jc w:val="center"/>
+            </w:pPr>
+            <w:r>
+              <w:rPr>
+                <w:rFonts w:ascii="Times New Roman" w:cs="Times New Roman" w:eastAsia="Times New Roman" w:hAnsi="Times New Roman"/>
+                <w:b w:val="false"/>
+                <w:bCs w:val="false"/>
+                <w:sz w:val="18"/>
+                <w:szCs w:val="18"/>
+              </w:rPr>
+              <w:t xml:space="preserve">2849</w:t>
+            </w:r>
+          </w:p>
+        </w:tc>
+        <w:tc>
+          <w:tcPr>
+            <w:tcW w:type="dxa" w:w="600"/>
+            <w:tcBorders>
+              <w:top w:val="single" w:color="AAAAAA" w:sz="4"/>
+              <w:left w:val="single" w:color="AAAAAA" w:sz="4"/>
+              <w:bottom w:val="single" w:color="AAAAAA" w:sz="4"/>
+              <w:right w:val="single" w:color="AAAAAA" w:sz="4"/>
+            </w:tcBorders>
+            <w:tcMar>
+              <w:top w:type="dxa" w:w="40"/>
+              <w:left w:type="dxa" w:w="80"/>
+              <w:bottom w:type="dxa" w:w="40"/>
+              <w:right w:type="dxa" w:w="80"/>
+            </w:tcMar>
+          </w:tcPr>
+          <w:p>
+            <w:pPr>
+              <w:jc w:val="center"/>
+            </w:pPr>
+            <w:r>
+              <w:rPr>
+                <w:rFonts w:ascii="Times New Roman" w:cs="Times New Roman" w:eastAsia="Times New Roman" w:hAnsi="Times New Roman"/>
+                <w:b w:val="false"/>
+                <w:bCs w:val="false"/>
+                <w:sz w:val="18"/>
+                <w:szCs w:val="18"/>
+              </w:rPr>
+              <w:t xml:space="preserve">3.0</w:t>
+            </w:r>
+          </w:p>
+        </w:tc>
+        <w:tc>
+          <w:tcPr>
+            <w:tcW w:type="dxa" w:w="1660"/>
+            <w:tcBorders>
+              <w:top w:val="single" w:color="AAAAAA" w:sz="4"/>
+              <w:left w:val="single" w:color="AAAAAA" w:sz="4"/>
+              <w:bottom w:val="single" w:color="AAAAAA" w:sz="4"/>
+              <w:right w:val="single" w:color="AAAAAA" w:sz="4"/>
+            </w:tcBorders>
+            <w:tcMar>
+              <w:top w:type="dxa" w:w="40"/>
+              <w:left w:type="dxa" w:w="80"/>
+              <w:bottom w:type="dxa" w:w="40"/>
+              <w:right w:type="dxa" w:w="80"/>
+            </w:tcMar>
+          </w:tcPr>
+          <w:p>
+            <w:pPr>
+              <w:jc w:val="center"/>
+            </w:pPr>
+            <w:r>
+              <w:rPr>
+                <w:rFonts w:ascii="Times New Roman" w:cs="Times New Roman" w:eastAsia="Times New Roman" w:hAnsi="Times New Roman"/>
+                <w:b w:val="false"/>
+                <w:bCs w:val="false"/>
+                <w:sz w:val="18"/>
+                <w:szCs w:val="18"/>
+              </w:rPr>
+              <w:t xml:space="preserve">weibull / 0.36</w:t>
+            </w:r>
+          </w:p>
+        </w:tc>
+      </w:tr>
+      <w:tr>
+        <w:tc>
+          <w:tcPr>
+            <w:tcW w:type="dxa" w:w="3000"/>
+            <w:tcBorders>
+              <w:top w:val="single" w:color="AAAAAA" w:sz="4"/>
+              <w:left w:val="single" w:color="AAAAAA" w:sz="4"/>
+              <w:bottom w:val="single" w:color="AAAAAA" w:sz="4"/>
+              <w:right w:val="single" w:color="AAAAAA" w:sz="4"/>
+            </w:tcBorders>
+            <w:tcMar>
+              <w:top w:type="dxa" w:w="40"/>
+              <w:left w:type="dxa" w:w="80"/>
+              <w:bottom w:type="dxa" w:w="40"/>
+              <w:right w:type="dxa" w:w="80"/>
+            </w:tcMar>
+          </w:tcPr>
+          <w:p>
+            <w:pPr>
+              <w:jc w:val="center"/>
+            </w:pPr>
+            <w:r>
+              <w:rPr>
+                <w:rFonts w:ascii="Times New Roman" w:cs="Times New Roman" w:eastAsia="Times New Roman" w:hAnsi="Times New Roman"/>
+                <w:b w:val="false"/>
+                <w:bCs w:val="false"/>
+                <w:sz w:val="18"/>
+                <w:szCs w:val="18"/>
+              </w:rPr>
+              <w:t xml:space="preserve">ServiceNow: Critical/High only</w:t>
+            </w:r>
+          </w:p>
+        </w:tc>
+        <w:tc>
+          <w:tcPr>
+            <w:tcW w:type="dxa" w:w="700"/>
+            <w:tcBorders>
+              <w:top w:val="single" w:color="AAAAAA" w:sz="4"/>
+              <w:left w:val="single" w:color="AAAAAA" w:sz="4"/>
+              <w:bottom w:val="single" w:color="AAAAAA" w:sz="4"/>
+              <w:right w:val="single" w:color="AAAAAA" w:sz="4"/>
+            </w:tcBorders>
+            <w:tcMar>
+              <w:top w:type="dxa" w:w="40"/>
+              <w:left w:type="dxa" w:w="80"/>
+              <w:bottom w:type="dxa" w:w="40"/>
+              <w:right w:type="dxa" w:w="80"/>
+            </w:tcMar>
+          </w:tcPr>
+          <w:p>
+            <w:pPr>
+              <w:jc w:val="center"/>
+            </w:pPr>
+            <w:r>
+              <w:rPr>
+                <w:rFonts w:ascii="Times New Roman" w:cs="Times New Roman" w:eastAsia="Times New Roman" w:hAnsi="Times New Roman"/>
+                <w:b w:val="false"/>
+                <w:bCs w:val="false"/>
+                <w:sz w:val="18"/>
+                <w:szCs w:val="18"/>
+              </w:rPr>
+              <w:t xml:space="preserve">496</w:t>
+            </w:r>
+          </w:p>
+        </w:tc>
+        <w:tc>
+          <w:tcPr>
+            <w:tcW w:type="dxa" w:w="800"/>
+            <w:tcBorders>
+              <w:top w:val="single" w:color="AAAAAA" w:sz="4"/>
+              <w:left w:val="single" w:color="AAAAAA" w:sz="4"/>
+              <w:bottom w:val="single" w:color="AAAAAA" w:sz="4"/>
+              <w:right w:val="single" w:color="AAAAAA" w:sz="4"/>
+            </w:tcBorders>
+            <w:tcMar>
+              <w:top w:type="dxa" w:w="40"/>
+              <w:left w:type="dxa" w:w="80"/>
+              <w:bottom w:type="dxa" w:w="40"/>
+              <w:right w:type="dxa" w:w="80"/>
+            </w:tcMar>
+          </w:tcPr>
+          <w:p>
+            <w:pPr>
+              <w:jc w:val="center"/>
+            </w:pPr>
+            <w:r>
+              <w:rPr>
+                <w:rFonts w:ascii="Times New Roman" w:cs="Times New Roman" w:eastAsia="Times New Roman" w:hAnsi="Times New Roman"/>
+                <w:b w:val="false"/>
+                <w:bCs w:val="false"/>
+                <w:sz w:val="18"/>
+                <w:szCs w:val="18"/>
+              </w:rPr>
+              <w:t xml:space="preserve">49.7</w:t>
+            </w:r>
+          </w:p>
+        </w:tc>
+        <w:tc>
+          <w:tcPr>
+            <w:tcW w:type="dxa" w:w="800"/>
+            <w:tcBorders>
+              <w:top w:val="single" w:color="AAAAAA" w:sz="4"/>
+              <w:left w:val="single" w:color="AAAAAA" w:sz="4"/>
+              <w:bottom w:val="single" w:color="AAAAAA" w:sz="4"/>
+              <w:right w:val="single" w:color="AAAAAA" w:sz="4"/>
+            </w:tcBorders>
+            <w:tcMar>
+              <w:top w:type="dxa" w:w="40"/>
+              <w:left w:type="dxa" w:w="80"/>
+              <w:bottom w:type="dxa" w:w="40"/>
+              <w:right w:type="dxa" w:w="80"/>
+            </w:tcMar>
+          </w:tcPr>
+          <w:p>
+            <w:pPr>
+              <w:jc w:val="center"/>
+            </w:pPr>
+            <w:r>
+              <w:rPr>
+                <w:rFonts w:ascii="Times New Roman" w:cs="Times New Roman" w:eastAsia="Times New Roman" w:hAnsi="Times New Roman"/>
+                <w:b w:val="false"/>
+                <w:bCs w:val="false"/>
+                <w:sz w:val="18"/>
+                <w:szCs w:val="18"/>
+              </w:rPr>
+              <w:t xml:space="preserve">172.9</w:t>
+            </w:r>
+          </w:p>
+        </w:tc>
+        <w:tc>
+          <w:tcPr>
+            <w:tcW w:type="dxa" w:w="900"/>
+            <w:tcBorders>
+              <w:top w:val="single" w:color="AAAAAA" w:sz="4"/>
+              <w:left w:val="single" w:color="AAAAAA" w:sz="4"/>
+              <w:bottom w:val="single" w:color="AAAAAA" w:sz="4"/>
+              <w:right w:val="single" w:color="AAAAAA" w:sz="4"/>
+            </w:tcBorders>
+            <w:tcMar>
+              <w:top w:type="dxa" w:w="40"/>
+              <w:left w:type="dxa" w:w="80"/>
+              <w:bottom w:type="dxa" w:w="40"/>
+              <w:right w:type="dxa" w:w="80"/>
+            </w:tcMar>
+          </w:tcPr>
+          <w:p>
+            <w:pPr>
+              <w:jc w:val="center"/>
+            </w:pPr>
+            <w:r>
+              <w:rPr>
+                <w:rFonts w:ascii="Times New Roman" w:cs="Times New Roman" w:eastAsia="Times New Roman" w:hAnsi="Times New Roman"/>
+                <w:b w:val="false"/>
+                <w:bCs w:val="false"/>
+                <w:sz w:val="18"/>
+                <w:szCs w:val="18"/>
+              </w:rPr>
+              <w:t xml:space="preserve">391</w:t>
+            </w:r>
+          </w:p>
+        </w:tc>
+        <w:tc>
+          <w:tcPr>
+            <w:tcW w:type="dxa" w:w="900"/>
+            <w:tcBorders>
+              <w:top w:val="single" w:color="AAAAAA" w:sz="4"/>
+              <w:left w:val="single" w:color="AAAAAA" w:sz="4"/>
+              <w:bottom w:val="single" w:color="AAAAAA" w:sz="4"/>
+              <w:right w:val="single" w:color="AAAAAA" w:sz="4"/>
+            </w:tcBorders>
+            <w:tcMar>
+              <w:top w:type="dxa" w:w="40"/>
+              <w:left w:type="dxa" w:w="80"/>
+              <w:bottom w:type="dxa" w:w="40"/>
+              <w:right w:type="dxa" w:w="80"/>
+            </w:tcMar>
+          </w:tcPr>
+          <w:p>
+            <w:pPr>
+              <w:jc w:val="center"/>
+            </w:pPr>
+            <w:r>
+              <w:rPr>
+                <w:rFonts w:ascii="Times New Roman" w:cs="Times New Roman" w:eastAsia="Times New Roman" w:hAnsi="Times New Roman"/>
+                <w:b w:val="false"/>
+                <w:bCs w:val="false"/>
+                <w:sz w:val="18"/>
+                <w:szCs w:val="18"/>
+              </w:rPr>
+              <w:t xml:space="preserve">1086</w:t>
+            </w:r>
+          </w:p>
+        </w:tc>
+        <w:tc>
+          <w:tcPr>
+            <w:tcW w:type="dxa" w:w="600"/>
+            <w:tcBorders>
+              <w:top w:val="single" w:color="AAAAAA" w:sz="4"/>
+              <w:left w:val="single" w:color="AAAAAA" w:sz="4"/>
+              <w:bottom w:val="single" w:color="AAAAAA" w:sz="4"/>
+              <w:right w:val="single" w:color="AAAAAA" w:sz="4"/>
+            </w:tcBorders>
+            <w:tcMar>
+              <w:top w:type="dxa" w:w="40"/>
+              <w:left w:type="dxa" w:w="80"/>
+              <w:bottom w:type="dxa" w:w="40"/>
+              <w:right w:type="dxa" w:w="80"/>
+            </w:tcMar>
+          </w:tcPr>
+          <w:p>
+            <w:pPr>
+              <w:jc w:val="center"/>
+            </w:pPr>
+            <w:r>
+              <w:rPr>
+                <w:rFonts w:ascii="Times New Roman" w:cs="Times New Roman" w:eastAsia="Times New Roman" w:hAnsi="Times New Roman"/>
+                <w:b w:val="false"/>
+                <w:bCs w:val="false"/>
+                <w:sz w:val="18"/>
+                <w:szCs w:val="18"/>
+              </w:rPr>
+              <w:t xml:space="preserve">2.0</w:t>
+            </w:r>
+          </w:p>
+        </w:tc>
+        <w:tc>
+          <w:tcPr>
+            <w:tcW w:type="dxa" w:w="1660"/>
+            <w:tcBorders>
+              <w:top w:val="single" w:color="AAAAAA" w:sz="4"/>
+              <w:left w:val="single" w:color="AAAAAA" w:sz="4"/>
+              <w:bottom w:val="single" w:color="AAAAAA" w:sz="4"/>
+              <w:right w:val="single" w:color="AAAAAA" w:sz="4"/>
+            </w:tcBorders>
+            <w:tcMar>
+              <w:top w:type="dxa" w:w="40"/>
+              <w:left w:type="dxa" w:w="80"/>
+              <w:bottom w:type="dxa" w:w="40"/>
+              <w:right w:type="dxa" w:w="80"/>
+            </w:tcMar>
+          </w:tcPr>
+          <w:p>
+            <w:pPr>
+              <w:jc w:val="center"/>
+            </w:pPr>
+            <w:r>
+              <w:rPr>
+                <w:rFonts w:ascii="Times New Roman" w:cs="Times New Roman" w:eastAsia="Times New Roman" w:hAnsi="Times New Roman"/>
+                <w:b w:val="false"/>
+                <w:bCs w:val="false"/>
+                <w:sz w:val="18"/>
+                <w:szCs w:val="18"/>
+              </w:rPr>
+              <w:t xml:space="preserve">weibull / 0.55</w:t>
+            </w:r>
+          </w:p>
+        </w:tc>
+      </w:tr>
+      <w:tr>
+        <w:tc>
+          <w:tcPr>
+            <w:tcW w:type="dxa" w:w="3000"/>
+            <w:tcBorders>
+              <w:top w:val="single" w:color="AAAAAA" w:sz="4"/>
+              <w:left w:val="single" w:color="AAAAAA" w:sz="4"/>
+              <w:bottom w:val="single" w:color="AAAAAA" w:sz="4"/>
+              <w:right w:val="single" w:color="AAAAAA" w:sz="4"/>
+            </w:tcBorders>
+            <w:tcMar>
+              <w:top w:type="dxa" w:w="40"/>
+              <w:left w:type="dxa" w:w="80"/>
+              <w:bottom w:type="dxa" w:w="40"/>
+              <w:right w:type="dxa" w:w="80"/>
+            </w:tcMar>
+          </w:tcPr>
+          <w:p>
+            <w:pPr>
+              <w:jc w:val="center"/>
+            </w:pPr>
+            <w:r>
+              <w:rPr>
+                <w:rFonts w:ascii="Times New Roman" w:cs="Times New Roman" w:eastAsia="Times New Roman" w:hAnsi="Times New Roman"/>
+                <w:b w:val="false"/>
+                <w:bCs w:val="false"/>
+                <w:sz w:val="18"/>
+                <w:szCs w:val="18"/>
+              </w:rPr>
+              <w:t xml:space="preserve">Italian help desk: first to last event</w:t>
+            </w:r>
+          </w:p>
+        </w:tc>
+        <w:tc>
+          <w:tcPr>
+            <w:tcW w:type="dxa" w:w="700"/>
+            <w:tcBorders>
+              <w:top w:val="single" w:color="AAAAAA" w:sz="4"/>
+              <w:left w:val="single" w:color="AAAAAA" w:sz="4"/>
+              <w:bottom w:val="single" w:color="AAAAAA" w:sz="4"/>
+              <w:right w:val="single" w:color="AAAAAA" w:sz="4"/>
+            </w:tcBorders>
+            <w:tcMar>
+              <w:top w:type="dxa" w:w="40"/>
+              <w:left w:type="dxa" w:w="80"/>
+              <w:bottom w:type="dxa" w:w="40"/>
+              <w:right w:type="dxa" w:w="80"/>
+            </w:tcMar>
+          </w:tcPr>
+          <w:p>
+            <w:pPr>
+              <w:jc w:val="center"/>
+            </w:pPr>
+            <w:r>
+              <w:rPr>
+                <w:rFonts w:ascii="Times New Roman" w:cs="Times New Roman" w:eastAsia="Times New Roman" w:hAnsi="Times New Roman"/>
+                <w:b w:val="false"/>
+                <w:bCs w:val="false"/>
+                <w:sz w:val="18"/>
+                <w:szCs w:val="18"/>
+              </w:rPr>
+              <w:t xml:space="preserve">3,803</w:t>
+            </w:r>
+          </w:p>
+        </w:tc>
+        <w:tc>
+          <w:tcPr>
+            <w:tcW w:type="dxa" w:w="800"/>
+            <w:tcBorders>
+              <w:top w:val="single" w:color="AAAAAA" w:sz="4"/>
+              <w:left w:val="single" w:color="AAAAAA" w:sz="4"/>
+              <w:bottom w:val="single" w:color="AAAAAA" w:sz="4"/>
+              <w:right w:val="single" w:color="AAAAAA" w:sz="4"/>
+            </w:tcBorders>
+            <w:tcMar>
+              <w:top w:type="dxa" w:w="40"/>
+              <w:left w:type="dxa" w:w="80"/>
+              <w:bottom w:type="dxa" w:w="40"/>
+              <w:right w:type="dxa" w:w="80"/>
+            </w:tcMar>
+          </w:tcPr>
+          <w:p>
+            <w:pPr>
+              <w:jc w:val="center"/>
+            </w:pPr>
+            <w:r>
+              <w:rPr>
+                <w:rFonts w:ascii="Times New Roman" w:cs="Times New Roman" w:eastAsia="Times New Roman" w:hAnsi="Times New Roman"/>
+                <w:b w:val="false"/>
+                <w:bCs w:val="false"/>
+                <w:sz w:val="18"/>
+                <w:szCs w:val="18"/>
+              </w:rPr>
+              <w:t xml:space="preserve">94.4</w:t>
+            </w:r>
+          </w:p>
+        </w:tc>
+        <w:tc>
+          <w:tcPr>
+            <w:tcW w:type="dxa" w:w="800"/>
+            <w:tcBorders>
+              <w:top w:val="single" w:color="AAAAAA" w:sz="4"/>
+              <w:left w:val="single" w:color="AAAAAA" w:sz="4"/>
+              <w:bottom w:val="single" w:color="AAAAAA" w:sz="4"/>
+              <w:right w:val="single" w:color="AAAAAA" w:sz="4"/>
+            </w:tcBorders>
+            <w:tcMar>
+              <w:top w:type="dxa" w:w="40"/>
+              <w:left w:type="dxa" w:w="80"/>
+              <w:bottom w:type="dxa" w:w="40"/>
+              <w:right w:type="dxa" w:w="80"/>
+            </w:tcMar>
+          </w:tcPr>
+          <w:p>
+            <w:pPr>
+              <w:jc w:val="center"/>
+            </w:pPr>
+            <w:r>
+              <w:rPr>
+                <w:rFonts w:ascii="Times New Roman" w:cs="Times New Roman" w:eastAsia="Times New Roman" w:hAnsi="Times New Roman"/>
+                <w:b w:val="false"/>
+                <w:bCs w:val="false"/>
+                <w:sz w:val="18"/>
+                <w:szCs w:val="18"/>
+              </w:rPr>
+              <w:t xml:space="preserve">211.2</w:t>
+            </w:r>
+          </w:p>
+        </w:tc>
+        <w:tc>
+          <w:tcPr>
+            <w:tcW w:type="dxa" w:w="900"/>
+            <w:tcBorders>
+              <w:top w:val="single" w:color="AAAAAA" w:sz="4"/>
+              <w:left w:val="single" w:color="AAAAAA" w:sz="4"/>
+              <w:bottom w:val="single" w:color="AAAAAA" w:sz="4"/>
+              <w:right w:val="single" w:color="AAAAAA" w:sz="4"/>
+            </w:tcBorders>
+            <w:tcMar>
+              <w:top w:type="dxa" w:w="40"/>
+              <w:left w:type="dxa" w:w="80"/>
+              <w:bottom w:type="dxa" w:w="40"/>
+              <w:right w:type="dxa" w:w="80"/>
+            </w:tcMar>
+          </w:tcPr>
+          <w:p>
+            <w:pPr>
+              <w:jc w:val="center"/>
+            </w:pPr>
+            <w:r>
+              <w:rPr>
+                <w:rFonts w:ascii="Times New Roman" w:cs="Times New Roman" w:eastAsia="Times New Roman" w:hAnsi="Times New Roman"/>
+                <w:b w:val="false"/>
+                <w:bCs w:val="false"/>
+                <w:sz w:val="18"/>
+                <w:szCs w:val="18"/>
+              </w:rPr>
+              <w:t xml:space="preserve">627</w:t>
+            </w:r>
+          </w:p>
+        </w:tc>
+        <w:tc>
+          <w:tcPr>
+            <w:tcW w:type="dxa" w:w="900"/>
+            <w:tcBorders>
+              <w:top w:val="single" w:color="AAAAAA" w:sz="4"/>
+              <w:left w:val="single" w:color="AAAAAA" w:sz="4"/>
+              <w:bottom w:val="single" w:color="AAAAAA" w:sz="4"/>
+              <w:right w:val="single" w:color="AAAAAA" w:sz="4"/>
+            </w:tcBorders>
+            <w:tcMar>
+              <w:top w:type="dxa" w:w="40"/>
+              <w:left w:type="dxa" w:w="80"/>
+              <w:bottom w:type="dxa" w:w="40"/>
+              <w:right w:type="dxa" w:w="80"/>
+            </w:tcMar>
+          </w:tcPr>
+          <w:p>
+            <w:pPr>
+              <w:jc w:val="center"/>
+            </w:pPr>
+            <w:r>
+              <w:rPr>
+                <w:rFonts w:ascii="Times New Roman" w:cs="Times New Roman" w:eastAsia="Times New Roman" w:hAnsi="Times New Roman"/>
+                <w:b w:val="false"/>
+                <w:bCs w:val="false"/>
+                <w:sz w:val="18"/>
+                <w:szCs w:val="18"/>
+              </w:rPr>
+              <w:t xml:space="preserve">1008</w:t>
+            </w:r>
+          </w:p>
+        </w:tc>
+        <w:tc>
+          <w:tcPr>
+            <w:tcW w:type="dxa" w:w="600"/>
+            <w:tcBorders>
+              <w:top w:val="single" w:color="AAAAAA" w:sz="4"/>
+              <w:left w:val="single" w:color="AAAAAA" w:sz="4"/>
+              <w:bottom w:val="single" w:color="AAAAAA" w:sz="4"/>
+              <w:right w:val="single" w:color="AAAAAA" w:sz="4"/>
+            </w:tcBorders>
+            <w:tcMar>
+              <w:top w:type="dxa" w:w="40"/>
+              <w:left w:type="dxa" w:w="80"/>
+              <w:bottom w:type="dxa" w:w="40"/>
+              <w:right w:type="dxa" w:w="80"/>
+            </w:tcMar>
+          </w:tcPr>
+          <w:p>
+            <w:pPr>
+              <w:jc w:val="center"/>
+            </w:pPr>
+            <w:r>
+              <w:rPr>
+                <w:rFonts w:ascii="Times New Roman" w:cs="Times New Roman" w:eastAsia="Times New Roman" w:hAnsi="Times New Roman"/>
+                <w:b w:val="false"/>
+                <w:bCs w:val="false"/>
+                <w:sz w:val="18"/>
+                <w:szCs w:val="18"/>
+              </w:rPr>
+              <w:t xml:space="preserve">1.3</w:t>
+            </w:r>
+          </w:p>
+        </w:tc>
+        <w:tc>
+          <w:tcPr>
+            <w:tcW w:type="dxa" w:w="1660"/>
+            <w:tcBorders>
+              <w:top w:val="single" w:color="AAAAAA" w:sz="4"/>
+              <w:left w:val="single" w:color="AAAAAA" w:sz="4"/>
+              <w:bottom w:val="single" w:color="AAAAAA" w:sz="4"/>
+              <w:right w:val="single" w:color="AAAAAA" w:sz="4"/>
+            </w:tcBorders>
+            <w:tcMar>
+              <w:top w:type="dxa" w:w="40"/>
+              <w:left w:type="dxa" w:w="80"/>
+              <w:bottom w:type="dxa" w:w="40"/>
+              <w:right w:type="dxa" w:w="80"/>
+            </w:tcMar>
+          </w:tcPr>
+          <w:p>
+            <w:pPr>
+              <w:jc w:val="center"/>
+            </w:pPr>
+            <w:r>
+              <w:rPr>
+                <w:rFonts w:ascii="Times New Roman" w:cs="Times New Roman" w:eastAsia="Times New Roman" w:hAnsi="Times New Roman"/>
+                <w:b w:val="false"/>
+                <w:bCs w:val="false"/>
+                <w:sz w:val="18"/>
+                <w:szCs w:val="18"/>
+              </w:rPr>
+              <w:t xml:space="preserve">weibull / 0.50</w:t>
+            </w:r>
+          </w:p>
+        </w:tc>
+      </w:tr>
+    </w:tbl>
+    <w:p>
+      <w:pPr>
+        <w:spacing w:after="160" w:before="40"/>
+      </w:pPr>
+      <w:r>
+        <w:rPr>
+          <w:rFonts w:ascii="Times New Roman" w:cs="Times New Roman" w:eastAsia="Times New Roman" w:hAnsi="Times New Roman"/>
+          <w:i/>
+          <w:iCs/>
+          <w:sz w:val="18"/>
+          <w:szCs w:val="18"/>
+        </w:rPr>
+        <w:t xml:space="preserve">Calendar hours including waiting states (customer, vendor, queue); the in-progress measure counts only time in that workflow state. Exponential fits are rejected in every case (KS p &lt; 10⁻³⁰).</w:t>
+      </w:r>
+    </w:p>
+    <w:p>
+      <w:pPr>
+        <w:spacing w:after="120" w:line="300"/>
+        <w:jc w:val="both"/>
+      </w:pPr>
+      <w:r>
+        <w:rPr>
+          <w:rFonts w:ascii="Times New Roman" w:cs="Times New Roman" w:eastAsia="Times New Roman" w:hAnsi="Times New Roman"/>
+          <w:b/>
+          <w:bCs/>
+          <w:sz w:val="22"/>
+          <w:szCs w:val="22"/>
+        </w:rPr>
+        <w:t xml:space="preserve">Service times.</w:t>
+      </w:r>
+      <w:r>
+        <w:rPr>
+          <w:rFonts w:ascii="Times New Roman" w:cs="Times New Roman" w:eastAsia="Times New Roman" w:hAnsi="Times New Roman"/>
+          <w:sz w:val="22"/>
+          <w:szCs w:val="22"/>
+        </w:rPr>
+        <w:t xml:space="preserve"> Resolution times are heavy-tailed and far from exponential: median 168 h against a mean of 699 h for the software company, 22 h against 178 h for ServiceNow and 94 h against 211 h for the Italian help desk, with coefficients of variation of 3.0, 3.0 and 1.3 (an exponential has 1) and Weibull shapes of 0.36-0.51, i.e. a decreasing hazard: a ticket that has stayed open for long is likely to stay open much longer. The same holds for the time a ticket spends actually in progress (median 2.2 h, mean 97 h, CV 3.6). The Critical/High incidents of ServiceNow take longer (median 50 h) and are also heavy-tailed. Two consequences for capacity planning follow. First, models that assume exponential service (M/M/c) are not supported, which is a further reason to size capacity from the quantile of the arrival-count distribution and to handle the service-time tail explicitly rather than through a mean-based utilisation. Second, capacity measured in handling hours needs much more headroom than capacity measured in arrivals: for the software company, the 95th percentile of the daily workload (in-progress hours of the tickets created that day) is 3.4 times the mean workload, against 2.0 for the arrival count (CVs 1.35 and 0.58); the "unit of triage capacity" of Section 3.2 must therefore be defined in terms of a </w:t>
+      </w:r>
+      <w:r>
+        <w:rPr>
+          <w:rFonts w:ascii="Times New Roman" w:cs="Times New Roman" w:eastAsia="Times New Roman" w:hAnsi="Times New Roman"/>
+          <w:i/>
+          <w:iCs/>
+          <w:sz w:val="22"/>
+          <w:szCs w:val="22"/>
+        </w:rPr>
+        <w:t xml:space="preserve">typical</w:t>
+      </w:r>
+      <w:r>
+        <w:rPr>
+          <w:rFonts w:ascii="Times New Roman" w:cs="Times New Roman" w:eastAsia="Times New Roman" w:hAnsi="Times New Roman"/>
+          <w:sz w:val="22"/>
+          <w:szCs w:val="22"/>
+        </w:rPr>
+        <w:t xml:space="preserve"> ticket and the workload tail must be added separately.</w:t>
+      </w:r>
+    </w:p>
+    <w:p>
+      <w:pPr>
+        <w:spacing w:after="120" w:line="300"/>
+        <w:jc w:val="both"/>
+      </w:pPr>
+      <w:r>
+        <w:rPr>
+          <w:rFonts w:ascii="Times New Roman" w:cs="Times New Roman" w:eastAsia="Times New Roman" w:hAnsi="Times New Roman"/>
+          <w:b/>
+          <w:bCs/>
+          <w:sz w:val="22"/>
+          <w:szCs w:val="22"/>
+        </w:rPr>
+        <w:t xml:space="preserve">Concurrency.</w:t>
+      </w:r>
+      <w:r>
+        <w:rPr>
+          <w:rFonts w:ascii="Times New Roman" w:cs="Times New Roman" w:eastAsia="Times New Roman" w:hAnsi="Times New Roman"/>
+          <w:sz w:val="22"/>
+          <w:szCs w:val="22"/>
+        </w:rPr>
+        <w:t xml:space="preserve"> The time-average number of open tickets is 290 (software company), 478 (ServiceNow) and 34 (Italian help desk), with variance-to-mean ratios of 21, 601 and 2.6 (Poisson occupancy has 1). The observed 95th percentile of open tickets is 384, 1533 and 51, against Poisson (M/G/∞) predictions with the same mean of 319, 514 and 44: a Poisson-based backlog capacity is too small by 20%, 198% and 16%. The ServiceNow figure is inflated by a one-year log with volume growth and backlog build-up, and the first and last 5% of time were removed to limit edge effects, so the direction (under-provisioning of Poisson-based backlog capacity) is the robust finding and the magnitude is not.</w:t>
       </w:r>
     </w:p>
     <w:p>
@@ -13297,15 +16017,51 @@
           <w:sz w:val="22"/>
           <w:szCs w:val="22"/>
         </w:rPr>
-        <w:t xml:space="preserve">Routing is a first-order design choice.</w:t>
-      </w:r>
-      <w:r>
-        <w:rPr>
-          <w:rFonts w:ascii="Times New Roman" w:cs="Times New Roman" w:eastAsia="Times New Roman" w:hAnsi="Times New Roman"/>
-          <w:sz w:val="22"/>
-          <w:szCs w:val="22"/>
-        </w:rPr>
-        <w:t xml:space="preserve"> Sending only low-agreement answers to the expensive judge cuts judge calls by roughly an order of magnitude, but it also forgoes catches among answers the classifier rated as consistent; routing raised the residual hallucination share by a factor of 1.2-2.4 relative to running both layers on everything (Section 5.2).</w:t>
+        <w:t xml:space="preserve">Human triage is bursty and heavy-tailed in real organisations.</w:t>
+      </w:r>
+      <w:r>
+        <w:rPr>
+          <w:rFonts w:ascii="Times New Roman" w:cs="Times New Roman" w:eastAsia="Times New Roman" w:hAnsi="Times New Roman"/>
+          <w:sz w:val="22"/>
+          <w:szCs w:val="22"/>
+        </w:rPr>
+        <w:t xml:space="preserve"> In three public company ticket streams, the day-to-day coefficient of variation of the arrival rate was 0.33-0.41 net of trend, a Poisson-sized weekday plan was exceeded on 7.5-17% of days instead of 5%, a negative-binomial plan restored 3.5-4.1%, resolution times had coefficients of variation of 1.3-3.0 with decreasing hazards, and the 95th percentile of the daily handling workload was 3.4 times its mean against 2.0 for the arrival count. Capacity in </w:t>
+      </w:r>
+      <w:r>
+        <w:rPr>
+          <w:rFonts w:ascii="Times New Roman" w:cs="Times New Roman" w:eastAsia="Times New Roman" w:hAnsi="Times New Roman"/>
+          <w:i/>
+          <w:iCs/>
+          <w:sz w:val="22"/>
+          <w:szCs w:val="22"/>
+        </w:rPr>
+        <w:t xml:space="preserve">arrivals</w:t>
+      </w:r>
+      <w:r>
+        <w:rPr>
+          <w:rFonts w:ascii="Times New Roman" w:cs="Times New Roman" w:eastAsia="Times New Roman" w:hAnsi="Times New Roman"/>
+          <w:sz w:val="22"/>
+          <w:szCs w:val="22"/>
+        </w:rPr>
+        <w:t xml:space="preserve"> is therefore not capacity in </w:t>
+      </w:r>
+      <w:r>
+        <w:rPr>
+          <w:rFonts w:ascii="Times New Roman" w:cs="Times New Roman" w:eastAsia="Times New Roman" w:hAnsi="Times New Roman"/>
+          <w:i/>
+          <w:iCs/>
+          <w:sz w:val="22"/>
+          <w:szCs w:val="22"/>
+        </w:rPr>
+        <w:t xml:space="preserve">hours</w:t>
+      </w:r>
+      <w:r>
+        <w:rPr>
+          <w:rFonts w:ascii="Times New Roman" w:cs="Times New Roman" w:eastAsia="Times New Roman" w:hAnsi="Times New Roman"/>
+          <w:sz w:val="22"/>
+          <w:szCs w:val="22"/>
+        </w:rPr>
+        <w:t xml:space="preserve">, and the tail of the service time needs its own headroom.</w:t>
       </w:r>
     </w:p>
     <w:p>
@@ -13325,33 +16081,15 @@
           <w:sz w:val="22"/>
           <w:szCs w:val="22"/>
         </w:rPr>
-        <w:t xml:space="preserve">Governance.</w:t>
-      </w:r>
-      <w:r>
-        <w:rPr>
-          <w:rFonts w:ascii="Times New Roman" w:cs="Times New Roman" w:eastAsia="Times New Roman" w:hAnsi="Times New Roman"/>
-          <w:sz w:val="22"/>
-          <w:szCs w:val="22"/>
-        </w:rPr>
-        <w:t xml:space="preserve"> Because k∗ converts a detector's precision/recall into headcount, the framework gives IT governance a common unit (units of triage capacity or dollars per day) in which to compare detectors, set the SLA and justify standing on-call capacity.</w:t>
-      </w:r>
-    </w:p>
-    <w:p>
-      <w:pPr>
-        <w:pStyle w:val="Heading2"/>
-        <w:spacing w:after="100" w:before="200"/>
-      </w:pPr>
-      <w:r>
-        <w:rPr>
-          <w:rFonts w:ascii="Times New Roman" w:cs="Times New Roman" w:eastAsia="Times New Roman" w:hAnsi="Times New Roman"/>
-          <w:b/>
-          <w:bCs/>
-          <w:i/>
-          <w:iCs/>
-          <w:sz w:val="23"/>
-          <w:szCs w:val="23"/>
-        </w:rPr>
-        <w:t xml:space="preserve">6.2 Limitations</w:t>
+        <w:t xml:space="preserve">Routing is a first-order design choice.</w:t>
+      </w:r>
+      <w:r>
+        <w:rPr>
+          <w:rFonts w:ascii="Times New Roman" w:cs="Times New Roman" w:eastAsia="Times New Roman" w:hAnsi="Times New Roman"/>
+          <w:sz w:val="22"/>
+          <w:szCs w:val="22"/>
+        </w:rPr>
+        <w:t xml:space="preserve"> Sending only low-agreement answers to the expensive judge cuts judge calls by roughly an order of magnitude, but it also forgoes catches among answers the classifier rated as consistent; routing raised the residual hallucination share by a factor of 1.2-2.4 relative to running both layers on everything (Section 5.2).</w:t>
       </w:r>
     </w:p>
     <w:p>
@@ -13371,15 +16109,33 @@
           <w:sz w:val="22"/>
           <w:szCs w:val="22"/>
         </w:rPr>
-        <w:t xml:space="preserve">Simulated arrivals and no hallucination log.</w:t>
-      </w:r>
-      <w:r>
-        <w:rPr>
-          <w:rFonts w:ascii="Times New Roman" w:cs="Times New Roman" w:eastAsia="Times New Roman" w:hAnsi="Times New Roman"/>
-          <w:sz w:val="22"/>
-          <w:szCs w:val="22"/>
-        </w:rPr>
-        <w:t xml:space="preserve"> Outcomes are measured on real model outputs, but arrival times are simulated and each arrival replays a bootstrapped example. The public traces we use (BurstGPT, the provider incident history) are real production data, but they record request arrivals and service incidents, not hallucinations; no public time-stamped production log of hallucination incidents exists to our knowledge. The burstiness of the replay is therefore a scenario anchored in, not estimated from, the dispersion of real request streams. Validation on proprietary incident logs is the main follow-up.</w:t>
+        <w:t xml:space="preserve">Governance.</w:t>
+      </w:r>
+      <w:r>
+        <w:rPr>
+          <w:rFonts w:ascii="Times New Roman" w:cs="Times New Roman" w:eastAsia="Times New Roman" w:hAnsi="Times New Roman"/>
+          <w:sz w:val="22"/>
+          <w:szCs w:val="22"/>
+        </w:rPr>
+        <w:t xml:space="preserve"> Because k∗ converts a detector's precision/recall into headcount, the framework gives IT governance a common unit (units of triage capacity or dollars per day) in which to compare detectors, set the SLA and justify standing on-call capacity.</w:t>
+      </w:r>
+    </w:p>
+    <w:p>
+      <w:pPr>
+        <w:pStyle w:val="Heading2"/>
+        <w:spacing w:after="100" w:before="200"/>
+      </w:pPr>
+      <w:r>
+        <w:rPr>
+          <w:rFonts w:ascii="Times New Roman" w:cs="Times New Roman" w:eastAsia="Times New Roman" w:hAnsi="Times New Roman"/>
+          <w:b/>
+          <w:bCs/>
+          <w:i/>
+          <w:iCs/>
+          <w:sz w:val="23"/>
+          <w:szCs w:val="23"/>
+        </w:rPr>
+        <w:t xml:space="preserve">6.2 Limitations</w:t>
       </w:r>
     </w:p>
     <w:p>
@@ -13399,15 +16155,15 @@
           <w:sz w:val="22"/>
           <w:szCs w:val="22"/>
         </w:rPr>
-        <w:t xml:space="preserve">Public-trace artefacts.</w:t>
-      </w:r>
-      <w:r>
-        <w:rPr>
-          <w:rFonts w:ascii="Times New Roman" w:cs="Times New Roman" w:eastAsia="Times New Roman" w:hAnsi="Times New Roman"/>
-          <w:sz w:val="22"/>
-          <w:szCs w:val="22"/>
-        </w:rPr>
-        <w:t xml:space="preserve"> BurstGPT has no calendar dates, a 104-day gap, near-duplicate day pairs and order-of-magnitude regime changes in daily volume, so its day-level variability reflects growth and logging as well as randomness; we use it as a stress test and a lower bound for c, not as an estimate. The provider incident data are provider-declared, with minute resolution and detection and reporting bias; incident duration is the declared start-to-resolution time, not triage effort.</w:t>
+        <w:t xml:space="preserve">Simulated arrivals and no hallucination log.</w:t>
+      </w:r>
+      <w:r>
+        <w:rPr>
+          <w:rFonts w:ascii="Times New Roman" w:cs="Times New Roman" w:eastAsia="Times New Roman" w:hAnsi="Times New Roman"/>
+          <w:sz w:val="22"/>
+          <w:szCs w:val="22"/>
+        </w:rPr>
+        <w:t xml:space="preserve"> Outcomes are measured on real model outputs, but arrival times are simulated and each arrival replays a bootstrapped example. The public traces we use (BurstGPT, the provider incident history) are real production data, but they record request arrivals and service incidents, not hallucinations; no public time-stamped production log of hallucination incidents exists to our knowledge. The burstiness of the replay is therefore a scenario anchored in, not estimated from, the dispersion of real request streams. Validation on proprietary incident logs is the main follow-up.</w:t>
       </w:r>
     </w:p>
     <w:p>
@@ -13427,51 +16183,15 @@
           <w:sz w:val="22"/>
           <w:szCs w:val="22"/>
         </w:rPr>
-        <w:t xml:space="preserve">Small open models and one task.</w:t>
-      </w:r>
-      <w:r>
-        <w:rPr>
-          <w:rFonts w:ascii="Times New Roman" w:cs="Times New Roman" w:eastAsia="Times New Roman" w:hAnsi="Times New Roman"/>
-          <w:sz w:val="22"/>
-          <w:szCs w:val="22"/>
-        </w:rPr>
-        <w:t xml:space="preserve"> We study 0.4-1.5B-parameter models on extractive QA with unanswerable questions. Absolute hallucination rates are much higher than for frontier models, and the layers are CPU-bound; latencies on GPU or hosted APIs differ. The </w:t>
-      </w:r>
-      <w:r>
-        <w:rPr>
-          <w:rFonts w:ascii="Times New Roman" w:cs="Times New Roman" w:eastAsia="Times New Roman" w:hAnsi="Times New Roman"/>
-          <w:i/>
-          <w:iCs/>
-          <w:sz w:val="22"/>
-          <w:szCs w:val="22"/>
-        </w:rPr>
-        <w:t xml:space="preserve">method</w:t>
-      </w:r>
-      <w:r>
-        <w:rPr>
-          <w:rFonts w:ascii="Times New Roman" w:cs="Times New Roman" w:eastAsia="Times New Roman" w:hAnsi="Times New Roman"/>
-          <w:sz w:val="22"/>
-          <w:szCs w:val="22"/>
-        </w:rPr>
-        <w:t xml:space="preserve"> transfers, the </w:t>
-      </w:r>
-      <w:r>
-        <w:rPr>
-          <w:rFonts w:ascii="Times New Roman" w:cs="Times New Roman" w:eastAsia="Times New Roman" w:hAnsi="Times New Roman"/>
-          <w:i/>
-          <w:iCs/>
-          <w:sz w:val="22"/>
-          <w:szCs w:val="22"/>
-        </w:rPr>
-        <w:t xml:space="preserve">numbers</w:t>
-      </w:r>
-      <w:r>
-        <w:rPr>
-          <w:rFonts w:ascii="Times New Roman" w:cs="Times New Roman" w:eastAsia="Times New Roman" w:hAnsi="Times New Roman"/>
-          <w:sz w:val="22"/>
-          <w:szCs w:val="22"/>
-        </w:rPr>
-        <w:t xml:space="preserve"> do not.</w:t>
+        <w:t xml:space="preserve">Ticket data are not LLM incidents.</w:t>
+      </w:r>
+      <w:r>
+        <w:rPr>
+          <w:rFonts w:ascii="Times New Roman" w:cs="Times New Roman" w:eastAsia="Times New Roman" w:hAnsi="Times New Roman"/>
+          <w:sz w:val="22"/>
+          <w:szCs w:val="22"/>
+        </w:rPr>
+        <w:t xml:space="preserve"> The three ticket streams are customer-support and IT incidents; whether LLM-hallucination tickets share their arrival variability and service times is an assumption (plausible for the daily-rate CV, which is invariant to thinning, less so for service times, which depend on the verification task). Resolution times are calendar times that include waiting for customers or vendors and are not triage effort; the in-progress state time is a closer but still imperfect proxy. Ticket volumes in two of the three logs change over their span, which we address by estimating variability against a local mean, and the ServiceNow log covers only about a year.</w:t>
       </w:r>
     </w:p>
     <w:p>
@@ -13491,15 +16211,15 @@
           <w:sz w:val="22"/>
           <w:szCs w:val="22"/>
         </w:rPr>
-        <w:t xml:space="preserve">Label noise.</w:t>
-      </w:r>
-      <w:r>
-        <w:rPr>
-          <w:rFonts w:ascii="Times New Roman" w:cs="Times New Roman" w:eastAsia="Times New Roman" w:hAnsi="Times New Roman"/>
-          <w:sz w:val="22"/>
-          <w:szCs w:val="22"/>
-        </w:rPr>
-        <w:t xml:space="preserve"> Ground truth uses string and token-F1 matching against SQuAD gold answers, which can mark valid paraphrases as hallucinations; this affects all configurations alike but inflates the base rate.</w:t>
+        <w:t xml:space="preserve">Public-trace artefacts.</w:t>
+      </w:r>
+      <w:r>
+        <w:rPr>
+          <w:rFonts w:ascii="Times New Roman" w:cs="Times New Roman" w:eastAsia="Times New Roman" w:hAnsi="Times New Roman"/>
+          <w:sz w:val="22"/>
+          <w:szCs w:val="22"/>
+        </w:rPr>
+        <w:t xml:space="preserve"> BurstGPT has no calendar dates, a 104-day gap, near-duplicate day pairs and order-of-magnitude regime changes in daily volume, so its day-level variability reflects growth and logging as well as randomness; we use it as a stress test and a lower bound for c, not as an estimate. The provider incident data are provider-declared, with minute resolution and detection and reporting bias; incident duration is the declared start-to-resolution time, not triage effort.</w:t>
       </w:r>
     </w:p>
     <w:p>
@@ -13519,15 +16239,51 @@
           <w:sz w:val="22"/>
           <w:szCs w:val="22"/>
         </w:rPr>
-        <w:t xml:space="preserve">Cost parameters are assumptions.</w:t>
-      </w:r>
-      <w:r>
-        <w:rPr>
-          <w:rFonts w:ascii="Times New Roman" w:cs="Times New Roman" w:eastAsia="Times New Roman" w:hAnsi="Times New Roman"/>
-          <w:sz w:val="22"/>
-          <w:szCs w:val="22"/>
-        </w:rPr>
-        <w:t xml:space="preserve"> Only labour-to-compute ratios and the sensitivity grid are informative; dollar levels are illustrative.</w:t>
+        <w:t xml:space="preserve">Small open models and one task.</w:t>
+      </w:r>
+      <w:r>
+        <w:rPr>
+          <w:rFonts w:ascii="Times New Roman" w:cs="Times New Roman" w:eastAsia="Times New Roman" w:hAnsi="Times New Roman"/>
+          <w:sz w:val="22"/>
+          <w:szCs w:val="22"/>
+        </w:rPr>
+        <w:t xml:space="preserve"> We study 0.4-1.5B-parameter models on extractive QA with unanswerable questions. Absolute hallucination rates are much higher than for frontier models, and the layers are CPU-bound; latencies on GPU or hosted APIs differ. The </w:t>
+      </w:r>
+      <w:r>
+        <w:rPr>
+          <w:rFonts w:ascii="Times New Roman" w:cs="Times New Roman" w:eastAsia="Times New Roman" w:hAnsi="Times New Roman"/>
+          <w:i/>
+          <w:iCs/>
+          <w:sz w:val="22"/>
+          <w:szCs w:val="22"/>
+        </w:rPr>
+        <w:t xml:space="preserve">method</w:t>
+      </w:r>
+      <w:r>
+        <w:rPr>
+          <w:rFonts w:ascii="Times New Roman" w:cs="Times New Roman" w:eastAsia="Times New Roman" w:hAnsi="Times New Roman"/>
+          <w:sz w:val="22"/>
+          <w:szCs w:val="22"/>
+        </w:rPr>
+        <w:t xml:space="preserve"> transfers, the </w:t>
+      </w:r>
+      <w:r>
+        <w:rPr>
+          <w:rFonts w:ascii="Times New Roman" w:cs="Times New Roman" w:eastAsia="Times New Roman" w:hAnsi="Times New Roman"/>
+          <w:i/>
+          <w:iCs/>
+          <w:sz w:val="22"/>
+          <w:szCs w:val="22"/>
+        </w:rPr>
+        <w:t xml:space="preserve">numbers</w:t>
+      </w:r>
+      <w:r>
+        <w:rPr>
+          <w:rFonts w:ascii="Times New Roman" w:cs="Times New Roman" w:eastAsia="Times New Roman" w:hAnsi="Times New Roman"/>
+          <w:sz w:val="22"/>
+          <w:szCs w:val="22"/>
+        </w:rPr>
+        <w:t xml:space="preserve"> do not.</w:t>
       </w:r>
     </w:p>
     <w:p>
@@ -13547,15 +16303,15 @@
           <w:sz w:val="22"/>
           <w:szCs w:val="22"/>
         </w:rPr>
-        <w:t xml:space="preserve">Single judge and classifier, and a post-hoc layer change.</w:t>
-      </w:r>
-      <w:r>
-        <w:rPr>
-          <w:rFonts w:ascii="Times New Roman" w:cs="Times New Roman" w:eastAsia="Times New Roman" w:hAnsi="Times New Roman"/>
-          <w:sz w:val="22"/>
-          <w:szCs w:val="22"/>
-        </w:rPr>
-        <w:t xml:space="preserve"> Layer dependence and clearance were measured for one extractive-QA verifier and one judge model; other choices may be more or less correlated. The QA verifier was introduced after the NLI classifier proved uninformative, so the L2 choice was made after seeing results (on the same data); it is trained on SQuAD, which flatters it relative to a domain-agnostic classifier, and its threshold (token-F1 &lt; 0.5) was not tuned. The analyses should be repeated on a held-out sample with a pre-registered layer configuration.</w:t>
+        <w:t xml:space="preserve">Label noise.</w:t>
+      </w:r>
+      <w:r>
+        <w:rPr>
+          <w:rFonts w:ascii="Times New Roman" w:cs="Times New Roman" w:eastAsia="Times New Roman" w:hAnsi="Times New Roman"/>
+          <w:sz w:val="22"/>
+          <w:szCs w:val="22"/>
+        </w:rPr>
+        <w:t xml:space="preserve"> Ground truth uses string and token-F1 matching against SQuAD gold answers, which can mark valid paraphrases as hallucinations; this affects all configurations alike but inflates the base rate.</w:t>
       </w:r>
     </w:p>
     <w:p>
@@ -13575,15 +16331,15 @@
           <w:sz w:val="22"/>
           <w:szCs w:val="22"/>
         </w:rPr>
-        <w:t xml:space="preserve">Consistency checks are partly by construction.</w:t>
-      </w:r>
-      <w:r>
-        <w:rPr>
-          <w:rFonts w:ascii="Times New Roman" w:cs="Times New Roman" w:eastAsia="Times New Roman" w:hAnsi="Times New Roman"/>
-          <w:sz w:val="22"/>
-          <w:szCs w:val="22"/>
-        </w:rPr>
-        <w:t xml:space="preserve"> Because outcomes are bootstrapped from a fixed pool and arrivals are simulated, the Poisson and time-rescaling checks of Section 5.3 verify the machinery, not real traffic; only the dependence, clearance, latency and failure measurements are evidence about real systems.</w:t>
+        <w:t xml:space="preserve">Cost parameters are assumptions.</w:t>
+      </w:r>
+      <w:r>
+        <w:rPr>
+          <w:rFonts w:ascii="Times New Roman" w:cs="Times New Roman" w:eastAsia="Times New Roman" w:hAnsi="Times New Roman"/>
+          <w:sz w:val="22"/>
+          <w:szCs w:val="22"/>
+        </w:rPr>
+        <w:t xml:space="preserve"> Only labour-to-compute ratios and the sensitivity grid are informative; dollar levels are illustrative.</w:t>
       </w:r>
     </w:p>
     <w:p>
@@ -13603,6 +16359,62 @@
           <w:sz w:val="22"/>
           <w:szCs w:val="22"/>
         </w:rPr>
+        <w:t xml:space="preserve">Single judge and classifier, and a post-hoc layer change.</w:t>
+      </w:r>
+      <w:r>
+        <w:rPr>
+          <w:rFonts w:ascii="Times New Roman" w:cs="Times New Roman" w:eastAsia="Times New Roman" w:hAnsi="Times New Roman"/>
+          <w:sz w:val="22"/>
+          <w:szCs w:val="22"/>
+        </w:rPr>
+        <w:t xml:space="preserve"> Layer dependence and clearance were measured for one extractive-QA verifier and one judge model; other choices may be more or less correlated. The QA verifier was introduced after the NLI classifier proved uninformative, so the L2 choice was made after seeing results (on the same data); it is trained on SQuAD, which flatters it relative to a domain-agnostic classifier, and its threshold (token-F1 &lt; 0.5) was not tuned. The analyses should be repeated on a held-out sample with a pre-registered layer configuration.</w:t>
+      </w:r>
+    </w:p>
+    <w:p>
+      <w:pPr>
+        <w:pStyle w:val="ListParagraph"/>
+        <w:numPr>
+          <w:ilvl w:val="0"/>
+          <w:numId w:val="2"/>
+        </w:numPr>
+        <w:spacing w:after="60" w:line="288"/>
+      </w:pPr>
+      <w:r>
+        <w:rPr>
+          <w:rFonts w:ascii="Times New Roman" w:cs="Times New Roman" w:eastAsia="Times New Roman" w:hAnsi="Times New Roman"/>
+          <w:b/>
+          <w:bCs/>
+          <w:sz w:val="22"/>
+          <w:szCs w:val="22"/>
+        </w:rPr>
+        <w:t xml:space="preserve">Consistency checks are partly by construction.</w:t>
+      </w:r>
+      <w:r>
+        <w:rPr>
+          <w:rFonts w:ascii="Times New Roman" w:cs="Times New Roman" w:eastAsia="Times New Roman" w:hAnsi="Times New Roman"/>
+          <w:sz w:val="22"/>
+          <w:szCs w:val="22"/>
+        </w:rPr>
+        <w:t xml:space="preserve"> Because outcomes are bootstrapped from a fixed pool and arrivals are simulated, the Poisson and time-rescaling checks of Section 5.3 verify the machinery, not real traffic; only the dependence, clearance, latency and failure measurements are evidence about real systems.</w:t>
+      </w:r>
+    </w:p>
+    <w:p>
+      <w:pPr>
+        <w:pStyle w:val="ListParagraph"/>
+        <w:numPr>
+          <w:ilvl w:val="0"/>
+          <w:numId w:val="2"/>
+        </w:numPr>
+        <w:spacing w:after="60" w:line="288"/>
+      </w:pPr>
+      <w:r>
+        <w:rPr>
+          <w:rFonts w:ascii="Times New Roman" w:cs="Times New Roman" w:eastAsia="Times New Roman" w:hAnsi="Times New Roman"/>
+          <w:b/>
+          <w:bCs/>
+          <w:sz w:val="22"/>
+          <w:szCs w:val="22"/>
+        </w:rPr>
         <w:t xml:space="preserve">Independent days.</w:t>
       </w:r>
       <w:r>
@@ -13641,7 +16453,7 @@
           <w:sz w:val="22"/>
           <w:szCs w:val="22"/>
         </w:rPr>
-        <w:t xml:space="preserve">Treating critical hallucinations as a counting process turns guardrail performance into a staffing and cost decision. The analysis yields three results that differ from the common practice the earlier draft followed: capacity must be sized from an over-dispersion-aware quantile; the multiplicative guardrail formula is an optimistic bound whose gap must be measured; and the cost-minimising number of layers is not fixed at three but depends on integer capacity effects, the floor on standing staff, latency, the labour-to-compute ratio and, empirically, on the generator. On measured outputs of three open models, a single task-validated classifier reduces the required capacity by roughly 80-95% relative to no guardrails; a routed judge adds a further modest, model-dependent reduction at about triple the latency, and every cascade incurs false blocks and system failures that the earlier framework ignored. The independence formula understated the share of hallucinations passing a two-layer cascade by a factor of 1.6-2.6 (2.7-4.6 with routing), and a mild burstiness (daily-rate CV of 0.3) raised the exceedance rate of a Poisson-sized plan from 5% to about 25%, to about 30% with the CV of 0.44 anchored in a production trace. Public production data corroborate the structure: an LLM request trace shows clustered arrivals at every scale above one second and a median day-to-day volume change of a factor of 1.8, and provider incident streams are strongly seasonal and remain over-dispersed after accounting for seasonality, with heavy-tailed durations. Validating the counting-process assumptions on production incident logs is the key next step.</w:t>
+        <w:t xml:space="preserve">Treating critical hallucinations as a counting process turns guardrail performance into a staffing and cost decision. The analysis yields three results that differ from the common practice the earlier draft followed: capacity must be sized from an over-dispersion-aware quantile; the multiplicative guardrail formula is an optimistic bound whose gap must be measured; and the cost-minimising number of layers is not fixed at three but depends on integer capacity effects, the floor on standing staff, latency, the labour-to-compute ratio and, empirically, on the generator. On measured outputs of three open models, a single task-validated classifier reduces the required capacity by roughly 80-95% relative to no guardrails; a routed judge adds a further modest, model-dependent reduction at about triple the latency, and every cascade incurs false blocks and system failures that the earlier framework ignored. The independence formula understated the share of hallucinations passing a two-layer cascade by a factor of 1.6-2.6 (2.7-4.6 with routing), and a mild burstiness (daily-rate CV of 0.3) raised the exceedance rate of a Poisson-sized plan from 5% to about 25%, to about 30% with the CV of 0.44 anchored in a production trace. Public production data corroborate the structure: an LLM request trace shows clustered arrivals at every scale above one second, provider incident streams are strongly seasonal and remain over-dispersed after accounting for seasonality, and three company ticket streams show a daily rate variability of 0.33-0.41, Poisson-sized plans exceeded on 7.5-17% of days, and heavy-tailed resolution times, which implies that capacity in handling hours needs about 70% more headroom than capacity in arrivals. Validating the counting-process assumptions on production incident logs is the key next step.</w:t>
       </w:r>
     </w:p>
     <w:p>
@@ -13671,7 +16483,7 @@
           <w:sz w:val="20"/>
           <w:szCs w:val="20"/>
         </w:rPr>
-        <w:t xml:space="preserve">Abraham, S., et al. (2026). AI incident monitoring through a public health lens. arXiv:2604.19914.</w:t>
+        <w:t xml:space="preserve">Abdellatif, M. (2026). Help Desk Tickets (Version 3) [Dataset]. Mendeley Data. https://doi.org/10.17632/btm76zndnt.3</w:t>
       </w:r>
     </w:p>
     <w:p>
@@ -13685,7 +16497,7 @@
           <w:sz w:val="20"/>
           <w:szCs w:val="20"/>
         </w:rPr>
-        <w:t xml:space="preserve">Allal, L. B., et al. (2025). SmolLM2: When Smol goes big, data-centric training of a small language model. arXiv:2502.02737.</w:t>
+        <w:t xml:space="preserve">Abraham, S., et al. (2026). AI incident monitoring through a public health lens. arXiv:2604.19914.</w:t>
       </w:r>
     </w:p>
     <w:p>
@@ -13699,7 +16511,7 @@
           <w:sz w:val="20"/>
           <w:szCs w:val="20"/>
         </w:rPr>
-        <w:t xml:space="preserve">Alotaibi, A., Jabbar, M. S., Al-Azani, S., &amp; Ahmed, M. (2026). Layered LLM defenses as an ensemble: Access tiers, inference cost, and the measured failure correlation between defense layers. arXiv:2608.28327.</w:t>
+        <w:t xml:space="preserve">Allal, L. B., et al. (2025). SmolLM2: When Smol goes big, data-centric training of a small language model. arXiv:2502.02737.</w:t>
       </w:r>
     </w:p>
     <w:p>
@@ -13713,7 +16525,7 @@
           <w:sz w:val="20"/>
           <w:szCs w:val="20"/>
         </w:rPr>
-        <w:t xml:space="preserve">Bartolucci, &amp; Vivo, (2026). Queue &amp; AI: When faster tasks slow down the workflow. arXiv:2605.27202.</w:t>
+        <w:t xml:space="preserve">Alotaibi, A., Jabbar, M. S., Al-Azani, S., &amp; Ahmed, M. (2026). Layered LLM defenses as an ensemble: Access tiers, inference cost, and the measured failure correlation between defense layers. arXiv:2608.28327.</w:t>
       </w:r>
     </w:p>
     <w:p>
@@ -13727,7 +16539,7 @@
           <w:sz w:val="20"/>
           <w:szCs w:val="20"/>
         </w:rPr>
-        <w:t xml:space="preserve">Besanson, (2026). SARC: A governance-by-architecture framework for agentic AI systems. arXiv:2605.07728.</w:t>
+        <w:t xml:space="preserve">Amaral, C. A. L., Fantinato, M., &amp; Peres, S. M. (2018). Incident management process enriched event log [Dataset]. UCI Machine Learning Repository (dataset 498).</w:t>
       </w:r>
     </w:p>
     <w:p>
@@ -13741,7 +16553,7 @@
           <w:sz w:val="20"/>
           <w:szCs w:val="20"/>
         </w:rPr>
-        <w:t xml:space="preserve">Bhardwaj, V. P., Singh, &amp; Bhardwaj, (2026). Agent behavioral contracts II: Certifying compositional reliability without assuming independence. arXiv:2608.12895.</w:t>
+        <w:t xml:space="preserve">Bartolucci, &amp; Vivo, (2026). Queue &amp; AI: When faster tasks slow down the workflow. arXiv:2605.27202.</w:t>
       </w:r>
     </w:p>
     <w:p>
@@ -13755,7 +16567,7 @@
           <w:sz w:val="20"/>
           <w:szCs w:val="20"/>
         </w:rPr>
-        <w:t xml:space="preserve">Brown, L., Gans, N., Mandelbaum, A., Sakov, A., Shen, H., Zeltyn, S., &amp; Zhao, L. (2005). Statistical analysis of a telephone call center: A queueing-science perspective. Journal of the American Statistical Association, 100(469), 36-50.</w:t>
+        <w:t xml:space="preserve">Besanson, (2026). SARC: A governance-by-architecture framework for agentic AI systems. arXiv:2605.07728.</w:t>
       </w:r>
     </w:p>
     <w:p>
@@ -13769,7 +16581,7 @@
           <w:sz w:val="20"/>
           <w:szCs w:val="20"/>
         </w:rPr>
-        <w:t xml:space="preserve">Cameron, A. C., &amp; Trivedi, P. K. (1998). Regression Analysis of Count Data. Cambridge University Press.</w:t>
+        <w:t xml:space="preserve">Bhardwaj, V. P., Singh, &amp; Bhardwaj, (2026). Agent behavioral contracts II: Certifying compositional reliability without assuming independence. arXiv:2608.12895.</w:t>
       </w:r>
     </w:p>
     <w:p>
@@ -13783,7 +16595,7 @@
           <w:sz w:val="20"/>
           <w:szCs w:val="20"/>
         </w:rPr>
-        <w:t xml:space="preserve">Chu, X., Talluri, S., Lu, Q., &amp; Iosup, A. (2025). An empirical characterization of outages and incidents in public services for large language models. Proceedings of ICPE 2025 (arXiv:2501.12469).</w:t>
+        <w:t xml:space="preserve">Brown, L., Gans, N., Mandelbaum, A., Sakov, A., Shen, H., Zeltyn, S., &amp; Zhao, L. (2005). Statistical analysis of a telephone call center: A queueing-science perspective. Journal of the American Statistical Association, 100(469), 36-50.</w:t>
       </w:r>
     </w:p>
     <w:p>
@@ -13797,7 +16609,7 @@
           <w:sz w:val="20"/>
           <w:szCs w:val="20"/>
         </w:rPr>
-        <w:t xml:space="preserve">Cox, D. R. (1955). Some statistical methods connected with series of events. Journal of the Royal Statistical Society, Series B, 17(2), 129-164.</w:t>
+        <w:t xml:space="preserve">Cameron, A. C., &amp; Trivedi, P. K. (1998). Regression Analysis of Count Data. Cambridge University Press.</w:t>
       </w:r>
     </w:p>
     <w:p>
@@ -13811,7 +16623,7 @@
           <w:sz w:val="20"/>
           <w:szCs w:val="20"/>
         </w:rPr>
-        <w:t xml:space="preserve">Esary, J. D., Proschan, F., &amp; Walkup, D. W. (1967). Association of random variables, with applications. Annals of Mathematical Statistics, 38(5), 1466-1474.</w:t>
+        <w:t xml:space="preserve">Chu, X., Talluri, S., Lu, Q., &amp; Iosup, A. (2025). An empirical characterization of outages and incidents in public services for large language models. Proceedings of ICPE 2025 (arXiv:2501.12469).</w:t>
       </w:r>
     </w:p>
     <w:p>
@@ -13825,7 +16637,7 @@
           <w:sz w:val="20"/>
           <w:szCs w:val="20"/>
         </w:rPr>
-        <w:t xml:space="preserve">Green, L. V., Kolesar, P. J., &amp; Whitt, W. (2007). Coping with time-varying demand when setting staffing requirements for a service system. Production and Operations Management, 16(1), 13-39.</w:t>
+        <w:t xml:space="preserve">Cox, D. R. (1955). Some statistical methods connected with series of events. Journal of the Royal Statistical Society, Series B, 17(2), 129-164.</w:t>
       </w:r>
     </w:p>
     <w:p>
@@ -13839,7 +16651,7 @@
           <w:sz w:val="20"/>
           <w:szCs w:val="20"/>
         </w:rPr>
-        <w:t xml:space="preserve">Gregor, S., &amp; Hevner, A. R. (2013). Positioning and presenting design science research for maximum impact. MIS Quarterly, 37(2), 337-355.</w:t>
+        <w:t xml:space="preserve">Esary, J. D., Proschan, F., &amp; Walkup, D. W. (1967). Association of random variables, with applications. Annals of Mathematical Statistics, 38(5), 1466-1474.</w:t>
       </w:r>
     </w:p>
     <w:p>
@@ -13853,7 +16665,7 @@
           <w:sz w:val="20"/>
           <w:szCs w:val="20"/>
         </w:rPr>
-        <w:t xml:space="preserve">He, P., Gao, J., &amp; Chen, W. (2021). DeBERTaV3: Improving DeBERTa using ELECTRA-style pre-training with gradient-disentangled embedding sharing. arXiv:2111.09543.</w:t>
+        <w:t xml:space="preserve">Green, L. V., Kolesar, P. J., &amp; Whitt, W. (2007). Coping with time-varying demand when setting staffing requirements for a service system. Production and Operations Management, 16(1), 13-39.</w:t>
       </w:r>
     </w:p>
     <w:p>
@@ -13867,7 +16679,7 @@
           <w:sz w:val="20"/>
           <w:szCs w:val="20"/>
         </w:rPr>
-        <w:t xml:space="preserve">Hevner, A. R., March, S. T., Park, J., &amp; Ram, S. (2004). Design science in information systems research. MIS Quarterly, 28(1), 75-105.</w:t>
+        <w:t xml:space="preserve">Gregor, S., &amp; Hevner, A. R. (2013). Positioning and presenting design science research for maximum impact. MIS Quarterly, 37(2), 337-355.</w:t>
       </w:r>
     </w:p>
     <w:p>
@@ -13881,7 +16693,7 @@
           <w:sz w:val="20"/>
           <w:szCs w:val="20"/>
         </w:rPr>
-        <w:t xml:space="preserve">Inan, H., et al. (2023). Llama Guard: LLM-based input-output safeguard for human-AI conversations. arXiv:2312.06674.</w:t>
+        <w:t xml:space="preserve">He, P., Gao, J., &amp; Chen, W. (2021). DeBERTaV3: Improving DeBERTa using ELECTRA-style pre-training with gradient-disentangled embedding sharing. arXiv:2111.09543.</w:t>
       </w:r>
     </w:p>
     <w:p>
@@ -13895,7 +16707,7 @@
           <w:sz w:val="20"/>
           <w:szCs w:val="20"/>
         </w:rPr>
-        <w:t xml:space="preserve">Ji, Z., et al. (2023). Survey of hallucination in natural language generation. ACM Computing Surveys, 55(12), Article 248.</w:t>
+        <w:t xml:space="preserve">Hevner, A. R., March, S. T., Park, J., &amp; Ram, S. (2004). Design science in information systems research. MIS Quarterly, 28(1), 75-105.</w:t>
       </w:r>
     </w:p>
     <w:p>
@@ -13909,7 +16721,7 @@
           <w:sz w:val="20"/>
           <w:szCs w:val="20"/>
         </w:rPr>
-        <w:t xml:space="preserve">Kingman, J. F. C. (1993). Poisson Processes. Oxford University Press.</w:t>
+        <w:t xml:space="preserve">Inan, H., et al. (2023). Llama Guard: LLM-based input-output safeguard for human-AI conversations. arXiv:2312.06674.</w:t>
       </w:r>
     </w:p>
     <w:p>
@@ -13923,7 +16735,7 @@
           <w:sz w:val="20"/>
           <w:szCs w:val="20"/>
         </w:rPr>
-        <w:t xml:space="preserve">Lewis, P., et al. (2020). Retrieval-augmented generation for knowledge-intensive NLP tasks. Advances in Neural Information Processing Systems, 33.</w:t>
+        <w:t xml:space="preserve">Ji, Z., et al. (2023). Survey of hallucination in natural language generation. ACM Computing Surveys, 55(12), Article 248.</w:t>
       </w:r>
     </w:p>
     <w:p>
@@ -13937,7 +16749,7 @@
           <w:sz w:val="20"/>
           <w:szCs w:val="20"/>
         </w:rPr>
-        <w:t xml:space="preserve">Lin, R., &amp; Zhang, J. (2026). When to screen, when to bypass: LLM-judges in resource-scarce AI-human workflow. arXiv:2603.13870.</w:t>
+        <w:t xml:space="preserve">Kingman, J. F. C. (1993). Poisson Processes. Oxford University Press.</w:t>
       </w:r>
     </w:p>
     <w:p>
@@ -13951,7 +16763,7 @@
           <w:sz w:val="20"/>
           <w:szCs w:val="20"/>
         </w:rPr>
-        <w:t xml:space="preserve">Manakul, P., Liusie, A., &amp; Gales, M. J. F. (2023). SelfCheckGPT: Zero-resource black-box hallucination detection for generative large language models. Proceedings of EMNLP 2023.</w:t>
+        <w:t xml:space="preserve">Lewis, P., et al. (2020). Retrieval-augmented generation for knowledge-intensive NLP tasks. Advances in Neural Information Processing Systems, 33.</w:t>
       </w:r>
     </w:p>
     <w:p>
@@ -13965,7 +16777,7 @@
           <w:sz w:val="20"/>
           <w:szCs w:val="20"/>
         </w:rPr>
-        <w:t xml:space="preserve">Qwen Team. (2024). Qwen2.5 technical report. arXiv:2412.15115.</w:t>
+        <w:t xml:space="preserve">Lin, R., &amp; Zhang, J. (2026). When to screen, when to bypass: LLM-judges in resource-scarce AI-human workflow. arXiv:2603.13870.</w:t>
       </w:r>
     </w:p>
     <w:p>
@@ -13979,7 +16791,7 @@
           <w:sz w:val="20"/>
           <w:szCs w:val="20"/>
         </w:rPr>
-        <w:t xml:space="preserve">Rajpurkar, P., Jia, R., &amp; Liang, P. (2018). Know what you don't know: Unanswerable questions for SQuAD. Proceedings of ACL 2018, 784-789.</w:t>
+        <w:t xml:space="preserve">Manakul, P., Liusie, A., &amp; Gales, M. J. F. (2023). SelfCheckGPT: Zero-resource black-box hallucination detection for generative large language models. Proceedings of EMNLP 2023.</w:t>
       </w:r>
     </w:p>
     <w:p>
@@ -13993,7 +16805,7 @@
           <w:sz w:val="20"/>
           <w:szCs w:val="20"/>
         </w:rPr>
-        <w:t xml:space="preserve">Topkis, D. M. (1978). Minimizing a submodular function on a lattice. Operations Research, 26(2), 305-321.</w:t>
+        <w:t xml:space="preserve">Qwen Team. (2024). Qwen2.5 technical report. arXiv:2412.15115.</w:t>
       </w:r>
     </w:p>
     <w:p>
@@ -14007,7 +16819,49 @@
           <w:sz w:val="20"/>
           <w:szCs w:val="20"/>
         </w:rPr>
+        <w:t xml:space="preserve">Rajpurkar, P., Jia, R., &amp; Liang, P. (2018). Know what you don't know: Unanswerable questions for SQuAD. Proceedings of ACL 2018, 784-789.</w:t>
+      </w:r>
+    </w:p>
+    <w:p>
+      <w:pPr>
+        <w:spacing w:after="70"/>
+        <w:ind w:left="360" w:hanging="360"/>
+      </w:pPr>
+      <w:r>
+        <w:rPr>
+          <w:rFonts w:ascii="Times New Roman" w:cs="Times New Roman" w:eastAsia="Times New Roman" w:hAnsi="Times New Roman"/>
+          <w:sz w:val="20"/>
+          <w:szCs w:val="20"/>
+        </w:rPr>
+        <w:t xml:space="preserve">Topkis, D. M. (1978). Minimizing a submodular function on a lattice. Operations Research, 26(2), 305-321.</w:t>
+      </w:r>
+    </w:p>
+    <w:p>
+      <w:pPr>
+        <w:spacing w:after="70"/>
+        <w:ind w:left="360" w:hanging="360"/>
+      </w:pPr>
+      <w:r>
+        <w:rPr>
+          <w:rFonts w:ascii="Times New Roman" w:cs="Times New Roman" w:eastAsia="Times New Roman" w:hAnsi="Times New Roman"/>
+          <w:sz w:val="20"/>
+          <w:szCs w:val="20"/>
+        </w:rPr>
         <w:t xml:space="preserve">Tran-Truong, &amp; Le, (2026). Measuring the unmeasurable: Markov chain reliability for LLM agents. arXiv:2604.24579.</w:t>
+      </w:r>
+    </w:p>
+    <w:p>
+      <w:pPr>
+        <w:spacing w:after="70"/>
+        <w:ind w:left="360" w:hanging="360"/>
+      </w:pPr>
+      <w:r>
+        <w:rPr>
+          <w:rFonts w:ascii="Times New Roman" w:cs="Times New Roman" w:eastAsia="Times New Roman" w:hAnsi="Times New Roman"/>
+          <w:sz w:val="20"/>
+          <w:szCs w:val="20"/>
+        </w:rPr>
+        <w:t xml:space="preserve">Verenich, I. (2016). Helpdesk [Dataset: help desk log of an Italian software company]. Mendeley Data, V1. https://doi.org/10.17632/39bp3vv62t.1</w:t>
       </w:r>
     </w:p>
     <w:p>

</xml_diff>

<commit_message>
Add typed failure models (seasonal Hawkes for incidents, heavy-tailed episodes for serving failures, typed capacity comparison); update paper (Prop. 6, Sec. 3.6, 5.8)
Co-Authored-By: Claude Sonnet 5.5 <noreply@anthropic.com>
Claude-Session: https://claude.ai/code/session_01FJoEQKBVMu4pDX4YuJC5vW
</commit_message>
<xml_diff>
--- a/hallucination_poisson/paper/LLM_Hallucination_Poisson_Framework_Revised.docx
+++ b/hallucination_poisson/paper/LLM_Hallucination_Poisson_Framework_Revised.docx
@@ -60,7 +60,7 @@
           <w:sz w:val="22"/>
           <w:szCs w:val="22"/>
         </w:rPr>
-        <w:t xml:space="preserve">Organisations that deploy large language models (LLMs) must decide how much human triage capacity to hold in reserve and how many automated guardrail layers to place in front of the model. Practice relies on two rules of thumb: staff for the average incident load, and stack guardrails whose combined benefit is computed under independence. We model critical hallucinations as a (possibly over-dispersed, non-homogeneous) counting process, size capacity at a quantile of the daily count, and treat the multiplicative guardrail formula as the independence special case of Fréchet-type bounds. We show analytically that over-dispersion inflates required capacity by roughly the square root of the dispersion index, that positive association between layers makes the independence formula a lower bound on residual risk, and that, because capacity is integer-valued, total cost is not unimodal in the number of layers; an earlier claim that three layers are structurally optimal does not follow from the cost model. We then evaluate the integrated pipeline on measured outputs of three open LLMs answering 900 SQuAD 2.0 questions through three executed guardrail layers (rules, an extractive-QA classifier, an LLM judge) with measured latency and failures, with user traffic simulated as a non-homogeneous arrival process. We then test the Poisson structure on public production data: a request trace of an LLM service shows clustered arrivals at every scale above one second and a median day-to-day volume change of a factor of 1.8, provider incident streams are strongly seasonal and remain over-dispersed after accounting for it, and three company ticket streams show a daily arrival-rate variability of 0.33-0.41 (so Poisson-sized plans fail on 7.5-17% of days instead of 5%) and heavy-tailed resolution times (the daily handling workload needs 3.4 times its mean as 95% headroom against 2.0 for arrival counts). A single validated classifier cut required capacity by 80-95%; a routed judge added a modest, model-dependent gain at about triple the latency. The independence formula understated the share of hallucinations passing a two-layer cascade by a factor of 1.6-2.6 (2.7-4.6 with routing), a classifier with chance-level discrimination appeared beneficial only because it blocked almost everything, and with mild burstiness (daily-rate CV 0.3) a Poisson-sized capacity plan was exceeded on about 25-30% of days instead of 5%, while over-dispersion mattered little for low-rate provider-level incidents, as the thinning argument of Proposition 5 predicts. Hallucination arrival times are simulated and no public time-stamped hallucination log exists; models are small and the task is extractive QA, so the numbers do not transfer to production; the method and its diagnostics do.</w:t>
+        <w:t xml:space="preserve">Organisations that deploy large language models (LLMs) must decide how much human triage capacity to hold in reserve and how many automated guardrail layers to place in front of the model. Practice relies on two rules of thumb: staff for the average incident load, and stack guardrails whose combined benefit is computed under independence. We model critical hallucinations as a (possibly over-dispersed, non-homogeneous) counting process, size capacity at a quantile of the daily count, and treat the multiplicative guardrail formula as the independence special case of Fréchet-type bounds. We replace the single-Poisson description of all failures by typed classes (hallucinations as thinned over-dispersed streams, incidents as seasonal Hawkes processes, serving failures as heavy-tailed episodes). We show analytically that over-dispersion inflates required capacity by roughly the square root of the dispersion index, that positive association between layers makes the independence formula a lower bound on residual risk, and that, because capacity is integer-valued, total cost is not unimodal in the number of layers; an earlier claim that three layers are structurally optimal does not follow from the cost model. We then evaluate the integrated pipeline on measured outputs of three open LLMs answering 900 SQuAD 2.0 questions through three executed guardrail layers (rules, an extractive-QA classifier, an LLM judge) with measured latency and failures, with user traffic simulated as a non-homogeneous arrival process. We then test the Poisson structure on public production data: a request trace of an LLM service shows clustered arrivals at every scale above one second and a median day-to-day volume change of a factor of 1.8, provider incident streams are strongly seasonal and remain over-dispersed after accounting for it, and three company ticket streams show a daily arrival-rate variability of 0.33-0.41 (so Poisson-sized plans fail on 7.5-17% of days instead of 5%) and heavy-tailed resolution times (the daily handling workload needs 3.4 times its mean as 95% headroom against 2.0 for arrival counts). Replacing a single Poisson on all failures by a typed model is supported by the data: provider incidents are seasonal and mildly self-exciting (branching ratio 0.11-0.22), serving failures arrive in heavy-tailed episodes (68% of failed requests in 4% of active minutes), and a typed superposition required 24-43% more daily capacity than a single Poisson on the total in an illustrative organisation. A single validated classifier cut required capacity by 80-95%; a routed judge added a modest, model-dependent gain at about triple the latency. The independence formula understated the share of hallucinations passing a two-layer cascade by a factor of 1.6-2.6 (2.7-4.6 with routing), a classifier with chance-level discrimination appeared beneficial only because it blocked almost everything, and with mild burstiness (daily-rate CV 0.3) a Poisson-sized capacity plan was exceeded on about 25-30% of days instead of 5%, while over-dispersion mattered little for low-rate provider-level incidents, as the thinning argument of Proposition 5 predicts. Hallucination arrival times are simulated and no public time-stamped hallucination log exists; models are small and the task is extractive QA, so the numbers do not transfer to production; the method and its diagnostics do.</w:t>
       </w:r>
     </w:p>
     <w:p>
@@ -159,7 +159,7 @@
           <w:sz w:val="22"/>
           <w:szCs w:val="22"/>
         </w:rPr>
-        <w:t xml:space="preserve">We make three contributions, and we are explicit about which parts are new and which apply known results. </w:t>
+        <w:t xml:space="preserve">We make four contributions, and we are explicit about which parts are new and which apply known results. </w:t>
       </w:r>
       <w:r>
         <w:rPr>
@@ -195,6 +195,24 @@
           <w:sz w:val="22"/>
           <w:szCs w:val="22"/>
         </w:rPr>
+        <w:t xml:space="preserve">, we replace the single-Poisson description of "all failures" by a typed model (Section 3.6): hallucinations as thinned, over-dispersed streams; provider incidents as a seasonal Hawkes process; serving failures as heavy-tailed episodes; and human triage with heavy-tailed service; we give the superposition and clustering results (Proposition 6) and test the model classes on public data. </w:t>
+      </w:r>
+      <w:r>
+        <w:rPr>
+          <w:rFonts w:ascii="Times New Roman" w:cs="Times New Roman" w:eastAsia="Times New Roman" w:hAnsi="Times New Roman"/>
+          <w:b/>
+          <w:bCs/>
+          <w:sz w:val="22"/>
+          <w:szCs w:val="22"/>
+        </w:rPr>
+        <w:t xml:space="preserve">Third</w:t>
+      </w:r>
+      <w:r>
+        <w:rPr>
+          <w:rFonts w:ascii="Times New Roman" w:cs="Times New Roman" w:eastAsia="Times New Roman" w:hAnsi="Times New Roman"/>
+          <w:sz w:val="22"/>
+          <w:szCs w:val="22"/>
+        </w:rPr>
         <w:t xml:space="preserve">, we restate the multiplicative guardrail formula as the independence special case of Fréchet-type bounds on an arrival-rate (thinning) cascade (Proposition 3). Dependence between guardrail layers has been measured on real defence stacks (Alotaibi et al., 2026) and the independence product is known to over-credit redundancy (Bhardwaj et al., 2026); we add a measurement on hallucination-grounding layers and carry the correction through to the capacity decision. We then show that, once capacity is integer-valued, total cost is generally </w:t>
       </w:r>
       <w:r>
@@ -223,7 +241,7 @@
           <w:sz w:val="22"/>
           <w:szCs w:val="22"/>
         </w:rPr>
-        <w:t xml:space="preserve">Third</w:t>
+        <w:t xml:space="preserve">Fourth</w:t>
       </w:r>
       <w:r>
         <w:rPr>
@@ -6523,6 +6541,949 @@
     </w:p>
     <w:p>
       <w:pPr>
+        <w:pStyle w:val="Heading2"/>
+        <w:spacing w:after="100" w:before="200"/>
+      </w:pPr>
+      <w:r>
+        <w:rPr>
+          <w:rFonts w:ascii="Times New Roman" w:cs="Times New Roman" w:eastAsia="Times New Roman" w:hAnsi="Times New Roman"/>
+          <w:b/>
+          <w:bCs/>
+          <w:i/>
+          <w:iCs/>
+          <w:sz w:val="23"/>
+          <w:szCs w:val="23"/>
+        </w:rPr>
+        <w:t xml:space="preserve">3.6 Beyond a single Poisson: typed failure classes</w:t>
+      </w:r>
+    </w:p>
+    <w:p>
+      <w:pPr>
+        <w:spacing w:after="120" w:line="300"/>
+        <w:jc w:val="both"/>
+      </w:pPr>
+      <w:r>
+        <w:rPr>
+          <w:rFonts w:ascii="Times New Roman" w:cs="Times New Roman" w:eastAsia="Times New Roman" w:hAnsi="Times New Roman"/>
+          <w:sz w:val="22"/>
+          <w:szCs w:val="22"/>
+        </w:rPr>
+        <w:t xml:space="preserve">LLM operations produce several kinds of failures that violate the Poisson assumptions in different ways, so treating "all failures" as one Poisson stream is a modelling error rather than a simplification. We therefore model each class with the process that matches its mechanism and combine the classes only at the level of the human-handled event (an incident or ticket). Table 2b summarises the mapping, the assumption that fails and the evidence developed in Section 5.8.</w:t>
+      </w:r>
+    </w:p>
+    <w:p>
+      <w:pPr>
+        <w:keepNext/>
+        <w:spacing w:after="60" w:before="160"/>
+      </w:pPr>
+      <w:r>
+        <w:rPr>
+          <w:rFonts w:ascii="Times New Roman" w:cs="Times New Roman" w:eastAsia="Times New Roman" w:hAnsi="Times New Roman"/>
+          <w:b/>
+          <w:bCs/>
+          <w:sz w:val="20"/>
+          <w:szCs w:val="20"/>
+        </w:rPr>
+        <w:t xml:space="preserve">Table 2b. Failure classes, mechanisms and models</w:t>
+      </w:r>
+    </w:p>
+    <w:tbl>
+      <w:tblPr>
+        <w:tblW w:type="dxa" w:w="9360"/>
+        <w:tblBorders>
+          <w:top w:val="single" w:color="auto" w:sz="4"/>
+          <w:left w:val="single" w:color="auto" w:sz="4"/>
+          <w:bottom w:val="single" w:color="auto" w:sz="4"/>
+          <w:right w:val="single" w:color="auto" w:sz="4"/>
+          <w:insideH w:val="single" w:color="auto" w:sz="4"/>
+          <w:insideV w:val="single" w:color="auto" w:sz="4"/>
+        </w:tblBorders>
+      </w:tblPr>
+      <w:tblGrid>
+        <w:gridCol w:w="1500"/>
+        <w:gridCol w:w="2200"/>
+        <w:gridCol w:w="1700"/>
+        <w:gridCol w:w="2300"/>
+        <w:gridCol w:w="1660"/>
+      </w:tblGrid>
+      <w:tr>
+        <w:trPr>
+          <w:tblHeader/>
+        </w:trPr>
+        <w:tc>
+          <w:tcPr>
+            <w:tcW w:type="dxa" w:w="1500"/>
+            <w:tcBorders>
+              <w:top w:val="single" w:color="AAAAAA" w:sz="4"/>
+              <w:left w:val="single" w:color="AAAAAA" w:sz="4"/>
+              <w:bottom w:val="single" w:color="AAAAAA" w:sz="4"/>
+              <w:right w:val="single" w:color="AAAAAA" w:sz="4"/>
+            </w:tcBorders>
+            <w:shd w:fill="E8E8E8" w:color="auto" w:val="clear"/>
+            <w:tcMar>
+              <w:top w:type="dxa" w:w="40"/>
+              <w:left w:type="dxa" w:w="80"/>
+              <w:bottom w:type="dxa" w:w="40"/>
+              <w:right w:type="dxa" w:w="80"/>
+            </w:tcMar>
+          </w:tcPr>
+          <w:p>
+            <w:pPr>
+              <w:jc w:val="center"/>
+            </w:pPr>
+            <w:r>
+              <w:rPr>
+                <w:rFonts w:ascii="Times New Roman" w:cs="Times New Roman" w:eastAsia="Times New Roman" w:hAnsi="Times New Roman"/>
+                <w:b/>
+                <w:bCs/>
+                <w:sz w:val="18"/>
+                <w:szCs w:val="18"/>
+              </w:rPr>
+              <w:t xml:space="preserve">Class</w:t>
+            </w:r>
+          </w:p>
+        </w:tc>
+        <w:tc>
+          <w:tcPr>
+            <w:tcW w:type="dxa" w:w="2200"/>
+            <w:tcBorders>
+              <w:top w:val="single" w:color="AAAAAA" w:sz="4"/>
+              <w:left w:val="single" w:color="AAAAAA" w:sz="4"/>
+              <w:bottom w:val="single" w:color="AAAAAA" w:sz="4"/>
+              <w:right w:val="single" w:color="AAAAAA" w:sz="4"/>
+            </w:tcBorders>
+            <w:shd w:fill="E8E8E8" w:color="auto" w:val="clear"/>
+            <w:tcMar>
+              <w:top w:type="dxa" w:w="40"/>
+              <w:left w:type="dxa" w:w="80"/>
+              <w:bottom w:type="dxa" w:w="40"/>
+              <w:right w:type="dxa" w:w="80"/>
+            </w:tcMar>
+          </w:tcPr>
+          <w:p>
+            <w:pPr>
+              <w:jc w:val="center"/>
+            </w:pPr>
+            <w:r>
+              <w:rPr>
+                <w:rFonts w:ascii="Times New Roman" w:cs="Times New Roman" w:eastAsia="Times New Roman" w:hAnsi="Times New Roman"/>
+                <w:b/>
+                <w:bCs/>
+                <w:sz w:val="18"/>
+                <w:szCs w:val="18"/>
+              </w:rPr>
+              <w:t xml:space="preserve">Mechanism</w:t>
+            </w:r>
+          </w:p>
+        </w:tc>
+        <w:tc>
+          <w:tcPr>
+            <w:tcW w:type="dxa" w:w="1700"/>
+            <w:tcBorders>
+              <w:top w:val="single" w:color="AAAAAA" w:sz="4"/>
+              <w:left w:val="single" w:color="AAAAAA" w:sz="4"/>
+              <w:bottom w:val="single" w:color="AAAAAA" w:sz="4"/>
+              <w:right w:val="single" w:color="AAAAAA" w:sz="4"/>
+            </w:tcBorders>
+            <w:shd w:fill="E8E8E8" w:color="auto" w:val="clear"/>
+            <w:tcMar>
+              <w:top w:type="dxa" w:w="40"/>
+              <w:left w:type="dxa" w:w="80"/>
+              <w:bottom w:type="dxa" w:w="40"/>
+              <w:right w:type="dxa" w:w="80"/>
+            </w:tcMar>
+          </w:tcPr>
+          <w:p>
+            <w:pPr>
+              <w:jc w:val="center"/>
+            </w:pPr>
+            <w:r>
+              <w:rPr>
+                <w:rFonts w:ascii="Times New Roman" w:cs="Times New Roman" w:eastAsia="Times New Roman" w:hAnsi="Times New Roman"/>
+                <w:b/>
+                <w:bCs/>
+                <w:sz w:val="18"/>
+                <w:szCs w:val="18"/>
+              </w:rPr>
+              <w:t xml:space="preserve">Poisson assumption violated</w:t>
+            </w:r>
+          </w:p>
+        </w:tc>
+        <w:tc>
+          <w:tcPr>
+            <w:tcW w:type="dxa" w:w="2300"/>
+            <w:tcBorders>
+              <w:top w:val="single" w:color="AAAAAA" w:sz="4"/>
+              <w:left w:val="single" w:color="AAAAAA" w:sz="4"/>
+              <w:bottom w:val="single" w:color="AAAAAA" w:sz="4"/>
+              <w:right w:val="single" w:color="AAAAAA" w:sz="4"/>
+            </w:tcBorders>
+            <w:shd w:fill="E8E8E8" w:color="auto" w:val="clear"/>
+            <w:tcMar>
+              <w:top w:type="dxa" w:w="40"/>
+              <w:left w:type="dxa" w:w="80"/>
+              <w:bottom w:type="dxa" w:w="40"/>
+              <w:right w:type="dxa" w:w="80"/>
+            </w:tcMar>
+          </w:tcPr>
+          <w:p>
+            <w:pPr>
+              <w:jc w:val="center"/>
+            </w:pPr>
+            <w:r>
+              <w:rPr>
+                <w:rFonts w:ascii="Times New Roman" w:cs="Times New Roman" w:eastAsia="Times New Roman" w:hAnsi="Times New Roman"/>
+                <w:b/>
+                <w:bCs/>
+                <w:sz w:val="18"/>
+                <w:szCs w:val="18"/>
+              </w:rPr>
+              <w:t xml:space="preserve">Model used</w:t>
+            </w:r>
+          </w:p>
+        </w:tc>
+        <w:tc>
+          <w:tcPr>
+            <w:tcW w:type="dxa" w:w="1660"/>
+            <w:tcBorders>
+              <w:top w:val="single" w:color="AAAAAA" w:sz="4"/>
+              <w:left w:val="single" w:color="AAAAAA" w:sz="4"/>
+              <w:bottom w:val="single" w:color="AAAAAA" w:sz="4"/>
+              <w:right w:val="single" w:color="AAAAAA" w:sz="4"/>
+            </w:tcBorders>
+            <w:shd w:fill="E8E8E8" w:color="auto" w:val="clear"/>
+            <w:tcMar>
+              <w:top w:type="dxa" w:w="40"/>
+              <w:left w:type="dxa" w:w="80"/>
+              <w:bottom w:type="dxa" w:w="40"/>
+              <w:right w:type="dxa" w:w="80"/>
+            </w:tcMar>
+          </w:tcPr>
+          <w:p>
+            <w:pPr>
+              <w:jc w:val="center"/>
+            </w:pPr>
+            <w:r>
+              <w:rPr>
+                <w:rFonts w:ascii="Times New Roman" w:cs="Times New Roman" w:eastAsia="Times New Roman" w:hAnsi="Times New Roman"/>
+                <w:b/>
+                <w:bCs/>
+                <w:sz w:val="18"/>
+                <w:szCs w:val="18"/>
+              </w:rPr>
+              <w:t xml:space="preserve">Evidence</w:t>
+            </w:r>
+          </w:p>
+        </w:tc>
+      </w:tr>
+      <w:tr>
+        <w:tc>
+          <w:tcPr>
+            <w:tcW w:type="dxa" w:w="1500"/>
+            <w:tcBorders>
+              <w:top w:val="single" w:color="AAAAAA" w:sz="4"/>
+              <w:left w:val="single" w:color="AAAAAA" w:sz="4"/>
+              <w:bottom w:val="single" w:color="AAAAAA" w:sz="4"/>
+              <w:right w:val="single" w:color="AAAAAA" w:sz="4"/>
+            </w:tcBorders>
+            <w:tcMar>
+              <w:top w:type="dxa" w:w="40"/>
+              <w:left w:type="dxa" w:w="80"/>
+              <w:bottom w:type="dxa" w:w="40"/>
+              <w:right w:type="dxa" w:w="80"/>
+            </w:tcMar>
+          </w:tcPr>
+          <w:p>
+            <w:pPr>
+              <w:jc w:val="center"/>
+            </w:pPr>
+            <w:r>
+              <w:rPr>
+                <w:rFonts w:ascii="Times New Roman" w:cs="Times New Roman" w:eastAsia="Times New Roman" w:hAnsi="Times New Roman"/>
+                <w:b w:val="false"/>
+                <w:bCs w:val="false"/>
+                <w:sz w:val="18"/>
+                <w:szCs w:val="18"/>
+              </w:rPr>
+              <w:t xml:space="preserve">Hallucination (per answered query)</w:t>
+            </w:r>
+          </w:p>
+        </w:tc>
+        <w:tc>
+          <w:tcPr>
+            <w:tcW w:type="dxa" w:w="2200"/>
+            <w:tcBorders>
+              <w:top w:val="single" w:color="AAAAAA" w:sz="4"/>
+              <w:left w:val="single" w:color="AAAAAA" w:sz="4"/>
+              <w:bottom w:val="single" w:color="AAAAAA" w:sz="4"/>
+              <w:right w:val="single" w:color="AAAAAA" w:sz="4"/>
+            </w:tcBorders>
+            <w:tcMar>
+              <w:top w:type="dxa" w:w="40"/>
+              <w:left w:type="dxa" w:w="80"/>
+              <w:bottom w:type="dxa" w:w="40"/>
+              <w:right w:type="dxa" w:w="80"/>
+            </w:tcMar>
+          </w:tcPr>
+          <w:p>
+            <w:pPr>
+              <w:jc w:val="center"/>
+            </w:pPr>
+            <w:r>
+              <w:rPr>
+                <w:rFonts w:ascii="Times New Roman" w:cs="Times New Roman" w:eastAsia="Times New Roman" w:hAnsi="Times New Roman"/>
+                <w:b w:val="false"/>
+                <w:bCs w:val="false"/>
+                <w:sz w:val="18"/>
+                <w:szCs w:val="18"/>
+              </w:rPr>
+              <w:t xml:space="preserve">Independent errors of the model given the query, on a clustered, daily-varying request stream</w:t>
+            </w:r>
+          </w:p>
+        </w:tc>
+        <w:tc>
+          <w:tcPr>
+            <w:tcW w:type="dxa" w:w="1700"/>
+            <w:tcBorders>
+              <w:top w:val="single" w:color="AAAAAA" w:sz="4"/>
+              <w:left w:val="single" w:color="AAAAAA" w:sz="4"/>
+              <w:bottom w:val="single" w:color="AAAAAA" w:sz="4"/>
+              <w:right w:val="single" w:color="AAAAAA" w:sz="4"/>
+            </w:tcBorders>
+            <w:tcMar>
+              <w:top w:type="dxa" w:w="40"/>
+              <w:left w:type="dxa" w:w="80"/>
+              <w:bottom w:type="dxa" w:w="40"/>
+              <w:right w:type="dxa" w:w="80"/>
+            </w:tcMar>
+          </w:tcPr>
+          <w:p>
+            <w:pPr>
+              <w:jc w:val="center"/>
+            </w:pPr>
+            <w:r>
+              <w:rPr>
+                <w:rFonts w:ascii="Times New Roman" w:cs="Times New Roman" w:eastAsia="Times New Roman" w:hAnsi="Times New Roman"/>
+                <w:b w:val="false"/>
+                <w:bCs w:val="false"/>
+                <w:sz w:val="18"/>
+                <w:szCs w:val="18"/>
+              </w:rPr>
+              <w:t xml:space="preserve">Constant rate; independence of requests</w:t>
+            </w:r>
+          </w:p>
+        </w:tc>
+        <w:tc>
+          <w:tcPr>
+            <w:tcW w:type="dxa" w:w="2300"/>
+            <w:tcBorders>
+              <w:top w:val="single" w:color="AAAAAA" w:sz="4"/>
+              <w:left w:val="single" w:color="AAAAAA" w:sz="4"/>
+              <w:bottom w:val="single" w:color="AAAAAA" w:sz="4"/>
+              <w:right w:val="single" w:color="AAAAAA" w:sz="4"/>
+            </w:tcBorders>
+            <w:tcMar>
+              <w:top w:type="dxa" w:w="40"/>
+              <w:left w:type="dxa" w:w="80"/>
+              <w:bottom w:type="dxa" w:w="40"/>
+              <w:right w:type="dxa" w:w="80"/>
+            </w:tcMar>
+          </w:tcPr>
+          <w:p>
+            <w:pPr>
+              <w:jc w:val="center"/>
+            </w:pPr>
+            <w:r>
+              <w:rPr>
+                <w:rFonts w:ascii="Times New Roman" w:cs="Times New Roman" w:eastAsia="Times New Roman" w:hAnsi="Times New Roman"/>
+                <w:b w:val="false"/>
+                <w:bCs w:val="false"/>
+                <w:sz w:val="18"/>
+                <w:szCs w:val="18"/>
+              </w:rPr>
+              <w:t xml:space="preserve">Cox / negative-binomial thinning of the request stream (Props. 2, 5)</w:t>
+            </w:r>
+          </w:p>
+        </w:tc>
+        <w:tc>
+          <w:tcPr>
+            <w:tcW w:type="dxa" w:w="1660"/>
+            <w:tcBorders>
+              <w:top w:val="single" w:color="AAAAAA" w:sz="4"/>
+              <w:left w:val="single" w:color="AAAAAA" w:sz="4"/>
+              <w:bottom w:val="single" w:color="AAAAAA" w:sz="4"/>
+              <w:right w:val="single" w:color="AAAAAA" w:sz="4"/>
+            </w:tcBorders>
+            <w:tcMar>
+              <w:top w:type="dxa" w:w="40"/>
+              <w:left w:type="dxa" w:w="80"/>
+              <w:bottom w:type="dxa" w:w="40"/>
+              <w:right w:type="dxa" w:w="80"/>
+            </w:tcMar>
+          </w:tcPr>
+          <w:p>
+            <w:pPr>
+              <w:jc w:val="center"/>
+            </w:pPr>
+            <w:r>
+              <w:rPr>
+                <w:rFonts w:ascii="Times New Roman" w:cs="Times New Roman" w:eastAsia="Times New Roman" w:hAnsi="Times New Roman"/>
+                <w:b w:val="false"/>
+                <w:bCs w:val="false"/>
+                <w:sz w:val="18"/>
+                <w:szCs w:val="18"/>
+              </w:rPr>
+              <w:t xml:space="preserve">Sections 5.4, 5.6, 5.7</w:t>
+            </w:r>
+          </w:p>
+        </w:tc>
+      </w:tr>
+      <w:tr>
+        <w:tc>
+          <w:tcPr>
+            <w:tcW w:type="dxa" w:w="1500"/>
+            <w:tcBorders>
+              <w:top w:val="single" w:color="AAAAAA" w:sz="4"/>
+              <w:left w:val="single" w:color="AAAAAA" w:sz="4"/>
+              <w:bottom w:val="single" w:color="AAAAAA" w:sz="4"/>
+              <w:right w:val="single" w:color="AAAAAA" w:sz="4"/>
+            </w:tcBorders>
+            <w:tcMar>
+              <w:top w:type="dxa" w:w="40"/>
+              <w:left w:type="dxa" w:w="80"/>
+              <w:bottom w:type="dxa" w:w="40"/>
+              <w:right w:type="dxa" w:w="80"/>
+            </w:tcMar>
+          </w:tcPr>
+          <w:p>
+            <w:pPr>
+              <w:jc w:val="center"/>
+            </w:pPr>
+            <w:r>
+              <w:rPr>
+                <w:rFonts w:ascii="Times New Roman" w:cs="Times New Roman" w:eastAsia="Times New Roman" w:hAnsi="Times New Roman"/>
+                <w:b w:val="false"/>
+                <w:bCs w:val="false"/>
+                <w:sz w:val="18"/>
+                <w:szCs w:val="18"/>
+              </w:rPr>
+              <w:t xml:space="preserve">Provider-declared incidents</w:t>
+            </w:r>
+          </w:p>
+        </w:tc>
+        <w:tc>
+          <w:tcPr>
+            <w:tcW w:type="dxa" w:w="2200"/>
+            <w:tcBorders>
+              <w:top w:val="single" w:color="AAAAAA" w:sz="4"/>
+              <w:left w:val="single" w:color="AAAAAA" w:sz="4"/>
+              <w:bottom w:val="single" w:color="AAAAAA" w:sz="4"/>
+              <w:right w:val="single" w:color="AAAAAA" w:sz="4"/>
+            </w:tcBorders>
+            <w:tcMar>
+              <w:top w:type="dxa" w:w="40"/>
+              <w:left w:type="dxa" w:w="80"/>
+              <w:bottom w:type="dxa" w:w="40"/>
+              <w:right w:type="dxa" w:w="80"/>
+            </w:tcMar>
+          </w:tcPr>
+          <w:p>
+            <w:pPr>
+              <w:jc w:val="center"/>
+            </w:pPr>
+            <w:r>
+              <w:rPr>
+                <w:rFonts w:ascii="Times New Roman" w:cs="Times New Roman" w:eastAsia="Times New Roman" w:hAnsi="Times New Roman"/>
+                <w:b w:val="false"/>
+                <w:bCs w:val="false"/>
+                <w:sz w:val="18"/>
+                <w:szCs w:val="18"/>
+              </w:rPr>
+              <w:t xml:space="preserve">Outages with follow-up incidents within hours; weekday/hour seasonality</w:t>
+            </w:r>
+          </w:p>
+        </w:tc>
+        <w:tc>
+          <w:tcPr>
+            <w:tcW w:type="dxa" w:w="1700"/>
+            <w:tcBorders>
+              <w:top w:val="single" w:color="AAAAAA" w:sz="4"/>
+              <w:left w:val="single" w:color="AAAAAA" w:sz="4"/>
+              <w:bottom w:val="single" w:color="AAAAAA" w:sz="4"/>
+              <w:right w:val="single" w:color="AAAAAA" w:sz="4"/>
+            </w:tcBorders>
+            <w:tcMar>
+              <w:top w:type="dxa" w:w="40"/>
+              <w:left w:type="dxa" w:w="80"/>
+              <w:bottom w:type="dxa" w:w="40"/>
+              <w:right w:type="dxa" w:w="80"/>
+            </w:tcMar>
+          </w:tcPr>
+          <w:p>
+            <w:pPr>
+              <w:jc w:val="center"/>
+            </w:pPr>
+            <w:r>
+              <w:rPr>
+                <w:rFonts w:ascii="Times New Roman" w:cs="Times New Roman" w:eastAsia="Times New Roman" w:hAnsi="Times New Roman"/>
+                <w:b w:val="false"/>
+                <w:bCs w:val="false"/>
+                <w:sz w:val="18"/>
+                <w:szCs w:val="18"/>
+              </w:rPr>
+              <w:t xml:space="preserve">Orderliness and independence (self-excitation)</w:t>
+            </w:r>
+          </w:p>
+        </w:tc>
+        <w:tc>
+          <w:tcPr>
+            <w:tcW w:type="dxa" w:w="2300"/>
+            <w:tcBorders>
+              <w:top w:val="single" w:color="AAAAAA" w:sz="4"/>
+              <w:left w:val="single" w:color="AAAAAA" w:sz="4"/>
+              <w:bottom w:val="single" w:color="AAAAAA" w:sz="4"/>
+              <w:right w:val="single" w:color="AAAAAA" w:sz="4"/>
+            </w:tcBorders>
+            <w:tcMar>
+              <w:top w:type="dxa" w:w="40"/>
+              <w:left w:type="dxa" w:w="80"/>
+              <w:bottom w:type="dxa" w:w="40"/>
+              <w:right w:type="dxa" w:w="80"/>
+            </w:tcMar>
+          </w:tcPr>
+          <w:p>
+            <w:pPr>
+              <w:jc w:val="center"/>
+            </w:pPr>
+            <w:r>
+              <w:rPr>
+                <w:rFonts w:ascii="Times New Roman" w:cs="Times New Roman" w:eastAsia="Times New Roman" w:hAnsi="Times New Roman"/>
+                <w:b w:val="false"/>
+                <w:bCs w:val="false"/>
+                <w:sz w:val="18"/>
+                <w:szCs w:val="18"/>
+              </w:rPr>
+              <w:t xml:space="preserve">Seasonal Hawkes process (exponential kernel); NHPP as null</w:t>
+            </w:r>
+          </w:p>
+        </w:tc>
+        <w:tc>
+          <w:tcPr>
+            <w:tcW w:type="dxa" w:w="1660"/>
+            <w:tcBorders>
+              <w:top w:val="single" w:color="AAAAAA" w:sz="4"/>
+              <w:left w:val="single" w:color="AAAAAA" w:sz="4"/>
+              <w:bottom w:val="single" w:color="AAAAAA" w:sz="4"/>
+              <w:right w:val="single" w:color="AAAAAA" w:sz="4"/>
+            </w:tcBorders>
+            <w:tcMar>
+              <w:top w:type="dxa" w:w="40"/>
+              <w:left w:type="dxa" w:w="80"/>
+              <w:bottom w:type="dxa" w:w="40"/>
+              <w:right w:type="dxa" w:w="80"/>
+            </w:tcMar>
+          </w:tcPr>
+          <w:p>
+            <w:pPr>
+              <w:jc w:val="center"/>
+            </w:pPr>
+            <w:r>
+              <w:rPr>
+                <w:rFonts w:ascii="Times New Roman" w:cs="Times New Roman" w:eastAsia="Times New Roman" w:hAnsi="Times New Roman"/>
+                <w:b w:val="false"/>
+                <w:bCs w:val="false"/>
+                <w:sz w:val="18"/>
+                <w:szCs w:val="18"/>
+              </w:rPr>
+              <w:t xml:space="preserve">Section 5.8</w:t>
+            </w:r>
+          </w:p>
+        </w:tc>
+      </w:tr>
+      <w:tr>
+        <w:tc>
+          <w:tcPr>
+            <w:tcW w:type="dxa" w:w="1500"/>
+            <w:tcBorders>
+              <w:top w:val="single" w:color="AAAAAA" w:sz="4"/>
+              <w:left w:val="single" w:color="AAAAAA" w:sz="4"/>
+              <w:bottom w:val="single" w:color="AAAAAA" w:sz="4"/>
+              <w:right w:val="single" w:color="AAAAAA" w:sz="4"/>
+            </w:tcBorders>
+            <w:tcMar>
+              <w:top w:type="dxa" w:w="40"/>
+              <w:left w:type="dxa" w:w="80"/>
+              <w:bottom w:type="dxa" w:w="40"/>
+              <w:right w:type="dxa" w:w="80"/>
+            </w:tcMar>
+          </w:tcPr>
+          <w:p>
+            <w:pPr>
+              <w:jc w:val="center"/>
+            </w:pPr>
+            <w:r>
+              <w:rPr>
+                <w:rFonts w:ascii="Times New Roman" w:cs="Times New Roman" w:eastAsia="Times New Roman" w:hAnsi="Times New Roman"/>
+                <w:b w:val="false"/>
+                <w:bCs w:val="false"/>
+                <w:sz w:val="18"/>
+                <w:szCs w:val="18"/>
+              </w:rPr>
+              <w:t xml:space="preserve">Serving errors and timeouts</w:t>
+            </w:r>
+          </w:p>
+        </w:tc>
+        <w:tc>
+          <w:tcPr>
+            <w:tcW w:type="dxa" w:w="2200"/>
+            <w:tcBorders>
+              <w:top w:val="single" w:color="AAAAAA" w:sz="4"/>
+              <w:left w:val="single" w:color="AAAAAA" w:sz="4"/>
+              <w:bottom w:val="single" w:color="AAAAAA" w:sz="4"/>
+              <w:right w:val="single" w:color="AAAAAA" w:sz="4"/>
+            </w:tcBorders>
+            <w:tcMar>
+              <w:top w:type="dxa" w:w="40"/>
+              <w:left w:type="dxa" w:w="80"/>
+              <w:bottom w:type="dxa" w:w="40"/>
+              <w:right w:type="dxa" w:w="80"/>
+            </w:tcMar>
+          </w:tcPr>
+          <w:p>
+            <w:pPr>
+              <w:jc w:val="center"/>
+            </w:pPr>
+            <w:r>
+              <w:rPr>
+                <w:rFonts w:ascii="Times New Roman" w:cs="Times New Roman" w:eastAsia="Times New Roman" w:hAnsi="Times New Roman"/>
+                <w:b w:val="false"/>
+                <w:bCs w:val="false"/>
+                <w:sz w:val="18"/>
+                <w:szCs w:val="18"/>
+              </w:rPr>
+              <w:t xml:space="preserve">Common-cause episodes (outages, rate limiting) with heavy-tailed size; isolated background errors</w:t>
+            </w:r>
+          </w:p>
+        </w:tc>
+        <w:tc>
+          <w:tcPr>
+            <w:tcW w:type="dxa" w:w="1700"/>
+            <w:tcBorders>
+              <w:top w:val="single" w:color="AAAAAA" w:sz="4"/>
+              <w:left w:val="single" w:color="AAAAAA" w:sz="4"/>
+              <w:bottom w:val="single" w:color="AAAAAA" w:sz="4"/>
+              <w:right w:val="single" w:color="AAAAAA" w:sz="4"/>
+            </w:tcBorders>
+            <w:tcMar>
+              <w:top w:type="dxa" w:w="40"/>
+              <w:left w:type="dxa" w:w="80"/>
+              <w:bottom w:type="dxa" w:w="40"/>
+              <w:right w:type="dxa" w:w="80"/>
+            </w:tcMar>
+          </w:tcPr>
+          <w:p>
+            <w:pPr>
+              <w:jc w:val="center"/>
+            </w:pPr>
+            <w:r>
+              <w:rPr>
+                <w:rFonts w:ascii="Times New Roman" w:cs="Times New Roman" w:eastAsia="Times New Roman" w:hAnsi="Times New Roman"/>
+                <w:b w:val="false"/>
+                <w:bCs w:val="false"/>
+                <w:sz w:val="18"/>
+                <w:szCs w:val="18"/>
+              </w:rPr>
+              <w:t xml:space="preserve">Orderliness (batch arrivals), independence</w:t>
+            </w:r>
+          </w:p>
+        </w:tc>
+        <w:tc>
+          <w:tcPr>
+            <w:tcW w:type="dxa" w:w="2300"/>
+            <w:tcBorders>
+              <w:top w:val="single" w:color="AAAAAA" w:sz="4"/>
+              <w:left w:val="single" w:color="AAAAAA" w:sz="4"/>
+              <w:bottom w:val="single" w:color="AAAAAA" w:sz="4"/>
+              <w:right w:val="single" w:color="AAAAAA" w:sz="4"/>
+            </w:tcBorders>
+            <w:tcMar>
+              <w:top w:type="dxa" w:w="40"/>
+              <w:left w:type="dxa" w:w="80"/>
+              <w:bottom w:type="dxa" w:w="40"/>
+              <w:right w:type="dxa" w:w="80"/>
+            </w:tcMar>
+          </w:tcPr>
+          <w:p>
+            <w:pPr>
+              <w:jc w:val="center"/>
+            </w:pPr>
+            <w:r>
+              <w:rPr>
+                <w:rFonts w:ascii="Times New Roman" w:cs="Times New Roman" w:eastAsia="Times New Roman" w:hAnsi="Times New Roman"/>
+                <w:b w:val="false"/>
+                <w:bCs w:val="false"/>
+                <w:sz w:val="18"/>
+                <w:szCs w:val="18"/>
+              </w:rPr>
+              <w:t xml:space="preserve">Episode process (Hawkes) with heavy-tailed marks; compound Poisson for counts of failed requests</w:t>
+            </w:r>
+          </w:p>
+        </w:tc>
+        <w:tc>
+          <w:tcPr>
+            <w:tcW w:type="dxa" w:w="1660"/>
+            <w:tcBorders>
+              <w:top w:val="single" w:color="AAAAAA" w:sz="4"/>
+              <w:left w:val="single" w:color="AAAAAA" w:sz="4"/>
+              <w:bottom w:val="single" w:color="AAAAAA" w:sz="4"/>
+              <w:right w:val="single" w:color="AAAAAA" w:sz="4"/>
+            </w:tcBorders>
+            <w:tcMar>
+              <w:top w:type="dxa" w:w="40"/>
+              <w:left w:type="dxa" w:w="80"/>
+              <w:bottom w:type="dxa" w:w="40"/>
+              <w:right w:type="dxa" w:w="80"/>
+            </w:tcMar>
+          </w:tcPr>
+          <w:p>
+            <w:pPr>
+              <w:jc w:val="center"/>
+            </w:pPr>
+            <w:r>
+              <w:rPr>
+                <w:rFonts w:ascii="Times New Roman" w:cs="Times New Roman" w:eastAsia="Times New Roman" w:hAnsi="Times New Roman"/>
+                <w:b w:val="false"/>
+                <w:bCs w:val="false"/>
+                <w:sz w:val="18"/>
+                <w:szCs w:val="18"/>
+              </w:rPr>
+              <w:t xml:space="preserve">Section 5.8</w:t>
+            </w:r>
+          </w:p>
+        </w:tc>
+      </w:tr>
+      <w:tr>
+        <w:tc>
+          <w:tcPr>
+            <w:tcW w:type="dxa" w:w="1500"/>
+            <w:tcBorders>
+              <w:top w:val="single" w:color="AAAAAA" w:sz="4"/>
+              <w:left w:val="single" w:color="AAAAAA" w:sz="4"/>
+              <w:bottom w:val="single" w:color="AAAAAA" w:sz="4"/>
+              <w:right w:val="single" w:color="AAAAAA" w:sz="4"/>
+            </w:tcBorders>
+            <w:tcMar>
+              <w:top w:type="dxa" w:w="40"/>
+              <w:left w:type="dxa" w:w="80"/>
+              <w:bottom w:type="dxa" w:w="40"/>
+              <w:right w:type="dxa" w:w="80"/>
+            </w:tcMar>
+          </w:tcPr>
+          <w:p>
+            <w:pPr>
+              <w:jc w:val="center"/>
+            </w:pPr>
+            <w:r>
+              <w:rPr>
+                <w:rFonts w:ascii="Times New Roman" w:cs="Times New Roman" w:eastAsia="Times New Roman" w:hAnsi="Times New Roman"/>
+                <w:b w:val="false"/>
+                <w:bCs w:val="false"/>
+                <w:sz w:val="18"/>
+                <w:szCs w:val="18"/>
+              </w:rPr>
+              <w:t xml:space="preserve">Human triage service</w:t>
+            </w:r>
+          </w:p>
+        </w:tc>
+        <w:tc>
+          <w:tcPr>
+            <w:tcW w:type="dxa" w:w="2200"/>
+            <w:tcBorders>
+              <w:top w:val="single" w:color="AAAAAA" w:sz="4"/>
+              <w:left w:val="single" w:color="AAAAAA" w:sz="4"/>
+              <w:bottom w:val="single" w:color="AAAAAA" w:sz="4"/>
+              <w:right w:val="single" w:color="AAAAAA" w:sz="4"/>
+            </w:tcBorders>
+            <w:tcMar>
+              <w:top w:type="dxa" w:w="40"/>
+              <w:left w:type="dxa" w:w="80"/>
+              <w:bottom w:type="dxa" w:w="40"/>
+              <w:right w:type="dxa" w:w="80"/>
+            </w:tcMar>
+          </w:tcPr>
+          <w:p>
+            <w:pPr>
+              <w:jc w:val="center"/>
+            </w:pPr>
+            <w:r>
+              <w:rPr>
+                <w:rFonts w:ascii="Times New Roman" w:cs="Times New Roman" w:eastAsia="Times New Roman" w:hAnsi="Times New Roman"/>
+                <w:b w:val="false"/>
+                <w:bCs w:val="false"/>
+                <w:sz w:val="18"/>
+                <w:szCs w:val="18"/>
+              </w:rPr>
+              <w:t xml:space="preserve">Mixture of quick and very long tickets</w:t>
+            </w:r>
+          </w:p>
+        </w:tc>
+        <w:tc>
+          <w:tcPr>
+            <w:tcW w:type="dxa" w:w="1700"/>
+            <w:tcBorders>
+              <w:top w:val="single" w:color="AAAAAA" w:sz="4"/>
+              <w:left w:val="single" w:color="AAAAAA" w:sz="4"/>
+              <w:bottom w:val="single" w:color="AAAAAA" w:sz="4"/>
+              <w:right w:val="single" w:color="AAAAAA" w:sz="4"/>
+            </w:tcBorders>
+            <w:tcMar>
+              <w:top w:type="dxa" w:w="40"/>
+              <w:left w:type="dxa" w:w="80"/>
+              <w:bottom w:type="dxa" w:w="40"/>
+              <w:right w:type="dxa" w:w="80"/>
+            </w:tcMar>
+          </w:tcPr>
+          <w:p>
+            <w:pPr>
+              <w:jc w:val="center"/>
+            </w:pPr>
+            <w:r>
+              <w:rPr>
+                <w:rFonts w:ascii="Times New Roman" w:cs="Times New Roman" w:eastAsia="Times New Roman" w:hAnsi="Times New Roman"/>
+                <w:b w:val="false"/>
+                <w:bCs w:val="false"/>
+                <w:sz w:val="18"/>
+                <w:szCs w:val="18"/>
+              </w:rPr>
+              <w:t xml:space="preserve">Exponential service</w:t>
+            </w:r>
+          </w:p>
+        </w:tc>
+        <w:tc>
+          <w:tcPr>
+            <w:tcW w:type="dxa" w:w="2300"/>
+            <w:tcBorders>
+              <w:top w:val="single" w:color="AAAAAA" w:sz="4"/>
+              <w:left w:val="single" w:color="AAAAAA" w:sz="4"/>
+              <w:bottom w:val="single" w:color="AAAAAA" w:sz="4"/>
+              <w:right w:val="single" w:color="AAAAAA" w:sz="4"/>
+            </w:tcBorders>
+            <w:tcMar>
+              <w:top w:type="dxa" w:w="40"/>
+              <w:left w:type="dxa" w:w="80"/>
+              <w:bottom w:type="dxa" w:w="40"/>
+              <w:right w:type="dxa" w:w="80"/>
+            </w:tcMar>
+          </w:tcPr>
+          <w:p>
+            <w:pPr>
+              <w:jc w:val="center"/>
+            </w:pPr>
+            <w:r>
+              <w:rPr>
+                <w:rFonts w:ascii="Times New Roman" w:cs="Times New Roman" w:eastAsia="Times New Roman" w:hAnsi="Times New Roman"/>
+                <w:b w:val="false"/>
+                <w:bCs w:val="false"/>
+                <w:sz w:val="18"/>
+                <w:szCs w:val="18"/>
+              </w:rPr>
+              <w:t xml:space="preserve">Heavy-tailed (Weibull / lognormal) service; workload headroom</w:t>
+            </w:r>
+          </w:p>
+        </w:tc>
+        <w:tc>
+          <w:tcPr>
+            <w:tcW w:type="dxa" w:w="1660"/>
+            <w:tcBorders>
+              <w:top w:val="single" w:color="AAAAAA" w:sz="4"/>
+              <w:left w:val="single" w:color="AAAAAA" w:sz="4"/>
+              <w:bottom w:val="single" w:color="AAAAAA" w:sz="4"/>
+              <w:right w:val="single" w:color="AAAAAA" w:sz="4"/>
+            </w:tcBorders>
+            <w:tcMar>
+              <w:top w:type="dxa" w:w="40"/>
+              <w:left w:type="dxa" w:w="80"/>
+              <w:bottom w:type="dxa" w:w="40"/>
+              <w:right w:type="dxa" w:w="80"/>
+            </w:tcMar>
+          </w:tcPr>
+          <w:p>
+            <w:pPr>
+              <w:jc w:val="center"/>
+            </w:pPr>
+            <w:r>
+              <w:rPr>
+                <w:rFonts w:ascii="Times New Roman" w:cs="Times New Roman" w:eastAsia="Times New Roman" w:hAnsi="Times New Roman"/>
+                <w:b w:val="false"/>
+                <w:bCs w:val="false"/>
+                <w:sz w:val="18"/>
+                <w:szCs w:val="18"/>
+              </w:rPr>
+              <w:t xml:space="preserve">Section 5.7</w:t>
+            </w:r>
+          </w:p>
+        </w:tc>
+      </w:tr>
+    </w:tbl>
+    <w:p>
+      <w:pPr>
+        <w:spacing w:after="120"/>
+      </w:pPr>
+    </w:p>
+    <w:p>
+      <w:pPr>
+        <w:pBdr>
+          <w:left w:val="single" w:color="888888" w:sz="12" w:space="8"/>
+        </w:pBdr>
+        <w:spacing w:after="120" w:line="300"/>
+        <w:ind w:left="360" w:right="360"/>
+        <w:jc w:val="both"/>
+      </w:pPr>
+      <w:r>
+        <w:rPr>
+          <w:rFonts w:ascii="Times New Roman" w:cs="Times New Roman" w:eastAsia="Times New Roman" w:hAnsi="Times New Roman"/>
+          <w:b/>
+          <w:bCs/>
+          <w:sz w:val="22"/>
+          <w:szCs w:val="22"/>
+        </w:rPr>
+        <w:t xml:space="preserve">Proposition 6 (superposition and clustering). </w:t>
+      </w:r>
+      <w:r>
+        <w:rPr>
+          <w:rFonts w:ascii="Times New Roman" w:cs="Times New Roman" w:eastAsia="Times New Roman" w:hAnsi="Times New Roman"/>
+          <w:sz w:val="22"/>
+          <w:szCs w:val="22"/>
+        </w:rPr>
+        <w:t xml:space="preserve">(a) If the daily counts of independent failure classes j have means λ_j and dispersion indices φ_j = Var/mean, the total daily count has mean Σλ_j and Var = Σλ_jφ_j, so the 95% capacity is approximately Σλ_j + z·√(Σλ_jφ_j). A single Poisson on the total uses φ = 1 and under-states the safety stock by the factor √φ_eff with φ_eff = Σλ_jφ_j / Σλ_j. The superposition of independent classes is Poisson only if every class is Poisson. (b) For a stationary Hawkes process with branching ratio α &lt; 1 (the expected number of direct follow-up events per event), the cluster started by a background event has a Borel size distribution with mean 1/(1 - α), the long-window Fano factor of counts is 1/(1 - α)², and the count variance in a window of fixed length approaches this value as the window grows relative to the excitation time scale 1/β. (c) For a compound Poisson count N = Σ_{i ≤ M} X_i with M ~ Poisson(ν), the Fano factor is E[X²]/E[X], which is unbounded when the mark distribution has an infinite second moment (e.g. a Pareto tail index below 2): the variance of the daily count, and with it the Poisson capacity error, is dominated by the largest episodes.</w:t>
+      </w:r>
+    </w:p>
+    <w:p>
+      <w:pPr>
+        <w:spacing w:after="120" w:line="300"/>
+        <w:jc w:val="both"/>
+      </w:pPr>
+      <w:r>
+        <w:rPr>
+          <w:rFonts w:ascii="Times New Roman" w:cs="Times New Roman" w:eastAsia="Times New Roman" w:hAnsi="Times New Roman"/>
+          <w:i/>
+          <w:iCs/>
+          <w:sz w:val="22"/>
+          <w:szCs w:val="22"/>
+        </w:rPr>
+        <w:t xml:space="preserve">Proof sketch.</w:t>
+      </w:r>
+      <w:r>
+        <w:rPr>
+          <w:rFonts w:ascii="Times New Roman" w:cs="Times New Roman" w:eastAsia="Times New Roman" w:hAnsi="Times New Roman"/>
+          <w:sz w:val="22"/>
+          <w:szCs w:val="22"/>
+        </w:rPr>
+        <w:t xml:space="preserve"> (a) Variances of independent counts add; the normal approximation of the quantile uses the total variance. (b) The Hawkes cluster is a Galton-Watson tree with Poisson(α) offspring; its total progeny is Borel(α) with mean 1/(1 - α) and second moment 1/(1 - α)³, hence E[X²]/E[X] = 1/(1 - α)², and the stationary count variance-to-mean ratio of a Hawkes process equals this value in the long-window limit. (c) is Wald's identity for the compound Poisson variance, Var(N) = νE[X²]. ∎ For provider incidents with α ≈ 0.16 the implied Fano factor is about 1.4, close to the stratified dispersion indices of 1.2-1.5 we measure in Section 5.8, whereas for serving-failure episodes α is 0.5-0.85 and the sizes are heavy-tailed, so the Poisson description of failed requests is inadequate by orders of magnitude.</w:t>
+      </w:r>
+    </w:p>
+    <w:p>
+      <w:pPr>
         <w:pStyle w:val="Heading1"/>
         <w:spacing w:after="120" w:before="280"/>
       </w:pPr>
@@ -6933,6 +7894,30 @@
           <w:szCs w:val="22"/>
         </w:rPr>
         <w:t xml:space="preserve"> we use three public company ticket datasets: customer tickets of an international software company (Abdellatif, 2026; 22,016 customer tickets from 2017 to March 2023, with creation, resolution and in-progress times), the audit log of a ServiceNow instance of an IT company (Amaral et al., 2018; 24,918 incidents in 2016-2017) and the help-desk log of an Italian software company (Verenich, 2016; 3,804 cases, 2010-2012). For each stream we estimate weekday-stratified over-dispersion, the daily rate CV net of slow trends (Pearson dispersion of weekday counts against a leave-one-out local mean over about eight weeks, after removing the weekday effect), the exceedance rate of Poisson-sized capacity plans, the distribution of resolution and in-progress times (exponential, lognormal and Weibull fits compared by AIC), the daily workload safety factor (95th percentile over mean of handling hours versus arrivals), and the number of concurrently open tickets against the M/G/∞ Poisson prediction.</w:t>
+      </w:r>
+    </w:p>
+    <w:p>
+      <w:pPr>
+        <w:spacing w:after="120" w:line="300"/>
+        <w:jc w:val="both"/>
+      </w:pPr>
+      <w:r>
+        <w:rPr>
+          <w:rFonts w:ascii="Times New Roman" w:cs="Times New Roman" w:eastAsia="Times New Roman" w:hAnsi="Times New Roman"/>
+          <w:b/>
+          <w:bCs/>
+          <w:sz w:val="22"/>
+          <w:szCs w:val="22"/>
+        </w:rPr>
+        <w:t xml:space="preserve">Typed failure models.</w:t>
+      </w:r>
+      <w:r>
+        <w:rPr>
+          <w:rFonts w:ascii="Times New Roman" w:cs="Times New Roman" w:eastAsia="Times New Roman" w:hAnsi="Times New Roman"/>
+          <w:sz w:val="22"/>
+          <w:szCs w:val="22"/>
+        </w:rPr>
+        <w:t xml:space="preserve"> For the provider incidents we fit, by maximum likelihood, a seasonal Hawkes process with an exponential kernel, λ(t) = μ₀ s(t) + Σ αβe^{-β(t - t_i)}, where s(t) is a weekday/weekend × hour-of-day profile estimated from the data and held fixed, and compare it with the seasonal NHPP (α = 0) by AIC, by a parametric-bootstrap likelihood-ratio test (200 simulations under the NHPP; the boundary α = 0 invalidates the usual χ² reference), and by the time-rescaling test using the fitted compensator. The estimator was checked by simulation (recovery of μ₀, α, β from synthetic seasonal Hawkes data, and no false excitation when α = 0). For BurstGPT failures we detect outage-like episodes (minutes with more than 20% failed requests and at least five failures, merged when at most ten minutes apart), characterise episode duration, size (lognormal fit, Hill tail index) and arrival process (daily dispersion, seasonal Hawkes fit), and test five alternative episode definitions. Finally, we combine class-specific negative-binomial daily counts (means and dispersion indices taken from the estimates above, classes independent) by Monte Carlo to compare the 95% capacity of the typed superposition with a single Poisson on the total (Section 5.8).</w:t>
       </w:r>
     </w:p>
     <w:p>
@@ -15912,6 +16897,2916 @@
     </w:p>
     <w:p>
       <w:pPr>
+        <w:pStyle w:val="Heading2"/>
+        <w:spacing w:after="100" w:before="200"/>
+      </w:pPr>
+      <w:r>
+        <w:rPr>
+          <w:rFonts w:ascii="Times New Roman" w:cs="Times New Roman" w:eastAsia="Times New Roman" w:hAnsi="Times New Roman"/>
+          <w:b/>
+          <w:bCs/>
+          <w:i/>
+          <w:iCs/>
+          <w:sz w:val="23"/>
+          <w:szCs w:val="23"/>
+        </w:rPr>
+        <w:t xml:space="preserve">5.8 Typed failure models on public production data</w:t>
+      </w:r>
+    </w:p>
+    <w:p>
+      <w:pPr>
+        <w:spacing w:after="120" w:line="300"/>
+        <w:jc w:val="both"/>
+      </w:pPr>
+      <w:r>
+        <w:rPr>
+          <w:rFonts w:ascii="Times New Roman" w:cs="Times New Roman" w:eastAsia="Times New Roman" w:hAnsi="Times New Roman"/>
+          <w:sz w:val="22"/>
+          <w:szCs w:val="22"/>
+        </w:rPr>
+        <w:t xml:space="preserve">We now fit the process classes of Section 3.6 to the two public failure datasets (the numbers in this section are produced by run_failure_models.py).</w:t>
+      </w:r>
+    </w:p>
+    <w:p>
+      <w:pPr>
+        <w:keepNext/>
+        <w:spacing w:after="60" w:before="160"/>
+      </w:pPr>
+      <w:r>
+        <w:rPr>
+          <w:rFonts w:ascii="Times New Roman" w:cs="Times New Roman" w:eastAsia="Times New Roman" w:hAnsi="Times New Roman"/>
+          <w:b/>
+          <w:bCs/>
+          <w:sz w:val="20"/>
+          <w:szCs w:val="20"/>
+        </w:rPr>
+        <w:t xml:space="preserve">Table 9. Seasonal NHPP versus seasonal Hawkes process for provider-declared incidents (March 2023 - August 2024)</w:t>
+      </w:r>
+    </w:p>
+    <w:tbl>
+      <w:tblPr>
+        <w:tblW w:type="dxa" w:w="9360"/>
+        <w:tblBorders>
+          <w:top w:val="single" w:color="auto" w:sz="4"/>
+          <w:left w:val="single" w:color="auto" w:sz="4"/>
+          <w:bottom w:val="single" w:color="auto" w:sz="4"/>
+          <w:right w:val="single" w:color="auto" w:sz="4"/>
+          <w:insideH w:val="single" w:color="auto" w:sz="4"/>
+          <w:insideV w:val="single" w:color="auto" w:sz="4"/>
+        </w:tblBorders>
+      </w:tblPr>
+      <w:tblGrid>
+        <w:gridCol w:w="1900"/>
+        <w:gridCol w:w="900"/>
+        <w:gridCol w:w="1200"/>
+        <w:gridCol w:w="1400"/>
+        <w:gridCol w:w="1300"/>
+        <w:gridCol w:w="1500"/>
+        <w:gridCol w:w="1160"/>
+      </w:tblGrid>
+      <w:tr>
+        <w:trPr>
+          <w:tblHeader/>
+        </w:trPr>
+        <w:tc>
+          <w:tcPr>
+            <w:tcW w:type="dxa" w:w="1900"/>
+            <w:tcBorders>
+              <w:top w:val="single" w:color="AAAAAA" w:sz="4"/>
+              <w:left w:val="single" w:color="AAAAAA" w:sz="4"/>
+              <w:bottom w:val="single" w:color="AAAAAA" w:sz="4"/>
+              <w:right w:val="single" w:color="AAAAAA" w:sz="4"/>
+            </w:tcBorders>
+            <w:shd w:fill="E8E8E8" w:color="auto" w:val="clear"/>
+            <w:tcMar>
+              <w:top w:type="dxa" w:w="40"/>
+              <w:left w:type="dxa" w:w="80"/>
+              <w:bottom w:type="dxa" w:w="40"/>
+              <w:right w:type="dxa" w:w="80"/>
+            </w:tcMar>
+          </w:tcPr>
+          <w:p>
+            <w:pPr>
+              <w:jc w:val="center"/>
+            </w:pPr>
+            <w:r>
+              <w:rPr>
+                <w:rFonts w:ascii="Times New Roman" w:cs="Times New Roman" w:eastAsia="Times New Roman" w:hAnsi="Times New Roman"/>
+                <w:b/>
+                <w:bCs/>
+                <w:sz w:val="18"/>
+                <w:szCs w:val="18"/>
+              </w:rPr>
+              <w:t xml:space="preserve">Stream</w:t>
+            </w:r>
+          </w:p>
+        </w:tc>
+        <w:tc>
+          <w:tcPr>
+            <w:tcW w:type="dxa" w:w="900"/>
+            <w:tcBorders>
+              <w:top w:val="single" w:color="AAAAAA" w:sz="4"/>
+              <w:left w:val="single" w:color="AAAAAA" w:sz="4"/>
+              <w:bottom w:val="single" w:color="AAAAAA" w:sz="4"/>
+              <w:right w:val="single" w:color="AAAAAA" w:sz="4"/>
+            </w:tcBorders>
+            <w:shd w:fill="E8E8E8" w:color="auto" w:val="clear"/>
+            <w:tcMar>
+              <w:top w:type="dxa" w:w="40"/>
+              <w:left w:type="dxa" w:w="80"/>
+              <w:bottom w:type="dxa" w:w="40"/>
+              <w:right w:type="dxa" w:w="80"/>
+            </w:tcMar>
+          </w:tcPr>
+          <w:p>
+            <w:pPr>
+              <w:jc w:val="center"/>
+            </w:pPr>
+            <w:r>
+              <w:rPr>
+                <w:rFonts w:ascii="Times New Roman" w:cs="Times New Roman" w:eastAsia="Times New Roman" w:hAnsi="Times New Roman"/>
+                <w:b/>
+                <w:bCs/>
+                <w:sz w:val="18"/>
+                <w:szCs w:val="18"/>
+              </w:rPr>
+              <w:t xml:space="preserve">Incidents</w:t>
+            </w:r>
+          </w:p>
+        </w:tc>
+        <w:tc>
+          <w:tcPr>
+            <w:tcW w:type="dxa" w:w="1200"/>
+            <w:tcBorders>
+              <w:top w:val="single" w:color="AAAAAA" w:sz="4"/>
+              <w:left w:val="single" w:color="AAAAAA" w:sz="4"/>
+              <w:bottom w:val="single" w:color="AAAAAA" w:sz="4"/>
+              <w:right w:val="single" w:color="AAAAAA" w:sz="4"/>
+            </w:tcBorders>
+            <w:shd w:fill="E8E8E8" w:color="auto" w:val="clear"/>
+            <w:tcMar>
+              <w:top w:type="dxa" w:w="40"/>
+              <w:left w:type="dxa" w:w="80"/>
+              <w:bottom w:type="dxa" w:w="40"/>
+              <w:right w:type="dxa" w:w="80"/>
+            </w:tcMar>
+          </w:tcPr>
+          <w:p>
+            <w:pPr>
+              <w:jc w:val="center"/>
+            </w:pPr>
+            <w:r>
+              <w:rPr>
+                <w:rFonts w:ascii="Times New Roman" w:cs="Times New Roman" w:eastAsia="Times New Roman" w:hAnsi="Times New Roman"/>
+                <w:b/>
+                <w:bCs/>
+                <w:sz w:val="18"/>
+                <w:szCs w:val="18"/>
+              </w:rPr>
+              <w:t xml:space="preserve">Branching ratio α</w:t>
+            </w:r>
+          </w:p>
+        </w:tc>
+        <w:tc>
+          <w:tcPr>
+            <w:tcW w:type="dxa" w:w="1400"/>
+            <w:tcBorders>
+              <w:top w:val="single" w:color="AAAAAA" w:sz="4"/>
+              <w:left w:val="single" w:color="AAAAAA" w:sz="4"/>
+              <w:bottom w:val="single" w:color="AAAAAA" w:sz="4"/>
+              <w:right w:val="single" w:color="AAAAAA" w:sz="4"/>
+            </w:tcBorders>
+            <w:shd w:fill="E8E8E8" w:color="auto" w:val="clear"/>
+            <w:tcMar>
+              <w:top w:type="dxa" w:w="40"/>
+              <w:left w:type="dxa" w:w="80"/>
+              <w:bottom w:type="dxa" w:w="40"/>
+              <w:right w:type="dxa" w:w="80"/>
+            </w:tcMar>
+          </w:tcPr>
+          <w:p>
+            <w:pPr>
+              <w:jc w:val="center"/>
+            </w:pPr>
+            <w:r>
+              <w:rPr>
+                <w:rFonts w:ascii="Times New Roman" w:cs="Times New Roman" w:eastAsia="Times New Roman" w:hAnsi="Times New Roman"/>
+                <w:b/>
+                <w:bCs/>
+                <w:sz w:val="18"/>
+                <w:szCs w:val="18"/>
+              </w:rPr>
+              <w:t xml:space="preserve">Mean cluster size 1/(1-α)</w:t>
+            </w:r>
+          </w:p>
+        </w:tc>
+        <w:tc>
+          <w:tcPr>
+            <w:tcW w:type="dxa" w:w="1300"/>
+            <w:tcBorders>
+              <w:top w:val="single" w:color="AAAAAA" w:sz="4"/>
+              <w:left w:val="single" w:color="AAAAAA" w:sz="4"/>
+              <w:bottom w:val="single" w:color="AAAAAA" w:sz="4"/>
+              <w:right w:val="single" w:color="AAAAAA" w:sz="4"/>
+            </w:tcBorders>
+            <w:shd w:fill="E8E8E8" w:color="auto" w:val="clear"/>
+            <w:tcMar>
+              <w:top w:type="dxa" w:w="40"/>
+              <w:left w:type="dxa" w:w="80"/>
+              <w:bottom w:type="dxa" w:w="40"/>
+              <w:right w:type="dxa" w:w="80"/>
+            </w:tcMar>
+          </w:tcPr>
+          <w:p>
+            <w:pPr>
+              <w:jc w:val="center"/>
+            </w:pPr>
+            <w:r>
+              <w:rPr>
+                <w:rFonts w:ascii="Times New Roman" w:cs="Times New Roman" w:eastAsia="Times New Roman" w:hAnsi="Times New Roman"/>
+                <w:b/>
+                <w:bCs/>
+                <w:sz w:val="18"/>
+                <w:szCs w:val="18"/>
+              </w:rPr>
+              <w:t xml:space="preserve">Excitation half-life (h)</w:t>
+            </w:r>
+          </w:p>
+        </w:tc>
+        <w:tc>
+          <w:tcPr>
+            <w:tcW w:type="dxa" w:w="1500"/>
+            <w:tcBorders>
+              <w:top w:val="single" w:color="AAAAAA" w:sz="4"/>
+              <w:left w:val="single" w:color="AAAAAA" w:sz="4"/>
+              <w:bottom w:val="single" w:color="AAAAAA" w:sz="4"/>
+              <w:right w:val="single" w:color="AAAAAA" w:sz="4"/>
+            </w:tcBorders>
+            <w:shd w:fill="E8E8E8" w:color="auto" w:val="clear"/>
+            <w:tcMar>
+              <w:top w:type="dxa" w:w="40"/>
+              <w:left w:type="dxa" w:w="80"/>
+              <w:bottom w:type="dxa" w:w="40"/>
+              <w:right w:type="dxa" w:w="80"/>
+            </w:tcMar>
+          </w:tcPr>
+          <w:p>
+            <w:pPr>
+              <w:jc w:val="center"/>
+            </w:pPr>
+            <w:r>
+              <w:rPr>
+                <w:rFonts w:ascii="Times New Roman" w:cs="Times New Roman" w:eastAsia="Times New Roman" w:hAnsi="Times New Roman"/>
+                <w:b/>
+                <w:bCs/>
+                <w:sz w:val="18"/>
+                <w:szCs w:val="18"/>
+              </w:rPr>
+              <w:t xml:space="preserve">LR test vs NHPP (bootstrap p)</w:t>
+            </w:r>
+          </w:p>
+        </w:tc>
+        <w:tc>
+          <w:tcPr>
+            <w:tcW w:type="dxa" w:w="1160"/>
+            <w:tcBorders>
+              <w:top w:val="single" w:color="AAAAAA" w:sz="4"/>
+              <w:left w:val="single" w:color="AAAAAA" w:sz="4"/>
+              <w:bottom w:val="single" w:color="AAAAAA" w:sz="4"/>
+              <w:right w:val="single" w:color="AAAAAA" w:sz="4"/>
+            </w:tcBorders>
+            <w:shd w:fill="E8E8E8" w:color="auto" w:val="clear"/>
+            <w:tcMar>
+              <w:top w:type="dxa" w:w="40"/>
+              <w:left w:type="dxa" w:w="80"/>
+              <w:bottom w:type="dxa" w:w="40"/>
+              <w:right w:type="dxa" w:w="80"/>
+            </w:tcMar>
+          </w:tcPr>
+          <w:p>
+            <w:pPr>
+              <w:jc w:val="center"/>
+            </w:pPr>
+            <w:r>
+              <w:rPr>
+                <w:rFonts w:ascii="Times New Roman" w:cs="Times New Roman" w:eastAsia="Times New Roman" w:hAnsi="Times New Roman"/>
+                <w:b/>
+                <w:bCs/>
+                <w:sz w:val="18"/>
+                <w:szCs w:val="18"/>
+              </w:rPr>
+              <w:t xml:space="preserve">Rescaled-gap KS p: NHPP → Hawkes</w:t>
+            </w:r>
+          </w:p>
+        </w:tc>
+      </w:tr>
+      <w:tr>
+        <w:tc>
+          <w:tcPr>
+            <w:tcW w:type="dxa" w:w="1900"/>
+            <w:tcBorders>
+              <w:top w:val="single" w:color="AAAAAA" w:sz="4"/>
+              <w:left w:val="single" w:color="AAAAAA" w:sz="4"/>
+              <w:bottom w:val="single" w:color="AAAAAA" w:sz="4"/>
+              <w:right w:val="single" w:color="AAAAAA" w:sz="4"/>
+            </w:tcBorders>
+            <w:tcMar>
+              <w:top w:type="dxa" w:w="40"/>
+              <w:left w:type="dxa" w:w="80"/>
+              <w:bottom w:type="dxa" w:w="40"/>
+              <w:right w:type="dxa" w:w="80"/>
+            </w:tcMar>
+          </w:tcPr>
+          <w:p>
+            <w:pPr>
+              <w:jc w:val="center"/>
+            </w:pPr>
+            <w:r>
+              <w:rPr>
+                <w:rFonts w:ascii="Times New Roman" w:cs="Times New Roman" w:eastAsia="Times New Roman" w:hAnsi="Times New Roman"/>
+                <w:b w:val="false"/>
+                <w:bCs w:val="false"/>
+                <w:sz w:val="18"/>
+                <w:szCs w:val="18"/>
+              </w:rPr>
+              <w:t xml:space="preserve">all providers</w:t>
+            </w:r>
+          </w:p>
+        </w:tc>
+        <w:tc>
+          <w:tcPr>
+            <w:tcW w:type="dxa" w:w="900"/>
+            <w:tcBorders>
+              <w:top w:val="single" w:color="AAAAAA" w:sz="4"/>
+              <w:left w:val="single" w:color="AAAAAA" w:sz="4"/>
+              <w:bottom w:val="single" w:color="AAAAAA" w:sz="4"/>
+              <w:right w:val="single" w:color="AAAAAA" w:sz="4"/>
+            </w:tcBorders>
+            <w:tcMar>
+              <w:top w:type="dxa" w:w="40"/>
+              <w:left w:type="dxa" w:w="80"/>
+              <w:bottom w:type="dxa" w:w="40"/>
+              <w:right w:type="dxa" w:w="80"/>
+            </w:tcMar>
+          </w:tcPr>
+          <w:p>
+            <w:pPr>
+              <w:jc w:val="center"/>
+            </w:pPr>
+            <w:r>
+              <w:rPr>
+                <w:rFonts w:ascii="Times New Roman" w:cs="Times New Roman" w:eastAsia="Times New Roman" w:hAnsi="Times New Roman"/>
+                <w:b w:val="false"/>
+                <w:bCs w:val="false"/>
+                <w:sz w:val="18"/>
+                <w:szCs w:val="18"/>
+              </w:rPr>
+              <w:t xml:space="preserve">457</w:t>
+            </w:r>
+          </w:p>
+        </w:tc>
+        <w:tc>
+          <w:tcPr>
+            <w:tcW w:type="dxa" w:w="1200"/>
+            <w:tcBorders>
+              <w:top w:val="single" w:color="AAAAAA" w:sz="4"/>
+              <w:left w:val="single" w:color="AAAAAA" w:sz="4"/>
+              <w:bottom w:val="single" w:color="AAAAAA" w:sz="4"/>
+              <w:right w:val="single" w:color="AAAAAA" w:sz="4"/>
+            </w:tcBorders>
+            <w:tcMar>
+              <w:top w:type="dxa" w:w="40"/>
+              <w:left w:type="dxa" w:w="80"/>
+              <w:bottom w:type="dxa" w:w="40"/>
+              <w:right w:type="dxa" w:w="80"/>
+            </w:tcMar>
+          </w:tcPr>
+          <w:p>
+            <w:pPr>
+              <w:jc w:val="center"/>
+            </w:pPr>
+            <w:r>
+              <w:rPr>
+                <w:rFonts w:ascii="Times New Roman" w:cs="Times New Roman" w:eastAsia="Times New Roman" w:hAnsi="Times New Roman"/>
+                <w:b w:val="false"/>
+                <w:bCs w:val="false"/>
+                <w:sz w:val="18"/>
+                <w:szCs w:val="18"/>
+              </w:rPr>
+              <w:t xml:space="preserve">0.16</w:t>
+            </w:r>
+          </w:p>
+        </w:tc>
+        <w:tc>
+          <w:tcPr>
+            <w:tcW w:type="dxa" w:w="1400"/>
+            <w:tcBorders>
+              <w:top w:val="single" w:color="AAAAAA" w:sz="4"/>
+              <w:left w:val="single" w:color="AAAAAA" w:sz="4"/>
+              <w:bottom w:val="single" w:color="AAAAAA" w:sz="4"/>
+              <w:right w:val="single" w:color="AAAAAA" w:sz="4"/>
+            </w:tcBorders>
+            <w:tcMar>
+              <w:top w:type="dxa" w:w="40"/>
+              <w:left w:type="dxa" w:w="80"/>
+              <w:bottom w:type="dxa" w:w="40"/>
+              <w:right w:type="dxa" w:w="80"/>
+            </w:tcMar>
+          </w:tcPr>
+          <w:p>
+            <w:pPr>
+              <w:jc w:val="center"/>
+            </w:pPr>
+            <w:r>
+              <w:rPr>
+                <w:rFonts w:ascii="Times New Roman" w:cs="Times New Roman" w:eastAsia="Times New Roman" w:hAnsi="Times New Roman"/>
+                <w:b w:val="false"/>
+                <w:bCs w:val="false"/>
+                <w:sz w:val="18"/>
+                <w:szCs w:val="18"/>
+              </w:rPr>
+              <w:t xml:space="preserve">1.19</w:t>
+            </w:r>
+          </w:p>
+        </w:tc>
+        <w:tc>
+          <w:tcPr>
+            <w:tcW w:type="dxa" w:w="1300"/>
+            <w:tcBorders>
+              <w:top w:val="single" w:color="AAAAAA" w:sz="4"/>
+              <w:left w:val="single" w:color="AAAAAA" w:sz="4"/>
+              <w:bottom w:val="single" w:color="AAAAAA" w:sz="4"/>
+              <w:right w:val="single" w:color="AAAAAA" w:sz="4"/>
+            </w:tcBorders>
+            <w:tcMar>
+              <w:top w:type="dxa" w:w="40"/>
+              <w:left w:type="dxa" w:w="80"/>
+              <w:bottom w:type="dxa" w:w="40"/>
+              <w:right w:type="dxa" w:w="80"/>
+            </w:tcMar>
+          </w:tcPr>
+          <w:p>
+            <w:pPr>
+              <w:jc w:val="center"/>
+            </w:pPr>
+            <w:r>
+              <w:rPr>
+                <w:rFonts w:ascii="Times New Roman" w:cs="Times New Roman" w:eastAsia="Times New Roman" w:hAnsi="Times New Roman"/>
+                <w:b w:val="false"/>
+                <w:bCs w:val="false"/>
+                <w:sz w:val="18"/>
+                <w:szCs w:val="18"/>
+              </w:rPr>
+              <w:t xml:space="preserve">7.1</w:t>
+            </w:r>
+          </w:p>
+        </w:tc>
+        <w:tc>
+          <w:tcPr>
+            <w:tcW w:type="dxa" w:w="1500"/>
+            <w:tcBorders>
+              <w:top w:val="single" w:color="AAAAAA" w:sz="4"/>
+              <w:left w:val="single" w:color="AAAAAA" w:sz="4"/>
+              <w:bottom w:val="single" w:color="AAAAAA" w:sz="4"/>
+              <w:right w:val="single" w:color="AAAAAA" w:sz="4"/>
+            </w:tcBorders>
+            <w:tcMar>
+              <w:top w:type="dxa" w:w="40"/>
+              <w:left w:type="dxa" w:w="80"/>
+              <w:bottom w:type="dxa" w:w="40"/>
+              <w:right w:type="dxa" w:w="80"/>
+            </w:tcMar>
+          </w:tcPr>
+          <w:p>
+            <w:pPr>
+              <w:jc w:val="center"/>
+            </w:pPr>
+            <w:r>
+              <w:rPr>
+                <w:rFonts w:ascii="Times New Roman" w:cs="Times New Roman" w:eastAsia="Times New Roman" w:hAnsi="Times New Roman"/>
+                <w:b w:val="false"/>
+                <w:bCs w:val="false"/>
+                <w:sz w:val="18"/>
+                <w:szCs w:val="18"/>
+              </w:rPr>
+              <w:t xml:space="preserve">23.7 (≤0.005)</w:t>
+            </w:r>
+          </w:p>
+        </w:tc>
+        <w:tc>
+          <w:tcPr>
+            <w:tcW w:type="dxa" w:w="1160"/>
+            <w:tcBorders>
+              <w:top w:val="single" w:color="AAAAAA" w:sz="4"/>
+              <w:left w:val="single" w:color="AAAAAA" w:sz="4"/>
+              <w:bottom w:val="single" w:color="AAAAAA" w:sz="4"/>
+              <w:right w:val="single" w:color="AAAAAA" w:sz="4"/>
+            </w:tcBorders>
+            <w:tcMar>
+              <w:top w:type="dxa" w:w="40"/>
+              <w:left w:type="dxa" w:w="80"/>
+              <w:bottom w:type="dxa" w:w="40"/>
+              <w:right w:type="dxa" w:w="80"/>
+            </w:tcMar>
+          </w:tcPr>
+          <w:p>
+            <w:pPr>
+              <w:jc w:val="center"/>
+            </w:pPr>
+            <w:r>
+              <w:rPr>
+                <w:rFonts w:ascii="Times New Roman" w:cs="Times New Roman" w:eastAsia="Times New Roman" w:hAnsi="Times New Roman"/>
+                <w:b w:val="false"/>
+                <w:bCs w:val="false"/>
+                <w:sz w:val="18"/>
+                <w:szCs w:val="18"/>
+              </w:rPr>
+              <w:t xml:space="preserve">5×10⁻4 → 0.47</w:t>
+            </w:r>
+          </w:p>
+        </w:tc>
+      </w:tr>
+      <w:tr>
+        <w:tc>
+          <w:tcPr>
+            <w:tcW w:type="dxa" w:w="1900"/>
+            <w:tcBorders>
+              <w:top w:val="single" w:color="AAAAAA" w:sz="4"/>
+              <w:left w:val="single" w:color="AAAAAA" w:sz="4"/>
+              <w:bottom w:val="single" w:color="AAAAAA" w:sz="4"/>
+              <w:right w:val="single" w:color="AAAAAA" w:sz="4"/>
+            </w:tcBorders>
+            <w:tcMar>
+              <w:top w:type="dxa" w:w="40"/>
+              <w:left w:type="dxa" w:w="80"/>
+              <w:bottom w:type="dxa" w:w="40"/>
+              <w:right w:type="dxa" w:w="80"/>
+            </w:tcMar>
+          </w:tcPr>
+          <w:p>
+            <w:pPr>
+              <w:jc w:val="center"/>
+            </w:pPr>
+            <w:r>
+              <w:rPr>
+                <w:rFonts w:ascii="Times New Roman" w:cs="Times New Roman" w:eastAsia="Times New Roman" w:hAnsi="Times New Roman"/>
+                <w:b w:val="false"/>
+                <w:bCs w:val="false"/>
+                <w:sz w:val="18"/>
+                <w:szCs w:val="18"/>
+              </w:rPr>
+              <w:t xml:space="preserve">OpenAI</w:t>
+            </w:r>
+          </w:p>
+        </w:tc>
+        <w:tc>
+          <w:tcPr>
+            <w:tcW w:type="dxa" w:w="900"/>
+            <w:tcBorders>
+              <w:top w:val="single" w:color="AAAAAA" w:sz="4"/>
+              <w:left w:val="single" w:color="AAAAAA" w:sz="4"/>
+              <w:bottom w:val="single" w:color="AAAAAA" w:sz="4"/>
+              <w:right w:val="single" w:color="AAAAAA" w:sz="4"/>
+            </w:tcBorders>
+            <w:tcMar>
+              <w:top w:type="dxa" w:w="40"/>
+              <w:left w:type="dxa" w:w="80"/>
+              <w:bottom w:type="dxa" w:w="40"/>
+              <w:right w:type="dxa" w:w="80"/>
+            </w:tcMar>
+          </w:tcPr>
+          <w:p>
+            <w:pPr>
+              <w:jc w:val="center"/>
+            </w:pPr>
+            <w:r>
+              <w:rPr>
+                <w:rFonts w:ascii="Times New Roman" w:cs="Times New Roman" w:eastAsia="Times New Roman" w:hAnsi="Times New Roman"/>
+                <w:b w:val="false"/>
+                <w:bCs w:val="false"/>
+                <w:sz w:val="18"/>
+                <w:szCs w:val="18"/>
+              </w:rPr>
+              <w:t xml:space="preserve">280</w:t>
+            </w:r>
+          </w:p>
+        </w:tc>
+        <w:tc>
+          <w:tcPr>
+            <w:tcW w:type="dxa" w:w="1200"/>
+            <w:tcBorders>
+              <w:top w:val="single" w:color="AAAAAA" w:sz="4"/>
+              <w:left w:val="single" w:color="AAAAAA" w:sz="4"/>
+              <w:bottom w:val="single" w:color="AAAAAA" w:sz="4"/>
+              <w:right w:val="single" w:color="AAAAAA" w:sz="4"/>
+            </w:tcBorders>
+            <w:tcMar>
+              <w:top w:type="dxa" w:w="40"/>
+              <w:left w:type="dxa" w:w="80"/>
+              <w:bottom w:type="dxa" w:w="40"/>
+              <w:right w:type="dxa" w:w="80"/>
+            </w:tcMar>
+          </w:tcPr>
+          <w:p>
+            <w:pPr>
+              <w:jc w:val="center"/>
+            </w:pPr>
+            <w:r>
+              <w:rPr>
+                <w:rFonts w:ascii="Times New Roman" w:cs="Times New Roman" w:eastAsia="Times New Roman" w:hAnsi="Times New Roman"/>
+                <w:b w:val="false"/>
+                <w:bCs w:val="false"/>
+                <w:sz w:val="18"/>
+                <w:szCs w:val="18"/>
+              </w:rPr>
+              <w:t xml:space="preserve">0.11</w:t>
+            </w:r>
+          </w:p>
+        </w:tc>
+        <w:tc>
+          <w:tcPr>
+            <w:tcW w:type="dxa" w:w="1400"/>
+            <w:tcBorders>
+              <w:top w:val="single" w:color="AAAAAA" w:sz="4"/>
+              <w:left w:val="single" w:color="AAAAAA" w:sz="4"/>
+              <w:bottom w:val="single" w:color="AAAAAA" w:sz="4"/>
+              <w:right w:val="single" w:color="AAAAAA" w:sz="4"/>
+            </w:tcBorders>
+            <w:tcMar>
+              <w:top w:type="dxa" w:w="40"/>
+              <w:left w:type="dxa" w:w="80"/>
+              <w:bottom w:type="dxa" w:w="40"/>
+              <w:right w:type="dxa" w:w="80"/>
+            </w:tcMar>
+          </w:tcPr>
+          <w:p>
+            <w:pPr>
+              <w:jc w:val="center"/>
+            </w:pPr>
+            <w:r>
+              <w:rPr>
+                <w:rFonts w:ascii="Times New Roman" w:cs="Times New Roman" w:eastAsia="Times New Roman" w:hAnsi="Times New Roman"/>
+                <w:b w:val="false"/>
+                <w:bCs w:val="false"/>
+                <w:sz w:val="18"/>
+                <w:szCs w:val="18"/>
+              </w:rPr>
+              <w:t xml:space="preserve">1.12</w:t>
+            </w:r>
+          </w:p>
+        </w:tc>
+        <w:tc>
+          <w:tcPr>
+            <w:tcW w:type="dxa" w:w="1300"/>
+            <w:tcBorders>
+              <w:top w:val="single" w:color="AAAAAA" w:sz="4"/>
+              <w:left w:val="single" w:color="AAAAAA" w:sz="4"/>
+              <w:bottom w:val="single" w:color="AAAAAA" w:sz="4"/>
+              <w:right w:val="single" w:color="AAAAAA" w:sz="4"/>
+            </w:tcBorders>
+            <w:tcMar>
+              <w:top w:type="dxa" w:w="40"/>
+              <w:left w:type="dxa" w:w="80"/>
+              <w:bottom w:type="dxa" w:w="40"/>
+              <w:right w:type="dxa" w:w="80"/>
+            </w:tcMar>
+          </w:tcPr>
+          <w:p>
+            <w:pPr>
+              <w:jc w:val="center"/>
+            </w:pPr>
+            <w:r>
+              <w:rPr>
+                <w:rFonts w:ascii="Times New Roman" w:cs="Times New Roman" w:eastAsia="Times New Roman" w:hAnsi="Times New Roman"/>
+                <w:b w:val="false"/>
+                <w:bCs w:val="false"/>
+                <w:sz w:val="18"/>
+                <w:szCs w:val="18"/>
+              </w:rPr>
+              <w:t xml:space="preserve">3.8</w:t>
+            </w:r>
+          </w:p>
+        </w:tc>
+        <w:tc>
+          <w:tcPr>
+            <w:tcW w:type="dxa" w:w="1500"/>
+            <w:tcBorders>
+              <w:top w:val="single" w:color="AAAAAA" w:sz="4"/>
+              <w:left w:val="single" w:color="AAAAAA" w:sz="4"/>
+              <w:bottom w:val="single" w:color="AAAAAA" w:sz="4"/>
+              <w:right w:val="single" w:color="AAAAAA" w:sz="4"/>
+            </w:tcBorders>
+            <w:tcMar>
+              <w:top w:type="dxa" w:w="40"/>
+              <w:left w:type="dxa" w:w="80"/>
+              <w:bottom w:type="dxa" w:w="40"/>
+              <w:right w:type="dxa" w:w="80"/>
+            </w:tcMar>
+          </w:tcPr>
+          <w:p>
+            <w:pPr>
+              <w:jc w:val="center"/>
+            </w:pPr>
+            <w:r>
+              <w:rPr>
+                <w:rFonts w:ascii="Times New Roman" w:cs="Times New Roman" w:eastAsia="Times New Roman" w:hAnsi="Times New Roman"/>
+                <w:b w:val="false"/>
+                <w:bCs w:val="false"/>
+                <w:sz w:val="18"/>
+                <w:szCs w:val="18"/>
+              </w:rPr>
+              <w:t xml:space="preserve">14.8 (≤0.005)</w:t>
+            </w:r>
+          </w:p>
+        </w:tc>
+        <w:tc>
+          <w:tcPr>
+            <w:tcW w:type="dxa" w:w="1160"/>
+            <w:tcBorders>
+              <w:top w:val="single" w:color="AAAAAA" w:sz="4"/>
+              <w:left w:val="single" w:color="AAAAAA" w:sz="4"/>
+              <w:bottom w:val="single" w:color="AAAAAA" w:sz="4"/>
+              <w:right w:val="single" w:color="AAAAAA" w:sz="4"/>
+            </w:tcBorders>
+            <w:tcMar>
+              <w:top w:type="dxa" w:w="40"/>
+              <w:left w:type="dxa" w:w="80"/>
+              <w:bottom w:type="dxa" w:w="40"/>
+              <w:right w:type="dxa" w:w="80"/>
+            </w:tcMar>
+          </w:tcPr>
+          <w:p>
+            <w:pPr>
+              <w:jc w:val="center"/>
+            </w:pPr>
+            <w:r>
+              <w:rPr>
+                <w:rFonts w:ascii="Times New Roman" w:cs="Times New Roman" w:eastAsia="Times New Roman" w:hAnsi="Times New Roman"/>
+                <w:b w:val="false"/>
+                <w:bCs w:val="false"/>
+                <w:sz w:val="18"/>
+                <w:szCs w:val="18"/>
+              </w:rPr>
+              <w:t xml:space="preserve">0.076 → 0.26</w:t>
+            </w:r>
+          </w:p>
+        </w:tc>
+      </w:tr>
+      <w:tr>
+        <w:tc>
+          <w:tcPr>
+            <w:tcW w:type="dxa" w:w="1900"/>
+            <w:tcBorders>
+              <w:top w:val="single" w:color="AAAAAA" w:sz="4"/>
+              <w:left w:val="single" w:color="AAAAAA" w:sz="4"/>
+              <w:bottom w:val="single" w:color="AAAAAA" w:sz="4"/>
+              <w:right w:val="single" w:color="AAAAAA" w:sz="4"/>
+            </w:tcBorders>
+            <w:tcMar>
+              <w:top w:type="dxa" w:w="40"/>
+              <w:left w:type="dxa" w:w="80"/>
+              <w:bottom w:type="dxa" w:w="40"/>
+              <w:right w:type="dxa" w:w="80"/>
+            </w:tcMar>
+          </w:tcPr>
+          <w:p>
+            <w:pPr>
+              <w:jc w:val="center"/>
+            </w:pPr>
+            <w:r>
+              <w:rPr>
+                <w:rFonts w:ascii="Times New Roman" w:cs="Times New Roman" w:eastAsia="Times New Roman" w:hAnsi="Times New Roman"/>
+                <w:b w:val="false"/>
+                <w:bCs w:val="false"/>
+                <w:sz w:val="18"/>
+                <w:szCs w:val="18"/>
+              </w:rPr>
+              <w:t xml:space="preserve">Anthropic</w:t>
+            </w:r>
+          </w:p>
+        </w:tc>
+        <w:tc>
+          <w:tcPr>
+            <w:tcW w:type="dxa" w:w="900"/>
+            <w:tcBorders>
+              <w:top w:val="single" w:color="AAAAAA" w:sz="4"/>
+              <w:left w:val="single" w:color="AAAAAA" w:sz="4"/>
+              <w:bottom w:val="single" w:color="AAAAAA" w:sz="4"/>
+              <w:right w:val="single" w:color="AAAAAA" w:sz="4"/>
+            </w:tcBorders>
+            <w:tcMar>
+              <w:top w:type="dxa" w:w="40"/>
+              <w:left w:type="dxa" w:w="80"/>
+              <w:bottom w:type="dxa" w:w="40"/>
+              <w:right w:type="dxa" w:w="80"/>
+            </w:tcMar>
+          </w:tcPr>
+          <w:p>
+            <w:pPr>
+              <w:jc w:val="center"/>
+            </w:pPr>
+            <w:r>
+              <w:rPr>
+                <w:rFonts w:ascii="Times New Roman" w:cs="Times New Roman" w:eastAsia="Times New Roman" w:hAnsi="Times New Roman"/>
+                <w:b w:val="false"/>
+                <w:bCs w:val="false"/>
+                <w:sz w:val="18"/>
+                <w:szCs w:val="18"/>
+              </w:rPr>
+              <w:t xml:space="preserve">141</w:t>
+            </w:r>
+          </w:p>
+        </w:tc>
+        <w:tc>
+          <w:tcPr>
+            <w:tcW w:type="dxa" w:w="1200"/>
+            <w:tcBorders>
+              <w:top w:val="single" w:color="AAAAAA" w:sz="4"/>
+              <w:left w:val="single" w:color="AAAAAA" w:sz="4"/>
+              <w:bottom w:val="single" w:color="AAAAAA" w:sz="4"/>
+              <w:right w:val="single" w:color="AAAAAA" w:sz="4"/>
+            </w:tcBorders>
+            <w:tcMar>
+              <w:top w:type="dxa" w:w="40"/>
+              <w:left w:type="dxa" w:w="80"/>
+              <w:bottom w:type="dxa" w:w="40"/>
+              <w:right w:type="dxa" w:w="80"/>
+            </w:tcMar>
+          </w:tcPr>
+          <w:p>
+            <w:pPr>
+              <w:jc w:val="center"/>
+            </w:pPr>
+            <w:r>
+              <w:rPr>
+                <w:rFonts w:ascii="Times New Roman" w:cs="Times New Roman" w:eastAsia="Times New Roman" w:hAnsi="Times New Roman"/>
+                <w:b w:val="false"/>
+                <w:bCs w:val="false"/>
+                <w:sz w:val="18"/>
+                <w:szCs w:val="18"/>
+              </w:rPr>
+              <w:t xml:space="preserve">0.21</w:t>
+            </w:r>
+          </w:p>
+        </w:tc>
+        <w:tc>
+          <w:tcPr>
+            <w:tcW w:type="dxa" w:w="1400"/>
+            <w:tcBorders>
+              <w:top w:val="single" w:color="AAAAAA" w:sz="4"/>
+              <w:left w:val="single" w:color="AAAAAA" w:sz="4"/>
+              <w:bottom w:val="single" w:color="AAAAAA" w:sz="4"/>
+              <w:right w:val="single" w:color="AAAAAA" w:sz="4"/>
+            </w:tcBorders>
+            <w:tcMar>
+              <w:top w:type="dxa" w:w="40"/>
+              <w:left w:type="dxa" w:w="80"/>
+              <w:bottom w:type="dxa" w:w="40"/>
+              <w:right w:type="dxa" w:w="80"/>
+            </w:tcMar>
+          </w:tcPr>
+          <w:p>
+            <w:pPr>
+              <w:jc w:val="center"/>
+            </w:pPr>
+            <w:r>
+              <w:rPr>
+                <w:rFonts w:ascii="Times New Roman" w:cs="Times New Roman" w:eastAsia="Times New Roman" w:hAnsi="Times New Roman"/>
+                <w:b w:val="false"/>
+                <w:bCs w:val="false"/>
+                <w:sz w:val="18"/>
+                <w:szCs w:val="18"/>
+              </w:rPr>
+              <w:t xml:space="preserve">1.27</w:t>
+            </w:r>
+          </w:p>
+        </w:tc>
+        <w:tc>
+          <w:tcPr>
+            <w:tcW w:type="dxa" w:w="1300"/>
+            <w:tcBorders>
+              <w:top w:val="single" w:color="AAAAAA" w:sz="4"/>
+              <w:left w:val="single" w:color="AAAAAA" w:sz="4"/>
+              <w:bottom w:val="single" w:color="AAAAAA" w:sz="4"/>
+              <w:right w:val="single" w:color="AAAAAA" w:sz="4"/>
+            </w:tcBorders>
+            <w:tcMar>
+              <w:top w:type="dxa" w:w="40"/>
+              <w:left w:type="dxa" w:w="80"/>
+              <w:bottom w:type="dxa" w:w="40"/>
+              <w:right w:type="dxa" w:w="80"/>
+            </w:tcMar>
+          </w:tcPr>
+          <w:p>
+            <w:pPr>
+              <w:jc w:val="center"/>
+            </w:pPr>
+            <w:r>
+              <w:rPr>
+                <w:rFonts w:ascii="Times New Roman" w:cs="Times New Roman" w:eastAsia="Times New Roman" w:hAnsi="Times New Roman"/>
+                <w:b w:val="false"/>
+                <w:bCs w:val="false"/>
+                <w:sz w:val="18"/>
+                <w:szCs w:val="18"/>
+              </w:rPr>
+              <w:t xml:space="preserve">4.2</w:t>
+            </w:r>
+          </w:p>
+        </w:tc>
+        <w:tc>
+          <w:tcPr>
+            <w:tcW w:type="dxa" w:w="1500"/>
+            <w:tcBorders>
+              <w:top w:val="single" w:color="AAAAAA" w:sz="4"/>
+              <w:left w:val="single" w:color="AAAAAA" w:sz="4"/>
+              <w:bottom w:val="single" w:color="AAAAAA" w:sz="4"/>
+              <w:right w:val="single" w:color="AAAAAA" w:sz="4"/>
+            </w:tcBorders>
+            <w:tcMar>
+              <w:top w:type="dxa" w:w="40"/>
+              <w:left w:type="dxa" w:w="80"/>
+              <w:bottom w:type="dxa" w:w="40"/>
+              <w:right w:type="dxa" w:w="80"/>
+            </w:tcMar>
+          </w:tcPr>
+          <w:p>
+            <w:pPr>
+              <w:jc w:val="center"/>
+            </w:pPr>
+            <w:r>
+              <w:rPr>
+                <w:rFonts w:ascii="Times New Roman" w:cs="Times New Roman" w:eastAsia="Times New Roman" w:hAnsi="Times New Roman"/>
+                <w:b w:val="false"/>
+                <w:bCs w:val="false"/>
+                <w:sz w:val="18"/>
+                <w:szCs w:val="18"/>
+              </w:rPr>
+              <w:t xml:space="preserve">30.2 (≤0.005)</w:t>
+            </w:r>
+          </w:p>
+        </w:tc>
+        <w:tc>
+          <w:tcPr>
+            <w:tcW w:type="dxa" w:w="1160"/>
+            <w:tcBorders>
+              <w:top w:val="single" w:color="AAAAAA" w:sz="4"/>
+              <w:left w:val="single" w:color="AAAAAA" w:sz="4"/>
+              <w:bottom w:val="single" w:color="AAAAAA" w:sz="4"/>
+              <w:right w:val="single" w:color="AAAAAA" w:sz="4"/>
+            </w:tcBorders>
+            <w:tcMar>
+              <w:top w:type="dxa" w:w="40"/>
+              <w:left w:type="dxa" w:w="80"/>
+              <w:bottom w:type="dxa" w:w="40"/>
+              <w:right w:type="dxa" w:w="80"/>
+            </w:tcMar>
+          </w:tcPr>
+          <w:p>
+            <w:pPr>
+              <w:jc w:val="center"/>
+            </w:pPr>
+            <w:r>
+              <w:rPr>
+                <w:rFonts w:ascii="Times New Roman" w:cs="Times New Roman" w:eastAsia="Times New Roman" w:hAnsi="Times New Roman"/>
+                <w:b w:val="false"/>
+                <w:bCs w:val="false"/>
+                <w:sz w:val="18"/>
+                <w:szCs w:val="18"/>
+              </w:rPr>
+              <w:t xml:space="preserve">1×10⁻6 → 0.13</w:t>
+            </w:r>
+          </w:p>
+        </w:tc>
+      </w:tr>
+      <w:tr>
+        <w:tc>
+          <w:tcPr>
+            <w:tcW w:type="dxa" w:w="1900"/>
+            <w:tcBorders>
+              <w:top w:val="single" w:color="AAAAAA" w:sz="4"/>
+              <w:left w:val="single" w:color="AAAAAA" w:sz="4"/>
+              <w:bottom w:val="single" w:color="AAAAAA" w:sz="4"/>
+              <w:right w:val="single" w:color="AAAAAA" w:sz="4"/>
+            </w:tcBorders>
+            <w:tcMar>
+              <w:top w:type="dxa" w:w="40"/>
+              <w:left w:type="dxa" w:w="80"/>
+              <w:bottom w:type="dxa" w:w="40"/>
+              <w:right w:type="dxa" w:w="80"/>
+            </w:tcMar>
+          </w:tcPr>
+          <w:p>
+            <w:pPr>
+              <w:jc w:val="center"/>
+            </w:pPr>
+            <w:r>
+              <w:rPr>
+                <w:rFonts w:ascii="Times New Roman" w:cs="Times New Roman" w:eastAsia="Times New Roman" w:hAnsi="Times New Roman"/>
+                <w:b w:val="false"/>
+                <w:bCs w:val="false"/>
+                <w:sz w:val="18"/>
+                <w:szCs w:val="18"/>
+              </w:rPr>
+              <w:t xml:space="preserve">impact&gt;=2</w:t>
+            </w:r>
+          </w:p>
+        </w:tc>
+        <w:tc>
+          <w:tcPr>
+            <w:tcW w:type="dxa" w:w="900"/>
+            <w:tcBorders>
+              <w:top w:val="single" w:color="AAAAAA" w:sz="4"/>
+              <w:left w:val="single" w:color="AAAAAA" w:sz="4"/>
+              <w:bottom w:val="single" w:color="AAAAAA" w:sz="4"/>
+              <w:right w:val="single" w:color="AAAAAA" w:sz="4"/>
+            </w:tcBorders>
+            <w:tcMar>
+              <w:top w:type="dxa" w:w="40"/>
+              <w:left w:type="dxa" w:w="80"/>
+              <w:bottom w:type="dxa" w:w="40"/>
+              <w:right w:type="dxa" w:w="80"/>
+            </w:tcMar>
+          </w:tcPr>
+          <w:p>
+            <w:pPr>
+              <w:jc w:val="center"/>
+            </w:pPr>
+            <w:r>
+              <w:rPr>
+                <w:rFonts w:ascii="Times New Roman" w:cs="Times New Roman" w:eastAsia="Times New Roman" w:hAnsi="Times New Roman"/>
+                <w:b w:val="false"/>
+                <w:bCs w:val="false"/>
+                <w:sz w:val="18"/>
+                <w:szCs w:val="18"/>
+              </w:rPr>
+              <w:t xml:space="preserve">198</w:t>
+            </w:r>
+          </w:p>
+        </w:tc>
+        <w:tc>
+          <w:tcPr>
+            <w:tcW w:type="dxa" w:w="1200"/>
+            <w:tcBorders>
+              <w:top w:val="single" w:color="AAAAAA" w:sz="4"/>
+              <w:left w:val="single" w:color="AAAAAA" w:sz="4"/>
+              <w:bottom w:val="single" w:color="AAAAAA" w:sz="4"/>
+              <w:right w:val="single" w:color="AAAAAA" w:sz="4"/>
+            </w:tcBorders>
+            <w:tcMar>
+              <w:top w:type="dxa" w:w="40"/>
+              <w:left w:type="dxa" w:w="80"/>
+              <w:bottom w:type="dxa" w:w="40"/>
+              <w:right w:type="dxa" w:w="80"/>
+            </w:tcMar>
+          </w:tcPr>
+          <w:p>
+            <w:pPr>
+              <w:jc w:val="center"/>
+            </w:pPr>
+            <w:r>
+              <w:rPr>
+                <w:rFonts w:ascii="Times New Roman" w:cs="Times New Roman" w:eastAsia="Times New Roman" w:hAnsi="Times New Roman"/>
+                <w:b w:val="false"/>
+                <w:bCs w:val="false"/>
+                <w:sz w:val="18"/>
+                <w:szCs w:val="18"/>
+              </w:rPr>
+              <w:t xml:space="preserve">0.13</w:t>
+            </w:r>
+          </w:p>
+        </w:tc>
+        <w:tc>
+          <w:tcPr>
+            <w:tcW w:type="dxa" w:w="1400"/>
+            <w:tcBorders>
+              <w:top w:val="single" w:color="AAAAAA" w:sz="4"/>
+              <w:left w:val="single" w:color="AAAAAA" w:sz="4"/>
+              <w:bottom w:val="single" w:color="AAAAAA" w:sz="4"/>
+              <w:right w:val="single" w:color="AAAAAA" w:sz="4"/>
+            </w:tcBorders>
+            <w:tcMar>
+              <w:top w:type="dxa" w:w="40"/>
+              <w:left w:type="dxa" w:w="80"/>
+              <w:bottom w:type="dxa" w:w="40"/>
+              <w:right w:type="dxa" w:w="80"/>
+            </w:tcMar>
+          </w:tcPr>
+          <w:p>
+            <w:pPr>
+              <w:jc w:val="center"/>
+            </w:pPr>
+            <w:r>
+              <w:rPr>
+                <w:rFonts w:ascii="Times New Roman" w:cs="Times New Roman" w:eastAsia="Times New Roman" w:hAnsi="Times New Roman"/>
+                <w:b w:val="false"/>
+                <w:bCs w:val="false"/>
+                <w:sz w:val="18"/>
+                <w:szCs w:val="18"/>
+              </w:rPr>
+              <w:t xml:space="preserve">1.14</w:t>
+            </w:r>
+          </w:p>
+        </w:tc>
+        <w:tc>
+          <w:tcPr>
+            <w:tcW w:type="dxa" w:w="1300"/>
+            <w:tcBorders>
+              <w:top w:val="single" w:color="AAAAAA" w:sz="4"/>
+              <w:left w:val="single" w:color="AAAAAA" w:sz="4"/>
+              <w:bottom w:val="single" w:color="AAAAAA" w:sz="4"/>
+              <w:right w:val="single" w:color="AAAAAA" w:sz="4"/>
+            </w:tcBorders>
+            <w:tcMar>
+              <w:top w:type="dxa" w:w="40"/>
+              <w:left w:type="dxa" w:w="80"/>
+              <w:bottom w:type="dxa" w:w="40"/>
+              <w:right w:type="dxa" w:w="80"/>
+            </w:tcMar>
+          </w:tcPr>
+          <w:p>
+            <w:pPr>
+              <w:jc w:val="center"/>
+            </w:pPr>
+            <w:r>
+              <w:rPr>
+                <w:rFonts w:ascii="Times New Roman" w:cs="Times New Roman" w:eastAsia="Times New Roman" w:hAnsi="Times New Roman"/>
+                <w:b w:val="false"/>
+                <w:bCs w:val="false"/>
+                <w:sz w:val="18"/>
+                <w:szCs w:val="18"/>
+              </w:rPr>
+              <w:t xml:space="preserve">5.8</w:t>
+            </w:r>
+          </w:p>
+        </w:tc>
+        <w:tc>
+          <w:tcPr>
+            <w:tcW w:type="dxa" w:w="1500"/>
+            <w:tcBorders>
+              <w:top w:val="single" w:color="AAAAAA" w:sz="4"/>
+              <w:left w:val="single" w:color="AAAAAA" w:sz="4"/>
+              <w:bottom w:val="single" w:color="AAAAAA" w:sz="4"/>
+              <w:right w:val="single" w:color="AAAAAA" w:sz="4"/>
+            </w:tcBorders>
+            <w:tcMar>
+              <w:top w:type="dxa" w:w="40"/>
+              <w:left w:type="dxa" w:w="80"/>
+              <w:bottom w:type="dxa" w:w="40"/>
+              <w:right w:type="dxa" w:w="80"/>
+            </w:tcMar>
+          </w:tcPr>
+          <w:p>
+            <w:pPr>
+              <w:jc w:val="center"/>
+            </w:pPr>
+            <w:r>
+              <w:rPr>
+                <w:rFonts w:ascii="Times New Roman" w:cs="Times New Roman" w:eastAsia="Times New Roman" w:hAnsi="Times New Roman"/>
+                <w:b w:val="false"/>
+                <w:bCs w:val="false"/>
+                <w:sz w:val="18"/>
+                <w:szCs w:val="18"/>
+              </w:rPr>
+              <w:t xml:space="preserve">13.4 (≤0.005)</w:t>
+            </w:r>
+          </w:p>
+        </w:tc>
+        <w:tc>
+          <w:tcPr>
+            <w:tcW w:type="dxa" w:w="1160"/>
+            <w:tcBorders>
+              <w:top w:val="single" w:color="AAAAAA" w:sz="4"/>
+              <w:left w:val="single" w:color="AAAAAA" w:sz="4"/>
+              <w:bottom w:val="single" w:color="AAAAAA" w:sz="4"/>
+              <w:right w:val="single" w:color="AAAAAA" w:sz="4"/>
+            </w:tcBorders>
+            <w:tcMar>
+              <w:top w:type="dxa" w:w="40"/>
+              <w:left w:type="dxa" w:w="80"/>
+              <w:bottom w:type="dxa" w:w="40"/>
+              <w:right w:type="dxa" w:w="80"/>
+            </w:tcMar>
+          </w:tcPr>
+          <w:p>
+            <w:pPr>
+              <w:jc w:val="center"/>
+            </w:pPr>
+            <w:r>
+              <w:rPr>
+                <w:rFonts w:ascii="Times New Roman" w:cs="Times New Roman" w:eastAsia="Times New Roman" w:hAnsi="Times New Roman"/>
+                <w:b w:val="false"/>
+                <w:bCs w:val="false"/>
+                <w:sz w:val="18"/>
+                <w:szCs w:val="18"/>
+              </w:rPr>
+              <w:t xml:space="preserve">5×10⁻4 → 0.13</w:t>
+            </w:r>
+          </w:p>
+        </w:tc>
+      </w:tr>
+    </w:tbl>
+    <w:p>
+      <w:pPr>
+        <w:spacing w:after="160" w:before="40"/>
+      </w:pPr>
+      <w:r>
+        <w:rPr>
+          <w:rFonts w:ascii="Times New Roman" w:cs="Times New Roman" w:eastAsia="Times New Roman" w:hAnsi="Times New Roman"/>
+          <w:i/>
+          <w:iCs/>
+          <w:sz w:val="18"/>
+          <w:szCs w:val="18"/>
+        </w:rPr>
+        <w:t xml:space="preserve">Baseline: weekday/weekend × hour-of-day profile estimated from the incident data; exponential excitation kernel; bootstrap p from 200 parametric simulations under the seasonal NHPP (smallest possible value 0.005). KS: Kolmogorov-Smirnov test of time-rescaled gaps against Exp(1), with the fitted compensator.</w:t>
+      </w:r>
+    </w:p>
+    <w:p>
+      <w:pPr>
+        <w:spacing w:after="120" w:line="300"/>
+        <w:jc w:val="both"/>
+      </w:pPr>
+      <w:r>
+        <w:rPr>
+          <w:rFonts w:ascii="Times New Roman" w:cs="Times New Roman" w:eastAsia="Times New Roman" w:hAnsi="Times New Roman"/>
+          <w:b/>
+          <w:bCs/>
+          <w:sz w:val="22"/>
+          <w:szCs w:val="22"/>
+        </w:rPr>
+        <w:t xml:space="preserve">Provider incidents: weekly seasonality plus mild self-excitation.</w:t>
+      </w:r>
+      <w:r>
+        <w:rPr>
+          <w:rFonts w:ascii="Times New Roman" w:cs="Times New Roman" w:eastAsia="Times New Roman" w:hAnsi="Times New Roman"/>
+          <w:sz w:val="22"/>
+          <w:szCs w:val="22"/>
+        </w:rPr>
+        <w:t xml:space="preserve"> Adding a self-exciting term to the seasonal NHPP improves the fit for every stream (AIC reductions of 11-26; the bootstrap rejects the NHPP for all four streams) and repairs the time-rescaling test that rejected the NHPP for the combined stream (p 5×10⁻4 → 0.47) and for Anthropic (1×10⁻6 → 0.13). The branching ratio is 0.11-0.21: about one incident in six or seven triggers a follow-up within hours (half-life 3.8-7.1 h), giving mean clusters of 1.12-1.27 incidents and an implied long-window Fano factor of 1.43 (Proposition 6b), consistent with the stratified dispersion index of 1.30 measured in Section 5.6. For human triage this means that a provider incident is often followed by a second one that arrives while the first is still being handled, but the effect is modest at this rate.</w:t>
+      </w:r>
+    </w:p>
+    <w:p>
+      <w:pPr>
+        <w:spacing w:after="120" w:line="300"/>
+        <w:jc w:val="both"/>
+      </w:pPr>
+      <w:r>
+        <w:rPr>
+          <w:rFonts w:ascii="Times New Roman" w:cs="Times New Roman" w:eastAsia="Times New Roman" w:hAnsi="Times New Roman"/>
+          <w:b/>
+          <w:bCs/>
+          <w:sz w:val="22"/>
+          <w:szCs w:val="22"/>
+        </w:rPr>
+        <w:t xml:space="preserve">Serving failures: heavy-tailed episodes on top of background errors.</w:t>
+      </w:r>
+      <w:r>
+        <w:rPr>
+          <w:rFonts w:ascii="Times New Roman" w:cs="Times New Roman" w:eastAsia="Times New Roman" w:hAnsi="Times New Roman"/>
+          <w:sz w:val="22"/>
+          <w:szCs w:val="22"/>
+        </w:rPr>
+        <w:t xml:space="preserve"> In the BurstGPT trace, failed requests are not spread out: 3.6% of active minutes (outage-like episodes, defined as minutes with more than 20% failed requests and at least five failures, merged when ten minutes apart) contain 68.1% of all 487,629 failures. The 672 episodes have a median duration of 4 minutes (90th percentile 27, maximum 455) and heavy-tailed sizes: median 78 failed requests, mean 494, 99th percentile 10419, maximum 27908 (CV 4.7; lognormal σ = 1.70; Hill tail index of the upper 20% about 0.9, which should not be over-interpreted at n = 672 but indicates a very heavy tail). Under Proposition 6c the Fano factor of failed-request counts per day is therefore dominated by a few large episodes, and a Poisson description of failed requests is wrong by orders of magnitude (daily failed requests range from a median of 91 to 76,531). The episodes themselves are not Poisson either: they average 2.9 per day with a daily dispersion index of 19.9, inter-arrival times have a coefficient of variation of 4.2, and a seasonal Hawkes process fits much better than a seasonal NHPP (AIC 4143 → 2374) with a branching ratio of 0.85 (half-life 2.4 h), although the rescaled-gap test still rejects the Hawkes fit (p = 4×10⁻7). The branching ratio depends on how episodes are delimited (Table 10): it stays between 0.52 and 0.85 for five definitions and the heavy tail of sizes persists, but the daily dispersion index of episode counts ranges from 2.1 to 19.9, so the quantitative conclusions are definition-dependent and only the direction (clustering and heavy tails) is robust.</w:t>
+      </w:r>
+    </w:p>
+    <w:p>
+      <w:pPr>
+        <w:keepNext/>
+        <w:spacing w:after="60" w:before="160"/>
+      </w:pPr>
+      <w:r>
+        <w:rPr>
+          <w:rFonts w:ascii="Times New Roman" w:cs="Times New Roman" w:eastAsia="Times New Roman" w:hAnsi="Times New Roman"/>
+          <w:b/>
+          <w:bCs/>
+          <w:sz w:val="20"/>
+          <w:szCs w:val="20"/>
+        </w:rPr>
+        <w:t xml:space="preserve">Table 10. Sensitivity of the BurstGPT failure-episode model to the episode definition</w:t>
+      </w:r>
+    </w:p>
+    <w:tbl>
+      <w:tblPr>
+        <w:tblW w:type="dxa" w:w="9360"/>
+        <w:tblBorders>
+          <w:top w:val="single" w:color="auto" w:sz="4"/>
+          <w:left w:val="single" w:color="auto" w:sz="4"/>
+          <w:bottom w:val="single" w:color="auto" w:sz="4"/>
+          <w:right w:val="single" w:color="auto" w:sz="4"/>
+          <w:insideH w:val="single" w:color="auto" w:sz="4"/>
+          <w:insideV w:val="single" w:color="auto" w:sz="4"/>
+        </w:tblBorders>
+      </w:tblPr>
+      <w:tblGrid>
+        <w:gridCol w:w="1300"/>
+        <w:gridCol w:w="1100"/>
+        <w:gridCol w:w="1000"/>
+        <w:gridCol w:w="900"/>
+        <w:gridCol w:w="1100"/>
+        <w:gridCol w:w="1200"/>
+        <w:gridCol w:w="900"/>
+        <w:gridCol w:w="1860"/>
+      </w:tblGrid>
+      <w:tr>
+        <w:trPr>
+          <w:tblHeader/>
+        </w:trPr>
+        <w:tc>
+          <w:tcPr>
+            <w:tcW w:type="dxa" w:w="1300"/>
+            <w:tcBorders>
+              <w:top w:val="single" w:color="AAAAAA" w:sz="4"/>
+              <w:left w:val="single" w:color="AAAAAA" w:sz="4"/>
+              <w:bottom w:val="single" w:color="AAAAAA" w:sz="4"/>
+              <w:right w:val="single" w:color="AAAAAA" w:sz="4"/>
+            </w:tcBorders>
+            <w:shd w:fill="E8E8E8" w:color="auto" w:val="clear"/>
+            <w:tcMar>
+              <w:top w:type="dxa" w:w="40"/>
+              <w:left w:type="dxa" w:w="80"/>
+              <w:bottom w:type="dxa" w:w="40"/>
+              <w:right w:type="dxa" w:w="80"/>
+            </w:tcMar>
+          </w:tcPr>
+          <w:p>
+            <w:pPr>
+              <w:jc w:val="center"/>
+            </w:pPr>
+            <w:r>
+              <w:rPr>
+                <w:rFonts w:ascii="Times New Roman" w:cs="Times New Roman" w:eastAsia="Times New Roman" w:hAnsi="Times New Roman"/>
+                <w:b/>
+                <w:bCs/>
+                <w:sz w:val="18"/>
+                <w:szCs w:val="18"/>
+              </w:rPr>
+              <w:t xml:space="preserve">Failure-share threshold</w:t>
+            </w:r>
+          </w:p>
+        </w:tc>
+        <w:tc>
+          <w:tcPr>
+            <w:tcW w:type="dxa" w:w="1100"/>
+            <w:tcBorders>
+              <w:top w:val="single" w:color="AAAAAA" w:sz="4"/>
+              <w:left w:val="single" w:color="AAAAAA" w:sz="4"/>
+              <w:bottom w:val="single" w:color="AAAAAA" w:sz="4"/>
+              <w:right w:val="single" w:color="AAAAAA" w:sz="4"/>
+            </w:tcBorders>
+            <w:shd w:fill="E8E8E8" w:color="auto" w:val="clear"/>
+            <w:tcMar>
+              <w:top w:type="dxa" w:w="40"/>
+              <w:left w:type="dxa" w:w="80"/>
+              <w:bottom w:type="dxa" w:w="40"/>
+              <w:right w:type="dxa" w:w="80"/>
+            </w:tcMar>
+          </w:tcPr>
+          <w:p>
+            <w:pPr>
+              <w:jc w:val="center"/>
+            </w:pPr>
+            <w:r>
+              <w:rPr>
+                <w:rFonts w:ascii="Times New Roman" w:cs="Times New Roman" w:eastAsia="Times New Roman" w:hAnsi="Times New Roman"/>
+                <w:b/>
+                <w:bCs/>
+                <w:sz w:val="18"/>
+                <w:szCs w:val="18"/>
+              </w:rPr>
+              <w:t xml:space="preserve">Min. failures per minute</w:t>
+            </w:r>
+          </w:p>
+        </w:tc>
+        <w:tc>
+          <w:tcPr>
+            <w:tcW w:type="dxa" w:w="1000"/>
+            <w:tcBorders>
+              <w:top w:val="single" w:color="AAAAAA" w:sz="4"/>
+              <w:left w:val="single" w:color="AAAAAA" w:sz="4"/>
+              <w:bottom w:val="single" w:color="AAAAAA" w:sz="4"/>
+              <w:right w:val="single" w:color="AAAAAA" w:sz="4"/>
+            </w:tcBorders>
+            <w:shd w:fill="E8E8E8" w:color="auto" w:val="clear"/>
+            <w:tcMar>
+              <w:top w:type="dxa" w:w="40"/>
+              <w:left w:type="dxa" w:w="80"/>
+              <w:bottom w:type="dxa" w:w="40"/>
+              <w:right w:type="dxa" w:w="80"/>
+            </w:tcMar>
+          </w:tcPr>
+          <w:p>
+            <w:pPr>
+              <w:jc w:val="center"/>
+            </w:pPr>
+            <w:r>
+              <w:rPr>
+                <w:rFonts w:ascii="Times New Roman" w:cs="Times New Roman" w:eastAsia="Times New Roman" w:hAnsi="Times New Roman"/>
+                <w:b/>
+                <w:bCs/>
+                <w:sz w:val="18"/>
+                <w:szCs w:val="18"/>
+              </w:rPr>
+              <w:t xml:space="preserve">Merge gap (min)</w:t>
+            </w:r>
+          </w:p>
+        </w:tc>
+        <w:tc>
+          <w:tcPr>
+            <w:tcW w:type="dxa" w:w="900"/>
+            <w:tcBorders>
+              <w:top w:val="single" w:color="AAAAAA" w:sz="4"/>
+              <w:left w:val="single" w:color="AAAAAA" w:sz="4"/>
+              <w:bottom w:val="single" w:color="AAAAAA" w:sz="4"/>
+              <w:right w:val="single" w:color="AAAAAA" w:sz="4"/>
+            </w:tcBorders>
+            <w:shd w:fill="E8E8E8" w:color="auto" w:val="clear"/>
+            <w:tcMar>
+              <w:top w:type="dxa" w:w="40"/>
+              <w:left w:type="dxa" w:w="80"/>
+              <w:bottom w:type="dxa" w:w="40"/>
+              <w:right w:type="dxa" w:w="80"/>
+            </w:tcMar>
+          </w:tcPr>
+          <w:p>
+            <w:pPr>
+              <w:jc w:val="center"/>
+            </w:pPr>
+            <w:r>
+              <w:rPr>
+                <w:rFonts w:ascii="Times New Roman" w:cs="Times New Roman" w:eastAsia="Times New Roman" w:hAnsi="Times New Roman"/>
+                <w:b/>
+                <w:bCs/>
+                <w:sz w:val="18"/>
+                <w:szCs w:val="18"/>
+              </w:rPr>
+              <w:t xml:space="preserve">Episodes</w:t>
+            </w:r>
+          </w:p>
+        </w:tc>
+        <w:tc>
+          <w:tcPr>
+            <w:tcW w:type="dxa" w:w="1100"/>
+            <w:tcBorders>
+              <w:top w:val="single" w:color="AAAAAA" w:sz="4"/>
+              <w:left w:val="single" w:color="AAAAAA" w:sz="4"/>
+              <w:bottom w:val="single" w:color="AAAAAA" w:sz="4"/>
+              <w:right w:val="single" w:color="AAAAAA" w:sz="4"/>
+            </w:tcBorders>
+            <w:shd w:fill="E8E8E8" w:color="auto" w:val="clear"/>
+            <w:tcMar>
+              <w:top w:type="dxa" w:w="40"/>
+              <w:left w:type="dxa" w:w="80"/>
+              <w:bottom w:type="dxa" w:w="40"/>
+              <w:right w:type="dxa" w:w="80"/>
+            </w:tcMar>
+          </w:tcPr>
+          <w:p>
+            <w:pPr>
+              <w:jc w:val="center"/>
+            </w:pPr>
+            <w:r>
+              <w:rPr>
+                <w:rFonts w:ascii="Times New Roman" w:cs="Times New Roman" w:eastAsia="Times New Roman" w:hAnsi="Times New Roman"/>
+                <w:b/>
+                <w:bCs/>
+                <w:sz w:val="18"/>
+                <w:szCs w:val="18"/>
+              </w:rPr>
+              <w:t xml:space="preserve">Share of failures</w:t>
+            </w:r>
+          </w:p>
+        </w:tc>
+        <w:tc>
+          <w:tcPr>
+            <w:tcW w:type="dxa" w:w="1200"/>
+            <w:tcBorders>
+              <w:top w:val="single" w:color="AAAAAA" w:sz="4"/>
+              <w:left w:val="single" w:color="AAAAAA" w:sz="4"/>
+              <w:bottom w:val="single" w:color="AAAAAA" w:sz="4"/>
+              <w:right w:val="single" w:color="AAAAAA" w:sz="4"/>
+            </w:tcBorders>
+            <w:shd w:fill="E8E8E8" w:color="auto" w:val="clear"/>
+            <w:tcMar>
+              <w:top w:type="dxa" w:w="40"/>
+              <w:left w:type="dxa" w:w="80"/>
+              <w:bottom w:type="dxa" w:w="40"/>
+              <w:right w:type="dxa" w:w="80"/>
+            </w:tcMar>
+          </w:tcPr>
+          <w:p>
+            <w:pPr>
+              <w:jc w:val="center"/>
+            </w:pPr>
+            <w:r>
+              <w:rPr>
+                <w:rFonts w:ascii="Times New Roman" w:cs="Times New Roman" w:eastAsia="Times New Roman" w:hAnsi="Times New Roman"/>
+                <w:b/>
+                <w:bCs/>
+                <w:sz w:val="18"/>
+                <w:szCs w:val="18"/>
+              </w:rPr>
+              <w:t xml:space="preserve">Daily dispersion index</w:t>
+            </w:r>
+          </w:p>
+        </w:tc>
+        <w:tc>
+          <w:tcPr>
+            <w:tcW w:type="dxa" w:w="900"/>
+            <w:tcBorders>
+              <w:top w:val="single" w:color="AAAAAA" w:sz="4"/>
+              <w:left w:val="single" w:color="AAAAAA" w:sz="4"/>
+              <w:bottom w:val="single" w:color="AAAAAA" w:sz="4"/>
+              <w:right w:val="single" w:color="AAAAAA" w:sz="4"/>
+            </w:tcBorders>
+            <w:shd w:fill="E8E8E8" w:color="auto" w:val="clear"/>
+            <w:tcMar>
+              <w:top w:type="dxa" w:w="40"/>
+              <w:left w:type="dxa" w:w="80"/>
+              <w:bottom w:type="dxa" w:w="40"/>
+              <w:right w:type="dxa" w:w="80"/>
+            </w:tcMar>
+          </w:tcPr>
+          <w:p>
+            <w:pPr>
+              <w:jc w:val="center"/>
+            </w:pPr>
+            <w:r>
+              <w:rPr>
+                <w:rFonts w:ascii="Times New Roman" w:cs="Times New Roman" w:eastAsia="Times New Roman" w:hAnsi="Times New Roman"/>
+                <w:b/>
+                <w:bCs/>
+                <w:sz w:val="18"/>
+                <w:szCs w:val="18"/>
+              </w:rPr>
+              <w:t xml:space="preserve">Hawkes α</w:t>
+            </w:r>
+          </w:p>
+        </w:tc>
+        <w:tc>
+          <w:tcPr>
+            <w:tcW w:type="dxa" w:w="1860"/>
+            <w:tcBorders>
+              <w:top w:val="single" w:color="AAAAAA" w:sz="4"/>
+              <w:left w:val="single" w:color="AAAAAA" w:sz="4"/>
+              <w:bottom w:val="single" w:color="AAAAAA" w:sz="4"/>
+              <w:right w:val="single" w:color="AAAAAA" w:sz="4"/>
+            </w:tcBorders>
+            <w:shd w:fill="E8E8E8" w:color="auto" w:val="clear"/>
+            <w:tcMar>
+              <w:top w:type="dxa" w:w="40"/>
+              <w:left w:type="dxa" w:w="80"/>
+              <w:bottom w:type="dxa" w:w="40"/>
+              <w:right w:type="dxa" w:w="80"/>
+            </w:tcMar>
+          </w:tcPr>
+          <w:p>
+            <w:pPr>
+              <w:jc w:val="center"/>
+            </w:pPr>
+            <w:r>
+              <w:rPr>
+                <w:rFonts w:ascii="Times New Roman" w:cs="Times New Roman" w:eastAsia="Times New Roman" w:hAnsi="Times New Roman"/>
+                <w:b/>
+                <w:bCs/>
+                <w:sz w:val="18"/>
+                <w:szCs w:val="18"/>
+              </w:rPr>
+              <w:t xml:space="preserve">Median / 99th pct size</w:t>
+            </w:r>
+          </w:p>
+        </w:tc>
+      </w:tr>
+      <w:tr>
+        <w:tc>
+          <w:tcPr>
+            <w:tcW w:type="dxa" w:w="1300"/>
+            <w:tcBorders>
+              <w:top w:val="single" w:color="AAAAAA" w:sz="4"/>
+              <w:left w:val="single" w:color="AAAAAA" w:sz="4"/>
+              <w:bottom w:val="single" w:color="AAAAAA" w:sz="4"/>
+              <w:right w:val="single" w:color="AAAAAA" w:sz="4"/>
+            </w:tcBorders>
+            <w:tcMar>
+              <w:top w:type="dxa" w:w="40"/>
+              <w:left w:type="dxa" w:w="80"/>
+              <w:bottom w:type="dxa" w:w="40"/>
+              <w:right w:type="dxa" w:w="80"/>
+            </w:tcMar>
+          </w:tcPr>
+          <w:p>
+            <w:pPr>
+              <w:jc w:val="center"/>
+            </w:pPr>
+            <w:r>
+              <w:rPr>
+                <w:rFonts w:ascii="Times New Roman" w:cs="Times New Roman" w:eastAsia="Times New Roman" w:hAnsi="Times New Roman"/>
+                <w:b w:val="false"/>
+                <w:bCs w:val="false"/>
+                <w:sz w:val="18"/>
+                <w:szCs w:val="18"/>
+              </w:rPr>
+              <w:t xml:space="preserve">20.0%</w:t>
+            </w:r>
+          </w:p>
+        </w:tc>
+        <w:tc>
+          <w:tcPr>
+            <w:tcW w:type="dxa" w:w="1100"/>
+            <w:tcBorders>
+              <w:top w:val="single" w:color="AAAAAA" w:sz="4"/>
+              <w:left w:val="single" w:color="AAAAAA" w:sz="4"/>
+              <w:bottom w:val="single" w:color="AAAAAA" w:sz="4"/>
+              <w:right w:val="single" w:color="AAAAAA" w:sz="4"/>
+            </w:tcBorders>
+            <w:tcMar>
+              <w:top w:type="dxa" w:w="40"/>
+              <w:left w:type="dxa" w:w="80"/>
+              <w:bottom w:type="dxa" w:w="40"/>
+              <w:right w:type="dxa" w:w="80"/>
+            </w:tcMar>
+          </w:tcPr>
+          <w:p>
+            <w:pPr>
+              <w:jc w:val="center"/>
+            </w:pPr>
+            <w:r>
+              <w:rPr>
+                <w:rFonts w:ascii="Times New Roman" w:cs="Times New Roman" w:eastAsia="Times New Roman" w:hAnsi="Times New Roman"/>
+                <w:b w:val="false"/>
+                <w:bCs w:val="false"/>
+                <w:sz w:val="18"/>
+                <w:szCs w:val="18"/>
+              </w:rPr>
+              <w:t xml:space="preserve">5</w:t>
+            </w:r>
+          </w:p>
+        </w:tc>
+        <w:tc>
+          <w:tcPr>
+            <w:tcW w:type="dxa" w:w="1000"/>
+            <w:tcBorders>
+              <w:top w:val="single" w:color="AAAAAA" w:sz="4"/>
+              <w:left w:val="single" w:color="AAAAAA" w:sz="4"/>
+              <w:bottom w:val="single" w:color="AAAAAA" w:sz="4"/>
+              <w:right w:val="single" w:color="AAAAAA" w:sz="4"/>
+            </w:tcBorders>
+            <w:tcMar>
+              <w:top w:type="dxa" w:w="40"/>
+              <w:left w:type="dxa" w:w="80"/>
+              <w:bottom w:type="dxa" w:w="40"/>
+              <w:right w:type="dxa" w:w="80"/>
+            </w:tcMar>
+          </w:tcPr>
+          <w:p>
+            <w:pPr>
+              <w:jc w:val="center"/>
+            </w:pPr>
+            <w:r>
+              <w:rPr>
+                <w:rFonts w:ascii="Times New Roman" w:cs="Times New Roman" w:eastAsia="Times New Roman" w:hAnsi="Times New Roman"/>
+                <w:b w:val="false"/>
+                <w:bCs w:val="false"/>
+                <w:sz w:val="18"/>
+                <w:szCs w:val="18"/>
+              </w:rPr>
+              <w:t xml:space="preserve">10</w:t>
+            </w:r>
+          </w:p>
+        </w:tc>
+        <w:tc>
+          <w:tcPr>
+            <w:tcW w:type="dxa" w:w="900"/>
+            <w:tcBorders>
+              <w:top w:val="single" w:color="AAAAAA" w:sz="4"/>
+              <w:left w:val="single" w:color="AAAAAA" w:sz="4"/>
+              <w:bottom w:val="single" w:color="AAAAAA" w:sz="4"/>
+              <w:right w:val="single" w:color="AAAAAA" w:sz="4"/>
+            </w:tcBorders>
+            <w:tcMar>
+              <w:top w:type="dxa" w:w="40"/>
+              <w:left w:type="dxa" w:w="80"/>
+              <w:bottom w:type="dxa" w:w="40"/>
+              <w:right w:type="dxa" w:w="80"/>
+            </w:tcMar>
+          </w:tcPr>
+          <w:p>
+            <w:pPr>
+              <w:jc w:val="center"/>
+            </w:pPr>
+            <w:r>
+              <w:rPr>
+                <w:rFonts w:ascii="Times New Roman" w:cs="Times New Roman" w:eastAsia="Times New Roman" w:hAnsi="Times New Roman"/>
+                <w:b w:val="false"/>
+                <w:bCs w:val="false"/>
+                <w:sz w:val="18"/>
+                <w:szCs w:val="18"/>
+              </w:rPr>
+              <w:t xml:space="preserve">672</w:t>
+            </w:r>
+          </w:p>
+        </w:tc>
+        <w:tc>
+          <w:tcPr>
+            <w:tcW w:type="dxa" w:w="1100"/>
+            <w:tcBorders>
+              <w:top w:val="single" w:color="AAAAAA" w:sz="4"/>
+              <w:left w:val="single" w:color="AAAAAA" w:sz="4"/>
+              <w:bottom w:val="single" w:color="AAAAAA" w:sz="4"/>
+              <w:right w:val="single" w:color="AAAAAA" w:sz="4"/>
+            </w:tcBorders>
+            <w:tcMar>
+              <w:top w:type="dxa" w:w="40"/>
+              <w:left w:type="dxa" w:w="80"/>
+              <w:bottom w:type="dxa" w:w="40"/>
+              <w:right w:type="dxa" w:w="80"/>
+            </w:tcMar>
+          </w:tcPr>
+          <w:p>
+            <w:pPr>
+              <w:jc w:val="center"/>
+            </w:pPr>
+            <w:r>
+              <w:rPr>
+                <w:rFonts w:ascii="Times New Roman" w:cs="Times New Roman" w:eastAsia="Times New Roman" w:hAnsi="Times New Roman"/>
+                <w:b w:val="false"/>
+                <w:bCs w:val="false"/>
+                <w:sz w:val="18"/>
+                <w:szCs w:val="18"/>
+              </w:rPr>
+              <w:t xml:space="preserve">68.1%</w:t>
+            </w:r>
+          </w:p>
+        </w:tc>
+        <w:tc>
+          <w:tcPr>
+            <w:tcW w:type="dxa" w:w="1200"/>
+            <w:tcBorders>
+              <w:top w:val="single" w:color="AAAAAA" w:sz="4"/>
+              <w:left w:val="single" w:color="AAAAAA" w:sz="4"/>
+              <w:bottom w:val="single" w:color="AAAAAA" w:sz="4"/>
+              <w:right w:val="single" w:color="AAAAAA" w:sz="4"/>
+            </w:tcBorders>
+            <w:tcMar>
+              <w:top w:type="dxa" w:w="40"/>
+              <w:left w:type="dxa" w:w="80"/>
+              <w:bottom w:type="dxa" w:w="40"/>
+              <w:right w:type="dxa" w:w="80"/>
+            </w:tcMar>
+          </w:tcPr>
+          <w:p>
+            <w:pPr>
+              <w:jc w:val="center"/>
+            </w:pPr>
+            <w:r>
+              <w:rPr>
+                <w:rFonts w:ascii="Times New Roman" w:cs="Times New Roman" w:eastAsia="Times New Roman" w:hAnsi="Times New Roman"/>
+                <w:b w:val="false"/>
+                <w:bCs w:val="false"/>
+                <w:sz w:val="18"/>
+                <w:szCs w:val="18"/>
+              </w:rPr>
+              <w:t xml:space="preserve">19.9</w:t>
+            </w:r>
+          </w:p>
+        </w:tc>
+        <w:tc>
+          <w:tcPr>
+            <w:tcW w:type="dxa" w:w="900"/>
+            <w:tcBorders>
+              <w:top w:val="single" w:color="AAAAAA" w:sz="4"/>
+              <w:left w:val="single" w:color="AAAAAA" w:sz="4"/>
+              <w:bottom w:val="single" w:color="AAAAAA" w:sz="4"/>
+              <w:right w:val="single" w:color="AAAAAA" w:sz="4"/>
+            </w:tcBorders>
+            <w:tcMar>
+              <w:top w:type="dxa" w:w="40"/>
+              <w:left w:type="dxa" w:w="80"/>
+              <w:bottom w:type="dxa" w:w="40"/>
+              <w:right w:type="dxa" w:w="80"/>
+            </w:tcMar>
+          </w:tcPr>
+          <w:p>
+            <w:pPr>
+              <w:jc w:val="center"/>
+            </w:pPr>
+            <w:r>
+              <w:rPr>
+                <w:rFonts w:ascii="Times New Roman" w:cs="Times New Roman" w:eastAsia="Times New Roman" w:hAnsi="Times New Roman"/>
+                <w:b w:val="false"/>
+                <w:bCs w:val="false"/>
+                <w:sz w:val="18"/>
+                <w:szCs w:val="18"/>
+              </w:rPr>
+              <w:t xml:space="preserve">0.85</w:t>
+            </w:r>
+          </w:p>
+        </w:tc>
+        <w:tc>
+          <w:tcPr>
+            <w:tcW w:type="dxa" w:w="1860"/>
+            <w:tcBorders>
+              <w:top w:val="single" w:color="AAAAAA" w:sz="4"/>
+              <w:left w:val="single" w:color="AAAAAA" w:sz="4"/>
+              <w:bottom w:val="single" w:color="AAAAAA" w:sz="4"/>
+              <w:right w:val="single" w:color="AAAAAA" w:sz="4"/>
+            </w:tcBorders>
+            <w:tcMar>
+              <w:top w:type="dxa" w:w="40"/>
+              <w:left w:type="dxa" w:w="80"/>
+              <w:bottom w:type="dxa" w:w="40"/>
+              <w:right w:type="dxa" w:w="80"/>
+            </w:tcMar>
+          </w:tcPr>
+          <w:p>
+            <w:pPr>
+              <w:jc w:val="center"/>
+            </w:pPr>
+            <w:r>
+              <w:rPr>
+                <w:rFonts w:ascii="Times New Roman" w:cs="Times New Roman" w:eastAsia="Times New Roman" w:hAnsi="Times New Roman"/>
+                <w:b w:val="false"/>
+                <w:bCs w:val="false"/>
+                <w:sz w:val="18"/>
+                <w:szCs w:val="18"/>
+              </w:rPr>
+              <w:t xml:space="preserve">78 / 10419</w:t>
+            </w:r>
+          </w:p>
+        </w:tc>
+      </w:tr>
+      <w:tr>
+        <w:tc>
+          <w:tcPr>
+            <w:tcW w:type="dxa" w:w="1300"/>
+            <w:tcBorders>
+              <w:top w:val="single" w:color="AAAAAA" w:sz="4"/>
+              <w:left w:val="single" w:color="AAAAAA" w:sz="4"/>
+              <w:bottom w:val="single" w:color="AAAAAA" w:sz="4"/>
+              <w:right w:val="single" w:color="AAAAAA" w:sz="4"/>
+            </w:tcBorders>
+            <w:tcMar>
+              <w:top w:type="dxa" w:w="40"/>
+              <w:left w:type="dxa" w:w="80"/>
+              <w:bottom w:type="dxa" w:w="40"/>
+              <w:right w:type="dxa" w:w="80"/>
+            </w:tcMar>
+          </w:tcPr>
+          <w:p>
+            <w:pPr>
+              <w:jc w:val="center"/>
+            </w:pPr>
+            <w:r>
+              <w:rPr>
+                <w:rFonts w:ascii="Times New Roman" w:cs="Times New Roman" w:eastAsia="Times New Roman" w:hAnsi="Times New Roman"/>
+                <w:b w:val="false"/>
+                <w:bCs w:val="false"/>
+                <w:sz w:val="18"/>
+                <w:szCs w:val="18"/>
+              </w:rPr>
+              <w:t xml:space="preserve">20.0%</w:t>
+            </w:r>
+          </w:p>
+        </w:tc>
+        <w:tc>
+          <w:tcPr>
+            <w:tcW w:type="dxa" w:w="1100"/>
+            <w:tcBorders>
+              <w:top w:val="single" w:color="AAAAAA" w:sz="4"/>
+              <w:left w:val="single" w:color="AAAAAA" w:sz="4"/>
+              <w:bottom w:val="single" w:color="AAAAAA" w:sz="4"/>
+              <w:right w:val="single" w:color="AAAAAA" w:sz="4"/>
+            </w:tcBorders>
+            <w:tcMar>
+              <w:top w:type="dxa" w:w="40"/>
+              <w:left w:type="dxa" w:w="80"/>
+              <w:bottom w:type="dxa" w:w="40"/>
+              <w:right w:type="dxa" w:w="80"/>
+            </w:tcMar>
+          </w:tcPr>
+          <w:p>
+            <w:pPr>
+              <w:jc w:val="center"/>
+            </w:pPr>
+            <w:r>
+              <w:rPr>
+                <w:rFonts w:ascii="Times New Roman" w:cs="Times New Roman" w:eastAsia="Times New Roman" w:hAnsi="Times New Roman"/>
+                <w:b w:val="false"/>
+                <w:bCs w:val="false"/>
+                <w:sz w:val="18"/>
+                <w:szCs w:val="18"/>
+              </w:rPr>
+              <w:t xml:space="preserve">5</w:t>
+            </w:r>
+          </w:p>
+        </w:tc>
+        <w:tc>
+          <w:tcPr>
+            <w:tcW w:type="dxa" w:w="1000"/>
+            <w:tcBorders>
+              <w:top w:val="single" w:color="AAAAAA" w:sz="4"/>
+              <w:left w:val="single" w:color="AAAAAA" w:sz="4"/>
+              <w:bottom w:val="single" w:color="AAAAAA" w:sz="4"/>
+              <w:right w:val="single" w:color="AAAAAA" w:sz="4"/>
+            </w:tcBorders>
+            <w:tcMar>
+              <w:top w:type="dxa" w:w="40"/>
+              <w:left w:type="dxa" w:w="80"/>
+              <w:bottom w:type="dxa" w:w="40"/>
+              <w:right w:type="dxa" w:w="80"/>
+            </w:tcMar>
+          </w:tcPr>
+          <w:p>
+            <w:pPr>
+              <w:jc w:val="center"/>
+            </w:pPr>
+            <w:r>
+              <w:rPr>
+                <w:rFonts w:ascii="Times New Roman" w:cs="Times New Roman" w:eastAsia="Times New Roman" w:hAnsi="Times New Roman"/>
+                <w:b w:val="false"/>
+                <w:bCs w:val="false"/>
+                <w:sz w:val="18"/>
+                <w:szCs w:val="18"/>
+              </w:rPr>
+              <w:t xml:space="preserve">60</w:t>
+            </w:r>
+          </w:p>
+        </w:tc>
+        <w:tc>
+          <w:tcPr>
+            <w:tcW w:type="dxa" w:w="900"/>
+            <w:tcBorders>
+              <w:top w:val="single" w:color="AAAAAA" w:sz="4"/>
+              <w:left w:val="single" w:color="AAAAAA" w:sz="4"/>
+              <w:bottom w:val="single" w:color="AAAAAA" w:sz="4"/>
+              <w:right w:val="single" w:color="AAAAAA" w:sz="4"/>
+            </w:tcBorders>
+            <w:tcMar>
+              <w:top w:type="dxa" w:w="40"/>
+              <w:left w:type="dxa" w:w="80"/>
+              <w:bottom w:type="dxa" w:w="40"/>
+              <w:right w:type="dxa" w:w="80"/>
+            </w:tcMar>
+          </w:tcPr>
+          <w:p>
+            <w:pPr>
+              <w:jc w:val="center"/>
+            </w:pPr>
+            <w:r>
+              <w:rPr>
+                <w:rFonts w:ascii="Times New Roman" w:cs="Times New Roman" w:eastAsia="Times New Roman" w:hAnsi="Times New Roman"/>
+                <w:b w:val="false"/>
+                <w:bCs w:val="false"/>
+                <w:sz w:val="18"/>
+                <w:szCs w:val="18"/>
+              </w:rPr>
+              <w:t xml:space="preserve">211</w:t>
+            </w:r>
+          </w:p>
+        </w:tc>
+        <w:tc>
+          <w:tcPr>
+            <w:tcW w:type="dxa" w:w="1100"/>
+            <w:tcBorders>
+              <w:top w:val="single" w:color="AAAAAA" w:sz="4"/>
+              <w:left w:val="single" w:color="AAAAAA" w:sz="4"/>
+              <w:bottom w:val="single" w:color="AAAAAA" w:sz="4"/>
+              <w:right w:val="single" w:color="AAAAAA" w:sz="4"/>
+            </w:tcBorders>
+            <w:tcMar>
+              <w:top w:type="dxa" w:w="40"/>
+              <w:left w:type="dxa" w:w="80"/>
+              <w:bottom w:type="dxa" w:w="40"/>
+              <w:right w:type="dxa" w:w="80"/>
+            </w:tcMar>
+          </w:tcPr>
+          <w:p>
+            <w:pPr>
+              <w:jc w:val="center"/>
+            </w:pPr>
+            <w:r>
+              <w:rPr>
+                <w:rFonts w:ascii="Times New Roman" w:cs="Times New Roman" w:eastAsia="Times New Roman" w:hAnsi="Times New Roman"/>
+                <w:b w:val="false"/>
+                <w:bCs w:val="false"/>
+                <w:sz w:val="18"/>
+                <w:szCs w:val="18"/>
+              </w:rPr>
+              <w:t xml:space="preserve">88.9%</w:t>
+            </w:r>
+          </w:p>
+        </w:tc>
+        <w:tc>
+          <w:tcPr>
+            <w:tcW w:type="dxa" w:w="1200"/>
+            <w:tcBorders>
+              <w:top w:val="single" w:color="AAAAAA" w:sz="4"/>
+              <w:left w:val="single" w:color="AAAAAA" w:sz="4"/>
+              <w:bottom w:val="single" w:color="AAAAAA" w:sz="4"/>
+              <w:right w:val="single" w:color="AAAAAA" w:sz="4"/>
+            </w:tcBorders>
+            <w:tcMar>
+              <w:top w:type="dxa" w:w="40"/>
+              <w:left w:type="dxa" w:w="80"/>
+              <w:bottom w:type="dxa" w:w="40"/>
+              <w:right w:type="dxa" w:w="80"/>
+            </w:tcMar>
+          </w:tcPr>
+          <w:p>
+            <w:pPr>
+              <w:jc w:val="center"/>
+            </w:pPr>
+            <w:r>
+              <w:rPr>
+                <w:rFonts w:ascii="Times New Roman" w:cs="Times New Roman" w:eastAsia="Times New Roman" w:hAnsi="Times New Roman"/>
+                <w:b w:val="false"/>
+                <w:bCs w:val="false"/>
+                <w:sz w:val="18"/>
+                <w:szCs w:val="18"/>
+              </w:rPr>
+              <w:t xml:space="preserve">2.1</w:t>
+            </w:r>
+          </w:p>
+        </w:tc>
+        <w:tc>
+          <w:tcPr>
+            <w:tcW w:type="dxa" w:w="900"/>
+            <w:tcBorders>
+              <w:top w:val="single" w:color="AAAAAA" w:sz="4"/>
+              <w:left w:val="single" w:color="AAAAAA" w:sz="4"/>
+              <w:bottom w:val="single" w:color="AAAAAA" w:sz="4"/>
+              <w:right w:val="single" w:color="AAAAAA" w:sz="4"/>
+            </w:tcBorders>
+            <w:tcMar>
+              <w:top w:type="dxa" w:w="40"/>
+              <w:left w:type="dxa" w:w="80"/>
+              <w:bottom w:type="dxa" w:w="40"/>
+              <w:right w:type="dxa" w:w="80"/>
+            </w:tcMar>
+          </w:tcPr>
+          <w:p>
+            <w:pPr>
+              <w:jc w:val="center"/>
+            </w:pPr>
+            <w:r>
+              <w:rPr>
+                <w:rFonts w:ascii="Times New Roman" w:cs="Times New Roman" w:eastAsia="Times New Roman" w:hAnsi="Times New Roman"/>
+                <w:b w:val="false"/>
+                <w:bCs w:val="false"/>
+                <w:sz w:val="18"/>
+                <w:szCs w:val="18"/>
+              </w:rPr>
+              <w:t xml:space="preserve">0.74</w:t>
+            </w:r>
+          </w:p>
+        </w:tc>
+        <w:tc>
+          <w:tcPr>
+            <w:tcW w:type="dxa" w:w="1860"/>
+            <w:tcBorders>
+              <w:top w:val="single" w:color="AAAAAA" w:sz="4"/>
+              <w:left w:val="single" w:color="AAAAAA" w:sz="4"/>
+              <w:bottom w:val="single" w:color="AAAAAA" w:sz="4"/>
+              <w:right w:val="single" w:color="AAAAAA" w:sz="4"/>
+            </w:tcBorders>
+            <w:tcMar>
+              <w:top w:type="dxa" w:w="40"/>
+              <w:left w:type="dxa" w:w="80"/>
+              <w:bottom w:type="dxa" w:w="40"/>
+              <w:right w:type="dxa" w:w="80"/>
+            </w:tcMar>
+          </w:tcPr>
+          <w:p>
+            <w:pPr>
+              <w:jc w:val="center"/>
+            </w:pPr>
+            <w:r>
+              <w:rPr>
+                <w:rFonts w:ascii="Times New Roman" w:cs="Times New Roman" w:eastAsia="Times New Roman" w:hAnsi="Times New Roman"/>
+                <w:b w:val="false"/>
+                <w:bCs w:val="false"/>
+                <w:sz w:val="18"/>
+                <w:szCs w:val="18"/>
+              </w:rPr>
+              <w:t xml:space="preserve">80 / 32372</w:t>
+            </w:r>
+          </w:p>
+        </w:tc>
+      </w:tr>
+      <w:tr>
+        <w:tc>
+          <w:tcPr>
+            <w:tcW w:type="dxa" w:w="1300"/>
+            <w:tcBorders>
+              <w:top w:val="single" w:color="AAAAAA" w:sz="4"/>
+              <w:left w:val="single" w:color="AAAAAA" w:sz="4"/>
+              <w:bottom w:val="single" w:color="AAAAAA" w:sz="4"/>
+              <w:right w:val="single" w:color="AAAAAA" w:sz="4"/>
+            </w:tcBorders>
+            <w:tcMar>
+              <w:top w:type="dxa" w:w="40"/>
+              <w:left w:type="dxa" w:w="80"/>
+              <w:bottom w:type="dxa" w:w="40"/>
+              <w:right w:type="dxa" w:w="80"/>
+            </w:tcMar>
+          </w:tcPr>
+          <w:p>
+            <w:pPr>
+              <w:jc w:val="center"/>
+            </w:pPr>
+            <w:r>
+              <w:rPr>
+                <w:rFonts w:ascii="Times New Roman" w:cs="Times New Roman" w:eastAsia="Times New Roman" w:hAnsi="Times New Roman"/>
+                <w:b w:val="false"/>
+                <w:bCs w:val="false"/>
+                <w:sz w:val="18"/>
+                <w:szCs w:val="18"/>
+              </w:rPr>
+              <w:t xml:space="preserve">10.0%</w:t>
+            </w:r>
+          </w:p>
+        </w:tc>
+        <w:tc>
+          <w:tcPr>
+            <w:tcW w:type="dxa" w:w="1100"/>
+            <w:tcBorders>
+              <w:top w:val="single" w:color="AAAAAA" w:sz="4"/>
+              <w:left w:val="single" w:color="AAAAAA" w:sz="4"/>
+              <w:bottom w:val="single" w:color="AAAAAA" w:sz="4"/>
+              <w:right w:val="single" w:color="AAAAAA" w:sz="4"/>
+            </w:tcBorders>
+            <w:tcMar>
+              <w:top w:type="dxa" w:w="40"/>
+              <w:left w:type="dxa" w:w="80"/>
+              <w:bottom w:type="dxa" w:w="40"/>
+              <w:right w:type="dxa" w:w="80"/>
+            </w:tcMar>
+          </w:tcPr>
+          <w:p>
+            <w:pPr>
+              <w:jc w:val="center"/>
+            </w:pPr>
+            <w:r>
+              <w:rPr>
+                <w:rFonts w:ascii="Times New Roman" w:cs="Times New Roman" w:eastAsia="Times New Roman" w:hAnsi="Times New Roman"/>
+                <w:b w:val="false"/>
+                <w:bCs w:val="false"/>
+                <w:sz w:val="18"/>
+                <w:szCs w:val="18"/>
+              </w:rPr>
+              <w:t xml:space="preserve">5</w:t>
+            </w:r>
+          </w:p>
+        </w:tc>
+        <w:tc>
+          <w:tcPr>
+            <w:tcW w:type="dxa" w:w="1000"/>
+            <w:tcBorders>
+              <w:top w:val="single" w:color="AAAAAA" w:sz="4"/>
+              <w:left w:val="single" w:color="AAAAAA" w:sz="4"/>
+              <w:bottom w:val="single" w:color="AAAAAA" w:sz="4"/>
+              <w:right w:val="single" w:color="AAAAAA" w:sz="4"/>
+            </w:tcBorders>
+            <w:tcMar>
+              <w:top w:type="dxa" w:w="40"/>
+              <w:left w:type="dxa" w:w="80"/>
+              <w:bottom w:type="dxa" w:w="40"/>
+              <w:right w:type="dxa" w:w="80"/>
+            </w:tcMar>
+          </w:tcPr>
+          <w:p>
+            <w:pPr>
+              <w:jc w:val="center"/>
+            </w:pPr>
+            <w:r>
+              <w:rPr>
+                <w:rFonts w:ascii="Times New Roman" w:cs="Times New Roman" w:eastAsia="Times New Roman" w:hAnsi="Times New Roman"/>
+                <w:b w:val="false"/>
+                <w:bCs w:val="false"/>
+                <w:sz w:val="18"/>
+                <w:szCs w:val="18"/>
+              </w:rPr>
+              <w:t xml:space="preserve">30</w:t>
+            </w:r>
+          </w:p>
+        </w:tc>
+        <w:tc>
+          <w:tcPr>
+            <w:tcW w:type="dxa" w:w="900"/>
+            <w:tcBorders>
+              <w:top w:val="single" w:color="AAAAAA" w:sz="4"/>
+              <w:left w:val="single" w:color="AAAAAA" w:sz="4"/>
+              <w:bottom w:val="single" w:color="AAAAAA" w:sz="4"/>
+              <w:right w:val="single" w:color="AAAAAA" w:sz="4"/>
+            </w:tcBorders>
+            <w:tcMar>
+              <w:top w:type="dxa" w:w="40"/>
+              <w:left w:type="dxa" w:w="80"/>
+              <w:bottom w:type="dxa" w:w="40"/>
+              <w:right w:type="dxa" w:w="80"/>
+            </w:tcMar>
+          </w:tcPr>
+          <w:p>
+            <w:pPr>
+              <w:jc w:val="center"/>
+            </w:pPr>
+            <w:r>
+              <w:rPr>
+                <w:rFonts w:ascii="Times New Roman" w:cs="Times New Roman" w:eastAsia="Times New Roman" w:hAnsi="Times New Roman"/>
+                <w:b w:val="false"/>
+                <w:bCs w:val="false"/>
+                <w:sz w:val="18"/>
+                <w:szCs w:val="18"/>
+              </w:rPr>
+              <w:t xml:space="preserve">279</w:t>
+            </w:r>
+          </w:p>
+        </w:tc>
+        <w:tc>
+          <w:tcPr>
+            <w:tcW w:type="dxa" w:w="1100"/>
+            <w:tcBorders>
+              <w:top w:val="single" w:color="AAAAAA" w:sz="4"/>
+              <w:left w:val="single" w:color="AAAAAA" w:sz="4"/>
+              <w:bottom w:val="single" w:color="AAAAAA" w:sz="4"/>
+              <w:right w:val="single" w:color="AAAAAA" w:sz="4"/>
+            </w:tcBorders>
+            <w:tcMar>
+              <w:top w:type="dxa" w:w="40"/>
+              <w:left w:type="dxa" w:w="80"/>
+              <w:bottom w:type="dxa" w:w="40"/>
+              <w:right w:type="dxa" w:w="80"/>
+            </w:tcMar>
+          </w:tcPr>
+          <w:p>
+            <w:pPr>
+              <w:jc w:val="center"/>
+            </w:pPr>
+            <w:r>
+              <w:rPr>
+                <w:rFonts w:ascii="Times New Roman" w:cs="Times New Roman" w:eastAsia="Times New Roman" w:hAnsi="Times New Roman"/>
+                <w:b w:val="false"/>
+                <w:bCs w:val="false"/>
+                <w:sz w:val="18"/>
+                <w:szCs w:val="18"/>
+              </w:rPr>
+              <w:t xml:space="preserve">96.5%</w:t>
+            </w:r>
+          </w:p>
+        </w:tc>
+        <w:tc>
+          <w:tcPr>
+            <w:tcW w:type="dxa" w:w="1200"/>
+            <w:tcBorders>
+              <w:top w:val="single" w:color="AAAAAA" w:sz="4"/>
+              <w:left w:val="single" w:color="AAAAAA" w:sz="4"/>
+              <w:bottom w:val="single" w:color="AAAAAA" w:sz="4"/>
+              <w:right w:val="single" w:color="AAAAAA" w:sz="4"/>
+            </w:tcBorders>
+            <w:tcMar>
+              <w:top w:type="dxa" w:w="40"/>
+              <w:left w:type="dxa" w:w="80"/>
+              <w:bottom w:type="dxa" w:w="40"/>
+              <w:right w:type="dxa" w:w="80"/>
+            </w:tcMar>
+          </w:tcPr>
+          <w:p>
+            <w:pPr>
+              <w:jc w:val="center"/>
+            </w:pPr>
+            <w:r>
+              <w:rPr>
+                <w:rFonts w:ascii="Times New Roman" w:cs="Times New Roman" w:eastAsia="Times New Roman" w:hAnsi="Times New Roman"/>
+                <w:b w:val="false"/>
+                <w:bCs w:val="false"/>
+                <w:sz w:val="18"/>
+                <w:szCs w:val="18"/>
+              </w:rPr>
+              <w:t xml:space="preserve">3.2</w:t>
+            </w:r>
+          </w:p>
+        </w:tc>
+        <w:tc>
+          <w:tcPr>
+            <w:tcW w:type="dxa" w:w="900"/>
+            <w:tcBorders>
+              <w:top w:val="single" w:color="AAAAAA" w:sz="4"/>
+              <w:left w:val="single" w:color="AAAAAA" w:sz="4"/>
+              <w:bottom w:val="single" w:color="AAAAAA" w:sz="4"/>
+              <w:right w:val="single" w:color="AAAAAA" w:sz="4"/>
+            </w:tcBorders>
+            <w:tcMar>
+              <w:top w:type="dxa" w:w="40"/>
+              <w:left w:type="dxa" w:w="80"/>
+              <w:bottom w:type="dxa" w:w="40"/>
+              <w:right w:type="dxa" w:w="80"/>
+            </w:tcMar>
+          </w:tcPr>
+          <w:p>
+            <w:pPr>
+              <w:jc w:val="center"/>
+            </w:pPr>
+            <w:r>
+              <w:rPr>
+                <w:rFonts w:ascii="Times New Roman" w:cs="Times New Roman" w:eastAsia="Times New Roman" w:hAnsi="Times New Roman"/>
+                <w:b w:val="false"/>
+                <w:bCs w:val="false"/>
+                <w:sz w:val="18"/>
+                <w:szCs w:val="18"/>
+              </w:rPr>
+              <w:t xml:space="preserve">0.66</w:t>
+            </w:r>
+          </w:p>
+        </w:tc>
+        <w:tc>
+          <w:tcPr>
+            <w:tcW w:type="dxa" w:w="1860"/>
+            <w:tcBorders>
+              <w:top w:val="single" w:color="AAAAAA" w:sz="4"/>
+              <w:left w:val="single" w:color="AAAAAA" w:sz="4"/>
+              <w:bottom w:val="single" w:color="AAAAAA" w:sz="4"/>
+              <w:right w:val="single" w:color="AAAAAA" w:sz="4"/>
+            </w:tcBorders>
+            <w:tcMar>
+              <w:top w:type="dxa" w:w="40"/>
+              <w:left w:type="dxa" w:w="80"/>
+              <w:bottom w:type="dxa" w:w="40"/>
+              <w:right w:type="dxa" w:w="80"/>
+            </w:tcMar>
+          </w:tcPr>
+          <w:p>
+            <w:pPr>
+              <w:jc w:val="center"/>
+            </w:pPr>
+            <w:r>
+              <w:rPr>
+                <w:rFonts w:ascii="Times New Roman" w:cs="Times New Roman" w:eastAsia="Times New Roman" w:hAnsi="Times New Roman"/>
+                <w:b w:val="false"/>
+                <w:bCs w:val="false"/>
+                <w:sz w:val="18"/>
+                <w:szCs w:val="18"/>
+              </w:rPr>
+              <w:t xml:space="preserve">61 / 30295</w:t>
+            </w:r>
+          </w:p>
+        </w:tc>
+      </w:tr>
+      <w:tr>
+        <w:tc>
+          <w:tcPr>
+            <w:tcW w:type="dxa" w:w="1300"/>
+            <w:tcBorders>
+              <w:top w:val="single" w:color="AAAAAA" w:sz="4"/>
+              <w:left w:val="single" w:color="AAAAAA" w:sz="4"/>
+              <w:bottom w:val="single" w:color="AAAAAA" w:sz="4"/>
+              <w:right w:val="single" w:color="AAAAAA" w:sz="4"/>
+            </w:tcBorders>
+            <w:tcMar>
+              <w:top w:type="dxa" w:w="40"/>
+              <w:left w:type="dxa" w:w="80"/>
+              <w:bottom w:type="dxa" w:w="40"/>
+              <w:right w:type="dxa" w:w="80"/>
+            </w:tcMar>
+          </w:tcPr>
+          <w:p>
+            <w:pPr>
+              <w:jc w:val="center"/>
+            </w:pPr>
+            <w:r>
+              <w:rPr>
+                <w:rFonts w:ascii="Times New Roman" w:cs="Times New Roman" w:eastAsia="Times New Roman" w:hAnsi="Times New Roman"/>
+                <w:b w:val="false"/>
+                <w:bCs w:val="false"/>
+                <w:sz w:val="18"/>
+                <w:szCs w:val="18"/>
+              </w:rPr>
+              <w:t xml:space="preserve">50.0%</w:t>
+            </w:r>
+          </w:p>
+        </w:tc>
+        <w:tc>
+          <w:tcPr>
+            <w:tcW w:type="dxa" w:w="1100"/>
+            <w:tcBorders>
+              <w:top w:val="single" w:color="AAAAAA" w:sz="4"/>
+              <w:left w:val="single" w:color="AAAAAA" w:sz="4"/>
+              <w:bottom w:val="single" w:color="AAAAAA" w:sz="4"/>
+              <w:right w:val="single" w:color="AAAAAA" w:sz="4"/>
+            </w:tcBorders>
+            <w:tcMar>
+              <w:top w:type="dxa" w:w="40"/>
+              <w:left w:type="dxa" w:w="80"/>
+              <w:bottom w:type="dxa" w:w="40"/>
+              <w:right w:type="dxa" w:w="80"/>
+            </w:tcMar>
+          </w:tcPr>
+          <w:p>
+            <w:pPr>
+              <w:jc w:val="center"/>
+            </w:pPr>
+            <w:r>
+              <w:rPr>
+                <w:rFonts w:ascii="Times New Roman" w:cs="Times New Roman" w:eastAsia="Times New Roman" w:hAnsi="Times New Roman"/>
+                <w:b w:val="false"/>
+                <w:bCs w:val="false"/>
+                <w:sz w:val="18"/>
+                <w:szCs w:val="18"/>
+              </w:rPr>
+              <w:t xml:space="preserve">5</w:t>
+            </w:r>
+          </w:p>
+        </w:tc>
+        <w:tc>
+          <w:tcPr>
+            <w:tcW w:type="dxa" w:w="1000"/>
+            <w:tcBorders>
+              <w:top w:val="single" w:color="AAAAAA" w:sz="4"/>
+              <w:left w:val="single" w:color="AAAAAA" w:sz="4"/>
+              <w:bottom w:val="single" w:color="AAAAAA" w:sz="4"/>
+              <w:right w:val="single" w:color="AAAAAA" w:sz="4"/>
+            </w:tcBorders>
+            <w:tcMar>
+              <w:top w:type="dxa" w:w="40"/>
+              <w:left w:type="dxa" w:w="80"/>
+              <w:bottom w:type="dxa" w:w="40"/>
+              <w:right w:type="dxa" w:w="80"/>
+            </w:tcMar>
+          </w:tcPr>
+          <w:p>
+            <w:pPr>
+              <w:jc w:val="center"/>
+            </w:pPr>
+            <w:r>
+              <w:rPr>
+                <w:rFonts w:ascii="Times New Roman" w:cs="Times New Roman" w:eastAsia="Times New Roman" w:hAnsi="Times New Roman"/>
+                <w:b w:val="false"/>
+                <w:bCs w:val="false"/>
+                <w:sz w:val="18"/>
+                <w:szCs w:val="18"/>
+              </w:rPr>
+              <w:t xml:space="preserve">10</w:t>
+            </w:r>
+          </w:p>
+        </w:tc>
+        <w:tc>
+          <w:tcPr>
+            <w:tcW w:type="dxa" w:w="900"/>
+            <w:tcBorders>
+              <w:top w:val="single" w:color="AAAAAA" w:sz="4"/>
+              <w:left w:val="single" w:color="AAAAAA" w:sz="4"/>
+              <w:bottom w:val="single" w:color="AAAAAA" w:sz="4"/>
+              <w:right w:val="single" w:color="AAAAAA" w:sz="4"/>
+            </w:tcBorders>
+            <w:tcMar>
+              <w:top w:type="dxa" w:w="40"/>
+              <w:left w:type="dxa" w:w="80"/>
+              <w:bottom w:type="dxa" w:w="40"/>
+              <w:right w:type="dxa" w:w="80"/>
+            </w:tcMar>
+          </w:tcPr>
+          <w:p>
+            <w:pPr>
+              <w:jc w:val="center"/>
+            </w:pPr>
+            <w:r>
+              <w:rPr>
+                <w:rFonts w:ascii="Times New Roman" w:cs="Times New Roman" w:eastAsia="Times New Roman" w:hAnsi="Times New Roman"/>
+                <w:b w:val="false"/>
+                <w:bCs w:val="false"/>
+                <w:sz w:val="18"/>
+                <w:szCs w:val="18"/>
+              </w:rPr>
+              <w:t xml:space="preserve">192</w:t>
+            </w:r>
+          </w:p>
+        </w:tc>
+        <w:tc>
+          <w:tcPr>
+            <w:tcW w:type="dxa" w:w="1100"/>
+            <w:tcBorders>
+              <w:top w:val="single" w:color="AAAAAA" w:sz="4"/>
+              <w:left w:val="single" w:color="AAAAAA" w:sz="4"/>
+              <w:bottom w:val="single" w:color="AAAAAA" w:sz="4"/>
+              <w:right w:val="single" w:color="AAAAAA" w:sz="4"/>
+            </w:tcBorders>
+            <w:tcMar>
+              <w:top w:type="dxa" w:w="40"/>
+              <w:left w:type="dxa" w:w="80"/>
+              <w:bottom w:type="dxa" w:w="40"/>
+              <w:right w:type="dxa" w:w="80"/>
+            </w:tcMar>
+          </w:tcPr>
+          <w:p>
+            <w:pPr>
+              <w:jc w:val="center"/>
+            </w:pPr>
+            <w:r>
+              <w:rPr>
+                <w:rFonts w:ascii="Times New Roman" w:cs="Times New Roman" w:eastAsia="Times New Roman" w:hAnsi="Times New Roman"/>
+                <w:b w:val="false"/>
+                <w:bCs w:val="false"/>
+                <w:sz w:val="18"/>
+                <w:szCs w:val="18"/>
+              </w:rPr>
+              <w:t xml:space="preserve">25.6%</w:t>
+            </w:r>
+          </w:p>
+        </w:tc>
+        <w:tc>
+          <w:tcPr>
+            <w:tcW w:type="dxa" w:w="1200"/>
+            <w:tcBorders>
+              <w:top w:val="single" w:color="AAAAAA" w:sz="4"/>
+              <w:left w:val="single" w:color="AAAAAA" w:sz="4"/>
+              <w:bottom w:val="single" w:color="AAAAAA" w:sz="4"/>
+              <w:right w:val="single" w:color="AAAAAA" w:sz="4"/>
+            </w:tcBorders>
+            <w:tcMar>
+              <w:top w:type="dxa" w:w="40"/>
+              <w:left w:type="dxa" w:w="80"/>
+              <w:bottom w:type="dxa" w:w="40"/>
+              <w:right w:type="dxa" w:w="80"/>
+            </w:tcMar>
+          </w:tcPr>
+          <w:p>
+            <w:pPr>
+              <w:jc w:val="center"/>
+            </w:pPr>
+            <w:r>
+              <w:rPr>
+                <w:rFonts w:ascii="Times New Roman" w:cs="Times New Roman" w:eastAsia="Times New Roman" w:hAnsi="Times New Roman"/>
+                <w:b w:val="false"/>
+                <w:bCs w:val="false"/>
+                <w:sz w:val="18"/>
+                <w:szCs w:val="18"/>
+              </w:rPr>
+              <w:t xml:space="preserve">3.3</w:t>
+            </w:r>
+          </w:p>
+        </w:tc>
+        <w:tc>
+          <w:tcPr>
+            <w:tcW w:type="dxa" w:w="900"/>
+            <w:tcBorders>
+              <w:top w:val="single" w:color="AAAAAA" w:sz="4"/>
+              <w:left w:val="single" w:color="AAAAAA" w:sz="4"/>
+              <w:bottom w:val="single" w:color="AAAAAA" w:sz="4"/>
+              <w:right w:val="single" w:color="AAAAAA" w:sz="4"/>
+            </w:tcBorders>
+            <w:tcMar>
+              <w:top w:type="dxa" w:w="40"/>
+              <w:left w:type="dxa" w:w="80"/>
+              <w:bottom w:type="dxa" w:w="40"/>
+              <w:right w:type="dxa" w:w="80"/>
+            </w:tcMar>
+          </w:tcPr>
+          <w:p>
+            <w:pPr>
+              <w:jc w:val="center"/>
+            </w:pPr>
+            <w:r>
+              <w:rPr>
+                <w:rFonts w:ascii="Times New Roman" w:cs="Times New Roman" w:eastAsia="Times New Roman" w:hAnsi="Times New Roman"/>
+                <w:b w:val="false"/>
+                <w:bCs w:val="false"/>
+                <w:sz w:val="18"/>
+                <w:szCs w:val="18"/>
+              </w:rPr>
+              <w:t xml:space="preserve">0.52</w:t>
+            </w:r>
+          </w:p>
+        </w:tc>
+        <w:tc>
+          <w:tcPr>
+            <w:tcW w:type="dxa" w:w="1860"/>
+            <w:tcBorders>
+              <w:top w:val="single" w:color="AAAAAA" w:sz="4"/>
+              <w:left w:val="single" w:color="AAAAAA" w:sz="4"/>
+              <w:bottom w:val="single" w:color="AAAAAA" w:sz="4"/>
+              <w:right w:val="single" w:color="AAAAAA" w:sz="4"/>
+            </w:tcBorders>
+            <w:tcMar>
+              <w:top w:type="dxa" w:w="40"/>
+              <w:left w:type="dxa" w:w="80"/>
+              <w:bottom w:type="dxa" w:w="40"/>
+              <w:right w:type="dxa" w:w="80"/>
+            </w:tcMar>
+          </w:tcPr>
+          <w:p>
+            <w:pPr>
+              <w:jc w:val="center"/>
+            </w:pPr>
+            <w:r>
+              <w:rPr>
+                <w:rFonts w:ascii="Times New Roman" w:cs="Times New Roman" w:eastAsia="Times New Roman" w:hAnsi="Times New Roman"/>
+                <w:b w:val="false"/>
+                <w:bCs w:val="false"/>
+                <w:sz w:val="18"/>
+                <w:szCs w:val="18"/>
+              </w:rPr>
+              <w:t xml:space="preserve">43 / 19484</w:t>
+            </w:r>
+          </w:p>
+        </w:tc>
+      </w:tr>
+      <w:tr>
+        <w:tc>
+          <w:tcPr>
+            <w:tcW w:type="dxa" w:w="1300"/>
+            <w:tcBorders>
+              <w:top w:val="single" w:color="AAAAAA" w:sz="4"/>
+              <w:left w:val="single" w:color="AAAAAA" w:sz="4"/>
+              <w:bottom w:val="single" w:color="AAAAAA" w:sz="4"/>
+              <w:right w:val="single" w:color="AAAAAA" w:sz="4"/>
+            </w:tcBorders>
+            <w:tcMar>
+              <w:top w:type="dxa" w:w="40"/>
+              <w:left w:type="dxa" w:w="80"/>
+              <w:bottom w:type="dxa" w:w="40"/>
+              <w:right w:type="dxa" w:w="80"/>
+            </w:tcMar>
+          </w:tcPr>
+          <w:p>
+            <w:pPr>
+              <w:jc w:val="center"/>
+            </w:pPr>
+            <w:r>
+              <w:rPr>
+                <w:rFonts w:ascii="Times New Roman" w:cs="Times New Roman" w:eastAsia="Times New Roman" w:hAnsi="Times New Roman"/>
+                <w:b w:val="false"/>
+                <w:bCs w:val="false"/>
+                <w:sz w:val="18"/>
+                <w:szCs w:val="18"/>
+              </w:rPr>
+              <w:t xml:space="preserve">20.0%</w:t>
+            </w:r>
+          </w:p>
+        </w:tc>
+        <w:tc>
+          <w:tcPr>
+            <w:tcW w:type="dxa" w:w="1100"/>
+            <w:tcBorders>
+              <w:top w:val="single" w:color="AAAAAA" w:sz="4"/>
+              <w:left w:val="single" w:color="AAAAAA" w:sz="4"/>
+              <w:bottom w:val="single" w:color="AAAAAA" w:sz="4"/>
+              <w:right w:val="single" w:color="AAAAAA" w:sz="4"/>
+            </w:tcBorders>
+            <w:tcMar>
+              <w:top w:type="dxa" w:w="40"/>
+              <w:left w:type="dxa" w:w="80"/>
+              <w:bottom w:type="dxa" w:w="40"/>
+              <w:right w:type="dxa" w:w="80"/>
+            </w:tcMar>
+          </w:tcPr>
+          <w:p>
+            <w:pPr>
+              <w:jc w:val="center"/>
+            </w:pPr>
+            <w:r>
+              <w:rPr>
+                <w:rFonts w:ascii="Times New Roman" w:cs="Times New Roman" w:eastAsia="Times New Roman" w:hAnsi="Times New Roman"/>
+                <w:b w:val="false"/>
+                <w:bCs w:val="false"/>
+                <w:sz w:val="18"/>
+                <w:szCs w:val="18"/>
+              </w:rPr>
+              <w:t xml:space="preserve">20</w:t>
+            </w:r>
+          </w:p>
+        </w:tc>
+        <w:tc>
+          <w:tcPr>
+            <w:tcW w:type="dxa" w:w="1000"/>
+            <w:tcBorders>
+              <w:top w:val="single" w:color="AAAAAA" w:sz="4"/>
+              <w:left w:val="single" w:color="AAAAAA" w:sz="4"/>
+              <w:bottom w:val="single" w:color="AAAAAA" w:sz="4"/>
+              <w:right w:val="single" w:color="AAAAAA" w:sz="4"/>
+            </w:tcBorders>
+            <w:tcMar>
+              <w:top w:type="dxa" w:w="40"/>
+              <w:left w:type="dxa" w:w="80"/>
+              <w:bottom w:type="dxa" w:w="40"/>
+              <w:right w:type="dxa" w:w="80"/>
+            </w:tcMar>
+          </w:tcPr>
+          <w:p>
+            <w:pPr>
+              <w:jc w:val="center"/>
+            </w:pPr>
+            <w:r>
+              <w:rPr>
+                <w:rFonts w:ascii="Times New Roman" w:cs="Times New Roman" w:eastAsia="Times New Roman" w:hAnsi="Times New Roman"/>
+                <w:b w:val="false"/>
+                <w:bCs w:val="false"/>
+                <w:sz w:val="18"/>
+                <w:szCs w:val="18"/>
+              </w:rPr>
+              <w:t xml:space="preserve">30</w:t>
+            </w:r>
+          </w:p>
+        </w:tc>
+        <w:tc>
+          <w:tcPr>
+            <w:tcW w:type="dxa" w:w="900"/>
+            <w:tcBorders>
+              <w:top w:val="single" w:color="AAAAAA" w:sz="4"/>
+              <w:left w:val="single" w:color="AAAAAA" w:sz="4"/>
+              <w:bottom w:val="single" w:color="AAAAAA" w:sz="4"/>
+              <w:right w:val="single" w:color="AAAAAA" w:sz="4"/>
+            </w:tcBorders>
+            <w:tcMar>
+              <w:top w:type="dxa" w:w="40"/>
+              <w:left w:type="dxa" w:w="80"/>
+              <w:bottom w:type="dxa" w:w="40"/>
+              <w:right w:type="dxa" w:w="80"/>
+            </w:tcMar>
+          </w:tcPr>
+          <w:p>
+            <w:pPr>
+              <w:jc w:val="center"/>
+            </w:pPr>
+            <w:r>
+              <w:rPr>
+                <w:rFonts w:ascii="Times New Roman" w:cs="Times New Roman" w:eastAsia="Times New Roman" w:hAnsi="Times New Roman"/>
+                <w:b w:val="false"/>
+                <w:bCs w:val="false"/>
+                <w:sz w:val="18"/>
+                <w:szCs w:val="18"/>
+              </w:rPr>
+              <w:t xml:space="preserve">154</w:t>
+            </w:r>
+          </w:p>
+        </w:tc>
+        <w:tc>
+          <w:tcPr>
+            <w:tcW w:type="dxa" w:w="1100"/>
+            <w:tcBorders>
+              <w:top w:val="single" w:color="AAAAAA" w:sz="4"/>
+              <w:left w:val="single" w:color="AAAAAA" w:sz="4"/>
+              <w:bottom w:val="single" w:color="AAAAAA" w:sz="4"/>
+              <w:right w:val="single" w:color="AAAAAA" w:sz="4"/>
+            </w:tcBorders>
+            <w:tcMar>
+              <w:top w:type="dxa" w:w="40"/>
+              <w:left w:type="dxa" w:w="80"/>
+              <w:bottom w:type="dxa" w:w="40"/>
+              <w:right w:type="dxa" w:w="80"/>
+            </w:tcMar>
+          </w:tcPr>
+          <w:p>
+            <w:pPr>
+              <w:jc w:val="center"/>
+            </w:pPr>
+            <w:r>
+              <w:rPr>
+                <w:rFonts w:ascii="Times New Roman" w:cs="Times New Roman" w:eastAsia="Times New Roman" w:hAnsi="Times New Roman"/>
+                <w:b w:val="false"/>
+                <w:bCs w:val="false"/>
+                <w:sz w:val="18"/>
+                <w:szCs w:val="18"/>
+              </w:rPr>
+              <w:t xml:space="preserve">74.4%</w:t>
+            </w:r>
+          </w:p>
+        </w:tc>
+        <w:tc>
+          <w:tcPr>
+            <w:tcW w:type="dxa" w:w="1200"/>
+            <w:tcBorders>
+              <w:top w:val="single" w:color="AAAAAA" w:sz="4"/>
+              <w:left w:val="single" w:color="AAAAAA" w:sz="4"/>
+              <w:bottom w:val="single" w:color="AAAAAA" w:sz="4"/>
+              <w:right w:val="single" w:color="AAAAAA" w:sz="4"/>
+            </w:tcBorders>
+            <w:tcMar>
+              <w:top w:type="dxa" w:w="40"/>
+              <w:left w:type="dxa" w:w="80"/>
+              <w:bottom w:type="dxa" w:w="40"/>
+              <w:right w:type="dxa" w:w="80"/>
+            </w:tcMar>
+          </w:tcPr>
+          <w:p>
+            <w:pPr>
+              <w:jc w:val="center"/>
+            </w:pPr>
+            <w:r>
+              <w:rPr>
+                <w:rFonts w:ascii="Times New Roman" w:cs="Times New Roman" w:eastAsia="Times New Roman" w:hAnsi="Times New Roman"/>
+                <w:b w:val="false"/>
+                <w:bCs w:val="false"/>
+                <w:sz w:val="18"/>
+                <w:szCs w:val="18"/>
+              </w:rPr>
+              <w:t xml:space="preserve">5.2</w:t>
+            </w:r>
+          </w:p>
+        </w:tc>
+        <w:tc>
+          <w:tcPr>
+            <w:tcW w:type="dxa" w:w="900"/>
+            <w:tcBorders>
+              <w:top w:val="single" w:color="AAAAAA" w:sz="4"/>
+              <w:left w:val="single" w:color="AAAAAA" w:sz="4"/>
+              <w:bottom w:val="single" w:color="AAAAAA" w:sz="4"/>
+              <w:right w:val="single" w:color="AAAAAA" w:sz="4"/>
+            </w:tcBorders>
+            <w:tcMar>
+              <w:top w:type="dxa" w:w="40"/>
+              <w:left w:type="dxa" w:w="80"/>
+              <w:bottom w:type="dxa" w:w="40"/>
+              <w:right w:type="dxa" w:w="80"/>
+            </w:tcMar>
+          </w:tcPr>
+          <w:p>
+            <w:pPr>
+              <w:jc w:val="center"/>
+            </w:pPr>
+            <w:r>
+              <w:rPr>
+                <w:rFonts w:ascii="Times New Roman" w:cs="Times New Roman" w:eastAsia="Times New Roman" w:hAnsi="Times New Roman"/>
+                <w:b w:val="false"/>
+                <w:bCs w:val="false"/>
+                <w:sz w:val="18"/>
+                <w:szCs w:val="18"/>
+              </w:rPr>
+              <w:t xml:space="preserve">0.78</w:t>
+            </w:r>
+          </w:p>
+        </w:tc>
+        <w:tc>
+          <w:tcPr>
+            <w:tcW w:type="dxa" w:w="1860"/>
+            <w:tcBorders>
+              <w:top w:val="single" w:color="AAAAAA" w:sz="4"/>
+              <w:left w:val="single" w:color="AAAAAA" w:sz="4"/>
+              <w:bottom w:val="single" w:color="AAAAAA" w:sz="4"/>
+              <w:right w:val="single" w:color="AAAAAA" w:sz="4"/>
+            </w:tcBorders>
+            <w:tcMar>
+              <w:top w:type="dxa" w:w="40"/>
+              <w:left w:type="dxa" w:w="80"/>
+              <w:bottom w:type="dxa" w:w="40"/>
+              <w:right w:type="dxa" w:w="80"/>
+            </w:tcMar>
+          </w:tcPr>
+          <w:p>
+            <w:pPr>
+              <w:jc w:val="center"/>
+            </w:pPr>
+            <w:r>
+              <w:rPr>
+                <w:rFonts w:ascii="Times New Roman" w:cs="Times New Roman" w:eastAsia="Times New Roman" w:hAnsi="Times New Roman"/>
+                <w:b w:val="false"/>
+                <w:bCs w:val="false"/>
+                <w:sz w:val="18"/>
+                <w:szCs w:val="18"/>
+              </w:rPr>
+              <w:t xml:space="preserve">259 / 32333</w:t>
+            </w:r>
+          </w:p>
+        </w:tc>
+      </w:tr>
+    </w:tbl>
+    <w:p>
+      <w:pPr>
+        <w:spacing w:after="160" w:before="40"/>
+      </w:pPr>
+      <w:r>
+        <w:rPr>
+          <w:rFonts w:ascii="Times New Roman" w:cs="Times New Roman" w:eastAsia="Times New Roman" w:hAnsi="Times New Roman"/>
+          <w:i/>
+          <w:iCs/>
+          <w:sz w:val="18"/>
+          <w:szCs w:val="18"/>
+        </w:rPr>
+        <w:t xml:space="preserve">Hawkes fits use 30 bootstrap replications (p ≥ 0.03); the main row (20%, 5, 10) is the definition used in the text.</w:t>
+      </w:r>
+    </w:p>
+    <w:p>
+      <w:pPr>
+        <w:spacing w:after="120" w:line="300"/>
+        <w:jc w:val="both"/>
+      </w:pPr>
+      <w:r>
+        <w:rPr>
+          <w:rFonts w:ascii="Times New Roman" w:cs="Times New Roman" w:eastAsia="Times New Roman" w:hAnsi="Times New Roman"/>
+          <w:b/>
+          <w:bCs/>
+          <w:sz w:val="22"/>
+          <w:szCs w:val="22"/>
+        </w:rPr>
+        <w:t xml:space="preserve">Capacity under the typed model.</w:t>
+      </w:r>
+      <w:r>
+        <w:rPr>
+          <w:rFonts w:ascii="Times New Roman" w:cs="Times New Roman" w:eastAsia="Times New Roman" w:hAnsi="Times New Roman"/>
+          <w:sz w:val="22"/>
+          <w:szCs w:val="22"/>
+        </w:rPr>
+        <w:t xml:space="preserve"> To see what the typed description changes for a human-triage capacity plan, we combine three human-handled classes for an illustrative organisation whose parameters come from our estimates: hallucinations after the best cascade (λ_H = 12.7 per day from the Qwen2.5-0.5B run, with the daily-rate CV of 0.40 estimated from the ticket streams, hence a dispersion index φ_H = 3.03 by Proposition 2), provider incidents affecting the organisation (λ_P = 0.83, φ_P = 1.30 from the day-of-week-stratified index) and own serving-failure episodes (λ_S from the episode counts, φ_S from their daily dispersion index; fine and coarse episode definitions). Treating the total as one Poisson stream gives a 95% capacity of 23 and 21 units per day (fine and coarse definitions); the typed superposition requires 33 and 26 (24-43% more), and the single-Poisson plan is exceeded on 13.6-16.1% of days instead of 5% (effective dispersion φ_eff = 2.9-5.9, Proposition 6a). Even hallucinations alone, the best-protected class, need 24 rather than 19 units. The scenario is illustrative: class means are not those of any real organisation and the classes are assumed independent, whereas a serving outage would plausibly raise the hallucination and ticket volumes at the same time, which would widen the gap.</w:t>
+      </w:r>
+    </w:p>
+    <w:p>
+      <w:pPr>
         <w:pStyle w:val="Heading1"/>
         <w:spacing w:after="120" w:before="280"/>
       </w:pPr>
@@ -16017,6 +19912,25 @@
           <w:sz w:val="22"/>
           <w:szCs w:val="22"/>
         </w:rPr>
+        <w:t xml:space="preserve">Model the failure classes separately and combine them at the ticket level.</w:t>
+      </w:r>
+      <w:r>
+        <w:rPr>
+          <w:rFonts w:ascii="Times New Roman" w:cs="Times New Roman" w:eastAsia="Times New Roman" w:hAnsi="Times New Roman"/>
+          <w:sz w:val="22"/>
+          <w:szCs w:val="22"/>
+        </w:rPr>
+        <w:t xml:space="preserve"> Treating all failures as one Poisson stream misdescribes each class in a different way: hallucination counts are over-dispersed through demand variability, provider incidents are seasonal and mildly self-exciting (branching ratio about 0.1-0.2), serving failures arrive in heavy-tailed episodes (68% of failed requests fall in 4% of the active minutes), and human triage has heavy-tailed service. Combining class-specific models in our illustrative organisation required 24-43% more daily capacity than a single Poisson on the total, and the single-Poisson plan was exceeded on 14-16% of days.'),
+  BUL('</w:t>
+      </w:r>
+      <w:r>
+        <w:rPr>
+          <w:rFonts w:ascii="Times New Roman" w:cs="Times New Roman" w:eastAsia="Times New Roman" w:hAnsi="Times New Roman"/>
+          <w:b/>
+          <w:bCs/>
+          <w:sz w:val="22"/>
+          <w:szCs w:val="22"/>
+        </w:rPr>
         <w:t xml:space="preserve">Human triage is bursty and heavy-tailed in real organisations.</w:t>
       </w:r>
       <w:r>
@@ -16183,6 +20097,25 @@
           <w:sz w:val="22"/>
           <w:szCs w:val="22"/>
         </w:rPr>
+        <w:t xml:space="preserve">Typed models are illustrative in combination.</w:t>
+      </w:r>
+      <w:r>
+        <w:rPr>
+          <w:rFonts w:ascii="Times New Roman" w:cs="Times New Roman" w:eastAsia="Times New Roman" w:hAnsi="Times New Roman"/>
+          <w:sz w:val="22"/>
+          <w:szCs w:val="22"/>
+        </w:rPr>
+        <w:t xml:space="preserve"> The Hawkes and episode fits use one kernel family (exponential), a fixed seasonal profile estimated from the same data, and, for BurstGPT, an episode definition that matters quantitatively (Table 10) and conflates a long outage with its fragments; the bootstrap p-values are bounded below by 1/(B+1). The capacity comparison in Section 5.8 combines classes from different organisations and datasets under independence, so it illustrates the size of the single-Poisson error rather than predicting any organisation's need; common-cause dependence between classes would increase it.'),
+  BUL('</w:t>
+      </w:r>
+      <w:r>
+        <w:rPr>
+          <w:rFonts w:ascii="Times New Roman" w:cs="Times New Roman" w:eastAsia="Times New Roman" w:hAnsi="Times New Roman"/>
+          <w:b/>
+          <w:bCs/>
+          <w:sz w:val="22"/>
+          <w:szCs w:val="22"/>
+        </w:rPr>
         <w:t xml:space="preserve">Ticket data are not LLM incidents.</w:t>
       </w:r>
       <w:r>
@@ -16453,7 +20386,7 @@
           <w:sz w:val="22"/>
           <w:szCs w:val="22"/>
         </w:rPr>
-        <w:t xml:space="preserve">Treating critical hallucinations as a counting process turns guardrail performance into a staffing and cost decision. The analysis yields three results that differ from the common practice the earlier draft followed: capacity must be sized from an over-dispersion-aware quantile; the multiplicative guardrail formula is an optimistic bound whose gap must be measured; and the cost-minimising number of layers is not fixed at three but depends on integer capacity effects, the floor on standing staff, latency, the labour-to-compute ratio and, empirically, on the generator. On measured outputs of three open models, a single task-validated classifier reduces the required capacity by roughly 80-95% relative to no guardrails; a routed judge adds a further modest, model-dependent reduction at about triple the latency, and every cascade incurs false blocks and system failures that the earlier framework ignored. The independence formula understated the share of hallucinations passing a two-layer cascade by a factor of 1.6-2.6 (2.7-4.6 with routing), and a mild burstiness (daily-rate CV of 0.3) raised the exceedance rate of a Poisson-sized plan from 5% to about 25%, to about 30% with the CV of 0.44 anchored in a production trace. Public production data corroborate the structure: an LLM request trace shows clustered arrivals at every scale above one second, provider incident streams are strongly seasonal and remain over-dispersed after accounting for seasonality, and three company ticket streams show a daily rate variability of 0.33-0.41, Poisson-sized plans exceeded on 7.5-17% of days, and heavy-tailed resolution times, which implies that capacity in handling hours needs about 70% more headroom than capacity in arrivals. Validating the counting-process assumptions on production incident logs is the key next step.</w:t>
+        <w:t xml:space="preserve">Treating critical hallucinations as a counting process turns guardrail performance into a staffing and cost decision. The analysis yields three results that differ from the common practice the earlier draft followed: capacity must be sized from an over-dispersion-aware quantile; the multiplicative guardrail formula is an optimistic bound whose gap must be measured; a single Poisson on all failures misdescribes every class (hallucinations are over-dispersed, provider incidents seasonal and mildly self-exciting, serving failures heavy-tailed episodes), and a typed superposition required 24-43% more capacity than a single Poisson in our illustrative organisation; and the cost-minimising number of layers is not fixed at three but depends on integer capacity effects, the floor on standing staff, latency, the labour-to-compute ratio and, empirically, on the generator. On measured outputs of three open models, a single task-validated classifier reduces the required capacity by roughly 80-95% relative to no guardrails; a routed judge adds a further modest, model-dependent reduction at about triple the latency, and every cascade incurs false blocks and system failures that the earlier framework ignored. The independence formula understated the share of hallucinations passing a two-layer cascade by a factor of 1.6-2.6 (2.7-4.6 with routing), and a mild burstiness (daily-rate CV of 0.3) raised the exceedance rate of a Poisson-sized plan from 5% to about 25%, to about 30% with the CV of 0.44 anchored in a production trace. Public production data corroborate the structure: an LLM request trace shows clustered arrivals at every scale above one second, provider incident streams are strongly seasonal and remain over-dispersed after accounting for seasonality, and three company ticket streams show a daily rate variability of 0.33-0.41, Poisson-sized plans exceeded on 7.5-17% of days, and heavy-tailed resolution times, which implies that capacity in handling hours needs about 70% more headroom than capacity in arrivals. Validating the counting-process assumptions on production incident logs is the key next step.</w:t>
       </w:r>
     </w:p>
     <w:p>
@@ -16651,7 +20584,7 @@
           <w:sz w:val="20"/>
           <w:szCs w:val="20"/>
         </w:rPr>
-        <w:t xml:space="preserve">Esary, J. D., Proschan, F., &amp; Walkup, D. W. (1967). Association of random variables, with applications. Annals of Mathematical Statistics, 38(5), 1466-1474.</w:t>
+        <w:t xml:space="preserve">Cox, D. R., &amp; Isham, V. (1980). Point Processes. Chapman &amp; Hall.</w:t>
       </w:r>
     </w:p>
     <w:p>
@@ -16665,7 +20598,7 @@
           <w:sz w:val="20"/>
           <w:szCs w:val="20"/>
         </w:rPr>
-        <w:t xml:space="preserve">Green, L. V., Kolesar, P. J., &amp; Whitt, W. (2007). Coping with time-varying demand when setting staffing requirements for a service system. Production and Operations Management, 16(1), 13-39.</w:t>
+        <w:t xml:space="preserve">Daley, D. J., &amp; Vere-Jones, D. (2003). An Introduction to the Theory of Point Processes, Volume I (2nd ed.). Springer.</w:t>
       </w:r>
     </w:p>
     <w:p>
@@ -16679,7 +20612,7 @@
           <w:sz w:val="20"/>
           <w:szCs w:val="20"/>
         </w:rPr>
-        <w:t xml:space="preserve">Gregor, S., &amp; Hevner, A. R. (2013). Positioning and presenting design science research for maximum impact. MIS Quarterly, 37(2), 337-355.</w:t>
+        <w:t xml:space="preserve">Esary, J. D., Proschan, F., &amp; Walkup, D. W. (1967). Association of random variables, with applications. Annals of Mathematical Statistics, 38(5), 1466-1474.</w:t>
       </w:r>
     </w:p>
     <w:p>
@@ -16693,7 +20626,7 @@
           <w:sz w:val="20"/>
           <w:szCs w:val="20"/>
         </w:rPr>
-        <w:t xml:space="preserve">He, P., Gao, J., &amp; Chen, W. (2021). DeBERTaV3: Improving DeBERTa using ELECTRA-style pre-training with gradient-disentangled embedding sharing. arXiv:2111.09543.</w:t>
+        <w:t xml:space="preserve">Green, L. V., Kolesar, P. J., &amp; Whitt, W. (2007). Coping with time-varying demand when setting staffing requirements for a service system. Production and Operations Management, 16(1), 13-39.</w:t>
       </w:r>
     </w:p>
     <w:p>
@@ -16707,7 +20640,7 @@
           <w:sz w:val="20"/>
           <w:szCs w:val="20"/>
         </w:rPr>
-        <w:t xml:space="preserve">Hevner, A. R., March, S. T., Park, J., &amp; Ram, S. (2004). Design science in information systems research. MIS Quarterly, 28(1), 75-105.</w:t>
+        <w:t xml:space="preserve">Gregor, S., &amp; Hevner, A. R. (2013). Positioning and presenting design science research for maximum impact. MIS Quarterly, 37(2), 337-355.</w:t>
       </w:r>
     </w:p>
     <w:p>
@@ -16721,7 +20654,7 @@
           <w:sz w:val="20"/>
           <w:szCs w:val="20"/>
         </w:rPr>
-        <w:t xml:space="preserve">Inan, H., et al. (2023). Llama Guard: LLM-based input-output safeguard for human-AI conversations. arXiv:2312.06674.</w:t>
+        <w:t xml:space="preserve">Hawkes, A. G. (1971). Spectra of some self-exciting and mutually exciting point processes. Biometrika, 58(1), 83-90.</w:t>
       </w:r>
     </w:p>
     <w:p>
@@ -16735,7 +20668,7 @@
           <w:sz w:val="20"/>
           <w:szCs w:val="20"/>
         </w:rPr>
-        <w:t xml:space="preserve">Ji, Z., et al. (2023). Survey of hallucination in natural language generation. ACM Computing Surveys, 55(12), Article 248.</w:t>
+        <w:t xml:space="preserve">He, P., Gao, J., &amp; Chen, W. (2021). DeBERTaV3: Improving DeBERTa using ELECTRA-style pre-training with gradient-disentangled embedding sharing. arXiv:2111.09543.</w:t>
       </w:r>
     </w:p>
     <w:p>
@@ -16749,7 +20682,7 @@
           <w:sz w:val="20"/>
           <w:szCs w:val="20"/>
         </w:rPr>
-        <w:t xml:space="preserve">Kingman, J. F. C. (1993). Poisson Processes. Oxford University Press.</w:t>
+        <w:t xml:space="preserve">Hevner, A. R., March, S. T., Park, J., &amp; Ram, S. (2004). Design science in information systems research. MIS Quarterly, 28(1), 75-105.</w:t>
       </w:r>
     </w:p>
     <w:p>
@@ -16763,7 +20696,7 @@
           <w:sz w:val="20"/>
           <w:szCs w:val="20"/>
         </w:rPr>
-        <w:t xml:space="preserve">Lewis, P., et al. (2020). Retrieval-augmented generation for knowledge-intensive NLP tasks. Advances in Neural Information Processing Systems, 33.</w:t>
+        <w:t xml:space="preserve">Inan, H., et al. (2023). Llama Guard: LLM-based input-output safeguard for human-AI conversations. arXiv:2312.06674.</w:t>
       </w:r>
     </w:p>
     <w:p>
@@ -16777,7 +20710,7 @@
           <w:sz w:val="20"/>
           <w:szCs w:val="20"/>
         </w:rPr>
-        <w:t xml:space="preserve">Lin, R., &amp; Zhang, J. (2026). When to screen, when to bypass: LLM-judges in resource-scarce AI-human workflow. arXiv:2603.13870.</w:t>
+        <w:t xml:space="preserve">Ji, Z., et al. (2023). Survey of hallucination in natural language generation. ACM Computing Surveys, 55(12), Article 248.</w:t>
       </w:r>
     </w:p>
     <w:p>
@@ -16791,7 +20724,63 @@
           <w:sz w:val="20"/>
           <w:szCs w:val="20"/>
         </w:rPr>
+        <w:t xml:space="preserve">Kingman, J. F. C. (1993). Poisson Processes. Oxford University Press.</w:t>
+      </w:r>
+    </w:p>
+    <w:p>
+      <w:pPr>
+        <w:spacing w:after="70"/>
+        <w:ind w:left="360" w:hanging="360"/>
+      </w:pPr>
+      <w:r>
+        <w:rPr>
+          <w:rFonts w:ascii="Times New Roman" w:cs="Times New Roman" w:eastAsia="Times New Roman" w:hAnsi="Times New Roman"/>
+          <w:sz w:val="20"/>
+          <w:szCs w:val="20"/>
+        </w:rPr>
+        <w:t xml:space="preserve">Lewis, P., et al. (2020). Retrieval-augmented generation for knowledge-intensive NLP tasks. Advances in Neural Information Processing Systems, 33.</w:t>
+      </w:r>
+    </w:p>
+    <w:p>
+      <w:pPr>
+        <w:spacing w:after="70"/>
+        <w:ind w:left="360" w:hanging="360"/>
+      </w:pPr>
+      <w:r>
+        <w:rPr>
+          <w:rFonts w:ascii="Times New Roman" w:cs="Times New Roman" w:eastAsia="Times New Roman" w:hAnsi="Times New Roman"/>
+          <w:sz w:val="20"/>
+          <w:szCs w:val="20"/>
+        </w:rPr>
+        <w:t xml:space="preserve">Lin, R., &amp; Zhang, J. (2026). When to screen, when to bypass: LLM-judges in resource-scarce AI-human workflow. arXiv:2603.13870.</w:t>
+      </w:r>
+    </w:p>
+    <w:p>
+      <w:pPr>
+        <w:spacing w:after="70"/>
+        <w:ind w:left="360" w:hanging="360"/>
+      </w:pPr>
+      <w:r>
+        <w:rPr>
+          <w:rFonts w:ascii="Times New Roman" w:cs="Times New Roman" w:eastAsia="Times New Roman" w:hAnsi="Times New Roman"/>
+          <w:sz w:val="20"/>
+          <w:szCs w:val="20"/>
+        </w:rPr>
         <w:t xml:space="preserve">Manakul, P., Liusie, A., &amp; Gales, M. J. F. (2023). SelfCheckGPT: Zero-resource black-box hallucination detection for generative large language models. Proceedings of EMNLP 2023.</w:t>
+      </w:r>
+    </w:p>
+    <w:p>
+      <w:pPr>
+        <w:spacing w:after="70"/>
+        <w:ind w:left="360" w:hanging="360"/>
+      </w:pPr>
+      <w:r>
+        <w:rPr>
+          <w:rFonts w:ascii="Times New Roman" w:cs="Times New Roman" w:eastAsia="Times New Roman" w:hAnsi="Times New Roman"/>
+          <w:sz w:val="20"/>
+          <w:szCs w:val="20"/>
+        </w:rPr>
+        <w:t xml:space="preserve">Ogata, Y. (1988). Statistical models for earthquake occurrences and residual analysis for point processes. Journal of the American Statistical Association, 83(401), 9-27.</w:t>
       </w:r>
     </w:p>
     <w:p>

</xml_diff>

<commit_message>
Remove 2026 literature citations (arXiv preprints) and the claims that depended on them; keep data-source attributions
Co-Authored-By: Claude Sonnet 5.5 <noreply@anthropic.com>
Claude-Session: https://claude.ai/code/session_01FJoEQKBVMu4pDX4YuJC5vW
</commit_message>
<xml_diff>
--- a/hallucination_poisson/paper/LLM_Hallucination_Poisson_Framework_Revised.docx
+++ b/hallucination_poisson/paper/LLM_Hallucination_Poisson_Framework_Revised.docx
@@ -213,7 +213,7 @@
           <w:sz w:val="22"/>
           <w:szCs w:val="22"/>
         </w:rPr>
-        <w:t xml:space="preserve">, we restate the multiplicative guardrail formula as the independence special case of Fréchet-type bounds on an arrival-rate cascade (Proposition 4). Dependence between guardrail layers has been measured on real defence stacks (Alotaibi et al., 2026) and the independence product is known to over-credit redundancy (Bhardwaj et al., 2026); we add a measurement on hallucination-grounding layers with uncertainty intervals and carry the correction through to the capacity decision. We also show that, once capacity is integer-valued, total cost is generally </w:t>
+        <w:t xml:space="preserve">, we restate the multiplicative guardrail formula as the independence special case of Fréchet-type bounds on an arrival-rate cascade (Proposition 4). The independence product is known to over-credit positively associated safeguards (Esary et al., 1967); we measure the dependence between hallucination-grounding layers with uncertainty intervals and carry the correction through to the capacity decision. We also show that, once capacity is integer-valued, total cost is generally </w:t>
       </w:r>
       <w:r>
         <w:rPr>
@@ -249,7 +249,7 @@
           <w:sz w:val="22"/>
           <w:szCs w:val="22"/>
         </w:rPr>
-        <w:t xml:space="preserve">, we evaluate the pipeline on real model outputs: three small open models answering the same 300 SQuAD 2.0 questions, three guardrail layers executed with measured latency and error behaviour, and traffic replayed through a non-homogeneous arrival process whose daily-rate variability is informed by public traces. Per-query hallucination outcomes, guardrail decisions, layer dependence and latency are measured; arrival times are simulated. To our knowledge, no earlier study combines measured guardrail performance, an incident-count model with dispersion and clustering, and a quantile-based capacity decision in one framework evaluated on real system outputs and public production traces; each ingredient has precedents (Section 2).</w:t>
+        <w:t xml:space="preserve">, we evaluate the pipeline on real model outputs: three small open models answering the same 300 SQuAD 2.0 questions, three guardrail layers executed with measured latency and error behaviour, and traffic replayed through a non-homogeneous arrival process whose daily-rate variability is informed by public traces. Per-query hallucination outcomes, guardrail decisions, layer dependence and latency are measured; arrival times are simulated. Each ingredient has precedents (Section 2); the contribution is their combination in one framework and its evaluation on measured system outputs and public production traces.</w:t>
       </w:r>
     </w:p>
     <w:p>
@@ -361,7 +361,7 @@
           <w:sz w:val="22"/>
           <w:szCs w:val="22"/>
         </w:rPr>
-        <w:t xml:space="preserve">Human review capacity for AI outputs.</w:t>
+        <w:t xml:space="preserve">Human review capacity.</w:t>
       </w:r>
       <w:r>
         <w:rPr>
@@ -369,7 +369,7 @@
           <w:sz w:val="22"/>
           <w:szCs w:val="22"/>
         </w:rPr>
-        <w:t xml:space="preserve"> Queueing models of human review of AI output exist: Poisson escalation arrivals with Erlang-C staffing of human operators for agent escalations (Besanson, 2026), M/G/1 models of reviewing AI drafts (Bartolucci and Vivo, 2026), and fluid-limit routing between an LLM judge and human review (Lin and Zhang, 2026). These use mean-based stability or waiting-time criteria and assume, rather than test, Poisson arrivals. We size capacity at a quantile of the incident-count distribution and test the arrival assumptions.</w:t>
+        <w:t xml:space="preserve"> Queueing models are the standard tool for sizing human review and service capacity, with mean-based stability or waiting-time criteria (Whitt, 2007) and piecewise-stationary staffing for time-varying demand (Green et al., 2007). We size capacity at a quantile of the incident-count distribution and test the arrival assumptions on public traces.</w:t>
       </w:r>
     </w:p>
     <w:p>
@@ -385,7 +385,7 @@
           <w:sz w:val="22"/>
           <w:szCs w:val="22"/>
         </w:rPr>
-        <w:t xml:space="preserve">Counting-process models of AI failures.</w:t>
+        <w:t xml:space="preserve">Counting-process models of failures.</w:t>
       </w:r>
       <w:r>
         <w:rPr>
@@ -393,7 +393,7 @@
           <w:sz w:val="22"/>
           <w:szCs w:val="22"/>
         </w:rPr>
-        <w:t xml:space="preserve"> Public-health-style monitoring of AI incident counts has found strong over-dispersion relative to Poisson in incident-database counts of vehicle and deepfake incidents (Abraham et al., 2026), and Markov reliability models of LLM agents reduce to the Goel-Okumoto NHPP software-reliability model in the rare-failure regime (Tran-Truong and Le, 2026). Neither concerns hallucination or guardrail-bypass events, nor applies time-rescaling tests or capacity sizing.</w:t>
+        <w:t xml:space="preserve"> Non-homogeneous Poisson processes are the classical model of failure counts in software reliability (Goel and Okumoto, 1979), and self-exciting point processes represent clustered events (Hawkes, 1971; Ogata, 1988; Daley and Vere-Jones, 2003). We apply these tools to the incident streams of LLM operations and test them, including the time-rescaling goodness-of-fit test, on public data.</w:t>
       </w:r>
     </w:p>
     <w:p>
@@ -417,7 +417,7 @@
           <w:sz w:val="22"/>
           <w:szCs w:val="22"/>
         </w:rPr>
-        <w:t xml:space="preserve"> The multiplicative formula for the residual rate of independent safeguards is standard in reliability engineering, and it over-credits redundancy when failures are positively associated (Esary et al., 1967). For LLM defence stacks, Alotaibi et al. (2026) measure positive failure correlation between seven defence layers (φ between 0.30 and 0.75 on JailbreakBench) and call the product a lower bound that no real stack attains; Bhardwaj et al. (2026) give a Fréchet-Hoeffding sandwich and measure high co-failure among same-model LLM components. Our dependence results should be read as additional evidence, in a different setting (hallucination-grounding layers), rather than as a first demonstration.</w:t>
+        <w:t xml:space="preserve"> The multiplicative formula for the residual rate of independent safeguards is standard in reliability engineering, and it over-credits redundancy when failures are positively associated (Esary et al., 1967). Guardrail layers around one LLM may fail together, for example on ambiguous or adversarial outputs, so the dependence has to be measured rather than assumed; we measure it for hallucination-grounding layers and bound its effect on residual risk.</w:t>
       </w:r>
     </w:p>
     <w:p>
@@ -433,7 +433,7 @@
           <w:sz w:val="22"/>
           <w:szCs w:val="22"/>
         </w:rPr>
-        <w:t xml:space="preserve">Gap.</w:t>
+        <w:t xml:space="preserve">Scope and positioning.</w:t>
       </w:r>
       <w:r>
         <w:rPr>
@@ -441,7 +441,7 @@
           <w:sz w:val="22"/>
           <w:szCs w:val="22"/>
         </w:rPr>
-        <w:t xml:space="preserve"> Prior work addresses these pieces separately: arrival models for AI incidents, human-review queueing, measured layer dependence, and guardrail cost-latency trade-offs. We integrate them for LLM hallucination operations and evaluate the integrated pipeline on measured outputs and public traces. The literature on LLM guardrails moved quickly in 2026; our search was not exhaustive and similar work may exist.</w:t>
+        <w:t xml:space="preserve"> We combine arrival models for incident streams, human-review capacity, measured layer dependence, and guardrail cost-latency trade-offs for LLM hallucination operations, and evaluate the combination on measured outputs and public traces. Our positioning relies on sources published before 2026; the literature on LLM guardrails, AI incident monitoring and human oversight of AI outputs has been moving quickly, our search was not exhaustive, and recent work may cover parts of what is presented here.</w:t>
       </w:r>
     </w:p>
     <w:p>
@@ -22434,7 +22434,7 @@
           <w:sz w:val="20"/>
           <w:szCs w:val="20"/>
         </w:rPr>
-        <w:t xml:space="preserve">Abraham, S., et al. (2026). AI incident monitoring through a public health lens. arXiv:2604.19914.</w:t>
+        <w:t xml:space="preserve">Allal, L. B., et al. (2025). SmolLM2: When Smol goes big, data-centric training of a small language model. arXiv:2502.02737.</w:t>
       </w:r>
     </w:p>
     <w:p>
@@ -22448,7 +22448,7 @@
           <w:sz w:val="20"/>
           <w:szCs w:val="20"/>
         </w:rPr>
-        <w:t xml:space="preserve">Allal, L. B., et al. (2025). SmolLM2: When Smol goes big, data-centric training of a small language model. arXiv:2502.02737.</w:t>
+        <w:t xml:space="preserve">Amaral, C. A. L., Fantinato, M., &amp; Peres, S. M. (2018). Incident management process enriched event log [Dataset]. UCI Machine Learning Repository (dataset 498).</w:t>
       </w:r>
     </w:p>
     <w:p>
@@ -22462,7 +22462,7 @@
           <w:sz w:val="20"/>
           <w:szCs w:val="20"/>
         </w:rPr>
-        <w:t xml:space="preserve">Alotaibi, A., Jabbar, M. S., Al-Azani, S., &amp; Ahmed, M. (2026). Layered LLM defenses as an ensemble: Access tiers, inference cost, and the measured failure correlation between defense layers. arXiv:2608.28327.</w:t>
+        <w:t xml:space="preserve">Brown, L., Gans, N., Mandelbaum, A., Sakov, A., Shen, H., Zeltyn, S., &amp; Zhao, L. (2005). Statistical analysis of a telephone call center: A queueing-science perspective. Journal of the American Statistical Association, 100(469), 36-50.</w:t>
       </w:r>
     </w:p>
     <w:p>
@@ -22476,7 +22476,7 @@
           <w:sz w:val="20"/>
           <w:szCs w:val="20"/>
         </w:rPr>
-        <w:t xml:space="preserve">Amaral, C. A. L., Fantinato, M., &amp; Peres, S. M. (2018). Incident management process enriched event log [Dataset]. UCI Machine Learning Repository (dataset 498).</w:t>
+        <w:t xml:space="preserve">Cameron, A. C., &amp; Trivedi, P. K. (1998). Regression Analysis of Count Data. Cambridge University Press.</w:t>
       </w:r>
     </w:p>
     <w:p>
@@ -22490,7 +22490,7 @@
           <w:sz w:val="20"/>
           <w:szCs w:val="20"/>
         </w:rPr>
-        <w:t xml:space="preserve">Bartolucci and Vivo (2026). Queue &amp; AI: When faster tasks slow down the workflow. arXiv:2605.27202.</w:t>
+        <w:t xml:space="preserve">Charlotin, D. (2026). AI Hallucination Cases database (court decisions with AI-fabricated content). https://www.damiencharlotin.com/hallucinations/ (CC BY 4.0; accessed 6 October 2026).</w:t>
       </w:r>
     </w:p>
     <w:p>
@@ -22504,7 +22504,7 @@
           <w:sz w:val="20"/>
           <w:szCs w:val="20"/>
         </w:rPr>
-        <w:t xml:space="preserve">Besanson (2026). SARC: A governance-by-architecture framework for agentic AI systems. arXiv:2605.07728.</w:t>
+        <w:t xml:space="preserve">Chu, X., Talluri, S., Lu, Q., &amp; Iosup, A. (2025). An empirical characterization of outages and incidents in public services for large language models. Proceedings of ICPE 2025 (arXiv:2501.12469).</w:t>
       </w:r>
     </w:p>
     <w:p>
@@ -22518,7 +22518,7 @@
           <w:sz w:val="20"/>
           <w:szCs w:val="20"/>
         </w:rPr>
-        <w:t xml:space="preserve">Bhardwaj, Singh, and Bhardwaj (2026). Agent behavioral contracts II: Certifying compositional reliability without assuming independence. arXiv:2608.12895.</w:t>
+        <w:t xml:space="preserve">Cox, D. R. (1955). Some statistical methods connected with series of events. Journal of the Royal Statistical Society, Series B, 17(2), 129-164.</w:t>
       </w:r>
     </w:p>
     <w:p>
@@ -22532,7 +22532,7 @@
           <w:sz w:val="20"/>
           <w:szCs w:val="20"/>
         </w:rPr>
-        <w:t xml:space="preserve">Brown, L., Gans, N., Mandelbaum, A., Sakov, A., Shen, H., Zeltyn, S., &amp; Zhao, L. (2005). Statistical analysis of a telephone call center: A queueing-science perspective. Journal of the American Statistical Association, 100(469), 36-50.</w:t>
+        <w:t xml:space="preserve">Cox, D. R., &amp; Isham, V. (1980). Point Processes. Chapman &amp; Hall.</w:t>
       </w:r>
     </w:p>
     <w:p>
@@ -22546,7 +22546,7 @@
           <w:sz w:val="20"/>
           <w:szCs w:val="20"/>
         </w:rPr>
-        <w:t xml:space="preserve">Cameron, A. C., &amp; Trivedi, P. K. (1998). Regression Analysis of Count Data. Cambridge University Press.</w:t>
+        <w:t xml:space="preserve">Daley, D. J., &amp; Vere-Jones, D. (2003). An Introduction to the Theory of Point Processes, Volume I (2nd ed.). Springer.</w:t>
       </w:r>
     </w:p>
     <w:p>
@@ -22560,7 +22560,7 @@
           <w:sz w:val="20"/>
           <w:szCs w:val="20"/>
         </w:rPr>
-        <w:t xml:space="preserve">Charlotin, D. (2026). AI Hallucination Cases database (court decisions with AI-fabricated content). https://www.damiencharlotin.com/hallucinations/ (CC BY 4.0; accessed 6 October 2026).</w:t>
+        <w:t xml:space="preserve">Esary, J. D., Proschan, F., &amp; Walkup, D. W. (1967). Association of random variables, with applications. Annals of Mathematical Statistics, 38(5), 1466-1474.</w:t>
       </w:r>
     </w:p>
     <w:p>
@@ -22574,7 +22574,7 @@
           <w:sz w:val="20"/>
           <w:szCs w:val="20"/>
         </w:rPr>
-        <w:t xml:space="preserve">Chu, X., Talluri, S., Lu, Q., &amp; Iosup, A. (2025). An empirical characterization of outages and incidents in public services for large language models. Proceedings of ICPE 2025 (arXiv:2501.12469).</w:t>
+        <w:t xml:space="preserve">Goel, A. L., &amp; Okumoto, K. (1979). Time-dependent error-detection rate model for software reliability and other performance measures. IEEE Transactions on Reliability, R-28(3), 206-211.</w:t>
       </w:r>
     </w:p>
     <w:p>
@@ -22588,7 +22588,7 @@
           <w:sz w:val="20"/>
           <w:szCs w:val="20"/>
         </w:rPr>
-        <w:t xml:space="preserve">Cox, D. R. (1955). Some statistical methods connected with series of events. Journal of the Royal Statistical Society, Series B, 17(2), 129-164.</w:t>
+        <w:t xml:space="preserve">Green, L. V., Kolesar, P. J., &amp; Whitt, W. (2007). Coping with time-varying demand when setting staffing requirements for a service system. Production and Operations Management, 16(1), 13-39.</w:t>
       </w:r>
     </w:p>
     <w:p>
@@ -22602,7 +22602,7 @@
           <w:sz w:val="20"/>
           <w:szCs w:val="20"/>
         </w:rPr>
-        <w:t xml:space="preserve">Cox, D. R., &amp; Isham, V. (1980). Point Processes. Chapman &amp; Hall.</w:t>
+        <w:t xml:space="preserve">Gregor, S., &amp; Hevner, A. R. (2013). Positioning and presenting design science research for maximum impact. MIS Quarterly, 37(2), 337-355.</w:t>
       </w:r>
     </w:p>
     <w:p>
@@ -22616,7 +22616,7 @@
           <w:sz w:val="20"/>
           <w:szCs w:val="20"/>
         </w:rPr>
-        <w:t xml:space="preserve">Daley, D. J., &amp; Vere-Jones, D. (2003). An Introduction to the Theory of Point Processes, Volume I (2nd ed.). Springer.</w:t>
+        <w:t xml:space="preserve">Hawkes, A. G. (1971). Spectra of some self-exciting and mutually exciting point processes. Biometrika, 58(1), 83-90.</w:t>
       </w:r>
     </w:p>
     <w:p>
@@ -22630,7 +22630,7 @@
           <w:sz w:val="20"/>
           <w:szCs w:val="20"/>
         </w:rPr>
-        <w:t xml:space="preserve">Esary, J. D., Proschan, F., &amp; Walkup, D. W. (1967). Association of random variables, with applications. Annals of Mathematical Statistics, 38(5), 1466-1474.</w:t>
+        <w:t xml:space="preserve">He, P., Gao, J., &amp; Chen, W. (2021). DeBERTaV3: Improving DeBERTa using ELECTRA-style pre-training with gradient-disentangled embedding sharing. arXiv:2111.09543.</w:t>
       </w:r>
     </w:p>
     <w:p>
@@ -22644,7 +22644,7 @@
           <w:sz w:val="20"/>
           <w:szCs w:val="20"/>
         </w:rPr>
-        <w:t xml:space="preserve">Green, L. V., Kolesar, P. J., &amp; Whitt, W. (2007). Coping with time-varying demand when setting staffing requirements for a service system. Production and Operations Management, 16(1), 13-39.</w:t>
+        <w:t xml:space="preserve">Hevner, A. R., March, S. T., Park, J., &amp; Ram, S. (2004). Design science in information systems research. MIS Quarterly, 28(1), 75-105.</w:t>
       </w:r>
     </w:p>
     <w:p>
@@ -22658,7 +22658,7 @@
           <w:sz w:val="20"/>
           <w:szCs w:val="20"/>
         </w:rPr>
-        <w:t xml:space="preserve">Gregor, S., &amp; Hevner, A. R. (2013). Positioning and presenting design science research for maximum impact. MIS Quarterly, 37(2), 337-355.</w:t>
+        <w:t xml:space="preserve">Inan, H., et al. (2023). Llama Guard: LLM-based input-output safeguard for human-AI conversations. arXiv:2312.06674.</w:t>
       </w:r>
     </w:p>
     <w:p>
@@ -22672,7 +22672,7 @@
           <w:sz w:val="20"/>
           <w:szCs w:val="20"/>
         </w:rPr>
-        <w:t xml:space="preserve">Hawkes, A. G. (1971). Spectra of some self-exciting and mutually exciting point processes. Biometrika, 58(1), 83-90.</w:t>
+        <w:t xml:space="preserve">Ji, Z., et al. (2023). Survey of hallucination in natural language generation. ACM Computing Surveys, 55(12), Article 248.</w:t>
       </w:r>
     </w:p>
     <w:p>
@@ -22686,7 +22686,7 @@
           <w:sz w:val="20"/>
           <w:szCs w:val="20"/>
         </w:rPr>
-        <w:t xml:space="preserve">He, P., Gao, J., &amp; Chen, W. (2021). DeBERTaV3: Improving DeBERTa using ELECTRA-style pre-training with gradient-disentangled embedding sharing. arXiv:2111.09543.</w:t>
+        <w:t xml:space="preserve">Kingman, J. F. C. (1993). Poisson Processes. Oxford University Press.</w:t>
       </w:r>
     </w:p>
     <w:p>
@@ -22700,7 +22700,7 @@
           <w:sz w:val="20"/>
           <w:szCs w:val="20"/>
         </w:rPr>
-        <w:t xml:space="preserve">Hevner, A. R., March, S. T., Park, J., &amp; Ram, S. (2004). Design science in information systems research. MIS Quarterly, 28(1), 75-105.</w:t>
+        <w:t xml:space="preserve">Lewis, P., et al. (2020). Retrieval-augmented generation for knowledge-intensive NLP tasks. Advances in Neural Information Processing Systems, 33.</w:t>
       </w:r>
     </w:p>
     <w:p>
@@ -22714,7 +22714,7 @@
           <w:sz w:val="20"/>
           <w:szCs w:val="20"/>
         </w:rPr>
-        <w:t xml:space="preserve">Inan, H., et al. (2023). Llama Guard: LLM-based input-output safeguard for human-AI conversations. arXiv:2312.06674.</w:t>
+        <w:t xml:space="preserve">Manakul, P., Liusie, A., &amp; Gales, M. J. F. (2023). SelfCheckGPT: Zero-resource black-box hallucination detection for generative large language models. Proceedings of EMNLP 2023.</w:t>
       </w:r>
     </w:p>
     <w:p>
@@ -22728,7 +22728,7 @@
           <w:sz w:val="20"/>
           <w:szCs w:val="20"/>
         </w:rPr>
-        <w:t xml:space="preserve">Ji, Z., et al. (2023). Survey of hallucination in natural language generation. ACM Computing Surveys, 55(12), Article 248.</w:t>
+        <w:t xml:space="preserve">Ogata, Y. (1988). Statistical models for earthquake occurrences and residual analysis for point processes. Journal of the American Statistical Association, 83(401), 9-27.</w:t>
       </w:r>
     </w:p>
     <w:p>
@@ -22742,7 +22742,7 @@
           <w:sz w:val="20"/>
           <w:szCs w:val="20"/>
         </w:rPr>
-        <w:t xml:space="preserve">Kingman, J. F. C. (1993). Poisson Processes. Oxford University Press.</w:t>
+        <w:t xml:space="preserve">Qwen Team. (2024). Qwen2.5 technical report. arXiv:2412.15115.</w:t>
       </w:r>
     </w:p>
     <w:p>
@@ -22756,7 +22756,7 @@
           <w:sz w:val="20"/>
           <w:szCs w:val="20"/>
         </w:rPr>
-        <w:t xml:space="preserve">Lewis, P., et al. (2020). Retrieval-augmented generation for knowledge-intensive NLP tasks. Advances in Neural Information Processing Systems, 33.</w:t>
+        <w:t xml:space="preserve">Rajpurkar, P., Jia, R., &amp; Liang, P. (2018). Know what you don't know: Unanswerable questions for SQuAD. Proceedings of ACL 2018, 784-789.</w:t>
       </w:r>
     </w:p>
     <w:p>
@@ -22770,91 +22770,7 @@
           <w:sz w:val="20"/>
           <w:szCs w:val="20"/>
         </w:rPr>
-        <w:t xml:space="preserve">Lin, R., &amp; Zhang, J. (2026). When to screen, when to bypass: LLM-judges in resource-scarce AI-human workflow. arXiv:2603.13870.</w:t>
-      </w:r>
-    </w:p>
-    <w:p>
-      <w:pPr>
-        <w:spacing w:after="70"/>
-        <w:ind w:left="360" w:hanging="360"/>
-      </w:pPr>
-      <w:r>
-        <w:rPr>
-          <w:rFonts w:ascii="Times New Roman" w:cs="Times New Roman" w:eastAsia="Times New Roman" w:hAnsi="Times New Roman"/>
-          <w:sz w:val="20"/>
-          <w:szCs w:val="20"/>
-        </w:rPr>
-        <w:t xml:space="preserve">Manakul, P., Liusie, A., &amp; Gales, M. J. F. (2023). SelfCheckGPT: Zero-resource black-box hallucination detection for generative large language models. Proceedings of EMNLP 2023.</w:t>
-      </w:r>
-    </w:p>
-    <w:p>
-      <w:pPr>
-        <w:spacing w:after="70"/>
-        <w:ind w:left="360" w:hanging="360"/>
-      </w:pPr>
-      <w:r>
-        <w:rPr>
-          <w:rFonts w:ascii="Times New Roman" w:cs="Times New Roman" w:eastAsia="Times New Roman" w:hAnsi="Times New Roman"/>
-          <w:sz w:val="20"/>
-          <w:szCs w:val="20"/>
-        </w:rPr>
-        <w:t xml:space="preserve">Ogata, Y. (1988). Statistical models for earthquake occurrences and residual analysis for point processes. Journal of the American Statistical Association, 83(401), 9-27.</w:t>
-      </w:r>
-    </w:p>
-    <w:p>
-      <w:pPr>
-        <w:spacing w:after="70"/>
-        <w:ind w:left="360" w:hanging="360"/>
-      </w:pPr>
-      <w:r>
-        <w:rPr>
-          <w:rFonts w:ascii="Times New Roman" w:cs="Times New Roman" w:eastAsia="Times New Roman" w:hAnsi="Times New Roman"/>
-          <w:sz w:val="20"/>
-          <w:szCs w:val="20"/>
-        </w:rPr>
-        <w:t xml:space="preserve">Qwen Team. (2024). Qwen2.5 technical report. arXiv:2412.15115.</w:t>
-      </w:r>
-    </w:p>
-    <w:p>
-      <w:pPr>
-        <w:spacing w:after="70"/>
-        <w:ind w:left="360" w:hanging="360"/>
-      </w:pPr>
-      <w:r>
-        <w:rPr>
-          <w:rFonts w:ascii="Times New Roman" w:cs="Times New Roman" w:eastAsia="Times New Roman" w:hAnsi="Times New Roman"/>
-          <w:sz w:val="20"/>
-          <w:szCs w:val="20"/>
-        </w:rPr>
-        <w:t xml:space="preserve">Rajpurkar, P., Jia, R., &amp; Liang, P. (2018). Know what you don't know: Unanswerable questions for SQuAD. Proceedings of ACL 2018, 784-789.</w:t>
-      </w:r>
-    </w:p>
-    <w:p>
-      <w:pPr>
-        <w:spacing w:after="70"/>
-        <w:ind w:left="360" w:hanging="360"/>
-      </w:pPr>
-      <w:r>
-        <w:rPr>
-          <w:rFonts w:ascii="Times New Roman" w:cs="Times New Roman" w:eastAsia="Times New Roman" w:hAnsi="Times New Roman"/>
-          <w:sz w:val="20"/>
-          <w:szCs w:val="20"/>
-        </w:rPr>
         <w:t xml:space="preserve">Topkis, D. M. (1978). Minimizing a submodular function on a lattice. Operations Research, 26(2), 305-321.</w:t>
-      </w:r>
-    </w:p>
-    <w:p>
-      <w:pPr>
-        <w:spacing w:after="70"/>
-        <w:ind w:left="360" w:hanging="360"/>
-      </w:pPr>
-      <w:r>
-        <w:rPr>
-          <w:rFonts w:ascii="Times New Roman" w:cs="Times New Roman" w:eastAsia="Times New Roman" w:hAnsi="Times New Roman"/>
-          <w:sz w:val="20"/>
-          <w:szCs w:val="20"/>
-        </w:rPr>
-        <w:t xml:space="preserve">Tran-Truong and Le (2026). Measuring the unmeasurable: Markov chain reliability for LLM agents. arXiv:2604.24579.</w:t>
       </w:r>
     </w:p>
     <w:p>

</xml_diff>

<commit_message>
Revert "Remove 2026 literature citations (arXiv preprints) and the claims that depended on them; keep data-source attributions"
This reverts commit 4b2c899139f3368b7e957ab8dc145075c8765673.
</commit_message>
<xml_diff>
--- a/hallucination_poisson/paper/LLM_Hallucination_Poisson_Framework_Revised.docx
+++ b/hallucination_poisson/paper/LLM_Hallucination_Poisson_Framework_Revised.docx
@@ -213,7 +213,7 @@
           <w:sz w:val="22"/>
           <w:szCs w:val="22"/>
         </w:rPr>
-        <w:t xml:space="preserve">, we restate the multiplicative guardrail formula as the independence special case of Fréchet-type bounds on an arrival-rate cascade (Proposition 4). The independence product is known to over-credit positively associated safeguards (Esary et al., 1967); we measure the dependence between hallucination-grounding layers with uncertainty intervals and carry the correction through to the capacity decision. We also show that, once capacity is integer-valued, total cost is generally </w:t>
+        <w:t xml:space="preserve">, we restate the multiplicative guardrail formula as the independence special case of Fréchet-type bounds on an arrival-rate cascade (Proposition 4). Dependence between guardrail layers has been measured on real defence stacks (Alotaibi et al., 2026) and the independence product is known to over-credit redundancy (Bhardwaj et al., 2026); we add a measurement on hallucination-grounding layers with uncertainty intervals and carry the correction through to the capacity decision. We also show that, once capacity is integer-valued, total cost is generally </w:t>
       </w:r>
       <w:r>
         <w:rPr>
@@ -249,7 +249,7 @@
           <w:sz w:val="22"/>
           <w:szCs w:val="22"/>
         </w:rPr>
-        <w:t xml:space="preserve">, we evaluate the pipeline on real model outputs: three small open models answering the same 300 SQuAD 2.0 questions, three guardrail layers executed with measured latency and error behaviour, and traffic replayed through a non-homogeneous arrival process whose daily-rate variability is informed by public traces. Per-query hallucination outcomes, guardrail decisions, layer dependence and latency are measured; arrival times are simulated. Each ingredient has precedents (Section 2); the contribution is their combination in one framework and its evaluation on measured system outputs and public production traces.</w:t>
+        <w:t xml:space="preserve">, we evaluate the pipeline on real model outputs: three small open models answering the same 300 SQuAD 2.0 questions, three guardrail layers executed with measured latency and error behaviour, and traffic replayed through a non-homogeneous arrival process whose daily-rate variability is informed by public traces. Per-query hallucination outcomes, guardrail decisions, layer dependence and latency are measured; arrival times are simulated. To our knowledge, no earlier study combines measured guardrail performance, an incident-count model with dispersion and clustering, and a quantile-based capacity decision in one framework evaluated on real system outputs and public production traces; each ingredient has precedents (Section 2).</w:t>
       </w:r>
     </w:p>
     <w:p>
@@ -361,7 +361,7 @@
           <w:sz w:val="22"/>
           <w:szCs w:val="22"/>
         </w:rPr>
-        <w:t xml:space="preserve">Human review capacity.</w:t>
+        <w:t xml:space="preserve">Human review capacity for AI outputs.</w:t>
       </w:r>
       <w:r>
         <w:rPr>
@@ -369,7 +369,7 @@
           <w:sz w:val="22"/>
           <w:szCs w:val="22"/>
         </w:rPr>
-        <w:t xml:space="preserve"> Queueing models are the standard tool for sizing human review and service capacity, with mean-based stability or waiting-time criteria (Whitt, 2007) and piecewise-stationary staffing for time-varying demand (Green et al., 2007). We size capacity at a quantile of the incident-count distribution and test the arrival assumptions on public traces.</w:t>
+        <w:t xml:space="preserve"> Queueing models of human review of AI output exist: Poisson escalation arrivals with Erlang-C staffing of human operators for agent escalations (Besanson, 2026), M/G/1 models of reviewing AI drafts (Bartolucci and Vivo, 2026), and fluid-limit routing between an LLM judge and human review (Lin and Zhang, 2026). These use mean-based stability or waiting-time criteria and assume, rather than test, Poisson arrivals. We size capacity at a quantile of the incident-count distribution and test the arrival assumptions.</w:t>
       </w:r>
     </w:p>
     <w:p>
@@ -385,7 +385,7 @@
           <w:sz w:val="22"/>
           <w:szCs w:val="22"/>
         </w:rPr>
-        <w:t xml:space="preserve">Counting-process models of failures.</w:t>
+        <w:t xml:space="preserve">Counting-process models of AI failures.</w:t>
       </w:r>
       <w:r>
         <w:rPr>
@@ -393,7 +393,7 @@
           <w:sz w:val="22"/>
           <w:szCs w:val="22"/>
         </w:rPr>
-        <w:t xml:space="preserve"> Non-homogeneous Poisson processes are the classical model of failure counts in software reliability (Goel and Okumoto, 1979), and self-exciting point processes represent clustered events (Hawkes, 1971; Ogata, 1988; Daley and Vere-Jones, 2003). We apply these tools to the incident streams of LLM operations and test them, including the time-rescaling goodness-of-fit test, on public data.</w:t>
+        <w:t xml:space="preserve"> Public-health-style monitoring of AI incident counts has found strong over-dispersion relative to Poisson in incident-database counts of vehicle and deepfake incidents (Abraham et al., 2026), and Markov reliability models of LLM agents reduce to the Goel-Okumoto NHPP software-reliability model in the rare-failure regime (Tran-Truong and Le, 2026). Neither concerns hallucination or guardrail-bypass events, nor applies time-rescaling tests or capacity sizing.</w:t>
       </w:r>
     </w:p>
     <w:p>
@@ -417,7 +417,7 @@
           <w:sz w:val="22"/>
           <w:szCs w:val="22"/>
         </w:rPr>
-        <w:t xml:space="preserve"> The multiplicative formula for the residual rate of independent safeguards is standard in reliability engineering, and it over-credits redundancy when failures are positively associated (Esary et al., 1967). Guardrail layers around one LLM may fail together, for example on ambiguous or adversarial outputs, so the dependence has to be measured rather than assumed; we measure it for hallucination-grounding layers and bound its effect on residual risk.</w:t>
+        <w:t xml:space="preserve"> The multiplicative formula for the residual rate of independent safeguards is standard in reliability engineering, and it over-credits redundancy when failures are positively associated (Esary et al., 1967). For LLM defence stacks, Alotaibi et al. (2026) measure positive failure correlation between seven defence layers (φ between 0.30 and 0.75 on JailbreakBench) and call the product a lower bound that no real stack attains; Bhardwaj et al. (2026) give a Fréchet-Hoeffding sandwich and measure high co-failure among same-model LLM components. Our dependence results should be read as additional evidence, in a different setting (hallucination-grounding layers), rather than as a first demonstration.</w:t>
       </w:r>
     </w:p>
     <w:p>
@@ -433,7 +433,7 @@
           <w:sz w:val="22"/>
           <w:szCs w:val="22"/>
         </w:rPr>
-        <w:t xml:space="preserve">Scope and positioning.</w:t>
+        <w:t xml:space="preserve">Gap.</w:t>
       </w:r>
       <w:r>
         <w:rPr>
@@ -441,7 +441,7 @@
           <w:sz w:val="22"/>
           <w:szCs w:val="22"/>
         </w:rPr>
-        <w:t xml:space="preserve"> We combine arrival models for incident streams, human-review capacity, measured layer dependence, and guardrail cost-latency trade-offs for LLM hallucination operations, and evaluate the combination on measured outputs and public traces. Our positioning relies on sources published before 2026; the literature on LLM guardrails, AI incident monitoring and human oversight of AI outputs has been moving quickly, our search was not exhaustive, and recent work may cover parts of what is presented here.</w:t>
+        <w:t xml:space="preserve"> Prior work addresses these pieces separately: arrival models for AI incidents, human-review queueing, measured layer dependence, and guardrail cost-latency trade-offs. We integrate them for LLM hallucination operations and evaluate the integrated pipeline on measured outputs and public traces. The literature on LLM guardrails moved quickly in 2026; our search was not exhaustive and similar work may exist.</w:t>
       </w:r>
     </w:p>
     <w:p>
@@ -22434,7 +22434,7 @@
           <w:sz w:val="20"/>
           <w:szCs w:val="20"/>
         </w:rPr>
-        <w:t xml:space="preserve">Allal, L. B., et al. (2025). SmolLM2: When Smol goes big, data-centric training of a small language model. arXiv:2502.02737.</w:t>
+        <w:t xml:space="preserve">Abraham, S., et al. (2026). AI incident monitoring through a public health lens. arXiv:2604.19914.</w:t>
       </w:r>
     </w:p>
     <w:p>
@@ -22448,7 +22448,7 @@
           <w:sz w:val="20"/>
           <w:szCs w:val="20"/>
         </w:rPr>
-        <w:t xml:space="preserve">Amaral, C. A. L., Fantinato, M., &amp; Peres, S. M. (2018). Incident management process enriched event log [Dataset]. UCI Machine Learning Repository (dataset 498).</w:t>
+        <w:t xml:space="preserve">Allal, L. B., et al. (2025). SmolLM2: When Smol goes big, data-centric training of a small language model. arXiv:2502.02737.</w:t>
       </w:r>
     </w:p>
     <w:p>
@@ -22462,7 +22462,7 @@
           <w:sz w:val="20"/>
           <w:szCs w:val="20"/>
         </w:rPr>
-        <w:t xml:space="preserve">Brown, L., Gans, N., Mandelbaum, A., Sakov, A., Shen, H., Zeltyn, S., &amp; Zhao, L. (2005). Statistical analysis of a telephone call center: A queueing-science perspective. Journal of the American Statistical Association, 100(469), 36-50.</w:t>
+        <w:t xml:space="preserve">Alotaibi, A., Jabbar, M. S., Al-Azani, S., &amp; Ahmed, M. (2026). Layered LLM defenses as an ensemble: Access tiers, inference cost, and the measured failure correlation between defense layers. arXiv:2608.28327.</w:t>
       </w:r>
     </w:p>
     <w:p>
@@ -22476,7 +22476,7 @@
           <w:sz w:val="20"/>
           <w:szCs w:val="20"/>
         </w:rPr>
-        <w:t xml:space="preserve">Cameron, A. C., &amp; Trivedi, P. K. (1998). Regression Analysis of Count Data. Cambridge University Press.</w:t>
+        <w:t xml:space="preserve">Amaral, C. A. L., Fantinato, M., &amp; Peres, S. M. (2018). Incident management process enriched event log [Dataset]. UCI Machine Learning Repository (dataset 498).</w:t>
       </w:r>
     </w:p>
     <w:p>
@@ -22490,7 +22490,7 @@
           <w:sz w:val="20"/>
           <w:szCs w:val="20"/>
         </w:rPr>
-        <w:t xml:space="preserve">Charlotin, D. (2026). AI Hallucination Cases database (court decisions with AI-fabricated content). https://www.damiencharlotin.com/hallucinations/ (CC BY 4.0; accessed 6 October 2026).</w:t>
+        <w:t xml:space="preserve">Bartolucci and Vivo (2026). Queue &amp; AI: When faster tasks slow down the workflow. arXiv:2605.27202.</w:t>
       </w:r>
     </w:p>
     <w:p>
@@ -22504,7 +22504,7 @@
           <w:sz w:val="20"/>
           <w:szCs w:val="20"/>
         </w:rPr>
-        <w:t xml:space="preserve">Chu, X., Talluri, S., Lu, Q., &amp; Iosup, A. (2025). An empirical characterization of outages and incidents in public services for large language models. Proceedings of ICPE 2025 (arXiv:2501.12469).</w:t>
+        <w:t xml:space="preserve">Besanson (2026). SARC: A governance-by-architecture framework for agentic AI systems. arXiv:2605.07728.</w:t>
       </w:r>
     </w:p>
     <w:p>
@@ -22518,7 +22518,7 @@
           <w:sz w:val="20"/>
           <w:szCs w:val="20"/>
         </w:rPr>
-        <w:t xml:space="preserve">Cox, D. R. (1955). Some statistical methods connected with series of events. Journal of the Royal Statistical Society, Series B, 17(2), 129-164.</w:t>
+        <w:t xml:space="preserve">Bhardwaj, Singh, and Bhardwaj (2026). Agent behavioral contracts II: Certifying compositional reliability without assuming independence. arXiv:2608.12895.</w:t>
       </w:r>
     </w:p>
     <w:p>
@@ -22532,7 +22532,7 @@
           <w:sz w:val="20"/>
           <w:szCs w:val="20"/>
         </w:rPr>
-        <w:t xml:space="preserve">Cox, D. R., &amp; Isham, V. (1980). Point Processes. Chapman &amp; Hall.</w:t>
+        <w:t xml:space="preserve">Brown, L., Gans, N., Mandelbaum, A., Sakov, A., Shen, H., Zeltyn, S., &amp; Zhao, L. (2005). Statistical analysis of a telephone call center: A queueing-science perspective. Journal of the American Statistical Association, 100(469), 36-50.</w:t>
       </w:r>
     </w:p>
     <w:p>
@@ -22546,7 +22546,7 @@
           <w:sz w:val="20"/>
           <w:szCs w:val="20"/>
         </w:rPr>
-        <w:t xml:space="preserve">Daley, D. J., &amp; Vere-Jones, D. (2003). An Introduction to the Theory of Point Processes, Volume I (2nd ed.). Springer.</w:t>
+        <w:t xml:space="preserve">Cameron, A. C., &amp; Trivedi, P. K. (1998). Regression Analysis of Count Data. Cambridge University Press.</w:t>
       </w:r>
     </w:p>
     <w:p>
@@ -22560,7 +22560,7 @@
           <w:sz w:val="20"/>
           <w:szCs w:val="20"/>
         </w:rPr>
-        <w:t xml:space="preserve">Esary, J. D., Proschan, F., &amp; Walkup, D. W. (1967). Association of random variables, with applications. Annals of Mathematical Statistics, 38(5), 1466-1474.</w:t>
+        <w:t xml:space="preserve">Charlotin, D. (2026). AI Hallucination Cases database (court decisions with AI-fabricated content). https://www.damiencharlotin.com/hallucinations/ (CC BY 4.0; accessed 6 October 2026).</w:t>
       </w:r>
     </w:p>
     <w:p>
@@ -22574,7 +22574,7 @@
           <w:sz w:val="20"/>
           <w:szCs w:val="20"/>
         </w:rPr>
-        <w:t xml:space="preserve">Goel, A. L., &amp; Okumoto, K. (1979). Time-dependent error-detection rate model for software reliability and other performance measures. IEEE Transactions on Reliability, R-28(3), 206-211.</w:t>
+        <w:t xml:space="preserve">Chu, X., Talluri, S., Lu, Q., &amp; Iosup, A. (2025). An empirical characterization of outages and incidents in public services for large language models. Proceedings of ICPE 2025 (arXiv:2501.12469).</w:t>
       </w:r>
     </w:p>
     <w:p>
@@ -22588,7 +22588,7 @@
           <w:sz w:val="20"/>
           <w:szCs w:val="20"/>
         </w:rPr>
-        <w:t xml:space="preserve">Green, L. V., Kolesar, P. J., &amp; Whitt, W. (2007). Coping with time-varying demand when setting staffing requirements for a service system. Production and Operations Management, 16(1), 13-39.</w:t>
+        <w:t xml:space="preserve">Cox, D. R. (1955). Some statistical methods connected with series of events. Journal of the Royal Statistical Society, Series B, 17(2), 129-164.</w:t>
       </w:r>
     </w:p>
     <w:p>
@@ -22602,7 +22602,7 @@
           <w:sz w:val="20"/>
           <w:szCs w:val="20"/>
         </w:rPr>
-        <w:t xml:space="preserve">Gregor, S., &amp; Hevner, A. R. (2013). Positioning and presenting design science research for maximum impact. MIS Quarterly, 37(2), 337-355.</w:t>
+        <w:t xml:space="preserve">Cox, D. R., &amp; Isham, V. (1980). Point Processes. Chapman &amp; Hall.</w:t>
       </w:r>
     </w:p>
     <w:p>
@@ -22616,7 +22616,7 @@
           <w:sz w:val="20"/>
           <w:szCs w:val="20"/>
         </w:rPr>
-        <w:t xml:space="preserve">Hawkes, A. G. (1971). Spectra of some self-exciting and mutually exciting point processes. Biometrika, 58(1), 83-90.</w:t>
+        <w:t xml:space="preserve">Daley, D. J., &amp; Vere-Jones, D. (2003). An Introduction to the Theory of Point Processes, Volume I (2nd ed.). Springer.</w:t>
       </w:r>
     </w:p>
     <w:p>
@@ -22630,7 +22630,7 @@
           <w:sz w:val="20"/>
           <w:szCs w:val="20"/>
         </w:rPr>
-        <w:t xml:space="preserve">He, P., Gao, J., &amp; Chen, W. (2021). DeBERTaV3: Improving DeBERTa using ELECTRA-style pre-training with gradient-disentangled embedding sharing. arXiv:2111.09543.</w:t>
+        <w:t xml:space="preserve">Esary, J. D., Proschan, F., &amp; Walkup, D. W. (1967). Association of random variables, with applications. Annals of Mathematical Statistics, 38(5), 1466-1474.</w:t>
       </w:r>
     </w:p>
     <w:p>
@@ -22644,7 +22644,7 @@
           <w:sz w:val="20"/>
           <w:szCs w:val="20"/>
         </w:rPr>
-        <w:t xml:space="preserve">Hevner, A. R., March, S. T., Park, J., &amp; Ram, S. (2004). Design science in information systems research. MIS Quarterly, 28(1), 75-105.</w:t>
+        <w:t xml:space="preserve">Green, L. V., Kolesar, P. J., &amp; Whitt, W. (2007). Coping with time-varying demand when setting staffing requirements for a service system. Production and Operations Management, 16(1), 13-39.</w:t>
       </w:r>
     </w:p>
     <w:p>
@@ -22658,7 +22658,7 @@
           <w:sz w:val="20"/>
           <w:szCs w:val="20"/>
         </w:rPr>
-        <w:t xml:space="preserve">Inan, H., et al. (2023). Llama Guard: LLM-based input-output safeguard for human-AI conversations. arXiv:2312.06674.</w:t>
+        <w:t xml:space="preserve">Gregor, S., &amp; Hevner, A. R. (2013). Positioning and presenting design science research for maximum impact. MIS Quarterly, 37(2), 337-355.</w:t>
       </w:r>
     </w:p>
     <w:p>
@@ -22672,7 +22672,7 @@
           <w:sz w:val="20"/>
           <w:szCs w:val="20"/>
         </w:rPr>
-        <w:t xml:space="preserve">Ji, Z., et al. (2023). Survey of hallucination in natural language generation. ACM Computing Surveys, 55(12), Article 248.</w:t>
+        <w:t xml:space="preserve">Hawkes, A. G. (1971). Spectra of some self-exciting and mutually exciting point processes. Biometrika, 58(1), 83-90.</w:t>
       </w:r>
     </w:p>
     <w:p>
@@ -22686,7 +22686,7 @@
           <w:sz w:val="20"/>
           <w:szCs w:val="20"/>
         </w:rPr>
-        <w:t xml:space="preserve">Kingman, J. F. C. (1993). Poisson Processes. Oxford University Press.</w:t>
+        <w:t xml:space="preserve">He, P., Gao, J., &amp; Chen, W. (2021). DeBERTaV3: Improving DeBERTa using ELECTRA-style pre-training with gradient-disentangled embedding sharing. arXiv:2111.09543.</w:t>
       </w:r>
     </w:p>
     <w:p>
@@ -22700,7 +22700,7 @@
           <w:sz w:val="20"/>
           <w:szCs w:val="20"/>
         </w:rPr>
-        <w:t xml:space="preserve">Lewis, P., et al. (2020). Retrieval-augmented generation for knowledge-intensive NLP tasks. Advances in Neural Information Processing Systems, 33.</w:t>
+        <w:t xml:space="preserve">Hevner, A. R., March, S. T., Park, J., &amp; Ram, S. (2004). Design science in information systems research. MIS Quarterly, 28(1), 75-105.</w:t>
       </w:r>
     </w:p>
     <w:p>
@@ -22714,7 +22714,7 @@
           <w:sz w:val="20"/>
           <w:szCs w:val="20"/>
         </w:rPr>
-        <w:t xml:space="preserve">Manakul, P., Liusie, A., &amp; Gales, M. J. F. (2023). SelfCheckGPT: Zero-resource black-box hallucination detection for generative large language models. Proceedings of EMNLP 2023.</w:t>
+        <w:t xml:space="preserve">Inan, H., et al. (2023). Llama Guard: LLM-based input-output safeguard for human-AI conversations. arXiv:2312.06674.</w:t>
       </w:r>
     </w:p>
     <w:p>
@@ -22728,7 +22728,7 @@
           <w:sz w:val="20"/>
           <w:szCs w:val="20"/>
         </w:rPr>
-        <w:t xml:space="preserve">Ogata, Y. (1988). Statistical models for earthquake occurrences and residual analysis for point processes. Journal of the American Statistical Association, 83(401), 9-27.</w:t>
+        <w:t xml:space="preserve">Ji, Z., et al. (2023). Survey of hallucination in natural language generation. ACM Computing Surveys, 55(12), Article 248.</w:t>
       </w:r>
     </w:p>
     <w:p>
@@ -22742,7 +22742,7 @@
           <w:sz w:val="20"/>
           <w:szCs w:val="20"/>
         </w:rPr>
-        <w:t xml:space="preserve">Qwen Team. (2024). Qwen2.5 technical report. arXiv:2412.15115.</w:t>
+        <w:t xml:space="preserve">Kingman, J. F. C. (1993). Poisson Processes. Oxford University Press.</w:t>
       </w:r>
     </w:p>
     <w:p>
@@ -22756,7 +22756,7 @@
           <w:sz w:val="20"/>
           <w:szCs w:val="20"/>
         </w:rPr>
-        <w:t xml:space="preserve">Rajpurkar, P., Jia, R., &amp; Liang, P. (2018). Know what you don't know: Unanswerable questions for SQuAD. Proceedings of ACL 2018, 784-789.</w:t>
+        <w:t xml:space="preserve">Lewis, P., et al. (2020). Retrieval-augmented generation for knowledge-intensive NLP tasks. Advances in Neural Information Processing Systems, 33.</w:t>
       </w:r>
     </w:p>
     <w:p>
@@ -22770,7 +22770,91 @@
           <w:sz w:val="20"/>
           <w:szCs w:val="20"/>
         </w:rPr>
+        <w:t xml:space="preserve">Lin, R., &amp; Zhang, J. (2026). When to screen, when to bypass: LLM-judges in resource-scarce AI-human workflow. arXiv:2603.13870.</w:t>
+      </w:r>
+    </w:p>
+    <w:p>
+      <w:pPr>
+        <w:spacing w:after="70"/>
+        <w:ind w:left="360" w:hanging="360"/>
+      </w:pPr>
+      <w:r>
+        <w:rPr>
+          <w:rFonts w:ascii="Times New Roman" w:cs="Times New Roman" w:eastAsia="Times New Roman" w:hAnsi="Times New Roman"/>
+          <w:sz w:val="20"/>
+          <w:szCs w:val="20"/>
+        </w:rPr>
+        <w:t xml:space="preserve">Manakul, P., Liusie, A., &amp; Gales, M. J. F. (2023). SelfCheckGPT: Zero-resource black-box hallucination detection for generative large language models. Proceedings of EMNLP 2023.</w:t>
+      </w:r>
+    </w:p>
+    <w:p>
+      <w:pPr>
+        <w:spacing w:after="70"/>
+        <w:ind w:left="360" w:hanging="360"/>
+      </w:pPr>
+      <w:r>
+        <w:rPr>
+          <w:rFonts w:ascii="Times New Roman" w:cs="Times New Roman" w:eastAsia="Times New Roman" w:hAnsi="Times New Roman"/>
+          <w:sz w:val="20"/>
+          <w:szCs w:val="20"/>
+        </w:rPr>
+        <w:t xml:space="preserve">Ogata, Y. (1988). Statistical models for earthquake occurrences and residual analysis for point processes. Journal of the American Statistical Association, 83(401), 9-27.</w:t>
+      </w:r>
+    </w:p>
+    <w:p>
+      <w:pPr>
+        <w:spacing w:after="70"/>
+        <w:ind w:left="360" w:hanging="360"/>
+      </w:pPr>
+      <w:r>
+        <w:rPr>
+          <w:rFonts w:ascii="Times New Roman" w:cs="Times New Roman" w:eastAsia="Times New Roman" w:hAnsi="Times New Roman"/>
+          <w:sz w:val="20"/>
+          <w:szCs w:val="20"/>
+        </w:rPr>
+        <w:t xml:space="preserve">Qwen Team. (2024). Qwen2.5 technical report. arXiv:2412.15115.</w:t>
+      </w:r>
+    </w:p>
+    <w:p>
+      <w:pPr>
+        <w:spacing w:after="70"/>
+        <w:ind w:left="360" w:hanging="360"/>
+      </w:pPr>
+      <w:r>
+        <w:rPr>
+          <w:rFonts w:ascii="Times New Roman" w:cs="Times New Roman" w:eastAsia="Times New Roman" w:hAnsi="Times New Roman"/>
+          <w:sz w:val="20"/>
+          <w:szCs w:val="20"/>
+        </w:rPr>
+        <w:t xml:space="preserve">Rajpurkar, P., Jia, R., &amp; Liang, P. (2018). Know what you don't know: Unanswerable questions for SQuAD. Proceedings of ACL 2018, 784-789.</w:t>
+      </w:r>
+    </w:p>
+    <w:p>
+      <w:pPr>
+        <w:spacing w:after="70"/>
+        <w:ind w:left="360" w:hanging="360"/>
+      </w:pPr>
+      <w:r>
+        <w:rPr>
+          <w:rFonts w:ascii="Times New Roman" w:cs="Times New Roman" w:eastAsia="Times New Roman" w:hAnsi="Times New Roman"/>
+          <w:sz w:val="20"/>
+          <w:szCs w:val="20"/>
+        </w:rPr>
         <w:t xml:space="preserve">Topkis, D. M. (1978). Minimizing a submodular function on a lattice. Operations Research, 26(2), 305-321.</w:t>
+      </w:r>
+    </w:p>
+    <w:p>
+      <w:pPr>
+        <w:spacing w:after="70"/>
+        <w:ind w:left="360" w:hanging="360"/>
+      </w:pPr>
+      <w:r>
+        <w:rPr>
+          <w:rFonts w:ascii="Times New Roman" w:cs="Times New Roman" w:eastAsia="Times New Roman" w:hAnsi="Times New Roman"/>
+          <w:sz w:val="20"/>
+          <w:szCs w:val="20"/>
+        </w:rPr>
+        <w:t xml:space="preserve">Tran-Truong and Le (2026). Measuring the unmeasurable: Markov chain reliability for LLM agents. arXiv:2604.24579.</w:t>
       </w:r>
     </w:p>
     <w:p>

</xml_diff>

<commit_message>
Restore 2026 citations with surname-only author formatting
Co-Authored-By: Claude Sonnet 5.5 <noreply@anthropic.com>
Claude-Session: https://claude.ai/code/session_01FJoEQKBVMu4pDX4YuJC5vW
</commit_message>
<xml_diff>
--- a/hallucination_poisson/paper/LLM_Hallucination_Poisson_Framework_Revised.docx
+++ b/hallucination_poisson/paper/LLM_Hallucination_Poisson_Framework_Revised.docx
@@ -22434,7 +22434,7 @@
           <w:sz w:val="20"/>
           <w:szCs w:val="20"/>
         </w:rPr>
-        <w:t xml:space="preserve">Abraham, S., et al. (2026). AI incident monitoring through a public health lens. arXiv:2604.19914.</w:t>
+        <w:t xml:space="preserve">Abraham et al. (2026). AI incident monitoring through a public health lens. arXiv:2604.19914.</w:t>
       </w:r>
     </w:p>
     <w:p>
@@ -22462,7 +22462,7 @@
           <w:sz w:val="20"/>
           <w:szCs w:val="20"/>
         </w:rPr>
-        <w:t xml:space="preserve">Alotaibi, A., Jabbar, M. S., Al-Azani, S., &amp; Ahmed, M. (2026). Layered LLM defenses as an ensemble: Access tiers, inference cost, and the measured failure correlation between defense layers. arXiv:2608.28327.</w:t>
+        <w:t xml:space="preserve">Alotaibi, Jabbar, Al-Azani, and Ahmed (2026). Layered LLM defenses as an ensemble: Access tiers, inference cost, and the measured failure correlation between defense layers. arXiv:2608.28327.</w:t>
       </w:r>
     </w:p>
     <w:p>
@@ -22770,7 +22770,7 @@
           <w:sz w:val="20"/>
           <w:szCs w:val="20"/>
         </w:rPr>
-        <w:t xml:space="preserve">Lin, R., &amp; Zhang, J. (2026). When to screen, when to bypass: LLM-judges in resource-scarce AI-human workflow. arXiv:2603.13870.</w:t>
+        <w:t xml:space="preserve">Lin and Zhang (2026). When to screen, when to bypass: LLM-judges in resource-scarce AI-human workflow. arXiv:2603.13870.</w:t>
       </w:r>
     </w:p>
     <w:p>

</xml_diff>

<commit_message>
Replace 'et al.' by author surname lists ('and co-authors' where the full list is unverified)
Co-Authored-By: Claude Sonnet 5.5 <noreply@anthropic.com>
Claude-Session: https://claude.ai/code/session_01FJoEQKBVMu4pDX4YuJC5vW
</commit_message>
<xml_diff>
--- a/hallucination_poisson/paper/LLM_Hallucination_Poisson_Framework_Revised.docx
+++ b/hallucination_poisson/paper/LLM_Hallucination_Poisson_Framework_Revised.docx
@@ -213,7 +213,7 @@
           <w:sz w:val="22"/>
           <w:szCs w:val="22"/>
         </w:rPr>
-        <w:t xml:space="preserve">, we restate the multiplicative guardrail formula as the independence special case of Fréchet-type bounds on an arrival-rate cascade (Proposition 4). Dependence between guardrail layers has been measured on real defence stacks (Alotaibi et al., 2026) and the independence product is known to over-credit redundancy (Bhardwaj et al., 2026); we add a measurement on hallucination-grounding layers with uncertainty intervals and carry the correction through to the capacity decision. We also show that, once capacity is integer-valued, total cost is generally </w:t>
+        <w:t xml:space="preserve">, we restate the multiplicative guardrail formula as the independence special case of Fréchet-type bounds on an arrival-rate cascade (Proposition 4). Dependence between guardrail layers has been measured on real defence stacks (Alotaibi, Jabbar, Al-Azani, and Ahmed, 2026) and the independence product is known to over-credit redundancy (Bhardwaj, Singh, and Bhardwaj, 2026); we add a measurement on hallucination-grounding layers with uncertainty intervals and carry the correction through to the capacity decision. We also show that, once capacity is integer-valued, total cost is generally </w:t>
       </w:r>
       <w:r>
         <w:rPr>
@@ -263,7 +263,7 @@
           <w:sz w:val="22"/>
           <w:szCs w:val="22"/>
         </w:rPr>
-        <w:t xml:space="preserve">The paper follows the design-science tradition in IS (Hevner et al., 2004; Gregor and Hevner, 2013): we propose an artifact (a capacity-planning and guardrail-sizing method), ground it in a formal model, and evaluate it on real system outputs. We are explicit about what the evaluation does and does not establish (Section 6).</w:t>
+        <w:t xml:space="preserve">The paper follows the design-science tradition in IS (Hevner, March, Park, and Ram, 2004; Gregor and Hevner, 2013): we propose an artifact (a capacity-planning and guardrail-sizing method), ground it in a formal model, and evaluate it on real system outputs. We are explicit about what the evaluation does and does not establish (Section 6).</w:t>
       </w:r>
     </w:p>
     <w:p>
@@ -303,7 +303,7 @@
           <w:sz w:val="22"/>
           <w:szCs w:val="22"/>
         </w:rPr>
-        <w:t xml:space="preserve"> Surveys document hallucination as a pervasive property of neural text generation (Ji et al., 2023). Mitigation work includes retrieval grounding (Lewis et al., 2020), sampling-based consistency checks (Manakul et al., 2023), safeguard classifiers (Inan et al., 2023) and LLM-as-judge verification (Zheng et al., 2023). This literature evaluates </w:t>
+        <w:t xml:space="preserve"> Surveys document hallucination as a pervasive property of neural text generation (Ji and co-authors, 2023). Mitigation work includes retrieval grounding (Lewis, Perez, Piktus, Petroni, Karpukhin, Goyal, Küttler, Lewis, Yih, Rocktäschel, Riedel, and Kiela, 2020), sampling-based consistency checks (Manakul, Liusie, and Gales, 2023), safeguard classifiers (Inan, Upasani, Chi, Rungta, Iyer, Mao, Tontchev, Hu, Fuller, Testuggine, and Khabsa, 2023) and LLM-as-judge verification (Zheng, Chiang, Sheng, Zhuang, Wu, Zhuang, Lin, Li, Li, Xing, Zhang, Gonzalez, and Stoica, 2023). This literature evaluates </w:t>
       </w:r>
       <w:r>
         <w:rPr>
@@ -345,7 +345,7 @@
           <w:sz w:val="22"/>
           <w:szCs w:val="22"/>
         </w:rPr>
-        <w:t xml:space="preserve"> The use of the Poisson quantile to size service capacity is classical in service operations (Whitt, 2007), and time-varying demand is handled by piecewise-stationary staffing (Green et al., 2007). Empirical studies of call centres report that arrivals are well described by a Poisson process only conditional on a random, day-specific rate, i.e. they are over-dispersed (Brown et al., 2005); count-data econometrics offers the negative-binomial remedy (Cameron and Trivedi, 1998). We import these tools to a new arrival stream and test whether the same caveats apply.</w:t>
+        <w:t xml:space="preserve"> The use of the Poisson quantile to size service capacity is classical in service operations (Whitt, 2007), and time-varying demand is handled by piecewise-stationary staffing (Green, Kolesar, and Whitt, 2007). Empirical studies of call centres report that arrivals are well described by a Poisson process only conditional on a random, day-specific rate, i.e. they are over-dispersed (Brown, Gans, Mandelbaum, Sakov, Shen, Zeltyn, and Zhao, 2005); count-data econometrics offers the negative-binomial remedy (Cameron and Trivedi, 1998). We import these tools to a new arrival stream and test whether the same caveats apply.</w:t>
       </w:r>
     </w:p>
     <w:p>
@@ -393,7 +393,7 @@
           <w:sz w:val="22"/>
           <w:szCs w:val="22"/>
         </w:rPr>
-        <w:t xml:space="preserve"> Public-health-style monitoring of AI incident counts has found strong over-dispersion relative to Poisson in incident-database counts of vehicle and deepfake incidents (Abraham et al., 2026), and Markov reliability models of LLM agents reduce to the Goel-Okumoto NHPP software-reliability model in the rare-failure regime (Tran-Truong and Le, 2026). Neither concerns hallucination or guardrail-bypass events, nor applies time-rescaling tests or capacity sizing.</w:t>
+        <w:t xml:space="preserve"> Public-health-style monitoring of AI incident counts has found strong over-dispersion relative to Poisson in incident-database counts of vehicle and deepfake incidents (Abraham, Chen, Chhun, and five co-authors, 2026), and Markov reliability models of LLM agents reduce to the Goel-Okumoto NHPP software-reliability model in the rare-failure regime (Tran-Truong and Le, 2026). Neither concerns hallucination or guardrail-bypass events, nor applies time-rescaling tests or capacity sizing.</w:t>
       </w:r>
     </w:p>
     <w:p>
@@ -417,7 +417,7 @@
           <w:sz w:val="22"/>
           <w:szCs w:val="22"/>
         </w:rPr>
-        <w:t xml:space="preserve"> The multiplicative formula for the residual rate of independent safeguards is standard in reliability engineering, and it over-credits redundancy when failures are positively associated (Esary et al., 1967). For LLM defence stacks, Alotaibi et al. (2026) measure positive failure correlation between seven defence layers (φ between 0.30 and 0.75 on JailbreakBench) and call the product a lower bound that no real stack attains; Bhardwaj et al. (2026) give a Fréchet-Hoeffding sandwich and measure high co-failure among same-model LLM components. Our dependence results should be read as additional evidence, in a different setting (hallucination-grounding layers), rather than as a first demonstration.</w:t>
+        <w:t xml:space="preserve"> The multiplicative formula for the residual rate of independent safeguards is standard in reliability engineering, and it over-credits redundancy when failures are positively associated (Esary, Proschan, and Walkup, 1967). For LLM defence stacks, Alotaibi, Jabbar, Al-Azani, and Ahmed (2026) measure positive failure correlation between seven defence layers (φ between 0.30 and 0.75 on JailbreakBench) and call the product a lower bound that no real stack attains; Bhardwaj, Singh, and Bhardwaj (2026) give a Fréchet-Hoeffding sandwich and measure high co-failure among same-model LLM components. Our dependence results should be read as additional evidence, in a different setting (hallucination-grounding layers), rather than as a first demonstration.</w:t>
       </w:r>
     </w:p>
     <w:p>
@@ -3076,7 +3076,7 @@
           <w:sz w:val="22"/>
           <w:szCs w:val="22"/>
         </w:rPr>
-        <w:t xml:space="preserve">For any joint behaviour of the layers, λ₀(1 - Σc_i)⁺ ≤ λ_N ≤ λ₀(1 - max_i c_i). If the layers' catch indicators, conditional on a hallucination, are positively associated (Esary et al., 1967), then additionally λ_N ≥ λ₀Π(1 - c_i). Consequently the multiplicative formula under-states residual risk and, through Proposition 1(a), under-states required capacity.</w:t>
+        <w:t xml:space="preserve">For any joint behaviour of the layers, λ₀(1 - Σc_i)⁺ ≤ λ_N ≤ λ₀(1 - max_i c_i). If the layers' catch indicators, conditional on a hallucination, are positively associated (Esary, Proschan, and Walkup, 1967), then additionally λ_N ≥ λ₀Π(1 - c_i). Consequently the multiplicative formula under-states residual risk and, through Proposition 1(a), under-states required capacity.</w:t>
       </w:r>
     </w:p>
     <w:p>
@@ -3100,7 +3100,7 @@
           <w:sz w:val="22"/>
           <w:szCs w:val="22"/>
         </w:rPr>
-        <w:t xml:space="preserve"> The bounds are the Fréchet-Bonferroni bounds for the event that no layer fires. For associated indicators, P(∩{I_i = 0}) ≥ ΠP(I_i = 0) (Esary et al., 1967). ∎</w:t>
+        <w:t xml:space="preserve"> The bounds are the Fréchet-Bonferroni bounds for the event that no layer fires. For associated indicators, P(∩{I_i = 0}) ≥ ΠP(I_i = 0) (Esary, Proschan, and Walkup, 1967). ∎</w:t>
       </w:r>
     </w:p>
     <w:p>
@@ -7545,7 +7545,7 @@
           <w:sz w:val="22"/>
           <w:szCs w:val="22"/>
         </w:rPr>
-        <w:t xml:space="preserve">We use the SQuAD 2.0 validation set (Rajpurkar et al., 2018), which combines answerable questions with questions that the supplied passage cannot answer. One random sample of 300 questions (seed 0; 148 unanswerable) is drawn once and given to all three models, so the three runs are paired on the same questions and are not independent samples. Each model receives the passage and the question and must reply with a short answer or the token UNANSWERABLE. A response is labelled a </w:t>
+        <w:t xml:space="preserve">We use the SQuAD 2.0 validation set (Rajpurkar, Jia, and Liang, 2018), which combines answerable questions with questions that the supplied passage cannot answer. One random sample of 300 questions (seed 0; 148 unanswerable) is drawn once and given to all three models, so the three runs are paired on the same questions and are not independent samples. Each model receives the passage and the question and must reply with a short answer or the token UNANSWERABLE. A response is labelled a </w:t>
       </w:r>
       <w:r>
         <w:rPr>
@@ -7563,7 +7563,7 @@
           <w:sz w:val="22"/>
           <w:szCs w:val="22"/>
         </w:rPr>
-        <w:t xml:space="preserve"> if it is not an abstention and either (i) the question is answerable and the answer matches no gold answer (normalised containment or token-F1 ≥ 0.6) or (ii) the question is unanswerable. Abstentions are never counted as hallucinations and bypass the guardrails. The generators are Qwen2.5-0.5B-Instruct, SmolLM2-360M-Instruct and Qwen2.5-1.5B-Instruct (Qwen Team, 2024; Allal et al., 2025), run greedily on CPU. We use small open models because they can be run end-to-end with full control and measured latency; their hallucination rate is higher than that of frontier models, so absolute rates should not be transferred (Section 6).</w:t>
+        <w:t xml:space="preserve"> if it is not an abstention and either (i) the question is answerable and the answer matches no gold answer (normalised containment or token-F1 ≥ 0.6) or (ii) the question is unanswerable. Abstentions are never counted as hallucinations and bypass the guardrails. The generators are Qwen2.5-0.5B-Instruct, SmolLM2-360M-Instruct and Qwen2.5-1.5B-Instruct (Qwen Team, 2024; Allal and co-authors, 2025), run greedily on CPU. We use small open models because they can be run end-to-end with full control and measured latency; their hallucination rate is higher than that of frontier models, so absolute rates should not be transferred (Section 6).</w:t>
       </w:r>
     </w:p>
     <w:p>
@@ -7651,7 +7651,7 @@
           <w:sz w:val="22"/>
           <w:szCs w:val="22"/>
         </w:rPr>
-        <w:t xml:space="preserve"> A SQuAD 2.0-trained extractive-QA model (deepset/roberta-base-squad2) answers the question from the evidence passage; the score is the token-F1 between its span and the generator's answer (0 if it predicts "no answer"), and the output is blocked if the score is below 0.5 (a threshold we did not tune). The first implementation of L2 was an NLI cross-encoder (DeBERTa-v3-small; He et al., 2021) scoring P(passage entails "the answer to Q is A"); it was uninformative and was replaced after we had seen the results (Section 5.1). Llama Guard-type classifiers target safety-policy violations rather than factual grounding and were therefore not used.</w:t>
+        <w:t xml:space="preserve"> A SQuAD 2.0-trained extractive-QA model (deepset/roberta-base-squad2) answers the question from the evidence passage; the score is the token-F1 between its span and the generator's answer (0 if it predicts "no answer"), and the output is blocked if the score is below 0.5 (a threshold we did not tune). The first implementation of L2 was an NLI cross-encoder (DeBERTa-v3-small; He, Gao, and Chen, 2021) scoring P(passage entails "the answer to Q is A"); it was uninformative and was replaced after we had seen the results (Section 5.1). Llama Guard-type classifiers target safety-policy violations rather than factual grounding and were therefore not used.</w:t>
       </w:r>
     </w:p>
     <w:p>
@@ -7679,7 +7679,7 @@
           <w:sz w:val="22"/>
           <w:szCs w:val="22"/>
         </w:rPr>
-        <w:t xml:space="preserve"> An LLM judge (Qwen2.5-1.5B-Instruct in every run) given the passage, question and answer, replying SUPPORTED or UNSUPPORTED (Zheng et al., 2023). It is invoked only when routed: when L2 is present, only if the L2 score is below 0.9.</w:t>
+        <w:t xml:space="preserve"> An LLM judge (Qwen2.5-1.5B-Instruct in every run) given the passage, question and answer, replying SUPPORTED or UNSUPPORTED (Zheng, Chiang, Sheng, Zhuang, Wu, Zhuang, Lin, Li, Li, Xing, Zhang, Gonzalez, and Stoica, 2023). It is invoked only when routed: when L2 is present, only if the L2 score is below 0.9.</w:t>
       </w:r>
     </w:p>
     <w:p>
@@ -7947,7 +7947,7 @@
           <w:sz w:val="22"/>
           <w:szCs w:val="22"/>
         </w:rPr>
-        <w:t xml:space="preserve"> (Wang et al., 2025; CC BY 4.0) contains 10.6 million request records of regional Azure OpenAI ChatGPT and GPT-4 services at one-second resolution over 231 days (two contiguous segments of 121 and 110 days separated by an unrecorded gap of 104 days; timestamps are seconds from an undisclosed day 0, so weekday labels are unknown); failed requests are the rows with zero response tokens. We estimate the hour-of-day profile, the day-to-day variability of request volume (robustly, because volume grows by two orders of magnitude and contains regime shifts), and the within-hour Fano factor of counts at 1 s, 10 s, 1 min and 10 min. </w:t>
+        <w:t xml:space="preserve"> (Wang and co-authors, 2025; CC BY 4.0) contains 10.6 million request records of regional Azure OpenAI ChatGPT and GPT-4 services at one-second resolution over 231 days (two contiguous segments of 121 and 110 days separated by an unrecorded gap of 104 days; timestamps are seconds from an undisclosed day 0, so weekday labels are unknown); failed requests are the rows with zero response tokens. We estimate the hour-of-day profile, the day-to-day variability of request volume (robustly, because volume grows by two orders of magnitude and contains regime shifts), and the within-hour Fano factor of counts at 1 s, 10 s, 1 min and 10 min. </w:t>
       </w:r>
       <w:r>
         <w:rPr>
@@ -7965,7 +7965,7 @@
           <w:sz w:val="22"/>
           <w:szCs w:val="22"/>
         </w:rPr>
-        <w:t xml:space="preserve"> (Chu et al., 2025; CC BY 4.0) contains provider-declared incidents scraped from the OpenAI, Anthropic and Character.AI status pages; we use the 457 incidents starting from March 2023, when all three pages are populated, and test Poisson counts per day and week (index of dispersion, also stratified by day of week), day-of-week and hour-of-day homogeneity, exponential inter-arrival times after time-rescaling with a fitted hour-of-week intensity, the distribution of incident durations as a proxy for human response time, and the number of concurrently open incidents against the M/G/∞ prediction. For </w:t>
+        <w:t xml:space="preserve"> (Chu, Talluri, Lu, and Iosup, 2025; CC BY 4.0) contains provider-declared incidents scraped from the OpenAI, Anthropic and Character.AI status pages; we use the 457 incidents starting from March 2023, when all three pages are populated, and test Poisson counts per day and week (index of dispersion, also stratified by day of week), day-of-week and hour-of-day homogeneity, exponential inter-arrival times after time-rescaling with a fitted hour-of-week intensity, the distribution of incident durations as a proxy for human response time, and the number of concurrently open incidents against the M/G/∞ prediction. For </w:t>
       </w:r>
       <w:r>
         <w:rPr>
@@ -7983,7 +7983,7 @@
           <w:sz w:val="22"/>
           <w:szCs w:val="22"/>
         </w:rPr>
-        <w:t xml:space="preserve"> we use three public company ticket datasets: customer tickets of an international software company (Abdellatif, 2026; 22,016 customer tickets from 2017 to March 2023, with creation, resolution and in-progress times), the audit log of a ServiceNow instance of an IT company (Amaral et al., 2018; 24,918 incidents in 2016-2017) and the help-desk log of an Italian software company (Verenich, 2016; 3,804 cases, 2010-2012). Filters: for the software company we keep tickets of type "Ticket", created in 2017 or later and resolved as "Done" (22,016 of 66,691 rows; 45,275 are of type Ticket, 23,871 of them created from 2017 on); the work week is detected from the data as the five busiest days of the week (Sunday-Thursday for this company, Monday-Friday for the others). The ServiceNow log has 98.9% of its incidents opened between 29 February and 1 June 2016, so its arrival analysis uses only the stationary middle weeks (7 March to 27 May 2016) and its concurrency is not analysed. For each stream we estimate weekday-stratified over-dispersion, the daily rate CV net of slow trends (Pearson dispersion of weekday counts against a leave-one-out local mean over about eight weeks, after removing the weekday effect), the exceedance rate of Poisson-sized capacity plans, the distribution of resolution and in-progress times (exponential, lognormal and Weibull fits compared by AIC), the daily workload safety factor (95th percentile over mean of handling hours versus arrivals), and the number of concurrently open tickets against the M/G/∞ Poisson prediction. For </w:t>
+        <w:t xml:space="preserve"> we use three public company ticket datasets: customer tickets of an international software company (Abdellatif, 2026; 22,016 customer tickets from 2017 to March 2023, with creation, resolution and in-progress times), the audit log of a ServiceNow instance of an IT company (Amaral, Fantinato, and Peres, 2018; 24,918 incidents in 2016-2017) and the help-desk log of an Italian software company (Verenich, 2016; 3,804 cases, 2010-2012). Filters: for the software company we keep tickets of type "Ticket", created in 2017 or later and resolved as "Done" (22,016 of 66,691 rows; 45,275 are of type Ticket, 23,871 of them created from 2017 on); the work week is detected from the data as the five busiest days of the week (Sunday-Thursday for this company, Monday-Friday for the others). The ServiceNow log has 98.9% of its incidents opened between 29 February and 1 June 2016, so its arrival analysis uses only the stationary middle weeks (7 March to 27 May 2016) and its concurrency is not analysed. For each stream we estimate weekday-stratified over-dispersion, the daily rate CV net of slow trends (Pearson dispersion of weekday counts against a leave-one-out local mean over about eight weeks, after removing the weekday effect), the exceedance rate of Poisson-sized capacity plans, the distribution of resolution and in-progress times (exponential, lognormal and Weibull fits compared by AIC), the daily workload safety factor (95th percentile over mean of handling hours versus arrivals), and the number of concurrently open tickets against the M/G/∞ Poisson prediction. For </w:t>
       </w:r>
       <w:r>
         <w:rPr>
@@ -22434,7 +22434,7 @@
           <w:sz w:val="20"/>
           <w:szCs w:val="20"/>
         </w:rPr>
-        <w:t xml:space="preserve">Abraham et al. (2026). AI incident monitoring through a public health lens. arXiv:2604.19914.</w:t>
+        <w:t xml:space="preserve">Abraham, Chen, Chhun, and five co-authors (2026). AI incident monitoring through a public health lens. arXiv:2604.19914.</w:t>
       </w:r>
     </w:p>
     <w:p>
@@ -22448,7 +22448,7 @@
           <w:sz w:val="20"/>
           <w:szCs w:val="20"/>
         </w:rPr>
-        <w:t xml:space="preserve">Allal, L. B., et al. (2025). SmolLM2: When Smol goes big, data-centric training of a small language model. arXiv:2502.02737.</w:t>
+        <w:t xml:space="preserve">Allal and co-authors (2025). SmolLM2: When Smol goes big, data-centric training of a small language model. arXiv:2502.02737.</w:t>
       </w:r>
     </w:p>
     <w:p>
@@ -22714,7 +22714,7 @@
           <w:sz w:val="20"/>
           <w:szCs w:val="20"/>
         </w:rPr>
-        <w:t xml:space="preserve">Inan, H., et al. (2023). Llama Guard: LLM-based input-output safeguard for human-AI conversations. arXiv:2312.06674.</w:t>
+        <w:t xml:space="preserve">Inan, Upasani, Chi, Rungta, Iyer, Mao, Tontchev, Hu, Fuller, Testuggine, and Khabsa (2023). Llama Guard: LLM-based input-output safeguard for human-AI conversations. arXiv:2312.06674.</w:t>
       </w:r>
     </w:p>
     <w:p>
@@ -22728,7 +22728,7 @@
           <w:sz w:val="20"/>
           <w:szCs w:val="20"/>
         </w:rPr>
-        <w:t xml:space="preserve">Ji, Z., et al. (2023). Survey of hallucination in natural language generation. ACM Computing Surveys, 55(12), Article 248.</w:t>
+        <w:t xml:space="preserve">Ji and co-authors (2023). Survey of hallucination in natural language generation. ACM Computing Surveys, 55(12), Article 248.</w:t>
       </w:r>
     </w:p>
     <w:p>
@@ -22756,7 +22756,7 @@
           <w:sz w:val="20"/>
           <w:szCs w:val="20"/>
         </w:rPr>
-        <w:t xml:space="preserve">Lewis, P., et al. (2020). Retrieval-augmented generation for knowledge-intensive NLP tasks. Advances in Neural Information Processing Systems, 33.</w:t>
+        <w:t xml:space="preserve">Lewis, Perez, Piktus, Petroni, Karpukhin, Goyal, Küttler, Lewis, Yih, Rocktäschel, Riedel, and Kiela (2020). Retrieval-augmented generation for knowledge-intensive NLP tasks. Advances in Neural Information Processing Systems, 33.</w:t>
       </w:r>
     </w:p>
     <w:p>
@@ -22882,7 +22882,7 @@
           <w:sz w:val="20"/>
           <w:szCs w:val="20"/>
         </w:rPr>
-        <w:t xml:space="preserve">Wang, Y., et al. (2025). BurstGPT: A real-world workload dataset to optimize LLM serving systems. Proceedings of KDD 2025 (arXiv:2401.17644).</w:t>
+        <w:t xml:space="preserve">Wang and co-authors (2025). BurstGPT: A real-world workload dataset to optimize LLM serving systems. Proceedings of KDD 2025 (arXiv:2401.17644).</w:t>
       </w:r>
     </w:p>
     <w:p>
@@ -22910,7 +22910,7 @@
           <w:sz w:val="20"/>
           <w:szCs w:val="20"/>
         </w:rPr>
-        <w:t xml:space="preserve">Zheng, L., et al. (2023). Judging LLM-as-a-judge with MT-Bench and Chatbot Arena. Advances in Neural Information Processing Systems, 36.</w:t>
+        <w:t xml:space="preserve">Zheng, Chiang, Sheng, Zhuang, Wu, Zhuang, Lin, Li, Li, Xing, Zhang, Gonzalez, and Stoica (2023). Judging LLM-as-a-judge with MT-Bench and Chatbot Arena. Advances in Neural Information Processing Systems, 36.</w:t>
       </w:r>
     </w:p>
     <w:sectPr>

</xml_diff>

<commit_message>
Fill full author surname lists from the arXiv API for all arXiv references
Co-Authored-By: Claude Sonnet 5.5 <noreply@anthropic.com>
Claude-Session: https://claude.ai/code/session_01FJoEQKBVMu4pDX4YuJC5vW
</commit_message>
<xml_diff>
--- a/hallucination_poisson/paper/LLM_Hallucination_Poisson_Framework_Revised.docx
+++ b/hallucination_poisson/paper/LLM_Hallucination_Poisson_Framework_Revised.docx
@@ -303,7 +303,7 @@
           <w:sz w:val="22"/>
           <w:szCs w:val="22"/>
         </w:rPr>
-        <w:t xml:space="preserve"> Surveys document hallucination as a pervasive property of neural text generation (Ji and co-authors, 2023). Mitigation work includes retrieval grounding (Lewis, Perez, Piktus, Petroni, Karpukhin, Goyal, Küttler, Lewis, Yih, Rocktäschel, Riedel, and Kiela, 2020), sampling-based consistency checks (Manakul, Liusie, and Gales, 2023), safeguard classifiers (Inan, Upasani, Chi, Rungta, Iyer, Mao, Tontchev, Hu, Fuller, Testuggine, and Khabsa, 2023) and LLM-as-judge verification (Zheng, Chiang, Sheng, Zhuang, Wu, Zhuang, Lin, Li, Li, Xing, Zhang, Gonzalez, and Stoica, 2023). This literature evaluates </w:t>
+        <w:t xml:space="preserve"> Surveys document hallucination as a pervasive property of neural text generation (Ji, Lee, Frieske, Yu, Su, Xu, Ishii, Bang, Chen, Dai, Chan, Madotto, and Fung, 2023). Mitigation work includes retrieval grounding (Lewis, Perez, Piktus, Petroni, Karpukhin, Goyal, Küttler, Lewis, Yih, Rocktäschel, Riedel, and Kiela, 2020), sampling-based consistency checks (Manakul, Liusie, and Gales, 2023), safeguard classifiers (Inan, Upasani, Chi, Rungta, Iyer, Mao, Tontchev, Hu, Fuller, Testuggine, and Khabsa, 2023) and LLM-as-judge verification (Zheng, Chiang, Sheng, Zhuang, Wu, Zhuang, Lin, Li, Li, Xing, Zhang, Gonzalez, and Stoica, 2023). This literature evaluates </w:t>
       </w:r>
       <w:r>
         <w:rPr>
@@ -393,7 +393,7 @@
           <w:sz w:val="22"/>
           <w:szCs w:val="22"/>
         </w:rPr>
-        <w:t xml:space="preserve"> Public-health-style monitoring of AI incident counts has found strong over-dispersion relative to Poisson in incident-database counts of vehicle and deepfake incidents (Abraham, Chen, Chhun, and five co-authors, 2026), and Markov reliability models of LLM agents reduce to the Goel-Okumoto NHPP software-reliability model in the rare-failure regime (Tran-Truong and Le, 2026). Neither concerns hallucination or guardrail-bypass events, nor applies time-rescaling tests or capacity sizing.</w:t>
+        <w:t xml:space="preserve"> Public-health-style monitoring of AI incident counts has found strong over-dispersion relative to Poisson in incident-database counts of vehicle and deepfake incidents (Abraham, Chen, Chhun, Jaramillo-Gutierrez, Mylius, Raaj, Slattery, and McGregor, 2026), and Markov reliability models of LLM agents reduce to the Goel-Okumoto NHPP software-reliability model in the rare-failure regime (Tran-Truong and Le, 2026). Neither concerns hallucination or guardrail-bypass events, nor applies time-rescaling tests or capacity sizing.</w:t>
       </w:r>
     </w:p>
     <w:p>
@@ -7563,7 +7563,7 @@
           <w:sz w:val="22"/>
           <w:szCs w:val="22"/>
         </w:rPr>
-        <w:t xml:space="preserve"> if it is not an abstention and either (i) the question is answerable and the answer matches no gold answer (normalised containment or token-F1 ≥ 0.6) or (ii) the question is unanswerable. Abstentions are never counted as hallucinations and bypass the guardrails. The generators are Qwen2.5-0.5B-Instruct, SmolLM2-360M-Instruct and Qwen2.5-1.5B-Instruct (Qwen Team, 2024; Allal and co-authors, 2025), run greedily on CPU. We use small open models because they can be run end-to-end with full control and measured latency; their hallucination rate is higher than that of frontier models, so absolute rates should not be transferred (Section 6).</w:t>
+        <w:t xml:space="preserve"> if it is not an abstention and either (i) the question is answerable and the answer matches no gold answer (normalised containment or token-F1 ≥ 0.6) or (ii) the question is unanswerable. Abstentions are never counted as hallucinations and bypass the guardrails. The generators are Qwen2.5-0.5B-Instruct, SmolLM2-360M-Instruct and Qwen2.5-1.5B-Instruct (Qwen Team, 2024; Allal, Lozhkov, Bakouch, Blázquez, Penedo, Tunstall, Marafioti, Kydlíček, Piqueres Lajarín, Srivastav, Lochner, Fahlgren, Nguyen, Fourrier, Burtenshaw, Larcher, Zhao, Zakka, Morlon, Raffel, von Werra, and Wolf, 2025), run greedily on CPU. We use small open models because they can be run end-to-end with full control and measured latency; their hallucination rate is higher than that of frontier models, so absolute rates should not be transferred (Section 6).</w:t>
       </w:r>
     </w:p>
     <w:p>
@@ -7947,7 +7947,7 @@
           <w:sz w:val="22"/>
           <w:szCs w:val="22"/>
         </w:rPr>
-        <w:t xml:space="preserve"> (Wang and co-authors, 2025; CC BY 4.0) contains 10.6 million request records of regional Azure OpenAI ChatGPT and GPT-4 services at one-second resolution over 231 days (two contiguous segments of 121 and 110 days separated by an unrecorded gap of 104 days; timestamps are seconds from an undisclosed day 0, so weekday labels are unknown); failed requests are the rows with zero response tokens. We estimate the hour-of-day profile, the day-to-day variability of request volume (robustly, because volume grows by two orders of magnitude and contains regime shifts), and the within-hour Fano factor of counts at 1 s, 10 s, 1 min and 10 min. </w:t>
+        <w:t xml:space="preserve"> (Wang, Chen, Li, Kang, Fang, Zhou, Zheng, Tang, He, Guo, Wang, Wang, Zhou, and Chu, 2025; CC BY 4.0) contains 10.6 million request records of regional Azure OpenAI ChatGPT and GPT-4 services at one-second resolution over 231 days (two contiguous segments of 121 and 110 days separated by an unrecorded gap of 104 days; timestamps are seconds from an undisclosed day 0, so weekday labels are unknown); failed requests are the rows with zero response tokens. We estimate the hour-of-day profile, the day-to-day variability of request volume (robustly, because volume grows by two orders of magnitude and contains regime shifts), and the within-hour Fano factor of counts at 1 s, 10 s, 1 min and 10 min. </w:t>
       </w:r>
       <w:r>
         <w:rPr>
@@ -22434,7 +22434,7 @@
           <w:sz w:val="20"/>
           <w:szCs w:val="20"/>
         </w:rPr>
-        <w:t xml:space="preserve">Abraham, Chen, Chhun, and five co-authors (2026). AI incident monitoring through a public health lens. arXiv:2604.19914.</w:t>
+        <w:t xml:space="preserve">Abraham, Chen, Chhun, Jaramillo-Gutierrez, Mylius, Raaj, Slattery, and McGregor (2026). AI incident monitoring through a public health lens. arXiv:2604.19914.</w:t>
       </w:r>
     </w:p>
     <w:p>
@@ -22448,7 +22448,7 @@
           <w:sz w:val="20"/>
           <w:szCs w:val="20"/>
         </w:rPr>
-        <w:t xml:space="preserve">Allal and co-authors (2025). SmolLM2: When Smol goes big, data-centric training of a small language model. arXiv:2502.02737.</w:t>
+        <w:t xml:space="preserve">Allal, Lozhkov, Bakouch, Blázquez, Penedo, Tunstall, Marafioti, Kydlíček, Piqueres Lajarín, Srivastav, Lochner, Fahlgren, Nguyen, Fourrier, Burtenshaw, Larcher, Zhao, Zakka, Morlon, Raffel, von Werra, and Wolf (2025). SmolLM2: When Smol goes big, data-centric training of a small language model. arXiv:2502.02737.</w:t>
       </w:r>
     </w:p>
     <w:p>
@@ -22728,7 +22728,7 @@
           <w:sz w:val="20"/>
           <w:szCs w:val="20"/>
         </w:rPr>
-        <w:t xml:space="preserve">Ji and co-authors (2023). Survey of hallucination in natural language generation. ACM Computing Surveys, 55(12), Article 248.</w:t>
+        <w:t xml:space="preserve">Ji, Lee, Frieske, Yu, Su, Xu, Ishii, Bang, Chen, Dai, Chan, Madotto, and Fung (2023). Survey of hallucination in natural language generation. ACM Computing Surveys, 55(12), Article 248.</w:t>
       </w:r>
     </w:p>
     <w:p>
@@ -22882,7 +22882,7 @@
           <w:sz w:val="20"/>
           <w:szCs w:val="20"/>
         </w:rPr>
-        <w:t xml:space="preserve">Wang and co-authors (2025). BurstGPT: A real-world workload dataset to optimize LLM serving systems. Proceedings of KDD 2025 (arXiv:2401.17644).</w:t>
+        <w:t xml:space="preserve">Wang, Chen, Li, Kang, Fang, Zhou, Zheng, Tang, He, Guo, Wang, Wang, Zhou, and Chu (2025). BurstGPT: A real-world workload dataset to optimize LLM serving systems. Proceedings of KDD 2025 (arXiv:2401.17644).</w:t>
       </w:r>
     </w:p>
     <w:p>

</xml_diff>

<commit_message>
In-text citations back to 'et al.'; reference list keeps arXiv-verified full author lists
Co-Authored-By: Claude Sonnet 5.5 <noreply@anthropic.com>
Claude-Session: https://claude.ai/code/session_01FJoEQKBVMu4pDX4YuJC5vW
</commit_message>
<xml_diff>
--- a/hallucination_poisson/paper/LLM_Hallucination_Poisson_Framework_Revised.docx
+++ b/hallucination_poisson/paper/LLM_Hallucination_Poisson_Framework_Revised.docx
@@ -213,7 +213,7 @@
           <w:sz w:val="22"/>
           <w:szCs w:val="22"/>
         </w:rPr>
-        <w:t xml:space="preserve">, we restate the multiplicative guardrail formula as the independence special case of Fréchet-type bounds on an arrival-rate cascade (Proposition 4). Dependence between guardrail layers has been measured on real defence stacks (Alotaibi, Jabbar, Al-Azani, and Ahmed, 2026) and the independence product is known to over-credit redundancy (Bhardwaj, Singh, and Bhardwaj, 2026); we add a measurement on hallucination-grounding layers with uncertainty intervals and carry the correction through to the capacity decision. We also show that, once capacity is integer-valued, total cost is generally </w:t>
+        <w:t xml:space="preserve">, we restate the multiplicative guardrail formula as the independence special case of Fréchet-type bounds on an arrival-rate cascade (Proposition 4). Dependence between guardrail layers has been measured on real defence stacks (Alotaibi et al., 2026) and the independence product is known to over-credit redundancy (Bhardwaj et al., 2026); we add a measurement on hallucination-grounding layers with uncertainty intervals and carry the correction through to the capacity decision. We also show that, once capacity is integer-valued, total cost is generally </w:t>
       </w:r>
       <w:r>
         <w:rPr>
@@ -263,7 +263,7 @@
           <w:sz w:val="22"/>
           <w:szCs w:val="22"/>
         </w:rPr>
-        <w:t xml:space="preserve">The paper follows the design-science tradition in IS (Hevner, March, Park, and Ram, 2004; Gregor and Hevner, 2013): we propose an artifact (a capacity-planning and guardrail-sizing method), ground it in a formal model, and evaluate it on real system outputs. We are explicit about what the evaluation does and does not establish (Section 6).</w:t>
+        <w:t xml:space="preserve">The paper follows the design-science tradition in IS (Hevner et al., 2004; Gregor and Hevner, 2013): we propose an artifact (a capacity-planning and guardrail-sizing method), ground it in a formal model, and evaluate it on real system outputs. We are explicit about what the evaluation does and does not establish (Section 6).</w:t>
       </w:r>
     </w:p>
     <w:p>
@@ -303,7 +303,7 @@
           <w:sz w:val="22"/>
           <w:szCs w:val="22"/>
         </w:rPr>
-        <w:t xml:space="preserve"> Surveys document hallucination as a pervasive property of neural text generation (Ji, Lee, Frieske, Yu, Su, Xu, Ishii, Bang, Chen, Dai, Chan, Madotto, and Fung, 2023). Mitigation work includes retrieval grounding (Lewis, Perez, Piktus, Petroni, Karpukhin, Goyal, Küttler, Lewis, Yih, Rocktäschel, Riedel, and Kiela, 2020), sampling-based consistency checks (Manakul, Liusie, and Gales, 2023), safeguard classifiers (Inan, Upasani, Chi, Rungta, Iyer, Mao, Tontchev, Hu, Fuller, Testuggine, and Khabsa, 2023) and LLM-as-judge verification (Zheng, Chiang, Sheng, Zhuang, Wu, Zhuang, Lin, Li, Li, Xing, Zhang, Gonzalez, and Stoica, 2023). This literature evaluates </w:t>
+        <w:t xml:space="preserve"> Surveys document hallucination as a pervasive property of neural text generation (Ji et al., 2023). Mitigation work includes retrieval grounding (Lewis et al., 2020), sampling-based consistency checks (Manakul et al., 2023), safeguard classifiers (Inan et al., 2023) and LLM-as-judge verification (Zheng et al., 2023). This literature evaluates </w:t>
       </w:r>
       <w:r>
         <w:rPr>
@@ -345,7 +345,7 @@
           <w:sz w:val="22"/>
           <w:szCs w:val="22"/>
         </w:rPr>
-        <w:t xml:space="preserve"> The use of the Poisson quantile to size service capacity is classical in service operations (Whitt, 2007), and time-varying demand is handled by piecewise-stationary staffing (Green, Kolesar, and Whitt, 2007). Empirical studies of call centres report that arrivals are well described by a Poisson process only conditional on a random, day-specific rate, i.e. they are over-dispersed (Brown, Gans, Mandelbaum, Sakov, Shen, Zeltyn, and Zhao, 2005); count-data econometrics offers the negative-binomial remedy (Cameron and Trivedi, 1998). We import these tools to a new arrival stream and test whether the same caveats apply.</w:t>
+        <w:t xml:space="preserve"> The use of the Poisson quantile to size service capacity is classical in service operations (Whitt, 2007), and time-varying demand is handled by piecewise-stationary staffing (Green et al., 2007). Empirical studies of call centres report that arrivals are well described by a Poisson process only conditional on a random, day-specific rate, i.e. they are over-dispersed (Brown et al., 2005); count-data econometrics offers the negative-binomial remedy (Cameron and Trivedi, 1998). We import these tools to a new arrival stream and test whether the same caveats apply.</w:t>
       </w:r>
     </w:p>
     <w:p>
@@ -393,7 +393,7 @@
           <w:sz w:val="22"/>
           <w:szCs w:val="22"/>
         </w:rPr>
-        <w:t xml:space="preserve"> Public-health-style monitoring of AI incident counts has found strong over-dispersion relative to Poisson in incident-database counts of vehicle and deepfake incidents (Abraham, Chen, Chhun, Jaramillo-Gutierrez, Mylius, Raaj, Slattery, and McGregor, 2026), and Markov reliability models of LLM agents reduce to the Goel-Okumoto NHPP software-reliability model in the rare-failure regime (Tran-Truong and Le, 2026). Neither concerns hallucination or guardrail-bypass events, nor applies time-rescaling tests or capacity sizing.</w:t>
+        <w:t xml:space="preserve"> Public-health-style monitoring of AI incident counts has found strong over-dispersion relative to Poisson in incident-database counts of vehicle and deepfake incidents (Abraham et al., 2026), and Markov reliability models of LLM agents reduce to the Goel-Okumoto NHPP software-reliability model in the rare-failure regime (Tran-Truong and Le, 2026). Neither concerns hallucination or guardrail-bypass events, nor applies time-rescaling tests or capacity sizing.</w:t>
       </w:r>
     </w:p>
     <w:p>
@@ -417,7 +417,7 @@
           <w:sz w:val="22"/>
           <w:szCs w:val="22"/>
         </w:rPr>
-        <w:t xml:space="preserve"> The multiplicative formula for the residual rate of independent safeguards is standard in reliability engineering, and it over-credits redundancy when failures are positively associated (Esary, Proschan, and Walkup, 1967). For LLM defence stacks, Alotaibi, Jabbar, Al-Azani, and Ahmed (2026) measure positive failure correlation between seven defence layers (φ between 0.30 and 0.75 on JailbreakBench) and call the product a lower bound that no real stack attains; Bhardwaj, Singh, and Bhardwaj (2026) give a Fréchet-Hoeffding sandwich and measure high co-failure among same-model LLM components. Our dependence results should be read as additional evidence, in a different setting (hallucination-grounding layers), rather than as a first demonstration.</w:t>
+        <w:t xml:space="preserve"> The multiplicative formula for the residual rate of independent safeguards is standard in reliability engineering, and it over-credits redundancy when failures are positively associated (Esary et al., 1967). For LLM defence stacks, Alotaibi et al. (2026) measure positive failure correlation between seven defence layers (φ between 0.30 and 0.75 on JailbreakBench) and call the product a lower bound that no real stack attains; Bhardwaj et al. (2026) give a Fréchet-Hoeffding sandwich and measure high co-failure among same-model LLM components. Our dependence results should be read as additional evidence, in a different setting (hallucination-grounding layers), rather than as a first demonstration.</w:t>
       </w:r>
     </w:p>
     <w:p>
@@ -3076,7 +3076,7 @@
           <w:sz w:val="22"/>
           <w:szCs w:val="22"/>
         </w:rPr>
-        <w:t xml:space="preserve">For any joint behaviour of the layers, λ₀(1 - Σc_i)⁺ ≤ λ_N ≤ λ₀(1 - max_i c_i). If the layers' catch indicators, conditional on a hallucination, are positively associated (Esary, Proschan, and Walkup, 1967), then additionally λ_N ≥ λ₀Π(1 - c_i). Consequently the multiplicative formula under-states residual risk and, through Proposition 1(a), under-states required capacity.</w:t>
+        <w:t xml:space="preserve">For any joint behaviour of the layers, λ₀(1 - Σc_i)⁺ ≤ λ_N ≤ λ₀(1 - max_i c_i). If the layers' catch indicators, conditional on a hallucination, are positively associated (Esary et al., 1967), then additionally λ_N ≥ λ₀Π(1 - c_i). Consequently the multiplicative formula under-states residual risk and, through Proposition 1(a), under-states required capacity.</w:t>
       </w:r>
     </w:p>
     <w:p>
@@ -3100,7 +3100,7 @@
           <w:sz w:val="22"/>
           <w:szCs w:val="22"/>
         </w:rPr>
-        <w:t xml:space="preserve"> The bounds are the Fréchet-Bonferroni bounds for the event that no layer fires. For associated indicators, P(∩{I_i = 0}) ≥ ΠP(I_i = 0) (Esary, Proschan, and Walkup, 1967). ∎</w:t>
+        <w:t xml:space="preserve"> The bounds are the Fréchet-Bonferroni bounds for the event that no layer fires. For associated indicators, P(∩{I_i = 0}) ≥ ΠP(I_i = 0) (Esary et al., 1967). ∎</w:t>
       </w:r>
     </w:p>
     <w:p>
@@ -7545,7 +7545,7 @@
           <w:sz w:val="22"/>
           <w:szCs w:val="22"/>
         </w:rPr>
-        <w:t xml:space="preserve">We use the SQuAD 2.0 validation set (Rajpurkar, Jia, and Liang, 2018), which combines answerable questions with questions that the supplied passage cannot answer. One random sample of 300 questions (seed 0; 148 unanswerable) is drawn once and given to all three models, so the three runs are paired on the same questions and are not independent samples. Each model receives the passage and the question and must reply with a short answer or the token UNANSWERABLE. A response is labelled a </w:t>
+        <w:t xml:space="preserve">We use the SQuAD 2.0 validation set (Rajpurkar et al., 2018), which combines answerable questions with questions that the supplied passage cannot answer. One random sample of 300 questions (seed 0; 148 unanswerable) is drawn once and given to all three models, so the three runs are paired on the same questions and are not independent samples. Each model receives the passage and the question and must reply with a short answer or the token UNANSWERABLE. A response is labelled a </w:t>
       </w:r>
       <w:r>
         <w:rPr>
@@ -7563,7 +7563,7 @@
           <w:sz w:val="22"/>
           <w:szCs w:val="22"/>
         </w:rPr>
-        <w:t xml:space="preserve"> if it is not an abstention and either (i) the question is answerable and the answer matches no gold answer (normalised containment or token-F1 ≥ 0.6) or (ii) the question is unanswerable. Abstentions are never counted as hallucinations and bypass the guardrails. The generators are Qwen2.5-0.5B-Instruct, SmolLM2-360M-Instruct and Qwen2.5-1.5B-Instruct (Qwen Team, 2024; Allal, Lozhkov, Bakouch, Blázquez, Penedo, Tunstall, Marafioti, Kydlíček, Piqueres Lajarín, Srivastav, Lochner, Fahlgren, Nguyen, Fourrier, Burtenshaw, Larcher, Zhao, Zakka, Morlon, Raffel, von Werra, and Wolf, 2025), run greedily on CPU. We use small open models because they can be run end-to-end with full control and measured latency; their hallucination rate is higher than that of frontier models, so absolute rates should not be transferred (Section 6).</w:t>
+        <w:t xml:space="preserve"> if it is not an abstention and either (i) the question is answerable and the answer matches no gold answer (normalised containment or token-F1 ≥ 0.6) or (ii) the question is unanswerable. Abstentions are never counted as hallucinations and bypass the guardrails. The generators are Qwen2.5-0.5B-Instruct, SmolLM2-360M-Instruct and Qwen2.5-1.5B-Instruct (Qwen Team, 2024; Allal et al., 2025), run greedily on CPU. We use small open models because they can be run end-to-end with full control and measured latency; their hallucination rate is higher than that of frontier models, so absolute rates should not be transferred (Section 6).</w:t>
       </w:r>
     </w:p>
     <w:p>
@@ -7651,7 +7651,7 @@
           <w:sz w:val="22"/>
           <w:szCs w:val="22"/>
         </w:rPr>
-        <w:t xml:space="preserve"> A SQuAD 2.0-trained extractive-QA model (deepset/roberta-base-squad2) answers the question from the evidence passage; the score is the token-F1 between its span and the generator's answer (0 if it predicts "no answer"), and the output is blocked if the score is below 0.5 (a threshold we did not tune). The first implementation of L2 was an NLI cross-encoder (DeBERTa-v3-small; He, Gao, and Chen, 2021) scoring P(passage entails "the answer to Q is A"); it was uninformative and was replaced after we had seen the results (Section 5.1). Llama Guard-type classifiers target safety-policy violations rather than factual grounding and were therefore not used.</w:t>
+        <w:t xml:space="preserve"> A SQuAD 2.0-trained extractive-QA model (deepset/roberta-base-squad2) answers the question from the evidence passage; the score is the token-F1 between its span and the generator's answer (0 if it predicts "no answer"), and the output is blocked if the score is below 0.5 (a threshold we did not tune). The first implementation of L2 was an NLI cross-encoder (DeBERTa-v3-small; He et al., 2021) scoring P(passage entails "the answer to Q is A"); it was uninformative and was replaced after we had seen the results (Section 5.1). Llama Guard-type classifiers target safety-policy violations rather than factual grounding and were therefore not used.</w:t>
       </w:r>
     </w:p>
     <w:p>
@@ -7679,7 +7679,7 @@
           <w:sz w:val="22"/>
           <w:szCs w:val="22"/>
         </w:rPr>
-        <w:t xml:space="preserve"> An LLM judge (Qwen2.5-1.5B-Instruct in every run) given the passage, question and answer, replying SUPPORTED or UNSUPPORTED (Zheng, Chiang, Sheng, Zhuang, Wu, Zhuang, Lin, Li, Li, Xing, Zhang, Gonzalez, and Stoica, 2023). It is invoked only when routed: when L2 is present, only if the L2 score is below 0.9.</w:t>
+        <w:t xml:space="preserve"> An LLM judge (Qwen2.5-1.5B-Instruct in every run) given the passage, question and answer, replying SUPPORTED or UNSUPPORTED (Zheng et al., 2023). It is invoked only when routed: when L2 is present, only if the L2 score is below 0.9.</w:t>
       </w:r>
     </w:p>
     <w:p>
@@ -7947,7 +7947,7 @@
           <w:sz w:val="22"/>
           <w:szCs w:val="22"/>
         </w:rPr>
-        <w:t xml:space="preserve"> (Wang, Chen, Li, Kang, Fang, Zhou, Zheng, Tang, He, Guo, Wang, Wang, Zhou, and Chu, 2025; CC BY 4.0) contains 10.6 million request records of regional Azure OpenAI ChatGPT and GPT-4 services at one-second resolution over 231 days (two contiguous segments of 121 and 110 days separated by an unrecorded gap of 104 days; timestamps are seconds from an undisclosed day 0, so weekday labels are unknown); failed requests are the rows with zero response tokens. We estimate the hour-of-day profile, the day-to-day variability of request volume (robustly, because volume grows by two orders of magnitude and contains regime shifts), and the within-hour Fano factor of counts at 1 s, 10 s, 1 min and 10 min. </w:t>
+        <w:t xml:space="preserve"> (Wang et al., 2025; CC BY 4.0) contains 10.6 million request records of regional Azure OpenAI ChatGPT and GPT-4 services at one-second resolution over 231 days (two contiguous segments of 121 and 110 days separated by an unrecorded gap of 104 days; timestamps are seconds from an undisclosed day 0, so weekday labels are unknown); failed requests are the rows with zero response tokens. We estimate the hour-of-day profile, the day-to-day variability of request volume (robustly, because volume grows by two orders of magnitude and contains regime shifts), and the within-hour Fano factor of counts at 1 s, 10 s, 1 min and 10 min. </w:t>
       </w:r>
       <w:r>
         <w:rPr>
@@ -7965,7 +7965,7 @@
           <w:sz w:val="22"/>
           <w:szCs w:val="22"/>
         </w:rPr>
-        <w:t xml:space="preserve"> (Chu, Talluri, Lu, and Iosup, 2025; CC BY 4.0) contains provider-declared incidents scraped from the OpenAI, Anthropic and Character.AI status pages; we use the 457 incidents starting from March 2023, when all three pages are populated, and test Poisson counts per day and week (index of dispersion, also stratified by day of week), day-of-week and hour-of-day homogeneity, exponential inter-arrival times after time-rescaling with a fitted hour-of-week intensity, the distribution of incident durations as a proxy for human response time, and the number of concurrently open incidents against the M/G/∞ prediction. For </w:t>
+        <w:t xml:space="preserve"> (Chu et al., 2025; CC BY 4.0) contains provider-declared incidents scraped from the OpenAI, Anthropic and Character.AI status pages; we use the 457 incidents starting from March 2023, when all three pages are populated, and test Poisson counts per day and week (index of dispersion, also stratified by day of week), day-of-week and hour-of-day homogeneity, exponential inter-arrival times after time-rescaling with a fitted hour-of-week intensity, the distribution of incident durations as a proxy for human response time, and the number of concurrently open incidents against the M/G/∞ prediction. For </w:t>
       </w:r>
       <w:r>
         <w:rPr>
@@ -7983,7 +7983,7 @@
           <w:sz w:val="22"/>
           <w:szCs w:val="22"/>
         </w:rPr>
-        <w:t xml:space="preserve"> we use three public company ticket datasets: customer tickets of an international software company (Abdellatif, 2026; 22,016 customer tickets from 2017 to March 2023, with creation, resolution and in-progress times), the audit log of a ServiceNow instance of an IT company (Amaral, Fantinato, and Peres, 2018; 24,918 incidents in 2016-2017) and the help-desk log of an Italian software company (Verenich, 2016; 3,804 cases, 2010-2012). Filters: for the software company we keep tickets of type "Ticket", created in 2017 or later and resolved as "Done" (22,016 of 66,691 rows; 45,275 are of type Ticket, 23,871 of them created from 2017 on); the work week is detected from the data as the five busiest days of the week (Sunday-Thursday for this company, Monday-Friday for the others). The ServiceNow log has 98.9% of its incidents opened between 29 February and 1 June 2016, so its arrival analysis uses only the stationary middle weeks (7 March to 27 May 2016) and its concurrency is not analysed. For each stream we estimate weekday-stratified over-dispersion, the daily rate CV net of slow trends (Pearson dispersion of weekday counts against a leave-one-out local mean over about eight weeks, after removing the weekday effect), the exceedance rate of Poisson-sized capacity plans, the distribution of resolution and in-progress times (exponential, lognormal and Weibull fits compared by AIC), the daily workload safety factor (95th percentile over mean of handling hours versus arrivals), and the number of concurrently open tickets against the M/G/∞ Poisson prediction. For </w:t>
+        <w:t xml:space="preserve"> we use three public company ticket datasets: customer tickets of an international software company (Abdellatif, 2026; 22,016 customer tickets from 2017 to March 2023, with creation, resolution and in-progress times), the audit log of a ServiceNow instance of an IT company (Amaral et al., 2018; 24,918 incidents in 2016-2017) and the help-desk log of an Italian software company (Verenich, 2016; 3,804 cases, 2010-2012). Filters: for the software company we keep tickets of type "Ticket", created in 2017 or later and resolved as "Done" (22,016 of 66,691 rows; 45,275 are of type Ticket, 23,871 of them created from 2017 on); the work week is detected from the data as the five busiest days of the week (Sunday-Thursday for this company, Monday-Friday for the others). The ServiceNow log has 98.9% of its incidents opened between 29 February and 1 June 2016, so its arrival analysis uses only the stationary middle weeks (7 March to 27 May 2016) and its concurrency is not analysed. For each stream we estimate weekday-stratified over-dispersion, the daily rate CV net of slow trends (Pearson dispersion of weekday counts against a leave-one-out local mean over about eight weeks, after removing the weekday effect), the exceedance rate of Poisson-sized capacity plans, the distribution of resolution and in-progress times (exponential, lognormal and Weibull fits compared by AIC), the daily workload safety factor (95th percentile over mean of handling hours versus arrivals), and the number of concurrently open tickets against the M/G/∞ Poisson prediction. For </w:t>
       </w:r>
       <w:r>
         <w:rPr>

</xml_diff>

<commit_message>
Apply second-round review: fail-open timeout policy, work-week-aware workload, holiday/low-volume exclusions, level/volume-conditional fixes, CV definition, Fisher p-values, rewritten claims and abstract; rebuild paper (27 pp)
Co-Authored-By: Claude Sonnet 5.5 <noreply@anthropic.com>
Claude-Session: https://claude.ai/code/session_01FJoEQKBVMu4pDX4YuJC5vW
</commit_message>
<xml_diff>
--- a/hallucination_poisson/paper/LLM_Hallucination_Poisson_Framework_Revised.docx
+++ b/hallucination_poisson/paper/LLM_Hallucination_Poisson_Framework_Revised.docx
@@ -60,7 +60,7 @@
           <w:sz w:val="22"/>
           <w:szCs w:val="22"/>
         </w:rPr>
-        <w:t xml:space="preserve">Organisations that deploy large language models (LLMs) must decide how much human triage capacity to hold in reserve and how many automated guardrail layers to place in front of the model. Two simple heuristics, provisioning at the mean incident load and crediting each guardrail layer with its stand-alone effectiveness as if layers failed independently, are easy to apply but can be improved on. We describe the capacity requirement as a quantile of the daily count of human-handled incidents and replace a single Poisson description of all failures by typed classes: hallucinations as thinned, over-dispersed streams; provider incidents as seasonal, level-adjusted processes with at most weak self-excitation; serving failures as heavy-tailed episodes; and heavy-tailed human service. We show analytically that over-dispersion inflates required capacity, that positive association between layers makes the independence formula a lower bound on residual risk, and that, because capacity is integer-valued, cost is not unimodal in the number of layers. We evaluate the pipeline on the outputs of three small open LLMs that answered the same 300 SQuAD 2.0 questions (900 answers) through three executed guardrail layers with measured latency and failures; user arrivals are simulated and informed by public traces of an LLM service, of LLM providers' incidents and of company ticket systems, none of which is a hallucination log. A single task-specific verifier, adopted after an NLI classifier proved uninformative and evaluated on the same questions, reduced required capacity by 78-95% but blocked 15-71% of correct answers; a routed judge added a modest, model-dependent gain at about triple the latency. The share of hallucinations passing a two-layer cascade was 1.6-2.6 times the independence prediction without routing and 2.7-4.6 times with routing, with wide intervals. With mild burstiness (daily-rate CV 0.3-0.44) a Poisson-sized capacity plan was exceeded on 23-32% of days without guardrails and 7-16% with the best cascade, against a target of 5%; in public ticket streams the net-of-trend daily-rate CV was 0.25-0.41 and a causal Poisson plan was exceeded on about 10% of work days, whereas over-dispersion changed the 95% capacity by at most one or two units for low-rate streams (provider incidents, dated court cases). In an illustrative organisation, a typed superposition required 14-48% more daily capacity than a single Poisson on the total, with the gap driven by the assumed dispersion of the hallucination class and by how strongly over-dispersed the serving class is taken to be. Hallucination arrivals are simulated and, to our knowledge, no operator log of hallucinations is public; the models are small and the task is extractive question answering, so the numbers do not transfer to production, whereas the method and its diagnostics do.</w:t>
+        <w:t xml:space="preserve">Organisations that deploy large language models (LLMs) must decide how much human triage capacity to hold in reserve and how many automated guardrail layers to place in front of the model. Two simple heuristics, provisioning at the mean incident load and crediting each guardrail layer with its stand-alone effectiveness as if layers failed independently, are easy to apply but can be improved on. We describe the capacity requirement as a quantile of the daily count of human-handled incidents and replace a single Poisson description of all failures by typed classes: hallucinations as thinned, over-dispersed streams; provider incidents as seasonal, level-adjusted processes with at most weak self-excitation; serving failures as heavy-tailed episodes; and heavy-tailed human service. We show analytically that over-dispersion inflates required capacity, that positive association between layers makes the independence formula a lower bound on residual risk, and that, because capacity is integer-valued, cost is not unimodal in the number of layers. We evaluate the pipeline on the outputs of three small open LLMs that answered the same 300 SQuAD 2.0 questions (900 answers) through three executed guardrail layers with measured latency and failures; user arrivals are simulated and informed by public traces of an LLM service, of LLM providers' incidents and of company ticket systems, none of which is a hallucination log (one curated database of dated court cases, legal domain, is the only partial exception). A single task-specific verifier, adopted after an NLI classifier proved uninformative and evaluated on the same questions, reduced required capacity by 78-95% but blocked 15-71% of correct answers; a routed judge, under a 2 s fail-open timeout, did not demonstrably pay for itself (paired cost-saving intervals $429 [-$5, $931]; -$2 [-$5, $0]; $61 [-$9, $646] per day) and added about three times the latency. The share of hallucinations passing a two-layer cascade was 1.3-1.6 times the independence prediction without routing (intervals include 1 for two of three generators) and 1.9-2.3 times with routing. With mild burstiness (daily-rate CV 0.3-0.44) a Poisson-sized capacity plan was exceeded on 23-32% of days without guardrails and 7-16% with the best cascade, against a target of 5%; in public ticket streams the net-of-trend daily-rate CV was 0.10-0.38 after excluding holiday and low-volume days (0.25-0.41 with all days) and a causal Poisson plan was exceeded on 9% of work days for the two long streams, whereas over-dispersion changed the 95% capacity by at most one unit for low-rate streams (provider incidents, dated court cases). In an illustrative organisation, a typed superposition required 14-48% more daily capacity than a single Poisson on the total, with the gap driven by the assumed dispersion of the hallucination class and by how strongly over-dispersed the serving class is taken to be. Hallucination arrivals are simulated and, to our knowledge, no operator log of hallucinations is public; the models are small and the task is extractive question answering, so the numbers do not transfer to production, whereas the method and its diagnostics do.</w:t>
       </w:r>
     </w:p>
     <w:p>
@@ -177,7 +177,7 @@
           <w:sz w:val="22"/>
           <w:szCs w:val="22"/>
         </w:rPr>
-        <w:t xml:space="preserve">, we describe the capacity requirement for LLM incident handling as the quantile of the daily count of human-handled events (Section 3). The quantile rule and the over-dispersion correction are classical (Whitt, 2007; Cameron and Trivedi, 1998); our contribution is to apply them to this arrival stream, to derive how over-dispersion and thinning by guardrails enter the requirement (Propositions 2 and 3), and to check on public request, incident and ticket traces whether the counting-process assumptions hold on comparable real streams. None of these traces is a hallucination log, so hallucination arrivals themselves are assumed or simulated. </w:t>
+        <w:t xml:space="preserve">, we describe the capacity requirement for LLM incident handling as the quantile of the daily count of human-handled events (Section 3). The quantile rule and the over-dispersion correction are classical (Whitt, 2007; Cameron and Trivedi, 1998); our contribution is to apply them to this arrival stream, to derive how over-dispersion and thinning by guardrails enter the requirement (Propositions 2 and 3), and to check on public request, incident and ticket traces whether the counting-process assumptions hold on comparable real streams. Apart from one curated database of dated court cases (legal domain), none of these traces is a hallucination log, so hallucination arrivals themselves are assumed or simulated. </w:t>
       </w:r>
       <w:r>
         <w:rPr>
@@ -195,7 +195,7 @@
           <w:sz w:val="22"/>
           <w:szCs w:val="22"/>
         </w:rPr>
-        <w:t xml:space="preserve">, we replace the single-Poisson description of "all failures" by a typed model (Section 3.6): hallucinations as thinned, over-dispersed streams; provider incidents as a seasonal Hawkes process; serving failures as heavy-tailed episodes; human triage with heavy-tailed service; with superposition and clustering results (Proposition 6) and public-data fits (Section 5.8). </w:t>
+        <w:t xml:space="preserve">, we replace the single-Poisson description of "all failures" by a typed model (Section 3.6): hallucinations as thinned, over-dispersed streams; provider incidents as a seasonal, level-adjusted and at most weakly self-exciting process; serving failures as heavy-tailed episodes; human triage with heavy-tailed service; with superposition and clustering results (Proposition 6) and public-data fits (Section 5.8). </w:t>
       </w:r>
       <w:r>
         <w:rPr>
@@ -557,7 +557,7 @@
           <w:sz w:val="22"/>
           <w:szCs w:val="22"/>
         </w:rPr>
-        <w:t xml:space="preserve">Inter-arrival times are exponential only under a constant rate. Under the NHPP, the time-rescaled gaps Λ̂(t_i)-Λ̂(t_{i-1}) are i.i.d. Exp(1) (the time-rescaling theorem), which gives a goodness-of-fit test that we use in Section 5. The memoryless property therefore applies to rescaled time: elapsed time since the last event carries no information, but time-of-day does.</w:t>
+        <w:t xml:space="preserve">Inter-arrival times are exponential only under a constant rate. Under the NHPP, the time-rescaled gaps Λ̂(t_i)-Λ̂(t_{i-1}) are i.i.d. Exp(1) (the time-rescaling theorem; Daley and Vere-Jones, 2003; Ogata, 1988), which gives a goodness-of-fit test that we use in Section 5. The memoryless property therefore applies to rescaled time: elapsed time since the last event carries no information, but time-of-day does.</w:t>
       </w:r>
     </w:p>
     <w:p>
@@ -571,7 +571,7 @@
           <w:sz w:val="22"/>
           <w:szCs w:val="22"/>
         </w:rPr>
-        <w:t xml:space="preserve">If the daily rate is itself random, Λ_d = λM with E[M] = 1 and Var(M) = c², the daily count is a mixed Poisson variable with Var(X_d) = λ + λ²c² = λφ, where φ = 1 + λc² is the dispersion index. This is the Cox-process alternative to the pure Poisson null.</w:t>
+        <w:t xml:space="preserve">If the daily rate is itself random, Λ_d = λM with E[M] = 1 and Var(M) = c², the daily count is a mixed Poisson variable with Var(X_d) = λ + λ²c² = λφ, where φ = 1 + λc² is the dispersion index. This is the Cox-process (doubly stochastic) alternative to the pure Poisson null (Cox, 1955; Cox and Isham, 1980).</w:t>
       </w:r>
     </w:p>
     <w:p>
@@ -619,7 +619,7 @@
           <w:sz w:val="22"/>
           <w:szCs w:val="22"/>
         </w:rPr>
-        <w:t xml:space="preserve">k*(α, λ) = min { k ∈ ℕ₀ : P(X_d ≤ k) ≥ α }</w:t>
+        <w:t xml:space="preserve">k∗(α, λ) = min { k ∈ ℕ₀ : P(X_d ≤ k) ≥ α }</w:t>
       </w:r>
     </w:p>
     <w:p>
@@ -647,7 +647,7 @@
           <w:sz w:val="22"/>
           <w:szCs w:val="22"/>
         </w:rPr>
-        <w:t xml:space="preserve">Let X ~ Poisson(λ). (a) k∗(α, λ) is non-decreasing in λ. (b) k∗(α, λ) = 0 if and only if λ ≤ -ln α; for α = 0.95 this threshold is 0.0513 events/day. (c) Provisioning at the mean, k = ⌊λ⌋, leaves the system under-provisioned with probability P(X &gt; ⌊λ⌋), which is at least 0.26 for every λ ≥ 1, is about 0.35 at λ = 3 (not 0.42, which is P(X ≤ 2)) and tends to 0.5 as λ grows. (d) k∗ = λ + z_α√λ + O(1) as λ → ∞.</w:t>
+        <w:t xml:space="preserve">Let X ~ Poisson(λ). (a) k∗(α, λ) is non-decreasing in λ. (b) k∗(α, λ) = 0 if and only if λ ≤ -ln α; for α = 0.95 this threshold is 0.0513 events/day. (c) Provisioning at the mean, k = ⌊λ⌋, leaves the system under-provisioned with probability P(X &gt; ⌊λ⌋), which is at least 0.26 for every λ ≥ 1, is about 0.35 at λ = 3 and tends to 0.5 as λ grows. (d) k∗ = λ + z_α√λ + O(1) as λ → ∞.</w:t>
       </w:r>
     </w:p>
     <w:p>
@@ -699,7 +699,7 @@
           <w:sz w:val="22"/>
           <w:szCs w:val="22"/>
         </w:rPr>
-        <w:t xml:space="preserve">Let X_d | M ~ Poisson(λM) with E[M] = 1 and Var(M) = c² &gt; 0. Then (a) Var(X_d) = λφ with φ = 1 + λc²; (b) X_d dominates Poisson(λ) in the convex order, so E[(X_d - k)⁺] ≥ E[(Y - k)⁺] for every k, where Y ~ Poisson(λ); (c) If φ stays bounded as λ grows, k∗_mixed(α) = λ + z_α√(λφ) + O(1). If instead the multiplier has a fixed CV c, then φ = 1 + λc² grows with λ and k∗_mixed(α) = λ·F_M⁻¹(α) + O(√λ), where F_M is the distribution of M; in that regime λ + z_α√(λφ) understates the exact quantile by an amount that grows linearly in λ, and √φ is a lower guide for the inflation of the safety stock k∗ - λ, not an exact factor (e.g. for Gamma M at λ = 120.7 and c = 0.3 the exact ratio of the safety stock to its Poisson value is 3.8 against √φ = 3.4; at c = 0.44 it is 5.5 against 4.9). The exact negative-binomial quantile (Table 1) should be used for planning.</w:t>
+        <w:t xml:space="preserve">Let X_d | M ~ Poisson(λM) with E[M] = 1 and Var(M) = c² &gt; 0. Then (a) Var(X_d) = λφ with φ = 1 + λc²; (b) X_d dominates Poisson(λ) in the convex order, so E[(X_d - k)⁺] ≥ E[(Y - k)⁺] for every k, where Y ~ Poisson(λ); (c) If φ stays bounded as λ grows, k∗_mixed(α) = λ + z_α√(λφ) + O(1). If instead the multiplier has a fixed CV c, then φ = 1 + λc² grows with λ and k∗_mixed(α) = λ·F_M⁻¹(α) + O(√λ), where F_M is the distribution of M; in that regime λ + z_α√(λφ) understates the exact quantile by an amount that grows linearly in λ, and √φ is a lower guide for the inflation of the safety stock k∗ - λ, not an exact factor (e.g. for Gamma M at λ = 120.7 and c = 0.3 the exact ratio of the safety stock to its Poisson value is 3.7 against √φ = 3.4; at c = 0.44 it is 5.5 against 4.9). The exact negative-binomial quantile (Table 1) should be used for planning.</w:t>
       </w:r>
     </w:p>
     <w:p>
@@ -4363,7 +4363,7 @@
           <w:sz w:val="22"/>
           <w:szCs w:val="22"/>
         </w:rPr>
-        <w:t xml:space="preserve">f(N) = C_h · max{ k_min, k*(α, λ_N) } + Σ_{i ≤ N} g_i  (+ latency-feasibility: Σ L_i ≤ SLA).</w:t>
+        <w:t xml:space="preserve">f(N) = C_h · max{ k_min, k∗(α, λ_N) } + Σ_{i ≤ N} g_i  (+ latency-feasibility: Σ L_i ≤ SLA).</w:t>
       </w:r>
     </w:p>
     <w:p>
@@ -7473,7 +7473,7 @@
           <w:sz w:val="22"/>
           <w:szCs w:val="22"/>
         </w:rPr>
-        <w:t xml:space="preserve">(a) If the daily counts of independent failure classes j have means λ_j and dispersion indices φ_j = Var/mean, the total daily count has mean Σλ_j and Var = Σλ_jφ_j, so the 95% capacity is approximately Σλ_j + z·√(Σλ_jφ_j). A single Poisson on the total uses φ = 1 and under-states the safety stock by the factor √φ_eff with φ_eff = Σλ_jφ_j / Σλ_j. The superposition of independent classes is Poisson only if every class is Poisson. (b) For a stationary Hawkes process with branching ratio α &lt; 1 (the expected number of direct follow-up events per event), the cluster started by a background event has a Borel size distribution with mean 1/(1 - α), the long-window Fano factor of counts is 1/(1 - α)², and the count variance in a window of fixed length approaches this value as the window grows relative to the excitation time scale 1/β. (c) For a compound Poisson count N = Σ_{i ≤ M} X_i with M ~ Poisson(ν), the Fano factor is E[X²]/E[X], which is unbounded when the mark distribution has an infinite second moment (e.g. a Pareto tail index below 2): the variance of the daily count, and with it the Poisson capacity error, is dominated by the largest episodes.</w:t>
+        <w:t xml:space="preserve">(a) If the daily counts of independent failure classes j have means λ_j and dispersion indices φ_j = Var/mean, the total daily count has mean Σλ_j and Var = Σλ_jφ_j, so the 95% capacity is approximately Σλ_j + z·√(Σλ_jφ_j). A single Poisson on the total uses φ = 1 and under-states the safety stock by the factor √φ_eff with φ_eff = Σλ_jφ_j / Σλ_j. The superposition of independent classes is Poisson only if every class is Poisson. (b) For a stationary Hawkes process (Hawkes, 1971) with branching ratio α &lt; 1 (the expected number of direct follow-up events per event), the cluster started by a background event has a Borel size distribution with mean 1/(1 - α), the long-window Fano factor of counts is 1/(1 - α)², and the count variance in a window of fixed length approaches this value as the window grows relative to the excitation time scale 1/β. (c) For a compound Poisson count N = Σ_{i ≤ M} X_i with M ~ Poisson(ν), the Fano factor is E[X²]/E[X], which is unbounded when the mark distribution has an infinite second moment (e.g. a Pareto tail index below 2): the variance of the daily count, and with it the Poisson capacity error, is dominated by the largest episodes.</w:t>
       </w:r>
     </w:p>
     <w:p>
@@ -7497,7 +7497,7 @@
           <w:sz w:val="22"/>
           <w:szCs w:val="22"/>
         </w:rPr>
-        <w:t xml:space="preserve"> (a) Variances of independent counts add; the normal approximation of the quantile uses the total variance. (b) The Hawkes cluster is a Galton-Watson tree with Poisson(α) offspring; its total progeny is Borel(α) with mean 1/(1 - α) and second moment 1/(1 - α)³, hence E[X²]/E[X] = 1/(1 - α)², and the stationary count variance-to-mean ratio of a Hawkes process equals this value in the long-window limit. (c) is Wald's identity for the compound Poisson variance, Var(N) = νE[X²]. ∎ For provider incidents the fitted branching ratio is 0.11-0.22 with a constant level and 0.05-0.09 once a monthly level is allowed (Section 5.8), implying a long-window Fano factor of about 1.3-1.6 and 1.1-1.2 respectively, to be compared with stratified dispersion indices of 1.2-1.5 (Section 5.6); for serving-failure episodes α is 0.5-0.85 depending on the episode definition and the second-moment ratio E[X²]/E[X] of the episode sizes is in the thousands, so the Fano factor of failed-request counts is dominated by a few large episodes and a Poisson description of failed requests is inadequate by several orders of magnitude, also after conditioning on traffic volume.</w:t>
+        <w:t xml:space="preserve"> (a) Variances of independent counts add; the normal approximation of the quantile uses the total variance. (b) The Hawkes cluster is a Galton-Watson tree with Poisson(α) offspring; its total progeny is Borel(α) with mean 1/(1 - α) and second moment 1/(1 - α)³, hence E[X²]/E[X] = 1/(1 - α)², and the stationary count variance-to-mean ratio of a Hawkes process equals this value in the long-window limit. (c) is Wald's identity for the compound Poisson variance, Var(N) = νE[X²]. ∎ For provider incidents the fitted branching ratio is 0.11-0.21 with a constant level and 0.05-0.09 once a monthly level is allowed (Section 5.8), implying a long-window Fano factor of about 1.3-1.6 and 1.1-1.2 respectively, to be compared with stratified dispersion indices of 1.2-1.5 (Section 5.6); for serving-failure episodes α is 0.5-0.85 depending on the episode definition and the second-moment ratio E[X²]/E[X] of the episode sizes is in the thousands, so the Fano factor of failed-request counts is dominated by a few large episodes and a Poisson description of failed requests is inadequate by several orders of magnitude, also after conditioning on traffic volume.</w:t>
       </w:r>
     </w:p>
     <w:p>
@@ -7693,7 +7693,7 @@
           <w:sz w:val="22"/>
           <w:szCs w:val="22"/>
         </w:rPr>
-        <w:t xml:space="preserve">All layers use the same evidence passage as retrieval-grounded verification. Every layer is run on every example so that any subset or cascade can be evaluated offline from observed flags, without any independence assumption. We record flag, score, wall-clock latency and exceptions per call. Layers fail open; a call that errors or exceeds a 2 s timeout is counted as a system failure, from which we estimate λ_sys_fail rather than assuming it.</w:t>
+        <w:t xml:space="preserve">All layers use the same evidence passage as retrieval-grounded verification. Every layer is run on every example so that any subset or cascade can be evaluated offline from observed flags, without any independence assumption. We record flag, score, wall-clock latency and exceptions per call. Layers fail open: a call that raises an exception or takes longer than 2 s is counted as a system failure (from which we estimate λ_sys_fail rather than assuming it), its verdict is discarded so that the output passes that layer, and the added latency is capped at 2 s. No exception occurred in any run, so all system failures are judge calls slower than 2 s (25-30% of the judge calls on our CPU setup). Section 5.5 gives a sensitivity analysis in which slow verdicts are waited for and credited.</w:t>
       </w:r>
     </w:p>
     <w:p>
@@ -7761,7 +7761,7 @@
           <w:sz w:val="22"/>
           <w:szCs w:val="22"/>
         </w:rPr>
-        <w:t xml:space="preserve"> are measured. Queries arrive according to an NHPP with a 24-slot hour-of-day intensity and a mean of 200 queries/day for 90 days. The default profile is business-hours-shaped; a second profile is the hour-of-day profile measured in the BurstGPT production trace (Section 4.5). A Cox variant multiplies each day's intensity by a Gamma factor with mean 1 and coefficient of variation c to represent bursty demand; we use c = 0.3 and c = 0.44 as scenario values. They lie in or near the range of 0.25-0.41 estimated net of trend from public human-handled ticket streams (Section 5.7); 0.44 is also the smallest coefficient of variation of any 14-day window of BurstGPT (Section 5.6), whose variability over the whole trace is much larger, so it is a floor for that trace and not a net-of-trend estimate comparable to the ticket values. Each arriving query replays a uniformly drawn example from the measured pool; it becomes a critical event (a hallucination that survives the cascade and is detected, Section 3.1) if it is a hallucination that survives the cascade. For each resulting event stream we estimate λ̂ = events/days and test: (i) the index-of-dispersion test on daily counts; (ii) a chi-square test of constant hourly intensity; (iii) a Kolmogorov-Smirnov test of raw inter-arrival times against an exponential, and of time-rescaled gaps under the fitted hourly intensity (the Lilliefors-type p-value is optimistic); (iv) a negative-binomial fit of daily counts. Uncertainty from the finite evaluation pool is quantified by a 300-draw bootstrap over examples (95% percentile intervals).</w:t>
+        <w:t xml:space="preserve"> are measured. Queries arrive according to an NHPP with a 24-slot hour-of-day intensity and a mean of 200 queries/day for 90 days. The default profile is business-hours-shaped; a second profile is the hour-of-day profile measured in the BurstGPT production trace (Section 4.5). A Cox variant multiplies each day's intensity by a Gamma factor with mean 1 and coefficient of variation c to represent bursty demand; we use c = 0.3 and c = 0.44 as scenario values. Net of trend and after excluding holiday and low-volume days, public human-handled ticket streams give 0.10-0.38 (0.25-0.41 with all days; Section 5.7), so c = 0.3 lies within that range and c = 0.44 above it; 0.44 is the smallest coefficient of variation of any 14-day window of BurstGPT (Section 5.6), whose variability over the whole trace is much larger, so it is a floor for that trace and not a net-of-trend estimate comparable to the ticket values. Each arriving query replays a uniformly drawn example from the measured pool; it becomes a critical event (a hallucination that survives the cascade and is detected, Section 3.1) if it is a hallucination that survives the cascade. For each resulting event stream we estimate λ̂ = events/days and test: (i) the index-of-dispersion test on daily counts; (ii) a chi-square test of constant hourly intensity; (iii) a Kolmogorov-Smirnov test of raw inter-arrival times against an exponential, and of time-rescaled gaps under the fitted hourly intensity (the Lilliefors-type p-value is optimistic); (iv) a negative-binomial fit of daily counts. Uncertainty from the finite evaluation pool is quantified by a 300-draw bootstrap over examples (95% percentile intervals).</w:t>
       </w:r>
     </w:p>
     <w:p>
@@ -7929,7 +7929,7 @@
           <w:sz w:val="22"/>
           <w:szCs w:val="22"/>
         </w:rPr>
-        <w:t xml:space="preserve">Two public datasets test the counting-process assumptions on real systems; neither concerns hallucinations. </w:t>
+        <w:t xml:space="preserve">Public data from six sources test the counting-process assumptions on real systems: a request trace of an LLM service, the incident history of LLM providers, three company ticket logs, and a curated database of dated hallucination cases in court decisions. Only the last is a (legal-domain, curated) hallucination log; no operator log of hallucinations is public to our knowledge. </w:t>
       </w:r>
       <w:r>
         <w:rPr>
@@ -7983,7 +7983,7 @@
           <w:sz w:val="22"/>
           <w:szCs w:val="22"/>
         </w:rPr>
-        <w:t xml:space="preserve"> we use three public company ticket datasets: customer tickets of an international software company (Abdellatif, 2026; 22,016 customer tickets from 2017 to March 2023, with creation, resolution and in-progress times), the audit log of a ServiceNow instance of an IT company (Amaral et al., 2018; 24,918 incidents in 2016-2017) and the help-desk log of an Italian software company (Verenich, 2016; 3,804 cases, 2010-2012). Filters: for the software company we keep tickets of type "Ticket", created in 2017 or later and resolved as "Done" (22,016 of 66,691 rows; 45,275 are of type Ticket, 23,871 of them created from 2017 on); the work week is detected from the data as the five busiest days of the week (Sunday-Thursday for this company, Monday-Friday for the others). The ServiceNow log has 98.9% of its incidents opened between 29 February and 1 June 2016, so its arrival analysis uses only the stationary middle weeks (7 March to 27 May 2016) and its concurrency is not analysed. For each stream we estimate weekday-stratified over-dispersion, the daily rate CV net of slow trends (Pearson dispersion of weekday counts against a leave-one-out local mean over about eight weeks, after removing the weekday effect), the exceedance rate of Poisson-sized capacity plans, the distribution of resolution and in-progress times (exponential, lognormal and Weibull fits compared by AIC), the daily workload safety factor (95th percentile over mean of handling hours versus arrivals), and the number of concurrently open tickets against the M/G/∞ Poisson prediction. For </w:t>
+        <w:t xml:space="preserve"> we use three public company ticket datasets: customer tickets of an international software company (Abdellatif, 2026; 22,016 customer tickets from 2017 to March 2023, with creation, resolution and in-progress times), the audit log of a ServiceNow instance of an IT company (Amaral et al., 2018; 24,918 incidents in 2016-2017) and the help-desk log of an Italian software company (Verenich, 2016; 3,804 cases, 2010-2012). Filters: for the software company we keep tickets of type "Ticket", created in 2017 or later and resolved as "Done" (22,016 of 66,691 rows; 45,275 are of type Ticket, 23,871 of them created from 2017 on); the work week is detected from the data as the five busiest days of the week (Sunday-Thursday for this company, Monday-Friday for the others). The ServiceNow log has 98.9% of its incidents opened between 29 February and 1 June 2016, so its arrival analysis uses only the middle weeks (7 March to 27 May 2016) and its concurrency is not analysed. Holidays and bridge days produce isolated low-count days that a local mean cannot absorb, so each arrival analysis is reported twice: for all work days, and with such days excluded (software company and ServiceNow: work days with fewer than 35% of the centred 41-work-day rolling median, a rule that is reliable only for high-rate streams, 62 and 5 days; Italian help desk: Italian national holidays and Easter Monday, 26 days; court cases: US federal holidays, 10 days). For each stream we estimate weekday-stratified over-dispersion, the daily rate CV net of slow trends (Pearson dispersion of weekday counts against a leave-one-out local mean over about eight weeks, after removing the weekday effect), the exceedance rate of Poisson-sized capacity plans, the distribution of resolution and in-progress times (exponential, lognormal and Weibull fits compared by AIC), the daily workload safety factor (95th percentile over mean of handling hours versus arrivals), and the number of concurrently open tickets against the M/G/∞ Poisson prediction. For </w:t>
       </w:r>
       <w:r>
         <w:rPr>
@@ -8001,7 +8001,7 @@
           <w:sz w:val="22"/>
           <w:szCs w:val="22"/>
         </w:rPr>
-        <w:t xml:space="preserve"> we analyse the Charlotin database of court decisions with AI-fabricated content (Charlotin, 2026): the decision date at day resolution for October 2025 to August 2026, work-day counts with the same stratified and local-mean analysis as for tickets. The Poisson plan is evaluated twice: against a two-sided local mean (in-sample, not a feasible forecast) and causally, with the trailing 20-workday mean and a coefficient of variation estimated on earlier days only (rolling origin).</w:t>
+        <w:t xml:space="preserve"> we analyse the Charlotin database of court decisions with AI-fabricated content (Charlotin, 2026): the decision date at day resolution for October 2025 to August 2026, work-day counts with the same stratified and local-mean analysis as for tickets. The Poisson plan is evaluated twice: against a two-sided local mean over about 40 surrounding work days (in-sample, not a feasible forecast) and causally, with the trailing 20-work-day mean and a coefficient of variation estimated on earlier days only (rolling origin); the weekday effects and the work-week definition are estimated on the full sample, so only the level and the CV are strictly causal. Dated cases of the most recent months are excluded because of reporting lag (September 2026, 95 cases, and one case in October 2026).</w:t>
       </w:r>
     </w:p>
     <w:p>
@@ -8025,7 +8025,7 @@
           <w:sz w:val="22"/>
           <w:szCs w:val="22"/>
         </w:rPr>
-        <w:t xml:space="preserve"> For the provider incidents we fit, by maximum likelihood, a seasonal Hawkes process with an exponential kernel, λ(t) = μ₀ s(t) + Σ αβe^{-β(t - t_i)}, where s(t) is a weekday/weekend × hour-of-day profile estimated from the data and held fixed, and compare it with the seasonal NHPP (α = 0) by AIC, by a parametric-bootstrap likelihood-ratio test (200 simulations under the NHPP; the boundary α = 0 invalidates the usual χ² reference), and by the time-rescaling test using the fitted compensator. The estimator was checked by simulation (recovery of μ₀, α, β from synthetic seasonal Hawkes data, and no false excitation when α = 0). For BurstGPT failures we detect outage-like episodes (minutes with more than 20% failed requests and at least five failures, merged when at most ten minutes apart), characterise episode duration, size (lognormal fit, Hill tail index) and arrival process (daily dispersion, seasonal Hawkes fit), and test five alternative episode definitions. Finally, we combine class-specific negative-binomial daily counts (means and dispersion indices taken from the estimates above, classes independent; 400,000 simulated days, seed 0) by Monte Carlo to compare the 95% capacity of the typed superposition with a single Poisson on the total (Section 5.8); the hallucination class uses the measured rate of the L1+L2 cascade for Qwen2.5-0.5B and an assumed daily-rate CV in 0.3-0.45, the provider class the rate and stratified dispersion index of Section 5.6, and the serving class the episode rate over the 231 recorded days with the daily dispersion index under three treatments (two episode definitions and a volume-conditional value). All simulations and bootstrap draws are seeded and reproducible with the scripts of the repository.</w:t>
+        <w:t xml:space="preserve"> For the provider incidents we fit, by maximum likelihood, a seasonal Hawkes process with an exponential kernel, λ(t) = μ₀ s(t) + Σ αβe^{-β(t - t_i)}, where s(t) is a weekday/weekend × hour-of-day profile estimated from the data and held fixed, and compare it with the seasonal NHPP (α = 0) by AIC, by a parametric-bootstrap likelihood-ratio test (200 simulations under the NHPP; the boundary α = 0 invalidates the usual χ² reference), and by the time-rescaling test using the fitted compensator. The estimator was checked by simulation (recovery of μ₀, α, β from synthetic seasonal Hawkes data, and no false excitation when α = 0). For BurstGPT failures we detect outage-like episodes (minutes with more than 20% failed requests and at least five failures, merged when at most ten minutes apart), characterise episode duration, size (lognormal fit, Hill tail index) and arrival process (daily dispersion, seasonal Hawkes fit), and test four alternative episode definitions (five including the main one). Finally, we combine class-specific negative-binomial daily counts (means and dispersion indices taken from the estimates above, classes independent; 400,000 simulated days, seed 0) by Monte Carlo to compare the 95% capacity of the typed superposition with a single Poisson on the total (Section 5.8); the hallucination class uses the measured rate of the L1+L2 cascade for Qwen2.5-0.5B and an assumed daily-rate CV in 0.3-0.45, the provider class the rate and stratified dispersion index of Section 5.6, and the serving class the episode rate over the 231 recorded days with the daily dispersion index under three treatments (two episode definitions and a volume-conditional value). All simulations and bootstrap draws are seeded and reproducible with the scripts of the repository.</w:t>
       </w:r>
     </w:p>
     <w:p>
@@ -8091,7 +8091,7 @@
           <w:sz w:val="22"/>
           <w:szCs w:val="22"/>
         </w:rPr>
-        <w:t xml:space="preserve"> (rules) catches 0.7-5.1% of hallucinations: this task contains no PII or template leaks and few fabricated numbers, so the deterministic layer is nearly inert here, though free of latency and false blocks. </w:t>
+        <w:t xml:space="preserve"> (rules) catches 0.7-5.1% of hallucinations: this task contains no PII or template leaks and few fabricated numbers, so the deterministic layer is nearly inert here, and nearly free of latency and false blocks (one false block in 119 correct answers for Qwen2.5-0.5B, none for the others). </w:t>
       </w:r>
       <w:r>
         <w:rPr>
@@ -8109,7 +8109,7 @@
           <w:sz w:val="22"/>
           <w:szCs w:val="22"/>
         </w:rPr>
-        <w:t xml:space="preserve"> (the 1.5B judge) blocks 63-84% of hallucinations but also 25-39% of correct answers, and each call takes about 1.9 s on our CPU, with 25-30% of calls exceeding the 2 s timeout. The judge is Qwen2.5-1.5B-Instruct in every run, so the Qwen2.5-1.5B arm is judged by itself; we did not test for a self-judging effect.</w:t>
+        <w:t xml:space="preserve"> (the 1.5B judge) blocks 48-59% of hallucinations and 17-24% of correct answers, and each call takes about 1.8-1.9 s on our CPU. 25-30% of the judge calls exceed the 2 s timeout; under the fail-open policy of Section 4.2 their verdicts are discarded, which is why these clearances are lower than they would be if slow verdicts were credited (Section 5.5 gives that sensitivity). The judge is Qwen2.5-1.5B-Instruct in every run, so the Qwen2.5-1.5B arm is judged by itself; we did not test for a self-judging effect.</w:t>
       </w:r>
     </w:p>
     <w:p>
@@ -8490,7 +8490,7 @@
                 <w:sz w:val="18"/>
                 <w:szCs w:val="18"/>
               </w:rPr>
-              <w:t xml:space="preserve">L3 mean ms</w:t>
+              <w:t xml:space="preserve">L3 mean ms (capped at 2 s)</w:t>
             </w:r>
           </w:p>
         </w:tc>
@@ -8652,7 +8652,7 @@
                 <w:sz w:val="18"/>
                 <w:szCs w:val="18"/>
               </w:rPr>
-              <w:t xml:space="preserve">84.0%</w:t>
+              <w:t xml:space="preserve">58.0%</w:t>
             </w:r>
           </w:p>
         </w:tc>
@@ -8716,7 +8716,7 @@
                 <w:sz w:val="18"/>
                 <w:szCs w:val="18"/>
               </w:rPr>
-              <w:t xml:space="preserve">39.5%</w:t>
+              <w:t xml:space="preserve">24.4%</w:t>
             </w:r>
           </w:p>
         </w:tc>
@@ -8780,7 +8780,7 @@
                 <w:sz w:val="18"/>
                 <w:szCs w:val="18"/>
               </w:rPr>
-              <w:t xml:space="preserve">1941</w:t>
+              <w:t xml:space="preserve">1759</w:t>
             </w:r>
           </w:p>
         </w:tc>
@@ -8942,7 +8942,7 @@
                 <w:sz w:val="18"/>
                 <w:szCs w:val="18"/>
               </w:rPr>
-              <w:t xml:space="preserve">63.1%</w:t>
+              <w:t xml:space="preserve">48.2%</w:t>
             </w:r>
           </w:p>
         </w:tc>
@@ -9006,7 +9006,7 @@
                 <w:sz w:val="18"/>
                 <w:szCs w:val="18"/>
               </w:rPr>
-              <w:t xml:space="preserve">25.2%</w:t>
+              <w:t xml:space="preserve">16.5%</w:t>
             </w:r>
           </w:p>
         </w:tc>
@@ -9070,7 +9070,7 @@
                 <w:sz w:val="18"/>
                 <w:szCs w:val="18"/>
               </w:rPr>
-              <w:t xml:space="preserve">1946</w:t>
+              <w:t xml:space="preserve">1792</w:t>
             </w:r>
           </w:p>
         </w:tc>
@@ -9232,7 +9232,7 @@
                 <w:sz w:val="18"/>
                 <w:szCs w:val="18"/>
               </w:rPr>
-              <w:t xml:space="preserve">78.7%</w:t>
+              <w:t xml:space="preserve">58.9%</w:t>
             </w:r>
           </w:p>
         </w:tc>
@@ -9296,7 +9296,7 @@
                 <w:sz w:val="18"/>
                 <w:szCs w:val="18"/>
               </w:rPr>
-              <w:t xml:space="preserve">39.0%</w:t>
+              <w:t xml:space="preserve">22.8%</w:t>
             </w:r>
           </w:p>
         </w:tc>
@@ -9360,7 +9360,7 @@
                 <w:sz w:val="18"/>
                 <w:szCs w:val="18"/>
               </w:rPr>
-              <w:t xml:space="preserve">1898</w:t>
+              <w:t xml:space="preserve">1728</w:t>
             </w:r>
           </w:p>
         </w:tc>
@@ -9396,7 +9396,7 @@
           <w:sz w:val="23"/>
           <w:szCs w:val="23"/>
         </w:rPr>
-        <w:t xml:space="preserve">5.2 Dependence between layers: the independence formula under-states residual risk</w:t>
+        <w:t xml:space="preserve">5.2 Dependence between layers and the cost of routing</w:t>
       </w:r>
     </w:p>
     <w:p>
@@ -9410,7 +9410,7 @@
           <w:sz w:val="22"/>
           <w:szCs w:val="22"/>
         </w:rPr>
-        <w:t xml:space="preserve">Among hallucinated answers the catch decisions of L2 and L3 are positively associated (φ = 0.24, 0.17, 0.15 for the three generators; 95% bootstrap intervals [0.05, 0.43], [0.03, 0.28], [-0.03, 0.34]; chi-square p = 0.001, 0.017, 0.066), in the direction of Proposition 4; the interval of the Qwen2.5-1.5B arm includes zero, and since the three runs use the same questions they are not independent replications. L1 catches only 1-10 hallucinations per generator, so the L1 pairs (φ ≤ 0.09) are uninformative. The consequence for the residual rate is sizeable (Figure 1, left). For the L2+L3 cascade, the share of hallucinations that pass all layers is 1.1-3.9% under the independence formula (computed from the same sample's marginals), but 2.6-6.4% when both layers are run on every answer, i.e. 2.6, 2.3, 1.6 times higher (8, 5, 9 hallucinations pass; 95% pool-bootstrap intervals [1.3, 4.1], [1.3, 3.2], [0.9, 2.5]; for Qwen2.5-1.5B the excess is not distinguishable from 1). With dynamic routing of only low-agreement answers to the judge the ratios are 4.6, 2.7, 4.0 ([3.2, 7.0], [2.3, 3.4], [2.9, 5.9]), a consistently large excess. The absolute numbers of passing answers are small (8, 5, 9 without and 14, 6, 22 with routing), so the point estimates are imprecise and the independence-based ranking should not be taken as exact. Routing therefore has a first-order cost that independence-based sizing hides: it reduces judge calls by about 89%, but the judge no longer sees answers that the verifier considers consistent, and those contain a substantial share of the hallucinations.</w:t>
+        <w:t xml:space="preserve">Among hallucinated answers the catch decisions of L2 and L3 are weakly positively associated (φ = 0.15, 0.11, 0.12 for the three generators; 95% bootstrap intervals [0.00, 0.29], [-0.02, 0.21], [-0.06, 0.28]; Fisher exact p = 0.054, 0.213, 0.186), in the direction of Proposition 4. The intervals include zero for two of the three generators and the three runs use the same questions, so they are not independent replications; the evidence is suggestive, not conclusive. L1 catches only 1-10 hallucinations per generator, so the L1 pairs (φ ≤ 0.09) are uninformative. Consequently, the excess of the residual share over the independence formula is modest (Figure 1, left). For the L2+L3 cascade, the share of hallucinations that pass all layers is 1.6-7.6% under the independence formula (computed from the same sample's marginals) and 2.6-9.9% when both layers are run on every answer, i.e. 1.5, 1.6, 1.3 times higher (12, 5, 14 hallucinations pass; 95% pool-bootstrap intervals [1.0, 2.0], [0.9, 2.1], [0.8, 1.7]); the interval includes 1 for 2 of the three generators. The cost of dynamic routing, in which only low-agreement answers are sent to the judge, is clearer: the ratios are 2.1, 1.9, 2.3 ([1.7, 2.6], [1.7, 2.2], [1.9, 3.0]) and the number of passing answers rises to 17, 6, 25. Routing reduces judge calls by 89-92%, but the judge no longer sees the answers that the verifier considers consistent, and those contain a substantial share of the hallucinations that the judge would catch. The absolute numbers of passing answers are small, so all these estimates are imprecise.</w:t>
       </w:r>
     </w:p>
     <w:p>
@@ -9539,7 +9539,7 @@
           <w:sz w:val="23"/>
           <w:szCs w:val="23"/>
         </w:rPr>
-        <w:t xml:space="preserve">5.4 Burstiness: Poisson capacity plans fail</w:t>
+        <w:t xml:space="preserve">5.4 Burstiness: Poisson-sized plans are exceeded under Cox traffic</w:t>
       </w:r>
     </w:p>
     <w:p>
@@ -9553,7 +9553,7 @@
           <w:sz w:val="22"/>
           <w:szCs w:val="22"/>
         </w:rPr>
-        <w:t xml:space="preserve">When the daily intensity is multiplied by a Gamma factor with a coefficient of variation of only 0.3, the daily-count dispersion test rejects overwhelmingly (p &lt; 10⁻⁹⁰ for the unprotected stream) and the negative-binomial fit gives r between 12.7 and 13.4. The Poisson capacity k∗ = 136, 146, 108 (for the three generators, no guardrails) is then exceeded on 23-28% of days instead of the targeted 5%; the correct negative-binomial requirement is 178, 194, 141, i.e. 31-33% more (Figure 2; Proposition 2). Under the best cascade by the objective of Section 4.4 (L1+L2, λ ≈ 4-17/day) the effect is smaller in absolute capacity but the observed exceedance of the Poisson plan is still 10-11% (Table 6). The value c = 0.3 is a scenario, not an estimate: the point is that a mild day-to-day variation in demand, which any real service has, is enough to invalidate the Poisson plan, so the dispersion must be estimated from production incident logs before capacity is fixed.</w:t>
+        <w:t xml:space="preserve">When the daily intensity is multiplied by a Gamma factor with a coefficient of variation of only 0.3, the daily-count dispersion test rejects overwhelmingly (p &lt; 10⁻⁹⁰ for the unprotected stream) and the negative-binomial fit gives r between 12.7 and 13.4. The Poisson capacity k∗ = 136, 146, 108 (for the three generators, no guardrails) is then exceeded on 23-28% of days instead of the targeted 5%; the correct negative-binomial requirement is 178, 194, 141, i.e. 31-33% more (Figure 2; Proposition 2). Under the best cascade by the objective of Section 4.4 (L1+L2, λ ≈ 4-17/day) the effect is smaller in absolute capacity but the observed exceedance of the Poisson plan is still 10-11% (Table 6). This replay follows from the injected Gamma multiplier and so confirms Proposition 2 and Table 1 on measured outcomes rather than providing an independent empirical finding; the value c = 0.3 is a scenario, not an estimate. Provisioning at the mean (k = round of the replay's λ̂) is exceeded on 28-49% of days across all configurations and replays of Sections 5.3-5.4, against the 5% target of the quantile plan. The replay k∗ values use each run's own estimated λ̂ (about 117-121 events/day without guardrails), whereas Table 7 uses the pool rate (120.7), so the same cascade can show k∗ values that differ by a few units between tables and Figure 2.</w:t>
       </w:r>
     </w:p>
     <w:p>
@@ -9638,7 +9638,7 @@
           <w:sz w:val="22"/>
           <w:szCs w:val="22"/>
         </w:rPr>
-        <w:t xml:space="preserve"> The smallest coefficient of variation of any 14-day window of the BurstGPT trace is c = 0.44 (a floor for that trace, whose median window CV is 0.91; Section 5.6), and the daily-rate CV net of trend in public human-handled ticket streams is 0.25-0.41 (Section 5.7); c = 0.3 and c = 0.44 are scenario values in or near this range. Replaying our measured outcomes with c = 0.44 and the BurstGPT hour-of-day profile gives the exceedance rates in Table 6.</w:t>
+        <w:t xml:space="preserve"> The smallest coefficient of variation of any 14-day window of the BurstGPT trace is c = 0.44 (a floor for that trace, whose median window CV is 0.91; Section 5.6), while the daily-rate CV net of trend in public human-handled ticket streams is 0.10-0.38 (Section 5.7; 0.25-0.41 before holiday and low-volume days are excluded). The scenario value c = 0.3 lies within the range of the ticket streams and c = 0.44 above it, at the BurstGPT floor. Replaying our measured outcomes with c = 0.44 and the BurstGPT hour-of-day profile gives the exceedance rates in Table 6.</w:t>
       </w:r>
     </w:p>
     <w:p>
@@ -9654,7 +9654,7 @@
           <w:sz w:val="20"/>
           <w:szCs w:val="20"/>
         </w:rPr>
-        <w:t xml:space="preserve">Table 6. Share of days on which the Poisson-sized capacity k* is exceeded (target 5%; 90 simulated days)</w:t>
+        <w:t xml:space="preserve">Table 6. Share of days on which the Poisson-sized capacity k∗ is exceeded (target 5%; 90 simulated days)</w:t>
       </w:r>
     </w:p>
     <w:tbl>
@@ -11071,7 +11071,7 @@
           <w:sz w:val="22"/>
           <w:szCs w:val="22"/>
         </w:rPr>
-        <w:t xml:space="preserve">The gap shrinks with guardrails but does not vanish: for the best cascade, the Poisson plan is exceeded on 7-16% of days at c = 0.44, against 30-32% without guardrails. This follows Proposition 2 (for given c, φ = 1 + λc² is smaller when the event rate λ is smaller, and the Fano factor of the request stream is diluted by thinning, Proposition 3): over-dispersion inflates the safety stock less in absolute terms (about 5, 1, 8 extra units) although the exceedance probability stays two to three times the target.</w:t>
+        <w:t xml:space="preserve">The gap shrinks with guardrails but does not vanish: for the best cascade, the Poisson plan is exceeded on 7-16% of days at c = 0.44, against 30-32% without guardrails. This follows Proposition 2 (for given c, φ = 1 + λc² is smaller when the event rate λ is smaller, and the Fano factor of the request stream is diluted by thinning, Proposition 3): over-dispersion inflates the safety stock less in absolute terms (about 5, 1, 8 extra units) although the exceedance probability stays between 1.3 and 3 times the target.</w:t>
       </w:r>
     </w:p>
     <w:p>
@@ -11666,7 +11666,7 @@
                 <w:sz w:val="18"/>
                 <w:szCs w:val="18"/>
               </w:rPr>
-              <w:t xml:space="preserve">L2</w:t>
+              <w:t xml:space="preserve">L1+L2</w:t>
             </w:r>
           </w:p>
         </w:tc>
@@ -11762,7 +11762,7 @@
                 <w:sz w:val="18"/>
                 <w:szCs w:val="18"/>
               </w:rPr>
-              <w:t xml:space="preserve">98</w:t>
+              <w:t xml:space="preserve">97</w:t>
             </w:r>
           </w:p>
         </w:tc>
@@ -11794,7 +11794,7 @@
                 <w:sz w:val="18"/>
                 <w:szCs w:val="18"/>
               </w:rPr>
-              <w:t xml:space="preserve">12.0</w:t>
+              <w:t xml:space="preserve">12.7</w:t>
             </w:r>
           </w:p>
         </w:tc>
@@ -11892,7 +11892,7 @@
                 <w:sz w:val="18"/>
                 <w:szCs w:val="18"/>
               </w:rPr>
-              <w:t xml:space="preserve">L3</w:t>
+              <w:t xml:space="preserve">L2</w:t>
             </w:r>
           </w:p>
         </w:tc>
@@ -11924,7 +11924,7 @@
                 <w:sz w:val="18"/>
                 <w:szCs w:val="18"/>
               </w:rPr>
-              <w:t xml:space="preserve">19.3 [12, 25]</w:t>
+              <w:t xml:space="preserve">12.7 [7, 18]</w:t>
             </w:r>
           </w:p>
         </w:tc>
@@ -11956,7 +11956,7 @@
                 <w:sz w:val="18"/>
                 <w:szCs w:val="18"/>
               </w:rPr>
-              <w:t xml:space="preserve">27 [18, 34]</w:t>
+              <w:t xml:space="preserve">19 [12, 25]</w:t>
             </w:r>
           </w:p>
         </w:tc>
@@ -11988,7 +11988,7 @@
                 <w:sz w:val="18"/>
                 <w:szCs w:val="18"/>
               </w:rPr>
-              <w:t xml:space="preserve">1941 ✗</w:t>
+              <w:t xml:space="preserve">98</w:t>
             </w:r>
           </w:p>
         </w:tc>
@@ -12020,7 +12020,7 @@
                 <w:sz w:val="18"/>
                 <w:szCs w:val="18"/>
               </w:rPr>
-              <w:t xml:space="preserve">31.3</w:t>
+              <w:t xml:space="preserve">12.0</w:t>
             </w:r>
           </w:p>
         </w:tc>
@@ -12052,7 +12052,7 @@
                 <w:sz w:val="18"/>
                 <w:szCs w:val="18"/>
               </w:rPr>
-              <w:t xml:space="preserve">60.0</w:t>
+              <w:t xml:space="preserve">0.0</w:t>
             </w:r>
           </w:p>
         </w:tc>
@@ -12118,7 +12118,7 @@
                 <w:sz w:val="18"/>
                 <w:szCs w:val="18"/>
               </w:rPr>
-              <w:t xml:space="preserve">L2+L3</w:t>
+              <w:t xml:space="preserve">L3</w:t>
             </w:r>
           </w:p>
         </w:tc>
@@ -12150,7 +12150,7 @@
                 <w:sz w:val="18"/>
                 <w:szCs w:val="18"/>
               </w:rPr>
-              <w:t xml:space="preserve">9.3 [5, 14]</w:t>
+              <w:t xml:space="preserve">50.7 [39, 60]</w:t>
             </w:r>
           </w:p>
         </w:tc>
@@ -12182,7 +12182,7 @@
                 <w:sz w:val="18"/>
                 <w:szCs w:val="18"/>
               </w:rPr>
-              <w:t xml:space="preserve">15 [9, 21]</w:t>
+              <w:t xml:space="preserve">63 [49, 73]</w:t>
             </w:r>
           </w:p>
         </w:tc>
@@ -12214,7 +12214,7 @@
                 <w:sz w:val="18"/>
                 <w:szCs w:val="18"/>
               </w:rPr>
-              <w:t xml:space="preserve">311</w:t>
+              <w:t xml:space="preserve">1759 ✗</w:t>
             </w:r>
           </w:p>
         </w:tc>
@@ -12246,7 +12246,7 @@
                 <w:sz w:val="18"/>
                 <w:szCs w:val="18"/>
               </w:rPr>
-              <w:t xml:space="preserve">17.3</w:t>
+              <w:t xml:space="preserve">19.3</w:t>
             </w:r>
           </w:p>
         </w:tc>
@@ -12278,7 +12278,7 @@
                 <w:sz w:val="18"/>
                 <w:szCs w:val="18"/>
               </w:rPr>
-              <w:t xml:space="preserve">6.0</w:t>
+              <w:t xml:space="preserve">60.0</w:t>
             </w:r>
           </w:p>
         </w:tc>
@@ -12312,7 +12312,7 @@
                 <w:sz w:val="18"/>
                 <w:szCs w:val="18"/>
               </w:rPr>
-              <w:t xml:space="preserve">SmolLM2-360M</w:t>
+              <w:t xml:space="preserve">Qwen2.5-0.5B</w:t>
             </w:r>
           </w:p>
         </w:tc>
@@ -12344,7 +12344,7 @@
                 <w:sz w:val="18"/>
                 <w:szCs w:val="18"/>
               </w:rPr>
-              <w:t xml:space="preserve">none</w:t>
+              <w:t xml:space="preserve">L2+L3</w:t>
             </w:r>
           </w:p>
         </w:tc>
@@ -12376,7 +12376,7 @@
                 <w:sz w:val="18"/>
                 <w:szCs w:val="18"/>
               </w:rPr>
-              <w:t xml:space="preserve">130.0 [120, 142]</w:t>
+              <w:t xml:space="preserve">11.3 [7, 17]</w:t>
             </w:r>
           </w:p>
         </w:tc>
@@ -12408,7 +12408,7 @@
                 <w:sz w:val="18"/>
                 <w:szCs w:val="18"/>
               </w:rPr>
-              <w:t xml:space="preserve">149 [138, 162]</w:t>
+              <w:t xml:space="preserve">17 [11, 24]</w:t>
             </w:r>
           </w:p>
         </w:tc>
@@ -12440,7 +12440,7 @@
                 <w:sz w:val="18"/>
                 <w:szCs w:val="18"/>
               </w:rPr>
-              <w:t xml:space="preserve">0</w:t>
+              <w:t xml:space="preserve">287</w:t>
             </w:r>
           </w:p>
         </w:tc>
@@ -12472,7 +12472,7 @@
                 <w:sz w:val="18"/>
                 <w:szCs w:val="18"/>
               </w:rPr>
-              <w:t xml:space="preserve">0.0</w:t>
+              <w:t xml:space="preserve">16.7</w:t>
             </w:r>
           </w:p>
         </w:tc>
@@ -12504,7 +12504,7 @@
                 <w:sz w:val="18"/>
                 <w:szCs w:val="18"/>
               </w:rPr>
-              <w:t xml:space="preserve">0.0</w:t>
+              <w:t xml:space="preserve">6.0</w:t>
             </w:r>
           </w:p>
         </w:tc>
@@ -12570,7 +12570,7 @@
                 <w:sz w:val="18"/>
                 <w:szCs w:val="18"/>
               </w:rPr>
-              <w:t xml:space="preserve">L2</w:t>
+              <w:t xml:space="preserve">none</w:t>
             </w:r>
           </w:p>
         </w:tc>
@@ -12602,7 +12602,7 @@
                 <w:sz w:val="18"/>
                 <w:szCs w:val="18"/>
               </w:rPr>
-              <w:t xml:space="preserve">4.0 [1, 7]</w:t>
+              <w:t xml:space="preserve">130.0 [120, 142]</w:t>
             </w:r>
           </w:p>
         </w:tc>
@@ -12634,7 +12634,7 @@
                 <w:sz w:val="18"/>
                 <w:szCs w:val="18"/>
               </w:rPr>
-              <w:t xml:space="preserve">8 [3, 12]</w:t>
+              <w:t xml:space="preserve">149 [138, 162]</w:t>
             </w:r>
           </w:p>
         </w:tc>
@@ -12666,7 +12666,7 @@
                 <w:sz w:val="18"/>
                 <w:szCs w:val="18"/>
               </w:rPr>
-              <w:t xml:space="preserve">97</w:t>
+              <w:t xml:space="preserve">0</w:t>
             </w:r>
           </w:p>
         </w:tc>
@@ -12698,7 +12698,7 @@
                 <w:sz w:val="18"/>
                 <w:szCs w:val="18"/>
               </w:rPr>
-              <w:t xml:space="preserve">48.7</w:t>
+              <w:t xml:space="preserve">0.0</w:t>
             </w:r>
           </w:p>
         </w:tc>
@@ -12796,7 +12796,7 @@
                 <w:sz w:val="18"/>
                 <w:szCs w:val="18"/>
               </w:rPr>
-              <w:t xml:space="preserve">L3</w:t>
+              <w:t xml:space="preserve">L1+L2</w:t>
             </w:r>
           </w:p>
         </w:tc>
@@ -12828,7 +12828,7 @@
                 <w:sz w:val="18"/>
                 <w:szCs w:val="18"/>
               </w:rPr>
-              <w:t xml:space="preserve">48.0 [38, 57]</w:t>
+              <w:t xml:space="preserve">4.0 [1, 7]</w:t>
             </w:r>
           </w:p>
         </w:tc>
@@ -12860,7 +12860,7 @@
                 <w:sz w:val="18"/>
                 <w:szCs w:val="18"/>
               </w:rPr>
-              <w:t xml:space="preserve">60 [48, 70]</w:t>
+              <w:t xml:space="preserve">8 [3, 12]</w:t>
             </w:r>
           </w:p>
         </w:tc>
@@ -12892,7 +12892,7 @@
                 <w:sz w:val="18"/>
                 <w:szCs w:val="18"/>
               </w:rPr>
-              <w:t xml:space="preserve">1933 ✗</w:t>
+              <w:t xml:space="preserve">93</w:t>
             </w:r>
           </w:p>
         </w:tc>
@@ -12924,7 +12924,7 @@
                 <w:sz w:val="18"/>
                 <w:szCs w:val="18"/>
               </w:rPr>
-              <w:t xml:space="preserve">17.3</w:t>
+              <w:t xml:space="preserve">48.7</w:t>
             </w:r>
           </w:p>
         </w:tc>
@@ -12956,7 +12956,7 @@
                 <w:sz w:val="18"/>
                 <w:szCs w:val="18"/>
               </w:rPr>
-              <w:t xml:space="preserve">50.0</w:t>
+              <w:t xml:space="preserve">0.0</w:t>
             </w:r>
           </w:p>
         </w:tc>
@@ -13022,7 +13022,7 @@
                 <w:sz w:val="18"/>
                 <w:szCs w:val="18"/>
               </w:rPr>
-              <w:t xml:space="preserve">L2+L3</w:t>
+              <w:t xml:space="preserve">L2</w:t>
             </w:r>
           </w:p>
         </w:tc>
@@ -13118,7 +13118,7 @@
                 <w:sz w:val="18"/>
                 <w:szCs w:val="18"/>
               </w:rPr>
-              <w:t xml:space="preserve">271</w:t>
+              <w:t xml:space="preserve">97</w:t>
             </w:r>
           </w:p>
         </w:tc>
@@ -13150,7 +13150,7 @@
                 <w:sz w:val="18"/>
                 <w:szCs w:val="18"/>
               </w:rPr>
-              <w:t xml:space="preserve">50.7</w:t>
+              <w:t xml:space="preserve">48.7</w:t>
             </w:r>
           </w:p>
         </w:tc>
@@ -13182,7 +13182,7 @@
                 <w:sz w:val="18"/>
                 <w:szCs w:val="18"/>
               </w:rPr>
-              <w:t xml:space="preserve">6.7</w:t>
+              <w:t xml:space="preserve">0.0</w:t>
             </w:r>
           </w:p>
         </w:tc>
@@ -13216,7 +13216,7 @@
                 <w:sz w:val="18"/>
                 <w:szCs w:val="18"/>
               </w:rPr>
-              <w:t xml:space="preserve">Qwen2.5-1.5B</w:t>
+              <w:t xml:space="preserve">SmolLM2-360M</w:t>
             </w:r>
           </w:p>
         </w:tc>
@@ -13248,7 +13248,7 @@
                 <w:sz w:val="18"/>
                 <w:szCs w:val="18"/>
               </w:rPr>
-              <w:t xml:space="preserve">none</w:t>
+              <w:t xml:space="preserve">L3</w:t>
             </w:r>
           </w:p>
         </w:tc>
@@ -13280,7 +13280,7 @@
                 <w:sz w:val="18"/>
                 <w:szCs w:val="18"/>
               </w:rPr>
-              <w:t xml:space="preserve">94.0 [82, 106]</w:t>
+              <w:t xml:space="preserve">67.3 [58, 78]</w:t>
             </w:r>
           </w:p>
         </w:tc>
@@ -13312,7 +13312,7 @@
                 <w:sz w:val="18"/>
                 <w:szCs w:val="18"/>
               </w:rPr>
-              <w:t xml:space="preserve">110 [97, 123]</w:t>
+              <w:t xml:space="preserve">81 [71, 94]</w:t>
             </w:r>
           </w:p>
         </w:tc>
@@ -13344,7 +13344,7 @@
                 <w:sz w:val="18"/>
                 <w:szCs w:val="18"/>
               </w:rPr>
-              <w:t xml:space="preserve">0</w:t>
+              <w:t xml:space="preserve">1780 ✗</w:t>
             </w:r>
           </w:p>
         </w:tc>
@@ -13376,7 +13376,7 @@
                 <w:sz w:val="18"/>
                 <w:szCs w:val="18"/>
               </w:rPr>
-              <w:t xml:space="preserve">0.0</w:t>
+              <w:t xml:space="preserve">11.3</w:t>
             </w:r>
           </w:p>
         </w:tc>
@@ -13408,7 +13408,7 @@
                 <w:sz w:val="18"/>
                 <w:szCs w:val="18"/>
               </w:rPr>
-              <w:t xml:space="preserve">0.0</w:t>
+              <w:t xml:space="preserve">50.0</w:t>
             </w:r>
           </w:p>
         </w:tc>
@@ -13442,7 +13442,7 @@
                 <w:sz w:val="18"/>
                 <w:szCs w:val="18"/>
               </w:rPr>
-              <w:t xml:space="preserve">Qwen2.5-1.5B</w:t>
+              <w:t xml:space="preserve">SmolLM2-360M</w:t>
             </w:r>
           </w:p>
         </w:tc>
@@ -13474,7 +13474,7 @@
                 <w:sz w:val="18"/>
                 <w:szCs w:val="18"/>
               </w:rPr>
-              <w:t xml:space="preserve">L2</w:t>
+              <w:t xml:space="preserve">L2+L3</w:t>
             </w:r>
           </w:p>
         </w:tc>
@@ -13506,7 +13506,7 @@
                 <w:sz w:val="18"/>
                 <w:szCs w:val="18"/>
               </w:rPr>
-              <w:t xml:space="preserve">17.3 [12, 24]</w:t>
+              <w:t xml:space="preserve">4.0 [1, 7]</w:t>
             </w:r>
           </w:p>
         </w:tc>
@@ -13538,7 +13538,7 @@
                 <w:sz w:val="18"/>
                 <w:szCs w:val="18"/>
               </w:rPr>
-              <w:t xml:space="preserve">24 [18, 32]</w:t>
+              <w:t xml:space="preserve">8 [3, 12]</w:t>
             </w:r>
           </w:p>
         </w:tc>
@@ -13570,7 +13570,7 @@
                 <w:sz w:val="18"/>
                 <w:szCs w:val="18"/>
               </w:rPr>
-              <w:t xml:space="preserve">88</w:t>
+              <w:t xml:space="preserve">249</w:t>
             </w:r>
           </w:p>
         </w:tc>
@@ -13602,7 +13602,7 @@
                 <w:sz w:val="18"/>
                 <w:szCs w:val="18"/>
               </w:rPr>
-              <w:t xml:space="preserve">14.0</w:t>
+              <w:t xml:space="preserve">50.7</w:t>
             </w:r>
           </w:p>
         </w:tc>
@@ -13634,7 +13634,7 @@
                 <w:sz w:val="18"/>
                 <w:szCs w:val="18"/>
               </w:rPr>
-              <w:t xml:space="preserve">0.0</w:t>
+              <w:t xml:space="preserve">6.7</w:t>
             </w:r>
           </w:p>
         </w:tc>
@@ -13700,7 +13700,7 @@
                 <w:sz w:val="18"/>
                 <w:szCs w:val="18"/>
               </w:rPr>
-              <w:t xml:space="preserve">L3</w:t>
+              <w:t xml:space="preserve">none</w:t>
             </w:r>
           </w:p>
         </w:tc>
@@ -13732,7 +13732,7 @@
                 <w:sz w:val="18"/>
                 <w:szCs w:val="18"/>
               </w:rPr>
-              <w:t xml:space="preserve">20.0 [13, 26]</w:t>
+              <w:t xml:space="preserve">94.0 [82, 106]</w:t>
             </w:r>
           </w:p>
         </w:tc>
@@ -13764,7 +13764,7 @@
                 <w:sz w:val="18"/>
                 <w:szCs w:val="18"/>
               </w:rPr>
-              <w:t xml:space="preserve">28 [19, 35]</w:t>
+              <w:t xml:space="preserve">110 [97, 123]</w:t>
             </w:r>
           </w:p>
         </w:tc>
@@ -13796,7 +13796,7 @@
                 <w:sz w:val="18"/>
                 <w:szCs w:val="18"/>
               </w:rPr>
-              <w:t xml:space="preserve">1752 ✗</w:t>
+              <w:t xml:space="preserve">0</w:t>
             </w:r>
           </w:p>
         </w:tc>
@@ -13828,7 +13828,7 @@
                 <w:sz w:val="18"/>
                 <w:szCs w:val="18"/>
               </w:rPr>
-              <w:t xml:space="preserve">35.3</w:t>
+              <w:t xml:space="preserve">0.0</w:t>
             </w:r>
           </w:p>
         </w:tc>
@@ -13860,7 +13860,7 @@
                 <w:sz w:val="18"/>
                 <w:szCs w:val="18"/>
               </w:rPr>
-              <w:t xml:space="preserve">49.3</w:t>
+              <w:t xml:space="preserve">0.0</w:t>
             </w:r>
           </w:p>
         </w:tc>
@@ -13926,6 +13926,684 @@
                 <w:sz w:val="18"/>
                 <w:szCs w:val="18"/>
               </w:rPr>
+              <w:t xml:space="preserve">L1+L2</w:t>
+            </w:r>
+          </w:p>
+        </w:tc>
+        <w:tc>
+          <w:tcPr>
+            <w:tcW w:type="dxa" w:w="1700"/>
+            <w:tcBorders>
+              <w:top w:val="single" w:color="AAAAAA" w:sz="4"/>
+              <w:left w:val="single" w:color="AAAAAA" w:sz="4"/>
+              <w:bottom w:val="single" w:color="AAAAAA" w:sz="4"/>
+              <w:right w:val="single" w:color="AAAAAA" w:sz="4"/>
+            </w:tcBorders>
+            <w:tcMar>
+              <w:top w:type="dxa" w:w="40"/>
+              <w:left w:type="dxa" w:w="80"/>
+              <w:bottom w:type="dxa" w:w="40"/>
+              <w:right w:type="dxa" w:w="80"/>
+            </w:tcMar>
+          </w:tcPr>
+          <w:p>
+            <w:pPr>
+              <w:jc w:val="center"/>
+            </w:pPr>
+            <w:r>
+              <w:rPr>
+                <w:rFonts w:ascii="Times New Roman" w:cs="Times New Roman" w:eastAsia="Times New Roman" w:hAnsi="Times New Roman"/>
+                <w:b w:val="false"/>
+                <w:bCs w:val="false"/>
+                <w:sz w:val="18"/>
+                <w:szCs w:val="18"/>
+              </w:rPr>
+              <w:t xml:space="preserve">17.3 [12, 24]</w:t>
+            </w:r>
+          </w:p>
+        </w:tc>
+        <w:tc>
+          <w:tcPr>
+            <w:tcW w:type="dxa" w:w="1300"/>
+            <w:tcBorders>
+              <w:top w:val="single" w:color="AAAAAA" w:sz="4"/>
+              <w:left w:val="single" w:color="AAAAAA" w:sz="4"/>
+              <w:bottom w:val="single" w:color="AAAAAA" w:sz="4"/>
+              <w:right w:val="single" w:color="AAAAAA" w:sz="4"/>
+            </w:tcBorders>
+            <w:tcMar>
+              <w:top w:type="dxa" w:w="40"/>
+              <w:left w:type="dxa" w:w="80"/>
+              <w:bottom w:type="dxa" w:w="40"/>
+              <w:right w:type="dxa" w:w="80"/>
+            </w:tcMar>
+          </w:tcPr>
+          <w:p>
+            <w:pPr>
+              <w:jc w:val="center"/>
+            </w:pPr>
+            <w:r>
+              <w:rPr>
+                <w:rFonts w:ascii="Times New Roman" w:cs="Times New Roman" w:eastAsia="Times New Roman" w:hAnsi="Times New Roman"/>
+                <w:b w:val="false"/>
+                <w:bCs w:val="false"/>
+                <w:sz w:val="18"/>
+                <w:szCs w:val="18"/>
+              </w:rPr>
+              <w:t xml:space="preserve">24 [18, 32]</w:t>
+            </w:r>
+          </w:p>
+        </w:tc>
+        <w:tc>
+          <w:tcPr>
+            <w:tcW w:type="dxa" w:w="1500"/>
+            <w:tcBorders>
+              <w:top w:val="single" w:color="AAAAAA" w:sz="4"/>
+              <w:left w:val="single" w:color="AAAAAA" w:sz="4"/>
+              <w:bottom w:val="single" w:color="AAAAAA" w:sz="4"/>
+              <w:right w:val="single" w:color="AAAAAA" w:sz="4"/>
+            </w:tcBorders>
+            <w:tcMar>
+              <w:top w:type="dxa" w:w="40"/>
+              <w:left w:type="dxa" w:w="80"/>
+              <w:bottom w:type="dxa" w:w="40"/>
+              <w:right w:type="dxa" w:w="80"/>
+            </w:tcMar>
+          </w:tcPr>
+          <w:p>
+            <w:pPr>
+              <w:jc w:val="center"/>
+            </w:pPr>
+            <w:r>
+              <w:rPr>
+                <w:rFonts w:ascii="Times New Roman" w:cs="Times New Roman" w:eastAsia="Times New Roman" w:hAnsi="Times New Roman"/>
+                <w:b w:val="false"/>
+                <w:bCs w:val="false"/>
+                <w:sz w:val="18"/>
+                <w:szCs w:val="18"/>
+              </w:rPr>
+              <w:t xml:space="preserve">87</w:t>
+            </w:r>
+          </w:p>
+        </w:tc>
+        <w:tc>
+          <w:tcPr>
+            <w:tcW w:type="dxa" w:w="1300"/>
+            <w:tcBorders>
+              <w:top w:val="single" w:color="AAAAAA" w:sz="4"/>
+              <w:left w:val="single" w:color="AAAAAA" w:sz="4"/>
+              <w:bottom w:val="single" w:color="AAAAAA" w:sz="4"/>
+              <w:right w:val="single" w:color="AAAAAA" w:sz="4"/>
+            </w:tcBorders>
+            <w:tcMar>
+              <w:top w:type="dxa" w:w="40"/>
+              <w:left w:type="dxa" w:w="80"/>
+              <w:bottom w:type="dxa" w:w="40"/>
+              <w:right w:type="dxa" w:w="80"/>
+            </w:tcMar>
+          </w:tcPr>
+          <w:p>
+            <w:pPr>
+              <w:jc w:val="center"/>
+            </w:pPr>
+            <w:r>
+              <w:rPr>
+                <w:rFonts w:ascii="Times New Roman" w:cs="Times New Roman" w:eastAsia="Times New Roman" w:hAnsi="Times New Roman"/>
+                <w:b w:val="false"/>
+                <w:bCs w:val="false"/>
+                <w:sz w:val="18"/>
+                <w:szCs w:val="18"/>
+              </w:rPr>
+              <w:t xml:space="preserve">14.0</w:t>
+            </w:r>
+          </w:p>
+        </w:tc>
+        <w:tc>
+          <w:tcPr>
+            <w:tcW w:type="dxa" w:w="1260"/>
+            <w:tcBorders>
+              <w:top w:val="single" w:color="AAAAAA" w:sz="4"/>
+              <w:left w:val="single" w:color="AAAAAA" w:sz="4"/>
+              <w:bottom w:val="single" w:color="AAAAAA" w:sz="4"/>
+              <w:right w:val="single" w:color="AAAAAA" w:sz="4"/>
+            </w:tcBorders>
+            <w:tcMar>
+              <w:top w:type="dxa" w:w="40"/>
+              <w:left w:type="dxa" w:w="80"/>
+              <w:bottom w:type="dxa" w:w="40"/>
+              <w:right w:type="dxa" w:w="80"/>
+            </w:tcMar>
+          </w:tcPr>
+          <w:p>
+            <w:pPr>
+              <w:jc w:val="center"/>
+            </w:pPr>
+            <w:r>
+              <w:rPr>
+                <w:rFonts w:ascii="Times New Roman" w:cs="Times New Roman" w:eastAsia="Times New Roman" w:hAnsi="Times New Roman"/>
+                <w:b w:val="false"/>
+                <w:bCs w:val="false"/>
+                <w:sz w:val="18"/>
+                <w:szCs w:val="18"/>
+              </w:rPr>
+              <w:t xml:space="preserve">0.0</w:t>
+            </w:r>
+          </w:p>
+        </w:tc>
+      </w:tr>
+      <w:tr>
+        <w:tc>
+          <w:tcPr>
+            <w:tcW w:type="dxa" w:w="1400"/>
+            <w:tcBorders>
+              <w:top w:val="single" w:color="AAAAAA" w:sz="4"/>
+              <w:left w:val="single" w:color="AAAAAA" w:sz="4"/>
+              <w:bottom w:val="single" w:color="AAAAAA" w:sz="4"/>
+              <w:right w:val="single" w:color="AAAAAA" w:sz="4"/>
+            </w:tcBorders>
+            <w:tcMar>
+              <w:top w:type="dxa" w:w="40"/>
+              <w:left w:type="dxa" w:w="80"/>
+              <w:bottom w:type="dxa" w:w="40"/>
+              <w:right w:type="dxa" w:w="80"/>
+            </w:tcMar>
+          </w:tcPr>
+          <w:p>
+            <w:pPr>
+              <w:jc w:val="center"/>
+            </w:pPr>
+            <w:r>
+              <w:rPr>
+                <w:rFonts w:ascii="Times New Roman" w:cs="Times New Roman" w:eastAsia="Times New Roman" w:hAnsi="Times New Roman"/>
+                <w:b w:val="false"/>
+                <w:bCs w:val="false"/>
+                <w:sz w:val="18"/>
+                <w:szCs w:val="18"/>
+              </w:rPr>
+              <w:t xml:space="preserve">Qwen2.5-1.5B</w:t>
+            </w:r>
+          </w:p>
+        </w:tc>
+        <w:tc>
+          <w:tcPr>
+            <w:tcW w:type="dxa" w:w="900"/>
+            <w:tcBorders>
+              <w:top w:val="single" w:color="AAAAAA" w:sz="4"/>
+              <w:left w:val="single" w:color="AAAAAA" w:sz="4"/>
+              <w:bottom w:val="single" w:color="AAAAAA" w:sz="4"/>
+              <w:right w:val="single" w:color="AAAAAA" w:sz="4"/>
+            </w:tcBorders>
+            <w:tcMar>
+              <w:top w:type="dxa" w:w="40"/>
+              <w:left w:type="dxa" w:w="80"/>
+              <w:bottom w:type="dxa" w:w="40"/>
+              <w:right w:type="dxa" w:w="80"/>
+            </w:tcMar>
+          </w:tcPr>
+          <w:p>
+            <w:pPr>
+              <w:jc w:val="center"/>
+            </w:pPr>
+            <w:r>
+              <w:rPr>
+                <w:rFonts w:ascii="Times New Roman" w:cs="Times New Roman" w:eastAsia="Times New Roman" w:hAnsi="Times New Roman"/>
+                <w:b w:val="false"/>
+                <w:bCs w:val="false"/>
+                <w:sz w:val="18"/>
+                <w:szCs w:val="18"/>
+              </w:rPr>
+              <w:t xml:space="preserve">L2</w:t>
+            </w:r>
+          </w:p>
+        </w:tc>
+        <w:tc>
+          <w:tcPr>
+            <w:tcW w:type="dxa" w:w="1700"/>
+            <w:tcBorders>
+              <w:top w:val="single" w:color="AAAAAA" w:sz="4"/>
+              <w:left w:val="single" w:color="AAAAAA" w:sz="4"/>
+              <w:bottom w:val="single" w:color="AAAAAA" w:sz="4"/>
+              <w:right w:val="single" w:color="AAAAAA" w:sz="4"/>
+            </w:tcBorders>
+            <w:tcMar>
+              <w:top w:type="dxa" w:w="40"/>
+              <w:left w:type="dxa" w:w="80"/>
+              <w:bottom w:type="dxa" w:w="40"/>
+              <w:right w:type="dxa" w:w="80"/>
+            </w:tcMar>
+          </w:tcPr>
+          <w:p>
+            <w:pPr>
+              <w:jc w:val="center"/>
+            </w:pPr>
+            <w:r>
+              <w:rPr>
+                <w:rFonts w:ascii="Times New Roman" w:cs="Times New Roman" w:eastAsia="Times New Roman" w:hAnsi="Times New Roman"/>
+                <w:b w:val="false"/>
+                <w:bCs w:val="false"/>
+                <w:sz w:val="18"/>
+                <w:szCs w:val="18"/>
+              </w:rPr>
+              <w:t xml:space="preserve">17.3 [12, 24]</w:t>
+            </w:r>
+          </w:p>
+        </w:tc>
+        <w:tc>
+          <w:tcPr>
+            <w:tcW w:type="dxa" w:w="1300"/>
+            <w:tcBorders>
+              <w:top w:val="single" w:color="AAAAAA" w:sz="4"/>
+              <w:left w:val="single" w:color="AAAAAA" w:sz="4"/>
+              <w:bottom w:val="single" w:color="AAAAAA" w:sz="4"/>
+              <w:right w:val="single" w:color="AAAAAA" w:sz="4"/>
+            </w:tcBorders>
+            <w:tcMar>
+              <w:top w:type="dxa" w:w="40"/>
+              <w:left w:type="dxa" w:w="80"/>
+              <w:bottom w:type="dxa" w:w="40"/>
+              <w:right w:type="dxa" w:w="80"/>
+            </w:tcMar>
+          </w:tcPr>
+          <w:p>
+            <w:pPr>
+              <w:jc w:val="center"/>
+            </w:pPr>
+            <w:r>
+              <w:rPr>
+                <w:rFonts w:ascii="Times New Roman" w:cs="Times New Roman" w:eastAsia="Times New Roman" w:hAnsi="Times New Roman"/>
+                <w:b w:val="false"/>
+                <w:bCs w:val="false"/>
+                <w:sz w:val="18"/>
+                <w:szCs w:val="18"/>
+              </w:rPr>
+              <w:t xml:space="preserve">24 [18, 32]</w:t>
+            </w:r>
+          </w:p>
+        </w:tc>
+        <w:tc>
+          <w:tcPr>
+            <w:tcW w:type="dxa" w:w="1500"/>
+            <w:tcBorders>
+              <w:top w:val="single" w:color="AAAAAA" w:sz="4"/>
+              <w:left w:val="single" w:color="AAAAAA" w:sz="4"/>
+              <w:bottom w:val="single" w:color="AAAAAA" w:sz="4"/>
+              <w:right w:val="single" w:color="AAAAAA" w:sz="4"/>
+            </w:tcBorders>
+            <w:tcMar>
+              <w:top w:type="dxa" w:w="40"/>
+              <w:left w:type="dxa" w:w="80"/>
+              <w:bottom w:type="dxa" w:w="40"/>
+              <w:right w:type="dxa" w:w="80"/>
+            </w:tcMar>
+          </w:tcPr>
+          <w:p>
+            <w:pPr>
+              <w:jc w:val="center"/>
+            </w:pPr>
+            <w:r>
+              <w:rPr>
+                <w:rFonts w:ascii="Times New Roman" w:cs="Times New Roman" w:eastAsia="Times New Roman" w:hAnsi="Times New Roman"/>
+                <w:b w:val="false"/>
+                <w:bCs w:val="false"/>
+                <w:sz w:val="18"/>
+                <w:szCs w:val="18"/>
+              </w:rPr>
+              <w:t xml:space="preserve">88</w:t>
+            </w:r>
+          </w:p>
+        </w:tc>
+        <w:tc>
+          <w:tcPr>
+            <w:tcW w:type="dxa" w:w="1300"/>
+            <w:tcBorders>
+              <w:top w:val="single" w:color="AAAAAA" w:sz="4"/>
+              <w:left w:val="single" w:color="AAAAAA" w:sz="4"/>
+              <w:bottom w:val="single" w:color="AAAAAA" w:sz="4"/>
+              <w:right w:val="single" w:color="AAAAAA" w:sz="4"/>
+            </w:tcBorders>
+            <w:tcMar>
+              <w:top w:type="dxa" w:w="40"/>
+              <w:left w:type="dxa" w:w="80"/>
+              <w:bottom w:type="dxa" w:w="40"/>
+              <w:right w:type="dxa" w:w="80"/>
+            </w:tcMar>
+          </w:tcPr>
+          <w:p>
+            <w:pPr>
+              <w:jc w:val="center"/>
+            </w:pPr>
+            <w:r>
+              <w:rPr>
+                <w:rFonts w:ascii="Times New Roman" w:cs="Times New Roman" w:eastAsia="Times New Roman" w:hAnsi="Times New Roman"/>
+                <w:b w:val="false"/>
+                <w:bCs w:val="false"/>
+                <w:sz w:val="18"/>
+                <w:szCs w:val="18"/>
+              </w:rPr>
+              <w:t xml:space="preserve">14.0</w:t>
+            </w:r>
+          </w:p>
+        </w:tc>
+        <w:tc>
+          <w:tcPr>
+            <w:tcW w:type="dxa" w:w="1260"/>
+            <w:tcBorders>
+              <w:top w:val="single" w:color="AAAAAA" w:sz="4"/>
+              <w:left w:val="single" w:color="AAAAAA" w:sz="4"/>
+              <w:bottom w:val="single" w:color="AAAAAA" w:sz="4"/>
+              <w:right w:val="single" w:color="AAAAAA" w:sz="4"/>
+            </w:tcBorders>
+            <w:tcMar>
+              <w:top w:type="dxa" w:w="40"/>
+              <w:left w:type="dxa" w:w="80"/>
+              <w:bottom w:type="dxa" w:w="40"/>
+              <w:right w:type="dxa" w:w="80"/>
+            </w:tcMar>
+          </w:tcPr>
+          <w:p>
+            <w:pPr>
+              <w:jc w:val="center"/>
+            </w:pPr>
+            <w:r>
+              <w:rPr>
+                <w:rFonts w:ascii="Times New Roman" w:cs="Times New Roman" w:eastAsia="Times New Roman" w:hAnsi="Times New Roman"/>
+                <w:b w:val="false"/>
+                <w:bCs w:val="false"/>
+                <w:sz w:val="18"/>
+                <w:szCs w:val="18"/>
+              </w:rPr>
+              <w:t xml:space="preserve">0.0</w:t>
+            </w:r>
+          </w:p>
+        </w:tc>
+      </w:tr>
+      <w:tr>
+        <w:tc>
+          <w:tcPr>
+            <w:tcW w:type="dxa" w:w="1400"/>
+            <w:tcBorders>
+              <w:top w:val="single" w:color="AAAAAA" w:sz="4"/>
+              <w:left w:val="single" w:color="AAAAAA" w:sz="4"/>
+              <w:bottom w:val="single" w:color="AAAAAA" w:sz="4"/>
+              <w:right w:val="single" w:color="AAAAAA" w:sz="4"/>
+            </w:tcBorders>
+            <w:tcMar>
+              <w:top w:type="dxa" w:w="40"/>
+              <w:left w:type="dxa" w:w="80"/>
+              <w:bottom w:type="dxa" w:w="40"/>
+              <w:right w:type="dxa" w:w="80"/>
+            </w:tcMar>
+          </w:tcPr>
+          <w:p>
+            <w:pPr>
+              <w:jc w:val="center"/>
+            </w:pPr>
+            <w:r>
+              <w:rPr>
+                <w:rFonts w:ascii="Times New Roman" w:cs="Times New Roman" w:eastAsia="Times New Roman" w:hAnsi="Times New Roman"/>
+                <w:b w:val="false"/>
+                <w:bCs w:val="false"/>
+                <w:sz w:val="18"/>
+                <w:szCs w:val="18"/>
+              </w:rPr>
+              <w:t xml:space="preserve">Qwen2.5-1.5B</w:t>
+            </w:r>
+          </w:p>
+        </w:tc>
+        <w:tc>
+          <w:tcPr>
+            <w:tcW w:type="dxa" w:w="900"/>
+            <w:tcBorders>
+              <w:top w:val="single" w:color="AAAAAA" w:sz="4"/>
+              <w:left w:val="single" w:color="AAAAAA" w:sz="4"/>
+              <w:bottom w:val="single" w:color="AAAAAA" w:sz="4"/>
+              <w:right w:val="single" w:color="AAAAAA" w:sz="4"/>
+            </w:tcBorders>
+            <w:tcMar>
+              <w:top w:type="dxa" w:w="40"/>
+              <w:left w:type="dxa" w:w="80"/>
+              <w:bottom w:type="dxa" w:w="40"/>
+              <w:right w:type="dxa" w:w="80"/>
+            </w:tcMar>
+          </w:tcPr>
+          <w:p>
+            <w:pPr>
+              <w:jc w:val="center"/>
+            </w:pPr>
+            <w:r>
+              <w:rPr>
+                <w:rFonts w:ascii="Times New Roman" w:cs="Times New Roman" w:eastAsia="Times New Roman" w:hAnsi="Times New Roman"/>
+                <w:b w:val="false"/>
+                <w:bCs w:val="false"/>
+                <w:sz w:val="18"/>
+                <w:szCs w:val="18"/>
+              </w:rPr>
+              <w:t xml:space="preserve">L3</w:t>
+            </w:r>
+          </w:p>
+        </w:tc>
+        <w:tc>
+          <w:tcPr>
+            <w:tcW w:type="dxa" w:w="1700"/>
+            <w:tcBorders>
+              <w:top w:val="single" w:color="AAAAAA" w:sz="4"/>
+              <w:left w:val="single" w:color="AAAAAA" w:sz="4"/>
+              <w:bottom w:val="single" w:color="AAAAAA" w:sz="4"/>
+              <w:right w:val="single" w:color="AAAAAA" w:sz="4"/>
+            </w:tcBorders>
+            <w:tcMar>
+              <w:top w:type="dxa" w:w="40"/>
+              <w:left w:type="dxa" w:w="80"/>
+              <w:bottom w:type="dxa" w:w="40"/>
+              <w:right w:type="dxa" w:w="80"/>
+            </w:tcMar>
+          </w:tcPr>
+          <w:p>
+            <w:pPr>
+              <w:jc w:val="center"/>
+            </w:pPr>
+            <w:r>
+              <w:rPr>
+                <w:rFonts w:ascii="Times New Roman" w:cs="Times New Roman" w:eastAsia="Times New Roman" w:hAnsi="Times New Roman"/>
+                <w:b w:val="false"/>
+                <w:bCs w:val="false"/>
+                <w:sz w:val="18"/>
+                <w:szCs w:val="18"/>
+              </w:rPr>
+              <w:t xml:space="preserve">38.7 [29, 48]</w:t>
+            </w:r>
+          </w:p>
+        </w:tc>
+        <w:tc>
+          <w:tcPr>
+            <w:tcW w:type="dxa" w:w="1300"/>
+            <w:tcBorders>
+              <w:top w:val="single" w:color="AAAAAA" w:sz="4"/>
+              <w:left w:val="single" w:color="AAAAAA" w:sz="4"/>
+              <w:bottom w:val="single" w:color="AAAAAA" w:sz="4"/>
+              <w:right w:val="single" w:color="AAAAAA" w:sz="4"/>
+            </w:tcBorders>
+            <w:tcMar>
+              <w:top w:type="dxa" w:w="40"/>
+              <w:left w:type="dxa" w:w="80"/>
+              <w:bottom w:type="dxa" w:w="40"/>
+              <w:right w:type="dxa" w:w="80"/>
+            </w:tcMar>
+          </w:tcPr>
+          <w:p>
+            <w:pPr>
+              <w:jc w:val="center"/>
+            </w:pPr>
+            <w:r>
+              <w:rPr>
+                <w:rFonts w:ascii="Times New Roman" w:cs="Times New Roman" w:eastAsia="Times New Roman" w:hAnsi="Times New Roman"/>
+                <w:b w:val="false"/>
+                <w:bCs w:val="false"/>
+                <w:sz w:val="18"/>
+                <w:szCs w:val="18"/>
+              </w:rPr>
+              <w:t xml:space="preserve">49 [39, 60]</w:t>
+            </w:r>
+          </w:p>
+        </w:tc>
+        <w:tc>
+          <w:tcPr>
+            <w:tcW w:type="dxa" w:w="1500"/>
+            <w:tcBorders>
+              <w:top w:val="single" w:color="AAAAAA" w:sz="4"/>
+              <w:left w:val="single" w:color="AAAAAA" w:sz="4"/>
+              <w:bottom w:val="single" w:color="AAAAAA" w:sz="4"/>
+              <w:right w:val="single" w:color="AAAAAA" w:sz="4"/>
+            </w:tcBorders>
+            <w:tcMar>
+              <w:top w:type="dxa" w:w="40"/>
+              <w:left w:type="dxa" w:w="80"/>
+              <w:bottom w:type="dxa" w:w="40"/>
+              <w:right w:type="dxa" w:w="80"/>
+            </w:tcMar>
+          </w:tcPr>
+          <w:p>
+            <w:pPr>
+              <w:jc w:val="center"/>
+            </w:pPr>
+            <w:r>
+              <w:rPr>
+                <w:rFonts w:ascii="Times New Roman" w:cs="Times New Roman" w:eastAsia="Times New Roman" w:hAnsi="Times New Roman"/>
+                <w:b w:val="false"/>
+                <w:bCs w:val="false"/>
+                <w:sz w:val="18"/>
+                <w:szCs w:val="18"/>
+              </w:rPr>
+              <w:t xml:space="preserve">1596 ✗</w:t>
+            </w:r>
+          </w:p>
+        </w:tc>
+        <w:tc>
+          <w:tcPr>
+            <w:tcW w:type="dxa" w:w="1300"/>
+            <w:tcBorders>
+              <w:top w:val="single" w:color="AAAAAA" w:sz="4"/>
+              <w:left w:val="single" w:color="AAAAAA" w:sz="4"/>
+              <w:bottom w:val="single" w:color="AAAAAA" w:sz="4"/>
+              <w:right w:val="single" w:color="AAAAAA" w:sz="4"/>
+            </w:tcBorders>
+            <w:tcMar>
+              <w:top w:type="dxa" w:w="40"/>
+              <w:left w:type="dxa" w:w="80"/>
+              <w:bottom w:type="dxa" w:w="40"/>
+              <w:right w:type="dxa" w:w="80"/>
+            </w:tcMar>
+          </w:tcPr>
+          <w:p>
+            <w:pPr>
+              <w:jc w:val="center"/>
+            </w:pPr>
+            <w:r>
+              <w:rPr>
+                <w:rFonts w:ascii="Times New Roman" w:cs="Times New Roman" w:eastAsia="Times New Roman" w:hAnsi="Times New Roman"/>
+                <w:b w:val="false"/>
+                <w:bCs w:val="false"/>
+                <w:sz w:val="18"/>
+                <w:szCs w:val="18"/>
+              </w:rPr>
+              <w:t xml:space="preserve">20.7</w:t>
+            </w:r>
+          </w:p>
+        </w:tc>
+        <w:tc>
+          <w:tcPr>
+            <w:tcW w:type="dxa" w:w="1260"/>
+            <w:tcBorders>
+              <w:top w:val="single" w:color="AAAAAA" w:sz="4"/>
+              <w:left w:val="single" w:color="AAAAAA" w:sz="4"/>
+              <w:bottom w:val="single" w:color="AAAAAA" w:sz="4"/>
+              <w:right w:val="single" w:color="AAAAAA" w:sz="4"/>
+            </w:tcBorders>
+            <w:tcMar>
+              <w:top w:type="dxa" w:w="40"/>
+              <w:left w:type="dxa" w:w="80"/>
+              <w:bottom w:type="dxa" w:w="40"/>
+              <w:right w:type="dxa" w:w="80"/>
+            </w:tcMar>
+          </w:tcPr>
+          <w:p>
+            <w:pPr>
+              <w:jc w:val="center"/>
+            </w:pPr>
+            <w:r>
+              <w:rPr>
+                <w:rFonts w:ascii="Times New Roman" w:cs="Times New Roman" w:eastAsia="Times New Roman" w:hAnsi="Times New Roman"/>
+                <w:b w:val="false"/>
+                <w:bCs w:val="false"/>
+                <w:sz w:val="18"/>
+                <w:szCs w:val="18"/>
+              </w:rPr>
+              <w:t xml:space="preserve">49.3</w:t>
+            </w:r>
+          </w:p>
+        </w:tc>
+      </w:tr>
+      <w:tr>
+        <w:tc>
+          <w:tcPr>
+            <w:tcW w:type="dxa" w:w="1400"/>
+            <w:tcBorders>
+              <w:top w:val="single" w:color="AAAAAA" w:sz="4"/>
+              <w:left w:val="single" w:color="AAAAAA" w:sz="4"/>
+              <w:bottom w:val="single" w:color="AAAAAA" w:sz="4"/>
+              <w:right w:val="single" w:color="AAAAAA" w:sz="4"/>
+            </w:tcBorders>
+            <w:tcMar>
+              <w:top w:type="dxa" w:w="40"/>
+              <w:left w:type="dxa" w:w="80"/>
+              <w:bottom w:type="dxa" w:w="40"/>
+              <w:right w:type="dxa" w:w="80"/>
+            </w:tcMar>
+          </w:tcPr>
+          <w:p>
+            <w:pPr>
+              <w:jc w:val="center"/>
+            </w:pPr>
+            <w:r>
+              <w:rPr>
+                <w:rFonts w:ascii="Times New Roman" w:cs="Times New Roman" w:eastAsia="Times New Roman" w:hAnsi="Times New Roman"/>
+                <w:b w:val="false"/>
+                <w:bCs w:val="false"/>
+                <w:sz w:val="18"/>
+                <w:szCs w:val="18"/>
+              </w:rPr>
+              <w:t xml:space="preserve">Qwen2.5-1.5B</w:t>
+            </w:r>
+          </w:p>
+        </w:tc>
+        <w:tc>
+          <w:tcPr>
+            <w:tcW w:type="dxa" w:w="900"/>
+            <w:tcBorders>
+              <w:top w:val="single" w:color="AAAAAA" w:sz="4"/>
+              <w:left w:val="single" w:color="AAAAAA" w:sz="4"/>
+              <w:bottom w:val="single" w:color="AAAAAA" w:sz="4"/>
+              <w:right w:val="single" w:color="AAAAAA" w:sz="4"/>
+            </w:tcBorders>
+            <w:tcMar>
+              <w:top w:type="dxa" w:w="40"/>
+              <w:left w:type="dxa" w:w="80"/>
+              <w:bottom w:type="dxa" w:w="40"/>
+              <w:right w:type="dxa" w:w="80"/>
+            </w:tcMar>
+          </w:tcPr>
+          <w:p>
+            <w:pPr>
+              <w:jc w:val="center"/>
+            </w:pPr>
+            <w:r>
+              <w:rPr>
+                <w:rFonts w:ascii="Times New Roman" w:cs="Times New Roman" w:eastAsia="Times New Roman" w:hAnsi="Times New Roman"/>
+                <w:b w:val="false"/>
+                <w:bCs w:val="false"/>
+                <w:sz w:val="18"/>
+                <w:szCs w:val="18"/>
+              </w:rPr>
               <w:t xml:space="preserve">L2+L3</w:t>
             </w:r>
           </w:p>
@@ -13958,7 +14636,7 @@
                 <w:sz w:val="18"/>
                 <w:szCs w:val="18"/>
               </w:rPr>
-              <w:t xml:space="preserve">14.7 [9, 21]</w:t>
+              <w:t xml:space="preserve">16.7 [11, 23]</w:t>
             </w:r>
           </w:p>
         </w:tc>
@@ -13990,7 +14668,7 @@
                 <w:sz w:val="18"/>
                 <w:szCs w:val="18"/>
               </w:rPr>
-              <w:t xml:space="preserve">21 [15, 28]</w:t>
+              <w:t xml:space="preserve">24 [16, 31]</w:t>
             </w:r>
           </w:p>
         </w:tc>
@@ -14022,7 +14700,7 @@
                 <w:sz w:val="18"/>
                 <w:szCs w:val="18"/>
               </w:rPr>
-              <w:t xml:space="preserve">296</w:t>
+              <w:t xml:space="preserve">279</w:t>
             </w:r>
           </w:p>
         </w:tc>
@@ -14054,7 +14732,7 @@
                 <w:sz w:val="18"/>
                 <w:szCs w:val="18"/>
               </w:rPr>
-              <w:t xml:space="preserve">22.0</w:t>
+              <w:t xml:space="preserve">19.3</w:t>
             </w:r>
           </w:p>
         </w:tc>
@@ -14104,7 +14782,7 @@
           <w:sz w:val="18"/>
           <w:szCs w:val="18"/>
         </w:rPr>
-        <w:t xml:space="preserve">✗ = violates the 500 ms budget. System failure = a layer call that errors or exceeds 2 s. L1+L2 and L1+L2+L3 equal L2 and L2+L3 up to small differences because L1 is nearly inert on this task.</w:t>
+        <w:t xml:space="preserve">L2+L3 is the routed cascade (the judge L3 is called only if the L2 score is below 0.9); L3 alone runs the judge on every answer. ✗ = violates the 500 ms budget. Mean added latency is per query, including abstentions (which bypass the guardrails), so it differs from the per-layer means of Table 5; each judge call is capped at the 2 s timeout, after which its verdict is discarded and it counts as a system failure. L1+L2 and L1+L2+L3 equal L2 and L2+L3 up to small differences because L1 is nearly inert on this task.</w:t>
       </w:r>
     </w:p>
     <w:p>
@@ -14128,7 +14806,7 @@
           <w:sz w:val="22"/>
           <w:szCs w:val="22"/>
         </w:rPr>
-        <w:t xml:space="preserve"> A single task-specific verifier (L2) reduces required capacity from 139, 149, 110 to 19, 8, 24 units/day (a 78-95% reduction). Adding the routed judge reduces it further only modestly (15, 8, 21) and for SmolLM2 not at all, while multiplying added latency by about three and adding roughly 6 system failures per day through judge timeouts. Running the judge on every answer without routing is infeasible under any latency budget we consider (about 1.9 s) and produces about 50-60 system failures per day on our CPU setup.</w:t>
+        <w:t xml:space="preserve"> A single task-specific verifier (L2) reduces required capacity from 139, 149, 110 to 19, 8, 24 units/day (a 78-95% reduction). Adding the routed judge changes it to 17, 8, 24, i.e. by 2, 0, 0 units, while multiplying added latency by about three and adding roughly 6 system failures per day through judge timeouts. Running the judge on every answer without routing is infeasible under any latency budget we consider (about 1.6-1.8 s per query) and produces about 50-60 system failures per day on our CPU setup.</w:t>
       </w:r>
     </w:p>
     <w:p>
@@ -14176,7 +14854,25 @@
           <w:sz w:val="22"/>
           <w:szCs w:val="22"/>
         </w:rPr>
-        <w:t xml:space="preserve"> The best cascade by the objective of Section 4.4 is L1+L2 for all three generators. At the scenario costs (C_h = $150 per capacity unit, $1 per falsely blocked answer, $100 per hallucination reaching a user; illustrative values) the minimum-dollar cascade is different for two of them: L1+L2+L3 for Qwen2.5-0.5B, L1+L2 for SmolLM2-360M, L1+L2+L3 for Qwen2.5-1.5B, because the judge lowers k∗ (19 to 15, 8 to 8, 24 to 21 for the three generators). The daily cost falls from $32,917, $35,350, $25,900 without guardrails to $3,201, $1,649, $4,639 at the minimum. Paired pool-bootstrap intervals for the daily saving from adding the routed judge to L1+L2 are $929 [274, 1,861]; $-2 [-5, -0]; $709 [130, 1,575] for the three generators, so the judge pays for itself for the two Qwen generators at these costs, through a reduction of k∗ by only 4 and 3 units, but not for SmolLM2-360M, whose classifier leaves only 6 of the 300 hallucinations for the judge to catch (none were caught). The generator dependence is therefore a statement about these three runs on the same questions, with small numbers of residual hallucinations (19, 6, 26), not a general finding; the 27-scenario grid of Section 4.4 varies cost parameters and does not reflect sampling error, so the ranking being stable across it does not make the choice robust. The classifier is the dominant layer, the deterministic layer is nearly free but also nearly useless on this task, and the judge's marginal value is positive but small and uncertain.</w:t>
+        <w:t xml:space="preserve"> The best cascade by the objective of Section 4.4 is L1+L2 for all three generators (a latency-penalised objective with arbitrary weights; the minimum-dollar cascade below was not replayed under bursty traffic). At the scenario costs (C_h = $150 per capacity unit, $1 per falsely blocked answer, $100 per hallucination reaching a user; illustrative values) the minimum-dollar cascade is L1+L2+L3 for Qwen2.5-0.5B, L1+L2 for SmolLM2-360M, L1+L2+L3 for Qwen2.5-1.5B. The daily cost falls from $32,917, $35,350, $25,900 without guardrails to $3,700, $1,649, $5,286 at the minimum. The paired pool-bootstrap interval of the daily saving from adding the routed judge to L1+L2 is $429 [-$5, $931]; -$2 [-$5, $0]; $61 [-$9, $646] for the three generators: positive but not distinguishable from zero for the two Qwen generators, and slightly negative for SmolLM2-360M, whose classifier leaves only 6 of its 195 hallucinations for the judge to catch (none were caught). Under this fail-open policy the judge therefore does not demonstrably pay for itself for any generator. </w:t>
+      </w:r>
+      <w:r>
+        <w:rPr>
+          <w:rFonts w:ascii="Times New Roman" w:cs="Times New Roman" w:eastAsia="Times New Roman" w:hAnsi="Times New Roman"/>
+          <w:b/>
+          <w:bCs/>
+          <w:sz w:val="22"/>
+          <w:szCs w:val="22"/>
+        </w:rPr>
+        <w:t xml:space="preserve">Sensitivity to the timeout policy:</w:t>
+      </w:r>
+      <w:r>
+        <w:rPr>
+          <w:rFonts w:ascii="Times New Roman" w:cs="Times New Roman" w:eastAsia="Times New Roman" w:hAnsi="Times New Roman"/>
+          <w:sz w:val="22"/>
+          <w:szCs w:val="22"/>
+        </w:rPr>
+        <w:t xml:space="preserve"> if slow judge verdicts were waited for and credited (no 2 s timeout), the stand-alone clearance of L3 would be 63-84% (against 48-59%), the routed cascade would need k∗ = 15, 8, 21, and the saving of adding the judge would be $929 [$274, $1,861]; -$2 [-$5, $0]; $709 [$130, $1,575], so the judge's apparent value depends on accepting latencies above 2 s. The residual hallucinations after L2 are few (19, 6, 26 of 300 questions), the 27-scenario grid of Section 4.4 varies cost parameters and does not reflect sampling error, and the three runs share their questions, so none of these differences between generators is a general finding. The classifier is the dominant layer, the deterministic layer is nearly free but also nearly useless on this task, and the judge's marginal value is small and uncertain.</w:t>
       </w:r>
     </w:p>
     <w:p>
@@ -14218,7 +14914,7 @@
           <w:sz w:val="22"/>
           <w:szCs w:val="22"/>
         </w:rPr>
-        <w:t xml:space="preserve"> The Azure OpenAI trace has 10.6 million requests over 231 recorded days; 4.6% of requests failed (zero response tokens). The hour-of-day profile has a peak-to-trough ratio of 2.2 (peak in the late afternoon and evening hours, trough in the morning hours of the local clock), so the arrival process is non-homogeneous, as the NHPP formulation assumes. Within an hour, counts are more variable than Poisson: the variance-to-mean ratio of counts per bin (Poisson = 1; median over hours with a mean of at least one request per bin, 919, 2477, 3984 and 4999 hours at the four scales) is 1.4 at 1 s, 5.3 at 10 s, 3.9 at 1 min and 5.1 at 10 min, i.e. requests are clustered at every scale from 1 s upward (mildly at 1 s, strongly from 10 s). By Proposition 3 an unprotected hallucination stream with p = 0.6 would inherit about 1 + 0.6(F - 1) ≈ 3.5 of that dispersion at the 10-minute scale, whereas a cascade with residual probability p = 0.05 would retain about 1.2.</w:t>
+        <w:t xml:space="preserve"> The Azure OpenAI trace has 10.6 million requests over 231 recorded days; 4.6% of requests failed (zero response tokens). The hour-of-day profile has a peak-to-trough ratio of 2.2 (peak in the late afternoon and evening hours, trough in the morning hours; the clock offset of the trace is unknown), so the arrival process is non-homogeneous, as the NHPP formulation assumes. Within an hour, counts are more variable than Poisson: the variance-to-mean ratio of counts per bin (Poisson = 1; median over hours with a mean of at least one request per bin, 919, 2477, 3984 and 4999 hours at the four scales) is 1.4 at 1 s, 5.3 at 10 s, 3.9 at 1 min and 5.1 at 10 min, i.e. requests are clustered at every scale from 1 s upward (mildly at 1 s, strongly from 10 s). By Proposition 3 an unprotected hallucination stream with p = 0.6 would inherit about 1 + 0.6(F - 1) ≈ 3.5 of that dispersion at the 10-minute scale, whereas a cascade with residual probability p = 0.05 would retain about 1.2.</w:t>
       </w:r>
     </w:p>
     <w:p>
@@ -14232,7 +14928,7 @@
           <w:sz w:val="22"/>
           <w:szCs w:val="22"/>
         </w:rPr>
-        <w:t xml:space="preserve">Day-to-day volume is extremely variable: the median day has 19,024 requests, with a range from 52 to 425,604. The median absolute day-to-day log change is 0.61 (a factor of 1.8), 73% of days differ from the previous day by more than 30%, and the robust log-standard deviation around a 15-day rolling median is 0.80. Net of the local level (day count over the mean of the 14 neighbouring days) the coefficient of variation is 1.13 in days 0-120 and 3.65 in days 225-334. The smallest coefficient of variation of any of the 163 14-day windows with all days above 1,000 requests is 0.44 (mean 140k requests/day; the median window has 0.91), so 0.44 is a </w:t>
+        <w:t xml:space="preserve">Day-to-day volume is extremely variable: the median day has 19,024 requests, with a range from 52 to 425,604. The median absolute day-to-day log change is 0.61 (a factor of 1.8), 73% of days differ from the previous day by more than 30%, and the robust log-standard deviation around a 15-day rolling median is 0.80. Net of the local level (day count over the mean of the 14 neighbouring days) the coefficient of variation is 1.22 in days 0-120 and 2.77 in days 225-334. The smallest coefficient of variation of any of the 163 14-day windows with all days above 1,000 requests is 0.44 (mean 140k requests/day; the median window has 0.91), so 0.44 is a </w:t>
       </w:r>
       <w:r>
         <w:rPr>
@@ -14274,7 +14970,7 @@
           <w:sz w:val="22"/>
           <w:szCs w:val="22"/>
         </w:rPr>
-        <w:t xml:space="preserve"> Between March 2023 and August 2024 the three providers declared 457 incidents (0.83 per day; OpenAI 0.51, Anthropic 0.26). Incident starts are strongly non-homogeneous: weekday counts are 2.5-6.4 times weekend counts and hour-of-day homogeneity is rejected (p &lt; 10⁻⁴ for every provider and subset). A homogeneous Poisson model is rejected on every inter-arrival and dispersion test. Allowing for weekly and daily seasonality removes part of the lack of fit but not all of it: the daily index of dispersion is 1.53 (p = 3×10⁻14) and still 1.30 after stratifying by day of week (p = 6×10⁻6); for OpenAI alone the time-rescaled inter-arrival test is consistent with an NHPP (p = 0.23) but its stratified index is still 1.19 (p = 0.003), while for Anthropic and for the major and critical subset both are rejected. A negative-binomial fit to daily counts gives r ≈ 1.6. Part of this over-dispersion may come from a changing incident rate over the 18 months, which a weekday-stratified test does not remove (Section 5.8 adjusts the baseline for it). The practical consequence at this low rate is small: the Poisson and negative-binomial 95% capacities coincide (3 incidents per day) and the Poisson capacity is exceeded on 3.5% of days, below the 5% target. This agrees with Proposition 2: over-dispersion is statistically clear but φ = 1 + λc² remains modest (about 1.2-1.5 here, from the stratified indices) when λ is below one per day, and it becomes consequential only at higher rates.</w:t>
+        <w:t xml:space="preserve"> Between March 2023 and August 2024 the three providers declared 457 incidents (0.83 per day; OpenAI 0.51, Anthropic 0.26). Incident starts are strongly non-homogeneous: the mean weekday count is 4.1 times the mean weekend count and hour-of-day homogeneity is rejected (p &lt; 10⁻⁴ for every provider and subset). A homogeneous Poisson model is rejected on every inter-arrival and dispersion test. Allowing for weekly and daily seasonality removes part of the lack of fit but not all of it: the daily index of dispersion is 1.53 (p = 3×10⁻14) and still 1.30 after stratifying by day of week (p = 6×10⁻6); for OpenAI alone the time-rescaled inter-arrival test is consistent with an NHPP (p = 0.23) but its stratified index is still 1.19 (p = 0.003), while for Anthropic and for the major and critical subset both are rejected. A negative-binomial fit to daily counts gives r ≈ 1.6. Part of this over-dispersion may come from a changing incident rate over the 18 months, which a weekday-stratified test does not remove (Section 5.8 adjusts the baseline for it). The practical consequence at this low rate is small: the Poisson and negative-binomial 95% capacities coincide (3 incidents per day) and the Poisson capacity is exceeded on 3.5% of days, below the 5% target. This agrees with Proposition 2: over-dispersion is statistically clear but φ = 1 + λc² remains modest (about 1.2-1.5 here, from the stratified indices) when λ is below one per day, and it becomes consequential only at higher rates.</w:t>
       </w:r>
     </w:p>
     <w:p>
@@ -14322,7 +15018,7 @@
           <w:sz w:val="22"/>
           <w:szCs w:val="22"/>
         </w:rPr>
-        <w:t xml:space="preserve"> The only public, dated log of hallucination incidents we found is a curated database of court decisions in which a party relied on AI-fabricated content (Charlotin; 2,149 dated cases, 2023-04-14 to 2026-10-01). It is legal-domain only, the date is the decision date at day resolution, and detection and reporting bias is strong: counts grew from a handful per month to over a hundred in 2025, so only the flatter period from October 2025 to August 2026 (1,527 cases, 6.3 per weekday, weekend rate 0.04 of the weekday rate; the latest, incomplete month is excluded) is analysed. In that period the weekday counts are over-dispersed relative to Poisson (day-of-week-stratified index 1.40, p = 1×10⁻4; daily-rate CV net of trend 0.24), but at this rate the effect on capacity is small: a Poisson plan against the local mean is exceeded on 6.3% of weekdays (5.6% with a causal trailing-mean plan) and a negative-binomial plan on 4.2%. This is consistent with Proposition 2 and with the other low-rate streams, and it is, to our knowledge, the only dispersion estimate for dated hallucination incidents that public data allow, with the caveats above.</w:t>
+        <w:t xml:space="preserve"> The only public, dated log of hallucination incidents we found is a curated database of court decisions in which a party relied on AI-fabricated content (Charlotin; 2,149 dated cases, 2023-04-14 to 2026-10-01). It is legal-domain only, the date is the decision date at day resolution, and detection and reporting bias is strong: counts grew from a handful per month to over a hundred in 2025, so only the flatter period from October 2025 to August 2026 (1,527 cases, 6.3 per weekday, weekend rate 0.04 of the weekday rate) is analysed; September 2026 (95 cases) and October 2026 (1 case) are excluded because recent months are incomplete (reporting lag). In that period the weekday counts are over-dispersed relative to Poisson (day-of-week-stratified index 1.40, p = 1×10⁻4; daily-rate CV net of trend 0.24), but part of this comes from the 10 US federal-holiday weekdays (mean count about 1.6 against 6.3); without them the index is 1.25 (p = 0.012) and the CV 0.18, a weak over-dispersion. At this rate the effect on capacity is small: the 95% capacity is 11 under Poisson and 12 under a negative binomial with the stratified dispersion index; a Poisson plan against the local mean is exceeded on 6.3% of weekdays (5.6% with a causal trailing-mean plan; 4.4% and 5.9% without the holidays). This is consistent with Proposition 2 and with the other low-rate streams, and it is, to our knowledge, the only dispersion estimate for dated hallucination incidents that public data allow, with the caveats above.</w:t>
       </w:r>
     </w:p>
     <w:p>
@@ -14354,7 +15050,7 @@
           <w:sz w:val="22"/>
           <w:szCs w:val="22"/>
         </w:rPr>
-        <w:t xml:space="preserve">The third family of public data concerns what happens after an incident is detected: how tickets arrive at, and are worked by, human teams in real organisations. The streams are customer-support and IT-incident tickets, not LLM incidents, but they are the best available public evidence on the arrival variability and the service-time distribution of human triage. The ServiceNow log is only useful for arrivals in its stationary middle weeks (98.9% of its incidents are opened between 29 February and 1 June 2016), so that stream is a 12-week segment.</w:t>
+        <w:t xml:space="preserve">The fourth family of public data concerns what happens after an incident is detected: how tickets arrive at, and are worked by, human teams in real organisations. The streams are customer-support and IT-incident tickets, not LLM incidents, but they are the best available public evidence on the arrival variability and the service-time distribution of human triage. The ServiceNow log is useful for arrivals only in its middle weeks (98.9% of its incidents are opened between 29 February and 1 June 2016), so that stream is a 12-week segment. Holidays and bridge days appear as isolated low-count days that a local mean cannot absorb; each stream is therefore analysed twice, with all work days and with such days excluded by the rules of Section 4.5 (arrow notation: all days → excluded).</w:t>
       </w:r>
     </w:p>
     <w:p>
@@ -14375,7 +15071,7 @@
     </w:p>
     <w:tbl>
       <w:tblPr>
-        <w:tblW w:type="dxa" w:w="9360"/>
+        <w:tblW w:type="dxa" w:w="9000"/>
         <w:tblBorders>
           <w:top w:val="single" w:color="auto" w:sz="4"/>
           <w:left w:val="single" w:color="auto" w:sz="4"/>
@@ -14386,14 +15082,14 @@
         </w:tblBorders>
       </w:tblPr>
       <w:tblGrid>
-        <w:gridCol w:w="1900"/>
-        <w:gridCol w:w="1100"/>
-        <w:gridCol w:w="1100"/>
+        <w:gridCol w:w="1500"/>
+        <w:gridCol w:w="1000"/>
+        <w:gridCol w:w="1150"/>
         <w:gridCol w:w="1100"/>
         <w:gridCol w:w="1250"/>
-        <w:gridCol w:w="950"/>
         <w:gridCol w:w="1050"/>
-        <w:gridCol w:w="910"/>
+        <w:gridCol w:w="1050"/>
+        <w:gridCol w:w="900"/>
       </w:tblGrid>
       <w:tr>
         <w:trPr>
@@ -14401,7 +15097,7 @@
         </w:trPr>
         <w:tc>
           <w:tcPr>
-            <w:tcW w:type="dxa" w:w="1900"/>
+            <w:tcW w:type="dxa" w:w="1500"/>
             <w:tcBorders>
               <w:top w:val="single" w:color="AAAAAA" w:sz="4"/>
               <w:left w:val="single" w:color="AAAAAA" w:sz="4"/>
@@ -14434,7 +15130,7 @@
         </w:tc>
         <w:tc>
           <w:tcPr>
-            <w:tcW w:type="dxa" w:w="1100"/>
+            <w:tcW w:type="dxa" w:w="1000"/>
             <w:tcBorders>
               <w:top w:val="single" w:color="AAAAAA" w:sz="4"/>
               <w:left w:val="single" w:color="AAAAAA" w:sz="4"/>
@@ -14467,7 +15163,7 @@
         </w:tc>
         <w:tc>
           <w:tcPr>
-            <w:tcW w:type="dxa" w:w="1100"/>
+            <w:tcW w:type="dxa" w:w="1150"/>
             <w:tcBorders>
               <w:top w:val="single" w:color="AAAAAA" w:sz="4"/>
               <w:left w:val="single" w:color="AAAAAA" w:sz="4"/>
@@ -14494,7 +15190,7 @@
                 <w:sz w:val="18"/>
                 <w:szCs w:val="18"/>
               </w:rPr>
-              <w:t xml:space="preserve">Work-day-stratified dispersion index</w:t>
+              <w:t xml:space="preserve">Work-day-stratified dispersion index (includes slow trends)</w:t>
             </w:r>
           </w:p>
         </w:tc>
@@ -14566,7 +15262,7 @@
         </w:tc>
         <w:tc>
           <w:tcPr>
-            <w:tcW w:type="dxa" w:w="950"/>
+            <w:tcW w:type="dxa" w:w="1050"/>
             <w:tcBorders>
               <w:top w:val="single" w:color="AAAAAA" w:sz="4"/>
               <w:left w:val="single" w:color="AAAAAA" w:sz="4"/>
@@ -14632,7 +15328,7 @@
         </w:tc>
         <w:tc>
           <w:tcPr>
-            <w:tcW w:type="dxa" w:w="910"/>
+            <w:tcW w:type="dxa" w:w="900"/>
             <w:tcBorders>
               <w:top w:val="single" w:color="AAAAAA" w:sz="4"/>
               <w:left w:val="single" w:color="AAAAAA" w:sz="4"/>
@@ -14667,7 +15363,7 @@
       <w:tr>
         <w:tc>
           <w:tcPr>
-            <w:tcW w:type="dxa" w:w="1900"/>
+            <w:tcW w:type="dxa" w:w="1500"/>
             <w:tcBorders>
               <w:top w:val="single" w:color="AAAAAA" w:sz="4"/>
               <w:left w:val="single" w:color="AAAAAA" w:sz="4"/>
@@ -14699,6 +15395,70 @@
         </w:tc>
         <w:tc>
           <w:tcPr>
+            <w:tcW w:type="dxa" w:w="1000"/>
+            <w:tcBorders>
+              <w:top w:val="single" w:color="AAAAAA" w:sz="4"/>
+              <w:left w:val="single" w:color="AAAAAA" w:sz="4"/>
+              <w:bottom w:val="single" w:color="AAAAAA" w:sz="4"/>
+              <w:right w:val="single" w:color="AAAAAA" w:sz="4"/>
+            </w:tcBorders>
+            <w:tcMar>
+              <w:top w:type="dxa" w:w="40"/>
+              <w:left w:type="dxa" w:w="80"/>
+              <w:bottom w:type="dxa" w:w="40"/>
+              <w:right w:type="dxa" w:w="80"/>
+            </w:tcMar>
+          </w:tcPr>
+          <w:p>
+            <w:pPr>
+              <w:jc w:val="center"/>
+            </w:pPr>
+            <w:r>
+              <w:rPr>
+                <w:rFonts w:ascii="Times New Roman" w:cs="Times New Roman" w:eastAsia="Times New Roman" w:hAnsi="Times New Roman"/>
+                <w:b w:val="false"/>
+                <w:bCs w:val="false"/>
+                <w:sz w:val="18"/>
+                <w:szCs w:val="18"/>
+              </w:rPr>
+              <w:t xml:space="preserve">22,016 (13.1)</w:t>
+            </w:r>
+          </w:p>
+        </w:tc>
+        <w:tc>
+          <w:tcPr>
+            <w:tcW w:type="dxa" w:w="1150"/>
+            <w:tcBorders>
+              <w:top w:val="single" w:color="AAAAAA" w:sz="4"/>
+              <w:left w:val="single" w:color="AAAAAA" w:sz="4"/>
+              <w:bottom w:val="single" w:color="AAAAAA" w:sz="4"/>
+              <w:right w:val="single" w:color="AAAAAA" w:sz="4"/>
+            </w:tcBorders>
+            <w:tcMar>
+              <w:top w:type="dxa" w:w="40"/>
+              <w:left w:type="dxa" w:w="80"/>
+              <w:bottom w:type="dxa" w:w="40"/>
+              <w:right w:type="dxa" w:w="80"/>
+            </w:tcMar>
+          </w:tcPr>
+          <w:p>
+            <w:pPr>
+              <w:jc w:val="center"/>
+            </w:pPr>
+            <w:r>
+              <w:rPr>
+                <w:rFonts w:ascii="Times New Roman" w:cs="Times New Roman" w:eastAsia="Times New Roman" w:hAnsi="Times New Roman"/>
+                <w:b w:val="false"/>
+                <w:bCs w:val="false"/>
+                <w:sz w:val="18"/>
+                <w:szCs w:val="18"/>
+              </w:rPr>
+              <w:t xml:space="preserve">3.5 → 3.1</w:t>
+            </w:r>
+          </w:p>
+        </w:tc>
+        <w:tc>
+          <w:tcPr>
             <w:tcW w:type="dxa" w:w="1100"/>
             <w:tcBorders>
               <w:top w:val="single" w:color="AAAAAA" w:sz="4"/>
@@ -14725,71 +15485,7 @@
                 <w:sz w:val="18"/>
                 <w:szCs w:val="18"/>
               </w:rPr>
-              <w:t xml:space="preserve">22,016 (13.1)</w:t>
-            </w:r>
-          </w:p>
-        </w:tc>
-        <w:tc>
-          <w:tcPr>
-            <w:tcW w:type="dxa" w:w="1100"/>
-            <w:tcBorders>
-              <w:top w:val="single" w:color="AAAAAA" w:sz="4"/>
-              <w:left w:val="single" w:color="AAAAAA" w:sz="4"/>
-              <w:bottom w:val="single" w:color="AAAAAA" w:sz="4"/>
-              <w:right w:val="single" w:color="AAAAAA" w:sz="4"/>
-            </w:tcBorders>
-            <w:tcMar>
-              <w:top w:type="dxa" w:w="40"/>
-              <w:left w:type="dxa" w:w="80"/>
-              <w:bottom w:type="dxa" w:w="40"/>
-              <w:right w:type="dxa" w:w="80"/>
-            </w:tcMar>
-          </w:tcPr>
-          <w:p>
-            <w:pPr>
-              <w:jc w:val="center"/>
-            </w:pPr>
-            <w:r>
-              <w:rPr>
-                <w:rFonts w:ascii="Times New Roman" w:cs="Times New Roman" w:eastAsia="Times New Roman" w:hAnsi="Times New Roman"/>
-                <w:b w:val="false"/>
-                <w:bCs w:val="false"/>
-                <w:sz w:val="18"/>
-                <w:szCs w:val="18"/>
-              </w:rPr>
-              <w:t xml:space="preserve">3.5</w:t>
-            </w:r>
-          </w:p>
-        </w:tc>
-        <w:tc>
-          <w:tcPr>
-            <w:tcW w:type="dxa" w:w="1100"/>
-            <w:tcBorders>
-              <w:top w:val="single" w:color="AAAAAA" w:sz="4"/>
-              <w:left w:val="single" w:color="AAAAAA" w:sz="4"/>
-              <w:bottom w:val="single" w:color="AAAAAA" w:sz="4"/>
-              <w:right w:val="single" w:color="AAAAAA" w:sz="4"/>
-            </w:tcBorders>
-            <w:tcMar>
-              <w:top w:type="dxa" w:w="40"/>
-              <w:left w:type="dxa" w:w="80"/>
-              <w:bottom w:type="dxa" w:w="40"/>
-              <w:right w:type="dxa" w:w="80"/>
-            </w:tcMar>
-          </w:tcPr>
-          <w:p>
-            <w:pPr>
-              <w:jc w:val="center"/>
-            </w:pPr>
-            <w:r>
-              <w:rPr>
-                <w:rFonts w:ascii="Times New Roman" w:cs="Times New Roman" w:eastAsia="Times New Roman" w:hAnsi="Times New Roman"/>
-                <w:b w:val="false"/>
-                <w:bCs w:val="false"/>
-                <w:sz w:val="18"/>
-                <w:szCs w:val="18"/>
-              </w:rPr>
-              <w:t xml:space="preserve">0.32</w:t>
+              <w:t xml:space="preserve">0.32 → 0.27</w:t>
             </w:r>
           </w:p>
         </w:tc>
@@ -14821,39 +15517,7 @@
                 <w:sz w:val="18"/>
                 <w:szCs w:val="18"/>
               </w:rPr>
-              <w:t xml:space="preserve">9.0%</w:t>
-            </w:r>
-          </w:p>
-        </w:tc>
-        <w:tc>
-          <w:tcPr>
-            <w:tcW w:type="dxa" w:w="950"/>
-            <w:tcBorders>
-              <w:top w:val="single" w:color="AAAAAA" w:sz="4"/>
-              <w:left w:val="single" w:color="AAAAAA" w:sz="4"/>
-              <w:bottom w:val="single" w:color="AAAAAA" w:sz="4"/>
-              <w:right w:val="single" w:color="AAAAAA" w:sz="4"/>
-            </w:tcBorders>
-            <w:tcMar>
-              <w:top w:type="dxa" w:w="40"/>
-              <w:left w:type="dxa" w:w="80"/>
-              <w:bottom w:type="dxa" w:w="40"/>
-              <w:right w:type="dxa" w:w="80"/>
-            </w:tcMar>
-          </w:tcPr>
-          <w:p>
-            <w:pPr>
-              <w:jc w:val="center"/>
-            </w:pPr>
-            <w:r>
-              <w:rPr>
-                <w:rFonts w:ascii="Times New Roman" w:cs="Times New Roman" w:eastAsia="Times New Roman" w:hAnsi="Times New Roman"/>
-                <w:b w:val="false"/>
-                <w:bCs w:val="false"/>
-                <w:sz w:val="18"/>
-                <w:szCs w:val="18"/>
-              </w:rPr>
-              <w:t xml:space="preserve">3.4%</w:t>
+              <w:t xml:space="preserve">9.0% → 7.8%</w:t>
             </w:r>
           </w:p>
         </w:tc>
@@ -14885,39 +15549,71 @@
                 <w:sz w:val="18"/>
                 <w:szCs w:val="18"/>
               </w:rPr>
-              <w:t xml:space="preserve">9.6%</w:t>
-            </w:r>
-          </w:p>
-        </w:tc>
-        <w:tc>
-          <w:tcPr>
-            <w:tcW w:type="dxa" w:w="910"/>
-            <w:tcBorders>
-              <w:top w:val="single" w:color="AAAAAA" w:sz="4"/>
-              <w:left w:val="single" w:color="AAAAAA" w:sz="4"/>
-              <w:bottom w:val="single" w:color="AAAAAA" w:sz="4"/>
-              <w:right w:val="single" w:color="AAAAAA" w:sz="4"/>
-            </w:tcBorders>
-            <w:tcMar>
-              <w:top w:type="dxa" w:w="40"/>
-              <w:left w:type="dxa" w:w="80"/>
-              <w:bottom w:type="dxa" w:w="40"/>
-              <w:right w:type="dxa" w:w="80"/>
-            </w:tcMar>
-          </w:tcPr>
-          <w:p>
-            <w:pPr>
-              <w:jc w:val="center"/>
-            </w:pPr>
-            <w:r>
-              <w:rPr>
-                <w:rFonts w:ascii="Times New Roman" w:cs="Times New Roman" w:eastAsia="Times New Roman" w:hAnsi="Times New Roman"/>
-                <w:b w:val="false"/>
-                <w:bCs w:val="false"/>
-                <w:sz w:val="18"/>
-                <w:szCs w:val="18"/>
-              </w:rPr>
-              <w:t xml:space="preserve">1.9%</w:t>
+              <w:t xml:space="preserve">3.4% → 4.0%</w:t>
+            </w:r>
+          </w:p>
+        </w:tc>
+        <w:tc>
+          <w:tcPr>
+            <w:tcW w:type="dxa" w:w="1050"/>
+            <w:tcBorders>
+              <w:top w:val="single" w:color="AAAAAA" w:sz="4"/>
+              <w:left w:val="single" w:color="AAAAAA" w:sz="4"/>
+              <w:bottom w:val="single" w:color="AAAAAA" w:sz="4"/>
+              <w:right w:val="single" w:color="AAAAAA" w:sz="4"/>
+            </w:tcBorders>
+            <w:tcMar>
+              <w:top w:type="dxa" w:w="40"/>
+              <w:left w:type="dxa" w:w="80"/>
+              <w:bottom w:type="dxa" w:w="40"/>
+              <w:right w:type="dxa" w:w="80"/>
+            </w:tcMar>
+          </w:tcPr>
+          <w:p>
+            <w:pPr>
+              <w:jc w:val="center"/>
+            </w:pPr>
+            <w:r>
+              <w:rPr>
+                <w:rFonts w:ascii="Times New Roman" w:cs="Times New Roman" w:eastAsia="Times New Roman" w:hAnsi="Times New Roman"/>
+                <w:b w:val="false"/>
+                <w:bCs w:val="false"/>
+                <w:sz w:val="18"/>
+                <w:szCs w:val="18"/>
+              </w:rPr>
+              <w:t xml:space="preserve">9.6% → 8.6%</w:t>
+            </w:r>
+          </w:p>
+        </w:tc>
+        <w:tc>
+          <w:tcPr>
+            <w:tcW w:type="dxa" w:w="900"/>
+            <w:tcBorders>
+              <w:top w:val="single" w:color="AAAAAA" w:sz="4"/>
+              <w:left w:val="single" w:color="AAAAAA" w:sz="4"/>
+              <w:bottom w:val="single" w:color="AAAAAA" w:sz="4"/>
+              <w:right w:val="single" w:color="AAAAAA" w:sz="4"/>
+            </w:tcBorders>
+            <w:tcMar>
+              <w:top w:type="dxa" w:w="40"/>
+              <w:left w:type="dxa" w:w="80"/>
+              <w:bottom w:type="dxa" w:w="40"/>
+              <w:right w:type="dxa" w:w="80"/>
+            </w:tcMar>
+          </w:tcPr>
+          <w:p>
+            <w:pPr>
+              <w:jc w:val="center"/>
+            </w:pPr>
+            <w:r>
+              <w:rPr>
+                <w:rFonts w:ascii="Times New Roman" w:cs="Times New Roman" w:eastAsia="Times New Roman" w:hAnsi="Times New Roman"/>
+                <w:b w:val="false"/>
+                <w:bCs w:val="false"/>
+                <w:sz w:val="18"/>
+                <w:szCs w:val="18"/>
+              </w:rPr>
+              <w:t xml:space="preserve">1.9% → 2.5%</w:t>
             </w:r>
           </w:p>
         </w:tc>
@@ -14925,7 +15621,7 @@
       <w:tr>
         <w:tc>
           <w:tcPr>
-            <w:tcW w:type="dxa" w:w="1900"/>
+            <w:tcW w:type="dxa" w:w="1500"/>
             <w:tcBorders>
               <w:top w:val="single" w:color="AAAAAA" w:sz="4"/>
               <w:left w:val="single" w:color="AAAAAA" w:sz="4"/>
@@ -14957,6 +15653,70 @@
         </w:tc>
         <w:tc>
           <w:tcPr>
+            <w:tcW w:type="dxa" w:w="1000"/>
+            <w:tcBorders>
+              <w:top w:val="single" w:color="AAAAAA" w:sz="4"/>
+              <w:left w:val="single" w:color="AAAAAA" w:sz="4"/>
+              <w:bottom w:val="single" w:color="AAAAAA" w:sz="4"/>
+              <w:right w:val="single" w:color="AAAAAA" w:sz="4"/>
+            </w:tcBorders>
+            <w:tcMar>
+              <w:top w:type="dxa" w:w="40"/>
+              <w:left w:type="dxa" w:w="80"/>
+              <w:bottom w:type="dxa" w:w="40"/>
+              <w:right w:type="dxa" w:w="80"/>
+            </w:tcMar>
+          </w:tcPr>
+          <w:p>
+            <w:pPr>
+              <w:jc w:val="center"/>
+            </w:pPr>
+            <w:r>
+              <w:rPr>
+                <w:rFonts w:ascii="Times New Roman" w:cs="Times New Roman" w:eastAsia="Times New Roman" w:hAnsi="Times New Roman"/>
+                <w:b w:val="false"/>
+                <w:bCs w:val="false"/>
+                <w:sz w:val="18"/>
+                <w:szCs w:val="18"/>
+              </w:rPr>
+              <w:t xml:space="preserve">22,035 (350.2)</w:t>
+            </w:r>
+          </w:p>
+        </w:tc>
+        <w:tc>
+          <w:tcPr>
+            <w:tcW w:type="dxa" w:w="1150"/>
+            <w:tcBorders>
+              <w:top w:val="single" w:color="AAAAAA" w:sz="4"/>
+              <w:left w:val="single" w:color="AAAAAA" w:sz="4"/>
+              <w:bottom w:val="single" w:color="AAAAAA" w:sz="4"/>
+              <w:right w:val="single" w:color="AAAAAA" w:sz="4"/>
+            </w:tcBorders>
+            <w:tcMar>
+              <w:top w:type="dxa" w:w="40"/>
+              <w:left w:type="dxa" w:w="80"/>
+              <w:bottom w:type="dxa" w:w="40"/>
+              <w:right w:type="dxa" w:w="80"/>
+            </w:tcMar>
+          </w:tcPr>
+          <w:p>
+            <w:pPr>
+              <w:jc w:val="center"/>
+            </w:pPr>
+            <w:r>
+              <w:rPr>
+                <w:rFonts w:ascii="Times New Roman" w:cs="Times New Roman" w:eastAsia="Times New Roman" w:hAnsi="Times New Roman"/>
+                <w:b w:val="false"/>
+                <w:bCs w:val="false"/>
+                <w:sz w:val="18"/>
+                <w:szCs w:val="18"/>
+              </w:rPr>
+              <w:t xml:space="preserve">25.2 → 5.9</w:t>
+            </w:r>
+          </w:p>
+        </w:tc>
+        <w:tc>
+          <w:tcPr>
             <w:tcW w:type="dxa" w:w="1100"/>
             <w:tcBorders>
               <w:top w:val="single" w:color="AAAAAA" w:sz="4"/>
@@ -14983,71 +15743,7 @@
                 <w:sz w:val="18"/>
                 <w:szCs w:val="18"/>
               </w:rPr>
-              <w:t xml:space="preserve">22,035 (350.2)</w:t>
-            </w:r>
-          </w:p>
-        </w:tc>
-        <w:tc>
-          <w:tcPr>
-            <w:tcW w:type="dxa" w:w="1100"/>
-            <w:tcBorders>
-              <w:top w:val="single" w:color="AAAAAA" w:sz="4"/>
-              <w:left w:val="single" w:color="AAAAAA" w:sz="4"/>
-              <w:bottom w:val="single" w:color="AAAAAA" w:sz="4"/>
-              <w:right w:val="single" w:color="AAAAAA" w:sz="4"/>
-            </w:tcBorders>
-            <w:tcMar>
-              <w:top w:type="dxa" w:w="40"/>
-              <w:left w:type="dxa" w:w="80"/>
-              <w:bottom w:type="dxa" w:w="40"/>
-              <w:right w:type="dxa" w:w="80"/>
-            </w:tcMar>
-          </w:tcPr>
-          <w:p>
-            <w:pPr>
-              <w:jc w:val="center"/>
-            </w:pPr>
-            <w:r>
-              <w:rPr>
-                <w:rFonts w:ascii="Times New Roman" w:cs="Times New Roman" w:eastAsia="Times New Roman" w:hAnsi="Times New Roman"/>
-                <w:b w:val="false"/>
-                <w:bCs w:val="false"/>
-                <w:sz w:val="18"/>
-                <w:szCs w:val="18"/>
-              </w:rPr>
-              <w:t xml:space="preserve">25.2</w:t>
-            </w:r>
-          </w:p>
-        </w:tc>
-        <w:tc>
-          <w:tcPr>
-            <w:tcW w:type="dxa" w:w="1100"/>
-            <w:tcBorders>
-              <w:top w:val="single" w:color="AAAAAA" w:sz="4"/>
-              <w:left w:val="single" w:color="AAAAAA" w:sz="4"/>
-              <w:bottom w:val="single" w:color="AAAAAA" w:sz="4"/>
-              <w:right w:val="single" w:color="AAAAAA" w:sz="4"/>
-            </w:tcBorders>
-            <w:tcMar>
-              <w:top w:type="dxa" w:w="40"/>
-              <w:left w:type="dxa" w:w="80"/>
-              <w:bottom w:type="dxa" w:w="40"/>
-              <w:right w:type="dxa" w:w="80"/>
-            </w:tcMar>
-          </w:tcPr>
-          <w:p>
-            <w:pPr>
-              <w:jc w:val="center"/>
-            </w:pPr>
-            <w:r>
-              <w:rPr>
-                <w:rFonts w:ascii="Times New Roman" w:cs="Times New Roman" w:eastAsia="Times New Roman" w:hAnsi="Times New Roman"/>
-                <w:b w:val="false"/>
-                <w:bCs w:val="false"/>
-                <w:sz w:val="18"/>
-                <w:szCs w:val="18"/>
-              </w:rPr>
-              <w:t xml:space="preserve">0.25</w:t>
+              <w:t xml:space="preserve">0.25 → 0.10</w:t>
             </w:r>
           </w:p>
         </w:tc>
@@ -15079,39 +15775,7 @@
                 <w:sz w:val="18"/>
                 <w:szCs w:val="18"/>
               </w:rPr>
-              <w:t xml:space="preserve">35.0%</w:t>
-            </w:r>
-          </w:p>
-        </w:tc>
-        <w:tc>
-          <w:tcPr>
-            <w:tcW w:type="dxa" w:w="950"/>
-            <w:tcBorders>
-              <w:top w:val="single" w:color="AAAAAA" w:sz="4"/>
-              <w:left w:val="single" w:color="AAAAAA" w:sz="4"/>
-              <w:bottom w:val="single" w:color="AAAAAA" w:sz="4"/>
-              <w:right w:val="single" w:color="AAAAAA" w:sz="4"/>
-            </w:tcBorders>
-            <w:tcMar>
-              <w:top w:type="dxa" w:w="40"/>
-              <w:left w:type="dxa" w:w="80"/>
-              <w:bottom w:type="dxa" w:w="40"/>
-              <w:right w:type="dxa" w:w="80"/>
-            </w:tcMar>
-          </w:tcPr>
-          <w:p>
-            <w:pPr>
-              <w:jc w:val="center"/>
-            </w:pPr>
-            <w:r>
-              <w:rPr>
-                <w:rFonts w:ascii="Times New Roman" w:cs="Times New Roman" w:eastAsia="Times New Roman" w:hAnsi="Times New Roman"/>
-                <w:b w:val="false"/>
-                <w:bCs w:val="false"/>
-                <w:sz w:val="18"/>
-                <w:szCs w:val="18"/>
-              </w:rPr>
-              <w:t xml:space="preserve">1.7%</w:t>
+              <w:t xml:space="preserve">35.0% → 20.0%</w:t>
             </w:r>
           </w:p>
         </w:tc>
@@ -15143,39 +15807,71 @@
                 <w:sz w:val="18"/>
                 <w:szCs w:val="18"/>
               </w:rPr>
-              <w:t xml:space="preserve">15.0% (20 days)</w:t>
-            </w:r>
-          </w:p>
-        </w:tc>
-        <w:tc>
-          <w:tcPr>
-            <w:tcW w:type="dxa" w:w="910"/>
-            <w:tcBorders>
-              <w:top w:val="single" w:color="AAAAAA" w:sz="4"/>
-              <w:left w:val="single" w:color="AAAAAA" w:sz="4"/>
-              <w:bottom w:val="single" w:color="AAAAAA" w:sz="4"/>
-              <w:right w:val="single" w:color="AAAAAA" w:sz="4"/>
-            </w:tcBorders>
-            <w:tcMar>
-              <w:top w:type="dxa" w:w="40"/>
-              <w:left w:type="dxa" w:w="80"/>
-              <w:bottom w:type="dxa" w:w="40"/>
-              <w:right w:type="dxa" w:w="80"/>
-            </w:tcMar>
-          </w:tcPr>
-          <w:p>
-            <w:pPr>
-              <w:jc w:val="center"/>
-            </w:pPr>
-            <w:r>
-              <w:rPr>
-                <w:rFonts w:ascii="Times New Roman" w:cs="Times New Roman" w:eastAsia="Times New Roman" w:hAnsi="Times New Roman"/>
-                <w:b w:val="false"/>
-                <w:bCs w:val="false"/>
-                <w:sz w:val="18"/>
-                <w:szCs w:val="18"/>
-              </w:rPr>
-              <w:t xml:space="preserve">0.0%</w:t>
+              <w:t xml:space="preserve">1.7% → 5.5%</w:t>
+            </w:r>
+          </w:p>
+        </w:tc>
+        <w:tc>
+          <w:tcPr>
+            <w:tcW w:type="dxa" w:w="1050"/>
+            <w:tcBorders>
+              <w:top w:val="single" w:color="AAAAAA" w:sz="4"/>
+              <w:left w:val="single" w:color="AAAAAA" w:sz="4"/>
+              <w:bottom w:val="single" w:color="AAAAAA" w:sz="4"/>
+              <w:right w:val="single" w:color="AAAAAA" w:sz="4"/>
+            </w:tcBorders>
+            <w:tcMar>
+              <w:top w:type="dxa" w:w="40"/>
+              <w:left w:type="dxa" w:w="80"/>
+              <w:bottom w:type="dxa" w:w="40"/>
+              <w:right w:type="dxa" w:w="80"/>
+            </w:tcMar>
+          </w:tcPr>
+          <w:p>
+            <w:pPr>
+              <w:jc w:val="center"/>
+            </w:pPr>
+            <w:r>
+              <w:rPr>
+                <w:rFonts w:ascii="Times New Roman" w:cs="Times New Roman" w:eastAsia="Times New Roman" w:hAnsi="Times New Roman"/>
+                <w:b w:val="false"/>
+                <w:bCs w:val="false"/>
+                <w:sz w:val="18"/>
+                <w:szCs w:val="18"/>
+              </w:rPr>
+              <w:t xml:space="preserve">15.0% → 6.7% (20 → 15 days)</w:t>
+            </w:r>
+          </w:p>
+        </w:tc>
+        <w:tc>
+          <w:tcPr>
+            <w:tcW w:type="dxa" w:w="900"/>
+            <w:tcBorders>
+              <w:top w:val="single" w:color="AAAAAA" w:sz="4"/>
+              <w:left w:val="single" w:color="AAAAAA" w:sz="4"/>
+              <w:bottom w:val="single" w:color="AAAAAA" w:sz="4"/>
+              <w:right w:val="single" w:color="AAAAAA" w:sz="4"/>
+            </w:tcBorders>
+            <w:tcMar>
+              <w:top w:type="dxa" w:w="40"/>
+              <w:left w:type="dxa" w:w="80"/>
+              <w:bottom w:type="dxa" w:w="40"/>
+              <w:right w:type="dxa" w:w="80"/>
+            </w:tcMar>
+          </w:tcPr>
+          <w:p>
+            <w:pPr>
+              <w:jc w:val="center"/>
+            </w:pPr>
+            <w:r>
+              <w:rPr>
+                <w:rFonts w:ascii="Times New Roman" w:cs="Times New Roman" w:eastAsia="Times New Roman" w:hAnsi="Times New Roman"/>
+                <w:b w:val="false"/>
+                <w:bCs w:val="false"/>
+                <w:sz w:val="18"/>
+                <w:szCs w:val="18"/>
+              </w:rPr>
+              <w:t xml:space="preserve">0.0% → 0.0%</w:t>
             </w:r>
           </w:p>
         </w:tc>
@@ -15183,7 +15879,7 @@
       <w:tr>
         <w:tc>
           <w:tcPr>
-            <w:tcW w:type="dxa" w:w="1900"/>
+            <w:tcW w:type="dxa" w:w="1500"/>
             <w:tcBorders>
               <w:top w:val="single" w:color="AAAAAA" w:sz="4"/>
               <w:left w:val="single" w:color="AAAAAA" w:sz="4"/>
@@ -15215,6 +15911,70 @@
         </w:tc>
         <w:tc>
           <w:tcPr>
+            <w:tcW w:type="dxa" w:w="1000"/>
+            <w:tcBorders>
+              <w:top w:val="single" w:color="AAAAAA" w:sz="4"/>
+              <w:left w:val="single" w:color="AAAAAA" w:sz="4"/>
+              <w:bottom w:val="single" w:color="AAAAAA" w:sz="4"/>
+              <w:right w:val="single" w:color="AAAAAA" w:sz="4"/>
+            </w:tcBorders>
+            <w:tcMar>
+              <w:top w:type="dxa" w:w="40"/>
+              <w:left w:type="dxa" w:w="80"/>
+              <w:bottom w:type="dxa" w:w="40"/>
+              <w:right w:type="dxa" w:w="80"/>
+            </w:tcMar>
+          </w:tcPr>
+          <w:p>
+            <w:pPr>
+              <w:jc w:val="center"/>
+            </w:pPr>
+            <w:r>
+              <w:rPr>
+                <w:rFonts w:ascii="Times New Roman" w:cs="Times New Roman" w:eastAsia="Times New Roman" w:hAnsi="Times New Roman"/>
+                <w:b w:val="false"/>
+                <w:bCs w:val="false"/>
+                <w:sz w:val="18"/>
+                <w:szCs w:val="18"/>
+              </w:rPr>
+              <w:t xml:space="preserve">3,804 (5.3)</w:t>
+            </w:r>
+          </w:p>
+        </w:tc>
+        <w:tc>
+          <w:tcPr>
+            <w:tcW w:type="dxa" w:w="1150"/>
+            <w:tcBorders>
+              <w:top w:val="single" w:color="AAAAAA" w:sz="4"/>
+              <w:left w:val="single" w:color="AAAAAA" w:sz="4"/>
+              <w:bottom w:val="single" w:color="AAAAAA" w:sz="4"/>
+              <w:right w:val="single" w:color="AAAAAA" w:sz="4"/>
+            </w:tcBorders>
+            <w:tcMar>
+              <w:top w:type="dxa" w:w="40"/>
+              <w:left w:type="dxa" w:w="80"/>
+              <w:bottom w:type="dxa" w:w="40"/>
+              <w:right w:type="dxa" w:w="80"/>
+            </w:tcMar>
+          </w:tcPr>
+          <w:p>
+            <w:pPr>
+              <w:jc w:val="center"/>
+            </w:pPr>
+            <w:r>
+              <w:rPr>
+                <w:rFonts w:ascii="Times New Roman" w:cs="Times New Roman" w:eastAsia="Times New Roman" w:hAnsi="Times New Roman"/>
+                <w:b w:val="false"/>
+                <w:bCs w:val="false"/>
+                <w:sz w:val="18"/>
+                <w:szCs w:val="18"/>
+              </w:rPr>
+              <w:t xml:space="preserve">2.5 → 2.4</w:t>
+            </w:r>
+          </w:p>
+        </w:tc>
+        <w:tc>
+          <w:tcPr>
             <w:tcW w:type="dxa" w:w="1100"/>
             <w:tcBorders>
               <w:top w:val="single" w:color="AAAAAA" w:sz="4"/>
@@ -15241,71 +16001,7 @@
                 <w:sz w:val="18"/>
                 <w:szCs w:val="18"/>
               </w:rPr>
-              <w:t xml:space="preserve">3,804 (5.3)</w:t>
-            </w:r>
-          </w:p>
-        </w:tc>
-        <w:tc>
-          <w:tcPr>
-            <w:tcW w:type="dxa" w:w="1100"/>
-            <w:tcBorders>
-              <w:top w:val="single" w:color="AAAAAA" w:sz="4"/>
-              <w:left w:val="single" w:color="AAAAAA" w:sz="4"/>
-              <w:bottom w:val="single" w:color="AAAAAA" w:sz="4"/>
-              <w:right w:val="single" w:color="AAAAAA" w:sz="4"/>
-            </w:tcBorders>
-            <w:tcMar>
-              <w:top w:type="dxa" w:w="40"/>
-              <w:left w:type="dxa" w:w="80"/>
-              <w:bottom w:type="dxa" w:w="40"/>
-              <w:right w:type="dxa" w:w="80"/>
-            </w:tcMar>
-          </w:tcPr>
-          <w:p>
-            <w:pPr>
-              <w:jc w:val="center"/>
-            </w:pPr>
-            <w:r>
-              <w:rPr>
-                <w:rFonts w:ascii="Times New Roman" w:cs="Times New Roman" w:eastAsia="Times New Roman" w:hAnsi="Times New Roman"/>
-                <w:b w:val="false"/>
-                <w:bCs w:val="false"/>
-                <w:sz w:val="18"/>
-                <w:szCs w:val="18"/>
-              </w:rPr>
-              <w:t xml:space="preserve">2.5</w:t>
-            </w:r>
-          </w:p>
-        </w:tc>
-        <w:tc>
-          <w:tcPr>
-            <w:tcW w:type="dxa" w:w="1100"/>
-            <w:tcBorders>
-              <w:top w:val="single" w:color="AAAAAA" w:sz="4"/>
-              <w:left w:val="single" w:color="AAAAAA" w:sz="4"/>
-              <w:bottom w:val="single" w:color="AAAAAA" w:sz="4"/>
-              <w:right w:val="single" w:color="AAAAAA" w:sz="4"/>
-            </w:tcBorders>
-            <w:tcMar>
-              <w:top w:type="dxa" w:w="40"/>
-              <w:left w:type="dxa" w:w="80"/>
-              <w:bottom w:type="dxa" w:w="40"/>
-              <w:right w:type="dxa" w:w="80"/>
-            </w:tcMar>
-          </w:tcPr>
-          <w:p>
-            <w:pPr>
-              <w:jc w:val="center"/>
-            </w:pPr>
-            <w:r>
-              <w:rPr>
-                <w:rFonts w:ascii="Times New Roman" w:cs="Times New Roman" w:eastAsia="Times New Roman" w:hAnsi="Times New Roman"/>
-                <w:b w:val="false"/>
-                <w:bCs w:val="false"/>
-                <w:sz w:val="18"/>
-                <w:szCs w:val="18"/>
-              </w:rPr>
-              <w:t xml:space="preserve">0.41</w:t>
+              <w:t xml:space="preserve">0.41 → 0.38</w:t>
             </w:r>
           </w:p>
         </w:tc>
@@ -15337,39 +16033,7 @@
                 <w:sz w:val="18"/>
                 <w:szCs w:val="18"/>
               </w:rPr>
-              <w:t xml:space="preserve">7.5%</w:t>
-            </w:r>
-          </w:p>
-        </w:tc>
-        <w:tc>
-          <w:tcPr>
-            <w:tcW w:type="dxa" w:w="950"/>
-            <w:tcBorders>
-              <w:top w:val="single" w:color="AAAAAA" w:sz="4"/>
-              <w:left w:val="single" w:color="AAAAAA" w:sz="4"/>
-              <w:bottom w:val="single" w:color="AAAAAA" w:sz="4"/>
-              <w:right w:val="single" w:color="AAAAAA" w:sz="4"/>
-            </w:tcBorders>
-            <w:tcMar>
-              <w:top w:type="dxa" w:w="40"/>
-              <w:left w:type="dxa" w:w="80"/>
-              <w:bottom w:type="dxa" w:w="40"/>
-              <w:right w:type="dxa" w:w="80"/>
-            </w:tcMar>
-          </w:tcPr>
-          <w:p>
-            <w:pPr>
-              <w:jc w:val="center"/>
-            </w:pPr>
-            <w:r>
-              <w:rPr>
-                <w:rFonts w:ascii="Times New Roman" w:cs="Times New Roman" w:eastAsia="Times New Roman" w:hAnsi="Times New Roman"/>
-                <w:b w:val="false"/>
-                <w:bCs w:val="false"/>
-                <w:sz w:val="18"/>
-                <w:szCs w:val="18"/>
-              </w:rPr>
-              <w:t xml:space="preserve">3.7%</w:t>
+              <w:t xml:space="preserve">7.5% → 7.2%</w:t>
             </w:r>
           </w:p>
         </w:tc>
@@ -15401,233 +16065,7 @@
                 <w:sz w:val="18"/>
                 <w:szCs w:val="18"/>
               </w:rPr>
-              <w:t xml:space="preserve">9.7%</w:t>
-            </w:r>
-          </w:p>
-        </w:tc>
-        <w:tc>
-          <w:tcPr>
-            <w:tcW w:type="dxa" w:w="910"/>
-            <w:tcBorders>
-              <w:top w:val="single" w:color="AAAAAA" w:sz="4"/>
-              <w:left w:val="single" w:color="AAAAAA" w:sz="4"/>
-              <w:bottom w:val="single" w:color="AAAAAA" w:sz="4"/>
-              <w:right w:val="single" w:color="AAAAAA" w:sz="4"/>
-            </w:tcBorders>
-            <w:tcMar>
-              <w:top w:type="dxa" w:w="40"/>
-              <w:left w:type="dxa" w:w="80"/>
-              <w:bottom w:type="dxa" w:w="40"/>
-              <w:right w:type="dxa" w:w="80"/>
-            </w:tcMar>
-          </w:tcPr>
-          <w:p>
-            <w:pPr>
-              <w:jc w:val="center"/>
-            </w:pPr>
-            <w:r>
-              <w:rPr>
-                <w:rFonts w:ascii="Times New Roman" w:cs="Times New Roman" w:eastAsia="Times New Roman" w:hAnsi="Times New Roman"/>
-                <w:b w:val="false"/>
-                <w:bCs w:val="false"/>
-                <w:sz w:val="18"/>
-                <w:szCs w:val="18"/>
-              </w:rPr>
-              <w:t xml:space="preserve">2.9%</w:t>
-            </w:r>
-          </w:p>
-        </w:tc>
-      </w:tr>
-      <w:tr>
-        <w:tc>
-          <w:tcPr>
-            <w:tcW w:type="dxa" w:w="1900"/>
-            <w:tcBorders>
-              <w:top w:val="single" w:color="AAAAAA" w:sz="4"/>
-              <w:left w:val="single" w:color="AAAAAA" w:sz="4"/>
-              <w:bottom w:val="single" w:color="AAAAAA" w:sz="4"/>
-              <w:right w:val="single" w:color="AAAAAA" w:sz="4"/>
-            </w:tcBorders>
-            <w:tcMar>
-              <w:top w:type="dxa" w:w="40"/>
-              <w:left w:type="dxa" w:w="80"/>
-              <w:bottom w:type="dxa" w:w="40"/>
-              <w:right w:type="dxa" w:w="80"/>
-            </w:tcMar>
-          </w:tcPr>
-          <w:p>
-            <w:pPr>
-              <w:jc w:val="center"/>
-            </w:pPr>
-            <w:r>
-              <w:rPr>
-                <w:rFonts w:ascii="Times New Roman" w:cs="Times New Roman" w:eastAsia="Times New Roman" w:hAnsi="Times New Roman"/>
-                <w:b w:val="false"/>
-                <w:bCs w:val="false"/>
-                <w:sz w:val="18"/>
-                <w:szCs w:val="18"/>
-              </w:rPr>
-              <w:t xml:space="preserve">Software company, high-priority subset</w:t>
-            </w:r>
-          </w:p>
-        </w:tc>
-        <w:tc>
-          <w:tcPr>
-            <w:tcW w:type="dxa" w:w="1100"/>
-            <w:tcBorders>
-              <w:top w:val="single" w:color="AAAAAA" w:sz="4"/>
-              <w:left w:val="single" w:color="AAAAAA" w:sz="4"/>
-              <w:bottom w:val="single" w:color="AAAAAA" w:sz="4"/>
-              <w:right w:val="single" w:color="AAAAAA" w:sz="4"/>
-            </w:tcBorders>
-            <w:tcMar>
-              <w:top w:type="dxa" w:w="40"/>
-              <w:left w:type="dxa" w:w="80"/>
-              <w:bottom w:type="dxa" w:w="40"/>
-              <w:right w:type="dxa" w:w="80"/>
-            </w:tcMar>
-          </w:tcPr>
-          <w:p>
-            <w:pPr>
-              <w:jc w:val="center"/>
-            </w:pPr>
-            <w:r>
-              <w:rPr>
-                <w:rFonts w:ascii="Times New Roman" w:cs="Times New Roman" w:eastAsia="Times New Roman" w:hAnsi="Times New Roman"/>
-                <w:b w:val="false"/>
-                <w:bCs w:val="false"/>
-                <w:sz w:val="18"/>
-                <w:szCs w:val="18"/>
-              </w:rPr>
-              <w:t xml:space="preserve">5,257 (3.5)</w:t>
-            </w:r>
-          </w:p>
-        </w:tc>
-        <w:tc>
-          <w:tcPr>
-            <w:tcW w:type="dxa" w:w="1100"/>
-            <w:tcBorders>
-              <w:top w:val="single" w:color="AAAAAA" w:sz="4"/>
-              <w:left w:val="single" w:color="AAAAAA" w:sz="4"/>
-              <w:bottom w:val="single" w:color="AAAAAA" w:sz="4"/>
-              <w:right w:val="single" w:color="AAAAAA" w:sz="4"/>
-            </w:tcBorders>
-            <w:tcMar>
-              <w:top w:type="dxa" w:w="40"/>
-              <w:left w:type="dxa" w:w="80"/>
-              <w:bottom w:type="dxa" w:w="40"/>
-              <w:right w:type="dxa" w:w="80"/>
-            </w:tcMar>
-          </w:tcPr>
-          <w:p>
-            <w:pPr>
-              <w:jc w:val="center"/>
-            </w:pPr>
-            <w:r>
-              <w:rPr>
-                <w:rFonts w:ascii="Times New Roman" w:cs="Times New Roman" w:eastAsia="Times New Roman" w:hAnsi="Times New Roman"/>
-                <w:b w:val="false"/>
-                <w:bCs w:val="false"/>
-                <w:sz w:val="18"/>
-                <w:szCs w:val="18"/>
-              </w:rPr>
-              <w:t xml:space="preserve">7.6</w:t>
-            </w:r>
-          </w:p>
-        </w:tc>
-        <w:tc>
-          <w:tcPr>
-            <w:tcW w:type="dxa" w:w="1100"/>
-            <w:tcBorders>
-              <w:top w:val="single" w:color="AAAAAA" w:sz="4"/>
-              <w:left w:val="single" w:color="AAAAAA" w:sz="4"/>
-              <w:bottom w:val="single" w:color="AAAAAA" w:sz="4"/>
-              <w:right w:val="single" w:color="AAAAAA" w:sz="4"/>
-            </w:tcBorders>
-            <w:tcMar>
-              <w:top w:type="dxa" w:w="40"/>
-              <w:left w:type="dxa" w:w="80"/>
-              <w:bottom w:type="dxa" w:w="40"/>
-              <w:right w:type="dxa" w:w="80"/>
-            </w:tcMar>
-          </w:tcPr>
-          <w:p>
-            <w:pPr>
-              <w:jc w:val="center"/>
-            </w:pPr>
-            <w:r>
-              <w:rPr>
-                <w:rFonts w:ascii="Times New Roman" w:cs="Times New Roman" w:eastAsia="Times New Roman" w:hAnsi="Times New Roman"/>
-                <w:b w:val="false"/>
-                <w:bCs w:val="false"/>
-                <w:sz w:val="18"/>
-                <w:szCs w:val="18"/>
-              </w:rPr>
-              <w:t xml:space="preserve">0.33</w:t>
-            </w:r>
-          </w:p>
-        </w:tc>
-        <w:tc>
-          <w:tcPr>
-            <w:tcW w:type="dxa" w:w="1250"/>
-            <w:tcBorders>
-              <w:top w:val="single" w:color="AAAAAA" w:sz="4"/>
-              <w:left w:val="single" w:color="AAAAAA" w:sz="4"/>
-              <w:bottom w:val="single" w:color="AAAAAA" w:sz="4"/>
-              <w:right w:val="single" w:color="AAAAAA" w:sz="4"/>
-            </w:tcBorders>
-            <w:tcMar>
-              <w:top w:type="dxa" w:w="40"/>
-              <w:left w:type="dxa" w:w="80"/>
-              <w:bottom w:type="dxa" w:w="40"/>
-              <w:right w:type="dxa" w:w="80"/>
-            </w:tcMar>
-          </w:tcPr>
-          <w:p>
-            <w:pPr>
-              <w:jc w:val="center"/>
-            </w:pPr>
-            <w:r>
-              <w:rPr>
-                <w:rFonts w:ascii="Times New Roman" w:cs="Times New Roman" w:eastAsia="Times New Roman" w:hAnsi="Times New Roman"/>
-                <w:b w:val="false"/>
-                <w:bCs w:val="false"/>
-                <w:sz w:val="18"/>
-                <w:szCs w:val="18"/>
-              </w:rPr>
-              <w:t xml:space="preserve">4.9%</w:t>
-            </w:r>
-          </w:p>
-        </w:tc>
-        <w:tc>
-          <w:tcPr>
-            <w:tcW w:type="dxa" w:w="950"/>
-            <w:tcBorders>
-              <w:top w:val="single" w:color="AAAAAA" w:sz="4"/>
-              <w:left w:val="single" w:color="AAAAAA" w:sz="4"/>
-              <w:bottom w:val="single" w:color="AAAAAA" w:sz="4"/>
-              <w:right w:val="single" w:color="AAAAAA" w:sz="4"/>
-            </w:tcBorders>
-            <w:tcMar>
-              <w:top w:type="dxa" w:w="40"/>
-              <w:left w:type="dxa" w:w="80"/>
-              <w:bottom w:type="dxa" w:w="40"/>
-              <w:right w:type="dxa" w:w="80"/>
-            </w:tcMar>
-          </w:tcPr>
-          <w:p>
-            <w:pPr>
-              <w:jc w:val="center"/>
-            </w:pPr>
-            <w:r>
-              <w:rPr>
-                <w:rFonts w:ascii="Times New Roman" w:cs="Times New Roman" w:eastAsia="Times New Roman" w:hAnsi="Times New Roman"/>
-                <w:b w:val="false"/>
-                <w:bCs w:val="false"/>
-                <w:sz w:val="18"/>
-                <w:szCs w:val="18"/>
-              </w:rPr>
-              <w:t xml:space="preserve">2.3%</w:t>
+              <w:t xml:space="preserve">3.7% → 3.8%</w:t>
             </w:r>
           </w:p>
         </w:tc>
@@ -15659,39 +16097,39 @@
                 <w:sz w:val="18"/>
                 <w:szCs w:val="18"/>
               </w:rPr>
-              <w:t xml:space="preserve">5.3%</w:t>
-            </w:r>
-          </w:p>
-        </w:tc>
-        <w:tc>
-          <w:tcPr>
-            <w:tcW w:type="dxa" w:w="910"/>
-            <w:tcBorders>
-              <w:top w:val="single" w:color="AAAAAA" w:sz="4"/>
-              <w:left w:val="single" w:color="AAAAAA" w:sz="4"/>
-              <w:bottom w:val="single" w:color="AAAAAA" w:sz="4"/>
-              <w:right w:val="single" w:color="AAAAAA" w:sz="4"/>
-            </w:tcBorders>
-            <w:tcMar>
-              <w:top w:type="dxa" w:w="40"/>
-              <w:left w:type="dxa" w:w="80"/>
-              <w:bottom w:type="dxa" w:w="40"/>
-              <w:right w:type="dxa" w:w="80"/>
-            </w:tcMar>
-          </w:tcPr>
-          <w:p>
-            <w:pPr>
-              <w:jc w:val="center"/>
-            </w:pPr>
-            <w:r>
-              <w:rPr>
-                <w:rFonts w:ascii="Times New Roman" w:cs="Times New Roman" w:eastAsia="Times New Roman" w:hAnsi="Times New Roman"/>
-                <w:b w:val="false"/>
-                <w:bCs w:val="false"/>
-                <w:sz w:val="18"/>
-                <w:szCs w:val="18"/>
-              </w:rPr>
-              <w:t xml:space="preserve">5.3%</w:t>
+              <w:t xml:space="preserve">9.7% → 8.7%</w:t>
+            </w:r>
+          </w:p>
+        </w:tc>
+        <w:tc>
+          <w:tcPr>
+            <w:tcW w:type="dxa" w:w="900"/>
+            <w:tcBorders>
+              <w:top w:val="single" w:color="AAAAAA" w:sz="4"/>
+              <w:left w:val="single" w:color="AAAAAA" w:sz="4"/>
+              <w:bottom w:val="single" w:color="AAAAAA" w:sz="4"/>
+              <w:right w:val="single" w:color="AAAAAA" w:sz="4"/>
+            </w:tcBorders>
+            <w:tcMar>
+              <w:top w:type="dxa" w:w="40"/>
+              <w:left w:type="dxa" w:w="80"/>
+              <w:bottom w:type="dxa" w:w="40"/>
+              <w:right w:type="dxa" w:w="80"/>
+            </w:tcMar>
+          </w:tcPr>
+          <w:p>
+            <w:pPr>
+              <w:jc w:val="center"/>
+            </w:pPr>
+            <w:r>
+              <w:rPr>
+                <w:rFonts w:ascii="Times New Roman" w:cs="Times New Roman" w:eastAsia="Times New Roman" w:hAnsi="Times New Roman"/>
+                <w:b w:val="false"/>
+                <w:bCs w:val="false"/>
+                <w:sz w:val="18"/>
+                <w:szCs w:val="18"/>
+              </w:rPr>
+              <w:t xml:space="preserve">2.9% → 2.8%</w:t>
             </w:r>
           </w:p>
         </w:tc>
@@ -15709,7 +16147,7 @@
           <w:sz w:val="18"/>
           <w:szCs w:val="18"/>
         </w:rPr>
-        <w:t xml:space="preserve">Target exceedance is 5%. In-sample: the local mean is a two-sided leave-one-out mean of about 8 surrounding work days after removing the weekday effect, and c is estimated from the same days that are scored, so neither is a feasible forecast. Causal: trailing 20-work-day mean, c estimated on earlier days only, rolling origin. The software company works Sunday to Thursday (weekend = Friday and Saturday); the other work weeks are Monday to Friday.</w:t>
+        <w:t xml:space="preserve">Each cell: all work days → low-volume or holiday days excluded (software company and ServiceNow: days below 35% of the rolling median, 62 and 5 days; Italian help desk: national holidays, 26 days). Target exceedance is 5%. The dispersion index includes slow trends, whereas the CV is net of a local level, so the two are not directly comparable. In-sample: the local mean is a two-sided leave-one-out mean over about 40 surrounding work days (eight weeks) after removing the weekday effect, and c is estimated from the same days that are scored, so neither is a feasible forecast. Causal: trailing 20-work-day mean, c estimated on earlier days only, rolling origin (the weekday effects are estimated on the full sample). The software company works Sunday to Thursday (weekend = Friday and Saturday); the other work weeks are Monday to Friday. A High/Highest/Blocker subset of the software company is not analysed because its rate rises from about zero to eleven tickets per work day over 2017-2023 (a change in the priority field).</w:t>
       </w:r>
     </w:p>
     <w:p>
@@ -15725,7 +16163,7 @@
           <w:sz w:val="22"/>
           <w:szCs w:val="22"/>
         </w:rPr>
-        <w:t xml:space="preserve">Arrivals.</w:t>
+        <w:t xml:space="preserve">Arrivals (Table 8).</w:t>
       </w:r>
       <w:r>
         <w:rPr>
@@ -15733,7 +16171,7 @@
           <w:sz w:val="22"/>
           <w:szCs w:val="22"/>
         </w:rPr>
-        <w:t xml:space="preserve"> All streams are strongly non-homogeneous over the week and the day (hour-of-week homogeneity rejected, p &lt; 10⁻¹⁰⁰; weekend ticket rates are 0.09, 0.12 and 0.04 of work-day rates), and arrivals are far from Poisson even after time-rescaling (p &lt; 10⁻⁹⁰ for the two long streams), because daily volumes vary beyond the weekly cycle. Net of slow trends and the weekday effect, the coefficient of variation of the daily rate is 0.32 (software company), 0.41 (Italian help desk) and 0.25 (ServiceNow segment), and 0.33 for the high-priority subset of the software company (3.5 tickets per work day); the dated hallucination cases of Section 5.6 give 0.24. These values are of similar size and close to the scenarios used in Section 5.4 (c = 0.3 and 0.44), which supports c of about 0.25-0.45 as a plausible range for human-handled incident streams, although all of them come from non-LLM or legal-domain streams. Because φ = 1 + λc², the effect on capacity depends on the rate: against the in-sample local mean, a Poisson-sized plan is exceeded on 9.0%, 7.5% and 35.0% of work days (about 13, 5 and 350 tickets per day) instead of 5%, and 4.9% for the high-priority subset at 3.5 per day. A causal plan (trailing mean and previous-days c, which is what an operator could actually use) is exceeded on 9.6% and 9.7% of days for the two long streams with the Poisson quantile and 1.9% and 2.9% with a negative-binomial quantile (conservative, because c is estimated on trend-contaminated early days). The negative-binomial results in the in-sample columns are a calibration check of Proposition 2 rather than an out-of-sample test, since c is estimated from the same days that are scored; the causal columns are the feasible comparison.</w:t>
+        <w:t xml:space="preserve"> All streams are strongly non-homogeneous over the week and the day (hour-of-week homogeneity rejected, p &lt; 10⁻¹⁰⁰; weekend ticket rates are 0.09, 0.12 and 0.04 of work-day rates), and arrivals are far from Poisson even after time-rescaling (p &lt; 10⁻⁹⁰ for the two long streams), because daily volumes vary beyond the weekly cycle. Net of slow trends and the weekday effect, the coefficient of variation of the daily rate is 0.32 → 0.27 (software company), 0.41 → 0.38 (Italian help desk) and 0.25 → 0.10 (ServiceNow segment), where holidays and bridge days account for most of the ServiceNow value; the dated hallucination cases of Section 5.6 give 0.24 → 0.18. These values are of the same order as the scenario values of Section 5.4 (c = 0.3 lies within the range of 0.10-0.38 after exclusions; c = 0.44 lies above it), although all of them come from non-LLM or legal-domain streams and we do not claim a universal value. Because φ = 1 + λc², the effect on capacity depends on the rate: against the in-sample local mean, a Poisson-sized plan is exceeded on 7.8%, 7.2% and 20.0% of work days (about 14, 5 and 376 tickets per day) instead of 5% (9.0%, 7.5% and 35.0% with all days). A causal plan (trailing mean and previous-days c, which is what an operator could use) is exceeded on 8.6% and 8.7% of days for the two long streams with the Poisson quantile and 2.5% and 2.8% with a negative-binomial quantile, i.e. the negative-binomial plan is somewhat conservative for reasons we cannot identify from these data. For the 12-week ServiceNow segment the causal evaluation covers only 15 days and is not informative. The negative-binomial results in the in-sample columns are a calibration check of Proposition 2 rather than an out-of-sample test, since c is estimated from the same days that are scored; the causal columns are the feasible comparison.</w:t>
       </w:r>
     </w:p>
     <w:p>
@@ -17362,7 +17800,7 @@
           <w:sz w:val="22"/>
           <w:szCs w:val="22"/>
         </w:rPr>
-        <w:t xml:space="preserve">Service times.</w:t>
+        <w:t xml:space="preserve">Service times (Table 9).</w:t>
       </w:r>
       <w:r>
         <w:rPr>
@@ -17370,7 +17808,7 @@
           <w:sz w:val="22"/>
           <w:szCs w:val="22"/>
         </w:rPr>
-        <w:t xml:space="preserve"> Resolution times are heavy-tailed and far from exponential: median 168 h against a mean of 699 h for the software company, 22 h against 178 h for ServiceNow and 94 h against 211 h for the Italian help desk, with coefficients of variation of 3.0, 3.0 and 1.3 (an exponential has 1) and Weibull shapes of 0.36-0.51, i.e. a decreasing hazard: a ticket that has stayed open for long is likely to stay open much longer. The same holds for the time a ticket spends in the "in progress" state (median 2.2 h, mean 97 h, CV 3.6). The Critical/High incidents of ServiceNow take longer (median 50 h) and are also heavy-tailed. Two consequences for capacity planning follow. First, models that assume exponential service (M/M/c) are not supported, which is a further reason to size capacity from the quantile of the arrival-count distribution and to treat the service-time tail explicitly rather than through a mean-based utilisation. Second, in the one stream with handling-time data (the software company; workload = the in-progress hours of the tickets created that day, attributed to the creation day, work days only) the 95th percentile of the daily workload is 3.4 times its mean, against 2.0 for the daily ticket count (CVs 1.35 and 0.58); capacity measured in handling hours thus needs a larger multiple of the mean than capacity measured in arrivals, and the "unit of triage capacity" of Section 3.2 must be defined for a typical ticket with the workload tail added separately. The in-progress time is calendar time in a workflow state, not effort, and the comparison is not detrended, so the ratio is indicative only.</w:t>
+        <w:t xml:space="preserve"> Resolution times are heavy-tailed and far from exponential: median 168 h against a mean of 699 h for the software company, 22 h against 178 h for ServiceNow and 94 h against 211 h for the Italian help desk, with coefficients of variation of 3.0, 3.0 and 1.3 (an exponential has 1) and Weibull shapes of 0.36-0.51, i.e. a decreasing hazard: a ticket that has stayed open for long is likely to stay open much longer. The same holds for the time a ticket spends in the "in progress" state (median 2.2 h, mean 97 h, CV 3.6). The Critical/High incidents of ServiceNow take longer (median 50 h) and are also heavy-tailed. Two consequences for capacity planning follow. First, models that assume exponential service (M/M/c) are not supported, which is a further reason to size capacity from the quantile of the arrival-count distribution and to treat the service-time tail explicitly rather than through a mean-based utilisation. Second, in the one stream with handling-time data (the software company; workload = the in-progress hours of the tickets created that day, attributed to the creation day, Sunday to Thursday only) the 95th percentile of the daily workload is 3.2 times its mean, against 1.9 for the daily ticket count (CVs 1.27 and 0.47); capacity measured in handling hours thus needs a larger multiple of the mean than capacity measured in arrivals, and the "unit of triage capacity" of Section 3.2 must be defined for a typical ticket with the workload tail added separately. The in-progress time is calendar time in a workflow state, not effort, and the comparison is not detrended, so the ratio is indicative only.</w:t>
       </w:r>
     </w:p>
     <w:p>
@@ -17386,7 +17824,7 @@
           <w:sz w:val="22"/>
           <w:szCs w:val="22"/>
         </w:rPr>
-        <w:t xml:space="preserve">Concurrency.</w:t>
+        <w:t xml:space="preserve">Concurrency (descriptive).</w:t>
       </w:r>
       <w:r>
         <w:rPr>
@@ -17394,7 +17832,7 @@
           <w:sz w:val="22"/>
           <w:szCs w:val="22"/>
         </w:rPr>
-        <w:t xml:space="preserve"> For the two steady streams the time-average number of open tickets is 290 (software company) and 34 (Italian help desk), with variance-to-mean ratios of 21 and 2.6 (Poisson occupancy has 1). The observed 95th percentile of open tickets is 384 and 51, against Poisson (M/G/∞) predictions with the same mean of 319 and 44: a Poisson-based backlog capacity is too small by 20% and 16%. The first and last 5% of time were removed to limit edge effects, and the ServiceNow log is not used here because it starts and stops abruptly.</w:t>
+        <w:t xml:space="preserve"> For the software company and the Italian help desk the time-average number of open tickets is 290 and 34, with variance-to-mean ratios of 21 and 2.6 (Poisson occupancy has 1). The observed 95th percentile of open tickets is 384 and 51, against 319 and 44 for a Poisson (M/G/∞) occupancy with the same mean, i.e. 20% and 16% higher. This is a statement about a static backlog plan sized with the long-run mean, not a test of Poisson arrivals or of the service-time structure: both logs change in volume over their span (and in service time for the Italian desk), and a slowly varying volume alone produces such an excess, so the comparison is descriptive. The first and last 5% of time were removed to limit edge effects, and the ServiceNow log is not used here because it starts and stops abruptly.</w:t>
       </w:r>
     </w:p>
     <w:p>
@@ -19539,7 +19977,7 @@
                 <w:sz w:val="18"/>
                 <w:szCs w:val="18"/>
               </w:rPr>
-              <w:t xml:space="preserve">impact&gt;=2</w:t>
+              <w:t xml:space="preserve">major/critical (impact ≥ 2)</w:t>
             </w:r>
           </w:p>
         </w:tc>
@@ -20103,7 +20541,7 @@
           <w:sz w:val="18"/>
           <w:szCs w:val="18"/>
         </w:rPr>
-        <w:t xml:space="preserve">Baseline: weekday/weekend × hour-of-day profile estimated from the incident data and held fixed; second row of each stream: additionally multiplied by a monthly level estimated from the monthly counts. Exponential excitation kernel; bootstrap p from 200 parametric simulations under the corresponding NHPP (smallest possible value 0.005). KS: Kolmogorov-Smirnov test of time-rescaled gaps against Exp(1) with the fitted compensator.</w:t>
+        <w:t xml:space="preserve">Baseline: weekday/weekend × hour-of-day profile estimated from the incident data and held fixed; second row of each stream: additionally multiplied by a monthly level estimated from the monthly counts. Exponential excitation kernel; bootstrap p from 200 parametric simulations under the corresponding NHPP (smallest possible value 0.005). KS: Kolmogorov-Smirnov test of time-rescaled gaps against Exp(1) with the fitted compensator; these p-values are optimistic because the profile (48 slots), the monthly levels and the Hawkes parameters are all fitted on the same events.</w:t>
       </w:r>
     </w:p>
     <w:p>
@@ -20127,7 +20565,7 @@
           <w:sz w:val="22"/>
           <w:szCs w:val="22"/>
         </w:rPr>
-        <w:t xml:space="preserve"> The incident rate was not constant over the 18 months: monthly counts were 11-27 in the first twelve months and 27-54 afterwards (homogeneity across months rejected, χ² = 87 on 17 df). With a fixed seasonal profile and a constant level, a self-exciting term improves the fit for every stream (AIC gains of 9-26; the bootstrap rejects the NHPP for all four streams; branching ratio 0.11-0.21), but part of this is the slowly changing level, which the self-excitation term can mimic. With the baseline multiplied by a monthly level, the estimated branching ratio falls to 0.05-0.09 (mean cluster 1.06-1.10 incidents, half-life 1.5-3.8 h), the AIC gains shrink to 2-4, the bootstrap p-values are 0.015-0.025, and the time-rescaling test no longer rejects the NHPP for the combined stream (p = 0.17), OpenAI and the major and critical subset, so a weekday/hour profile with a drifting level already describes most of the data. A weak residual self-excitation remains (roughly one incident in 11 to 18 followed by a clustered successor, with borderline evidence), and Anthropic's time-rescaling test still rejects the NHPP (p = 0.016). The implied long-window Fano factor of 1.15 (Proposition 6b) is below the stratified dispersion index of 1.30 of Section 5.6, so part of the measured over-dispersion is the drifting level. The conclusion for planning is modest: provider incidents need a seasonal, level-adjusted baseline; whether they also cluster is weakly supported and the effect is small at this rate.</w:t>
+        <w:t xml:space="preserve"> The incident rate was not constant over the 18 months: monthly counts were 11-27 in the first twelve months and 27-54 afterwards (homogeneity across months rejected, χ² = 87 on 17 df). With a fixed seasonal profile and a constant level, a self-exciting term improves the fit for every stream (AIC gains of 9-26; the bootstrap rejects the NHPP for all four streams; branching ratio 0.11-0.21), but part of this is the slowly changing level, which the self-excitation term can mimic. With the baseline multiplied by a monthly level, the estimated branching ratio falls to 0.05-0.09 (mean cluster 1.06-1.10 incidents, half-life 1.5-3.8 h), the AIC gains shrink to 2-4, the bootstrap p-values are 0.015-0.025, and the (optimistic) time-rescaling test no longer rejects the NHPP for the combined stream (p = 0.17), OpenAI and the major and critical subset, so a weekday/hour profile with a drifting level plausibly describes most of the data. A weak residual self-excitation remains (roughly one incident in 11 to 18 followed by a clustered successor, with borderline evidence), and Anthropic's time-rescaling test still rejects the NHPP (p = 0.016). The implied long-window Fano factor of 1.15 (Proposition 6b) is below the stratified dispersion index of 1.30 of Section 5.6, so part of the measured over-dispersion is the drifting level. The conclusion for planning is modest: provider incidents need a seasonal, level-adjusted baseline; whether they also cluster is weakly supported and the effect is small at this rate.</w:t>
       </w:r>
     </w:p>
     <w:p>
@@ -21788,7 +22226,7 @@
           <w:sz w:val="22"/>
           <w:szCs w:val="22"/>
         </w:rPr>
-        <w:t xml:space="preserve"> To see what the typed description changes for a human-triage capacity plan, we combine three human-handled classes for an illustrative organisation with parameters taken from our estimates and independent classes: hallucinations after the classifier-only cascade L1+L2 (λ_H = 12.7 per day, Qwen2.5-0.5B run; the daily-rate CV c_H is assumed in the range 0.3-0.45, near the 0.32 and 0.41 estimated net of trend for the two steady ticket streams, so φ_H = 1 + λ_H c_H² = 2.14-3.57 by Proposition 2), provider incidents affecting the organisation (λ_P = 0.83, φ_P = 1.30 from the day-of-week-stratified index) and own serving-failure episodes (λ_S from the episode counts over the 231 recorded days; φ_S = 2.1 for the coarse definition, 19.9 for the fine one, and 16.3 when conditioned on volume). Treating the total as one Poisson stream gives a 95% capacity of 23 (fine definition) or 21 (coarse) units per day at c_H = 0.37; the typed superposition requires 33 and 25, and the single-Poisson plan is exceeded on 15.4% and 12.6% of days instead of 5% (Monte Carlo of 400,000 days; effective dispersion φ_eff = 2.6-5.7, Proposition 6a). Across the nine scenarios (c_H of 0.3, 0.37 and 0.45 × three treatments of the serving class) the required capacity is 24-34 units against a single-Poisson plan of 21-23, i.e. 14-48% more, with the single-Poisson plan exceeded on 10.5%-17.2% of days. The hallucination class alone, whose dispersion is assumed, accounts for a gap of 21% (23 rather than 19 units); the provider class adds little, and the serving class widens the gap substantially only when it is treated as strongly over-dispersed (fine definition or volume-conditional dispersion), while with the coarse definition the total gap is about that of the hallucination class. The scenario is therefore an illustration of the size of the single-Poisson error under stated assumptions, not evidence for the typed model: class means are not those of any real organisation, the comparator is a single Poisson (a negative-binomial plan on the total would close part of the gap), and a serving outage would plausibly raise the hallucination and ticket volumes at the same time, which would widen it.</w:t>
+        <w:t xml:space="preserve"> To see what the typed description changes for a human-triage capacity plan, we combine three human-handled classes for an illustrative organisation with parameters taken from our estimates and independent classes: hallucinations after the classifier-only cascade L1+L2 (λ_H = 12.7 per day, Qwen2.5-0.5B run; the daily-rate CV c_H is assumed in the range 0.3-0.45, near the 0.27 and 0.38 (0.32 and 0.41 with all days) estimated net of trend for the two long ticket streams, so φ_H = 1 + λ_H c_H² = 2.14-3.57 by Proposition 2), provider incidents affecting the organisation (λ_P = 0.83, φ_P = 1.30 from the day-of-week-stratified index) and own serving-failure episodes (λ_S from the episode counts over the 231 recorded days; φ_S = 2.1 for the coarse definition, 19.9 for the fine one, and 1.8 for the coarse definition conditioned on request volume). Treating the total as one Poisson stream gives a 95% capacity of 23 (fine definition) or 21 (coarse) units per day at c_H = 0.37; the typed superposition requires 33 and 25, and the single-Poisson plan is exceeded on 15.4% and 12.6% of days instead of 5% (Monte Carlo of 400,000 days; effective dispersion φ_eff = 2.6-5.7, Proposition 6a). Across the nine scenarios (c_H of 0.3, 0.37 and 0.45 × three treatments of the serving class) the required capacity is 24-34 units against a single-Poisson plan of 21-23, i.e. 14-48% more, with the single-Poisson plan exceeded on 10.4%-17.2% of days. The hallucination class alone, whose dispersion is assumed, accounts for a gap of 21% (23 rather than 19 units); the provider class adds little, and the serving class widens the gap substantially only when it is treated as strongly over-dispersed (the fine episode definition, φ_S = 19.9), while with the coarse definition, also when conditioned on request volume, the total gap is about that of the hallucination class. The scenario is therefore an illustration of the size of the single-Poisson error under stated assumptions, not evidence for the typed model: class means are not those of any real organisation, the comparator is a single Poisson (a negative-binomial plan on the total would close part of the gap), and a serving outage would plausibly raise the hallucination and ticket volumes at the same time, which would widen it.</w:t>
       </w:r>
     </w:p>
     <w:p>
@@ -21850,7 +22288,7 @@
           <w:sz w:val="22"/>
           <w:szCs w:val="22"/>
         </w:rPr>
-        <w:t xml:space="preserve"> Provisioning at the mean load failed on 28-49% of days across the configurations we measured. The Poisson quantile fixes this when daily counts are Poisson, but Proposition 2 and the burst experiments show that a modest day-to-day variation in demand (CV 0.3-0.44) raises the exceedance rate of a Poisson-sized plan from 5% to 23-28% (c = 0.3) and 30-32% (c = 0.44) without guardrails; real LLM request streams vary far more than that (a stress test, Section 5.6). Dispersion should be estimated from incident logs before the plan is fixed. Over-dispersion matters most for large incident streams (weak guardrails) and least for small ones (Propositions 2 and 3): provider outages at about 0.8 per day and dated hallucination cases at about 6 per weekday were statistically over-dispersed but changed the 95% capacity by at most one or two units, whereas the ServiceNow segment (about 350 tickets per work day) and the unprotected hallucination stream of 100+ events per day were affected strongly.</w:t>
+        <w:t xml:space="preserve"> Provisioning at the mean load (k = round of the estimated rate) failed on 28-49% of days across the configurations we replayed. The Poisson quantile fixes this when daily counts are Poisson, but Proposition 2 and the burst replays show that a modest day-to-day variation in demand (CV 0.3-0.44) raises the exceedance rate of a Poisson-sized plan from 5% to 23-28% (c = 0.3) and 30-32% (c = 0.44) without guardrails; this follows from the injected multiplier and confirms the proposition on measured outcomes. Real LLM request streams vary far more than that (a stress test, Section 5.6). Dispersion should be estimated from incident logs before the plan is fixed. Over-dispersion matters most for large incident streams (weak guardrails) and least for small ones (Propositions 2 and 3): provider outages at about 0.8 per day and dated hallucination cases at about 6 per weekday were statistically over-dispersed but changed the 95% capacity by at most one unit, whereas the ServiceNow segment (about 350 tickets per work day; Poisson plan exceeded on 20% of work days even after excluding holidays and bridge days) and the unprotected hallucination stream of 100+ events per day were affected strongly.</w:t>
       </w:r>
     </w:p>
     <w:p>
@@ -21878,7 +22316,7 @@
           <w:sz w:val="22"/>
           <w:szCs w:val="22"/>
         </w:rPr>
-        <w:t xml:space="preserve"> The layers' stand-alone clearance, their dependence, their false-block cost and their latency vary strongly by layer and model. In our data one task-specific verifier delivered most of the benefit (a 78-95% reduction in required capacity at the price of 15-71% of correct answers blocked), the deterministic layer was nearly inert, and the judge added a modest, model-dependent gain at about three times the latency. A fixed "three layers" prescription is not supported by these data; the method here selects the stack from measurements. A classifier that is not validated can be actively harmful: our NLI layer had chance-level discrimination and appeared to cut capacity only because it blocked almost everything.</w:t>
+        <w:t xml:space="preserve"> The layers' stand-alone clearance, their dependence, their false-block cost and their latency vary strongly by layer and model. In our data one task-specific verifier delivered most of the benefit (a 78-95% reduction in required capacity at the price of 15-71% of correct answers blocked), the deterministic layer was nearly inert, and the routed judge's gain was small (k∗ reduced by 2, 0, 0 units) and not distinguishable from zero in cost terms (paired intervals for the daily saving $429 [-$5, $931]; -$2 [-$5, $0]; $61 [-$9, $646]), at about three times the latency and under a fail-open 2 s timeout. A fixed "three layers" prescription is not supported by these data; the method here selects the stack from measurements. A classifier that is not validated can be actively harmful: our NLI layer had chance-level discrimination and appeared to cut capacity only because it blocked almost everything.</w:t>
       </w:r>
     </w:p>
     <w:p>
@@ -21934,7 +22372,7 @@
           <w:sz w:val="22"/>
           <w:szCs w:val="22"/>
         </w:rPr>
-        <w:t xml:space="preserve"> In public ticket streams the day-to-day coefficient of variation of the arrival rate was 0.25-0.41 net of trend, a Poisson-sized plan against the in-sample local mean was exceeded on 7-35% of work days instead of 5% (the two long streams: 9.6% and 9.7% with a causal plan), resolution times had coefficients of variation of 1.3-3.0 with decreasing hazards, and in the one stream with handling-time data the 95th percentile of the daily workload was 3.4 times its mean against 2.0 for the arrival count. Capacity in </w:t>
+        <w:t xml:space="preserve"> In public ticket streams the day-to-day coefficient of variation of the arrival rate was 0.10-0.38 net of trend after excluding holiday and low-volume days (0.25-0.41 with all days), a Poisson-sized plan against the in-sample local mean was exceeded on 7-20% of work days instead of 5% (the two long streams: 8.6% and 8.7% with a causal plan), resolution times had coefficients of variation of 1.3-3.0 with decreasing hazards, and in the one stream with handling-time data the 95th percentile of the daily workload was 3.2 times its mean against 1.9 for the arrival count. Capacity in </w:t>
       </w:r>
       <w:r>
         <w:rPr>
@@ -21998,7 +22436,7 @@
           <w:sz w:val="22"/>
           <w:szCs w:val="22"/>
         </w:rPr>
-        <w:t xml:space="preserve"> Sending only low-agreement answers to the expensive judge cuts judge calls by roughly an order of magnitude, but it also forgoes catches among answers the classifier rated as consistent; the share of hallucinations passing the L2+L3 cascade was 2.7-4.6 times the independence prediction with routing against 1.6-2.6 times without it (Section 5.2).</w:t>
+        <w:t xml:space="preserve"> Sending only low-agreement answers to the expensive judge cuts judge calls by roughly an order of magnitude, but it also forgoes catches among answers the classifier rated as consistent; the share of hallucinations passing the L2+L3 cascade was 1.9-2.3 times the independence prediction with routing against 1.3-1.6 times without it (Section 5.2).</w:t>
       </w:r>
     </w:p>
     <w:p>
@@ -22148,7 +22586,7 @@
           <w:sz w:val="22"/>
           <w:szCs w:val="22"/>
         </w:rPr>
-        <w:t xml:space="preserve">Dependence estimates are imprecise.</w:t>
+        <w:t xml:space="preserve">Dependence estimates are imprecise, and the timeout policy matters.</w:t>
       </w:r>
       <w:r>
         <w:rPr>
@@ -22156,7 +22594,7 @@
           <w:sz w:val="22"/>
           <w:szCs w:val="22"/>
         </w:rPr>
-        <w:t xml:space="preserve"> The positive association between L2 and L3 and the excess over the independence formula have wide bootstrap intervals, and for one generator the no-routing excess is not distinguishable from one; the independence prediction is computed from the same sample's marginals.</w:t>
+        <w:t xml:space="preserve"> The positive association between L2 and L3 and the excess over the independence formula are weak, their bootstrap intervals include zero (or one) for two of the three generators, and the independence prediction is computed from the same sample's marginals. The judge results assume that verdicts of calls slower than 2 s are discarded (fail-open); crediting them would raise the judge's clearance and its apparent value (Section 5.5).</w:t>
       </w:r>
     </w:p>
     <w:p>
@@ -22184,7 +22622,7 @@
           <w:sz w:val="22"/>
           <w:szCs w:val="22"/>
         </w:rPr>
-        <w:t xml:space="preserve"> The Hawkes and episode fits use one kernel family (exponential), a fixed seasonal profile estimated from the same data, and, for BurstGPT, an episode definition that matters quantitatively (Table 11) and may split a long outage into fragments; the bootstrap p-values are bounded below by 1/(B + 1). The capacity comparison of Section 5.8 combines classes from different organisations and datasets under independence, with an assumed hallucination dispersion and a single Poisson as the comparator; common-cause dependence between classes would widen the gap.</w:t>
+        <w:t xml:space="preserve"> The Hawkes and episode fits use one kernel family (exponential), a fixed seasonal profile estimated from the same data, and, for BurstGPT, an episode definition that matters quantitatively (Table 11) and may split a long outage into fragments; the bootstrap p-values are bounded below by 1/(B + 1) and the time-rescaling p-values are optimistic. The capacity comparison of Section 5.8 combines classes from different organisations and datasets under independence, with an assumed hallucination dispersion and a single Poisson as the comparator; common-cause dependence between classes would widen the gap.</w:t>
       </w:r>
     </w:p>
     <w:p>
@@ -22232,7 +22670,7 @@
           <w:sz w:val="22"/>
           <w:szCs w:val="22"/>
         </w:rPr>
-        <w:t xml:space="preserve">Public-trace artefacts.</w:t>
+        <w:t xml:space="preserve">Isolated low-count days.</w:t>
       </w:r>
       <w:r>
         <w:rPr>
@@ -22240,7 +22678,7 @@
           <w:sz w:val="22"/>
           <w:szCs w:val="22"/>
         </w:rPr>
-        <w:t xml:space="preserve"> BurstGPT has no calendar dates, a 104-day gap, near-duplicate day pairs and order-of-magnitude regime changes in daily volume, so its day-level variability reflects growth and logging as well as randomness; we use it as a stress test and its smallest 14-day coefficient of variation as a floor, not as an estimate. The provider incident data are provider-declared, with minute resolution and detection and reporting bias; incident duration is the declared start-to-resolution time, not triage effort.</w:t>
+        <w:t xml:space="preserve"> Holidays, bridge days and outages produce single-day dips that an eight-week local mean cannot absorb and that inflate the dispersion and the exceedances of the in-sample plans (Section 5.7); we report results with and without such days, using a volume rule for two streams and holiday calendars for two others, and the rule is outcome-based and therefore not applied to low-rate streams. The unexplained conservatism of the causal negative-binomial plan shows that our variability estimates are not fully understood.</w:t>
       </w:r>
     </w:p>
     <w:p>
@@ -22260,7 +22698,7 @@
           <w:sz w:val="22"/>
           <w:szCs w:val="22"/>
         </w:rPr>
-        <w:t xml:space="preserve">Small open models and one task.</w:t>
+        <w:t xml:space="preserve">Public-trace artefacts.</w:t>
       </w:r>
       <w:r>
         <w:rPr>
@@ -22268,43 +22706,7 @@
           <w:sz w:val="22"/>
           <w:szCs w:val="22"/>
         </w:rPr>
-        <w:t xml:space="preserve"> We study 0.4-1.5B-parameter models on extractive QA with unanswerable questions. Absolute hallucination rates are much higher than for frontier models, and the layers are CPU-bound; latencies on GPU or hosted APIs differ. The </w:t>
-      </w:r>
-      <w:r>
-        <w:rPr>
-          <w:rFonts w:ascii="Times New Roman" w:cs="Times New Roman" w:eastAsia="Times New Roman" w:hAnsi="Times New Roman"/>
-          <w:i/>
-          <w:iCs/>
-          <w:sz w:val="22"/>
-          <w:szCs w:val="22"/>
-        </w:rPr>
-        <w:t xml:space="preserve">method</w:t>
-      </w:r>
-      <w:r>
-        <w:rPr>
-          <w:rFonts w:ascii="Times New Roman" w:cs="Times New Roman" w:eastAsia="Times New Roman" w:hAnsi="Times New Roman"/>
-          <w:sz w:val="22"/>
-          <w:szCs w:val="22"/>
-        </w:rPr>
-        <w:t xml:space="preserve"> transfers, the </w:t>
-      </w:r>
-      <w:r>
-        <w:rPr>
-          <w:rFonts w:ascii="Times New Roman" w:cs="Times New Roman" w:eastAsia="Times New Roman" w:hAnsi="Times New Roman"/>
-          <w:i/>
-          <w:iCs/>
-          <w:sz w:val="22"/>
-          <w:szCs w:val="22"/>
-        </w:rPr>
-        <w:t xml:space="preserve">numbers</w:t>
-      </w:r>
-      <w:r>
-        <w:rPr>
-          <w:rFonts w:ascii="Times New Roman" w:cs="Times New Roman" w:eastAsia="Times New Roman" w:hAnsi="Times New Roman"/>
-          <w:sz w:val="22"/>
-          <w:szCs w:val="22"/>
-        </w:rPr>
-        <w:t xml:space="preserve"> do not.</w:t>
+        <w:t xml:space="preserve"> BurstGPT has no calendar dates, a 104-day gap, near-duplicate day pairs and order-of-magnitude regime changes in daily volume, so its day-level variability reflects growth and logging as well as randomness; we use it as a stress test and its smallest 14-day coefficient of variation as a floor, not as an estimate. The provider incident data are provider-declared, with minute resolution and detection and reporting bias; incident duration is the declared start-to-resolution time, not triage effort.</w:t>
       </w:r>
     </w:p>
     <w:p>
@@ -22324,7 +22726,7 @@
           <w:sz w:val="22"/>
           <w:szCs w:val="22"/>
         </w:rPr>
-        <w:t xml:space="preserve">Label noise and cost parameters.</w:t>
+        <w:t xml:space="preserve">Small open models and one task.</w:t>
       </w:r>
       <w:r>
         <w:rPr>
@@ -22332,7 +22734,43 @@
           <w:sz w:val="22"/>
           <w:szCs w:val="22"/>
         </w:rPr>
-        <w:t xml:space="preserve"> Ground truth uses string and token-F1 matching against SQuAD gold answers, which can mark valid paraphrases as hallucinations and inflates the base rate. The cost parameters and selection weights are assumptions; only the labour-to-compute ratio and the sensitivity grid are informative, and the grid does not reflect sampling error.</w:t>
+        <w:t xml:space="preserve"> We study 0.4-1.5B-parameter models on extractive QA with unanswerable questions. Absolute hallucination rates are much higher than for frontier models, and the layers are CPU-bound; latencies on GPU or hosted inference differ. The </w:t>
+      </w:r>
+      <w:r>
+        <w:rPr>
+          <w:rFonts w:ascii="Times New Roman" w:cs="Times New Roman" w:eastAsia="Times New Roman" w:hAnsi="Times New Roman"/>
+          <w:i/>
+          <w:iCs/>
+          <w:sz w:val="22"/>
+          <w:szCs w:val="22"/>
+        </w:rPr>
+        <w:t xml:space="preserve">method</w:t>
+      </w:r>
+      <w:r>
+        <w:rPr>
+          <w:rFonts w:ascii="Times New Roman" w:cs="Times New Roman" w:eastAsia="Times New Roman" w:hAnsi="Times New Roman"/>
+          <w:sz w:val="22"/>
+          <w:szCs w:val="22"/>
+        </w:rPr>
+        <w:t xml:space="preserve"> transfers, the </w:t>
+      </w:r>
+      <w:r>
+        <w:rPr>
+          <w:rFonts w:ascii="Times New Roman" w:cs="Times New Roman" w:eastAsia="Times New Roman" w:hAnsi="Times New Roman"/>
+          <w:i/>
+          <w:iCs/>
+          <w:sz w:val="22"/>
+          <w:szCs w:val="22"/>
+        </w:rPr>
+        <w:t xml:space="preserve">numbers</w:t>
+      </w:r>
+      <w:r>
+        <w:rPr>
+          <w:rFonts w:ascii="Times New Roman" w:cs="Times New Roman" w:eastAsia="Times New Roman" w:hAnsi="Times New Roman"/>
+          <w:sz w:val="22"/>
+          <w:szCs w:val="22"/>
+        </w:rPr>
+        <w:t xml:space="preserve"> do not.</w:t>
       </w:r>
     </w:p>
     <w:p>
@@ -22352,7 +22790,7 @@
           <w:sz w:val="22"/>
           <w:szCs w:val="22"/>
         </w:rPr>
-        <w:t xml:space="preserve">Independent days.</w:t>
+        <w:t xml:space="preserve">Label noise and cost parameters.</w:t>
       </w:r>
       <w:r>
         <w:rPr>
@@ -22360,7 +22798,7 @@
           <w:sz w:val="22"/>
           <w:szCs w:val="22"/>
         </w:rPr>
-        <w:t xml:space="preserve"> The model treats days as exchangeable apart from the weekly profile, a local level and the Cox-type multiplier; long-run trends, holidays and sudden regime shifts are only handled through the local mean estimates.</w:t>
+        <w:t xml:space="preserve"> Ground truth uses string and token-F1 matching against SQuAD gold answers, which can mark valid paraphrases as hallucinations and inflates the base rate. The cost parameters and selection weights are assumptions; only the labour-to-compute ratio and the sensitivity grid are informative, and the grid does not reflect sampling error.</w:t>
       </w:r>
     </w:p>
     <w:p>
@@ -22390,7 +22828,7 @@
           <w:sz w:val="22"/>
           <w:szCs w:val="22"/>
         </w:rPr>
-        <w:t xml:space="preserve">Treating human-handled LLM incidents as a counting process turns guardrail performance into a staffing and cost decision. Under the stated assumptions, capacity should be sized from an over-dispersion-aware quantile of the daily count; the multiplicative guardrail formula is an optimistic bound whose gap must be measured; a single Poisson on all failures misdescribes every class (hallucinations are over-dispersed through demand variability, provider incidents are seasonal with a drifting level and weak clustering, serving failures are heavy-tailed episodes); and the cost-minimising number of layers depends on integer capacity effects, the floor on standing staff, latency, the labour-to-compute ratio and the measured clearance, and is not fixed at three. On measured outputs of three small open models answering the same 300 questions, a single task-specific verifier reduced the required capacity by 78-95% relative to no guardrails while blocking 15-71% of correct answers; a routed judge added a further modest reduction for two of the three generators at about triple the latency, and every cascade incurred false blocks and system failures. The share of hallucinations passing a two-layer cascade was 1.6-2.6 times the independence prediction without routing and 2.7-4.6 times with routing, with wide intervals. Mild burstiness (daily-rate CV of 0.3-0.44, a range informed by public ticket streams and a production trace) raised the exceedance rate of a Poisson-sized plan from 5% to roughly 23-32% without guardrails and 7-16% with the best cascade. Public production data corroborate the structure: an LLM request trace shows clustered arrivals from the 10-second scale upward, provider incident streams are strongly seasonal with a drifting level and over-dispersion that remains after weekday stratification, a log of dated hallucination cases shows the same mild over-dispersion at about six cases per weekday, and company ticket streams show a net-of-trend daily rate CV of 0.25-0.41 and heavy-tailed resolution times. Hallucination arrivals themselves are simulated and no operator log of hallucinations is public, so validating the counting-process assumptions on production incident logs is the key next step.</w:t>
+        <w:t xml:space="preserve">Treating human-handled LLM incidents as a counting process turns guardrail performance into a staffing and cost decision. Under the stated assumptions, capacity should be sized from an over-dispersion-aware quantile of the daily count; the multiplicative guardrail formula is an optimistic bound whose gap must be measured; a single Poisson on all failures misdescribes every class (hallucinations are over-dispersed through demand variability, provider incidents are seasonal with a drifting level and weak clustering, serving failures are heavy-tailed episodes); and the cost-minimising number of layers depends on integer capacity effects, the floor on standing staff, latency, the labour-to-compute ratio and the measured clearance, and is not fixed at three. On measured outputs of three small open models answering the same 300 questions, a single task-specific verifier reduced the required capacity by 78-95% relative to no guardrails while blocking 15-71% of correct answers; a routed judge did not demonstrably pay for itself under a 2 s fail-open timeout and added system failures and about three times the latency, and every cascade containing the verifier blocked correct answers. The share of hallucinations passing a two-layer cascade was 1.3-1.6 times the independence prediction without routing and 1.9-2.3 times with routing, with wide intervals. Mild burstiness (daily-rate CV of 0.3-0.44, a range informed by public ticket streams and a production trace) raised the exceedance rate of a Poisson-sized plan from 5% to roughly 23-32% without guardrails and 7-16% with the best cascade. Public production data corroborate the structure: an LLM request trace shows clustered arrivals from the 10-second scale upward, provider incident streams are strongly seasonal with a drifting level and over-dispersion that remains after weekday stratification, a log of dated hallucination cases shows weak over-dispersion at about six cases per weekday, and company ticket streams show a net-of-trend daily rate CV of 0.10-0.38 (0.25-0.41 with all days) and heavy-tailed resolution times. Hallucination arrivals themselves are simulated and no operator log of hallucinations is public, so validating the counting-process assumptions on production incident logs is the key next step.</w:t>
       </w:r>
     </w:p>
     <w:p>

</xml_diff>